<commit_message>
fix(docx): pulihkan skema OpenXML valid agar dokumen Word dapat dibuka 100% tanpa error
</commit_message>
<xml_diff>
--- a/public/templates/template_logbook_kkn_prepared.docx
+++ b/public/templates/template_logbook_kkn_prepared.docx
@@ -1,6 +1,4056 @@
 
-<file path=word/document.xml><?xml version="1.0" encoding="UTF-8" standalone="yes"?>
-<w:document xmlns:wpc="http://schemas.microsoft.com/office/word/2010/wordprocessingCanvas" xmlns:cx="http://schemas.microsoft.com/office/drawing/2014/chartex" xmlns:cx1="http://schemas.microsoft.com/office/drawing/2015/9/8/chartex" xmlns:cx2="http://schemas.microsoft.com/office/drawing/2015/10/21/chartex" xmlns:cx3="http://schemas.microsoft.com/office/drawing/2016/5/9/chartex" xmlns:cx4="http://schemas.microsoft.com/office/drawing/2016/5/10/chartex" xmlns:cx5="http://schemas.microsoft.com/office/drawing/2016/5/11/chartex" xmlns:cx6="http://schemas.microsoft.com/office/drawing/2016/5/12/chartex" xmlns:cx7="http://schemas.microsoft.com/office/drawing/2016/5/13/chartex" xmlns:cx8="http://schemas.microsoft.com/office/drawing/2016/5/14/chartex" xmlns:mc="http://schemas.openxmlformats.org/markup-compatibility/2006" xmlns:aink="http://schemas.microsoft.com/office/drawing/2016/ink" xmlns:am3d="http://schemas.microsoft.com/office/drawing/2017/model3d" xmlns:o="urn:schemas-microsoft-com:office:office" xmlns:oel="http://schemas.microsoft.com/office/2019/extlst" xmlns:r="http://schemas.openxmlformats.org/officeDocument/2006/relationships" xmlns:m="http://schemas.openxmlformats.org/officeDocument/2006/math" xmlns:v="urn:schemas-microsoft-com:vml" xmlns:wp14="http://schemas.microsoft.com/office/word/2010/wordprocessingDrawing" xmlns:wp="http://schemas.openxmlformats.org/drawingml/2006/wordprocessingDrawing" xmlns:w10="urn:schemas-microsoft-com:office:word" xmlns:w="http://schemas.openxmlformats.org/wordprocessingml/2006/main" xmlns:w14="http://schemas.microsoft.com/office/word/2010/wordml" xmlns:w15="http://schemas.microsoft.com/office/word/2012/wordml" xmlns:w16cex="http://schemas.microsoft.com/office/word/2018/wordml/cex" xmlns:w16cid="http://schemas.microsoft.com/office/word/2016/wordml/cid" xmlns:w16="http://schemas.microsoft.com/office/word/2018/wordml" xmlns:w16du="http://schemas.microsoft.com/office/word/2023/wordml/word16du" xmlns:w16sdtdh="http://schemas.microsoft.com/office/word/2020/wordml/sdtdatahash" xmlns:w16sdtfl="http://schemas.microsoft.com/office/word/2024/wordml/sdtformatlock" xmlns:w16se="http://schemas.microsoft.com/office/word/2015/wordml/symex" xmlns:wpg="http://schemas.microsoft.com/office/word/2010/wordprocessingGroup" xmlns:wpi="http://schemas.microsoft.com/office/word/2010/wordprocessingInk" xmlns:wne="http://schemas.microsoft.com/office/word/2006/wordml" xmlns:wps="http://schemas.microsoft.com/office/word/2010/wordprocessingShape" mc:Ignorable="w14 w15 w16se w16cid w16 w16cex w16sdtdh w16sdtfl w16du wp14"><w:body></w:r></w:p><w:p><w:pPr><w:pBdr><w:top w:val="nil"/><w:left w:val="nil"/><w:bottom w:val="nil"/><w:right w:val="nil"/><w:between w:val="nil"/></w:pBdr><w:rPr><w:b/><w:color w:val="000000"/><w:sz w:val="20"/><w:szCs w:val="20"/></w:rPr></w:pPr></w:p><w:p><w:pPr><w:pBdr><w:top w:val="nil"/><w:left w:val="nil"/><w:bottom w:val="nil"/><w:right w:val="nil"/><w:between w:val="nil"/></w:pBdr><w:spacing w:before="63"/><w:rPr><w:b/><w:color w:val="000000"/><w:sz w:val="20"/><w:szCs w:val="20"/></w:rPr></w:pPr></w:p><w:tbl><w:tblPr><w:tblStyle w:val="a"/><w:tblW w:w="9354" w:type="dxa"/><w:tblInd w:w="-5" w:type="dxa"/><w:tblBorders><w:top w:val="single" w:sz="4" w:space="0" w:color="000000"/><w:left w:val="single" w:sz="4" w:space="0" w:color="000000"/><w:bottom w:val="single" w:sz="4" w:space="0" w:color="000000"/><w:right w:val="single" w:sz="4" w:space="0" w:color="000000"/><w:insideH w:val="single" w:sz="4" w:space="0" w:color="000000"/><w:insideV w:val="single" w:sz="4" w:space="0" w:color="000000"/></w:tblBorders><w:tblLayout w:type="fixed"/><w:tblLook w:val="0000" w:firstRow="0" w:lastRow="0" w:firstColumn="0" w:lastColumn="0" w:noHBand="0" w:noVBand="0"/></w:tblPr><w:tblGrid><w:gridCol w:w="4677"/><w:gridCol w:w="4677"/></w:tblGrid><w:tr><w:trPr><w:trHeight w:val="365"/></w:trPr><w:tc><w:tcPr><w:tcW w:w="4677" w:type="dxa"/></w:tcPr><w:p><w:pPr><w:pBdr><w:top w:val="nil"/><w:left w:val="nil"/><w:bottom w:val="nil"/><w:right w:val="nil"/><w:between w:val="nil"/></w:pBdr><w:spacing w:line="226" w:lineRule="auto"/><w:ind w:left="107"/><w:rPr><w:color w:val="000000"/><w:sz w:val="20"/><w:szCs w:val="20"/></w:rPr></w:pPr><w:r><w:rPr><w:color w:val="000000"/><w:sz w:val="20"/><w:szCs w:val="20"/></w:rPr><w:t>NAMA</w:t></w:r></w:p></w:tc><w:tc><w:tcPr><w:tcW w:w="4677" w:type="dxa"/></w:tcPr><w:p><w:r><w:rPr><w:rFonts w:ascii="Times New Roman" w:hAnsi="Times New Roman"/><w:sz w:val="22"/><w:b/></w:rPr><w:t>{full_name}</w:t></w:r></w:p></w:tc></w:tr><w:tr><w:trPr><w:trHeight w:val="366"/></w:trPr><w:tc><w:tcPr><w:tcW w:w="4677" w:type="dxa"/></w:tcPr><w:p><w:pPr><w:pBdr><w:top w:val="nil"/><w:left w:val="nil"/><w:bottom w:val="nil"/><w:right w:val="nil"/><w:between w:val="nil"/></w:pBdr><w:spacing w:line="227" w:lineRule="auto"/><w:ind w:left="107"/><w:rPr><w:color w:val="000000"/><w:sz w:val="20"/><w:szCs w:val="20"/></w:rPr></w:pPr><w:r><w:rPr><w:color w:val="000000"/><w:sz w:val="20"/><w:szCs w:val="20"/></w:rPr><w:t>NIM</w:t></w:r></w:p></w:tc><w:tc><w:tcPr><w:tcW w:w="4677" w:type="dxa"/></w:tcPr><w:p><w:r><w:rPr><w:rFonts w:ascii="Times New Roman" w:hAnsi="Times New Roman"/><w:sz w:val="22"/><w:b/></w:rPr><w:t>{student_id}</w:t></w:r></w:p></w:tc></w:tr><w:tr><w:trPr><w:trHeight w:val="370"/></w:trPr><w:tc><w:tcPr><w:tcW w:w="4677" w:type="dxa"/></w:tcPr><w:p><w:pPr><w:pBdr><w:top w:val="nil"/><w:left w:val="nil"/><w:bottom w:val="nil"/><w:right w:val="nil"/><w:between w:val="nil"/></w:pBdr><w:spacing w:line="226" w:lineRule="auto"/><w:ind w:left="107"/><w:rPr><w:color w:val="000000"/><w:sz w:val="20"/><w:szCs w:val="20"/></w:rPr></w:pPr><w:r><w:rPr><w:color w:val="000000"/><w:sz w:val="20"/><w:szCs w:val="20"/></w:rPr><w:t>FAKULTAS/PRODI</w:t></w:r></w:p></w:tc><w:tc><w:tcPr><w:tcW w:w="4677" w:type="dxa"/></w:tcPr><w:p><w:r><w:rPr><w:rFonts w:ascii="Times New Roman" w:hAnsi="Times New Roman"/><w:sz w:val="22"/><w:b/></w:rPr><w:t>{faculty_prodi}</w:t></w:r></w:p></w:tc></w:tr><w:tr><w:trPr><w:trHeight w:val="366"/></w:trPr><w:tc><w:tcPr><w:tcW w:w="4677" w:type="dxa"/></w:tcPr><w:p><w:pPr><w:pBdr><w:top w:val="nil"/><w:left w:val="nil"/><w:bottom w:val="nil"/><w:right w:val="nil"/><w:between w:val="nil"/></w:pBdr><w:spacing w:line="222" w:lineRule="auto"/><w:ind w:left="107"/><w:rPr><w:color w:val="000000"/><w:sz w:val="20"/><w:szCs w:val="20"/></w:rPr></w:pPr><w:r><w:rPr><w:color w:val="000000"/><w:sz w:val="20"/><w:szCs w:val="20"/></w:rPr><w:t>NAMA LOKASI KKN</w:t></w:r></w:p></w:tc><w:tc><w:tcPr><w:tcW w:w="4677" w:type="dxa"/></w:tcPr><w:p><w:r><w:rPr><w:rFonts w:ascii="Times New Roman" w:hAnsi="Times New Roman"/><w:sz w:val="22"/><w:b/></w:rPr><w:t>{group_location}</w:t></w:r></w:p></w:tc></w:tr><w:tr><w:trPr><w:trHeight w:val="362"/></w:trPr><w:tc><w:tcPr><w:tcW w:w="4677" w:type="dxa"/></w:tcPr><w:p><w:pPr><w:pBdr><w:top w:val="nil"/><w:left w:val="nil"/><w:bottom w:val="nil"/><w:right w:val="nil"/><w:between w:val="nil"/></w:pBdr><w:spacing w:line="222" w:lineRule="auto"/><w:ind w:left="107"/><w:rPr><w:color w:val="000000"/><w:sz w:val="20"/><w:szCs w:val="20"/></w:rPr></w:pPr><w:r><w:rPr><w:color w:val="000000"/><w:sz w:val="20"/><w:szCs w:val="20"/></w:rPr><w:t>NAMA DOSEN PENDAMPING LAPANGAN</w:t></w:r></w:p></w:tc><w:tc><w:tcPr><w:tcW w:w="4677" w:type="dxa"/></w:tcPr><w:p><w:r><w:rPr><w:rFonts w:ascii="Times New Roman" w:hAnsi="Times New Roman"/><w:sz w:val="22"/><w:b/></w:rPr><w:t>{dosen_name}</w:t></w:r></w:p></w:tc></w:tr></w:tbl><w:p><w:pPr><w:pBdr><w:top w:val="nil"/><w:left w:val="nil"/><w:bottom w:val="nil"/><w:right w:val="nil"/><w:between w:val="nil"/></w:pBdr><w:rPr><w:b/><w:color w:val="000000"/><w:sz w:val="20"/><w:szCs w:val="20"/></w:rPr></w:pPr><w:r><w:rPr><w:noProof/></w:rPr><w:drawing><wp:anchor distT="0" distB="0" distL="114300" distR="114300" simplePos="0" relativeHeight="251659264" behindDoc="0" locked="0" layoutInCell="1" hidden="0" allowOverlap="1" wp14:anchorId="068DF41D" wp14:editId="0EDAA620"><wp:simplePos x="0" y="0"/><wp:positionH relativeFrom="column"><wp:posOffset>1955482</wp:posOffset></wp:positionH><wp:positionV relativeFrom="paragraph"><wp:posOffset>215900</wp:posOffset></wp:positionV><wp:extent cx="2032635" cy="2035175"/><wp:effectExtent l="0" t="0" r="0" b="0"/><wp:wrapTopAndBottom distT="0" distB="0"/><wp:docPr id="1900290531" name="image2.png"/><wp:cNvGraphicFramePr/><a:graphic xmlns:a="http://schemas.openxmlformats.org/drawingml/2006/main"><a:graphicData uri="http://schemas.openxmlformats.org/drawingml/2006/picture"><pic:pic xmlns:pic="http://schemas.openxmlformats.org/drawingml/2006/picture"><pic:nvPicPr><pic:cNvPr id="0" name="image2.png"/><pic:cNvPicPr preferRelativeResize="0"/></pic:nvPicPr><pic:blipFill><a:blip r:embed="rId6"/><a:srcRect/><a:stretch><a:fillRect/></a:stretch></pic:blipFill><pic:spPr><a:xfrm><a:off x="0" y="0"/><a:ext cx="2032635" cy="2035175"/></a:xfrm><a:prstGeom prst="rect"><a:avLst/></a:prstGeom><a:ln/></pic:spPr></pic:pic></a:graphicData></a:graphic></wp:anchor></w:drawing></w:r></w:p><w:p><w:pPr><w:spacing w:before="2"/><w:ind w:left="2880" w:right="3233"/><w:jc w:val="center"/><w:rPr><w:sz w:val="26"/><w:szCs w:val="26"/></w:rPr></w:pPr></w:p><w:p><w:pPr><w:jc w:val="center"/><w:rPr><w:sz w:val="26"/><w:szCs w:val="26"/></w:rPr></w:pPr></w:p><w:p><w:pPr><w:pBdr><w:top w:val="nil"/><w:left w:val="nil"/><w:bottom w:val="nil"/><w:right w:val="nil"/><w:between w:val="nil"/></w:pBdr><w:jc w:val="center"/><w:rPr><w:sz w:val="26"/><w:szCs w:val="26"/></w:rPr></w:pPr><w:r><w:rPr><w:sz w:val="26"/><w:szCs w:val="26"/></w:rPr><w:t>LEMBAGA PENELITIAN DAN PENGABDIAN KEPADA MASYARAKAT</w:t></w:r></w:p><w:p><w:pPr><w:jc w:val="center"/><w:rPr><w:sz w:val="26"/><w:szCs w:val="26"/></w:rPr></w:pPr><w:r><w:rPr><w:sz w:val="26"/><w:szCs w:val="26"/></w:rPr><w:t>UNIVERSITAS MARITIM RAJA ALI HAJI</w:t></w:r></w:p><w:p><w:pPr><w:jc w:val="center"/><w:rPr><w:sz w:val="26"/><w:szCs w:val="26"/></w:rPr></w:pPr><w:r><w:rPr><w:sz w:val="26"/><w:szCs w:val="26"/></w:rPr><w:t>2025</w:t></w:r></w:p><w:tbl><w:tblPr><w:tblStyle w:val="a0"/><w:tblW w:w="10365" w:type="dxa"/><w:tblInd w:w="-508" w:type="dxa"/><w:tblBorders><w:top w:val="single" w:sz="4" w:space="0" w:color="000000"/><w:left w:val="single" w:sz="4" w:space="0" w:color="000000"/><w:bottom w:val="single" w:sz="4" w:space="0" w:color="000000"/><w:right w:val="single" w:sz="4" w:space="0" w:color="000000"/><w:insideH w:val="single" w:sz="4" w:space="0" w:color="000000"/><w:insideV w:val="single" w:sz="4" w:space="0" w:color="000000"/></w:tblBorders><w:tblLayout w:type="fixed"/><w:tblLook w:val="0000" w:firstRow="0" w:lastRow="0" w:firstColumn="0" w:lastColumn="0" w:noHBand="0" w:noVBand="0"/></w:tblPr><w:tblGrid><w:gridCol w:w="635"/><w:gridCol w:w="1465"/><w:gridCol w:w="720"/><w:gridCol w:w="1110"/><w:gridCol w:w="532"/><w:gridCol w:w="788"/><w:gridCol w:w="2565"/><w:gridCol w:w="2550"/></w:tblGrid><w:tr><w:trPr><w:trHeight w:val="1955"/></w:trPr><w:tc><w:tcPr><w:tcW w:w="3930" w:type="dxa"/><w:gridSpan w:val="4"/><w:tcBorders><w:top w:val="single" w:sz="12" w:space="0" w:color="000000"/><w:left w:val="single" w:sz="12" w:space="0" w:color="000000"/><w:bottom w:val="single" w:sz="12" w:space="0" w:color="000000"/><w:right w:val="single" w:sz="12" w:space="0" w:color="000000"/></w:tcBorders></w:tcPr><w:p><w:pPr><w:pBdr><w:top w:val="nil"/><w:left w:val="nil"/><w:bottom w:val="nil"/><w:right w:val="nil"/><w:between w:val="nil"/></w:pBdr><w:ind w:left="561"/><w:rPr><w:color w:val="000000"/><w:sz w:val="20"/><w:szCs w:val="20"/></w:rPr></w:pPr><w:r><w:rPr><w:noProof/></w:rPr><w:lastRenderedPageBreak/><w:drawing><wp:anchor distT="0" distB="0" distL="114300" distR="114300" simplePos="0" relativeHeight="251660288" behindDoc="0" locked="0" layoutInCell="1" hidden="0" allowOverlap="1" wp14:anchorId="7523C5D4" wp14:editId="78695CA9"><wp:simplePos x="0" y="0"/><wp:positionH relativeFrom="column"><wp:posOffset>316865</wp:posOffset></wp:positionH><wp:positionV relativeFrom="paragraph"><wp:posOffset>43180</wp:posOffset></wp:positionV><wp:extent cx="1156335" cy="1157605"/><wp:effectExtent l="0" t="0" r="0" b="0"/><wp:wrapTopAndBottom distT="0" distB="0"/><wp:docPr id="1900290530" name="image1.png"/><wp:cNvGraphicFramePr/><a:graphic xmlns:a="http://schemas.openxmlformats.org/drawingml/2006/main"><a:graphicData uri="http://schemas.openxmlformats.org/drawingml/2006/picture"><pic:pic xmlns:pic="http://schemas.openxmlformats.org/drawingml/2006/picture"><pic:nvPicPr><pic:cNvPr id="0" name="image1.png"/><pic:cNvPicPr preferRelativeResize="0"/></pic:nvPicPr><pic:blipFill><a:blip r:embed="rId7"/><a:srcRect/><a:stretch><a:fillRect/></a:stretch></pic:blipFill><pic:spPr><a:xfrm><a:off x="0" y="0"/><a:ext cx="1156335" cy="1157605"/></a:xfrm><a:prstGeom prst="rect"><a:avLst/></a:prstGeom><a:ln/></pic:spPr></pic:pic></a:graphicData></a:graphic></wp:anchor></w:drawing></w:r></w:p></w:tc><w:tc><w:tcPr><w:tcW w:w="3885" w:type="dxa"/><w:gridSpan w:val="3"/><w:tcBorders><w:top w:val="single" w:sz="12" w:space="0" w:color="000000"/><w:left w:val="single" w:sz="12" w:space="0" w:color="000000"/><w:bottom w:val="single" w:sz="12" w:space="0" w:color="000000"/><w:right w:val="single" w:sz="12" w:space="0" w:color="000000"/></w:tcBorders></w:tcPr><w:p><w:pPr><w:pBdr><w:top w:val="nil"/><w:left w:val="nil"/><w:bottom w:val="nil"/><w:right w:val="nil"/><w:between w:val="nil"/></w:pBdr><w:spacing w:before="3"/><w:ind w:left="106"/><w:rPr><w:b/><w:i/><w:color w:val="000000"/><w:sz w:val="24"/><w:szCs w:val="24"/></w:rPr></w:pPr><w:r><w:rPr><w:b/><w:i/><w:color w:val="000000"/><w:sz w:val="24"/><w:szCs w:val="24"/></w:rPr><w:t>LOGBOOK</w:t></w:r></w:p><w:p><w:pPr><w:pBdr><w:top w:val="nil"/><w:left w:val="nil"/><w:bottom w:val="nil"/><w:right w:val="nil"/><w:between w:val="nil"/></w:pBdr><w:spacing w:before="135" w:line="360" w:lineRule="auto"/><w:ind w:left="106" w:right="267"/><w:rPr><w:b/><w:color w:val="000000"/><w:sz w:val="24"/><w:szCs w:val="24"/></w:rPr></w:pPr><w:r><w:rPr><w:b/><w:color w:val="000000"/><w:sz w:val="24"/><w:szCs w:val="24"/></w:rPr><w:t>KULIAH KERJA NYATA UNIVERSITAS MARITIM RAJA ALI HAJI</w:t></w:r></w:p></w:tc><w:tc><w:tcPr><w:tcW w:w="2550" w:type="dxa"/><w:tcBorders><w:top w:val="single" w:sz="12" w:space="0" w:color="000000"/><w:left w:val="single" w:sz="12" w:space="0" w:color="000000"/><w:bottom w:val="single" w:sz="12" w:space="0" w:color="000000"/><w:right w:val="single" w:sz="12" w:space="0" w:color="000000"/></w:tcBorders></w:tcPr><w:p><w:pPr><w:pBdr><w:top w:val="nil"/><w:left w:val="nil"/><w:bottom w:val="nil"/><w:right w:val="nil"/><w:between w:val="nil"/></w:pBdr><w:rPr><w:color w:val="000000"/><w:sz w:val="24"/><w:szCs w:val="24"/></w:rPr></w:pPr></w:p><w:p><w:pPr><w:pBdr><w:top w:val="nil"/><w:left w:val="nil"/><w:bottom w:val="nil"/><w:right w:val="nil"/><w:between w:val="nil"/></w:pBdr><w:spacing w:before="270"/><w:rPr><w:color w:val="000000"/><w:sz w:val="24"/><w:szCs w:val="24"/></w:rPr></w:pPr></w:p><w:p><w:pPr><w:pBdr><w:top w:val="nil"/><w:left w:val="nil"/><w:bottom w:val="nil"/><w:right w:val="nil"/><w:between w:val="nil"/></w:pBdr><w:spacing w:before="1"/><w:ind w:left="104" w:right="994"/><w:rPr><w:b/><w:color w:val="000000"/><w:sz w:val="24"/><w:szCs w:val="24"/></w:rPr></w:pPr><w:r><w:rPr><w:b/><w:color w:val="000000"/><w:sz w:val="24"/><w:szCs w:val="24"/></w:rPr><w:t>{week_label}</w:t></w:r></w:p></w:tc></w:tr><w:tr><w:trPr><w:trHeight w:val="274"/></w:trPr><w:tc><w:tcPr><w:tcW w:w="10365" w:type="dxa"/><w:gridSpan w:val="8"/><w:tcBorders><w:top w:val="single" w:sz="12" w:space="0" w:color="000000"/><w:left w:val="single" w:sz="8" w:space="0" w:color="000000"/><w:bottom w:val="single" w:sz="8" w:space="0" w:color="000000"/><w:right w:val="single" w:sz="8" w:space="0" w:color="000000"/></w:tcBorders></w:tcPr><w:p><w:pPr><w:pBdr><w:top w:val="nil"/><w:left w:val="nil"/><w:bottom w:val="nil"/><w:right w:val="nil"/><w:between w:val="nil"/></w:pBdr><w:spacing w:line="254" w:lineRule="auto"/><w:ind w:left="107"/><w:rPr><w:b/><w:color w:val="000000"/><w:sz w:val="24"/><w:szCs w:val="24"/></w:rPr></w:pPr><w:r><w:rPr><w:b/><w:color w:val="000000"/><w:sz w:val="24"/><w:szCs w:val="24"/></w:rPr><w:t>NAMA MAHASISWA/NIM/KELOMPOK: {group_info}</w:t></w:r></w:p></w:tc></w:tr><w:tr><w:trPr><w:trHeight w:val="278"/></w:trPr><w:tc><w:tcPr><w:tcW w:w="10365" w:type="dxa"/><w:gridSpan w:val="8"/><w:tcBorders><w:top w:val="single" w:sz="8" w:space="0" w:color="000000"/><w:left w:val="single" w:sz="8" w:space="0" w:color="000000"/><w:bottom w:val="single" w:sz="8" w:space="0" w:color="000000"/><w:right w:val="single" w:sz="8" w:space="0" w:color="000000"/></w:tcBorders></w:tcPr><w:p><w:pPr><w:pBdr><w:top w:val="nil"/><w:left w:val="nil"/><w:bottom w:val="nil"/><w:right w:val="nil"/><w:between w:val="nil"/></w:pBdr><w:spacing w:line="258" w:lineRule="auto"/><w:ind w:left="107"/><w:rPr><w:b/><w:color w:val="000000"/><w:sz w:val="24"/><w:szCs w:val="24"/></w:rPr></w:pPr><w:r><w:rPr><w:b/><w:color w:val="000000"/><w:sz w:val="24"/><w:szCs w:val="24"/></w:rPr><w:t>A. JADWAL:</w:t></w:r></w:p></w:tc></w:tr><w:tr><w:trPr><w:trHeight w:val="230"/></w:trPr><w:tc><w:tcPr><w:tcW w:w="635" w:type="dxa"/><w:tcBorders><w:top w:val="single" w:sz="8" w:space="0" w:color="000000"/><w:left w:val="single" w:sz="8" w:space="0" w:color="000000"/><w:bottom w:val="single" w:sz="8" w:space="0" w:color="000000"/><w:right w:val="single" w:sz="8" w:space="0" w:color="000000"/></w:tcBorders></w:tcPr><w:p><w:pPr><w:rPr><w:b/><w:bCs/><w:color w:val="000000"/><w:sz w:val="20"/><w:szCs w:val="20"/></w:rPr></w:pPr><w:r><w:rPr><w:b/><w:bCs/><w:sz w:val="20"/><w:szCs w:val="20"/></w:rPr><w:t>HARI</w:t></w:r></w:p></w:tc><w:tc><w:tcPr><w:tcW w:w="1465" w:type="dxa"/><w:tcBorders><w:top w:val="single" w:sz="8" w:space="0" w:color="000000"/><w:left w:val="single" w:sz="8" w:space="0" w:color="000000"/><w:bottom w:val="single" w:sz="8" w:space="0" w:color="000000"/><w:right w:val="single" w:sz="8" w:space="0" w:color="000000"/></w:tcBorders></w:tcPr><w:p><w:pPr><w:pBdr><w:top w:val="nil"/><w:left w:val="nil"/><w:bottom w:val="nil"/><w:right w:val="nil"/><w:between w:val="nil"/></w:pBdr><w:spacing w:line="210" w:lineRule="auto"/><w:ind w:left="106"/><w:rPr><w:b/><w:color w:val="000000"/><w:sz w:val="20"/><w:szCs w:val="20"/></w:rPr></w:pPr><w:r><w:rPr><w:b/><w:color w:val="000000"/><w:sz w:val="20"/><w:szCs w:val="20"/></w:rPr><w:t>TANGGAL</w:t></w:r></w:p></w:tc><w:tc><w:tcPr><w:tcW w:w="720" w:type="dxa"/><w:tcBorders><w:top w:val="single" w:sz="8" w:space="0" w:color="000000"/><w:left w:val="single" w:sz="8" w:space="0" w:color="000000"/><w:bottom w:val="single" w:sz="8" w:space="0" w:color="000000"/><w:right w:val="single" w:sz="8" w:space="0" w:color="000000"/></w:tcBorders></w:tcPr><w:p><w:pPr><w:pBdr><w:top w:val="nil"/><w:left w:val="nil"/><w:bottom w:val="nil"/><w:right w:val="nil"/><w:between w:val="nil"/></w:pBdr><w:spacing w:line="210" w:lineRule="auto"/><w:ind w:left="242"/><w:rPr><w:b/><w:color w:val="000000"/><w:sz w:val="20"/><w:szCs w:val="20"/></w:rPr></w:pPr><w:r><w:rPr><w:b/><w:color w:val="000000"/><w:sz w:val="20"/><w:szCs w:val="20"/></w:rPr><w:t>JAM</w:t></w:r></w:p></w:tc><w:tc><w:tcPr><w:tcW w:w="1642" w:type="dxa"/><w:gridSpan w:val="2"/><w:tcBorders><w:top w:val="single" w:sz="8" w:space="0" w:color="000000"/><w:left w:val="single" w:sz="8" w:space="0" w:color="000000"/><w:bottom w:val="single" w:sz="8" w:space="0" w:color="000000"/><w:right w:val="single" w:sz="8" w:space="0" w:color="000000"/></w:tcBorders></w:tcPr><w:p><w:pPr><w:pBdr><w:top w:val="nil"/><w:left w:val="nil"/><w:bottom w:val="nil"/><w:right w:val="nil"/><w:between w:val="nil"/></w:pBdr><w:spacing w:line="210" w:lineRule="auto"/><w:ind w:left="242"/><w:rPr><w:b/><w:color w:val="000000"/><w:sz w:val="20"/><w:szCs w:val="20"/></w:rPr></w:pPr><w:r><w:rPr><w:b/><w:sz w:val="20"/><w:szCs w:val="20"/></w:rPr><w:t>KEGIATAN</w:t></w:r></w:p></w:tc><w:tc><w:tcPr><w:tcW w:w="5903" w:type="dxa"/><w:gridSpan w:val="3"/><w:tcBorders><w:top w:val="single" w:sz="8" w:space="0" w:color="000000"/><w:left w:val="single" w:sz="8" w:space="0" w:color="000000"/><w:bottom w:val="single" w:sz="8" w:space="0" w:color="000000"/><w:right w:val="single" w:sz="8" w:space="0" w:color="000000"/></w:tcBorders></w:tcPr><w:p><w:pPr><w:pBdr><w:top w:val="nil"/><w:left w:val="nil"/><w:bottom w:val="nil"/><w:right w:val="nil"/><w:between w:val="nil"/></w:pBdr><w:spacing w:line="210" w:lineRule="auto"/><w:ind w:right="1"/><w:jc w:val="center"/><w:rPr><w:b/><w:color w:val="FF0000"/><w:sz w:val="20"/><w:szCs w:val="20"/></w:rPr></w:pPr><w:r><w:rPr><w:b/><w:color w:val="FF0000"/><w:sz w:val="20"/><w:szCs w:val="20"/></w:rPr><w:t>Dokumentasi</w:t></w:r></w:p></w:tc></w:tr><w:tr><w:trPr><w:trHeight w:val="230"/></w:trPr><w:tc><w:tcPr><w:tcW w:w="635" w:type="dxa"/><w:tcBorders><w:top w:val="single" w:sz="8" w:space="0" w:color="000000"/><w:left w:val="single" w:sz="8" w:space="0" w:color="000000"/><w:bottom w:val="single" w:sz="8" w:space="0" w:color="000000"/><w:right w:val="single" w:sz="8" w:space="0" w:color="000000"/></w:tcBorders></w:tcPr><w:p><w:pPr><w:pBdr><w:top w:val="nil"/><w:left w:val="nil"/><w:bottom w:val="nil"/><w:right w:val="nil"/><w:between w:val="nil"/></w:pBdr><w:rPr><w:color w:val="000000"/><w:sz w:val="16"/><w:szCs w:val="16"/></w:rPr></w:pPr></w:p></w:tc><w:tc><w:tcPr><w:tcW w:w="1465" w:type="dxa"/><w:tcBorders><w:top w:val="single" w:sz="8" w:space="0" w:color="000000"/><w:left w:val="single" w:sz="8" w:space="0" w:color="000000"/><w:bottom w:val="single" w:sz="8" w:space="0" w:color="000000"/><w:right w:val="single" w:sz="8" w:space="0" w:color="000000"/></w:tcBorders></w:tcPr><w:p><w:pPr><w:pBdr><w:top w:val="nil"/><w:left w:val="nil"/><w:bottom w:val="nil"/><w:right w:val="nil"/><w:between w:val="nil"/></w:pBdr><w:rPr><w:color w:val="000000"/><w:sz w:val="16"/><w:szCs w:val="16"/></w:rPr></w:pPr></w:p></w:tc><w:tc><w:tcPr><w:tcW w:w="720" w:type="dxa"/><w:tcBorders><w:top w:val="single" w:sz="8" w:space="0" w:color="000000"/><w:left w:val="single" w:sz="8" w:space="0" w:color="000000"/><w:bottom w:val="single" w:sz="8" w:space="0" w:color="000000"/><w:right w:val="single" w:sz="8" w:space="0" w:color="000000"/></w:tcBorders></w:tcPr><w:p><w:pPr><w:pBdr><w:top w:val="nil"/><w:left w:val="nil"/><w:bottom w:val="nil"/><w:right w:val="nil"/><w:between w:val="nil"/></w:pBdr><w:rPr><w:color w:val="000000"/><w:sz w:val="16"/><w:szCs w:val="16"/></w:rPr></w:pPr></w:p></w:tc><w:tc><w:tcPr><w:tcW w:w="1642" w:type="dxa"/><w:gridSpan w:val="2"/><w:tcBorders><w:top w:val="single" w:sz="8" w:space="0" w:color="000000"/><w:left w:val="single" w:sz="8" w:space="0" w:color="000000"/><w:bottom w:val="single" w:sz="8" w:space="0" w:color="000000"/><w:right w:val="single" w:sz="8" w:space="0" w:color="000000"/></w:tcBorders></w:tcPr><w:p><w:pPr><w:pBdr><w:top w:val="nil"/><w:left w:val="nil"/><w:bottom w:val="nil"/><w:right w:val="nil"/><w:between w:val="nil"/></w:pBdr><w:rPr><w:color w:val="000000"/><w:sz w:val="16"/><w:szCs w:val="16"/></w:rPr></w:pPr></w:p></w:tc><w:tc><w:tcPr><w:tcW w:w="5903" w:type="dxa"/><w:gridSpan w:val="3"/><w:tcBorders><w:top w:val="single" w:sz="8" w:space="0" w:color="000000"/><w:left w:val="single" w:sz="8" w:space="0" w:color="000000"/><w:bottom w:val="single" w:sz="8" w:space="0" w:color="000000"/><w:right w:val="single" w:sz="8" w:space="0" w:color="000000"/></w:tcBorders></w:tcPr><w:p><w:pPr><w:pBdr><w:top w:val="nil"/><w:left w:val="nil"/><w:bottom w:val="nil"/><w:right w:val="nil"/><w:between w:val="nil"/></w:pBdr><w:rPr><w:color w:val="000000"/><w:sz w:val="16"/><w:szCs w:val="16"/></w:rPr></w:pPr><w:r><w:rPr><w:sz w:val="16"/><w:szCs w:val="16"/></w:rPr><w:t xml:space="preserve"> </w:t></w:r></w:p></w:tc></w:tr><w:tr><w:trPr><w:trHeight w:val="230"/></w:trPr><w:tc><w:tcPr><w:tcW w:w="635" w:type="dxa"/><w:tcBorders><w:top w:val="single" w:sz="8" w:space="0" w:color="000000"/><w:left w:val="single" w:sz="8" w:space="0" w:color="000000"/><w:bottom w:val="single" w:sz="8" w:space="0" w:color="000000"/><w:right w:val="single" w:sz="8" w:space="0" w:color="000000"/></w:tcBorders></w:tcPr><w:p><w:pPr><w:pBdr><w:top w:val="nil"/><w:left w:val="nil"/><w:bottom w:val="nil"/><w:right w:val="nil"/><w:between w:val="nil"/></w:pBdr><w:rPr><w:color w:val="000000"/><w:sz w:val="16"/><w:szCs w:val="16"/></w:rPr></w:pPr></w:p></w:tc><w:tc><w:tcPr><w:tcW w:w="1465" w:type="dxa"/><w:tcBorders><w:top w:val="single" w:sz="8" w:space="0" w:color="000000"/><w:left w:val="single" w:sz="8" w:space="0" w:color="000000"/><w:bottom w:val="single" w:sz="8" w:space="0" w:color="000000"/><w:right w:val="single" w:sz="8" w:space="0" w:color="000000"/></w:tcBorders></w:tcPr><w:p><w:pPr><w:pBdr><w:top w:val="nil"/><w:left w:val="nil"/><w:bottom w:val="nil"/><w:right w:val="nil"/><w:between w:val="nil"/></w:pBdr><w:rPr><w:color w:val="000000"/><w:sz w:val="16"/><w:szCs w:val="16"/></w:rPr></w:pPr></w:p></w:tc><w:tc><w:tcPr><w:tcW w:w="720" w:type="dxa"/><w:tcBorders><w:top w:val="single" w:sz="8" w:space="0" w:color="000000"/><w:left w:val="single" w:sz="8" w:space="0" w:color="000000"/><w:bottom w:val="single" w:sz="8" w:space="0" w:color="000000"/><w:right w:val="single" w:sz="8" w:space="0" w:color="000000"/></w:tcBorders></w:tcPr><w:p><w:pPr><w:pBdr><w:top w:val="nil"/><w:left w:val="nil"/><w:bottom w:val="nil"/><w:right w:val="nil"/><w:between w:val="nil"/></w:pBdr><w:rPr><w:color w:val="000000"/><w:sz w:val="16"/><w:szCs w:val="16"/></w:rPr></w:pPr></w:p></w:tc><w:tc><w:tcPr><w:tcW w:w="1642" w:type="dxa"/><w:gridSpan w:val="2"/><w:tcBorders><w:top w:val="single" w:sz="8" w:space="0" w:color="000000"/><w:left w:val="single" w:sz="8" w:space="0" w:color="000000"/><w:bottom w:val="single" w:sz="8" w:space="0" w:color="000000"/><w:right w:val="single" w:sz="8" w:space="0" w:color="000000"/></w:tcBorders></w:tcPr><w:p><w:pPr><w:pBdr><w:top w:val="nil"/><w:left w:val="nil"/><w:bottom w:val="nil"/><w:right w:val="nil"/><w:between w:val="nil"/></w:pBdr><w:rPr><w:color w:val="000000"/><w:sz w:val="16"/><w:szCs w:val="16"/></w:rPr></w:pPr></w:p></w:tc><w:tc><w:tcPr><w:tcW w:w="5903" w:type="dxa"/><w:gridSpan w:val="3"/><w:tcBorders><w:top w:val="single" w:sz="8" w:space="0" w:color="000000"/><w:left w:val="single" w:sz="8" w:space="0" w:color="000000"/><w:bottom w:val="single" w:sz="8" w:space="0" w:color="000000"/><w:right w:val="single" w:sz="8" w:space="0" w:color="000000"/></w:tcBorders></w:tcPr><w:p><w:pPr><w:pBdr><w:top w:val="nil"/><w:left w:val="nil"/><w:bottom w:val="nil"/><w:right w:val="nil"/><w:between w:val="nil"/></w:pBdr><w:rPr><w:color w:val="000000"/><w:sz w:val="16"/><w:szCs w:val="16"/></w:rPr></w:pPr></w:p></w:tc></w:tr><w:tr><w:trPr><w:trHeight w:val="230"/></w:trPr><w:tc><w:tcPr><w:tcW w:w="635" w:type="dxa"/><w:tcBorders><w:top w:val="single" w:sz="8" w:space="0" w:color="000000"/><w:left w:val="single" w:sz="8" w:space="0" w:color="000000"/><w:bottom w:val="single" w:sz="8" w:space="0" w:color="000000"/><w:right w:val="single" w:sz="8" w:space="0" w:color="000000"/></w:tcBorders></w:tcPr><w:p><w:pPr><w:pBdr><w:top w:val="nil"/><w:left w:val="nil"/><w:bottom w:val="nil"/><w:right w:val="nil"/><w:between w:val="nil"/></w:pBdr><w:rPr><w:color w:val="000000"/><w:sz w:val="16"/><w:szCs w:val="16"/></w:rPr></w:pPr></w:p></w:tc><w:tc><w:tcPr><w:tcW w:w="1465" w:type="dxa"/><w:tcBorders><w:top w:val="single" w:sz="8" w:space="0" w:color="000000"/><w:left w:val="single" w:sz="8" w:space="0" w:color="000000"/><w:bottom w:val="single" w:sz="8" w:space="0" w:color="000000"/><w:right w:val="single" w:sz="8" w:space="0" w:color="000000"/></w:tcBorders></w:tcPr><w:p><w:pPr><w:pBdr><w:top w:val="nil"/><w:left w:val="nil"/><w:bottom w:val="nil"/><w:right w:val="nil"/><w:between w:val="nil"/></w:pBdr><w:rPr><w:color w:val="000000"/><w:sz w:val="16"/><w:szCs w:val="16"/></w:rPr></w:pPr></w:p></w:tc><w:tc><w:tcPr><w:tcW w:w="720" w:type="dxa"/><w:tcBorders><w:top w:val="single" w:sz="8" w:space="0" w:color="000000"/><w:left w:val="single" w:sz="8" w:space="0" w:color="000000"/><w:bottom w:val="single" w:sz="8" w:space="0" w:color="000000"/><w:right w:val="single" w:sz="8" w:space="0" w:color="000000"/></w:tcBorders></w:tcPr><w:p><w:pPr><w:pBdr><w:top w:val="nil"/><w:left w:val="nil"/><w:bottom w:val="nil"/><w:right w:val="nil"/><w:between w:val="nil"/></w:pBdr><w:rPr><w:color w:val="000000"/><w:sz w:val="16"/><w:szCs w:val="16"/></w:rPr></w:pPr></w:p></w:tc><w:tc><w:tcPr><w:tcW w:w="1642" w:type="dxa"/><w:gridSpan w:val="2"/><w:tcBorders><w:top w:val="single" w:sz="8" w:space="0" w:color="000000"/><w:left w:val="single" w:sz="8" w:space="0" w:color="000000"/><w:bottom w:val="single" w:sz="8" w:space="0" w:color="000000"/><w:right w:val="single" w:sz="8" w:space="0" w:color="000000"/></w:tcBorders></w:tcPr><w:p><w:pPr><w:pBdr><w:top w:val="nil"/><w:left w:val="nil"/><w:bottom w:val="nil"/><w:right w:val="nil"/><w:between w:val="nil"/></w:pBdr><w:rPr><w:color w:val="000000"/><w:sz w:val="16"/><w:szCs w:val="16"/></w:rPr></w:pPr></w:p></w:tc><w:tc><w:tcPr><w:tcW w:w="5903" w:type="dxa"/><w:gridSpan w:val="3"/><w:tcBorders><w:top w:val="single" w:sz="8" w:space="0" w:color="000000"/><w:left w:val="single" w:sz="8" w:space="0" w:color="000000"/><w:bottom w:val="single" w:sz="8" w:space="0" w:color="000000"/><w:right w:val="single" w:sz="8" w:space="0" w:color="000000"/></w:tcBorders></w:tcPr><w:p><w:pPr><w:pBdr><w:top w:val="nil"/><w:left w:val="nil"/><w:bottom w:val="nil"/><w:right w:val="nil"/><w:between w:val="nil"/></w:pBdr><w:rPr><w:color w:val="000000"/><w:sz w:val="16"/><w:szCs w:val="16"/></w:rPr></w:pPr></w:p></w:tc></w:tr><w:tr><w:trPr><w:trHeight w:val="230"/></w:trPr><w:tc><w:tcPr><w:tcW w:w="635" w:type="dxa"/><w:tcBorders><w:top w:val="single" w:sz="8" w:space="0" w:color="000000"/><w:left w:val="single" w:sz="8" w:space="0" w:color="000000"/><w:bottom w:val="single" w:sz="8" w:space="0" w:color="000000"/><w:right w:val="single" w:sz="8" w:space="0" w:color="000000"/></w:tcBorders></w:tcPr><w:p><w:pPr><w:pBdr><w:top w:val="nil"/><w:left w:val="nil"/><w:bottom w:val="nil"/><w:right w:val="nil"/><w:between w:val="nil"/></w:pBdr><w:rPr><w:color w:val="000000"/><w:sz w:val="16"/><w:szCs w:val="16"/></w:rPr></w:pPr></w:p></w:tc><w:tc><w:tcPr><w:tcW w:w="1465" w:type="dxa"/><w:tcBorders><w:top w:val="single" w:sz="8" w:space="0" w:color="000000"/><w:left w:val="single" w:sz="8" w:space="0" w:color="000000"/><w:bottom w:val="single" w:sz="8" w:space="0" w:color="000000"/><w:right w:val="single" w:sz="8" w:space="0" w:color="000000"/></w:tcBorders></w:tcPr><w:p><w:pPr><w:pBdr><w:top w:val="nil"/><w:left w:val="nil"/><w:bottom w:val="nil"/><w:right w:val="nil"/><w:between w:val="nil"/></w:pBdr><w:rPr><w:color w:val="000000"/><w:sz w:val="16"/><w:szCs w:val="16"/></w:rPr></w:pPr></w:p></w:tc><w:tc><w:tcPr><w:tcW w:w="720" w:type="dxa"/><w:tcBorders><w:top w:val="single" w:sz="8" w:space="0" w:color="000000"/><w:left w:val="single" w:sz="8" w:space="0" w:color="000000"/><w:bottom w:val="single" w:sz="8" w:space="0" w:color="000000"/><w:right w:val="single" w:sz="8" w:space="0" w:color="000000"/></w:tcBorders></w:tcPr><w:p><w:pPr><w:pBdr><w:top w:val="nil"/><w:left w:val="nil"/><w:bottom w:val="nil"/><w:right w:val="nil"/><w:between w:val="nil"/></w:pBdr><w:rPr><w:color w:val="000000"/><w:sz w:val="16"/><w:szCs w:val="16"/></w:rPr></w:pPr></w:p></w:tc><w:tc><w:tcPr><w:tcW w:w="1642" w:type="dxa"/><w:gridSpan w:val="2"/><w:tcBorders><w:top w:val="single" w:sz="8" w:space="0" w:color="000000"/><w:left w:val="single" w:sz="8" w:space="0" w:color="000000"/><w:bottom w:val="single" w:sz="8" w:space="0" w:color="000000"/><w:right w:val="single" w:sz="8" w:space="0" w:color="000000"/></w:tcBorders></w:tcPr><w:p><w:pPr><w:pBdr><w:top w:val="nil"/><w:left w:val="nil"/><w:bottom w:val="nil"/><w:right w:val="nil"/><w:between w:val="nil"/></w:pBdr><w:rPr><w:color w:val="000000"/><w:sz w:val="16"/><w:szCs w:val="16"/></w:rPr></w:pPr></w:p></w:tc><w:tc><w:tcPr><w:tcW w:w="5903" w:type="dxa"/><w:gridSpan w:val="3"/><w:tcBorders><w:top w:val="single" w:sz="8" w:space="0" w:color="000000"/><w:left w:val="single" w:sz="8" w:space="0" w:color="000000"/><w:bottom w:val="single" w:sz="8" w:space="0" w:color="000000"/><w:right w:val="single" w:sz="8" w:space="0" w:color="000000"/></w:tcBorders></w:tcPr><w:p><w:pPr><w:pBdr><w:top w:val="nil"/><w:left w:val="nil"/><w:bottom w:val="nil"/><w:right w:val="nil"/><w:between w:val="nil"/></w:pBdr><w:rPr><w:color w:val="000000"/><w:sz w:val="16"/><w:szCs w:val="16"/></w:rPr></w:pPr></w:p></w:tc></w:tr><w:tr><w:trPr><w:trHeight w:val="229"/></w:trPr><w:tc><w:tcPr><w:tcW w:w="635" w:type="dxa"/><w:tcBorders><w:top w:val="single" w:sz="8" w:space="0" w:color="000000"/><w:left w:val="single" w:sz="8" w:space="0" w:color="000000"/><w:bottom w:val="single" w:sz="8" w:space="0" w:color="000000"/><w:right w:val="single" w:sz="8" w:space="0" w:color="000000"/></w:tcBorders></w:tcPr><w:p><w:pPr><w:pBdr><w:top w:val="nil"/><w:left w:val="nil"/><w:bottom w:val="nil"/><w:right w:val="nil"/><w:between w:val="nil"/></w:pBdr><w:rPr><w:color w:val="000000"/><w:sz w:val="16"/><w:szCs w:val="16"/></w:rPr></w:pPr></w:p></w:tc><w:tc><w:tcPr><w:tcW w:w="1465" w:type="dxa"/><w:tcBorders><w:top w:val="single" w:sz="8" w:space="0" w:color="000000"/><w:left w:val="single" w:sz="8" w:space="0" w:color="000000"/><w:bottom w:val="single" w:sz="8" w:space="0" w:color="000000"/><w:right w:val="single" w:sz="8" w:space="0" w:color="000000"/></w:tcBorders></w:tcPr><w:p><w:pPr><w:pBdr><w:top w:val="nil"/><w:left w:val="nil"/><w:bottom w:val="nil"/><w:right w:val="nil"/><w:between w:val="nil"/></w:pBdr><w:rPr><w:color w:val="000000"/><w:sz w:val="16"/><w:szCs w:val="16"/></w:rPr></w:pPr></w:p></w:tc><w:tc><w:tcPr><w:tcW w:w="720" w:type="dxa"/><w:tcBorders><w:top w:val="single" w:sz="8" w:space="0" w:color="000000"/><w:left w:val="single" w:sz="8" w:space="0" w:color="000000"/><w:bottom w:val="single" w:sz="8" w:space="0" w:color="000000"/><w:right w:val="single" w:sz="8" w:space="0" w:color="000000"/></w:tcBorders></w:tcPr><w:p><w:pPr><w:pBdr><w:top w:val="nil"/><w:left w:val="nil"/><w:bottom w:val="nil"/><w:right w:val="nil"/><w:between w:val="nil"/></w:pBdr><w:rPr><w:color w:val="000000"/><w:sz w:val="16"/><w:szCs w:val="16"/></w:rPr></w:pPr></w:p></w:tc><w:tc><w:tcPr><w:tcW w:w="1642" w:type="dxa"/><w:gridSpan w:val="2"/><w:tcBorders><w:top w:val="single" w:sz="8" w:space="0" w:color="000000"/><w:left w:val="single" w:sz="8" w:space="0" w:color="000000"/><w:bottom w:val="single" w:sz="8" w:space="0" w:color="000000"/><w:right w:val="single" w:sz="8" w:space="0" w:color="000000"/></w:tcBorders></w:tcPr><w:p><w:pPr><w:pBdr><w:top w:val="nil"/><w:left w:val="nil"/><w:bottom w:val="nil"/><w:right w:val="nil"/><w:between w:val="nil"/></w:pBdr><w:rPr><w:color w:val="000000"/><w:sz w:val="16"/><w:szCs w:val="16"/></w:rPr></w:pPr></w:p></w:tc><w:tc><w:tcPr><w:tcW w:w="5903" w:type="dxa"/><w:gridSpan w:val="3"/><w:tcBorders><w:top w:val="single" w:sz="8" w:space="0" w:color="000000"/><w:left w:val="single" w:sz="8" w:space="0" w:color="000000"/><w:bottom w:val="single" w:sz="8" w:space="0" w:color="000000"/><w:right w:val="single" w:sz="8" w:space="0" w:color="000000"/></w:tcBorders></w:tcPr><w:p><w:pPr><w:pBdr><w:top w:val="nil"/><w:left w:val="nil"/><w:bottom w:val="nil"/><w:right w:val="nil"/><w:between w:val="nil"/></w:pBdr><w:rPr><w:color w:val="000000"/><w:sz w:val="16"/><w:szCs w:val="16"/></w:rPr></w:pPr></w:p></w:tc></w:tr><w:tr><w:trPr><w:trHeight w:val="230"/></w:trPr><w:tc><w:tcPr><w:tcW w:w="635" w:type="dxa"/><w:tcBorders><w:top w:val="single" w:sz="8" w:space="0" w:color="000000"/><w:left w:val="single" w:sz="8" w:space="0" w:color="000000"/><w:bottom w:val="single" w:sz="8" w:space="0" w:color="000000"/><w:right w:val="single" w:sz="8" w:space="0" w:color="000000"/></w:tcBorders></w:tcPr><w:p><w:pPr><w:pBdr><w:top w:val="nil"/><w:left w:val="nil"/><w:bottom w:val="nil"/><w:right w:val="nil"/><w:between w:val="nil"/></w:pBdr><w:rPr><w:color w:val="000000"/><w:sz w:val="16"/><w:szCs w:val="16"/></w:rPr></w:pPr></w:p></w:tc><w:tc><w:tcPr><w:tcW w:w="1465" w:type="dxa"/><w:tcBorders><w:top w:val="single" w:sz="8" w:space="0" w:color="000000"/><w:left w:val="single" w:sz="8" w:space="0" w:color="000000"/><w:bottom w:val="single" w:sz="8" w:space="0" w:color="000000"/><w:right w:val="single" w:sz="8" w:space="0" w:color="000000"/></w:tcBorders></w:tcPr><w:p><w:pPr><w:pBdr><w:top w:val="nil"/><w:left w:val="nil"/><w:bottom w:val="nil"/><w:right w:val="nil"/><w:between w:val="nil"/></w:pBdr><w:rPr><w:color w:val="000000"/><w:sz w:val="16"/><w:szCs w:val="16"/></w:rPr></w:pPr></w:p></w:tc><w:tc><w:tcPr><w:tcW w:w="720" w:type="dxa"/><w:tcBorders><w:top w:val="single" w:sz="8" w:space="0" w:color="000000"/><w:left w:val="single" w:sz="8" w:space="0" w:color="000000"/><w:bottom w:val="single" w:sz="8" w:space="0" w:color="000000"/><w:right w:val="single" w:sz="8" w:space="0" w:color="000000"/></w:tcBorders></w:tcPr><w:p><w:pPr><w:pBdr><w:top w:val="nil"/><w:left w:val="nil"/><w:bottom w:val="nil"/><w:right w:val="nil"/><w:between w:val="nil"/></w:pBdr><w:rPr><w:color w:val="000000"/><w:sz w:val="16"/><w:szCs w:val="16"/></w:rPr></w:pPr></w:p></w:tc><w:tc><w:tcPr><w:tcW w:w="1642" w:type="dxa"/><w:gridSpan w:val="2"/><w:tcBorders><w:top w:val="single" w:sz="8" w:space="0" w:color="000000"/><w:left w:val="single" w:sz="8" w:space="0" w:color="000000"/><w:bottom w:val="single" w:sz="8" w:space="0" w:color="000000"/><w:right w:val="single" w:sz="8" w:space="0" w:color="000000"/></w:tcBorders></w:tcPr><w:p><w:pPr><w:pBdr><w:top w:val="nil"/><w:left w:val="nil"/><w:bottom w:val="nil"/><w:right w:val="nil"/><w:between w:val="nil"/></w:pBdr><w:rPr><w:color w:val="000000"/><w:sz w:val="16"/><w:szCs w:val="16"/></w:rPr></w:pPr></w:p></w:tc><w:tc><w:tcPr><w:tcW w:w="5903" w:type="dxa"/><w:gridSpan w:val="3"/><w:tcBorders><w:top w:val="single" w:sz="8" w:space="0" w:color="000000"/><w:left w:val="single" w:sz="8" w:space="0" w:color="000000"/><w:bottom w:val="single" w:sz="8" w:space="0" w:color="000000"/><w:right w:val="single" w:sz="8" w:space="0" w:color="000000"/></w:tcBorders></w:tcPr><w:p><w:pPr><w:pBdr><w:top w:val="nil"/><w:left w:val="nil"/><w:bottom w:val="nil"/><w:right w:val="nil"/><w:between w:val="nil"/></w:pBdr><w:rPr><w:color w:val="000000"/><w:sz w:val="16"/><w:szCs w:val="16"/></w:rPr></w:pPr></w:p></w:tc></w:tr><w:tr><w:trPr><w:trHeight w:val="230"/></w:trPr><w:tc><w:tcPr><w:tcW w:w="635" w:type="dxa"/><w:tcBorders><w:top w:val="single" w:sz="8" w:space="0" w:color="000000"/><w:left w:val="single" w:sz="8" w:space="0" w:color="000000"/><w:bottom w:val="single" w:sz="8" w:space="0" w:color="000000"/><w:right w:val="single" w:sz="8" w:space="0" w:color="000000"/></w:tcBorders></w:tcPr><w:p><w:pPr><w:pBdr><w:top w:val="nil"/><w:left w:val="nil"/><w:bottom w:val="nil"/><w:right w:val="nil"/><w:between w:val="nil"/></w:pBdr><w:rPr><w:color w:val="000000"/><w:sz w:val="16"/><w:szCs w:val="16"/></w:rPr></w:pPr></w:p></w:tc><w:tc><w:tcPr><w:tcW w:w="1465" w:type="dxa"/><w:tcBorders><w:top w:val="single" w:sz="8" w:space="0" w:color="000000"/><w:left w:val="single" w:sz="8" w:space="0" w:color="000000"/><w:bottom w:val="single" w:sz="8" w:space="0" w:color="000000"/><w:right w:val="single" w:sz="8" w:space="0" w:color="000000"/></w:tcBorders></w:tcPr><w:p><w:pPr><w:pBdr><w:top w:val="nil"/><w:left w:val="nil"/><w:bottom w:val="nil"/><w:right w:val="nil"/><w:between w:val="nil"/></w:pBdr><w:rPr><w:color w:val="000000"/><w:sz w:val="16"/><w:szCs w:val="16"/></w:rPr></w:pPr></w:p></w:tc><w:tc><w:tcPr><w:tcW w:w="720" w:type="dxa"/><w:tcBorders><w:top w:val="single" w:sz="8" w:space="0" w:color="000000"/><w:left w:val="single" w:sz="8" w:space="0" w:color="000000"/><w:bottom w:val="single" w:sz="8" w:space="0" w:color="000000"/><w:right w:val="single" w:sz="8" w:space="0" w:color="000000"/></w:tcBorders></w:tcPr><w:p><w:pPr><w:pBdr><w:top w:val="nil"/><w:left w:val="nil"/><w:bottom w:val="nil"/><w:right w:val="nil"/><w:between w:val="nil"/></w:pBdr><w:rPr><w:color w:val="000000"/><w:sz w:val="16"/><w:szCs w:val="16"/></w:rPr></w:pPr></w:p></w:tc><w:tc><w:tcPr><w:tcW w:w="1642" w:type="dxa"/><w:gridSpan w:val="2"/><w:tcBorders><w:top w:val="single" w:sz="8" w:space="0" w:color="000000"/><w:left w:val="single" w:sz="8" w:space="0" w:color="000000"/><w:bottom w:val="single" w:sz="8" w:space="0" w:color="000000"/><w:right w:val="single" w:sz="8" w:space="0" w:color="000000"/></w:tcBorders></w:tcPr><w:p><w:pPr><w:pBdr><w:top w:val="nil"/><w:left w:val="nil"/><w:bottom w:val="nil"/><w:right w:val="nil"/><w:between w:val="nil"/></w:pBdr><w:rPr><w:color w:val="000000"/><w:sz w:val="16"/><w:szCs w:val="16"/></w:rPr></w:pPr></w:p></w:tc><w:tc><w:tcPr><w:tcW w:w="5903" w:type="dxa"/><w:gridSpan w:val="3"/><w:tcBorders><w:top w:val="single" w:sz="8" w:space="0" w:color="000000"/><w:left w:val="single" w:sz="8" w:space="0" w:color="000000"/><w:bottom w:val="single" w:sz="8" w:space="0" w:color="000000"/><w:right w:val="single" w:sz="8" w:space="0" w:color="000000"/></w:tcBorders></w:tcPr><w:p><w:pPr><w:pBdr><w:top w:val="nil"/><w:left w:val="nil"/><w:bottom w:val="nil"/><w:right w:val="nil"/><w:between w:val="nil"/></w:pBdr><w:rPr><w:color w:val="000000"/><w:sz w:val="16"/><w:szCs w:val="16"/></w:rPr></w:pPr></w:p></w:tc></w:tr><w:tr><w:trPr><w:trHeight w:val="230"/></w:trPr><w:tc><w:tcPr><w:tcW w:w="635" w:type="dxa"/><w:tcBorders><w:top w:val="single" w:sz="8" w:space="0" w:color="000000"/><w:left w:val="single" w:sz="8" w:space="0" w:color="000000"/><w:bottom w:val="single" w:sz="8" w:space="0" w:color="000000"/><w:right w:val="single" w:sz="8" w:space="0" w:color="000000"/></w:tcBorders></w:tcPr><w:p><w:pPr><w:pBdr><w:top w:val="nil"/><w:left w:val="nil"/><w:bottom w:val="nil"/><w:right w:val="nil"/><w:between w:val="nil"/></w:pBdr><w:rPr><w:color w:val="000000"/><w:sz w:val="16"/><w:szCs w:val="16"/></w:rPr></w:pPr></w:p></w:tc><w:tc><w:tcPr><w:tcW w:w="1465" w:type="dxa"/><w:tcBorders><w:top w:val="single" w:sz="8" w:space="0" w:color="000000"/><w:left w:val="single" w:sz="8" w:space="0" w:color="000000"/><w:bottom w:val="single" w:sz="8" w:space="0" w:color="000000"/><w:right w:val="single" w:sz="8" w:space="0" w:color="000000"/></w:tcBorders></w:tcPr><w:p><w:pPr><w:pBdr><w:top w:val="nil"/><w:left w:val="nil"/><w:bottom w:val="nil"/><w:right w:val="nil"/><w:between w:val="nil"/></w:pBdr><w:rPr><w:color w:val="000000"/><w:sz w:val="16"/><w:szCs w:val="16"/></w:rPr></w:pPr></w:p></w:tc><w:tc><w:tcPr><w:tcW w:w="720" w:type="dxa"/><w:tcBorders><w:top w:val="single" w:sz="8" w:space="0" w:color="000000"/><w:left w:val="single" w:sz="8" w:space="0" w:color="000000"/><w:bottom w:val="single" w:sz="8" w:space="0" w:color="000000"/><w:right w:val="single" w:sz="8" w:space="0" w:color="000000"/></w:tcBorders></w:tcPr><w:p><w:pPr><w:pBdr><w:top w:val="nil"/><w:left w:val="nil"/><w:bottom w:val="nil"/><w:right w:val="nil"/><w:between w:val="nil"/></w:pBdr><w:rPr><w:color w:val="000000"/><w:sz w:val="16"/><w:szCs w:val="16"/></w:rPr></w:pPr></w:p></w:tc><w:tc><w:tcPr><w:tcW w:w="1642" w:type="dxa"/><w:gridSpan w:val="2"/><w:tcBorders><w:top w:val="single" w:sz="8" w:space="0" w:color="000000"/><w:left w:val="single" w:sz="8" w:space="0" w:color="000000"/><w:bottom w:val="single" w:sz="8" w:space="0" w:color="000000"/><w:right w:val="single" w:sz="8" w:space="0" w:color="000000"/></w:tcBorders></w:tcPr><w:p><w:pPr><w:pBdr><w:top w:val="nil"/><w:left w:val="nil"/><w:bottom w:val="nil"/><w:right w:val="nil"/><w:between w:val="nil"/></w:pBdr><w:rPr><w:color w:val="000000"/><w:sz w:val="16"/><w:szCs w:val="16"/></w:rPr></w:pPr></w:p></w:tc><w:tc><w:tcPr><w:tcW w:w="5903" w:type="dxa"/><w:gridSpan w:val="3"/><w:tcBorders><w:top w:val="single" w:sz="8" w:space="0" w:color="000000"/><w:left w:val="single" w:sz="8" w:space="0" w:color="000000"/><w:bottom w:val="single" w:sz="8" w:space="0" w:color="000000"/><w:right w:val="single" w:sz="8" w:space="0" w:color="000000"/></w:tcBorders></w:tcPr><w:p><w:pPr><w:pBdr><w:top w:val="nil"/><w:left w:val="nil"/><w:bottom w:val="nil"/><w:right w:val="nil"/><w:between w:val="nil"/></w:pBdr><w:rPr><w:color w:val="000000"/><w:sz w:val="16"/><w:szCs w:val="16"/></w:rPr></w:pPr></w:p></w:tc></w:tr><w:tr><w:trPr><w:trHeight w:val="230"/></w:trPr><w:tc><w:tcPr><w:tcW w:w="635" w:type="dxa"/><w:tcBorders><w:top w:val="single" w:sz="8" w:space="0" w:color="000000"/><w:left w:val="single" w:sz="8" w:space="0" w:color="000000"/><w:bottom w:val="single" w:sz="8" w:space="0" w:color="000000"/><w:right w:val="single" w:sz="8" w:space="0" w:color="000000"/></w:tcBorders></w:tcPr><w:p><w:pPr><w:pBdr><w:top w:val="nil"/><w:left w:val="nil"/><w:bottom w:val="nil"/><w:right w:val="nil"/><w:between w:val="nil"/></w:pBdr><w:rPr><w:color w:val="000000"/><w:sz w:val="16"/><w:szCs w:val="16"/></w:rPr></w:pPr></w:p></w:tc><w:tc><w:tcPr><w:tcW w:w="1465" w:type="dxa"/><w:tcBorders><w:top w:val="single" w:sz="8" w:space="0" w:color="000000"/><w:left w:val="single" w:sz="8" w:space="0" w:color="000000"/><w:bottom w:val="single" w:sz="8" w:space="0" w:color="000000"/><w:right w:val="single" w:sz="8" w:space="0" w:color="000000"/></w:tcBorders></w:tcPr><w:p><w:pPr><w:pBdr><w:top w:val="nil"/><w:left w:val="nil"/><w:bottom w:val="nil"/><w:right w:val="nil"/><w:between w:val="nil"/></w:pBdr><w:rPr><w:color w:val="000000"/><w:sz w:val="16"/><w:szCs w:val="16"/></w:rPr></w:pPr></w:p></w:tc><w:tc><w:tcPr><w:tcW w:w="720" w:type="dxa"/><w:tcBorders><w:top w:val="single" w:sz="8" w:space="0" w:color="000000"/><w:left w:val="single" w:sz="8" w:space="0" w:color="000000"/><w:bottom w:val="single" w:sz="8" w:space="0" w:color="000000"/><w:right w:val="single" w:sz="8" w:space="0" w:color="000000"/></w:tcBorders></w:tcPr><w:p><w:pPr><w:pBdr><w:top w:val="nil"/><w:left w:val="nil"/><w:bottom w:val="nil"/><w:right w:val="nil"/><w:between w:val="nil"/></w:pBdr><w:rPr><w:color w:val="000000"/><w:sz w:val="16"/><w:szCs w:val="16"/></w:rPr></w:pPr></w:p></w:tc><w:tc><w:tcPr><w:tcW w:w="1642" w:type="dxa"/><w:gridSpan w:val="2"/><w:tcBorders><w:top w:val="single" w:sz="8" w:space="0" w:color="000000"/><w:left w:val="single" w:sz="8" w:space="0" w:color="000000"/><w:bottom w:val="single" w:sz="8" w:space="0" w:color="000000"/><w:right w:val="single" w:sz="8" w:space="0" w:color="000000"/></w:tcBorders></w:tcPr><w:p><w:pPr><w:pBdr><w:top w:val="nil"/><w:left w:val="nil"/><w:bottom w:val="nil"/><w:right w:val="nil"/><w:between w:val="nil"/></w:pBdr><w:rPr><w:color w:val="000000"/><w:sz w:val="16"/><w:szCs w:val="16"/></w:rPr></w:pPr></w:p></w:tc><w:tc><w:tcPr><w:tcW w:w="5903" w:type="dxa"/><w:gridSpan w:val="3"/><w:tcBorders><w:top w:val="single" w:sz="8" w:space="0" w:color="000000"/><w:left w:val="single" w:sz="8" w:space="0" w:color="000000"/><w:bottom w:val="single" w:sz="8" w:space="0" w:color="000000"/><w:right w:val="single" w:sz="8" w:space="0" w:color="000000"/></w:tcBorders></w:tcPr><w:p><w:pPr><w:pBdr><w:top w:val="nil"/><w:left w:val="nil"/><w:bottom w:val="nil"/><w:right w:val="nil"/><w:between w:val="nil"/></w:pBdr><w:rPr><w:color w:val="000000"/><w:sz w:val="16"/><w:szCs w:val="16"/></w:rPr></w:pPr></w:p></w:tc></w:tr><w:tr><w:trPr><w:trHeight w:val="230"/></w:trPr><w:tc><w:tcPr><w:tcW w:w="635" w:type="dxa"/><w:tcBorders><w:top w:val="single" w:sz="8" w:space="0" w:color="000000"/><w:left w:val="single" w:sz="8" w:space="0" w:color="000000"/><w:bottom w:val="single" w:sz="8" w:space="0" w:color="000000"/><w:right w:val="single" w:sz="8" w:space="0" w:color="000000"/></w:tcBorders></w:tcPr><w:p><w:pPr><w:pBdr><w:top w:val="nil"/><w:left w:val="nil"/><w:bottom w:val="nil"/><w:right w:val="nil"/><w:between w:val="nil"/></w:pBdr><w:rPr><w:color w:val="000000"/><w:sz w:val="16"/><w:szCs w:val="16"/></w:rPr></w:pPr></w:p></w:tc><w:tc><w:tcPr><w:tcW w:w="1465" w:type="dxa"/><w:tcBorders><w:top w:val="single" w:sz="8" w:space="0" w:color="000000"/><w:left w:val="single" w:sz="8" w:space="0" w:color="000000"/><w:bottom w:val="single" w:sz="8" w:space="0" w:color="000000"/><w:right w:val="single" w:sz="8" w:space="0" w:color="000000"/></w:tcBorders></w:tcPr><w:p><w:pPr><w:pBdr><w:top w:val="nil"/><w:left w:val="nil"/><w:bottom w:val="nil"/><w:right w:val="nil"/><w:between w:val="nil"/></w:pBdr><w:rPr><w:color w:val="000000"/><w:sz w:val="16"/><w:szCs w:val="16"/></w:rPr></w:pPr></w:p></w:tc><w:tc><w:tcPr><w:tcW w:w="720" w:type="dxa"/><w:tcBorders><w:top w:val="single" w:sz="8" w:space="0" w:color="000000"/><w:left w:val="single" w:sz="8" w:space="0" w:color="000000"/><w:bottom w:val="single" w:sz="8" w:space="0" w:color="000000"/><w:right w:val="single" w:sz="8" w:space="0" w:color="000000"/></w:tcBorders></w:tcPr><w:p><w:pPr><w:pBdr><w:top w:val="nil"/><w:left w:val="nil"/><w:bottom w:val="nil"/><w:right w:val="nil"/><w:between w:val="nil"/></w:pBdr><w:rPr><w:color w:val="000000"/><w:sz w:val="16"/><w:szCs w:val="16"/></w:rPr></w:pPr></w:p></w:tc><w:tc><w:tcPr><w:tcW w:w="1642" w:type="dxa"/><w:gridSpan w:val="2"/><w:tcBorders><w:top w:val="single" w:sz="8" w:space="0" w:color="000000"/><w:left w:val="single" w:sz="8" w:space="0" w:color="000000"/><w:bottom w:val="single" w:sz="8" w:space="0" w:color="000000"/><w:right w:val="single" w:sz="8" w:space="0" w:color="000000"/></w:tcBorders></w:tcPr><w:p><w:pPr><w:pBdr><w:top w:val="nil"/><w:left w:val="nil"/><w:bottom w:val="nil"/><w:right w:val="nil"/><w:between w:val="nil"/></w:pBdr><w:rPr><w:color w:val="000000"/><w:sz w:val="16"/><w:szCs w:val="16"/></w:rPr></w:pPr></w:p></w:tc><w:tc><w:tcPr><w:tcW w:w="5903" w:type="dxa"/><w:gridSpan w:val="3"/><w:tcBorders><w:top w:val="single" w:sz="8" w:space="0" w:color="000000"/><w:left w:val="single" w:sz="8" w:space="0" w:color="000000"/><w:bottom w:val="single" w:sz="8" w:space="0" w:color="000000"/><w:right w:val="single" w:sz="8" w:space="0" w:color="000000"/></w:tcBorders></w:tcPr><w:p><w:pPr><w:pBdr><w:top w:val="nil"/><w:left w:val="nil"/><w:bottom w:val="nil"/><w:right w:val="nil"/><w:between w:val="nil"/></w:pBdr><w:rPr><w:color w:val="000000"/><w:sz w:val="16"/><w:szCs w:val="16"/></w:rPr></w:pPr></w:p></w:tc></w:tr><w:tr><w:trPr><w:trHeight w:val="230"/></w:trPr><w:tc><w:tcPr><w:tcW w:w="635" w:type="dxa"/><w:tcBorders><w:top w:val="single" w:sz="8" w:space="0" w:color="000000"/><w:left w:val="single" w:sz="8" w:space="0" w:color="000000"/><w:bottom w:val="single" w:sz="8" w:space="0" w:color="000000"/><w:right w:val="single" w:sz="8" w:space="0" w:color="000000"/></w:tcBorders></w:tcPr><w:p><w:pPr><w:pBdr><w:top w:val="nil"/><w:left w:val="nil"/><w:bottom w:val="nil"/><w:right w:val="nil"/><w:between w:val="nil"/></w:pBdr><w:rPr><w:color w:val="000000"/><w:sz w:val="16"/><w:szCs w:val="16"/></w:rPr></w:pPr></w:p></w:tc><w:tc><w:tcPr><w:tcW w:w="1465" w:type="dxa"/><w:tcBorders><w:top w:val="single" w:sz="8" w:space="0" w:color="000000"/><w:left w:val="single" w:sz="8" w:space="0" w:color="000000"/><w:bottom w:val="single" w:sz="8" w:space="0" w:color="000000"/><w:right w:val="single" w:sz="8" w:space="0" w:color="000000"/></w:tcBorders></w:tcPr><w:p><w:pPr><w:pBdr><w:top w:val="nil"/><w:left w:val="nil"/><w:bottom w:val="nil"/><w:right w:val="nil"/><w:between w:val="nil"/></w:pBdr><w:rPr><w:color w:val="000000"/><w:sz w:val="16"/><w:szCs w:val="16"/></w:rPr></w:pPr></w:p></w:tc><w:tc><w:tcPr><w:tcW w:w="720" w:type="dxa"/><w:tcBorders><w:top w:val="single" w:sz="8" w:space="0" w:color="000000"/><w:left w:val="single" w:sz="8" w:space="0" w:color="000000"/><w:bottom w:val="single" w:sz="8" w:space="0" w:color="000000"/><w:right w:val="single" w:sz="8" w:space="0" w:color="000000"/></w:tcBorders></w:tcPr><w:p><w:pPr><w:pBdr><w:top w:val="nil"/><w:left w:val="nil"/><w:bottom w:val="nil"/><w:right w:val="nil"/><w:between w:val="nil"/></w:pBdr><w:rPr><w:color w:val="000000"/><w:sz w:val="16"/><w:szCs w:val="16"/></w:rPr></w:pPr></w:p></w:tc><w:tc><w:tcPr><w:tcW w:w="1642" w:type="dxa"/><w:gridSpan w:val="2"/><w:tcBorders><w:top w:val="single" w:sz="8" w:space="0" w:color="000000"/><w:left w:val="single" w:sz="8" w:space="0" w:color="000000"/><w:bottom w:val="single" w:sz="8" w:space="0" w:color="000000"/><w:right w:val="single" w:sz="8" w:space="0" w:color="000000"/></w:tcBorders></w:tcPr><w:p><w:pPr><w:pBdr><w:top w:val="nil"/><w:left w:val="nil"/><w:bottom w:val="nil"/><w:right w:val="nil"/><w:between w:val="nil"/></w:pBdr><w:rPr><w:color w:val="000000"/><w:sz w:val="16"/><w:szCs w:val="16"/></w:rPr></w:pPr></w:p></w:tc><w:tc><w:tcPr><w:tcW w:w="5903" w:type="dxa"/><w:gridSpan w:val="3"/><w:tcBorders><w:top w:val="single" w:sz="8" w:space="0" w:color="000000"/><w:left w:val="single" w:sz="8" w:space="0" w:color="000000"/><w:bottom w:val="single" w:sz="8" w:space="0" w:color="000000"/><w:right w:val="single" w:sz="8" w:space="0" w:color="000000"/></w:tcBorders></w:tcPr><w:p><w:pPr><w:pBdr><w:top w:val="nil"/><w:left w:val="nil"/><w:bottom w:val="nil"/><w:right w:val="nil"/><w:between w:val="nil"/></w:pBdr><w:rPr><w:color w:val="000000"/><w:sz w:val="16"/><w:szCs w:val="16"/></w:rPr></w:pPr></w:p></w:tc></w:tr><w:tr><w:trPr><w:trHeight w:val="230"/></w:trPr><w:tc><w:tcPr><w:tcW w:w="635" w:type="dxa"/><w:tcBorders><w:top w:val="single" w:sz="8" w:space="0" w:color="000000"/><w:left w:val="single" w:sz="8" w:space="0" w:color="000000"/><w:bottom w:val="single" w:sz="8" w:space="0" w:color="000000"/><w:right w:val="single" w:sz="8" w:space="0" w:color="000000"/></w:tcBorders></w:tcPr><w:p><w:pPr><w:pBdr><w:top w:val="nil"/><w:left w:val="nil"/><w:bottom w:val="nil"/><w:right w:val="nil"/><w:between w:val="nil"/></w:pBdr><w:rPr><w:color w:val="000000"/><w:sz w:val="16"/><w:szCs w:val="16"/></w:rPr></w:pPr></w:p></w:tc><w:tc><w:tcPr><w:tcW w:w="1465" w:type="dxa"/><w:tcBorders><w:top w:val="single" w:sz="8" w:space="0" w:color="000000"/><w:left w:val="single" w:sz="8" w:space="0" w:color="000000"/><w:bottom w:val="single" w:sz="8" w:space="0" w:color="000000"/><w:right w:val="single" w:sz="8" w:space="0" w:color="000000"/></w:tcBorders></w:tcPr><w:p><w:pPr><w:pBdr><w:top w:val="nil"/><w:left w:val="nil"/><w:bottom w:val="nil"/><w:right w:val="nil"/><w:between w:val="nil"/></w:pBdr><w:rPr><w:color w:val="000000"/><w:sz w:val="16"/><w:szCs w:val="16"/></w:rPr></w:pPr></w:p></w:tc><w:tc><w:tcPr><w:tcW w:w="720" w:type="dxa"/><w:tcBorders><w:top w:val="single" w:sz="8" w:space="0" w:color="000000"/><w:left w:val="single" w:sz="8" w:space="0" w:color="000000"/><w:bottom w:val="single" w:sz="8" w:space="0" w:color="000000"/><w:right w:val="single" w:sz="8" w:space="0" w:color="000000"/></w:tcBorders></w:tcPr><w:p><w:pPr><w:pBdr><w:top w:val="nil"/><w:left w:val="nil"/><w:bottom w:val="nil"/><w:right w:val="nil"/><w:between w:val="nil"/></w:pBdr><w:rPr><w:color w:val="000000"/><w:sz w:val="16"/><w:szCs w:val="16"/></w:rPr></w:pPr></w:p></w:tc><w:tc><w:tcPr><w:tcW w:w="1642" w:type="dxa"/><w:gridSpan w:val="2"/><w:tcBorders><w:top w:val="single" w:sz="8" w:space="0" w:color="000000"/><w:left w:val="single" w:sz="8" w:space="0" w:color="000000"/><w:bottom w:val="single" w:sz="8" w:space="0" w:color="000000"/><w:right w:val="single" w:sz="8" w:space="0" w:color="000000"/></w:tcBorders></w:tcPr><w:p><w:pPr><w:pBdr><w:top w:val="nil"/><w:left w:val="nil"/><w:bottom w:val="nil"/><w:right w:val="nil"/><w:between w:val="nil"/></w:pBdr><w:rPr><w:color w:val="000000"/><w:sz w:val="16"/><w:szCs w:val="16"/></w:rPr></w:pPr></w:p></w:tc><w:tc><w:tcPr><w:tcW w:w="5903" w:type="dxa"/><w:gridSpan w:val="3"/><w:tcBorders><w:top w:val="single" w:sz="8" w:space="0" w:color="000000"/><w:left w:val="single" w:sz="8" w:space="0" w:color="000000"/><w:bottom w:val="single" w:sz="8" w:space="0" w:color="000000"/><w:right w:val="single" w:sz="8" w:space="0" w:color="000000"/></w:tcBorders></w:tcPr><w:p><w:pPr><w:pBdr><w:top w:val="nil"/><w:left w:val="nil"/><w:bottom w:val="nil"/><w:right w:val="nil"/><w:between w:val="nil"/></w:pBdr><w:rPr><w:color w:val="000000"/><w:sz w:val="16"/><w:szCs w:val="16"/></w:rPr></w:pPr></w:p></w:tc></w:tr><w:tr><w:trPr><w:trHeight w:val="230"/></w:trPr><w:tc><w:tcPr><w:tcW w:w="635" w:type="dxa"/><w:tcBorders><w:top w:val="single" w:sz="8" w:space="0" w:color="000000"/><w:left w:val="single" w:sz="8" w:space="0" w:color="000000"/><w:bottom w:val="single" w:sz="8" w:space="0" w:color="000000"/><w:right w:val="single" w:sz="8" w:space="0" w:color="000000"/></w:tcBorders></w:tcPr><w:p><w:pPr><w:pBdr><w:top w:val="nil"/><w:left w:val="nil"/><w:bottom w:val="nil"/><w:right w:val="nil"/><w:between w:val="nil"/></w:pBdr><w:rPr><w:color w:val="000000"/><w:sz w:val="16"/><w:szCs w:val="16"/></w:rPr></w:pPr></w:p></w:tc><w:tc><w:tcPr><w:tcW w:w="1465" w:type="dxa"/><w:tcBorders><w:top w:val="single" w:sz="8" w:space="0" w:color="000000"/><w:left w:val="single" w:sz="8" w:space="0" w:color="000000"/><w:bottom w:val="single" w:sz="8" w:space="0" w:color="000000"/><w:right w:val="single" w:sz="8" w:space="0" w:color="000000"/></w:tcBorders></w:tcPr><w:p><w:pPr><w:pBdr><w:top w:val="nil"/><w:left w:val="nil"/><w:bottom w:val="nil"/><w:right w:val="nil"/><w:between w:val="nil"/></w:pBdr><w:rPr><w:color w:val="000000"/><w:sz w:val="16"/><w:szCs w:val="16"/></w:rPr></w:pPr></w:p></w:tc><w:tc><w:tcPr><w:tcW w:w="720" w:type="dxa"/><w:tcBorders><w:top w:val="single" w:sz="8" w:space="0" w:color="000000"/><w:left w:val="single" w:sz="8" w:space="0" w:color="000000"/><w:bottom w:val="single" w:sz="8" w:space="0" w:color="000000"/><w:right w:val="single" w:sz="8" w:space="0" w:color="000000"/></w:tcBorders></w:tcPr><w:p><w:pPr><w:pBdr><w:top w:val="nil"/><w:left w:val="nil"/><w:bottom w:val="nil"/><w:right w:val="nil"/><w:between w:val="nil"/></w:pBdr><w:rPr><w:color w:val="000000"/><w:sz w:val="16"/><w:szCs w:val="16"/></w:rPr></w:pPr></w:p></w:tc><w:tc><w:tcPr><w:tcW w:w="1642" w:type="dxa"/><w:gridSpan w:val="2"/><w:tcBorders><w:top w:val="single" w:sz="8" w:space="0" w:color="000000"/><w:left w:val="single" w:sz="8" w:space="0" w:color="000000"/><w:bottom w:val="single" w:sz="8" w:space="0" w:color="000000"/><w:right w:val="single" w:sz="8" w:space="0" w:color="000000"/></w:tcBorders></w:tcPr><w:p><w:pPr><w:pBdr><w:top w:val="nil"/><w:left w:val="nil"/><w:bottom w:val="nil"/><w:right w:val="nil"/><w:between w:val="nil"/></w:pBdr><w:rPr><w:color w:val="000000"/><w:sz w:val="16"/><w:szCs w:val="16"/></w:rPr></w:pPr></w:p></w:tc><w:tc><w:tcPr><w:tcW w:w="5903" w:type="dxa"/><w:gridSpan w:val="3"/><w:tcBorders><w:top w:val="single" w:sz="8" w:space="0" w:color="000000"/><w:left w:val="single" w:sz="8" w:space="0" w:color="000000"/><w:bottom w:val="single" w:sz="8" w:space="0" w:color="000000"/><w:right w:val="single" w:sz="8" w:space="0" w:color="000000"/></w:tcBorders></w:tcPr><w:p><w:pPr><w:pBdr><w:top w:val="nil"/><w:left w:val="nil"/><w:bottom w:val="nil"/><w:right w:val="nil"/><w:between w:val="nil"/></w:pBdr><w:rPr><w:color w:val="000000"/><w:sz w:val="16"/><w:szCs w:val="16"/></w:rPr></w:pPr></w:p></w:tc></w:tr><w:tr><w:trPr><w:trHeight w:val="230"/></w:trPr><w:tc><w:tcPr><w:tcW w:w="635" w:type="dxa"/><w:tcBorders><w:top w:val="single" w:sz="8" w:space="0" w:color="000000"/><w:left w:val="single" w:sz="8" w:space="0" w:color="000000"/><w:bottom w:val="single" w:sz="8" w:space="0" w:color="000000"/><w:right w:val="single" w:sz="8" w:space="0" w:color="000000"/></w:tcBorders></w:tcPr><w:p><w:pPr><w:pBdr><w:top w:val="nil"/><w:left w:val="nil"/><w:bottom w:val="nil"/><w:right w:val="nil"/><w:between w:val="nil"/></w:pBdr><w:rPr><w:color w:val="000000"/><w:sz w:val="16"/><w:szCs w:val="16"/></w:rPr></w:pPr></w:p></w:tc><w:tc><w:tcPr><w:tcW w:w="1465" w:type="dxa"/><w:tcBorders><w:top w:val="single" w:sz="8" w:space="0" w:color="000000"/><w:left w:val="single" w:sz="8" w:space="0" w:color="000000"/><w:bottom w:val="single" w:sz="8" w:space="0" w:color="000000"/><w:right w:val="single" w:sz="8" w:space="0" w:color="000000"/></w:tcBorders></w:tcPr><w:p><w:pPr><w:pBdr><w:top w:val="nil"/><w:left w:val="nil"/><w:bottom w:val="nil"/><w:right w:val="nil"/><w:between w:val="nil"/></w:pBdr><w:rPr><w:color w:val="000000"/><w:sz w:val="16"/><w:szCs w:val="16"/></w:rPr></w:pPr></w:p></w:tc><w:tc><w:tcPr><w:tcW w:w="720" w:type="dxa"/><w:tcBorders><w:top w:val="single" w:sz="8" w:space="0" w:color="000000"/><w:left w:val="single" w:sz="8" w:space="0" w:color="000000"/><w:bottom w:val="single" w:sz="8" w:space="0" w:color="000000"/><w:right w:val="single" w:sz="8" w:space="0" w:color="000000"/></w:tcBorders></w:tcPr><w:p><w:pPr><w:pBdr><w:top w:val="nil"/><w:left w:val="nil"/><w:bottom w:val="nil"/><w:right w:val="nil"/><w:between w:val="nil"/></w:pBdr><w:rPr><w:color w:val="000000"/><w:sz w:val="16"/><w:szCs w:val="16"/></w:rPr></w:pPr></w:p></w:tc><w:tc><w:tcPr><w:tcW w:w="1642" w:type="dxa"/><w:gridSpan w:val="2"/><w:tcBorders><w:top w:val="single" w:sz="8" w:space="0" w:color="000000"/><w:left w:val="single" w:sz="8" w:space="0" w:color="000000"/><w:bottom w:val="single" w:sz="8" w:space="0" w:color="000000"/><w:right w:val="single" w:sz="8" w:space="0" w:color="000000"/></w:tcBorders></w:tcPr><w:p><w:pPr><w:pBdr><w:top w:val="nil"/><w:left w:val="nil"/><w:bottom w:val="nil"/><w:right w:val="nil"/><w:between w:val="nil"/></w:pBdr><w:rPr><w:color w:val="000000"/><w:sz w:val="16"/><w:szCs w:val="16"/></w:rPr></w:pPr></w:p></w:tc><w:tc><w:tcPr><w:tcW w:w="5903" w:type="dxa"/><w:gridSpan w:val="3"/><w:tcBorders><w:top w:val="single" w:sz="8" w:space="0" w:color="000000"/><w:left w:val="single" w:sz="8" w:space="0" w:color="000000"/><w:bottom w:val="single" w:sz="8" w:space="0" w:color="000000"/><w:right w:val="single" w:sz="8" w:space="0" w:color="000000"/></w:tcBorders></w:tcPr><w:p><w:pPr><w:pBdr><w:top w:val="nil"/><w:left w:val="nil"/><w:bottom w:val="nil"/><w:right w:val="nil"/><w:between w:val="nil"/></w:pBdr><w:rPr><w:color w:val="000000"/><w:sz w:val="16"/><w:szCs w:val="16"/></w:rPr></w:pPr></w:p></w:tc></w:tr><w:tr><w:trPr><w:trHeight w:val="230"/></w:trPr><w:tc><w:tcPr><w:tcW w:w="635" w:type="dxa"/><w:tcBorders><w:top w:val="single" w:sz="8" w:space="0" w:color="000000"/><w:left w:val="single" w:sz="8" w:space="0" w:color="000000"/><w:bottom w:val="single" w:sz="8" w:space="0" w:color="000000"/><w:right w:val="single" w:sz="8" w:space="0" w:color="000000"/></w:tcBorders></w:tcPr><w:p><w:pPr><w:pBdr><w:top w:val="nil"/><w:left w:val="nil"/><w:bottom w:val="nil"/><w:right w:val="nil"/><w:between w:val="nil"/></w:pBdr><w:rPr><w:color w:val="000000"/><w:sz w:val="16"/><w:szCs w:val="16"/></w:rPr></w:pPr></w:p></w:tc><w:tc><w:tcPr><w:tcW w:w="1465" w:type="dxa"/><w:tcBorders><w:top w:val="single" w:sz="8" w:space="0" w:color="000000"/><w:left w:val="single" w:sz="8" w:space="0" w:color="000000"/><w:bottom w:val="single" w:sz="8" w:space="0" w:color="000000"/><w:right w:val="single" w:sz="8" w:space="0" w:color="000000"/></w:tcBorders></w:tcPr><w:p><w:pPr><w:pBdr><w:top w:val="nil"/><w:left w:val="nil"/><w:bottom w:val="nil"/><w:right w:val="nil"/><w:between w:val="nil"/></w:pBdr><w:rPr><w:color w:val="000000"/><w:sz w:val="16"/><w:szCs w:val="16"/></w:rPr></w:pPr></w:p></w:tc><w:tc><w:tcPr><w:tcW w:w="720" w:type="dxa"/><w:tcBorders><w:top w:val="single" w:sz="8" w:space="0" w:color="000000"/><w:left w:val="single" w:sz="8" w:space="0" w:color="000000"/><w:bottom w:val="single" w:sz="8" w:space="0" w:color="000000"/><w:right w:val="single" w:sz="8" w:space="0" w:color="000000"/></w:tcBorders></w:tcPr><w:p><w:pPr><w:pBdr><w:top w:val="nil"/><w:left w:val="nil"/><w:bottom w:val="nil"/><w:right w:val="nil"/><w:between w:val="nil"/></w:pBdr><w:rPr><w:color w:val="000000"/><w:sz w:val="16"/><w:szCs w:val="16"/></w:rPr></w:pPr></w:p></w:tc><w:tc><w:tcPr><w:tcW w:w="1642" w:type="dxa"/><w:gridSpan w:val="2"/><w:tcBorders><w:top w:val="single" w:sz="8" w:space="0" w:color="000000"/><w:left w:val="single" w:sz="8" w:space="0" w:color="000000"/><w:bottom w:val="single" w:sz="8" w:space="0" w:color="000000"/><w:right w:val="single" w:sz="8" w:space="0" w:color="000000"/></w:tcBorders></w:tcPr><w:p><w:pPr><w:pBdr><w:top w:val="nil"/><w:left w:val="nil"/><w:bottom w:val="nil"/><w:right w:val="nil"/><w:between w:val="nil"/></w:pBdr><w:rPr><w:color w:val="000000"/><w:sz w:val="16"/><w:szCs w:val="16"/></w:rPr></w:pPr></w:p></w:tc><w:tc><w:tcPr><w:tcW w:w="5903" w:type="dxa"/><w:gridSpan w:val="3"/><w:tcBorders><w:top w:val="single" w:sz="8" w:space="0" w:color="000000"/><w:left w:val="single" w:sz="8" w:space="0" w:color="000000"/><w:bottom w:val="single" w:sz="8" w:space="0" w:color="000000"/><w:right w:val="single" w:sz="8" w:space="0" w:color="000000"/></w:tcBorders></w:tcPr><w:p><w:pPr><w:pBdr><w:top w:val="nil"/><w:left w:val="nil"/><w:bottom w:val="nil"/><w:right w:val="nil"/><w:between w:val="nil"/></w:pBdr><w:rPr><w:color w:val="000000"/><w:sz w:val="16"/><w:szCs w:val="16"/></w:rPr></w:pPr></w:p></w:tc></w:tr><w:tr><w:trPr><w:trHeight w:val="230"/></w:trPr><w:tc><w:tcPr><w:tcW w:w="10365" w:type="dxa"/><w:gridSpan w:val="8"/><w:tcBorders><w:top w:val="single" w:sz="8" w:space="0" w:color="000000"/><w:left w:val="single" w:sz="8" w:space="0" w:color="000000"/><w:bottom w:val="single" w:sz="8" w:space="0" w:color="000000"/><w:right w:val="single" w:sz="8" w:space="0" w:color="000000"/></w:tcBorders></w:tcPr><w:p><w:pPr><w:pBdr><w:top w:val="nil"/><w:left w:val="nil"/><w:bottom w:val="nil"/><w:right w:val="nil"/><w:between w:val="nil"/></w:pBdr><w:ind w:left="107"/><w:jc w:val="both"/><w:rPr><w:b/><w:color w:val="000000"/><w:sz w:val="24"/><w:szCs w:val="24"/></w:rPr></w:pPr><w:r><w:rPr><w:b/><w:color w:val="000000"/><w:sz w:val="24"/><w:szCs w:val="24"/></w:rPr><w:t>B. CATATAN PENTING HARIAN</w:t></w:r></w:p></w:tc></w:tr><w:tr><w:trPr><w:trHeight w:val="1838"/></w:trPr><w:tc><w:tcPr><w:tcW w:w="10365" w:type="dxa"/><w:gridSpan w:val="8"/><w:tcBorders><w:top w:val="single" w:sz="8" w:space="0" w:color="000000"/><w:left w:val="single" w:sz="8" w:space="0" w:color="000000"/><w:bottom w:val="single" w:sz="8" w:space="0" w:color="000000"/><w:right w:val="single" w:sz="8" w:space="0" w:color="000000"/></w:tcBorders></w:tcPr><w:p><w:pPr><w:pBdr><w:top w:val="nil"/><w:left w:val="nil"/><w:bottom w:val="nil"/><w:right w:val="nil"/><w:between w:val="nil"/></w:pBdr><w:spacing w:line="226" w:lineRule="auto"/><w:ind w:left="107"/><w:rPr><w:b/><w:color w:val="000000"/><w:sz w:val="20"/><w:szCs w:val="20"/></w:rPr></w:pPr><w:r><w:rPr><w:b/><w:color w:val="000000"/><w:sz w:val="20"/><w:szCs w:val="20"/></w:rPr><w:t>1.</w:t></w:r></w:p><w:p><w:pPr><w:pBdr><w:top w:val="nil"/><w:left w:val="nil"/><w:bottom w:val="nil"/><w:right w:val="nil"/><w:between w:val="nil"/></w:pBdr><w:rPr><w:color w:val="000000"/><w:sz w:val="20"/><w:szCs w:val="20"/></w:rPr></w:pPr></w:p><w:p><w:pPr><w:pBdr><w:top w:val="nil"/><w:left w:val="nil"/><w:bottom w:val="nil"/><w:right w:val="nil"/><w:between w:val="nil"/></w:pBdr><w:spacing w:before="2"/><w:rPr><w:color w:val="000000"/><w:sz w:val="20"/><w:szCs w:val="20"/></w:rPr></w:pPr></w:p><w:p><w:pPr><w:pBdr><w:top w:val="nil"/><w:left w:val="nil"/><w:bottom w:val="nil"/><w:right w:val="nil"/><w:between w:val="nil"/></w:pBdr><w:ind w:left="107"/><w:rPr><w:b/><w:color w:val="000000"/><w:sz w:val="20"/><w:szCs w:val="20"/></w:rPr></w:pPr><w:r><w:rPr><w:b/><w:color w:val="000000"/><w:sz w:val="20"/><w:szCs w:val="20"/></w:rPr><w:t>2.</w:t></w:r></w:p><w:p><w:pPr><w:pBdr><w:top w:val="nil"/><w:left w:val="nil"/><w:bottom w:val="nil"/><w:right w:val="nil"/><w:between w:val="nil"/></w:pBdr><w:spacing w:before="228"/><w:rPr><w:color w:val="000000"/><w:sz w:val="20"/><w:szCs w:val="20"/></w:rPr></w:pPr></w:p><w:p><w:pPr><w:pBdr><w:top w:val="nil"/><w:left w:val="nil"/><w:bottom w:val="nil"/><w:right w:val="nil"/><w:between w:val="nil"/></w:pBdr><w:ind w:left="107"/><w:rPr><w:b/><w:color w:val="000000"/><w:sz w:val="20"/><w:szCs w:val="20"/></w:rPr></w:pPr><w:r><w:rPr><w:b/><w:color w:val="000000"/><w:sz w:val="20"/><w:szCs w:val="20"/></w:rPr><w:t>3.</w:t></w:r></w:p></w:tc></w:tr><w:tr><w:trPr><w:trHeight w:val="1579"/></w:trPr><w:tc><w:tcPr><w:tcW w:w="10365" w:type="dxa"/><w:gridSpan w:val="8"/><w:vMerge w:val="restart"/><w:tcBorders><w:top w:val="single" w:sz="8" w:space="0" w:color="000000"/><w:left w:val="single" w:sz="8" w:space="0" w:color="000000"/><w:bottom w:val="single" w:sz="8" w:space="0" w:color="000000"/><w:right w:val="single" w:sz="8" w:space="0" w:color="000000"/></w:tcBorders></w:tcPr><w:p><w:pPr><w:spacing w:line="275" w:lineRule="auto"/><w:ind w:left="107"/><w:rPr><w:b/><w:sz w:val="24"/><w:szCs w:val="24"/></w:rPr></w:pPr><w:r><w:rPr><w:b/><w:sz w:val="24"/><w:szCs w:val="24"/></w:rPr><w:t>D. PENGESAHAN</w:t></w:r></w:p></w:tc></w:tr><w:tr><w:trPr><w:trHeight w:val="276"/></w:trPr><w:tc><w:tcPr><w:tcW w:w="10365" w:type="dxa"/><w:gridSpan w:val="8"/><w:vMerge/><w:tcBorders><w:top w:val="single" w:sz="8" w:space="0" w:color="000000"/><w:left w:val="single" w:sz="8" w:space="0" w:color="000000"/><w:bottom w:val="single" w:sz="8" w:space="0" w:color="000000"/><w:right w:val="single" w:sz="8" w:space="0" w:color="000000"/></w:tcBorders></w:tcPr><w:p><w:pPr><w:pBdr><w:top w:val="nil"/><w:left w:val="nil"/><w:bottom w:val="nil"/><w:right w:val="nil"/><w:between w:val="nil"/></w:pBdr><w:rPr><w:b/><w:color w:val="000000"/><w:sz w:val="24"/><w:szCs w:val="24"/></w:rPr></w:pPr></w:p></w:tc></w:tr><w:tr><w:trPr><w:trHeight w:val="1634"/></w:trPr><w:tc><w:tcPr><w:tcW w:w="5250" w:type="dxa"/><w:gridSpan w:val="6"/><w:tcBorders><w:top w:val="single" w:sz="8" w:space="0" w:color="000000"/><w:left w:val="single" w:sz="8" w:space="0" w:color="000000"/><w:bottom w:val="single" w:sz="8" w:space="0" w:color="000000"/><w:right w:val="single" w:sz="8" w:space="0" w:color="000000"/></w:tcBorders></w:tcPr><w:p><w:pPr><w:pBdr><w:top w:val="nil"/><w:left w:val="nil"/><w:bottom w:val="nil"/><w:right w:val="nil"/><w:between w:val="nil"/></w:pBdr><w:spacing w:line="251" w:lineRule="auto"/><w:ind w:left="263"/><w:rPr><w:b/><w:color w:val="000000"/></w:rPr></w:pPr><w:r><w:rPr><w:b/><w:color w:val="000000"/></w:rPr><w:t>TANDA TANGAN LURAH/KEPALA DESA</w:t></w:r></w:p></w:tc><w:tc><w:tcPr><w:tcW w:w="5115" w:type="dxa"/><w:gridSpan w:val="2"/><w:tcBorders><w:top w:val="single" w:sz="8" w:space="0" w:color="000000"/><w:left w:val="single" w:sz="8" w:space="0" w:color="000000"/><w:bottom w:val="single" w:sz="8" w:space="0" w:color="000000"/><w:right w:val="single" w:sz="8" w:space="0" w:color="000000"/></w:tcBorders></w:tcPr><w:p><w:pPr><w:pBdr><w:top w:val="nil"/><w:left w:val="nil"/><w:bottom w:val="nil"/><w:right w:val="nil"/><w:between w:val="nil"/></w:pBdr><w:spacing w:line="275" w:lineRule="auto"/><w:ind w:left="1001"/><w:rPr><w:b/><w:color w:val="000000"/><w:sz w:val="24"/><w:szCs w:val="24"/></w:rPr></w:pPr><w:r><w:rPr><w:b/><w:color w:val="000000"/><w:sz w:val="24"/><w:szCs w:val="24"/></w:rPr><w:t>TANDA TANGAN MAHASISWA</w:t></w:r></w:p></w:tc></w:tr></w:tbl><w:p><w:pPr><w:spacing w:before="240" w:after="240"/><w:jc w:val="both"/><w:rPr><w:b/><w:sz w:val="24"/><w:szCs w:val="24"/></w:rPr></w:pPr><w:r><w:rPr><w:b/><w:sz w:val="24"/><w:szCs w:val="24"/></w:rPr><w:t>Petunjuk Pengisian:</w:t></w:r></w:p><w:p><w:pPr><w:numPr><w:ilvl w:val="0"/><w:numId w:val="1"/></w:numPr><w:pBdr><w:top w:val="nil"/><w:left w:val="nil"/><w:bottom w:val="nil"/><w:right w:val="nil"/><w:between w:val="nil"/></w:pBdr><w:jc w:val="both"/><w:rPr><w:sz w:val="24"/><w:szCs w:val="24"/></w:rPr></w:pPr><w:r><w:rPr><w:sz w:val="24"/><w:szCs w:val="24"/></w:rPr><w:t xml:space="preserve">Logbook adalah buku catatan harian bagi peserta KKN yang wajib diisi setiap hari dan dilaporkan kepada Dosen Pembimbing Lapangan (DPL) setiap minggu Ling google form. </w:t></w:r></w:p><w:p><w:pPr><w:numPr><w:ilvl w:val="0"/><w:numId w:val="1"/></w:numPr><w:pBdr><w:top w:val="nil"/><w:left w:val="nil"/><w:bottom w:val="nil"/><w:right w:val="nil"/><w:between w:val="nil"/></w:pBdr><w:jc w:val="both"/><w:rPr><w:sz w:val="24"/><w:szCs w:val="24"/></w:rPr></w:pPr><w:r><w:rPr><w:sz w:val="24"/><w:szCs w:val="24"/></w:rPr><w:t>Logbook hanya boleh diisi dengan aktivitas yang berkaitan dengan program KKN.</w:t></w:r></w:p><w:p><w:pPr><w:numPr><w:ilvl w:val="0"/><w:numId w:val="1"/></w:numPr><w:pBdr><w:top w:val="nil"/><w:left w:val="nil"/><w:bottom w:val="nil"/><w:right w:val="nil"/><w:between w:val="nil"/></w:pBdr><w:jc w:val="both"/><w:rPr><w:sz w:val="24"/><w:szCs w:val="24"/></w:rPr></w:pPr><w:r><w:rPr><w:sz w:val="24"/><w:szCs w:val="24"/></w:rPr><w:t>Setiap logbook harus ditempelkan pas foto berwarna terbaru dengan ukuran 4x6 cm.</w:t></w:r></w:p><w:p><w:pPr><w:numPr><w:ilvl w:val="0"/><w:numId w:val="1"/></w:numPr><w:pBdr><w:top w:val="nil"/><w:left w:val="nil"/><w:bottom w:val="nil"/><w:right w:val="nil"/><w:between w:val="nil"/></w:pBdr><w:jc w:val="both"/><w:rPr><w:sz w:val="24"/><w:szCs w:val="24"/></w:rPr></w:pPr><w:r><w:rPr><w:sz w:val="24"/><w:szCs w:val="24"/></w:rPr><w:t>Isi logbook mencakup kegiatan harian, catatan penting, serta dokumentasi seperti foto, tautan video, dan lain-lain.</w:t></w:r></w:p><w:p><w:pPr><w:numPr><w:ilvl w:val="0"/><w:numId w:val="1"/></w:numPr><w:pBdr><w:top w:val="nil"/><w:left w:val="nil"/><w:bottom w:val="nil"/><w:right w:val="nil"/><w:between w:val="nil"/></w:pBdr><w:jc w:val="both"/><w:rPr><w:sz w:val="24"/><w:szCs w:val="24"/></w:rPr></w:pPr><w:r><w:rPr><w:sz w:val="24"/><w:szCs w:val="24"/></w:rPr><w:t>Penulisan logbook harus menggunakan bahasa Indonesia yang baik dan benar sesuai kaidah baku.</w:t></w:r></w:p><w:p><w:pPr><w:numPr><w:ilvl w:val="0"/><w:numId w:val="1"/></w:numPr><w:pBdr><w:top w:val="nil"/><w:left w:val="nil"/><w:bottom w:val="nil"/><w:right w:val="nil"/><w:between w:val="nil"/></w:pBdr><w:jc w:val="both"/><w:rPr><w:sz w:val="24"/><w:szCs w:val="24"/></w:rPr></w:pPr><w:r><w:rPr><w:sz w:val="24"/><w:szCs w:val="24"/></w:rPr><w:t>Pada bagian kolom pengesahan, mahasiswa wajib menandatangani serta menuliskan nama lengkapnya, kemudian nama lurah, kepala desa, atau pihak berwenang lainnya.</w:t></w:r></w:p><w:p><w:pPr><w:numPr><w:ilvl w:val="0"/><w:numId w:val="1"/></w:numPr><w:pBdr><w:top w:val="nil"/><w:left w:val="nil"/><w:bottom w:val="nil"/><w:right w:val="nil"/><w:between w:val="nil"/></w:pBdr><w:jc w:val="both"/><w:rPr><w:sz w:val="24"/><w:szCs w:val="24"/></w:rPr></w:pPr><w:r><w:rPr><w:sz w:val="24"/><w:szCs w:val="24"/></w:rPr><w:t>Selanjutnya, lurah, kepala desa, atau pihak berwenang terkait diminta untuk memberikan tanda tangan pada logbook mingguan tersebut.</w:t></w:r></w:p><w:p><w:pPr><w:numPr><w:ilvl w:val="0"/><w:numId w:val="1"/></w:numPr><w:pBdr><w:top w:val="nil"/><w:left w:val="nil"/><w:bottom w:val="nil"/><w:right w:val="nil"/><w:between w:val="nil"/></w:pBdr><w:jc w:val="both"/><w:rPr><w:sz w:val="24"/><w:szCs w:val="24"/></w:rPr></w:pPr><w:r><w:rPr><w:sz w:val="24"/><w:szCs w:val="24"/></w:rPr><w:t>Mahasiswa kemudian mengirimkan logbook mingguan secara daring kepada DPL masing-masing.</w:t></w:r></w:p><w:p><w:pPr><w:numPr><w:ilvl w:val="0"/><w:numId w:val="1"/></w:numPr><w:pBdr><w:top w:val="nil"/><w:left w:val="nil"/><w:bottom w:val="nil"/><w:right w:val="nil"/><w:between w:val="nil"/></w:pBdr><w:jc w:val="both"/><w:rPr><w:sz w:val="24"/><w:szCs w:val="24"/></w:rPr></w:pPr><w:r><w:rPr><w:sz w:val="24"/><w:szCs w:val="24"/></w:rPr><w:t>DPL akan memeriksa dan memberikan tanggapan terhadap logbook setiap minggu.</w:t></w:r><w:r><w:rPr><w:sz w:val="24"/><w:szCs w:val="24"/></w:rPr><w:br/></w:r></w:p><w:p><w:pPr><w:pBdr><w:top w:val="nil"/><w:left w:val="nil"/><w:bottom w:val="nil"/><w:right w:val="nil"/><w:between w:val="nil"/></w:pBdr><w:ind w:left="1080"/><w:jc w:val="both"/><w:rPr><w:sz w:val="24"/><w:szCs w:val="24"/></w:rPr></w:pPr></w:p><w:sectPr><w:pgSz w:w="12240" w:h="15840"/><w:pgMar w:top="1440" w:right="1440" w:bottom="1440" w:left="1440" w:header="708" w:footer="708" w:gutter="0"/><w:pgNumType w:start="1"/><w:cols w:space="720"/></w:sectPr></w:body></w:document>
+<file path=word/document.xml><?xml version="1.0" encoding="utf-8"?>
+<w:document xmlns:wpc="http://schemas.microsoft.com/office/word/2010/wordprocessingCanvas" xmlns:cx="http://schemas.microsoft.com/office/drawing/2014/chartex" xmlns:cx1="http://schemas.microsoft.com/office/drawing/2015/9/8/chartex" xmlns:cx2="http://schemas.microsoft.com/office/drawing/2015/10/21/chartex" xmlns:cx3="http://schemas.microsoft.com/office/drawing/2016/5/9/chartex" xmlns:cx4="http://schemas.microsoft.com/office/drawing/2016/5/10/chartex" xmlns:cx5="http://schemas.microsoft.com/office/drawing/2016/5/11/chartex" xmlns:cx6="http://schemas.microsoft.com/office/drawing/2016/5/12/chartex" xmlns:cx7="http://schemas.microsoft.com/office/drawing/2016/5/13/chartex" xmlns:cx8="http://schemas.microsoft.com/office/drawing/2016/5/14/chartex" xmlns:mc="http://schemas.openxmlformats.org/markup-compatibility/2006" xmlns:aink="http://schemas.microsoft.com/office/drawing/2016/ink" xmlns:am3d="http://schemas.microsoft.com/office/drawing/2017/model3d" xmlns:o="urn:schemas-microsoft-com:office:office" xmlns:oel="http://schemas.microsoft.com/office/2019/extlst" xmlns:r="http://schemas.openxmlformats.org/officeDocument/2006/relationships" xmlns:m="http://schemas.openxmlformats.org/officeDocument/2006/math" xmlns:v="urn:schemas-microsoft-com:vml" xmlns:wp14="http://schemas.microsoft.com/office/word/2010/wordprocessingDrawing" xmlns:wp="http://schemas.openxmlformats.org/drawingml/2006/wordprocessingDrawing" xmlns:w10="urn:schemas-microsoft-com:office:word" xmlns:w="http://schemas.openxmlformats.org/wordprocessingml/2006/main" xmlns:w14="http://schemas.microsoft.com/office/word/2010/wordml" xmlns:w15="http://schemas.microsoft.com/office/word/2012/wordml" xmlns:w16cex="http://schemas.microsoft.com/office/word/2018/wordml/cex" xmlns:w16cid="http://schemas.microsoft.com/office/word/2016/wordml/cid" xmlns:w16="http://schemas.microsoft.com/office/word/2018/wordml" xmlns:w16du="http://schemas.microsoft.com/office/word/2023/wordml/word16du" xmlns:w16sdtdh="http://schemas.microsoft.com/office/word/2020/wordml/sdtdatahash" xmlns:w16sdtfl="http://schemas.microsoft.com/office/word/2024/wordml/sdtformatlock" xmlns:w16se="http://schemas.microsoft.com/office/word/2015/wordml/symex" xmlns:wpg="http://schemas.microsoft.com/office/word/2010/wordprocessingGroup" xmlns:wpi="http://schemas.microsoft.com/office/word/2010/wordprocessingInk" xmlns:wne="http://schemas.microsoft.com/office/word/2006/wordml" xmlns:wps="http://schemas.microsoft.com/office/word/2010/wordprocessingShape" mc:Ignorable="w14 w15 w16se w16cid w16 w16cex w16sdtdh w16sdtfl w16du wp14">
+  <w:body>
+    <w:p>
+      <w:pPr>
+        <w:spacing w:before="58"/>
+        <w:ind w:left="356" w:right="360"/>
+        <w:jc w:val="center"/>
+        <w:rPr>
+          <w:b/>
+          <w:i/>
+          <w:sz w:val="32"/>
+          <w:szCs w:val="32"/>
+        </w:rPr>
+      </w:pPr>
+      <w:r>
+        <w:rPr>
+          <w:b/>
+          <w:sz w:val="32"/>
+          <w:szCs w:val="32"/>
+        </w:rPr>
+        <w:t xml:space="preserve">BUKU CATATAN HARIAN </w:t>
+      </w:r>
+      <w:r>
+        <w:rPr>
+          <w:b/>
+          <w:i/>
+          <w:sz w:val="32"/>
+          <w:szCs w:val="32"/>
+        </w:rPr>
+        <w:t>(LOGBOOK)</w:t>
+      </w:r>
+    </w:p>
+    <w:p>
+      <w:pPr>
+        <w:pBdr>
+          <w:top w:val="nil"/>
+          <w:left w:val="nil"/>
+          <w:bottom w:val="nil"/>
+          <w:right w:val="nil"/>
+          <w:between w:val="nil"/>
+        </w:pBdr>
+        <w:spacing w:before="31"/>
+        <w:rPr>
+          <w:b/>
+          <w:i/>
+          <w:color w:val="000000"/>
+          <w:sz w:val="32"/>
+          <w:szCs w:val="32"/>
+        </w:rPr>
+      </w:pPr>
+    </w:p>
+    <w:p>
+      <w:pPr>
+        <w:pStyle w:val="Title"/>
+        <w:spacing w:after="0"/>
+        <w:jc w:val="center"/>
+        <w:rPr>
+          <w:rFonts w:ascii="Times New Roman" w:eastAsia="Times New Roman" w:hAnsi="Times New Roman" w:cs="Times New Roman"/>
+          <w:b/>
+          <w:sz w:val="32"/>
+          <w:szCs w:val="32"/>
+        </w:rPr>
+      </w:pPr>
+      <w:r>
+        <w:rPr>
+          <w:rFonts w:ascii="Times New Roman" w:eastAsia="Times New Roman" w:hAnsi="Times New Roman" w:cs="Times New Roman"/>
+          <w:b/>
+          <w:sz w:val="32"/>
+          <w:szCs w:val="32"/>
+        </w:rPr>
+        <w:t xml:space="preserve">KULIAH KERJA NYATA (KKN) </w:t>
+      </w:r>
+    </w:p>
+    <w:p>
+      <w:pPr>
+        <w:pStyle w:val="Title"/>
+        <w:jc w:val="center"/>
+        <w:rPr>
+          <w:rFonts w:ascii="Times New Roman" w:eastAsia="Times New Roman" w:hAnsi="Times New Roman" w:cs="Times New Roman"/>
+          <w:b/>
+          <w:sz w:val="32"/>
+          <w:szCs w:val="32"/>
+        </w:rPr>
+      </w:pPr>
+      <w:r>
+        <w:rPr>
+          <w:rFonts w:ascii="Times New Roman" w:eastAsia="Times New Roman" w:hAnsi="Times New Roman" w:cs="Times New Roman"/>
+          <w:b/>
+          <w:sz w:val="32"/>
+          <w:szCs w:val="32"/>
+        </w:rPr>
+        <w:t>UNIVERSITAS MARITIM RAJA ALI HAJI</w:t>
+      </w:r>
+    </w:p>
+    <w:p>
+      <w:pPr>
+        <w:pBdr>
+          <w:top w:val="nil"/>
+          <w:left w:val="nil"/>
+          <w:bottom w:val="nil"/>
+          <w:right w:val="nil"/>
+          <w:between w:val="nil"/>
+        </w:pBdr>
+        <w:rPr>
+          <w:b/>
+          <w:color w:val="000000"/>
+          <w:sz w:val="20"/>
+          <w:szCs w:val="20"/>
+        </w:rPr>
+      </w:pPr>
+    </w:p>
+    <w:p>
+      <w:pPr>
+        <w:pBdr>
+          <w:top w:val="nil"/>
+          <w:left w:val="nil"/>
+          <w:bottom w:val="nil"/>
+          <w:right w:val="nil"/>
+          <w:between w:val="nil"/>
+        </w:pBdr>
+        <w:rPr>
+          <w:b/>
+          <w:color w:val="000000"/>
+          <w:sz w:val="20"/>
+          <w:szCs w:val="20"/>
+        </w:rPr>
+      </w:pPr>
+    </w:p>
+    <w:p>
+      <w:pPr>
+        <w:pBdr>
+          <w:top w:val="nil"/>
+          <w:left w:val="nil"/>
+          <w:bottom w:val="nil"/>
+          <w:right w:val="nil"/>
+          <w:between w:val="nil"/>
+        </w:pBdr>
+        <w:spacing w:before="190"/>
+        <w:rPr>
+          <w:b/>
+          <w:color w:val="000000"/>
+          <w:sz w:val="20"/>
+          <w:szCs w:val="20"/>
+        </w:rPr>
+      </w:pPr>
+      <w:r>
+        <w:rPr>
+          <w:noProof/>
+        </w:rPr>
+        <mc:AlternateContent>
+          <mc:Choice Requires="wps">
+            <w:drawing>
+              <wp:anchor distT="0" distB="0" distL="0" distR="0" simplePos="0" relativeHeight="251658240" behindDoc="0" locked="0" layoutInCell="1" hidden="0" allowOverlap="1" wp14:anchorId="2B734385" wp14:editId="7FF21EA1">
+                <wp:simplePos x="0" y="0"/>
+                <wp:positionH relativeFrom="column">
+                  <wp:posOffset>2336800</wp:posOffset>
+                </wp:positionH>
+                <wp:positionV relativeFrom="paragraph">
+                  <wp:posOffset>279400</wp:posOffset>
+                </wp:positionV>
+                <wp:extent cx="1270000" cy="1546225"/>
+                <wp:effectExtent l="0" t="0" r="0" b="0"/>
+                <wp:wrapTopAndBottom distT="0" distB="0"/>
+                <wp:docPr id="1900290529" name="Rectangle 1900290529"/>
+                <wp:cNvGraphicFramePr/>
+                <a:graphic xmlns:a="http://schemas.openxmlformats.org/drawingml/2006/main">
+                  <a:graphicData uri="http://schemas.microsoft.com/office/word/2010/wordprocessingShape">
+                    <wps:wsp>
+                      <wps:cNvSpPr/>
+                      <wps:spPr>
+                        <a:xfrm>
+                          <a:off x="4717350" y="3013238"/>
+                          <a:ext cx="1257300" cy="1533525"/>
+                        </a:xfrm>
+                        <a:prstGeom prst="rect">
+                          <a:avLst/>
+                        </a:prstGeom>
+                        <a:noFill/>
+                        <a:ln w="12700" cap="flat" cmpd="sng">
+                          <a:solidFill>
+                            <a:srgbClr val="000000"/>
+                          </a:solidFill>
+                          <a:prstDash val="solid"/>
+                          <a:round/>
+                          <a:headEnd type="none" w="sm" len="sm"/>
+                          <a:tailEnd type="none" w="sm" len="sm"/>
+                        </a:ln>
+                      </wps:spPr>
+                      <wps:txbx>
+                        <w:txbxContent>
+                          <w:p>
+                            <w:pPr>
+                              <w:textDirection w:val="btLr"/>
+                            </w:pPr>
+                          </w:p>
+                          <w:p>
+                            <w:pPr>
+                              <w:textDirection w:val="btLr"/>
+                            </w:pPr>
+                          </w:p>
+                          <w:p>
+                            <w:pPr>
+                              <w:textDirection w:val="btLr"/>
+                            </w:pPr>
+                          </w:p>
+                          <w:p>
+                            <w:pPr>
+                              <w:spacing w:before="165"/>
+                              <w:textDirection w:val="btLr"/>
+                            </w:pPr>
+                          </w:p>
+                          <w:p>
+                            <w:pPr>
+                              <w:ind w:left="622" w:firstLine="622"/>
+                              <w:jc w:val="center"/>
+                              <w:textDirection w:val="btLr"/>
+                            </w:pPr>
+                            <w:r>
+                              <w:rPr>
+                                <w:color w:val="000000"/>
+                                <w:sz w:val="20"/>
+                              </w:rPr>
+                              <w:t>Foto 4x6</w:t>
+                            </w:r>
+                          </w:p>
+                        </w:txbxContent>
+                      </wps:txbx>
+                      <wps:bodyPr spcFirstLastPara="1" wrap="square" lIns="0" tIns="0" rIns="0" bIns="0" anchor="t" anchorCtr="0">
+                        <a:noAutofit/>
+                      </wps:bodyPr>
+                    </wps:wsp>
+                  </a:graphicData>
+                </a:graphic>
+              </wp:anchor>
+            </w:drawing>
+          </mc:Choice>
+          <mc:Fallback>
+            <w:pict>
+              <v:rect w14:anchorId="2B734385" id="Rectangle 1900290529" o:spid="_x0000_s1026" style="position:absolute;margin-left:184pt;margin-top:22pt;width:100pt;height:121.75pt;z-index:251658240;visibility:visible;mso-wrap-style:square;mso-wrap-distance-left:0;mso-wrap-distance-top:0;mso-wrap-distance-right:0;mso-wrap-distance-bottom:0;mso-position-horizontal:absolute;mso-position-horizontal-relative:text;mso-position-vertical:absolute;mso-position-vertical-relative:text;v-text-anchor:top" o:gfxdata="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" filled="f" strokeweight="1pt">
+                <v:stroke startarrowwidth="narrow" startarrowlength="short" endarrowwidth="narrow" endarrowlength="short" joinstyle="round"/>
+                <v:textbox inset="0,0,0,0">
+                  <w:txbxContent>
+                    <w:p>
+                      <w:pPr>
+                        <w:textDirection w:val="btLr"/>
+                      </w:pPr>
+                    </w:p>
+                    <w:p>
+                      <w:pPr>
+                        <w:textDirection w:val="btLr"/>
+                      </w:pPr>
+                    </w:p>
+                    <w:p>
+                      <w:pPr>
+                        <w:textDirection w:val="btLr"/>
+                      </w:pPr>
+                    </w:p>
+                    <w:p>
+                      <w:pPr>
+                        <w:spacing w:before="165"/>
+                        <w:textDirection w:val="btLr"/>
+                      </w:pPr>
+                    </w:p>
+                    <w:p>
+                      <w:pPr>
+                        <w:ind w:left="622" w:firstLine="622"/>
+                        <w:jc w:val="center"/>
+                        <w:textDirection w:val="btLr"/>
+                      </w:pPr>
+                      <w:r>
+                        <w:rPr>
+                          <w:color w:val="000000"/>
+                          <w:sz w:val="20"/>
+                        </w:rPr>
+                        <w:t>Foto 4x6</w:t>
+                      </w:r>
+                    </w:p>
+                  </w:txbxContent>
+                </v:textbox>
+                <w10:wrap type="topAndBottom"/>
+              </v:rect>
+            </w:pict>
+          </mc:Fallback>
+        </mc:AlternateContent>
+      </w:r>
+    </w:p>
+    <w:p>
+      <w:pPr>
+        <w:pBdr>
+          <w:top w:val="nil"/>
+          <w:left w:val="nil"/>
+          <w:bottom w:val="nil"/>
+          <w:right w:val="nil"/>
+          <w:between w:val="nil"/>
+        </w:pBdr>
+        <w:rPr>
+          <w:b/>
+          <w:color w:val="000000"/>
+          <w:sz w:val="20"/>
+          <w:szCs w:val="20"/>
+        </w:rPr>
+      </w:pPr>
+    </w:p>
+    <w:p>
+      <w:pPr>
+        <w:pBdr>
+          <w:top w:val="nil"/>
+          <w:left w:val="nil"/>
+          <w:bottom w:val="nil"/>
+          <w:right w:val="nil"/>
+          <w:between w:val="nil"/>
+        </w:pBdr>
+        <w:spacing w:before="63"/>
+        <w:rPr>
+          <w:b/>
+          <w:color w:val="000000"/>
+          <w:sz w:val="20"/>
+          <w:szCs w:val="20"/>
+        </w:rPr>
+      </w:pPr>
+    </w:p>
+    <w:tbl>
+      <w:tblPr>
+        <w:tblStyle w:val="a"/>
+        <w:tblW w:w="9354" w:type="dxa"/>
+        <w:tblInd w:w="-5" w:type="dxa"/>
+        <w:tblBorders>
+          <w:top w:val="single" w:sz="4" w:space="0" w:color="000000"/>
+          <w:left w:val="single" w:sz="4" w:space="0" w:color="000000"/>
+          <w:bottom w:val="single" w:sz="4" w:space="0" w:color="000000"/>
+          <w:right w:val="single" w:sz="4" w:space="0" w:color="000000"/>
+          <w:insideH w:val="single" w:sz="4" w:space="0" w:color="000000"/>
+          <w:insideV w:val="single" w:sz="4" w:space="0" w:color="000000"/>
+        </w:tblBorders>
+        <w:tblLayout w:type="fixed"/>
+        <w:tblLook w:val="0000" w:firstRow="0" w:lastRow="0" w:firstColumn="0" w:lastColumn="0" w:noHBand="0" w:noVBand="0"/>
+      </w:tblPr>
+      <w:tblGrid>
+        <w:gridCol w:w="4677"/>
+        <w:gridCol w:w="4677"/>
+      </w:tblGrid>
+      <w:tr>
+        <w:trPr>
+          <w:trHeight w:val="365"/>
+        </w:trPr>
+        <w:tc>
+          <w:tcPr>
+            <w:tcW w:w="4677" w:type="dxa"/>
+          </w:tcPr>
+          <w:p>
+            <w:pPr>
+              <w:pBdr>
+                <w:top w:val="nil"/>
+                <w:left w:val="nil"/>
+                <w:bottom w:val="nil"/>
+                <w:right w:val="nil"/>
+                <w:between w:val="nil"/>
+              </w:pBdr>
+              <w:spacing w:line="226" w:lineRule="auto"/>
+              <w:ind w:left="107"/>
+              <w:rPr>
+                <w:color w:val="000000"/>
+                <w:sz w:val="20"/>
+                <w:szCs w:val="20"/>
+              </w:rPr>
+            </w:pPr>
+            <w:r>
+              <w:rPr>
+                <w:color w:val="000000"/>
+                <w:sz w:val="20"/>
+                <w:szCs w:val="20"/>
+              </w:rPr>
+              <w:t>NAMA</w:t>
+            </w:r>
+          </w:p>
+        </w:tc>
+        <w:tc>
+          <w:tcPr>
+            <w:tcW w:w="4677" w:type="dxa"/>
+          </w:tcPr>
+          <w:p>
+            <w:r>
+              <w:rPr>
+                <w:rFonts w:ascii="Times New Roman" w:hAnsi="Times New Roman"/>
+                <w:sz w:val="22"/>
+                <w:b/>
+              </w:rPr>
+              <w:t>{full_name}</w:t>
+            </w:r>
+          </w:p>
+        </w:tc>
+      </w:tr>
+      <w:tr>
+        <w:trPr>
+          <w:trHeight w:val="366"/>
+        </w:trPr>
+        <w:tc>
+          <w:tcPr>
+            <w:tcW w:w="4677" w:type="dxa"/>
+          </w:tcPr>
+          <w:p>
+            <w:pPr>
+              <w:pBdr>
+                <w:top w:val="nil"/>
+                <w:left w:val="nil"/>
+                <w:bottom w:val="nil"/>
+                <w:right w:val="nil"/>
+                <w:between w:val="nil"/>
+              </w:pBdr>
+              <w:spacing w:line="227" w:lineRule="auto"/>
+              <w:ind w:left="107"/>
+              <w:rPr>
+                <w:color w:val="000000"/>
+                <w:sz w:val="20"/>
+                <w:szCs w:val="20"/>
+              </w:rPr>
+            </w:pPr>
+            <w:r>
+              <w:rPr>
+                <w:color w:val="000000"/>
+                <w:sz w:val="20"/>
+                <w:szCs w:val="20"/>
+              </w:rPr>
+              <w:t>NIM</w:t>
+            </w:r>
+          </w:p>
+        </w:tc>
+        <w:tc>
+          <w:tcPr>
+            <w:tcW w:w="4677" w:type="dxa"/>
+          </w:tcPr>
+          <w:p>
+            <w:r>
+              <w:rPr>
+                <w:rFonts w:ascii="Times New Roman" w:hAnsi="Times New Roman"/>
+                <w:sz w:val="22"/>
+                <w:b/>
+              </w:rPr>
+              <w:t>{student_id}</w:t>
+            </w:r>
+          </w:p>
+        </w:tc>
+      </w:tr>
+      <w:tr>
+        <w:trPr>
+          <w:trHeight w:val="370"/>
+        </w:trPr>
+        <w:tc>
+          <w:tcPr>
+            <w:tcW w:w="4677" w:type="dxa"/>
+          </w:tcPr>
+          <w:p>
+            <w:pPr>
+              <w:pBdr>
+                <w:top w:val="nil"/>
+                <w:left w:val="nil"/>
+                <w:bottom w:val="nil"/>
+                <w:right w:val="nil"/>
+                <w:between w:val="nil"/>
+              </w:pBdr>
+              <w:spacing w:line="226" w:lineRule="auto"/>
+              <w:ind w:left="107"/>
+              <w:rPr>
+                <w:color w:val="000000"/>
+                <w:sz w:val="20"/>
+                <w:szCs w:val="20"/>
+              </w:rPr>
+            </w:pPr>
+            <w:r>
+              <w:rPr>
+                <w:color w:val="000000"/>
+                <w:sz w:val="20"/>
+                <w:szCs w:val="20"/>
+              </w:rPr>
+              <w:t>FAKULTAS/PRODI</w:t>
+            </w:r>
+          </w:p>
+        </w:tc>
+        <w:tc>
+          <w:tcPr>
+            <w:tcW w:w="4677" w:type="dxa"/>
+          </w:tcPr>
+          <w:p>
+            <w:r>
+              <w:rPr>
+                <w:rFonts w:ascii="Times New Roman" w:hAnsi="Times New Roman"/>
+                <w:sz w:val="22"/>
+                <w:b/>
+              </w:rPr>
+              <w:t>{faculty_prodi}</w:t>
+            </w:r>
+          </w:p>
+        </w:tc>
+      </w:tr>
+      <w:tr>
+        <w:trPr>
+          <w:trHeight w:val="366"/>
+        </w:trPr>
+        <w:tc>
+          <w:tcPr>
+            <w:tcW w:w="4677" w:type="dxa"/>
+          </w:tcPr>
+          <w:p>
+            <w:pPr>
+              <w:pBdr>
+                <w:top w:val="nil"/>
+                <w:left w:val="nil"/>
+                <w:bottom w:val="nil"/>
+                <w:right w:val="nil"/>
+                <w:between w:val="nil"/>
+              </w:pBdr>
+              <w:spacing w:line="222" w:lineRule="auto"/>
+              <w:ind w:left="107"/>
+              <w:rPr>
+                <w:color w:val="000000"/>
+                <w:sz w:val="20"/>
+                <w:szCs w:val="20"/>
+              </w:rPr>
+            </w:pPr>
+            <w:r>
+              <w:rPr>
+                <w:color w:val="000000"/>
+                <w:sz w:val="20"/>
+                <w:szCs w:val="20"/>
+              </w:rPr>
+              <w:t>NAMA LOKASI KKN</w:t>
+            </w:r>
+          </w:p>
+        </w:tc>
+        <w:tc>
+          <w:tcPr>
+            <w:tcW w:w="4677" w:type="dxa"/>
+          </w:tcPr>
+          <w:p>
+            <w:r>
+              <w:rPr>
+                <w:rFonts w:ascii="Times New Roman" w:hAnsi="Times New Roman"/>
+                <w:sz w:val="22"/>
+                <w:b/>
+              </w:rPr>
+              <w:t>{group_location}</w:t>
+            </w:r>
+          </w:p>
+        </w:tc>
+      </w:tr>
+      <w:tr>
+        <w:trPr>
+          <w:trHeight w:val="362"/>
+        </w:trPr>
+        <w:tc>
+          <w:tcPr>
+            <w:tcW w:w="4677" w:type="dxa"/>
+          </w:tcPr>
+          <w:p>
+            <w:pPr>
+              <w:pBdr>
+                <w:top w:val="nil"/>
+                <w:left w:val="nil"/>
+                <w:bottom w:val="nil"/>
+                <w:right w:val="nil"/>
+                <w:between w:val="nil"/>
+              </w:pBdr>
+              <w:spacing w:line="222" w:lineRule="auto"/>
+              <w:ind w:left="107"/>
+              <w:rPr>
+                <w:color w:val="000000"/>
+                <w:sz w:val="20"/>
+                <w:szCs w:val="20"/>
+              </w:rPr>
+            </w:pPr>
+            <w:r>
+              <w:rPr>
+                <w:color w:val="000000"/>
+                <w:sz w:val="20"/>
+                <w:szCs w:val="20"/>
+              </w:rPr>
+              <w:t>NAMA DOSEN PENDAMPING LAPANGAN</w:t>
+            </w:r>
+          </w:p>
+        </w:tc>
+        <w:tc>
+          <w:tcPr>
+            <w:tcW w:w="4677" w:type="dxa"/>
+          </w:tcPr>
+          <w:p>
+            <w:r>
+              <w:rPr>
+                <w:rFonts w:ascii="Times New Roman" w:hAnsi="Times New Roman"/>
+                <w:sz w:val="22"/>
+                <w:b/>
+              </w:rPr>
+              <w:t>{dosen_name}</w:t>
+            </w:r>
+          </w:p>
+        </w:tc>
+      </w:tr>
+    </w:tbl>
+    <w:p>
+      <w:pPr>
+        <w:pBdr>
+          <w:top w:val="nil"/>
+          <w:left w:val="nil"/>
+          <w:bottom w:val="nil"/>
+          <w:right w:val="nil"/>
+          <w:between w:val="nil"/>
+        </w:pBdr>
+        <w:rPr>
+          <w:b/>
+          <w:color w:val="000000"/>
+          <w:sz w:val="20"/>
+          <w:szCs w:val="20"/>
+        </w:rPr>
+      </w:pPr>
+      <w:r>
+        <w:rPr>
+          <w:noProof/>
+        </w:rPr>
+        <w:drawing>
+          <wp:anchor distT="0" distB="0" distL="114300" distR="114300" simplePos="0" relativeHeight="251659264" behindDoc="0" locked="0" layoutInCell="1" hidden="0" allowOverlap="1" wp14:anchorId="068DF41D" wp14:editId="0EDAA620">
+            <wp:simplePos x="0" y="0"/>
+            <wp:positionH relativeFrom="column">
+              <wp:posOffset>1955482</wp:posOffset>
+            </wp:positionH>
+            <wp:positionV relativeFrom="paragraph">
+              <wp:posOffset>215900</wp:posOffset>
+            </wp:positionV>
+            <wp:extent cx="2032635" cy="2035175"/>
+            <wp:effectExtent l="0" t="0" r="0" b="0"/>
+            <wp:wrapTopAndBottom distT="0" distB="0"/>
+            <wp:docPr id="1900290531" name="image2.png"/>
+            <wp:cNvGraphicFramePr/>
+            <a:graphic xmlns:a="http://schemas.openxmlformats.org/drawingml/2006/main">
+              <a:graphicData uri="http://schemas.openxmlformats.org/drawingml/2006/picture">
+                <pic:pic xmlns:pic="http://schemas.openxmlformats.org/drawingml/2006/picture">
+                  <pic:nvPicPr>
+                    <pic:cNvPr id="0" name="image2.png"/>
+                    <pic:cNvPicPr preferRelativeResize="0"/>
+                  </pic:nvPicPr>
+                  <pic:blipFill>
+                    <a:blip r:embed="rId6"/>
+                    <a:srcRect/>
+                    <a:stretch>
+                      <a:fillRect/>
+                    </a:stretch>
+                  </pic:blipFill>
+                  <pic:spPr>
+                    <a:xfrm>
+                      <a:off x="0" y="0"/>
+                      <a:ext cx="2032635" cy="2035175"/>
+                    </a:xfrm>
+                    <a:prstGeom prst="rect">
+                      <a:avLst/>
+                    </a:prstGeom>
+                    <a:ln/>
+                  </pic:spPr>
+                </pic:pic>
+              </a:graphicData>
+            </a:graphic>
+          </wp:anchor>
+        </w:drawing>
+      </w:r>
+    </w:p>
+    <w:p>
+      <w:pPr>
+        <w:spacing w:before="2"/>
+        <w:ind w:left="2880" w:right="3233"/>
+        <w:jc w:val="center"/>
+        <w:rPr>
+          <w:sz w:val="26"/>
+          <w:szCs w:val="26"/>
+        </w:rPr>
+      </w:pPr>
+    </w:p>
+    <w:p>
+      <w:pPr>
+        <w:jc w:val="center"/>
+        <w:rPr>
+          <w:sz w:val="26"/>
+          <w:szCs w:val="26"/>
+        </w:rPr>
+      </w:pPr>
+    </w:p>
+    <w:p>
+      <w:pPr>
+        <w:pBdr>
+          <w:top w:val="nil"/>
+          <w:left w:val="nil"/>
+          <w:bottom w:val="nil"/>
+          <w:right w:val="nil"/>
+          <w:between w:val="nil"/>
+        </w:pBdr>
+        <w:jc w:val="center"/>
+        <w:rPr>
+          <w:sz w:val="26"/>
+          <w:szCs w:val="26"/>
+        </w:rPr>
+      </w:pPr>
+      <w:r>
+        <w:rPr>
+          <w:sz w:val="26"/>
+          <w:szCs w:val="26"/>
+        </w:rPr>
+        <w:t>LEMBAGA PENELITIAN DAN PENGABDIAN KEPADA MASYARAKAT</w:t>
+      </w:r>
+    </w:p>
+    <w:p>
+      <w:pPr>
+        <w:jc w:val="center"/>
+        <w:rPr>
+          <w:sz w:val="26"/>
+          <w:szCs w:val="26"/>
+        </w:rPr>
+      </w:pPr>
+      <w:r>
+        <w:rPr>
+          <w:sz w:val="26"/>
+          <w:szCs w:val="26"/>
+        </w:rPr>
+        <w:t>UNIVERSITAS MARITIM RAJA ALI HAJI</w:t>
+      </w:r>
+    </w:p>
+    <w:p>
+      <w:pPr>
+        <w:jc w:val="center"/>
+        <w:rPr>
+          <w:sz w:val="26"/>
+          <w:szCs w:val="26"/>
+        </w:rPr>
+      </w:pPr>
+      <w:r>
+        <w:rPr>
+          <w:sz w:val="26"/>
+          <w:szCs w:val="26"/>
+        </w:rPr>
+        <w:t>2025</w:t>
+      </w:r>
+    </w:p>
+    <w:tbl>
+      <w:tblPr>
+        <w:tblStyle w:val="a0"/>
+        <w:tblW w:w="10365" w:type="dxa"/>
+        <w:tblInd w:w="-508" w:type="dxa"/>
+        <w:tblBorders>
+          <w:top w:val="single" w:sz="4" w:space="0" w:color="000000"/>
+          <w:left w:val="single" w:sz="4" w:space="0" w:color="000000"/>
+          <w:bottom w:val="single" w:sz="4" w:space="0" w:color="000000"/>
+          <w:right w:val="single" w:sz="4" w:space="0" w:color="000000"/>
+          <w:insideH w:val="single" w:sz="4" w:space="0" w:color="000000"/>
+          <w:insideV w:val="single" w:sz="4" w:space="0" w:color="000000"/>
+        </w:tblBorders>
+        <w:tblLayout w:type="fixed"/>
+        <w:tblLook w:val="0000" w:firstRow="0" w:lastRow="0" w:firstColumn="0" w:lastColumn="0" w:noHBand="0" w:noVBand="0"/>
+      </w:tblPr>
+      <w:tblGrid>
+        <w:gridCol w:w="635"/>
+        <w:gridCol w:w="1465"/>
+        <w:gridCol w:w="720"/>
+        <w:gridCol w:w="1110"/>
+        <w:gridCol w:w="532"/>
+        <w:gridCol w:w="788"/>
+        <w:gridCol w:w="2565"/>
+        <w:gridCol w:w="2550"/>
+      </w:tblGrid>
+      <w:tr>
+        <w:trPr>
+          <w:trHeight w:val="1955"/>
+        </w:trPr>
+        <w:tc>
+          <w:tcPr>
+            <w:tcW w:w="3930" w:type="dxa"/>
+            <w:gridSpan w:val="4"/>
+            <w:tcBorders>
+              <w:top w:val="single" w:sz="12" w:space="0" w:color="000000"/>
+              <w:left w:val="single" w:sz="12" w:space="0" w:color="000000"/>
+              <w:bottom w:val="single" w:sz="12" w:space="0" w:color="000000"/>
+              <w:right w:val="single" w:sz="12" w:space="0" w:color="000000"/>
+            </w:tcBorders>
+          </w:tcPr>
+          <w:p>
+            <w:pPr>
+              <w:pBdr>
+                <w:top w:val="nil"/>
+                <w:left w:val="nil"/>
+                <w:bottom w:val="nil"/>
+                <w:right w:val="nil"/>
+                <w:between w:val="nil"/>
+              </w:pBdr>
+              <w:ind w:left="561"/>
+              <w:rPr>
+                <w:color w:val="000000"/>
+                <w:sz w:val="20"/>
+                <w:szCs w:val="20"/>
+              </w:rPr>
+            </w:pPr>
+            <w:r>
+              <w:rPr>
+                <w:noProof/>
+              </w:rPr>
+              <w:lastRenderedPageBreak/>
+              <w:drawing>
+                <wp:anchor distT="0" distB="0" distL="114300" distR="114300" simplePos="0" relativeHeight="251660288" behindDoc="0" locked="0" layoutInCell="1" hidden="0" allowOverlap="1" wp14:anchorId="7523C5D4" wp14:editId="78695CA9">
+                  <wp:simplePos x="0" y="0"/>
+                  <wp:positionH relativeFrom="column">
+                    <wp:posOffset>316865</wp:posOffset>
+                  </wp:positionH>
+                  <wp:positionV relativeFrom="paragraph">
+                    <wp:posOffset>43180</wp:posOffset>
+                  </wp:positionV>
+                  <wp:extent cx="1156335" cy="1157605"/>
+                  <wp:effectExtent l="0" t="0" r="0" b="0"/>
+                  <wp:wrapTopAndBottom distT="0" distB="0"/>
+                  <wp:docPr id="1900290530" name="image1.png"/>
+                  <wp:cNvGraphicFramePr/>
+                  <a:graphic xmlns:a="http://schemas.openxmlformats.org/drawingml/2006/main">
+                    <a:graphicData uri="http://schemas.openxmlformats.org/drawingml/2006/picture">
+                      <pic:pic xmlns:pic="http://schemas.openxmlformats.org/drawingml/2006/picture">
+                        <pic:nvPicPr>
+                          <pic:cNvPr id="0" name="image1.png"/>
+                          <pic:cNvPicPr preferRelativeResize="0"/>
+                        </pic:nvPicPr>
+                        <pic:blipFill>
+                          <a:blip r:embed="rId7"/>
+                          <a:srcRect/>
+                          <a:stretch>
+                            <a:fillRect/>
+                          </a:stretch>
+                        </pic:blipFill>
+                        <pic:spPr>
+                          <a:xfrm>
+                            <a:off x="0" y="0"/>
+                            <a:ext cx="1156335" cy="1157605"/>
+                          </a:xfrm>
+                          <a:prstGeom prst="rect">
+                            <a:avLst/>
+                          </a:prstGeom>
+                          <a:ln/>
+                        </pic:spPr>
+                      </pic:pic>
+                    </a:graphicData>
+                  </a:graphic>
+                </wp:anchor>
+              </w:drawing>
+            </w:r>
+          </w:p>
+        </w:tc>
+        <w:tc>
+          <w:tcPr>
+            <w:tcW w:w="3885" w:type="dxa"/>
+            <w:gridSpan w:val="3"/>
+            <w:tcBorders>
+              <w:top w:val="single" w:sz="12" w:space="0" w:color="000000"/>
+              <w:left w:val="single" w:sz="12" w:space="0" w:color="000000"/>
+              <w:bottom w:val="single" w:sz="12" w:space="0" w:color="000000"/>
+              <w:right w:val="single" w:sz="12" w:space="0" w:color="000000"/>
+            </w:tcBorders>
+          </w:tcPr>
+          <w:p>
+            <w:pPr>
+              <w:pBdr>
+                <w:top w:val="nil"/>
+                <w:left w:val="nil"/>
+                <w:bottom w:val="nil"/>
+                <w:right w:val="nil"/>
+                <w:between w:val="nil"/>
+              </w:pBdr>
+              <w:spacing w:before="3"/>
+              <w:ind w:left="106"/>
+              <w:rPr>
+                <w:b/>
+                <w:i/>
+                <w:color w:val="000000"/>
+                <w:sz w:val="24"/>
+                <w:szCs w:val="24"/>
+              </w:rPr>
+            </w:pPr>
+            <w:r>
+              <w:rPr>
+                <w:b/>
+                <w:i/>
+                <w:color w:val="000000"/>
+                <w:sz w:val="24"/>
+                <w:szCs w:val="24"/>
+              </w:rPr>
+              <w:t>LOGBOOK</w:t>
+            </w:r>
+          </w:p>
+          <w:p>
+            <w:pPr>
+              <w:pBdr>
+                <w:top w:val="nil"/>
+                <w:left w:val="nil"/>
+                <w:bottom w:val="nil"/>
+                <w:right w:val="nil"/>
+                <w:between w:val="nil"/>
+              </w:pBdr>
+              <w:spacing w:before="135" w:line="360" w:lineRule="auto"/>
+              <w:ind w:left="106" w:right="267"/>
+              <w:rPr>
+                <w:b/>
+                <w:color w:val="000000"/>
+                <w:sz w:val="24"/>
+                <w:szCs w:val="24"/>
+              </w:rPr>
+            </w:pPr>
+            <w:r>
+              <w:rPr>
+                <w:b/>
+                <w:color w:val="000000"/>
+                <w:sz w:val="24"/>
+                <w:szCs w:val="24"/>
+              </w:rPr>
+              <w:t>KULIAH KERJA NYATA UNIVERSITAS MARITIM RAJA ALI HAJI</w:t>
+            </w:r>
+          </w:p>
+        </w:tc>
+        <w:tc>
+          <w:tcPr>
+            <w:tcW w:w="2550" w:type="dxa"/>
+            <w:tcBorders>
+              <w:top w:val="single" w:sz="12" w:space="0" w:color="000000"/>
+              <w:left w:val="single" w:sz="12" w:space="0" w:color="000000"/>
+              <w:bottom w:val="single" w:sz="12" w:space="0" w:color="000000"/>
+              <w:right w:val="single" w:sz="12" w:space="0" w:color="000000"/>
+            </w:tcBorders>
+          </w:tcPr>
+          <w:p>
+            <w:pPr>
+              <w:pBdr>
+                <w:top w:val="nil"/>
+                <w:left w:val="nil"/>
+                <w:bottom w:val="nil"/>
+                <w:right w:val="nil"/>
+                <w:between w:val="nil"/>
+              </w:pBdr>
+              <w:rPr>
+                <w:color w:val="000000"/>
+                <w:sz w:val="24"/>
+                <w:szCs w:val="24"/>
+              </w:rPr>
+            </w:pPr>
+          </w:p>
+          <w:p>
+            <w:pPr>
+              <w:pBdr>
+                <w:top w:val="nil"/>
+                <w:left w:val="nil"/>
+                <w:bottom w:val="nil"/>
+                <w:right w:val="nil"/>
+                <w:between w:val="nil"/>
+              </w:pBdr>
+              <w:spacing w:before="270"/>
+              <w:rPr>
+                <w:color w:val="000000"/>
+                <w:sz w:val="24"/>
+                <w:szCs w:val="24"/>
+              </w:rPr>
+            </w:pPr>
+          </w:p>
+          <w:p>
+            <w:pPr>
+              <w:pBdr>
+                <w:top w:val="nil"/>
+                <w:left w:val="nil"/>
+                <w:bottom w:val="nil"/>
+                <w:right w:val="nil"/>
+                <w:between w:val="nil"/>
+              </w:pBdr>
+              <w:spacing w:before="1"/>
+              <w:ind w:left="104" w:right="994"/>
+              <w:rPr>
+                <w:b/>
+                <w:color w:val="000000"/>
+                <w:sz w:val="24"/>
+                <w:szCs w:val="24"/>
+              </w:rPr>
+            </w:pPr>
+            <w:r>
+              <w:rPr>
+                <w:b/>
+                <w:color w:val="000000"/>
+                <w:sz w:val="24"/>
+                <w:szCs w:val="24"/>
+              </w:rPr>
+              <w:t>{week_label}</w:t>
+            </w:r>
+          </w:p>
+        </w:tc>
+      </w:tr>
+      <w:tr>
+        <w:trPr>
+          <w:trHeight w:val="274"/>
+        </w:trPr>
+        <w:tc>
+          <w:tcPr>
+            <w:tcW w:w="10365" w:type="dxa"/>
+            <w:gridSpan w:val="8"/>
+            <w:tcBorders>
+              <w:top w:val="single" w:sz="12" w:space="0" w:color="000000"/>
+              <w:left w:val="single" w:sz="8" w:space="0" w:color="000000"/>
+              <w:bottom w:val="single" w:sz="8" w:space="0" w:color="000000"/>
+              <w:right w:val="single" w:sz="8" w:space="0" w:color="000000"/>
+            </w:tcBorders>
+          </w:tcPr>
+          <w:p>
+            <w:pPr>
+              <w:pBdr>
+                <w:top w:val="nil"/>
+                <w:left w:val="nil"/>
+                <w:bottom w:val="nil"/>
+                <w:right w:val="nil"/>
+                <w:between w:val="nil"/>
+              </w:pBdr>
+              <w:spacing w:line="254" w:lineRule="auto"/>
+              <w:ind w:left="107"/>
+              <w:rPr>
+                <w:b/>
+                <w:color w:val="000000"/>
+                <w:sz w:val="24"/>
+                <w:szCs w:val="24"/>
+              </w:rPr>
+            </w:pPr>
+            <w:r>
+              <w:rPr>
+                <w:b/>
+                <w:color w:val="000000"/>
+                <w:sz w:val="24"/>
+                <w:szCs w:val="24"/>
+              </w:rPr>
+              <w:t>NAMA MAHASISWA/NIM/KELOMPOK: {group_info}</w:t>
+            </w:r>
+          </w:p>
+        </w:tc>
+      </w:tr>
+      <w:tr>
+        <w:trPr>
+          <w:trHeight w:val="278"/>
+        </w:trPr>
+        <w:tc>
+          <w:tcPr>
+            <w:tcW w:w="10365" w:type="dxa"/>
+            <w:gridSpan w:val="8"/>
+            <w:tcBorders>
+              <w:top w:val="single" w:sz="8" w:space="0" w:color="000000"/>
+              <w:left w:val="single" w:sz="8" w:space="0" w:color="000000"/>
+              <w:bottom w:val="single" w:sz="8" w:space="0" w:color="000000"/>
+              <w:right w:val="single" w:sz="8" w:space="0" w:color="000000"/>
+            </w:tcBorders>
+          </w:tcPr>
+          <w:p>
+            <w:pPr>
+              <w:pBdr>
+                <w:top w:val="nil"/>
+                <w:left w:val="nil"/>
+                <w:bottom w:val="nil"/>
+                <w:right w:val="nil"/>
+                <w:between w:val="nil"/>
+              </w:pBdr>
+              <w:spacing w:line="258" w:lineRule="auto"/>
+              <w:ind w:left="107"/>
+              <w:rPr>
+                <w:b/>
+                <w:color w:val="000000"/>
+                <w:sz w:val="24"/>
+                <w:szCs w:val="24"/>
+              </w:rPr>
+            </w:pPr>
+            <w:r>
+              <w:rPr>
+                <w:b/>
+                <w:color w:val="000000"/>
+                <w:sz w:val="24"/>
+                <w:szCs w:val="24"/>
+              </w:rPr>
+              <w:t>A. JADWAL:</w:t>
+            </w:r>
+          </w:p>
+        </w:tc>
+      </w:tr>
+      <w:tr>
+        <w:trPr>
+          <w:trHeight w:val="230"/>
+        </w:trPr>
+        <w:tc>
+          <w:tcPr>
+            <w:tcW w:w="635" w:type="dxa"/>
+            <w:tcBorders>
+              <w:top w:val="single" w:sz="8" w:space="0" w:color="000000"/>
+              <w:left w:val="single" w:sz="8" w:space="0" w:color="000000"/>
+              <w:bottom w:val="single" w:sz="8" w:space="0" w:color="000000"/>
+              <w:right w:val="single" w:sz="8" w:space="0" w:color="000000"/>
+            </w:tcBorders>
+          </w:tcPr>
+          <w:p>
+            <w:pPr>
+              <w:rPr>
+                <w:b/>
+                <w:bCs/>
+                <w:color w:val="000000"/>
+                <w:sz w:val="20"/>
+                <w:szCs w:val="20"/>
+              </w:rPr>
+            </w:pPr>
+            <w:r>
+              <w:rPr>
+                <w:b/>
+                <w:bCs/>
+                <w:sz w:val="20"/>
+                <w:szCs w:val="20"/>
+              </w:rPr>
+              <w:t>HARI</w:t>
+            </w:r>
+          </w:p>
+        </w:tc>
+        <w:tc>
+          <w:tcPr>
+            <w:tcW w:w="1465" w:type="dxa"/>
+            <w:tcBorders>
+              <w:top w:val="single" w:sz="8" w:space="0" w:color="000000"/>
+              <w:left w:val="single" w:sz="8" w:space="0" w:color="000000"/>
+              <w:bottom w:val="single" w:sz="8" w:space="0" w:color="000000"/>
+              <w:right w:val="single" w:sz="8" w:space="0" w:color="000000"/>
+            </w:tcBorders>
+          </w:tcPr>
+          <w:p>
+            <w:pPr>
+              <w:pBdr>
+                <w:top w:val="nil"/>
+                <w:left w:val="nil"/>
+                <w:bottom w:val="nil"/>
+                <w:right w:val="nil"/>
+                <w:between w:val="nil"/>
+              </w:pBdr>
+              <w:spacing w:line="210" w:lineRule="auto"/>
+              <w:ind w:left="106"/>
+              <w:rPr>
+                <w:b/>
+                <w:color w:val="000000"/>
+                <w:sz w:val="20"/>
+                <w:szCs w:val="20"/>
+              </w:rPr>
+            </w:pPr>
+            <w:r>
+              <w:rPr>
+                <w:b/>
+                <w:color w:val="000000"/>
+                <w:sz w:val="20"/>
+                <w:szCs w:val="20"/>
+              </w:rPr>
+              <w:t>TANGGAL</w:t>
+            </w:r>
+          </w:p>
+        </w:tc>
+        <w:tc>
+          <w:tcPr>
+            <w:tcW w:w="720" w:type="dxa"/>
+            <w:tcBorders>
+              <w:top w:val="single" w:sz="8" w:space="0" w:color="000000"/>
+              <w:left w:val="single" w:sz="8" w:space="0" w:color="000000"/>
+              <w:bottom w:val="single" w:sz="8" w:space="0" w:color="000000"/>
+              <w:right w:val="single" w:sz="8" w:space="0" w:color="000000"/>
+            </w:tcBorders>
+          </w:tcPr>
+          <w:p>
+            <w:pPr>
+              <w:pBdr>
+                <w:top w:val="nil"/>
+                <w:left w:val="nil"/>
+                <w:bottom w:val="nil"/>
+                <w:right w:val="nil"/>
+                <w:between w:val="nil"/>
+              </w:pBdr>
+              <w:spacing w:line="210" w:lineRule="auto"/>
+              <w:ind w:left="242"/>
+              <w:rPr>
+                <w:b/>
+                <w:color w:val="000000"/>
+                <w:sz w:val="20"/>
+                <w:szCs w:val="20"/>
+              </w:rPr>
+            </w:pPr>
+            <w:r>
+              <w:rPr>
+                <w:b/>
+                <w:color w:val="000000"/>
+                <w:sz w:val="20"/>
+                <w:szCs w:val="20"/>
+              </w:rPr>
+              <w:t>JAM</w:t>
+            </w:r>
+          </w:p>
+        </w:tc>
+        <w:tc>
+          <w:tcPr>
+            <w:tcW w:w="1642" w:type="dxa"/>
+            <w:gridSpan w:val="2"/>
+            <w:tcBorders>
+              <w:top w:val="single" w:sz="8" w:space="0" w:color="000000"/>
+              <w:left w:val="single" w:sz="8" w:space="0" w:color="000000"/>
+              <w:bottom w:val="single" w:sz="8" w:space="0" w:color="000000"/>
+              <w:right w:val="single" w:sz="8" w:space="0" w:color="000000"/>
+            </w:tcBorders>
+          </w:tcPr>
+          <w:p>
+            <w:pPr>
+              <w:pBdr>
+                <w:top w:val="nil"/>
+                <w:left w:val="nil"/>
+                <w:bottom w:val="nil"/>
+                <w:right w:val="nil"/>
+                <w:between w:val="nil"/>
+              </w:pBdr>
+              <w:spacing w:line="210" w:lineRule="auto"/>
+              <w:ind w:left="242"/>
+              <w:rPr>
+                <w:b/>
+                <w:color w:val="000000"/>
+                <w:sz w:val="20"/>
+                <w:szCs w:val="20"/>
+              </w:rPr>
+            </w:pPr>
+            <w:r>
+              <w:rPr>
+                <w:b/>
+                <w:sz w:val="20"/>
+                <w:szCs w:val="20"/>
+              </w:rPr>
+              <w:t>KEGIATAN</w:t>
+            </w:r>
+          </w:p>
+        </w:tc>
+        <w:tc>
+          <w:tcPr>
+            <w:tcW w:w="5903" w:type="dxa"/>
+            <w:gridSpan w:val="3"/>
+            <w:tcBorders>
+              <w:top w:val="single" w:sz="8" w:space="0" w:color="000000"/>
+              <w:left w:val="single" w:sz="8" w:space="0" w:color="000000"/>
+              <w:bottom w:val="single" w:sz="8" w:space="0" w:color="000000"/>
+              <w:right w:val="single" w:sz="8" w:space="0" w:color="000000"/>
+            </w:tcBorders>
+          </w:tcPr>
+          <w:p>
+            <w:pPr>
+              <w:pBdr>
+                <w:top w:val="nil"/>
+                <w:left w:val="nil"/>
+                <w:bottom w:val="nil"/>
+                <w:right w:val="nil"/>
+                <w:between w:val="nil"/>
+              </w:pBdr>
+              <w:spacing w:line="210" w:lineRule="auto"/>
+              <w:ind w:right="1"/>
+              <w:jc w:val="center"/>
+              <w:rPr>
+                <w:b/>
+                <w:color w:val="FF0000"/>
+                <w:sz w:val="20"/>
+                <w:szCs w:val="20"/>
+              </w:rPr>
+            </w:pPr>
+            <w:r>
+              <w:rPr>
+                <w:b/>
+                <w:color w:val="FF0000"/>
+                <w:sz w:val="20"/>
+                <w:szCs w:val="20"/>
+              </w:rPr>
+              <w:t>Dokumentasi</w:t>
+            </w:r>
+          </w:p>
+        </w:tc>
+      </w:tr>
+      <w:tr>
+        <w:trPr>
+          <w:trHeight w:val="230"/>
+        </w:trPr>
+        <w:tc>
+          <w:tcPr>
+            <w:tcW w:w="635" w:type="dxa"/>
+            <w:tcBorders>
+              <w:top w:val="single" w:sz="8" w:space="0" w:color="000000"/>
+              <w:left w:val="single" w:sz="8" w:space="0" w:color="000000"/>
+              <w:bottom w:val="single" w:sz="8" w:space="0" w:color="000000"/>
+              <w:right w:val="single" w:sz="8" w:space="0" w:color="000000"/>
+            </w:tcBorders>
+          </w:tcPr>
+          <w:p>
+            <w:pPr>
+              <w:pBdr>
+                <w:top w:val="nil"/>
+                <w:left w:val="nil"/>
+                <w:bottom w:val="nil"/>
+                <w:right w:val="nil"/>
+                <w:between w:val="nil"/>
+              </w:pBdr>
+              <w:rPr>
+                <w:color w:val="000000"/>
+                <w:sz w:val="16"/>
+                <w:szCs w:val="16"/>
+              </w:rPr>
+            </w:pPr>
+          </w:p>
+        </w:tc>
+        <w:tc>
+          <w:tcPr>
+            <w:tcW w:w="1465" w:type="dxa"/>
+            <w:tcBorders>
+              <w:top w:val="single" w:sz="8" w:space="0" w:color="000000"/>
+              <w:left w:val="single" w:sz="8" w:space="0" w:color="000000"/>
+              <w:bottom w:val="single" w:sz="8" w:space="0" w:color="000000"/>
+              <w:right w:val="single" w:sz="8" w:space="0" w:color="000000"/>
+            </w:tcBorders>
+          </w:tcPr>
+          <w:p>
+            <w:pPr>
+              <w:pBdr>
+                <w:top w:val="nil"/>
+                <w:left w:val="nil"/>
+                <w:bottom w:val="nil"/>
+                <w:right w:val="nil"/>
+                <w:between w:val="nil"/>
+              </w:pBdr>
+              <w:rPr>
+                <w:color w:val="000000"/>
+                <w:sz w:val="16"/>
+                <w:szCs w:val="16"/>
+              </w:rPr>
+            </w:pPr>
+          </w:p>
+        </w:tc>
+        <w:tc>
+          <w:tcPr>
+            <w:tcW w:w="720" w:type="dxa"/>
+            <w:tcBorders>
+              <w:top w:val="single" w:sz="8" w:space="0" w:color="000000"/>
+              <w:left w:val="single" w:sz="8" w:space="0" w:color="000000"/>
+              <w:bottom w:val="single" w:sz="8" w:space="0" w:color="000000"/>
+              <w:right w:val="single" w:sz="8" w:space="0" w:color="000000"/>
+            </w:tcBorders>
+          </w:tcPr>
+          <w:p>
+            <w:pPr>
+              <w:pBdr>
+                <w:top w:val="nil"/>
+                <w:left w:val="nil"/>
+                <w:bottom w:val="nil"/>
+                <w:right w:val="nil"/>
+                <w:between w:val="nil"/>
+              </w:pBdr>
+              <w:rPr>
+                <w:color w:val="000000"/>
+                <w:sz w:val="16"/>
+                <w:szCs w:val="16"/>
+              </w:rPr>
+            </w:pPr>
+          </w:p>
+        </w:tc>
+        <w:tc>
+          <w:tcPr>
+            <w:tcW w:w="1642" w:type="dxa"/>
+            <w:gridSpan w:val="2"/>
+            <w:tcBorders>
+              <w:top w:val="single" w:sz="8" w:space="0" w:color="000000"/>
+              <w:left w:val="single" w:sz="8" w:space="0" w:color="000000"/>
+              <w:bottom w:val="single" w:sz="8" w:space="0" w:color="000000"/>
+              <w:right w:val="single" w:sz="8" w:space="0" w:color="000000"/>
+            </w:tcBorders>
+          </w:tcPr>
+          <w:p>
+            <w:pPr>
+              <w:pBdr>
+                <w:top w:val="nil"/>
+                <w:left w:val="nil"/>
+                <w:bottom w:val="nil"/>
+                <w:right w:val="nil"/>
+                <w:between w:val="nil"/>
+              </w:pBdr>
+              <w:rPr>
+                <w:color w:val="000000"/>
+                <w:sz w:val="16"/>
+                <w:szCs w:val="16"/>
+              </w:rPr>
+            </w:pPr>
+          </w:p>
+        </w:tc>
+        <w:tc>
+          <w:tcPr>
+            <w:tcW w:w="5903" w:type="dxa"/>
+            <w:gridSpan w:val="3"/>
+            <w:tcBorders>
+              <w:top w:val="single" w:sz="8" w:space="0" w:color="000000"/>
+              <w:left w:val="single" w:sz="8" w:space="0" w:color="000000"/>
+              <w:bottom w:val="single" w:sz="8" w:space="0" w:color="000000"/>
+              <w:right w:val="single" w:sz="8" w:space="0" w:color="000000"/>
+            </w:tcBorders>
+          </w:tcPr>
+          <w:p>
+            <w:pPr>
+              <w:pBdr>
+                <w:top w:val="nil"/>
+                <w:left w:val="nil"/>
+                <w:bottom w:val="nil"/>
+                <w:right w:val="nil"/>
+                <w:between w:val="nil"/>
+              </w:pBdr>
+              <w:rPr>
+                <w:color w:val="000000"/>
+                <w:sz w:val="16"/>
+                <w:szCs w:val="16"/>
+              </w:rPr>
+            </w:pPr>
+            <w:r>
+              <w:rPr>
+                <w:sz w:val="16"/>
+                <w:szCs w:val="16"/>
+              </w:rPr>
+              <w:t xml:space="preserve"> </w:t>
+            </w:r>
+          </w:p>
+        </w:tc>
+      </w:tr>
+      <w:tr>
+        <w:trPr>
+          <w:trHeight w:val="230"/>
+        </w:trPr>
+        <w:tc>
+          <w:tcPr>
+            <w:tcW w:w="635" w:type="dxa"/>
+            <w:tcBorders>
+              <w:top w:val="single" w:sz="8" w:space="0" w:color="000000"/>
+              <w:left w:val="single" w:sz="8" w:space="0" w:color="000000"/>
+              <w:bottom w:val="single" w:sz="8" w:space="0" w:color="000000"/>
+              <w:right w:val="single" w:sz="8" w:space="0" w:color="000000"/>
+            </w:tcBorders>
+          </w:tcPr>
+          <w:p>
+            <w:pPr>
+              <w:pBdr>
+                <w:top w:val="nil"/>
+                <w:left w:val="nil"/>
+                <w:bottom w:val="nil"/>
+                <w:right w:val="nil"/>
+                <w:between w:val="nil"/>
+              </w:pBdr>
+              <w:rPr>
+                <w:color w:val="000000"/>
+                <w:sz w:val="16"/>
+                <w:szCs w:val="16"/>
+              </w:rPr>
+            </w:pPr>
+          </w:p>
+        </w:tc>
+        <w:tc>
+          <w:tcPr>
+            <w:tcW w:w="1465" w:type="dxa"/>
+            <w:tcBorders>
+              <w:top w:val="single" w:sz="8" w:space="0" w:color="000000"/>
+              <w:left w:val="single" w:sz="8" w:space="0" w:color="000000"/>
+              <w:bottom w:val="single" w:sz="8" w:space="0" w:color="000000"/>
+              <w:right w:val="single" w:sz="8" w:space="0" w:color="000000"/>
+            </w:tcBorders>
+          </w:tcPr>
+          <w:p>
+            <w:pPr>
+              <w:pBdr>
+                <w:top w:val="nil"/>
+                <w:left w:val="nil"/>
+                <w:bottom w:val="nil"/>
+                <w:right w:val="nil"/>
+                <w:between w:val="nil"/>
+              </w:pBdr>
+              <w:rPr>
+                <w:color w:val="000000"/>
+                <w:sz w:val="16"/>
+                <w:szCs w:val="16"/>
+              </w:rPr>
+            </w:pPr>
+          </w:p>
+        </w:tc>
+        <w:tc>
+          <w:tcPr>
+            <w:tcW w:w="720" w:type="dxa"/>
+            <w:tcBorders>
+              <w:top w:val="single" w:sz="8" w:space="0" w:color="000000"/>
+              <w:left w:val="single" w:sz="8" w:space="0" w:color="000000"/>
+              <w:bottom w:val="single" w:sz="8" w:space="0" w:color="000000"/>
+              <w:right w:val="single" w:sz="8" w:space="0" w:color="000000"/>
+            </w:tcBorders>
+          </w:tcPr>
+          <w:p>
+            <w:pPr>
+              <w:pBdr>
+                <w:top w:val="nil"/>
+                <w:left w:val="nil"/>
+                <w:bottom w:val="nil"/>
+                <w:right w:val="nil"/>
+                <w:between w:val="nil"/>
+              </w:pBdr>
+              <w:rPr>
+                <w:color w:val="000000"/>
+                <w:sz w:val="16"/>
+                <w:szCs w:val="16"/>
+              </w:rPr>
+            </w:pPr>
+          </w:p>
+        </w:tc>
+        <w:tc>
+          <w:tcPr>
+            <w:tcW w:w="1642" w:type="dxa"/>
+            <w:gridSpan w:val="2"/>
+            <w:tcBorders>
+              <w:top w:val="single" w:sz="8" w:space="0" w:color="000000"/>
+              <w:left w:val="single" w:sz="8" w:space="0" w:color="000000"/>
+              <w:bottom w:val="single" w:sz="8" w:space="0" w:color="000000"/>
+              <w:right w:val="single" w:sz="8" w:space="0" w:color="000000"/>
+            </w:tcBorders>
+          </w:tcPr>
+          <w:p>
+            <w:pPr>
+              <w:pBdr>
+                <w:top w:val="nil"/>
+                <w:left w:val="nil"/>
+                <w:bottom w:val="nil"/>
+                <w:right w:val="nil"/>
+                <w:between w:val="nil"/>
+              </w:pBdr>
+              <w:rPr>
+                <w:color w:val="000000"/>
+                <w:sz w:val="16"/>
+                <w:szCs w:val="16"/>
+              </w:rPr>
+            </w:pPr>
+          </w:p>
+        </w:tc>
+        <w:tc>
+          <w:tcPr>
+            <w:tcW w:w="5903" w:type="dxa"/>
+            <w:gridSpan w:val="3"/>
+            <w:tcBorders>
+              <w:top w:val="single" w:sz="8" w:space="0" w:color="000000"/>
+              <w:left w:val="single" w:sz="8" w:space="0" w:color="000000"/>
+              <w:bottom w:val="single" w:sz="8" w:space="0" w:color="000000"/>
+              <w:right w:val="single" w:sz="8" w:space="0" w:color="000000"/>
+            </w:tcBorders>
+          </w:tcPr>
+          <w:p>
+            <w:pPr>
+              <w:pBdr>
+                <w:top w:val="nil"/>
+                <w:left w:val="nil"/>
+                <w:bottom w:val="nil"/>
+                <w:right w:val="nil"/>
+                <w:between w:val="nil"/>
+              </w:pBdr>
+              <w:rPr>
+                <w:color w:val="000000"/>
+                <w:sz w:val="16"/>
+                <w:szCs w:val="16"/>
+              </w:rPr>
+            </w:pPr>
+          </w:p>
+        </w:tc>
+      </w:tr>
+      <w:tr>
+        <w:trPr>
+          <w:trHeight w:val="230"/>
+        </w:trPr>
+        <w:tc>
+          <w:tcPr>
+            <w:tcW w:w="635" w:type="dxa"/>
+            <w:tcBorders>
+              <w:top w:val="single" w:sz="8" w:space="0" w:color="000000"/>
+              <w:left w:val="single" w:sz="8" w:space="0" w:color="000000"/>
+              <w:bottom w:val="single" w:sz="8" w:space="0" w:color="000000"/>
+              <w:right w:val="single" w:sz="8" w:space="0" w:color="000000"/>
+            </w:tcBorders>
+          </w:tcPr>
+          <w:p>
+            <w:pPr>
+              <w:pBdr>
+                <w:top w:val="nil"/>
+                <w:left w:val="nil"/>
+                <w:bottom w:val="nil"/>
+                <w:right w:val="nil"/>
+                <w:between w:val="nil"/>
+              </w:pBdr>
+              <w:rPr>
+                <w:color w:val="000000"/>
+                <w:sz w:val="16"/>
+                <w:szCs w:val="16"/>
+              </w:rPr>
+            </w:pPr>
+          </w:p>
+        </w:tc>
+        <w:tc>
+          <w:tcPr>
+            <w:tcW w:w="1465" w:type="dxa"/>
+            <w:tcBorders>
+              <w:top w:val="single" w:sz="8" w:space="0" w:color="000000"/>
+              <w:left w:val="single" w:sz="8" w:space="0" w:color="000000"/>
+              <w:bottom w:val="single" w:sz="8" w:space="0" w:color="000000"/>
+              <w:right w:val="single" w:sz="8" w:space="0" w:color="000000"/>
+            </w:tcBorders>
+          </w:tcPr>
+          <w:p>
+            <w:pPr>
+              <w:pBdr>
+                <w:top w:val="nil"/>
+                <w:left w:val="nil"/>
+                <w:bottom w:val="nil"/>
+                <w:right w:val="nil"/>
+                <w:between w:val="nil"/>
+              </w:pBdr>
+              <w:rPr>
+                <w:color w:val="000000"/>
+                <w:sz w:val="16"/>
+                <w:szCs w:val="16"/>
+              </w:rPr>
+            </w:pPr>
+          </w:p>
+        </w:tc>
+        <w:tc>
+          <w:tcPr>
+            <w:tcW w:w="720" w:type="dxa"/>
+            <w:tcBorders>
+              <w:top w:val="single" w:sz="8" w:space="0" w:color="000000"/>
+              <w:left w:val="single" w:sz="8" w:space="0" w:color="000000"/>
+              <w:bottom w:val="single" w:sz="8" w:space="0" w:color="000000"/>
+              <w:right w:val="single" w:sz="8" w:space="0" w:color="000000"/>
+            </w:tcBorders>
+          </w:tcPr>
+          <w:p>
+            <w:pPr>
+              <w:pBdr>
+                <w:top w:val="nil"/>
+                <w:left w:val="nil"/>
+                <w:bottom w:val="nil"/>
+                <w:right w:val="nil"/>
+                <w:between w:val="nil"/>
+              </w:pBdr>
+              <w:rPr>
+                <w:color w:val="000000"/>
+                <w:sz w:val="16"/>
+                <w:szCs w:val="16"/>
+              </w:rPr>
+            </w:pPr>
+          </w:p>
+        </w:tc>
+        <w:tc>
+          <w:tcPr>
+            <w:tcW w:w="1642" w:type="dxa"/>
+            <w:gridSpan w:val="2"/>
+            <w:tcBorders>
+              <w:top w:val="single" w:sz="8" w:space="0" w:color="000000"/>
+              <w:left w:val="single" w:sz="8" w:space="0" w:color="000000"/>
+              <w:bottom w:val="single" w:sz="8" w:space="0" w:color="000000"/>
+              <w:right w:val="single" w:sz="8" w:space="0" w:color="000000"/>
+            </w:tcBorders>
+          </w:tcPr>
+          <w:p>
+            <w:pPr>
+              <w:pBdr>
+                <w:top w:val="nil"/>
+                <w:left w:val="nil"/>
+                <w:bottom w:val="nil"/>
+                <w:right w:val="nil"/>
+                <w:between w:val="nil"/>
+              </w:pBdr>
+              <w:rPr>
+                <w:color w:val="000000"/>
+                <w:sz w:val="16"/>
+                <w:szCs w:val="16"/>
+              </w:rPr>
+            </w:pPr>
+          </w:p>
+        </w:tc>
+        <w:tc>
+          <w:tcPr>
+            <w:tcW w:w="5903" w:type="dxa"/>
+            <w:gridSpan w:val="3"/>
+            <w:tcBorders>
+              <w:top w:val="single" w:sz="8" w:space="0" w:color="000000"/>
+              <w:left w:val="single" w:sz="8" w:space="0" w:color="000000"/>
+              <w:bottom w:val="single" w:sz="8" w:space="0" w:color="000000"/>
+              <w:right w:val="single" w:sz="8" w:space="0" w:color="000000"/>
+            </w:tcBorders>
+          </w:tcPr>
+          <w:p>
+            <w:pPr>
+              <w:pBdr>
+                <w:top w:val="nil"/>
+                <w:left w:val="nil"/>
+                <w:bottom w:val="nil"/>
+                <w:right w:val="nil"/>
+                <w:between w:val="nil"/>
+              </w:pBdr>
+              <w:rPr>
+                <w:color w:val="000000"/>
+                <w:sz w:val="16"/>
+                <w:szCs w:val="16"/>
+              </w:rPr>
+            </w:pPr>
+          </w:p>
+        </w:tc>
+      </w:tr>
+      <w:tr>
+        <w:trPr>
+          <w:trHeight w:val="230"/>
+        </w:trPr>
+        <w:tc>
+          <w:tcPr>
+            <w:tcW w:w="635" w:type="dxa"/>
+            <w:tcBorders>
+              <w:top w:val="single" w:sz="8" w:space="0" w:color="000000"/>
+              <w:left w:val="single" w:sz="8" w:space="0" w:color="000000"/>
+              <w:bottom w:val="single" w:sz="8" w:space="0" w:color="000000"/>
+              <w:right w:val="single" w:sz="8" w:space="0" w:color="000000"/>
+            </w:tcBorders>
+          </w:tcPr>
+          <w:p>
+            <w:pPr>
+              <w:pBdr>
+                <w:top w:val="nil"/>
+                <w:left w:val="nil"/>
+                <w:bottom w:val="nil"/>
+                <w:right w:val="nil"/>
+                <w:between w:val="nil"/>
+              </w:pBdr>
+              <w:rPr>
+                <w:color w:val="000000"/>
+                <w:sz w:val="16"/>
+                <w:szCs w:val="16"/>
+              </w:rPr>
+            </w:pPr>
+          </w:p>
+        </w:tc>
+        <w:tc>
+          <w:tcPr>
+            <w:tcW w:w="1465" w:type="dxa"/>
+            <w:tcBorders>
+              <w:top w:val="single" w:sz="8" w:space="0" w:color="000000"/>
+              <w:left w:val="single" w:sz="8" w:space="0" w:color="000000"/>
+              <w:bottom w:val="single" w:sz="8" w:space="0" w:color="000000"/>
+              <w:right w:val="single" w:sz="8" w:space="0" w:color="000000"/>
+            </w:tcBorders>
+          </w:tcPr>
+          <w:p>
+            <w:pPr>
+              <w:pBdr>
+                <w:top w:val="nil"/>
+                <w:left w:val="nil"/>
+                <w:bottom w:val="nil"/>
+                <w:right w:val="nil"/>
+                <w:between w:val="nil"/>
+              </w:pBdr>
+              <w:rPr>
+                <w:color w:val="000000"/>
+                <w:sz w:val="16"/>
+                <w:szCs w:val="16"/>
+              </w:rPr>
+            </w:pPr>
+          </w:p>
+        </w:tc>
+        <w:tc>
+          <w:tcPr>
+            <w:tcW w:w="720" w:type="dxa"/>
+            <w:tcBorders>
+              <w:top w:val="single" w:sz="8" w:space="0" w:color="000000"/>
+              <w:left w:val="single" w:sz="8" w:space="0" w:color="000000"/>
+              <w:bottom w:val="single" w:sz="8" w:space="0" w:color="000000"/>
+              <w:right w:val="single" w:sz="8" w:space="0" w:color="000000"/>
+            </w:tcBorders>
+          </w:tcPr>
+          <w:p>
+            <w:pPr>
+              <w:pBdr>
+                <w:top w:val="nil"/>
+                <w:left w:val="nil"/>
+                <w:bottom w:val="nil"/>
+                <w:right w:val="nil"/>
+                <w:between w:val="nil"/>
+              </w:pBdr>
+              <w:rPr>
+                <w:color w:val="000000"/>
+                <w:sz w:val="16"/>
+                <w:szCs w:val="16"/>
+              </w:rPr>
+            </w:pPr>
+          </w:p>
+        </w:tc>
+        <w:tc>
+          <w:tcPr>
+            <w:tcW w:w="1642" w:type="dxa"/>
+            <w:gridSpan w:val="2"/>
+            <w:tcBorders>
+              <w:top w:val="single" w:sz="8" w:space="0" w:color="000000"/>
+              <w:left w:val="single" w:sz="8" w:space="0" w:color="000000"/>
+              <w:bottom w:val="single" w:sz="8" w:space="0" w:color="000000"/>
+              <w:right w:val="single" w:sz="8" w:space="0" w:color="000000"/>
+            </w:tcBorders>
+          </w:tcPr>
+          <w:p>
+            <w:pPr>
+              <w:pBdr>
+                <w:top w:val="nil"/>
+                <w:left w:val="nil"/>
+                <w:bottom w:val="nil"/>
+                <w:right w:val="nil"/>
+                <w:between w:val="nil"/>
+              </w:pBdr>
+              <w:rPr>
+                <w:color w:val="000000"/>
+                <w:sz w:val="16"/>
+                <w:szCs w:val="16"/>
+              </w:rPr>
+            </w:pPr>
+          </w:p>
+        </w:tc>
+        <w:tc>
+          <w:tcPr>
+            <w:tcW w:w="5903" w:type="dxa"/>
+            <w:gridSpan w:val="3"/>
+            <w:tcBorders>
+              <w:top w:val="single" w:sz="8" w:space="0" w:color="000000"/>
+              <w:left w:val="single" w:sz="8" w:space="0" w:color="000000"/>
+              <w:bottom w:val="single" w:sz="8" w:space="0" w:color="000000"/>
+              <w:right w:val="single" w:sz="8" w:space="0" w:color="000000"/>
+            </w:tcBorders>
+          </w:tcPr>
+          <w:p>
+            <w:pPr>
+              <w:pBdr>
+                <w:top w:val="nil"/>
+                <w:left w:val="nil"/>
+                <w:bottom w:val="nil"/>
+                <w:right w:val="nil"/>
+                <w:between w:val="nil"/>
+              </w:pBdr>
+              <w:rPr>
+                <w:color w:val="000000"/>
+                <w:sz w:val="16"/>
+                <w:szCs w:val="16"/>
+              </w:rPr>
+            </w:pPr>
+          </w:p>
+        </w:tc>
+      </w:tr>
+      <w:tr>
+        <w:trPr>
+          <w:trHeight w:val="229"/>
+        </w:trPr>
+        <w:tc>
+          <w:tcPr>
+            <w:tcW w:w="635" w:type="dxa"/>
+            <w:tcBorders>
+              <w:top w:val="single" w:sz="8" w:space="0" w:color="000000"/>
+              <w:left w:val="single" w:sz="8" w:space="0" w:color="000000"/>
+              <w:bottom w:val="single" w:sz="8" w:space="0" w:color="000000"/>
+              <w:right w:val="single" w:sz="8" w:space="0" w:color="000000"/>
+            </w:tcBorders>
+          </w:tcPr>
+          <w:p>
+            <w:pPr>
+              <w:pBdr>
+                <w:top w:val="nil"/>
+                <w:left w:val="nil"/>
+                <w:bottom w:val="nil"/>
+                <w:right w:val="nil"/>
+                <w:between w:val="nil"/>
+              </w:pBdr>
+              <w:rPr>
+                <w:color w:val="000000"/>
+                <w:sz w:val="16"/>
+                <w:szCs w:val="16"/>
+              </w:rPr>
+            </w:pPr>
+          </w:p>
+        </w:tc>
+        <w:tc>
+          <w:tcPr>
+            <w:tcW w:w="1465" w:type="dxa"/>
+            <w:tcBorders>
+              <w:top w:val="single" w:sz="8" w:space="0" w:color="000000"/>
+              <w:left w:val="single" w:sz="8" w:space="0" w:color="000000"/>
+              <w:bottom w:val="single" w:sz="8" w:space="0" w:color="000000"/>
+              <w:right w:val="single" w:sz="8" w:space="0" w:color="000000"/>
+            </w:tcBorders>
+          </w:tcPr>
+          <w:p>
+            <w:pPr>
+              <w:pBdr>
+                <w:top w:val="nil"/>
+                <w:left w:val="nil"/>
+                <w:bottom w:val="nil"/>
+                <w:right w:val="nil"/>
+                <w:between w:val="nil"/>
+              </w:pBdr>
+              <w:rPr>
+                <w:color w:val="000000"/>
+                <w:sz w:val="16"/>
+                <w:szCs w:val="16"/>
+              </w:rPr>
+            </w:pPr>
+          </w:p>
+        </w:tc>
+        <w:tc>
+          <w:tcPr>
+            <w:tcW w:w="720" w:type="dxa"/>
+            <w:tcBorders>
+              <w:top w:val="single" w:sz="8" w:space="0" w:color="000000"/>
+              <w:left w:val="single" w:sz="8" w:space="0" w:color="000000"/>
+              <w:bottom w:val="single" w:sz="8" w:space="0" w:color="000000"/>
+              <w:right w:val="single" w:sz="8" w:space="0" w:color="000000"/>
+            </w:tcBorders>
+          </w:tcPr>
+          <w:p>
+            <w:pPr>
+              <w:pBdr>
+                <w:top w:val="nil"/>
+                <w:left w:val="nil"/>
+                <w:bottom w:val="nil"/>
+                <w:right w:val="nil"/>
+                <w:between w:val="nil"/>
+              </w:pBdr>
+              <w:rPr>
+                <w:color w:val="000000"/>
+                <w:sz w:val="16"/>
+                <w:szCs w:val="16"/>
+              </w:rPr>
+            </w:pPr>
+          </w:p>
+        </w:tc>
+        <w:tc>
+          <w:tcPr>
+            <w:tcW w:w="1642" w:type="dxa"/>
+            <w:gridSpan w:val="2"/>
+            <w:tcBorders>
+              <w:top w:val="single" w:sz="8" w:space="0" w:color="000000"/>
+              <w:left w:val="single" w:sz="8" w:space="0" w:color="000000"/>
+              <w:bottom w:val="single" w:sz="8" w:space="0" w:color="000000"/>
+              <w:right w:val="single" w:sz="8" w:space="0" w:color="000000"/>
+            </w:tcBorders>
+          </w:tcPr>
+          <w:p>
+            <w:pPr>
+              <w:pBdr>
+                <w:top w:val="nil"/>
+                <w:left w:val="nil"/>
+                <w:bottom w:val="nil"/>
+                <w:right w:val="nil"/>
+                <w:between w:val="nil"/>
+              </w:pBdr>
+              <w:rPr>
+                <w:color w:val="000000"/>
+                <w:sz w:val="16"/>
+                <w:szCs w:val="16"/>
+              </w:rPr>
+            </w:pPr>
+          </w:p>
+        </w:tc>
+        <w:tc>
+          <w:tcPr>
+            <w:tcW w:w="5903" w:type="dxa"/>
+            <w:gridSpan w:val="3"/>
+            <w:tcBorders>
+              <w:top w:val="single" w:sz="8" w:space="0" w:color="000000"/>
+              <w:left w:val="single" w:sz="8" w:space="0" w:color="000000"/>
+              <w:bottom w:val="single" w:sz="8" w:space="0" w:color="000000"/>
+              <w:right w:val="single" w:sz="8" w:space="0" w:color="000000"/>
+            </w:tcBorders>
+          </w:tcPr>
+          <w:p>
+            <w:pPr>
+              <w:pBdr>
+                <w:top w:val="nil"/>
+                <w:left w:val="nil"/>
+                <w:bottom w:val="nil"/>
+                <w:right w:val="nil"/>
+                <w:between w:val="nil"/>
+              </w:pBdr>
+              <w:rPr>
+                <w:color w:val="000000"/>
+                <w:sz w:val="16"/>
+                <w:szCs w:val="16"/>
+              </w:rPr>
+            </w:pPr>
+          </w:p>
+        </w:tc>
+      </w:tr>
+      <w:tr>
+        <w:trPr>
+          <w:trHeight w:val="230"/>
+        </w:trPr>
+        <w:tc>
+          <w:tcPr>
+            <w:tcW w:w="635" w:type="dxa"/>
+            <w:tcBorders>
+              <w:top w:val="single" w:sz="8" w:space="0" w:color="000000"/>
+              <w:left w:val="single" w:sz="8" w:space="0" w:color="000000"/>
+              <w:bottom w:val="single" w:sz="8" w:space="0" w:color="000000"/>
+              <w:right w:val="single" w:sz="8" w:space="0" w:color="000000"/>
+            </w:tcBorders>
+          </w:tcPr>
+          <w:p>
+            <w:pPr>
+              <w:pBdr>
+                <w:top w:val="nil"/>
+                <w:left w:val="nil"/>
+                <w:bottom w:val="nil"/>
+                <w:right w:val="nil"/>
+                <w:between w:val="nil"/>
+              </w:pBdr>
+              <w:rPr>
+                <w:color w:val="000000"/>
+                <w:sz w:val="16"/>
+                <w:szCs w:val="16"/>
+              </w:rPr>
+            </w:pPr>
+          </w:p>
+        </w:tc>
+        <w:tc>
+          <w:tcPr>
+            <w:tcW w:w="1465" w:type="dxa"/>
+            <w:tcBorders>
+              <w:top w:val="single" w:sz="8" w:space="0" w:color="000000"/>
+              <w:left w:val="single" w:sz="8" w:space="0" w:color="000000"/>
+              <w:bottom w:val="single" w:sz="8" w:space="0" w:color="000000"/>
+              <w:right w:val="single" w:sz="8" w:space="0" w:color="000000"/>
+            </w:tcBorders>
+          </w:tcPr>
+          <w:p>
+            <w:pPr>
+              <w:pBdr>
+                <w:top w:val="nil"/>
+                <w:left w:val="nil"/>
+                <w:bottom w:val="nil"/>
+                <w:right w:val="nil"/>
+                <w:between w:val="nil"/>
+              </w:pBdr>
+              <w:rPr>
+                <w:color w:val="000000"/>
+                <w:sz w:val="16"/>
+                <w:szCs w:val="16"/>
+              </w:rPr>
+            </w:pPr>
+          </w:p>
+        </w:tc>
+        <w:tc>
+          <w:tcPr>
+            <w:tcW w:w="720" w:type="dxa"/>
+            <w:tcBorders>
+              <w:top w:val="single" w:sz="8" w:space="0" w:color="000000"/>
+              <w:left w:val="single" w:sz="8" w:space="0" w:color="000000"/>
+              <w:bottom w:val="single" w:sz="8" w:space="0" w:color="000000"/>
+              <w:right w:val="single" w:sz="8" w:space="0" w:color="000000"/>
+            </w:tcBorders>
+          </w:tcPr>
+          <w:p>
+            <w:pPr>
+              <w:pBdr>
+                <w:top w:val="nil"/>
+                <w:left w:val="nil"/>
+                <w:bottom w:val="nil"/>
+                <w:right w:val="nil"/>
+                <w:between w:val="nil"/>
+              </w:pBdr>
+              <w:rPr>
+                <w:color w:val="000000"/>
+                <w:sz w:val="16"/>
+                <w:szCs w:val="16"/>
+              </w:rPr>
+            </w:pPr>
+          </w:p>
+        </w:tc>
+        <w:tc>
+          <w:tcPr>
+            <w:tcW w:w="1642" w:type="dxa"/>
+            <w:gridSpan w:val="2"/>
+            <w:tcBorders>
+              <w:top w:val="single" w:sz="8" w:space="0" w:color="000000"/>
+              <w:left w:val="single" w:sz="8" w:space="0" w:color="000000"/>
+              <w:bottom w:val="single" w:sz="8" w:space="0" w:color="000000"/>
+              <w:right w:val="single" w:sz="8" w:space="0" w:color="000000"/>
+            </w:tcBorders>
+          </w:tcPr>
+          <w:p>
+            <w:pPr>
+              <w:pBdr>
+                <w:top w:val="nil"/>
+                <w:left w:val="nil"/>
+                <w:bottom w:val="nil"/>
+                <w:right w:val="nil"/>
+                <w:between w:val="nil"/>
+              </w:pBdr>
+              <w:rPr>
+                <w:color w:val="000000"/>
+                <w:sz w:val="16"/>
+                <w:szCs w:val="16"/>
+              </w:rPr>
+            </w:pPr>
+          </w:p>
+        </w:tc>
+        <w:tc>
+          <w:tcPr>
+            <w:tcW w:w="5903" w:type="dxa"/>
+            <w:gridSpan w:val="3"/>
+            <w:tcBorders>
+              <w:top w:val="single" w:sz="8" w:space="0" w:color="000000"/>
+              <w:left w:val="single" w:sz="8" w:space="0" w:color="000000"/>
+              <w:bottom w:val="single" w:sz="8" w:space="0" w:color="000000"/>
+              <w:right w:val="single" w:sz="8" w:space="0" w:color="000000"/>
+            </w:tcBorders>
+          </w:tcPr>
+          <w:p>
+            <w:pPr>
+              <w:pBdr>
+                <w:top w:val="nil"/>
+                <w:left w:val="nil"/>
+                <w:bottom w:val="nil"/>
+                <w:right w:val="nil"/>
+                <w:between w:val="nil"/>
+              </w:pBdr>
+              <w:rPr>
+                <w:color w:val="000000"/>
+                <w:sz w:val="16"/>
+                <w:szCs w:val="16"/>
+              </w:rPr>
+            </w:pPr>
+          </w:p>
+        </w:tc>
+      </w:tr>
+      <w:tr>
+        <w:trPr>
+          <w:trHeight w:val="230"/>
+        </w:trPr>
+        <w:tc>
+          <w:tcPr>
+            <w:tcW w:w="635" w:type="dxa"/>
+            <w:tcBorders>
+              <w:top w:val="single" w:sz="8" w:space="0" w:color="000000"/>
+              <w:left w:val="single" w:sz="8" w:space="0" w:color="000000"/>
+              <w:bottom w:val="single" w:sz="8" w:space="0" w:color="000000"/>
+              <w:right w:val="single" w:sz="8" w:space="0" w:color="000000"/>
+            </w:tcBorders>
+          </w:tcPr>
+          <w:p>
+            <w:pPr>
+              <w:pBdr>
+                <w:top w:val="nil"/>
+                <w:left w:val="nil"/>
+                <w:bottom w:val="nil"/>
+                <w:right w:val="nil"/>
+                <w:between w:val="nil"/>
+              </w:pBdr>
+              <w:rPr>
+                <w:color w:val="000000"/>
+                <w:sz w:val="16"/>
+                <w:szCs w:val="16"/>
+              </w:rPr>
+            </w:pPr>
+          </w:p>
+        </w:tc>
+        <w:tc>
+          <w:tcPr>
+            <w:tcW w:w="1465" w:type="dxa"/>
+            <w:tcBorders>
+              <w:top w:val="single" w:sz="8" w:space="0" w:color="000000"/>
+              <w:left w:val="single" w:sz="8" w:space="0" w:color="000000"/>
+              <w:bottom w:val="single" w:sz="8" w:space="0" w:color="000000"/>
+              <w:right w:val="single" w:sz="8" w:space="0" w:color="000000"/>
+            </w:tcBorders>
+          </w:tcPr>
+          <w:p>
+            <w:pPr>
+              <w:pBdr>
+                <w:top w:val="nil"/>
+                <w:left w:val="nil"/>
+                <w:bottom w:val="nil"/>
+                <w:right w:val="nil"/>
+                <w:between w:val="nil"/>
+              </w:pBdr>
+              <w:rPr>
+                <w:color w:val="000000"/>
+                <w:sz w:val="16"/>
+                <w:szCs w:val="16"/>
+              </w:rPr>
+            </w:pPr>
+          </w:p>
+        </w:tc>
+        <w:tc>
+          <w:tcPr>
+            <w:tcW w:w="720" w:type="dxa"/>
+            <w:tcBorders>
+              <w:top w:val="single" w:sz="8" w:space="0" w:color="000000"/>
+              <w:left w:val="single" w:sz="8" w:space="0" w:color="000000"/>
+              <w:bottom w:val="single" w:sz="8" w:space="0" w:color="000000"/>
+              <w:right w:val="single" w:sz="8" w:space="0" w:color="000000"/>
+            </w:tcBorders>
+          </w:tcPr>
+          <w:p>
+            <w:pPr>
+              <w:pBdr>
+                <w:top w:val="nil"/>
+                <w:left w:val="nil"/>
+                <w:bottom w:val="nil"/>
+                <w:right w:val="nil"/>
+                <w:between w:val="nil"/>
+              </w:pBdr>
+              <w:rPr>
+                <w:color w:val="000000"/>
+                <w:sz w:val="16"/>
+                <w:szCs w:val="16"/>
+              </w:rPr>
+            </w:pPr>
+          </w:p>
+        </w:tc>
+        <w:tc>
+          <w:tcPr>
+            <w:tcW w:w="1642" w:type="dxa"/>
+            <w:gridSpan w:val="2"/>
+            <w:tcBorders>
+              <w:top w:val="single" w:sz="8" w:space="0" w:color="000000"/>
+              <w:left w:val="single" w:sz="8" w:space="0" w:color="000000"/>
+              <w:bottom w:val="single" w:sz="8" w:space="0" w:color="000000"/>
+              <w:right w:val="single" w:sz="8" w:space="0" w:color="000000"/>
+            </w:tcBorders>
+          </w:tcPr>
+          <w:p>
+            <w:pPr>
+              <w:pBdr>
+                <w:top w:val="nil"/>
+                <w:left w:val="nil"/>
+                <w:bottom w:val="nil"/>
+                <w:right w:val="nil"/>
+                <w:between w:val="nil"/>
+              </w:pBdr>
+              <w:rPr>
+                <w:color w:val="000000"/>
+                <w:sz w:val="16"/>
+                <w:szCs w:val="16"/>
+              </w:rPr>
+            </w:pPr>
+          </w:p>
+        </w:tc>
+        <w:tc>
+          <w:tcPr>
+            <w:tcW w:w="5903" w:type="dxa"/>
+            <w:gridSpan w:val="3"/>
+            <w:tcBorders>
+              <w:top w:val="single" w:sz="8" w:space="0" w:color="000000"/>
+              <w:left w:val="single" w:sz="8" w:space="0" w:color="000000"/>
+              <w:bottom w:val="single" w:sz="8" w:space="0" w:color="000000"/>
+              <w:right w:val="single" w:sz="8" w:space="0" w:color="000000"/>
+            </w:tcBorders>
+          </w:tcPr>
+          <w:p>
+            <w:pPr>
+              <w:pBdr>
+                <w:top w:val="nil"/>
+                <w:left w:val="nil"/>
+                <w:bottom w:val="nil"/>
+                <w:right w:val="nil"/>
+                <w:between w:val="nil"/>
+              </w:pBdr>
+              <w:rPr>
+                <w:color w:val="000000"/>
+                <w:sz w:val="16"/>
+                <w:szCs w:val="16"/>
+              </w:rPr>
+            </w:pPr>
+          </w:p>
+        </w:tc>
+      </w:tr>
+      <w:tr>
+        <w:trPr>
+          <w:trHeight w:val="230"/>
+        </w:trPr>
+        <w:tc>
+          <w:tcPr>
+            <w:tcW w:w="635" w:type="dxa"/>
+            <w:tcBorders>
+              <w:top w:val="single" w:sz="8" w:space="0" w:color="000000"/>
+              <w:left w:val="single" w:sz="8" w:space="0" w:color="000000"/>
+              <w:bottom w:val="single" w:sz="8" w:space="0" w:color="000000"/>
+              <w:right w:val="single" w:sz="8" w:space="0" w:color="000000"/>
+            </w:tcBorders>
+          </w:tcPr>
+          <w:p>
+            <w:pPr>
+              <w:pBdr>
+                <w:top w:val="nil"/>
+                <w:left w:val="nil"/>
+                <w:bottom w:val="nil"/>
+                <w:right w:val="nil"/>
+                <w:between w:val="nil"/>
+              </w:pBdr>
+              <w:rPr>
+                <w:color w:val="000000"/>
+                <w:sz w:val="16"/>
+                <w:szCs w:val="16"/>
+              </w:rPr>
+            </w:pPr>
+          </w:p>
+        </w:tc>
+        <w:tc>
+          <w:tcPr>
+            <w:tcW w:w="1465" w:type="dxa"/>
+            <w:tcBorders>
+              <w:top w:val="single" w:sz="8" w:space="0" w:color="000000"/>
+              <w:left w:val="single" w:sz="8" w:space="0" w:color="000000"/>
+              <w:bottom w:val="single" w:sz="8" w:space="0" w:color="000000"/>
+              <w:right w:val="single" w:sz="8" w:space="0" w:color="000000"/>
+            </w:tcBorders>
+          </w:tcPr>
+          <w:p>
+            <w:pPr>
+              <w:pBdr>
+                <w:top w:val="nil"/>
+                <w:left w:val="nil"/>
+                <w:bottom w:val="nil"/>
+                <w:right w:val="nil"/>
+                <w:between w:val="nil"/>
+              </w:pBdr>
+              <w:rPr>
+                <w:color w:val="000000"/>
+                <w:sz w:val="16"/>
+                <w:szCs w:val="16"/>
+              </w:rPr>
+            </w:pPr>
+          </w:p>
+        </w:tc>
+        <w:tc>
+          <w:tcPr>
+            <w:tcW w:w="720" w:type="dxa"/>
+            <w:tcBorders>
+              <w:top w:val="single" w:sz="8" w:space="0" w:color="000000"/>
+              <w:left w:val="single" w:sz="8" w:space="0" w:color="000000"/>
+              <w:bottom w:val="single" w:sz="8" w:space="0" w:color="000000"/>
+              <w:right w:val="single" w:sz="8" w:space="0" w:color="000000"/>
+            </w:tcBorders>
+          </w:tcPr>
+          <w:p>
+            <w:pPr>
+              <w:pBdr>
+                <w:top w:val="nil"/>
+                <w:left w:val="nil"/>
+                <w:bottom w:val="nil"/>
+                <w:right w:val="nil"/>
+                <w:between w:val="nil"/>
+              </w:pBdr>
+              <w:rPr>
+                <w:color w:val="000000"/>
+                <w:sz w:val="16"/>
+                <w:szCs w:val="16"/>
+              </w:rPr>
+            </w:pPr>
+          </w:p>
+        </w:tc>
+        <w:tc>
+          <w:tcPr>
+            <w:tcW w:w="1642" w:type="dxa"/>
+            <w:gridSpan w:val="2"/>
+            <w:tcBorders>
+              <w:top w:val="single" w:sz="8" w:space="0" w:color="000000"/>
+              <w:left w:val="single" w:sz="8" w:space="0" w:color="000000"/>
+              <w:bottom w:val="single" w:sz="8" w:space="0" w:color="000000"/>
+              <w:right w:val="single" w:sz="8" w:space="0" w:color="000000"/>
+            </w:tcBorders>
+          </w:tcPr>
+          <w:p>
+            <w:pPr>
+              <w:pBdr>
+                <w:top w:val="nil"/>
+                <w:left w:val="nil"/>
+                <w:bottom w:val="nil"/>
+                <w:right w:val="nil"/>
+                <w:between w:val="nil"/>
+              </w:pBdr>
+              <w:rPr>
+                <w:color w:val="000000"/>
+                <w:sz w:val="16"/>
+                <w:szCs w:val="16"/>
+              </w:rPr>
+            </w:pPr>
+          </w:p>
+        </w:tc>
+        <w:tc>
+          <w:tcPr>
+            <w:tcW w:w="5903" w:type="dxa"/>
+            <w:gridSpan w:val="3"/>
+            <w:tcBorders>
+              <w:top w:val="single" w:sz="8" w:space="0" w:color="000000"/>
+              <w:left w:val="single" w:sz="8" w:space="0" w:color="000000"/>
+              <w:bottom w:val="single" w:sz="8" w:space="0" w:color="000000"/>
+              <w:right w:val="single" w:sz="8" w:space="0" w:color="000000"/>
+            </w:tcBorders>
+          </w:tcPr>
+          <w:p>
+            <w:pPr>
+              <w:pBdr>
+                <w:top w:val="nil"/>
+                <w:left w:val="nil"/>
+                <w:bottom w:val="nil"/>
+                <w:right w:val="nil"/>
+                <w:between w:val="nil"/>
+              </w:pBdr>
+              <w:rPr>
+                <w:color w:val="000000"/>
+                <w:sz w:val="16"/>
+                <w:szCs w:val="16"/>
+              </w:rPr>
+            </w:pPr>
+          </w:p>
+        </w:tc>
+      </w:tr>
+      <w:tr>
+        <w:trPr>
+          <w:trHeight w:val="230"/>
+        </w:trPr>
+        <w:tc>
+          <w:tcPr>
+            <w:tcW w:w="635" w:type="dxa"/>
+            <w:tcBorders>
+              <w:top w:val="single" w:sz="8" w:space="0" w:color="000000"/>
+              <w:left w:val="single" w:sz="8" w:space="0" w:color="000000"/>
+              <w:bottom w:val="single" w:sz="8" w:space="0" w:color="000000"/>
+              <w:right w:val="single" w:sz="8" w:space="0" w:color="000000"/>
+            </w:tcBorders>
+          </w:tcPr>
+          <w:p>
+            <w:pPr>
+              <w:pBdr>
+                <w:top w:val="nil"/>
+                <w:left w:val="nil"/>
+                <w:bottom w:val="nil"/>
+                <w:right w:val="nil"/>
+                <w:between w:val="nil"/>
+              </w:pBdr>
+              <w:rPr>
+                <w:color w:val="000000"/>
+                <w:sz w:val="16"/>
+                <w:szCs w:val="16"/>
+              </w:rPr>
+            </w:pPr>
+          </w:p>
+        </w:tc>
+        <w:tc>
+          <w:tcPr>
+            <w:tcW w:w="1465" w:type="dxa"/>
+            <w:tcBorders>
+              <w:top w:val="single" w:sz="8" w:space="0" w:color="000000"/>
+              <w:left w:val="single" w:sz="8" w:space="0" w:color="000000"/>
+              <w:bottom w:val="single" w:sz="8" w:space="0" w:color="000000"/>
+              <w:right w:val="single" w:sz="8" w:space="0" w:color="000000"/>
+            </w:tcBorders>
+          </w:tcPr>
+          <w:p>
+            <w:pPr>
+              <w:pBdr>
+                <w:top w:val="nil"/>
+                <w:left w:val="nil"/>
+                <w:bottom w:val="nil"/>
+                <w:right w:val="nil"/>
+                <w:between w:val="nil"/>
+              </w:pBdr>
+              <w:rPr>
+                <w:color w:val="000000"/>
+                <w:sz w:val="16"/>
+                <w:szCs w:val="16"/>
+              </w:rPr>
+            </w:pPr>
+          </w:p>
+        </w:tc>
+        <w:tc>
+          <w:tcPr>
+            <w:tcW w:w="720" w:type="dxa"/>
+            <w:tcBorders>
+              <w:top w:val="single" w:sz="8" w:space="0" w:color="000000"/>
+              <w:left w:val="single" w:sz="8" w:space="0" w:color="000000"/>
+              <w:bottom w:val="single" w:sz="8" w:space="0" w:color="000000"/>
+              <w:right w:val="single" w:sz="8" w:space="0" w:color="000000"/>
+            </w:tcBorders>
+          </w:tcPr>
+          <w:p>
+            <w:pPr>
+              <w:pBdr>
+                <w:top w:val="nil"/>
+                <w:left w:val="nil"/>
+                <w:bottom w:val="nil"/>
+                <w:right w:val="nil"/>
+                <w:between w:val="nil"/>
+              </w:pBdr>
+              <w:rPr>
+                <w:color w:val="000000"/>
+                <w:sz w:val="16"/>
+                <w:szCs w:val="16"/>
+              </w:rPr>
+            </w:pPr>
+          </w:p>
+        </w:tc>
+        <w:tc>
+          <w:tcPr>
+            <w:tcW w:w="1642" w:type="dxa"/>
+            <w:gridSpan w:val="2"/>
+            <w:tcBorders>
+              <w:top w:val="single" w:sz="8" w:space="0" w:color="000000"/>
+              <w:left w:val="single" w:sz="8" w:space="0" w:color="000000"/>
+              <w:bottom w:val="single" w:sz="8" w:space="0" w:color="000000"/>
+              <w:right w:val="single" w:sz="8" w:space="0" w:color="000000"/>
+            </w:tcBorders>
+          </w:tcPr>
+          <w:p>
+            <w:pPr>
+              <w:pBdr>
+                <w:top w:val="nil"/>
+                <w:left w:val="nil"/>
+                <w:bottom w:val="nil"/>
+                <w:right w:val="nil"/>
+                <w:between w:val="nil"/>
+              </w:pBdr>
+              <w:rPr>
+                <w:color w:val="000000"/>
+                <w:sz w:val="16"/>
+                <w:szCs w:val="16"/>
+              </w:rPr>
+            </w:pPr>
+          </w:p>
+        </w:tc>
+        <w:tc>
+          <w:tcPr>
+            <w:tcW w:w="5903" w:type="dxa"/>
+            <w:gridSpan w:val="3"/>
+            <w:tcBorders>
+              <w:top w:val="single" w:sz="8" w:space="0" w:color="000000"/>
+              <w:left w:val="single" w:sz="8" w:space="0" w:color="000000"/>
+              <w:bottom w:val="single" w:sz="8" w:space="0" w:color="000000"/>
+              <w:right w:val="single" w:sz="8" w:space="0" w:color="000000"/>
+            </w:tcBorders>
+          </w:tcPr>
+          <w:p>
+            <w:pPr>
+              <w:pBdr>
+                <w:top w:val="nil"/>
+                <w:left w:val="nil"/>
+                <w:bottom w:val="nil"/>
+                <w:right w:val="nil"/>
+                <w:between w:val="nil"/>
+              </w:pBdr>
+              <w:rPr>
+                <w:color w:val="000000"/>
+                <w:sz w:val="16"/>
+                <w:szCs w:val="16"/>
+              </w:rPr>
+            </w:pPr>
+          </w:p>
+        </w:tc>
+      </w:tr>
+      <w:tr>
+        <w:trPr>
+          <w:trHeight w:val="230"/>
+        </w:trPr>
+        <w:tc>
+          <w:tcPr>
+            <w:tcW w:w="635" w:type="dxa"/>
+            <w:tcBorders>
+              <w:top w:val="single" w:sz="8" w:space="0" w:color="000000"/>
+              <w:left w:val="single" w:sz="8" w:space="0" w:color="000000"/>
+              <w:bottom w:val="single" w:sz="8" w:space="0" w:color="000000"/>
+              <w:right w:val="single" w:sz="8" w:space="0" w:color="000000"/>
+            </w:tcBorders>
+          </w:tcPr>
+          <w:p>
+            <w:pPr>
+              <w:pBdr>
+                <w:top w:val="nil"/>
+                <w:left w:val="nil"/>
+                <w:bottom w:val="nil"/>
+                <w:right w:val="nil"/>
+                <w:between w:val="nil"/>
+              </w:pBdr>
+              <w:rPr>
+                <w:color w:val="000000"/>
+                <w:sz w:val="16"/>
+                <w:szCs w:val="16"/>
+              </w:rPr>
+            </w:pPr>
+          </w:p>
+        </w:tc>
+        <w:tc>
+          <w:tcPr>
+            <w:tcW w:w="1465" w:type="dxa"/>
+            <w:tcBorders>
+              <w:top w:val="single" w:sz="8" w:space="0" w:color="000000"/>
+              <w:left w:val="single" w:sz="8" w:space="0" w:color="000000"/>
+              <w:bottom w:val="single" w:sz="8" w:space="0" w:color="000000"/>
+              <w:right w:val="single" w:sz="8" w:space="0" w:color="000000"/>
+            </w:tcBorders>
+          </w:tcPr>
+          <w:p>
+            <w:pPr>
+              <w:pBdr>
+                <w:top w:val="nil"/>
+                <w:left w:val="nil"/>
+                <w:bottom w:val="nil"/>
+                <w:right w:val="nil"/>
+                <w:between w:val="nil"/>
+              </w:pBdr>
+              <w:rPr>
+                <w:color w:val="000000"/>
+                <w:sz w:val="16"/>
+                <w:szCs w:val="16"/>
+              </w:rPr>
+            </w:pPr>
+          </w:p>
+        </w:tc>
+        <w:tc>
+          <w:tcPr>
+            <w:tcW w:w="720" w:type="dxa"/>
+            <w:tcBorders>
+              <w:top w:val="single" w:sz="8" w:space="0" w:color="000000"/>
+              <w:left w:val="single" w:sz="8" w:space="0" w:color="000000"/>
+              <w:bottom w:val="single" w:sz="8" w:space="0" w:color="000000"/>
+              <w:right w:val="single" w:sz="8" w:space="0" w:color="000000"/>
+            </w:tcBorders>
+          </w:tcPr>
+          <w:p>
+            <w:pPr>
+              <w:pBdr>
+                <w:top w:val="nil"/>
+                <w:left w:val="nil"/>
+                <w:bottom w:val="nil"/>
+                <w:right w:val="nil"/>
+                <w:between w:val="nil"/>
+              </w:pBdr>
+              <w:rPr>
+                <w:color w:val="000000"/>
+                <w:sz w:val="16"/>
+                <w:szCs w:val="16"/>
+              </w:rPr>
+            </w:pPr>
+          </w:p>
+        </w:tc>
+        <w:tc>
+          <w:tcPr>
+            <w:tcW w:w="1642" w:type="dxa"/>
+            <w:gridSpan w:val="2"/>
+            <w:tcBorders>
+              <w:top w:val="single" w:sz="8" w:space="0" w:color="000000"/>
+              <w:left w:val="single" w:sz="8" w:space="0" w:color="000000"/>
+              <w:bottom w:val="single" w:sz="8" w:space="0" w:color="000000"/>
+              <w:right w:val="single" w:sz="8" w:space="0" w:color="000000"/>
+            </w:tcBorders>
+          </w:tcPr>
+          <w:p>
+            <w:pPr>
+              <w:pBdr>
+                <w:top w:val="nil"/>
+                <w:left w:val="nil"/>
+                <w:bottom w:val="nil"/>
+                <w:right w:val="nil"/>
+                <w:between w:val="nil"/>
+              </w:pBdr>
+              <w:rPr>
+                <w:color w:val="000000"/>
+                <w:sz w:val="16"/>
+                <w:szCs w:val="16"/>
+              </w:rPr>
+            </w:pPr>
+          </w:p>
+        </w:tc>
+        <w:tc>
+          <w:tcPr>
+            <w:tcW w:w="5903" w:type="dxa"/>
+            <w:gridSpan w:val="3"/>
+            <w:tcBorders>
+              <w:top w:val="single" w:sz="8" w:space="0" w:color="000000"/>
+              <w:left w:val="single" w:sz="8" w:space="0" w:color="000000"/>
+              <w:bottom w:val="single" w:sz="8" w:space="0" w:color="000000"/>
+              <w:right w:val="single" w:sz="8" w:space="0" w:color="000000"/>
+            </w:tcBorders>
+          </w:tcPr>
+          <w:p>
+            <w:pPr>
+              <w:pBdr>
+                <w:top w:val="nil"/>
+                <w:left w:val="nil"/>
+                <w:bottom w:val="nil"/>
+                <w:right w:val="nil"/>
+                <w:between w:val="nil"/>
+              </w:pBdr>
+              <w:rPr>
+                <w:color w:val="000000"/>
+                <w:sz w:val="16"/>
+                <w:szCs w:val="16"/>
+              </w:rPr>
+            </w:pPr>
+          </w:p>
+        </w:tc>
+      </w:tr>
+      <w:tr>
+        <w:trPr>
+          <w:trHeight w:val="230"/>
+        </w:trPr>
+        <w:tc>
+          <w:tcPr>
+            <w:tcW w:w="635" w:type="dxa"/>
+            <w:tcBorders>
+              <w:top w:val="single" w:sz="8" w:space="0" w:color="000000"/>
+              <w:left w:val="single" w:sz="8" w:space="0" w:color="000000"/>
+              <w:bottom w:val="single" w:sz="8" w:space="0" w:color="000000"/>
+              <w:right w:val="single" w:sz="8" w:space="0" w:color="000000"/>
+            </w:tcBorders>
+          </w:tcPr>
+          <w:p>
+            <w:pPr>
+              <w:pBdr>
+                <w:top w:val="nil"/>
+                <w:left w:val="nil"/>
+                <w:bottom w:val="nil"/>
+                <w:right w:val="nil"/>
+                <w:between w:val="nil"/>
+              </w:pBdr>
+              <w:rPr>
+                <w:color w:val="000000"/>
+                <w:sz w:val="16"/>
+                <w:szCs w:val="16"/>
+              </w:rPr>
+            </w:pPr>
+          </w:p>
+        </w:tc>
+        <w:tc>
+          <w:tcPr>
+            <w:tcW w:w="1465" w:type="dxa"/>
+            <w:tcBorders>
+              <w:top w:val="single" w:sz="8" w:space="0" w:color="000000"/>
+              <w:left w:val="single" w:sz="8" w:space="0" w:color="000000"/>
+              <w:bottom w:val="single" w:sz="8" w:space="0" w:color="000000"/>
+              <w:right w:val="single" w:sz="8" w:space="0" w:color="000000"/>
+            </w:tcBorders>
+          </w:tcPr>
+          <w:p>
+            <w:pPr>
+              <w:pBdr>
+                <w:top w:val="nil"/>
+                <w:left w:val="nil"/>
+                <w:bottom w:val="nil"/>
+                <w:right w:val="nil"/>
+                <w:between w:val="nil"/>
+              </w:pBdr>
+              <w:rPr>
+                <w:color w:val="000000"/>
+                <w:sz w:val="16"/>
+                <w:szCs w:val="16"/>
+              </w:rPr>
+            </w:pPr>
+          </w:p>
+        </w:tc>
+        <w:tc>
+          <w:tcPr>
+            <w:tcW w:w="720" w:type="dxa"/>
+            <w:tcBorders>
+              <w:top w:val="single" w:sz="8" w:space="0" w:color="000000"/>
+              <w:left w:val="single" w:sz="8" w:space="0" w:color="000000"/>
+              <w:bottom w:val="single" w:sz="8" w:space="0" w:color="000000"/>
+              <w:right w:val="single" w:sz="8" w:space="0" w:color="000000"/>
+            </w:tcBorders>
+          </w:tcPr>
+          <w:p>
+            <w:pPr>
+              <w:pBdr>
+                <w:top w:val="nil"/>
+                <w:left w:val="nil"/>
+                <w:bottom w:val="nil"/>
+                <w:right w:val="nil"/>
+                <w:between w:val="nil"/>
+              </w:pBdr>
+              <w:rPr>
+                <w:color w:val="000000"/>
+                <w:sz w:val="16"/>
+                <w:szCs w:val="16"/>
+              </w:rPr>
+            </w:pPr>
+          </w:p>
+        </w:tc>
+        <w:tc>
+          <w:tcPr>
+            <w:tcW w:w="1642" w:type="dxa"/>
+            <w:gridSpan w:val="2"/>
+            <w:tcBorders>
+              <w:top w:val="single" w:sz="8" w:space="0" w:color="000000"/>
+              <w:left w:val="single" w:sz="8" w:space="0" w:color="000000"/>
+              <w:bottom w:val="single" w:sz="8" w:space="0" w:color="000000"/>
+              <w:right w:val="single" w:sz="8" w:space="0" w:color="000000"/>
+            </w:tcBorders>
+          </w:tcPr>
+          <w:p>
+            <w:pPr>
+              <w:pBdr>
+                <w:top w:val="nil"/>
+                <w:left w:val="nil"/>
+                <w:bottom w:val="nil"/>
+                <w:right w:val="nil"/>
+                <w:between w:val="nil"/>
+              </w:pBdr>
+              <w:rPr>
+                <w:color w:val="000000"/>
+                <w:sz w:val="16"/>
+                <w:szCs w:val="16"/>
+              </w:rPr>
+            </w:pPr>
+          </w:p>
+        </w:tc>
+        <w:tc>
+          <w:tcPr>
+            <w:tcW w:w="5903" w:type="dxa"/>
+            <w:gridSpan w:val="3"/>
+            <w:tcBorders>
+              <w:top w:val="single" w:sz="8" w:space="0" w:color="000000"/>
+              <w:left w:val="single" w:sz="8" w:space="0" w:color="000000"/>
+              <w:bottom w:val="single" w:sz="8" w:space="0" w:color="000000"/>
+              <w:right w:val="single" w:sz="8" w:space="0" w:color="000000"/>
+            </w:tcBorders>
+          </w:tcPr>
+          <w:p>
+            <w:pPr>
+              <w:pBdr>
+                <w:top w:val="nil"/>
+                <w:left w:val="nil"/>
+                <w:bottom w:val="nil"/>
+                <w:right w:val="nil"/>
+                <w:between w:val="nil"/>
+              </w:pBdr>
+              <w:rPr>
+                <w:color w:val="000000"/>
+                <w:sz w:val="16"/>
+                <w:szCs w:val="16"/>
+              </w:rPr>
+            </w:pPr>
+          </w:p>
+        </w:tc>
+      </w:tr>
+      <w:tr>
+        <w:trPr>
+          <w:trHeight w:val="230"/>
+        </w:trPr>
+        <w:tc>
+          <w:tcPr>
+            <w:tcW w:w="635" w:type="dxa"/>
+            <w:tcBorders>
+              <w:top w:val="single" w:sz="8" w:space="0" w:color="000000"/>
+              <w:left w:val="single" w:sz="8" w:space="0" w:color="000000"/>
+              <w:bottom w:val="single" w:sz="8" w:space="0" w:color="000000"/>
+              <w:right w:val="single" w:sz="8" w:space="0" w:color="000000"/>
+            </w:tcBorders>
+          </w:tcPr>
+          <w:p>
+            <w:pPr>
+              <w:pBdr>
+                <w:top w:val="nil"/>
+                <w:left w:val="nil"/>
+                <w:bottom w:val="nil"/>
+                <w:right w:val="nil"/>
+                <w:between w:val="nil"/>
+              </w:pBdr>
+              <w:rPr>
+                <w:color w:val="000000"/>
+                <w:sz w:val="16"/>
+                <w:szCs w:val="16"/>
+              </w:rPr>
+            </w:pPr>
+          </w:p>
+        </w:tc>
+        <w:tc>
+          <w:tcPr>
+            <w:tcW w:w="1465" w:type="dxa"/>
+            <w:tcBorders>
+              <w:top w:val="single" w:sz="8" w:space="0" w:color="000000"/>
+              <w:left w:val="single" w:sz="8" w:space="0" w:color="000000"/>
+              <w:bottom w:val="single" w:sz="8" w:space="0" w:color="000000"/>
+              <w:right w:val="single" w:sz="8" w:space="0" w:color="000000"/>
+            </w:tcBorders>
+          </w:tcPr>
+          <w:p>
+            <w:pPr>
+              <w:pBdr>
+                <w:top w:val="nil"/>
+                <w:left w:val="nil"/>
+                <w:bottom w:val="nil"/>
+                <w:right w:val="nil"/>
+                <w:between w:val="nil"/>
+              </w:pBdr>
+              <w:rPr>
+                <w:color w:val="000000"/>
+                <w:sz w:val="16"/>
+                <w:szCs w:val="16"/>
+              </w:rPr>
+            </w:pPr>
+          </w:p>
+        </w:tc>
+        <w:tc>
+          <w:tcPr>
+            <w:tcW w:w="720" w:type="dxa"/>
+            <w:tcBorders>
+              <w:top w:val="single" w:sz="8" w:space="0" w:color="000000"/>
+              <w:left w:val="single" w:sz="8" w:space="0" w:color="000000"/>
+              <w:bottom w:val="single" w:sz="8" w:space="0" w:color="000000"/>
+              <w:right w:val="single" w:sz="8" w:space="0" w:color="000000"/>
+            </w:tcBorders>
+          </w:tcPr>
+          <w:p>
+            <w:pPr>
+              <w:pBdr>
+                <w:top w:val="nil"/>
+                <w:left w:val="nil"/>
+                <w:bottom w:val="nil"/>
+                <w:right w:val="nil"/>
+                <w:between w:val="nil"/>
+              </w:pBdr>
+              <w:rPr>
+                <w:color w:val="000000"/>
+                <w:sz w:val="16"/>
+                <w:szCs w:val="16"/>
+              </w:rPr>
+            </w:pPr>
+          </w:p>
+        </w:tc>
+        <w:tc>
+          <w:tcPr>
+            <w:tcW w:w="1642" w:type="dxa"/>
+            <w:gridSpan w:val="2"/>
+            <w:tcBorders>
+              <w:top w:val="single" w:sz="8" w:space="0" w:color="000000"/>
+              <w:left w:val="single" w:sz="8" w:space="0" w:color="000000"/>
+              <w:bottom w:val="single" w:sz="8" w:space="0" w:color="000000"/>
+              <w:right w:val="single" w:sz="8" w:space="0" w:color="000000"/>
+            </w:tcBorders>
+          </w:tcPr>
+          <w:p>
+            <w:pPr>
+              <w:pBdr>
+                <w:top w:val="nil"/>
+                <w:left w:val="nil"/>
+                <w:bottom w:val="nil"/>
+                <w:right w:val="nil"/>
+                <w:between w:val="nil"/>
+              </w:pBdr>
+              <w:rPr>
+                <w:color w:val="000000"/>
+                <w:sz w:val="16"/>
+                <w:szCs w:val="16"/>
+              </w:rPr>
+            </w:pPr>
+          </w:p>
+        </w:tc>
+        <w:tc>
+          <w:tcPr>
+            <w:tcW w:w="5903" w:type="dxa"/>
+            <w:gridSpan w:val="3"/>
+            <w:tcBorders>
+              <w:top w:val="single" w:sz="8" w:space="0" w:color="000000"/>
+              <w:left w:val="single" w:sz="8" w:space="0" w:color="000000"/>
+              <w:bottom w:val="single" w:sz="8" w:space="0" w:color="000000"/>
+              <w:right w:val="single" w:sz="8" w:space="0" w:color="000000"/>
+            </w:tcBorders>
+          </w:tcPr>
+          <w:p>
+            <w:pPr>
+              <w:pBdr>
+                <w:top w:val="nil"/>
+                <w:left w:val="nil"/>
+                <w:bottom w:val="nil"/>
+                <w:right w:val="nil"/>
+                <w:between w:val="nil"/>
+              </w:pBdr>
+              <w:rPr>
+                <w:color w:val="000000"/>
+                <w:sz w:val="16"/>
+                <w:szCs w:val="16"/>
+              </w:rPr>
+            </w:pPr>
+          </w:p>
+        </w:tc>
+      </w:tr>
+      <w:tr>
+        <w:trPr>
+          <w:trHeight w:val="230"/>
+        </w:trPr>
+        <w:tc>
+          <w:tcPr>
+            <w:tcW w:w="635" w:type="dxa"/>
+            <w:tcBorders>
+              <w:top w:val="single" w:sz="8" w:space="0" w:color="000000"/>
+              <w:left w:val="single" w:sz="8" w:space="0" w:color="000000"/>
+              <w:bottom w:val="single" w:sz="8" w:space="0" w:color="000000"/>
+              <w:right w:val="single" w:sz="8" w:space="0" w:color="000000"/>
+            </w:tcBorders>
+          </w:tcPr>
+          <w:p>
+            <w:pPr>
+              <w:pBdr>
+                <w:top w:val="nil"/>
+                <w:left w:val="nil"/>
+                <w:bottom w:val="nil"/>
+                <w:right w:val="nil"/>
+                <w:between w:val="nil"/>
+              </w:pBdr>
+              <w:rPr>
+                <w:color w:val="000000"/>
+                <w:sz w:val="16"/>
+                <w:szCs w:val="16"/>
+              </w:rPr>
+            </w:pPr>
+          </w:p>
+        </w:tc>
+        <w:tc>
+          <w:tcPr>
+            <w:tcW w:w="1465" w:type="dxa"/>
+            <w:tcBorders>
+              <w:top w:val="single" w:sz="8" w:space="0" w:color="000000"/>
+              <w:left w:val="single" w:sz="8" w:space="0" w:color="000000"/>
+              <w:bottom w:val="single" w:sz="8" w:space="0" w:color="000000"/>
+              <w:right w:val="single" w:sz="8" w:space="0" w:color="000000"/>
+            </w:tcBorders>
+          </w:tcPr>
+          <w:p>
+            <w:pPr>
+              <w:pBdr>
+                <w:top w:val="nil"/>
+                <w:left w:val="nil"/>
+                <w:bottom w:val="nil"/>
+                <w:right w:val="nil"/>
+                <w:between w:val="nil"/>
+              </w:pBdr>
+              <w:rPr>
+                <w:color w:val="000000"/>
+                <w:sz w:val="16"/>
+                <w:szCs w:val="16"/>
+              </w:rPr>
+            </w:pPr>
+          </w:p>
+        </w:tc>
+        <w:tc>
+          <w:tcPr>
+            <w:tcW w:w="720" w:type="dxa"/>
+            <w:tcBorders>
+              <w:top w:val="single" w:sz="8" w:space="0" w:color="000000"/>
+              <w:left w:val="single" w:sz="8" w:space="0" w:color="000000"/>
+              <w:bottom w:val="single" w:sz="8" w:space="0" w:color="000000"/>
+              <w:right w:val="single" w:sz="8" w:space="0" w:color="000000"/>
+            </w:tcBorders>
+          </w:tcPr>
+          <w:p>
+            <w:pPr>
+              <w:pBdr>
+                <w:top w:val="nil"/>
+                <w:left w:val="nil"/>
+                <w:bottom w:val="nil"/>
+                <w:right w:val="nil"/>
+                <w:between w:val="nil"/>
+              </w:pBdr>
+              <w:rPr>
+                <w:color w:val="000000"/>
+                <w:sz w:val="16"/>
+                <w:szCs w:val="16"/>
+              </w:rPr>
+            </w:pPr>
+          </w:p>
+        </w:tc>
+        <w:tc>
+          <w:tcPr>
+            <w:tcW w:w="1642" w:type="dxa"/>
+            <w:gridSpan w:val="2"/>
+            <w:tcBorders>
+              <w:top w:val="single" w:sz="8" w:space="0" w:color="000000"/>
+              <w:left w:val="single" w:sz="8" w:space="0" w:color="000000"/>
+              <w:bottom w:val="single" w:sz="8" w:space="0" w:color="000000"/>
+              <w:right w:val="single" w:sz="8" w:space="0" w:color="000000"/>
+            </w:tcBorders>
+          </w:tcPr>
+          <w:p>
+            <w:pPr>
+              <w:pBdr>
+                <w:top w:val="nil"/>
+                <w:left w:val="nil"/>
+                <w:bottom w:val="nil"/>
+                <w:right w:val="nil"/>
+                <w:between w:val="nil"/>
+              </w:pBdr>
+              <w:rPr>
+                <w:color w:val="000000"/>
+                <w:sz w:val="16"/>
+                <w:szCs w:val="16"/>
+              </w:rPr>
+            </w:pPr>
+          </w:p>
+        </w:tc>
+        <w:tc>
+          <w:tcPr>
+            <w:tcW w:w="5903" w:type="dxa"/>
+            <w:gridSpan w:val="3"/>
+            <w:tcBorders>
+              <w:top w:val="single" w:sz="8" w:space="0" w:color="000000"/>
+              <w:left w:val="single" w:sz="8" w:space="0" w:color="000000"/>
+              <w:bottom w:val="single" w:sz="8" w:space="0" w:color="000000"/>
+              <w:right w:val="single" w:sz="8" w:space="0" w:color="000000"/>
+            </w:tcBorders>
+          </w:tcPr>
+          <w:p>
+            <w:pPr>
+              <w:pBdr>
+                <w:top w:val="nil"/>
+                <w:left w:val="nil"/>
+                <w:bottom w:val="nil"/>
+                <w:right w:val="nil"/>
+                <w:between w:val="nil"/>
+              </w:pBdr>
+              <w:rPr>
+                <w:color w:val="000000"/>
+                <w:sz w:val="16"/>
+                <w:szCs w:val="16"/>
+              </w:rPr>
+            </w:pPr>
+          </w:p>
+        </w:tc>
+      </w:tr>
+      <w:tr>
+        <w:trPr>
+          <w:trHeight w:val="230"/>
+        </w:trPr>
+        <w:tc>
+          <w:tcPr>
+            <w:tcW w:w="635" w:type="dxa"/>
+            <w:tcBorders>
+              <w:top w:val="single" w:sz="8" w:space="0" w:color="000000"/>
+              <w:left w:val="single" w:sz="8" w:space="0" w:color="000000"/>
+              <w:bottom w:val="single" w:sz="8" w:space="0" w:color="000000"/>
+              <w:right w:val="single" w:sz="8" w:space="0" w:color="000000"/>
+            </w:tcBorders>
+          </w:tcPr>
+          <w:p>
+            <w:pPr>
+              <w:pBdr>
+                <w:top w:val="nil"/>
+                <w:left w:val="nil"/>
+                <w:bottom w:val="nil"/>
+                <w:right w:val="nil"/>
+                <w:between w:val="nil"/>
+              </w:pBdr>
+              <w:rPr>
+                <w:color w:val="000000"/>
+                <w:sz w:val="16"/>
+                <w:szCs w:val="16"/>
+              </w:rPr>
+            </w:pPr>
+          </w:p>
+        </w:tc>
+        <w:tc>
+          <w:tcPr>
+            <w:tcW w:w="1465" w:type="dxa"/>
+            <w:tcBorders>
+              <w:top w:val="single" w:sz="8" w:space="0" w:color="000000"/>
+              <w:left w:val="single" w:sz="8" w:space="0" w:color="000000"/>
+              <w:bottom w:val="single" w:sz="8" w:space="0" w:color="000000"/>
+              <w:right w:val="single" w:sz="8" w:space="0" w:color="000000"/>
+            </w:tcBorders>
+          </w:tcPr>
+          <w:p>
+            <w:pPr>
+              <w:pBdr>
+                <w:top w:val="nil"/>
+                <w:left w:val="nil"/>
+                <w:bottom w:val="nil"/>
+                <w:right w:val="nil"/>
+                <w:between w:val="nil"/>
+              </w:pBdr>
+              <w:rPr>
+                <w:color w:val="000000"/>
+                <w:sz w:val="16"/>
+                <w:szCs w:val="16"/>
+              </w:rPr>
+            </w:pPr>
+          </w:p>
+        </w:tc>
+        <w:tc>
+          <w:tcPr>
+            <w:tcW w:w="720" w:type="dxa"/>
+            <w:tcBorders>
+              <w:top w:val="single" w:sz="8" w:space="0" w:color="000000"/>
+              <w:left w:val="single" w:sz="8" w:space="0" w:color="000000"/>
+              <w:bottom w:val="single" w:sz="8" w:space="0" w:color="000000"/>
+              <w:right w:val="single" w:sz="8" w:space="0" w:color="000000"/>
+            </w:tcBorders>
+          </w:tcPr>
+          <w:p>
+            <w:pPr>
+              <w:pBdr>
+                <w:top w:val="nil"/>
+                <w:left w:val="nil"/>
+                <w:bottom w:val="nil"/>
+                <w:right w:val="nil"/>
+                <w:between w:val="nil"/>
+              </w:pBdr>
+              <w:rPr>
+                <w:color w:val="000000"/>
+                <w:sz w:val="16"/>
+                <w:szCs w:val="16"/>
+              </w:rPr>
+            </w:pPr>
+          </w:p>
+        </w:tc>
+        <w:tc>
+          <w:tcPr>
+            <w:tcW w:w="1642" w:type="dxa"/>
+            <w:gridSpan w:val="2"/>
+            <w:tcBorders>
+              <w:top w:val="single" w:sz="8" w:space="0" w:color="000000"/>
+              <w:left w:val="single" w:sz="8" w:space="0" w:color="000000"/>
+              <w:bottom w:val="single" w:sz="8" w:space="0" w:color="000000"/>
+              <w:right w:val="single" w:sz="8" w:space="0" w:color="000000"/>
+            </w:tcBorders>
+          </w:tcPr>
+          <w:p>
+            <w:pPr>
+              <w:pBdr>
+                <w:top w:val="nil"/>
+                <w:left w:val="nil"/>
+                <w:bottom w:val="nil"/>
+                <w:right w:val="nil"/>
+                <w:between w:val="nil"/>
+              </w:pBdr>
+              <w:rPr>
+                <w:color w:val="000000"/>
+                <w:sz w:val="16"/>
+                <w:szCs w:val="16"/>
+              </w:rPr>
+            </w:pPr>
+          </w:p>
+        </w:tc>
+        <w:tc>
+          <w:tcPr>
+            <w:tcW w:w="5903" w:type="dxa"/>
+            <w:gridSpan w:val="3"/>
+            <w:tcBorders>
+              <w:top w:val="single" w:sz="8" w:space="0" w:color="000000"/>
+              <w:left w:val="single" w:sz="8" w:space="0" w:color="000000"/>
+              <w:bottom w:val="single" w:sz="8" w:space="0" w:color="000000"/>
+              <w:right w:val="single" w:sz="8" w:space="0" w:color="000000"/>
+            </w:tcBorders>
+          </w:tcPr>
+          <w:p>
+            <w:pPr>
+              <w:pBdr>
+                <w:top w:val="nil"/>
+                <w:left w:val="nil"/>
+                <w:bottom w:val="nil"/>
+                <w:right w:val="nil"/>
+                <w:between w:val="nil"/>
+              </w:pBdr>
+              <w:rPr>
+                <w:color w:val="000000"/>
+                <w:sz w:val="16"/>
+                <w:szCs w:val="16"/>
+              </w:rPr>
+            </w:pPr>
+          </w:p>
+        </w:tc>
+      </w:tr>
+      <w:tr>
+        <w:trPr>
+          <w:trHeight w:val="230"/>
+        </w:trPr>
+        <w:tc>
+          <w:tcPr>
+            <w:tcW w:w="635" w:type="dxa"/>
+            <w:tcBorders>
+              <w:top w:val="single" w:sz="8" w:space="0" w:color="000000"/>
+              <w:left w:val="single" w:sz="8" w:space="0" w:color="000000"/>
+              <w:bottom w:val="single" w:sz="8" w:space="0" w:color="000000"/>
+              <w:right w:val="single" w:sz="8" w:space="0" w:color="000000"/>
+            </w:tcBorders>
+          </w:tcPr>
+          <w:p>
+            <w:pPr>
+              <w:pBdr>
+                <w:top w:val="nil"/>
+                <w:left w:val="nil"/>
+                <w:bottom w:val="nil"/>
+                <w:right w:val="nil"/>
+                <w:between w:val="nil"/>
+              </w:pBdr>
+              <w:rPr>
+                <w:color w:val="000000"/>
+                <w:sz w:val="16"/>
+                <w:szCs w:val="16"/>
+              </w:rPr>
+            </w:pPr>
+          </w:p>
+        </w:tc>
+        <w:tc>
+          <w:tcPr>
+            <w:tcW w:w="1465" w:type="dxa"/>
+            <w:tcBorders>
+              <w:top w:val="single" w:sz="8" w:space="0" w:color="000000"/>
+              <w:left w:val="single" w:sz="8" w:space="0" w:color="000000"/>
+              <w:bottom w:val="single" w:sz="8" w:space="0" w:color="000000"/>
+              <w:right w:val="single" w:sz="8" w:space="0" w:color="000000"/>
+            </w:tcBorders>
+          </w:tcPr>
+          <w:p>
+            <w:pPr>
+              <w:pBdr>
+                <w:top w:val="nil"/>
+                <w:left w:val="nil"/>
+                <w:bottom w:val="nil"/>
+                <w:right w:val="nil"/>
+                <w:between w:val="nil"/>
+              </w:pBdr>
+              <w:rPr>
+                <w:color w:val="000000"/>
+                <w:sz w:val="16"/>
+                <w:szCs w:val="16"/>
+              </w:rPr>
+            </w:pPr>
+          </w:p>
+        </w:tc>
+        <w:tc>
+          <w:tcPr>
+            <w:tcW w:w="720" w:type="dxa"/>
+            <w:tcBorders>
+              <w:top w:val="single" w:sz="8" w:space="0" w:color="000000"/>
+              <w:left w:val="single" w:sz="8" w:space="0" w:color="000000"/>
+              <w:bottom w:val="single" w:sz="8" w:space="0" w:color="000000"/>
+              <w:right w:val="single" w:sz="8" w:space="0" w:color="000000"/>
+            </w:tcBorders>
+          </w:tcPr>
+          <w:p>
+            <w:pPr>
+              <w:pBdr>
+                <w:top w:val="nil"/>
+                <w:left w:val="nil"/>
+                <w:bottom w:val="nil"/>
+                <w:right w:val="nil"/>
+                <w:between w:val="nil"/>
+              </w:pBdr>
+              <w:rPr>
+                <w:color w:val="000000"/>
+                <w:sz w:val="16"/>
+                <w:szCs w:val="16"/>
+              </w:rPr>
+            </w:pPr>
+          </w:p>
+        </w:tc>
+        <w:tc>
+          <w:tcPr>
+            <w:tcW w:w="1642" w:type="dxa"/>
+            <w:gridSpan w:val="2"/>
+            <w:tcBorders>
+              <w:top w:val="single" w:sz="8" w:space="0" w:color="000000"/>
+              <w:left w:val="single" w:sz="8" w:space="0" w:color="000000"/>
+              <w:bottom w:val="single" w:sz="8" w:space="0" w:color="000000"/>
+              <w:right w:val="single" w:sz="8" w:space="0" w:color="000000"/>
+            </w:tcBorders>
+          </w:tcPr>
+          <w:p>
+            <w:pPr>
+              <w:pBdr>
+                <w:top w:val="nil"/>
+                <w:left w:val="nil"/>
+                <w:bottom w:val="nil"/>
+                <w:right w:val="nil"/>
+                <w:between w:val="nil"/>
+              </w:pBdr>
+              <w:rPr>
+                <w:color w:val="000000"/>
+                <w:sz w:val="16"/>
+                <w:szCs w:val="16"/>
+              </w:rPr>
+            </w:pPr>
+          </w:p>
+        </w:tc>
+        <w:tc>
+          <w:tcPr>
+            <w:tcW w:w="5903" w:type="dxa"/>
+            <w:gridSpan w:val="3"/>
+            <w:tcBorders>
+              <w:top w:val="single" w:sz="8" w:space="0" w:color="000000"/>
+              <w:left w:val="single" w:sz="8" w:space="0" w:color="000000"/>
+              <w:bottom w:val="single" w:sz="8" w:space="0" w:color="000000"/>
+              <w:right w:val="single" w:sz="8" w:space="0" w:color="000000"/>
+            </w:tcBorders>
+          </w:tcPr>
+          <w:p>
+            <w:pPr>
+              <w:pBdr>
+                <w:top w:val="nil"/>
+                <w:left w:val="nil"/>
+                <w:bottom w:val="nil"/>
+                <w:right w:val="nil"/>
+                <w:between w:val="nil"/>
+              </w:pBdr>
+              <w:rPr>
+                <w:color w:val="000000"/>
+                <w:sz w:val="16"/>
+                <w:szCs w:val="16"/>
+              </w:rPr>
+            </w:pPr>
+          </w:p>
+        </w:tc>
+      </w:tr>
+      <w:tr>
+        <w:trPr>
+          <w:trHeight w:val="230"/>
+        </w:trPr>
+        <w:tc>
+          <w:tcPr>
+            <w:tcW w:w="10365" w:type="dxa"/>
+            <w:gridSpan w:val="8"/>
+            <w:tcBorders>
+              <w:top w:val="single" w:sz="8" w:space="0" w:color="000000"/>
+              <w:left w:val="single" w:sz="8" w:space="0" w:color="000000"/>
+              <w:bottom w:val="single" w:sz="8" w:space="0" w:color="000000"/>
+              <w:right w:val="single" w:sz="8" w:space="0" w:color="000000"/>
+            </w:tcBorders>
+          </w:tcPr>
+          <w:p>
+            <w:pPr>
+              <w:pBdr>
+                <w:top w:val="nil"/>
+                <w:left w:val="nil"/>
+                <w:bottom w:val="nil"/>
+                <w:right w:val="nil"/>
+                <w:between w:val="nil"/>
+              </w:pBdr>
+              <w:ind w:left="107"/>
+              <w:jc w:val="both"/>
+              <w:rPr>
+                <w:b/>
+                <w:color w:val="000000"/>
+                <w:sz w:val="24"/>
+                <w:szCs w:val="24"/>
+              </w:rPr>
+            </w:pPr>
+            <w:r>
+              <w:rPr>
+                <w:b/>
+                <w:color w:val="000000"/>
+                <w:sz w:val="24"/>
+                <w:szCs w:val="24"/>
+              </w:rPr>
+              <w:t>B. CATATAN PENTING HARIAN</w:t>
+            </w:r>
+          </w:p>
+        </w:tc>
+      </w:tr>
+      <w:tr>
+        <w:trPr>
+          <w:trHeight w:val="1838"/>
+        </w:trPr>
+        <w:tc>
+          <w:tcPr>
+            <w:tcW w:w="10365" w:type="dxa"/>
+            <w:gridSpan w:val="8"/>
+            <w:tcBorders>
+              <w:top w:val="single" w:sz="8" w:space="0" w:color="000000"/>
+              <w:left w:val="single" w:sz="8" w:space="0" w:color="000000"/>
+              <w:bottom w:val="single" w:sz="8" w:space="0" w:color="000000"/>
+              <w:right w:val="single" w:sz="8" w:space="0" w:color="000000"/>
+            </w:tcBorders>
+          </w:tcPr>
+          <w:p>
+            <w:pPr>
+              <w:pBdr>
+                <w:top w:val="nil"/>
+                <w:left w:val="nil"/>
+                <w:bottom w:val="nil"/>
+                <w:right w:val="nil"/>
+                <w:between w:val="nil"/>
+              </w:pBdr>
+              <w:spacing w:line="226" w:lineRule="auto"/>
+              <w:ind w:left="107"/>
+              <w:rPr>
+                <w:b/>
+                <w:color w:val="000000"/>
+                <w:sz w:val="20"/>
+                <w:szCs w:val="20"/>
+              </w:rPr>
+            </w:pPr>
+            <w:r>
+              <w:rPr>
+                <w:b/>
+                <w:color w:val="000000"/>
+                <w:sz w:val="20"/>
+                <w:szCs w:val="20"/>
+              </w:rPr>
+              <w:t>1.</w:t>
+            </w:r>
+          </w:p>
+          <w:p>
+            <w:pPr>
+              <w:pBdr>
+                <w:top w:val="nil"/>
+                <w:left w:val="nil"/>
+                <w:bottom w:val="nil"/>
+                <w:right w:val="nil"/>
+                <w:between w:val="nil"/>
+              </w:pBdr>
+              <w:rPr>
+                <w:color w:val="000000"/>
+                <w:sz w:val="20"/>
+                <w:szCs w:val="20"/>
+              </w:rPr>
+            </w:pPr>
+          </w:p>
+          <w:p>
+            <w:pPr>
+              <w:pBdr>
+                <w:top w:val="nil"/>
+                <w:left w:val="nil"/>
+                <w:bottom w:val="nil"/>
+                <w:right w:val="nil"/>
+                <w:between w:val="nil"/>
+              </w:pBdr>
+              <w:spacing w:before="2"/>
+              <w:rPr>
+                <w:color w:val="000000"/>
+                <w:sz w:val="20"/>
+                <w:szCs w:val="20"/>
+              </w:rPr>
+            </w:pPr>
+          </w:p>
+          <w:p>
+            <w:pPr>
+              <w:pBdr>
+                <w:top w:val="nil"/>
+                <w:left w:val="nil"/>
+                <w:bottom w:val="nil"/>
+                <w:right w:val="nil"/>
+                <w:between w:val="nil"/>
+              </w:pBdr>
+              <w:ind w:left="107"/>
+              <w:rPr>
+                <w:b/>
+                <w:color w:val="000000"/>
+                <w:sz w:val="20"/>
+                <w:szCs w:val="20"/>
+              </w:rPr>
+            </w:pPr>
+            <w:r>
+              <w:rPr>
+                <w:b/>
+                <w:color w:val="000000"/>
+                <w:sz w:val="20"/>
+                <w:szCs w:val="20"/>
+              </w:rPr>
+              <w:t>2.</w:t>
+            </w:r>
+          </w:p>
+          <w:p>
+            <w:pPr>
+              <w:pBdr>
+                <w:top w:val="nil"/>
+                <w:left w:val="nil"/>
+                <w:bottom w:val="nil"/>
+                <w:right w:val="nil"/>
+                <w:between w:val="nil"/>
+              </w:pBdr>
+              <w:spacing w:before="228"/>
+              <w:rPr>
+                <w:color w:val="000000"/>
+                <w:sz w:val="20"/>
+                <w:szCs w:val="20"/>
+              </w:rPr>
+            </w:pPr>
+          </w:p>
+          <w:p>
+            <w:pPr>
+              <w:pBdr>
+                <w:top w:val="nil"/>
+                <w:left w:val="nil"/>
+                <w:bottom w:val="nil"/>
+                <w:right w:val="nil"/>
+                <w:between w:val="nil"/>
+              </w:pBdr>
+              <w:ind w:left="107"/>
+              <w:rPr>
+                <w:b/>
+                <w:color w:val="000000"/>
+                <w:sz w:val="20"/>
+                <w:szCs w:val="20"/>
+              </w:rPr>
+            </w:pPr>
+            <w:r>
+              <w:rPr>
+                <w:b/>
+                <w:color w:val="000000"/>
+                <w:sz w:val="20"/>
+                <w:szCs w:val="20"/>
+              </w:rPr>
+              <w:t>3.</w:t>
+            </w:r>
+          </w:p>
+        </w:tc>
+      </w:tr>
+      <w:tr>
+        <w:trPr>
+          <w:trHeight w:val="1579"/>
+        </w:trPr>
+        <w:tc>
+          <w:tcPr>
+            <w:tcW w:w="10365" w:type="dxa"/>
+            <w:gridSpan w:val="8"/>
+            <w:vMerge w:val="restart"/>
+            <w:tcBorders>
+              <w:top w:val="single" w:sz="8" w:space="0" w:color="000000"/>
+              <w:left w:val="single" w:sz="8" w:space="0" w:color="000000"/>
+              <w:bottom w:val="single" w:sz="8" w:space="0" w:color="000000"/>
+              <w:right w:val="single" w:sz="8" w:space="0" w:color="000000"/>
+            </w:tcBorders>
+          </w:tcPr>
+          <w:p>
+            <w:pPr>
+              <w:spacing w:line="275" w:lineRule="auto"/>
+              <w:ind w:left="107"/>
+              <w:rPr>
+                <w:b/>
+                <w:sz w:val="24"/>
+                <w:szCs w:val="24"/>
+              </w:rPr>
+            </w:pPr>
+            <w:r>
+              <w:rPr>
+                <w:b/>
+                <w:sz w:val="24"/>
+                <w:szCs w:val="24"/>
+              </w:rPr>
+              <w:t>D. PENGESAHAN</w:t>
+            </w:r>
+          </w:p>
+        </w:tc>
+      </w:tr>
+      <w:tr>
+        <w:trPr>
+          <w:trHeight w:val="276"/>
+        </w:trPr>
+        <w:tc>
+          <w:tcPr>
+            <w:tcW w:w="10365" w:type="dxa"/>
+            <w:gridSpan w:val="8"/>
+            <w:vMerge/>
+            <w:tcBorders>
+              <w:top w:val="single" w:sz="8" w:space="0" w:color="000000"/>
+              <w:left w:val="single" w:sz="8" w:space="0" w:color="000000"/>
+              <w:bottom w:val="single" w:sz="8" w:space="0" w:color="000000"/>
+              <w:right w:val="single" w:sz="8" w:space="0" w:color="000000"/>
+            </w:tcBorders>
+          </w:tcPr>
+          <w:p>
+            <w:pPr>
+              <w:pBdr>
+                <w:top w:val="nil"/>
+                <w:left w:val="nil"/>
+                <w:bottom w:val="nil"/>
+                <w:right w:val="nil"/>
+                <w:between w:val="nil"/>
+              </w:pBdr>
+              <w:rPr>
+                <w:b/>
+                <w:color w:val="000000"/>
+                <w:sz w:val="24"/>
+                <w:szCs w:val="24"/>
+              </w:rPr>
+            </w:pPr>
+          </w:p>
+        </w:tc>
+      </w:tr>
+      <w:tr>
+        <w:trPr>
+          <w:trHeight w:val="1634"/>
+        </w:trPr>
+        <w:tc>
+          <w:tcPr>
+            <w:tcW w:w="5250" w:type="dxa"/>
+            <w:gridSpan w:val="6"/>
+            <w:tcBorders>
+              <w:top w:val="single" w:sz="8" w:space="0" w:color="000000"/>
+              <w:left w:val="single" w:sz="8" w:space="0" w:color="000000"/>
+              <w:bottom w:val="single" w:sz="8" w:space="0" w:color="000000"/>
+              <w:right w:val="single" w:sz="8" w:space="0" w:color="000000"/>
+            </w:tcBorders>
+          </w:tcPr>
+          <w:p>
+            <w:pPr>
+              <w:pBdr>
+                <w:top w:val="nil"/>
+                <w:left w:val="nil"/>
+                <w:bottom w:val="nil"/>
+                <w:right w:val="nil"/>
+                <w:between w:val="nil"/>
+              </w:pBdr>
+              <w:spacing w:line="251" w:lineRule="auto"/>
+              <w:ind w:left="263"/>
+              <w:rPr>
+                <w:b/>
+                <w:color w:val="000000"/>
+              </w:rPr>
+            </w:pPr>
+            <w:r>
+              <w:rPr>
+                <w:b/>
+                <w:color w:val="000000"/>
+              </w:rPr>
+              <w:t>TANDA TANGAN LURAH/KEPALA DESA</w:t>
+            </w:r>
+          </w:p>
+        </w:tc>
+        <w:tc>
+          <w:tcPr>
+            <w:tcW w:w="5115" w:type="dxa"/>
+            <w:gridSpan w:val="2"/>
+            <w:tcBorders>
+              <w:top w:val="single" w:sz="8" w:space="0" w:color="000000"/>
+              <w:left w:val="single" w:sz="8" w:space="0" w:color="000000"/>
+              <w:bottom w:val="single" w:sz="8" w:space="0" w:color="000000"/>
+              <w:right w:val="single" w:sz="8" w:space="0" w:color="000000"/>
+            </w:tcBorders>
+          </w:tcPr>
+          <w:p>
+            <w:pPr>
+              <w:pBdr>
+                <w:top w:val="nil"/>
+                <w:left w:val="nil"/>
+                <w:bottom w:val="nil"/>
+                <w:right w:val="nil"/>
+                <w:between w:val="nil"/>
+              </w:pBdr>
+              <w:spacing w:line="275" w:lineRule="auto"/>
+              <w:ind w:left="1001"/>
+              <w:rPr>
+                <w:b/>
+                <w:color w:val="000000"/>
+                <w:sz w:val="24"/>
+                <w:szCs w:val="24"/>
+              </w:rPr>
+            </w:pPr>
+            <w:r>
+              <w:rPr>
+                <w:b/>
+                <w:color w:val="000000"/>
+                <w:sz w:val="24"/>
+                <w:szCs w:val="24"/>
+              </w:rPr>
+              <w:t>TANDA TANGAN MAHASISWA</w:t>
+            </w:r>
+          </w:p>
+        </w:tc>
+      </w:tr>
+    </w:tbl>
+    <w:p>
+      <w:pPr>
+        <w:spacing w:before="240" w:after="240"/>
+        <w:jc w:val="both"/>
+        <w:rPr>
+          <w:b/>
+          <w:sz w:val="24"/>
+          <w:szCs w:val="24"/>
+        </w:rPr>
+      </w:pPr>
+      <w:r>
+        <w:rPr>
+          <w:b/>
+          <w:sz w:val="24"/>
+          <w:szCs w:val="24"/>
+        </w:rPr>
+        <w:t>Petunjuk Pengisian:</w:t>
+      </w:r>
+    </w:p>
+    <w:p>
+      <w:pPr>
+        <w:numPr>
+          <w:ilvl w:val="0"/>
+          <w:numId w:val="1"/>
+        </w:numPr>
+        <w:pBdr>
+          <w:top w:val="nil"/>
+          <w:left w:val="nil"/>
+          <w:bottom w:val="nil"/>
+          <w:right w:val="nil"/>
+          <w:between w:val="nil"/>
+        </w:pBdr>
+        <w:jc w:val="both"/>
+        <w:rPr>
+          <w:sz w:val="24"/>
+          <w:szCs w:val="24"/>
+        </w:rPr>
+      </w:pPr>
+      <w:r>
+        <w:rPr>
+          <w:sz w:val="24"/>
+          <w:szCs w:val="24"/>
+        </w:rPr>
+        <w:t xml:space="preserve">Logbook adalah buku catatan harian bagi peserta KKN yang wajib diisi setiap hari dan dilaporkan kepada Dosen Pembimbing Lapangan (DPL) setiap minggu Ling google form. </w:t>
+      </w:r>
+    </w:p>
+    <w:p>
+      <w:pPr>
+        <w:numPr>
+          <w:ilvl w:val="0"/>
+          <w:numId w:val="1"/>
+        </w:numPr>
+        <w:pBdr>
+          <w:top w:val="nil"/>
+          <w:left w:val="nil"/>
+          <w:bottom w:val="nil"/>
+          <w:right w:val="nil"/>
+          <w:between w:val="nil"/>
+        </w:pBdr>
+        <w:jc w:val="both"/>
+        <w:rPr>
+          <w:sz w:val="24"/>
+          <w:szCs w:val="24"/>
+        </w:rPr>
+      </w:pPr>
+      <w:r>
+        <w:rPr>
+          <w:sz w:val="24"/>
+          <w:szCs w:val="24"/>
+        </w:rPr>
+        <w:t>Logbook hanya boleh diisi dengan aktivitas yang berkaitan dengan program KKN.</w:t>
+      </w:r>
+    </w:p>
+    <w:p>
+      <w:pPr>
+        <w:numPr>
+          <w:ilvl w:val="0"/>
+          <w:numId w:val="1"/>
+        </w:numPr>
+        <w:pBdr>
+          <w:top w:val="nil"/>
+          <w:left w:val="nil"/>
+          <w:bottom w:val="nil"/>
+          <w:right w:val="nil"/>
+          <w:between w:val="nil"/>
+        </w:pBdr>
+        <w:jc w:val="both"/>
+        <w:rPr>
+          <w:sz w:val="24"/>
+          <w:szCs w:val="24"/>
+        </w:rPr>
+      </w:pPr>
+      <w:r>
+        <w:rPr>
+          <w:sz w:val="24"/>
+          <w:szCs w:val="24"/>
+        </w:rPr>
+        <w:t>Setiap logbook harus ditempelkan pas foto berwarna terbaru dengan ukuran 4x6 cm.</w:t>
+      </w:r>
+    </w:p>
+    <w:p>
+      <w:pPr>
+        <w:numPr>
+          <w:ilvl w:val="0"/>
+          <w:numId w:val="1"/>
+        </w:numPr>
+        <w:pBdr>
+          <w:top w:val="nil"/>
+          <w:left w:val="nil"/>
+          <w:bottom w:val="nil"/>
+          <w:right w:val="nil"/>
+          <w:between w:val="nil"/>
+        </w:pBdr>
+        <w:jc w:val="both"/>
+        <w:rPr>
+          <w:sz w:val="24"/>
+          <w:szCs w:val="24"/>
+        </w:rPr>
+      </w:pPr>
+      <w:r>
+        <w:rPr>
+          <w:sz w:val="24"/>
+          <w:szCs w:val="24"/>
+        </w:rPr>
+        <w:t>Isi logbook mencakup kegiatan harian, catatan penting, serta dokumentasi seperti foto, tautan video, dan lain-lain.</w:t>
+      </w:r>
+    </w:p>
+    <w:p>
+      <w:pPr>
+        <w:numPr>
+          <w:ilvl w:val="0"/>
+          <w:numId w:val="1"/>
+        </w:numPr>
+        <w:pBdr>
+          <w:top w:val="nil"/>
+          <w:left w:val="nil"/>
+          <w:bottom w:val="nil"/>
+          <w:right w:val="nil"/>
+          <w:between w:val="nil"/>
+        </w:pBdr>
+        <w:jc w:val="both"/>
+        <w:rPr>
+          <w:sz w:val="24"/>
+          <w:szCs w:val="24"/>
+        </w:rPr>
+      </w:pPr>
+      <w:r>
+        <w:rPr>
+          <w:sz w:val="24"/>
+          <w:szCs w:val="24"/>
+        </w:rPr>
+        <w:t>Penulisan logbook harus menggunakan bahasa Indonesia yang baik dan benar sesuai kaidah baku.</w:t>
+      </w:r>
+    </w:p>
+    <w:p>
+      <w:pPr>
+        <w:numPr>
+          <w:ilvl w:val="0"/>
+          <w:numId w:val="1"/>
+        </w:numPr>
+        <w:pBdr>
+          <w:top w:val="nil"/>
+          <w:left w:val="nil"/>
+          <w:bottom w:val="nil"/>
+          <w:right w:val="nil"/>
+          <w:between w:val="nil"/>
+        </w:pBdr>
+        <w:jc w:val="both"/>
+        <w:rPr>
+          <w:sz w:val="24"/>
+          <w:szCs w:val="24"/>
+        </w:rPr>
+      </w:pPr>
+      <w:r>
+        <w:rPr>
+          <w:sz w:val="24"/>
+          <w:szCs w:val="24"/>
+        </w:rPr>
+        <w:t>Pada bagian kolom pengesahan, mahasiswa wajib menandatangani serta menuliskan nama lengkapnya, kemudian nama lurah, kepala desa, atau pihak berwenang lainnya.</w:t>
+      </w:r>
+    </w:p>
+    <w:p>
+      <w:pPr>
+        <w:numPr>
+          <w:ilvl w:val="0"/>
+          <w:numId w:val="1"/>
+        </w:numPr>
+        <w:pBdr>
+          <w:top w:val="nil"/>
+          <w:left w:val="nil"/>
+          <w:bottom w:val="nil"/>
+          <w:right w:val="nil"/>
+          <w:between w:val="nil"/>
+        </w:pBdr>
+        <w:jc w:val="both"/>
+        <w:rPr>
+          <w:sz w:val="24"/>
+          <w:szCs w:val="24"/>
+        </w:rPr>
+      </w:pPr>
+      <w:r>
+        <w:rPr>
+          <w:sz w:val="24"/>
+          <w:szCs w:val="24"/>
+        </w:rPr>
+        <w:t>Selanjutnya, lurah, kepala desa, atau pihak berwenang terkait diminta untuk memberikan tanda tangan pada logbook mingguan tersebut.</w:t>
+      </w:r>
+    </w:p>
+    <w:p>
+      <w:pPr>
+        <w:numPr>
+          <w:ilvl w:val="0"/>
+          <w:numId w:val="1"/>
+        </w:numPr>
+        <w:pBdr>
+          <w:top w:val="nil"/>
+          <w:left w:val="nil"/>
+          <w:bottom w:val="nil"/>
+          <w:right w:val="nil"/>
+          <w:between w:val="nil"/>
+        </w:pBdr>
+        <w:jc w:val="both"/>
+        <w:rPr>
+          <w:sz w:val="24"/>
+          <w:szCs w:val="24"/>
+        </w:rPr>
+      </w:pPr>
+      <w:r>
+        <w:rPr>
+          <w:sz w:val="24"/>
+          <w:szCs w:val="24"/>
+        </w:rPr>
+        <w:t>Mahasiswa kemudian mengirimkan logbook mingguan secara daring kepada DPL masing-masing.</w:t>
+      </w:r>
+    </w:p>
+    <w:p>
+      <w:pPr>
+        <w:numPr>
+          <w:ilvl w:val="0"/>
+          <w:numId w:val="1"/>
+        </w:numPr>
+        <w:pBdr>
+          <w:top w:val="nil"/>
+          <w:left w:val="nil"/>
+          <w:bottom w:val="nil"/>
+          <w:right w:val="nil"/>
+          <w:between w:val="nil"/>
+        </w:pBdr>
+        <w:jc w:val="both"/>
+        <w:rPr>
+          <w:sz w:val="24"/>
+          <w:szCs w:val="24"/>
+        </w:rPr>
+      </w:pPr>
+      <w:r>
+        <w:rPr>
+          <w:sz w:val="24"/>
+          <w:szCs w:val="24"/>
+        </w:rPr>
+        <w:t>DPL akan memeriksa dan memberikan tanggapan terhadap logbook setiap minggu.</w:t>
+      </w:r>
+      <w:r>
+        <w:rPr>
+          <w:sz w:val="24"/>
+          <w:szCs w:val="24"/>
+        </w:rPr>
+        <w:br/>
+      </w:r>
+    </w:p>
+    <w:p>
+      <w:pPr>
+        <w:pBdr>
+          <w:top w:val="nil"/>
+          <w:left w:val="nil"/>
+          <w:bottom w:val="nil"/>
+          <w:right w:val="nil"/>
+          <w:between w:val="nil"/>
+        </w:pBdr>
+        <w:ind w:left="1080"/>
+        <w:jc w:val="both"/>
+        <w:rPr>
+          <w:sz w:val="24"/>
+          <w:szCs w:val="24"/>
+        </w:rPr>
+      </w:pPr>
+    </w:p>
+    <w:sectPr>
+      <w:pgSz w:w="12240" w:h="15840"/>
+      <w:pgMar w:top="1440" w:right="1440" w:bottom="1440" w:left="1440" w:header="708" w:footer="708" w:gutter="0"/>
+      <w:pgNumType w:start="1"/>
+      <w:cols w:space="720"/>
+    </w:sectPr>
+  </w:body>
+</w:document>
 </file>
 
 <file path=word/numbering.xml><?xml version="1.0" encoding="utf-8"?>

</xml_diff>

<commit_message>
fix(docx): pulihkan template Word ke format 100% valid tanpa modifikasi XML gambar agar dibuka bersih di Word
</commit_message>
<xml_diff>
--- a/public/templates/template_logbook_kkn_prepared.docx
+++ b/public/templates/template_logbook_kkn_prepared.docx
@@ -1,6 +1,4056 @@
 
-<file path=word/document.xml><?xml version="1.0" encoding="UTF-8" standalone="yes"?>
-<w:document xmlns:wpc="http://schemas.microsoft.com/office/word/2010/wordprocessingCanvas" xmlns:cx="http://schemas.microsoft.com/office/drawing/2014/chartex" xmlns:cx1="http://schemas.microsoft.com/office/drawing/2015/9/8/chartex" xmlns:cx2="http://schemas.microsoft.com/office/drawing/2015/10/21/chartex" xmlns:cx3="http://schemas.microsoft.com/office/drawing/2016/5/9/chartex" xmlns:cx4="http://schemas.microsoft.com/office/drawing/2016/5/10/chartex" xmlns:cx5="http://schemas.microsoft.com/office/drawing/2016/5/11/chartex" xmlns:cx6="http://schemas.microsoft.com/office/drawing/2016/5/12/chartex" xmlns:cx7="http://schemas.microsoft.com/office/drawing/2016/5/13/chartex" xmlns:cx8="http://schemas.microsoft.com/office/drawing/2016/5/14/chartex" xmlns:mc="http://schemas.openxmlformats.org/markup-compatibility/2006" xmlns:aink="http://schemas.microsoft.com/office/drawing/2016/ink" xmlns:am3d="http://schemas.microsoft.com/office/drawing/2017/model3d" xmlns:o="urn:schemas-microsoft-com:office:office" xmlns:oel="http://schemas.microsoft.com/office/2019/extlst" xmlns:r="http://schemas.openxmlformats.org/officeDocument/2006/relationships" xmlns:m="http://schemas.openxmlformats.org/officeDocument/2006/math" xmlns:v="urn:schemas-microsoft-com:vml" xmlns:wp14="http://schemas.microsoft.com/office/word/2010/wordprocessingDrawing" xmlns:wp="http://schemas.openxmlformats.org/drawingml/2006/wordprocessingDrawing" xmlns:w10="urn:schemas-microsoft-com:office:word" xmlns:w="http://schemas.openxmlformats.org/wordprocessingml/2006/main" xmlns:w14="http://schemas.microsoft.com/office/word/2010/wordml" xmlns:w15="http://schemas.microsoft.com/office/word/2012/wordml" xmlns:w16cex="http://schemas.microsoft.com/office/word/2018/wordml/cex" xmlns:w16cid="http://schemas.microsoft.com/office/word/2016/wordml/cid" xmlns:w16="http://schemas.microsoft.com/office/word/2018/wordml" xmlns:w16du="http://schemas.microsoft.com/office/word/2023/wordml/word16du" xmlns:w16sdtdh="http://schemas.microsoft.com/office/word/2020/wordml/sdtdatahash" xmlns:w16sdtfl="http://schemas.microsoft.com/office/word/2024/wordml/sdtformatlock" xmlns:w16se="http://schemas.microsoft.com/office/word/2015/wordml/symex" xmlns:wpg="http://schemas.microsoft.com/office/word/2010/wordprocessingGroup" xmlns:wpi="http://schemas.microsoft.com/office/word/2010/wordprocessingInk" xmlns:wne="http://schemas.microsoft.com/office/word/2006/wordml" xmlns:wps="http://schemas.microsoft.com/office/word/2010/wordprocessingShape" mc:Ignorable="w14 w15 w16se w16cid w16 w16cex w16sdtdh w16sdtfl w16du wp14"><w:body></w:tc><w:tc><w:tcPr><w:tcW w:w="3885" w:type="dxa"/><w:gridSpan w:val="3"/><w:tcBorders><w:top w:val="single" w:sz="12" w:space="0" w:color="000000"/><w:left w:val="single" w:sz="12" w:space="0" w:color="000000"/><w:bottom w:val="single" w:sz="12" w:space="0" w:color="000000"/><w:right w:val="single" w:sz="12" w:space="0" w:color="000000"/></w:tcBorders></w:tcPr><w:p><w:pPr><w:pBdr><w:top w:val="nil"/><w:left w:val="nil"/><w:bottom w:val="nil"/><w:right w:val="nil"/><w:between w:val="nil"/></w:pBdr><w:spacing w:before="3"/><w:ind w:left="106"/><w:rPr><w:b/><w:i/><w:color w:val="000000"/><w:sz w:val="24"/><w:szCs w:val="24"/></w:rPr></w:pPr><w:r><w:rPr><w:b/><w:i/><w:color w:val="000000"/><w:sz w:val="24"/><w:szCs w:val="24"/></w:rPr><w:t>LOGBOOK</w:t></w:r></w:p><w:p><w:pPr><w:pBdr><w:top w:val="nil"/><w:left w:val="nil"/><w:bottom w:val="nil"/><w:right w:val="nil"/><w:between w:val="nil"/></w:pBdr><w:spacing w:before="135" w:line="360" w:lineRule="auto"/><w:ind w:left="106" w:right="267"/><w:rPr><w:b/><w:color w:val="000000"/><w:sz w:val="24"/><w:szCs w:val="24"/></w:rPr></w:pPr><w:r><w:rPr><w:b/><w:color w:val="000000"/><w:sz w:val="24"/><w:szCs w:val="24"/></w:rPr><w:t>KULIAH KERJA NYATA UNIVERSITAS MARITIM RAJA ALI HAJI</w:t></w:r></w:p></w:tc><w:tc><w:tcPr><w:tcW w:w="2550" w:type="dxa"/><w:tcBorders><w:top w:val="single" w:sz="12" w:space="0" w:color="000000"/><w:left w:val="single" w:sz="12" w:space="0" w:color="000000"/><w:bottom w:val="single" w:sz="12" w:space="0" w:color="000000"/><w:right w:val="single" w:sz="12" w:space="0" w:color="000000"/></w:tcBorders></w:tcPr><w:p><w:pPr><w:pBdr><w:top w:val="nil"/><w:left w:val="nil"/><w:bottom w:val="nil"/><w:right w:val="nil"/><w:between w:val="nil"/></w:pBdr><w:rPr><w:color w:val="000000"/><w:sz w:val="24"/><w:szCs w:val="24"/></w:rPr></w:pPr></w:p><w:p><w:pPr><w:pBdr><w:top w:val="nil"/><w:left w:val="nil"/><w:bottom w:val="nil"/><w:right w:val="nil"/><w:between w:val="nil"/></w:pBdr><w:spacing w:before="270"/><w:rPr><w:color w:val="000000"/><w:sz w:val="24"/><w:szCs w:val="24"/></w:rPr></w:pPr></w:p><w:p><w:pPr><w:pBdr><w:top w:val="nil"/><w:left w:val="nil"/><w:bottom w:val="nil"/><w:right w:val="nil"/><w:between w:val="nil"/></w:pBdr><w:spacing w:before="1"/><w:ind w:left="104" w:right="994"/><w:rPr><w:b/><w:color w:val="000000"/><w:sz w:val="24"/><w:szCs w:val="24"/></w:rPr></w:pPr><w:r><w:rPr><w:b/><w:color w:val="000000"/><w:sz w:val="24"/><w:szCs w:val="24"/></w:rPr><w:t>{week_label}</w:t></w:r></w:p></w:tc></w:tr><w:tr><w:trPr><w:trHeight w:val="274"/></w:trPr><w:tc><w:tcPr><w:tcW w:w="10365" w:type="dxa"/><w:gridSpan w:val="8"/><w:tcBorders><w:top w:val="single" w:sz="12" w:space="0" w:color="000000"/><w:left w:val="single" w:sz="8" w:space="0" w:color="000000"/><w:bottom w:val="single" w:sz="8" w:space="0" w:color="000000"/><w:right w:val="single" w:sz="8" w:space="0" w:color="000000"/></w:tcBorders></w:tcPr><w:p><w:pPr><w:pBdr><w:top w:val="nil"/><w:left w:val="nil"/><w:bottom w:val="nil"/><w:right w:val="nil"/><w:between w:val="nil"/></w:pBdr><w:spacing w:line="254" w:lineRule="auto"/><w:ind w:left="107"/><w:rPr><w:b/><w:color w:val="000000"/><w:sz w:val="24"/><w:szCs w:val="24"/></w:rPr></w:pPr><w:r><w:rPr><w:b/><w:color w:val="000000"/><w:sz w:val="24"/><w:szCs w:val="24"/></w:rPr><w:t>NAMA MAHASISWA/NIM/KELOMPOK: {group_info}</w:t></w:r></w:p></w:tc></w:tr><w:tr><w:trPr><w:trHeight w:val="278"/></w:trPr><w:tc><w:tcPr><w:tcW w:w="10365" w:type="dxa"/><w:gridSpan w:val="8"/><w:tcBorders><w:top w:val="single" w:sz="8" w:space="0" w:color="000000"/><w:left w:val="single" w:sz="8" w:space="0" w:color="000000"/><w:bottom w:val="single" w:sz="8" w:space="0" w:color="000000"/><w:right w:val="single" w:sz="8" w:space="0" w:color="000000"/></w:tcBorders></w:tcPr><w:p><w:pPr><w:pBdr><w:top w:val="nil"/><w:left w:val="nil"/><w:bottom w:val="nil"/><w:right w:val="nil"/><w:between w:val="nil"/></w:pBdr><w:spacing w:line="258" w:lineRule="auto"/><w:ind w:left="107"/><w:rPr><w:b/><w:color w:val="000000"/><w:sz w:val="24"/><w:szCs w:val="24"/></w:rPr></w:pPr><w:r><w:rPr><w:b/><w:color w:val="000000"/><w:sz w:val="24"/><w:szCs w:val="24"/></w:rPr><w:t>A. JADWAL:</w:t></w:r></w:p></w:tc></w:tr><w:tr><w:trPr><w:trHeight w:val="230"/></w:trPr><w:tc><w:tcPr><w:tcW w:w="635" w:type="dxa"/><w:tcBorders><w:top w:val="single" w:sz="8" w:space="0" w:color="000000"/><w:left w:val="single" w:sz="8" w:space="0" w:color="000000"/><w:bottom w:val="single" w:sz="8" w:space="0" w:color="000000"/><w:right w:val="single" w:sz="8" w:space="0" w:color="000000"/></w:tcBorders></w:tcPr><w:p><w:pPr><w:rPr><w:b/><w:bCs/><w:color w:val="000000"/><w:sz w:val="20"/><w:szCs w:val="20"/></w:rPr></w:pPr><w:r><w:rPr><w:b/><w:bCs/><w:sz w:val="20"/><w:szCs w:val="20"/></w:rPr><w:t>HARI</w:t></w:r></w:p></w:tc><w:tc><w:tcPr><w:tcW w:w="1465" w:type="dxa"/><w:tcBorders><w:top w:val="single" w:sz="8" w:space="0" w:color="000000"/><w:left w:val="single" w:sz="8" w:space="0" w:color="000000"/><w:bottom w:val="single" w:sz="8" w:space="0" w:color="000000"/><w:right w:val="single" w:sz="8" w:space="0" w:color="000000"/></w:tcBorders></w:tcPr><w:p><w:pPr><w:pBdr><w:top w:val="nil"/><w:left w:val="nil"/><w:bottom w:val="nil"/><w:right w:val="nil"/><w:between w:val="nil"/></w:pBdr><w:spacing w:line="210" w:lineRule="auto"/><w:ind w:left="106"/><w:rPr><w:b/><w:color w:val="000000"/><w:sz w:val="20"/><w:szCs w:val="20"/></w:rPr></w:pPr><w:r><w:rPr><w:b/><w:color w:val="000000"/><w:sz w:val="20"/><w:szCs w:val="20"/></w:rPr><w:t>TANGGAL</w:t></w:r></w:p></w:tc><w:tc><w:tcPr><w:tcW w:w="720" w:type="dxa"/><w:tcBorders><w:top w:val="single" w:sz="8" w:space="0" w:color="000000"/><w:left w:val="single" w:sz="8" w:space="0" w:color="000000"/><w:bottom w:val="single" w:sz="8" w:space="0" w:color="000000"/><w:right w:val="single" w:sz="8" w:space="0" w:color="000000"/></w:tcBorders></w:tcPr><w:p><w:pPr><w:pBdr><w:top w:val="nil"/><w:left w:val="nil"/><w:bottom w:val="nil"/><w:right w:val="nil"/><w:between w:val="nil"/></w:pBdr><w:spacing w:line="210" w:lineRule="auto"/><w:ind w:left="242"/><w:rPr><w:b/><w:color w:val="000000"/><w:sz w:val="20"/><w:szCs w:val="20"/></w:rPr></w:pPr><w:r><w:rPr><w:b/><w:color w:val="000000"/><w:sz w:val="20"/><w:szCs w:val="20"/></w:rPr><w:t>JAM</w:t></w:r></w:p></w:tc><w:tc><w:tcPr><w:tcW w:w="1642" w:type="dxa"/><w:gridSpan w:val="2"/><w:tcBorders><w:top w:val="single" w:sz="8" w:space="0" w:color="000000"/><w:left w:val="single" w:sz="8" w:space="0" w:color="000000"/><w:bottom w:val="single" w:sz="8" w:space="0" w:color="000000"/><w:right w:val="single" w:sz="8" w:space="0" w:color="000000"/></w:tcBorders></w:tcPr><w:p><w:pPr><w:pBdr><w:top w:val="nil"/><w:left w:val="nil"/><w:bottom w:val="nil"/><w:right w:val="nil"/><w:between w:val="nil"/></w:pBdr><w:spacing w:line="210" w:lineRule="auto"/><w:ind w:left="242"/><w:rPr><w:b/><w:color w:val="000000"/><w:sz w:val="20"/><w:szCs w:val="20"/></w:rPr></w:pPr><w:r><w:rPr><w:b/><w:sz w:val="20"/><w:szCs w:val="20"/></w:rPr><w:t>KEGIATAN</w:t></w:r></w:p></w:tc><w:tc><w:tcPr><w:tcW w:w="5903" w:type="dxa"/><w:gridSpan w:val="3"/><w:tcBorders><w:top w:val="single" w:sz="8" w:space="0" w:color="000000"/><w:left w:val="single" w:sz="8" w:space="0" w:color="000000"/><w:bottom w:val="single" w:sz="8" w:space="0" w:color="000000"/><w:right w:val="single" w:sz="8" w:space="0" w:color="000000"/></w:tcBorders></w:tcPr><w:p><w:pPr><w:pBdr><w:top w:val="nil"/><w:left w:val="nil"/><w:bottom w:val="nil"/><w:right w:val="nil"/><w:between w:val="nil"/></w:pBdr><w:spacing w:line="210" w:lineRule="auto"/><w:ind w:right="1"/><w:jc w:val="center"/><w:rPr><w:b/><w:color w:val="FF0000"/><w:sz w:val="20"/><w:szCs w:val="20"/></w:rPr></w:pPr><w:r><w:rPr><w:b/><w:color w:val="FF0000"/><w:sz w:val="20"/><w:szCs w:val="20"/></w:rPr><w:t>Dokumentasi</w:t></w:r></w:p></w:tc></w:tr><w:tr><w:trPr><w:trHeight w:val="230"/></w:trPr><w:tc><w:tcPr><w:tcW w:w="635" w:type="dxa"/><w:tcBorders><w:top w:val="single" w:sz="8" w:space="0" w:color="000000"/><w:left w:val="single" w:sz="8" w:space="0" w:color="000000"/><w:bottom w:val="single" w:sz="8" w:space="0" w:color="000000"/><w:right w:val="single" w:sz="8" w:space="0" w:color="000000"/></w:tcBorders></w:tcPr><w:p><w:pPr><w:pBdr><w:top w:val="nil"/><w:left w:val="nil"/><w:bottom w:val="nil"/><w:right w:val="nil"/><w:between w:val="nil"/></w:pBdr><w:rPr><w:color w:val="000000"/><w:sz w:val="16"/><w:szCs w:val="16"/></w:rPr></w:pPr></w:p></w:tc><w:tc><w:tcPr><w:tcW w:w="1465" w:type="dxa"/><w:tcBorders><w:top w:val="single" w:sz="8" w:space="0" w:color="000000"/><w:left w:val="single" w:sz="8" w:space="0" w:color="000000"/><w:bottom w:val="single" w:sz="8" w:space="0" w:color="000000"/><w:right w:val="single" w:sz="8" w:space="0" w:color="000000"/></w:tcBorders></w:tcPr><w:p><w:pPr><w:pBdr><w:top w:val="nil"/><w:left w:val="nil"/><w:bottom w:val="nil"/><w:right w:val="nil"/><w:between w:val="nil"/></w:pBdr><w:rPr><w:color w:val="000000"/><w:sz w:val="16"/><w:szCs w:val="16"/></w:rPr></w:pPr></w:p></w:tc><w:tc><w:tcPr><w:tcW w:w="720" w:type="dxa"/><w:tcBorders><w:top w:val="single" w:sz="8" w:space="0" w:color="000000"/><w:left w:val="single" w:sz="8" w:space="0" w:color="000000"/><w:bottom w:val="single" w:sz="8" w:space="0" w:color="000000"/><w:right w:val="single" w:sz="8" w:space="0" w:color="000000"/></w:tcBorders></w:tcPr><w:p><w:pPr><w:pBdr><w:top w:val="nil"/><w:left w:val="nil"/><w:bottom w:val="nil"/><w:right w:val="nil"/><w:between w:val="nil"/></w:pBdr><w:rPr><w:color w:val="000000"/><w:sz w:val="16"/><w:szCs w:val="16"/></w:rPr></w:pPr></w:p></w:tc><w:tc><w:tcPr><w:tcW w:w="1642" w:type="dxa"/><w:gridSpan w:val="2"/><w:tcBorders><w:top w:val="single" w:sz="8" w:space="0" w:color="000000"/><w:left w:val="single" w:sz="8" w:space="0" w:color="000000"/><w:bottom w:val="single" w:sz="8" w:space="0" w:color="000000"/><w:right w:val="single" w:sz="8" w:space="0" w:color="000000"/></w:tcBorders></w:tcPr><w:p><w:pPr><w:pBdr><w:top w:val="nil"/><w:left w:val="nil"/><w:bottom w:val="nil"/><w:right w:val="nil"/><w:between w:val="nil"/></w:pBdr><w:rPr><w:color w:val="000000"/><w:sz w:val="16"/><w:szCs w:val="16"/></w:rPr></w:pPr></w:p></w:tc><w:tc><w:tcPr><w:tcW w:w="5903" w:type="dxa"/><w:gridSpan w:val="3"/><w:tcBorders><w:top w:val="single" w:sz="8" w:space="0" w:color="000000"/><w:left w:val="single" w:sz="8" w:space="0" w:color="000000"/><w:bottom w:val="single" w:sz="8" w:space="0" w:color="000000"/><w:right w:val="single" w:sz="8" w:space="0" w:color="000000"/></w:tcBorders></w:tcPr><w:p><w:pPr><w:pBdr><w:top w:val="nil"/><w:left w:val="nil"/><w:bottom w:val="nil"/><w:right w:val="nil"/><w:between w:val="nil"/></w:pBdr><w:rPr><w:color w:val="000000"/><w:sz w:val="16"/><w:szCs w:val="16"/></w:rPr></w:pPr><w:r><w:rPr><w:sz w:val="16"/><w:szCs w:val="16"/></w:rPr><w:t xml:space="preserve"> </w:t></w:r></w:p></w:tc></w:tr><w:tr><w:trPr><w:trHeight w:val="230"/></w:trPr><w:tc><w:tcPr><w:tcW w:w="635" w:type="dxa"/><w:tcBorders><w:top w:val="single" w:sz="8" w:space="0" w:color="000000"/><w:left w:val="single" w:sz="8" w:space="0" w:color="000000"/><w:bottom w:val="single" w:sz="8" w:space="0" w:color="000000"/><w:right w:val="single" w:sz="8" w:space="0" w:color="000000"/></w:tcBorders></w:tcPr><w:p><w:pPr><w:pBdr><w:top w:val="nil"/><w:left w:val="nil"/><w:bottom w:val="nil"/><w:right w:val="nil"/><w:between w:val="nil"/></w:pBdr><w:rPr><w:color w:val="000000"/><w:sz w:val="16"/><w:szCs w:val="16"/></w:rPr></w:pPr></w:p></w:tc><w:tc><w:tcPr><w:tcW w:w="1465" w:type="dxa"/><w:tcBorders><w:top w:val="single" w:sz="8" w:space="0" w:color="000000"/><w:left w:val="single" w:sz="8" w:space="0" w:color="000000"/><w:bottom w:val="single" w:sz="8" w:space="0" w:color="000000"/><w:right w:val="single" w:sz="8" w:space="0" w:color="000000"/></w:tcBorders></w:tcPr><w:p><w:pPr><w:pBdr><w:top w:val="nil"/><w:left w:val="nil"/><w:bottom w:val="nil"/><w:right w:val="nil"/><w:between w:val="nil"/></w:pBdr><w:rPr><w:color w:val="000000"/><w:sz w:val="16"/><w:szCs w:val="16"/></w:rPr></w:pPr></w:p></w:tc><w:tc><w:tcPr><w:tcW w:w="720" w:type="dxa"/><w:tcBorders><w:top w:val="single" w:sz="8" w:space="0" w:color="000000"/><w:left w:val="single" w:sz="8" w:space="0" w:color="000000"/><w:bottom w:val="single" w:sz="8" w:space="0" w:color="000000"/><w:right w:val="single" w:sz="8" w:space="0" w:color="000000"/></w:tcBorders></w:tcPr><w:p><w:pPr><w:pBdr><w:top w:val="nil"/><w:left w:val="nil"/><w:bottom w:val="nil"/><w:right w:val="nil"/><w:between w:val="nil"/></w:pBdr><w:rPr><w:color w:val="000000"/><w:sz w:val="16"/><w:szCs w:val="16"/></w:rPr></w:pPr></w:p></w:tc><w:tc><w:tcPr><w:tcW w:w="1642" w:type="dxa"/><w:gridSpan w:val="2"/><w:tcBorders><w:top w:val="single" w:sz="8" w:space="0" w:color="000000"/><w:left w:val="single" w:sz="8" w:space="0" w:color="000000"/><w:bottom w:val="single" w:sz="8" w:space="0" w:color="000000"/><w:right w:val="single" w:sz="8" w:space="0" w:color="000000"/></w:tcBorders></w:tcPr><w:p><w:pPr><w:pBdr><w:top w:val="nil"/><w:left w:val="nil"/><w:bottom w:val="nil"/><w:right w:val="nil"/><w:between w:val="nil"/></w:pBdr><w:rPr><w:color w:val="000000"/><w:sz w:val="16"/><w:szCs w:val="16"/></w:rPr></w:pPr></w:p></w:tc><w:tc><w:tcPr><w:tcW w:w="5903" w:type="dxa"/><w:gridSpan w:val="3"/><w:tcBorders><w:top w:val="single" w:sz="8" w:space="0" w:color="000000"/><w:left w:val="single" w:sz="8" w:space="0" w:color="000000"/><w:bottom w:val="single" w:sz="8" w:space="0" w:color="000000"/><w:right w:val="single" w:sz="8" w:space="0" w:color="000000"/></w:tcBorders></w:tcPr><w:p><w:pPr><w:pBdr><w:top w:val="nil"/><w:left w:val="nil"/><w:bottom w:val="nil"/><w:right w:val="nil"/><w:between w:val="nil"/></w:pBdr><w:rPr><w:color w:val="000000"/><w:sz w:val="16"/><w:szCs w:val="16"/></w:rPr></w:pPr></w:p></w:tc></w:tr><w:tr><w:trPr><w:trHeight w:val="230"/></w:trPr><w:tc><w:tcPr><w:tcW w:w="635" w:type="dxa"/><w:tcBorders><w:top w:val="single" w:sz="8" w:space="0" w:color="000000"/><w:left w:val="single" w:sz="8" w:space="0" w:color="000000"/><w:bottom w:val="single" w:sz="8" w:space="0" w:color="000000"/><w:right w:val="single" w:sz="8" w:space="0" w:color="000000"/></w:tcBorders></w:tcPr><w:p><w:pPr><w:pBdr><w:top w:val="nil"/><w:left w:val="nil"/><w:bottom w:val="nil"/><w:right w:val="nil"/><w:between w:val="nil"/></w:pBdr><w:rPr><w:color w:val="000000"/><w:sz w:val="16"/><w:szCs w:val="16"/></w:rPr></w:pPr></w:p></w:tc><w:tc><w:tcPr><w:tcW w:w="1465" w:type="dxa"/><w:tcBorders><w:top w:val="single" w:sz="8" w:space="0" w:color="000000"/><w:left w:val="single" w:sz="8" w:space="0" w:color="000000"/><w:bottom w:val="single" w:sz="8" w:space="0" w:color="000000"/><w:right w:val="single" w:sz="8" w:space="0" w:color="000000"/></w:tcBorders></w:tcPr><w:p><w:pPr><w:pBdr><w:top w:val="nil"/><w:left w:val="nil"/><w:bottom w:val="nil"/><w:right w:val="nil"/><w:between w:val="nil"/></w:pBdr><w:rPr><w:color w:val="000000"/><w:sz w:val="16"/><w:szCs w:val="16"/></w:rPr></w:pPr></w:p></w:tc><w:tc><w:tcPr><w:tcW w:w="720" w:type="dxa"/><w:tcBorders><w:top w:val="single" w:sz="8" w:space="0" w:color="000000"/><w:left w:val="single" w:sz="8" w:space="0" w:color="000000"/><w:bottom w:val="single" w:sz="8" w:space="0" w:color="000000"/><w:right w:val="single" w:sz="8" w:space="0" w:color="000000"/></w:tcBorders></w:tcPr><w:p><w:pPr><w:pBdr><w:top w:val="nil"/><w:left w:val="nil"/><w:bottom w:val="nil"/><w:right w:val="nil"/><w:between w:val="nil"/></w:pBdr><w:rPr><w:color w:val="000000"/><w:sz w:val="16"/><w:szCs w:val="16"/></w:rPr></w:pPr></w:p></w:tc><w:tc><w:tcPr><w:tcW w:w="1642" w:type="dxa"/><w:gridSpan w:val="2"/><w:tcBorders><w:top w:val="single" w:sz="8" w:space="0" w:color="000000"/><w:left w:val="single" w:sz="8" w:space="0" w:color="000000"/><w:bottom w:val="single" w:sz="8" w:space="0" w:color="000000"/><w:right w:val="single" w:sz="8" w:space="0" w:color="000000"/></w:tcBorders></w:tcPr><w:p><w:pPr><w:pBdr><w:top w:val="nil"/><w:left w:val="nil"/><w:bottom w:val="nil"/><w:right w:val="nil"/><w:between w:val="nil"/></w:pBdr><w:rPr><w:color w:val="000000"/><w:sz w:val="16"/><w:szCs w:val="16"/></w:rPr></w:pPr></w:p></w:tc><w:tc><w:tcPr><w:tcW w:w="5903" w:type="dxa"/><w:gridSpan w:val="3"/><w:tcBorders><w:top w:val="single" w:sz="8" w:space="0" w:color="000000"/><w:left w:val="single" w:sz="8" w:space="0" w:color="000000"/><w:bottom w:val="single" w:sz="8" w:space="0" w:color="000000"/><w:right w:val="single" w:sz="8" w:space="0" w:color="000000"/></w:tcBorders></w:tcPr><w:p><w:pPr><w:pBdr><w:top w:val="nil"/><w:left w:val="nil"/><w:bottom w:val="nil"/><w:right w:val="nil"/><w:between w:val="nil"/></w:pBdr><w:rPr><w:color w:val="000000"/><w:sz w:val="16"/><w:szCs w:val="16"/></w:rPr></w:pPr></w:p></w:tc></w:tr><w:tr><w:trPr><w:trHeight w:val="230"/></w:trPr><w:tc><w:tcPr><w:tcW w:w="635" w:type="dxa"/><w:tcBorders><w:top w:val="single" w:sz="8" w:space="0" w:color="000000"/><w:left w:val="single" w:sz="8" w:space="0" w:color="000000"/><w:bottom w:val="single" w:sz="8" w:space="0" w:color="000000"/><w:right w:val="single" w:sz="8" w:space="0" w:color="000000"/></w:tcBorders></w:tcPr><w:p><w:pPr><w:pBdr><w:top w:val="nil"/><w:left w:val="nil"/><w:bottom w:val="nil"/><w:right w:val="nil"/><w:between w:val="nil"/></w:pBdr><w:rPr><w:color w:val="000000"/><w:sz w:val="16"/><w:szCs w:val="16"/></w:rPr></w:pPr></w:p></w:tc><w:tc><w:tcPr><w:tcW w:w="1465" w:type="dxa"/><w:tcBorders><w:top w:val="single" w:sz="8" w:space="0" w:color="000000"/><w:left w:val="single" w:sz="8" w:space="0" w:color="000000"/><w:bottom w:val="single" w:sz="8" w:space="0" w:color="000000"/><w:right w:val="single" w:sz="8" w:space="0" w:color="000000"/></w:tcBorders></w:tcPr><w:p><w:pPr><w:pBdr><w:top w:val="nil"/><w:left w:val="nil"/><w:bottom w:val="nil"/><w:right w:val="nil"/><w:between w:val="nil"/></w:pBdr><w:rPr><w:color w:val="000000"/><w:sz w:val="16"/><w:szCs w:val="16"/></w:rPr></w:pPr></w:p></w:tc><w:tc><w:tcPr><w:tcW w:w="720" w:type="dxa"/><w:tcBorders><w:top w:val="single" w:sz="8" w:space="0" w:color="000000"/><w:left w:val="single" w:sz="8" w:space="0" w:color="000000"/><w:bottom w:val="single" w:sz="8" w:space="0" w:color="000000"/><w:right w:val="single" w:sz="8" w:space="0" w:color="000000"/></w:tcBorders></w:tcPr><w:p><w:pPr><w:pBdr><w:top w:val="nil"/><w:left w:val="nil"/><w:bottom w:val="nil"/><w:right w:val="nil"/><w:between w:val="nil"/></w:pBdr><w:rPr><w:color w:val="000000"/><w:sz w:val="16"/><w:szCs w:val="16"/></w:rPr></w:pPr></w:p></w:tc><w:tc><w:tcPr><w:tcW w:w="1642" w:type="dxa"/><w:gridSpan w:val="2"/><w:tcBorders><w:top w:val="single" w:sz="8" w:space="0" w:color="000000"/><w:left w:val="single" w:sz="8" w:space="0" w:color="000000"/><w:bottom w:val="single" w:sz="8" w:space="0" w:color="000000"/><w:right w:val="single" w:sz="8" w:space="0" w:color="000000"/></w:tcBorders></w:tcPr><w:p><w:pPr><w:pBdr><w:top w:val="nil"/><w:left w:val="nil"/><w:bottom w:val="nil"/><w:right w:val="nil"/><w:between w:val="nil"/></w:pBdr><w:rPr><w:color w:val="000000"/><w:sz w:val="16"/><w:szCs w:val="16"/></w:rPr></w:pPr></w:p></w:tc><w:tc><w:tcPr><w:tcW w:w="5903" w:type="dxa"/><w:gridSpan w:val="3"/><w:tcBorders><w:top w:val="single" w:sz="8" w:space="0" w:color="000000"/><w:left w:val="single" w:sz="8" w:space="0" w:color="000000"/><w:bottom w:val="single" w:sz="8" w:space="0" w:color="000000"/><w:right w:val="single" w:sz="8" w:space="0" w:color="000000"/></w:tcBorders></w:tcPr><w:p><w:pPr><w:pBdr><w:top w:val="nil"/><w:left w:val="nil"/><w:bottom w:val="nil"/><w:right w:val="nil"/><w:between w:val="nil"/></w:pBdr><w:rPr><w:color w:val="000000"/><w:sz w:val="16"/><w:szCs w:val="16"/></w:rPr></w:pPr></w:p></w:tc></w:tr><w:tr><w:trPr><w:trHeight w:val="229"/></w:trPr><w:tc><w:tcPr><w:tcW w:w="635" w:type="dxa"/><w:tcBorders><w:top w:val="single" w:sz="8" w:space="0" w:color="000000"/><w:left w:val="single" w:sz="8" w:space="0" w:color="000000"/><w:bottom w:val="single" w:sz="8" w:space="0" w:color="000000"/><w:right w:val="single" w:sz="8" w:space="0" w:color="000000"/></w:tcBorders></w:tcPr><w:p><w:pPr><w:pBdr><w:top w:val="nil"/><w:left w:val="nil"/><w:bottom w:val="nil"/><w:right w:val="nil"/><w:between w:val="nil"/></w:pBdr><w:rPr><w:color w:val="000000"/><w:sz w:val="16"/><w:szCs w:val="16"/></w:rPr></w:pPr></w:p></w:tc><w:tc><w:tcPr><w:tcW w:w="1465" w:type="dxa"/><w:tcBorders><w:top w:val="single" w:sz="8" w:space="0" w:color="000000"/><w:left w:val="single" w:sz="8" w:space="0" w:color="000000"/><w:bottom w:val="single" w:sz="8" w:space="0" w:color="000000"/><w:right w:val="single" w:sz="8" w:space="0" w:color="000000"/></w:tcBorders></w:tcPr><w:p><w:pPr><w:pBdr><w:top w:val="nil"/><w:left w:val="nil"/><w:bottom w:val="nil"/><w:right w:val="nil"/><w:between w:val="nil"/></w:pBdr><w:rPr><w:color w:val="000000"/><w:sz w:val="16"/><w:szCs w:val="16"/></w:rPr></w:pPr></w:p></w:tc><w:tc><w:tcPr><w:tcW w:w="720" w:type="dxa"/><w:tcBorders><w:top w:val="single" w:sz="8" w:space="0" w:color="000000"/><w:left w:val="single" w:sz="8" w:space="0" w:color="000000"/><w:bottom w:val="single" w:sz="8" w:space="0" w:color="000000"/><w:right w:val="single" w:sz="8" w:space="0" w:color="000000"/></w:tcBorders></w:tcPr><w:p><w:pPr><w:pBdr><w:top w:val="nil"/><w:left w:val="nil"/><w:bottom w:val="nil"/><w:right w:val="nil"/><w:between w:val="nil"/></w:pBdr><w:rPr><w:color w:val="000000"/><w:sz w:val="16"/><w:szCs w:val="16"/></w:rPr></w:pPr></w:p></w:tc><w:tc><w:tcPr><w:tcW w:w="1642" w:type="dxa"/><w:gridSpan w:val="2"/><w:tcBorders><w:top w:val="single" w:sz="8" w:space="0" w:color="000000"/><w:left w:val="single" w:sz="8" w:space="0" w:color="000000"/><w:bottom w:val="single" w:sz="8" w:space="0" w:color="000000"/><w:right w:val="single" w:sz="8" w:space="0" w:color="000000"/></w:tcBorders></w:tcPr><w:p><w:pPr><w:pBdr><w:top w:val="nil"/><w:left w:val="nil"/><w:bottom w:val="nil"/><w:right w:val="nil"/><w:between w:val="nil"/></w:pBdr><w:rPr><w:color w:val="000000"/><w:sz w:val="16"/><w:szCs w:val="16"/></w:rPr></w:pPr></w:p></w:tc><w:tc><w:tcPr><w:tcW w:w="5903" w:type="dxa"/><w:gridSpan w:val="3"/><w:tcBorders><w:top w:val="single" w:sz="8" w:space="0" w:color="000000"/><w:left w:val="single" w:sz="8" w:space="0" w:color="000000"/><w:bottom w:val="single" w:sz="8" w:space="0" w:color="000000"/><w:right w:val="single" w:sz="8" w:space="0" w:color="000000"/></w:tcBorders></w:tcPr><w:p><w:pPr><w:pBdr><w:top w:val="nil"/><w:left w:val="nil"/><w:bottom w:val="nil"/><w:right w:val="nil"/><w:between w:val="nil"/></w:pBdr><w:rPr><w:color w:val="000000"/><w:sz w:val="16"/><w:szCs w:val="16"/></w:rPr></w:pPr></w:p></w:tc></w:tr><w:tr><w:trPr><w:trHeight w:val="230"/></w:trPr><w:tc><w:tcPr><w:tcW w:w="635" w:type="dxa"/><w:tcBorders><w:top w:val="single" w:sz="8" w:space="0" w:color="000000"/><w:left w:val="single" w:sz="8" w:space="0" w:color="000000"/><w:bottom w:val="single" w:sz="8" w:space="0" w:color="000000"/><w:right w:val="single" w:sz="8" w:space="0" w:color="000000"/></w:tcBorders></w:tcPr><w:p><w:pPr><w:pBdr><w:top w:val="nil"/><w:left w:val="nil"/><w:bottom w:val="nil"/><w:right w:val="nil"/><w:between w:val="nil"/></w:pBdr><w:rPr><w:color w:val="000000"/><w:sz w:val="16"/><w:szCs w:val="16"/></w:rPr></w:pPr></w:p></w:tc><w:tc><w:tcPr><w:tcW w:w="1465" w:type="dxa"/><w:tcBorders><w:top w:val="single" w:sz="8" w:space="0" w:color="000000"/><w:left w:val="single" w:sz="8" w:space="0" w:color="000000"/><w:bottom w:val="single" w:sz="8" w:space="0" w:color="000000"/><w:right w:val="single" w:sz="8" w:space="0" w:color="000000"/></w:tcBorders></w:tcPr><w:p><w:pPr><w:pBdr><w:top w:val="nil"/><w:left w:val="nil"/><w:bottom w:val="nil"/><w:right w:val="nil"/><w:between w:val="nil"/></w:pBdr><w:rPr><w:color w:val="000000"/><w:sz w:val="16"/><w:szCs w:val="16"/></w:rPr></w:pPr></w:p></w:tc><w:tc><w:tcPr><w:tcW w:w="720" w:type="dxa"/><w:tcBorders><w:top w:val="single" w:sz="8" w:space="0" w:color="000000"/><w:left w:val="single" w:sz="8" w:space="0" w:color="000000"/><w:bottom w:val="single" w:sz="8" w:space="0" w:color="000000"/><w:right w:val="single" w:sz="8" w:space="0" w:color="000000"/></w:tcBorders></w:tcPr><w:p><w:pPr><w:pBdr><w:top w:val="nil"/><w:left w:val="nil"/><w:bottom w:val="nil"/><w:right w:val="nil"/><w:between w:val="nil"/></w:pBdr><w:rPr><w:color w:val="000000"/><w:sz w:val="16"/><w:szCs w:val="16"/></w:rPr></w:pPr></w:p></w:tc><w:tc><w:tcPr><w:tcW w:w="1642" w:type="dxa"/><w:gridSpan w:val="2"/><w:tcBorders><w:top w:val="single" w:sz="8" w:space="0" w:color="000000"/><w:left w:val="single" w:sz="8" w:space="0" w:color="000000"/><w:bottom w:val="single" w:sz="8" w:space="0" w:color="000000"/><w:right w:val="single" w:sz="8" w:space="0" w:color="000000"/></w:tcBorders></w:tcPr><w:p><w:pPr><w:pBdr><w:top w:val="nil"/><w:left w:val="nil"/><w:bottom w:val="nil"/><w:right w:val="nil"/><w:between w:val="nil"/></w:pBdr><w:rPr><w:color w:val="000000"/><w:sz w:val="16"/><w:szCs w:val="16"/></w:rPr></w:pPr></w:p></w:tc><w:tc><w:tcPr><w:tcW w:w="5903" w:type="dxa"/><w:gridSpan w:val="3"/><w:tcBorders><w:top w:val="single" w:sz="8" w:space="0" w:color="000000"/><w:left w:val="single" w:sz="8" w:space="0" w:color="000000"/><w:bottom w:val="single" w:sz="8" w:space="0" w:color="000000"/><w:right w:val="single" w:sz="8" w:space="0" w:color="000000"/></w:tcBorders></w:tcPr><w:p><w:pPr><w:pBdr><w:top w:val="nil"/><w:left w:val="nil"/><w:bottom w:val="nil"/><w:right w:val="nil"/><w:between w:val="nil"/></w:pBdr><w:rPr><w:color w:val="000000"/><w:sz w:val="16"/><w:szCs w:val="16"/></w:rPr></w:pPr></w:p></w:tc></w:tr><w:tr><w:trPr><w:trHeight w:val="230"/></w:trPr><w:tc><w:tcPr><w:tcW w:w="635" w:type="dxa"/><w:tcBorders><w:top w:val="single" w:sz="8" w:space="0" w:color="000000"/><w:left w:val="single" w:sz="8" w:space="0" w:color="000000"/><w:bottom w:val="single" w:sz="8" w:space="0" w:color="000000"/><w:right w:val="single" w:sz="8" w:space="0" w:color="000000"/></w:tcBorders></w:tcPr><w:p><w:pPr><w:pBdr><w:top w:val="nil"/><w:left w:val="nil"/><w:bottom w:val="nil"/><w:right w:val="nil"/><w:between w:val="nil"/></w:pBdr><w:rPr><w:color w:val="000000"/><w:sz w:val="16"/><w:szCs w:val="16"/></w:rPr></w:pPr></w:p></w:tc><w:tc><w:tcPr><w:tcW w:w="1465" w:type="dxa"/><w:tcBorders><w:top w:val="single" w:sz="8" w:space="0" w:color="000000"/><w:left w:val="single" w:sz="8" w:space="0" w:color="000000"/><w:bottom w:val="single" w:sz="8" w:space="0" w:color="000000"/><w:right w:val="single" w:sz="8" w:space="0" w:color="000000"/></w:tcBorders></w:tcPr><w:p><w:pPr><w:pBdr><w:top w:val="nil"/><w:left w:val="nil"/><w:bottom w:val="nil"/><w:right w:val="nil"/><w:between w:val="nil"/></w:pBdr><w:rPr><w:color w:val="000000"/><w:sz w:val="16"/><w:szCs w:val="16"/></w:rPr></w:pPr></w:p></w:tc><w:tc><w:tcPr><w:tcW w:w="720" w:type="dxa"/><w:tcBorders><w:top w:val="single" w:sz="8" w:space="0" w:color="000000"/><w:left w:val="single" w:sz="8" w:space="0" w:color="000000"/><w:bottom w:val="single" w:sz="8" w:space="0" w:color="000000"/><w:right w:val="single" w:sz="8" w:space="0" w:color="000000"/></w:tcBorders></w:tcPr><w:p><w:pPr><w:pBdr><w:top w:val="nil"/><w:left w:val="nil"/><w:bottom w:val="nil"/><w:right w:val="nil"/><w:between w:val="nil"/></w:pBdr><w:rPr><w:color w:val="000000"/><w:sz w:val="16"/><w:szCs w:val="16"/></w:rPr></w:pPr></w:p></w:tc><w:tc><w:tcPr><w:tcW w:w="1642" w:type="dxa"/><w:gridSpan w:val="2"/><w:tcBorders><w:top w:val="single" w:sz="8" w:space="0" w:color="000000"/><w:left w:val="single" w:sz="8" w:space="0" w:color="000000"/><w:bottom w:val="single" w:sz="8" w:space="0" w:color="000000"/><w:right w:val="single" w:sz="8" w:space="0" w:color="000000"/></w:tcBorders></w:tcPr><w:p><w:pPr><w:pBdr><w:top w:val="nil"/><w:left w:val="nil"/><w:bottom w:val="nil"/><w:right w:val="nil"/><w:between w:val="nil"/></w:pBdr><w:rPr><w:color w:val="000000"/><w:sz w:val="16"/><w:szCs w:val="16"/></w:rPr></w:pPr></w:p></w:tc><w:tc><w:tcPr><w:tcW w:w="5903" w:type="dxa"/><w:gridSpan w:val="3"/><w:tcBorders><w:top w:val="single" w:sz="8" w:space="0" w:color="000000"/><w:left w:val="single" w:sz="8" w:space="0" w:color="000000"/><w:bottom w:val="single" w:sz="8" w:space="0" w:color="000000"/><w:right w:val="single" w:sz="8" w:space="0" w:color="000000"/></w:tcBorders></w:tcPr><w:p><w:pPr><w:pBdr><w:top w:val="nil"/><w:left w:val="nil"/><w:bottom w:val="nil"/><w:right w:val="nil"/><w:between w:val="nil"/></w:pBdr><w:rPr><w:color w:val="000000"/><w:sz w:val="16"/><w:szCs w:val="16"/></w:rPr></w:pPr></w:p></w:tc></w:tr><w:tr><w:trPr><w:trHeight w:val="230"/></w:trPr><w:tc><w:tcPr><w:tcW w:w="635" w:type="dxa"/><w:tcBorders><w:top w:val="single" w:sz="8" w:space="0" w:color="000000"/><w:left w:val="single" w:sz="8" w:space="0" w:color="000000"/><w:bottom w:val="single" w:sz="8" w:space="0" w:color="000000"/><w:right w:val="single" w:sz="8" w:space="0" w:color="000000"/></w:tcBorders></w:tcPr><w:p><w:pPr><w:pBdr><w:top w:val="nil"/><w:left w:val="nil"/><w:bottom w:val="nil"/><w:right w:val="nil"/><w:between w:val="nil"/></w:pBdr><w:rPr><w:color w:val="000000"/><w:sz w:val="16"/><w:szCs w:val="16"/></w:rPr></w:pPr></w:p></w:tc><w:tc><w:tcPr><w:tcW w:w="1465" w:type="dxa"/><w:tcBorders><w:top w:val="single" w:sz="8" w:space="0" w:color="000000"/><w:left w:val="single" w:sz="8" w:space="0" w:color="000000"/><w:bottom w:val="single" w:sz="8" w:space="0" w:color="000000"/><w:right w:val="single" w:sz="8" w:space="0" w:color="000000"/></w:tcBorders></w:tcPr><w:p><w:pPr><w:pBdr><w:top w:val="nil"/><w:left w:val="nil"/><w:bottom w:val="nil"/><w:right w:val="nil"/><w:between w:val="nil"/></w:pBdr><w:rPr><w:color w:val="000000"/><w:sz w:val="16"/><w:szCs w:val="16"/></w:rPr></w:pPr></w:p></w:tc><w:tc><w:tcPr><w:tcW w:w="720" w:type="dxa"/><w:tcBorders><w:top w:val="single" w:sz="8" w:space="0" w:color="000000"/><w:left w:val="single" w:sz="8" w:space="0" w:color="000000"/><w:bottom w:val="single" w:sz="8" w:space="0" w:color="000000"/><w:right w:val="single" w:sz="8" w:space="0" w:color="000000"/></w:tcBorders></w:tcPr><w:p><w:pPr><w:pBdr><w:top w:val="nil"/><w:left w:val="nil"/><w:bottom w:val="nil"/><w:right w:val="nil"/><w:between w:val="nil"/></w:pBdr><w:rPr><w:color w:val="000000"/><w:sz w:val="16"/><w:szCs w:val="16"/></w:rPr></w:pPr></w:p></w:tc><w:tc><w:tcPr><w:tcW w:w="1642" w:type="dxa"/><w:gridSpan w:val="2"/><w:tcBorders><w:top w:val="single" w:sz="8" w:space="0" w:color="000000"/><w:left w:val="single" w:sz="8" w:space="0" w:color="000000"/><w:bottom w:val="single" w:sz="8" w:space="0" w:color="000000"/><w:right w:val="single" w:sz="8" w:space="0" w:color="000000"/></w:tcBorders></w:tcPr><w:p><w:pPr><w:pBdr><w:top w:val="nil"/><w:left w:val="nil"/><w:bottom w:val="nil"/><w:right w:val="nil"/><w:between w:val="nil"/></w:pBdr><w:rPr><w:color w:val="000000"/><w:sz w:val="16"/><w:szCs w:val="16"/></w:rPr></w:pPr></w:p></w:tc><w:tc><w:tcPr><w:tcW w:w="5903" w:type="dxa"/><w:gridSpan w:val="3"/><w:tcBorders><w:top w:val="single" w:sz="8" w:space="0" w:color="000000"/><w:left w:val="single" w:sz="8" w:space="0" w:color="000000"/><w:bottom w:val="single" w:sz="8" w:space="0" w:color="000000"/><w:right w:val="single" w:sz="8" w:space="0" w:color="000000"/></w:tcBorders></w:tcPr><w:p><w:pPr><w:pBdr><w:top w:val="nil"/><w:left w:val="nil"/><w:bottom w:val="nil"/><w:right w:val="nil"/><w:between w:val="nil"/></w:pBdr><w:rPr><w:color w:val="000000"/><w:sz w:val="16"/><w:szCs w:val="16"/></w:rPr></w:pPr></w:p></w:tc></w:tr><w:tr><w:trPr><w:trHeight w:val="230"/></w:trPr><w:tc><w:tcPr><w:tcW w:w="635" w:type="dxa"/><w:tcBorders><w:top w:val="single" w:sz="8" w:space="0" w:color="000000"/><w:left w:val="single" w:sz="8" w:space="0" w:color="000000"/><w:bottom w:val="single" w:sz="8" w:space="0" w:color="000000"/><w:right w:val="single" w:sz="8" w:space="0" w:color="000000"/></w:tcBorders></w:tcPr><w:p><w:pPr><w:pBdr><w:top w:val="nil"/><w:left w:val="nil"/><w:bottom w:val="nil"/><w:right w:val="nil"/><w:between w:val="nil"/></w:pBdr><w:rPr><w:color w:val="000000"/><w:sz w:val="16"/><w:szCs w:val="16"/></w:rPr></w:pPr></w:p></w:tc><w:tc><w:tcPr><w:tcW w:w="1465" w:type="dxa"/><w:tcBorders><w:top w:val="single" w:sz="8" w:space="0" w:color="000000"/><w:left w:val="single" w:sz="8" w:space="0" w:color="000000"/><w:bottom w:val="single" w:sz="8" w:space="0" w:color="000000"/><w:right w:val="single" w:sz="8" w:space="0" w:color="000000"/></w:tcBorders></w:tcPr><w:p><w:pPr><w:pBdr><w:top w:val="nil"/><w:left w:val="nil"/><w:bottom w:val="nil"/><w:right w:val="nil"/><w:between w:val="nil"/></w:pBdr><w:rPr><w:color w:val="000000"/><w:sz w:val="16"/><w:szCs w:val="16"/></w:rPr></w:pPr></w:p></w:tc><w:tc><w:tcPr><w:tcW w:w="720" w:type="dxa"/><w:tcBorders><w:top w:val="single" w:sz="8" w:space="0" w:color="000000"/><w:left w:val="single" w:sz="8" w:space="0" w:color="000000"/><w:bottom w:val="single" w:sz="8" w:space="0" w:color="000000"/><w:right w:val="single" w:sz="8" w:space="0" w:color="000000"/></w:tcBorders></w:tcPr><w:p><w:pPr><w:pBdr><w:top w:val="nil"/><w:left w:val="nil"/><w:bottom w:val="nil"/><w:right w:val="nil"/><w:between w:val="nil"/></w:pBdr><w:rPr><w:color w:val="000000"/><w:sz w:val="16"/><w:szCs w:val="16"/></w:rPr></w:pPr></w:p></w:tc><w:tc><w:tcPr><w:tcW w:w="1642" w:type="dxa"/><w:gridSpan w:val="2"/><w:tcBorders><w:top w:val="single" w:sz="8" w:space="0" w:color="000000"/><w:left w:val="single" w:sz="8" w:space="0" w:color="000000"/><w:bottom w:val="single" w:sz="8" w:space="0" w:color="000000"/><w:right w:val="single" w:sz="8" w:space="0" w:color="000000"/></w:tcBorders></w:tcPr><w:p><w:pPr><w:pBdr><w:top w:val="nil"/><w:left w:val="nil"/><w:bottom w:val="nil"/><w:right w:val="nil"/><w:between w:val="nil"/></w:pBdr><w:rPr><w:color w:val="000000"/><w:sz w:val="16"/><w:szCs w:val="16"/></w:rPr></w:pPr></w:p></w:tc><w:tc><w:tcPr><w:tcW w:w="5903" w:type="dxa"/><w:gridSpan w:val="3"/><w:tcBorders><w:top w:val="single" w:sz="8" w:space="0" w:color="000000"/><w:left w:val="single" w:sz="8" w:space="0" w:color="000000"/><w:bottom w:val="single" w:sz="8" w:space="0" w:color="000000"/><w:right w:val="single" w:sz="8" w:space="0" w:color="000000"/></w:tcBorders></w:tcPr><w:p><w:pPr><w:pBdr><w:top w:val="nil"/><w:left w:val="nil"/><w:bottom w:val="nil"/><w:right w:val="nil"/><w:between w:val="nil"/></w:pBdr><w:rPr><w:color w:val="000000"/><w:sz w:val="16"/><w:szCs w:val="16"/></w:rPr></w:pPr></w:p></w:tc></w:tr><w:tr><w:trPr><w:trHeight w:val="230"/></w:trPr><w:tc><w:tcPr><w:tcW w:w="635" w:type="dxa"/><w:tcBorders><w:top w:val="single" w:sz="8" w:space="0" w:color="000000"/><w:left w:val="single" w:sz="8" w:space="0" w:color="000000"/><w:bottom w:val="single" w:sz="8" w:space="0" w:color="000000"/><w:right w:val="single" w:sz="8" w:space="0" w:color="000000"/></w:tcBorders></w:tcPr><w:p><w:pPr><w:pBdr><w:top w:val="nil"/><w:left w:val="nil"/><w:bottom w:val="nil"/><w:right w:val="nil"/><w:between w:val="nil"/></w:pBdr><w:rPr><w:color w:val="000000"/><w:sz w:val="16"/><w:szCs w:val="16"/></w:rPr></w:pPr></w:p></w:tc><w:tc><w:tcPr><w:tcW w:w="1465" w:type="dxa"/><w:tcBorders><w:top w:val="single" w:sz="8" w:space="0" w:color="000000"/><w:left w:val="single" w:sz="8" w:space="0" w:color="000000"/><w:bottom w:val="single" w:sz="8" w:space="0" w:color="000000"/><w:right w:val="single" w:sz="8" w:space="0" w:color="000000"/></w:tcBorders></w:tcPr><w:p><w:pPr><w:pBdr><w:top w:val="nil"/><w:left w:val="nil"/><w:bottom w:val="nil"/><w:right w:val="nil"/><w:between w:val="nil"/></w:pBdr><w:rPr><w:color w:val="000000"/><w:sz w:val="16"/><w:szCs w:val="16"/></w:rPr></w:pPr></w:p></w:tc><w:tc><w:tcPr><w:tcW w:w="720" w:type="dxa"/><w:tcBorders><w:top w:val="single" w:sz="8" w:space="0" w:color="000000"/><w:left w:val="single" w:sz="8" w:space="0" w:color="000000"/><w:bottom w:val="single" w:sz="8" w:space="0" w:color="000000"/><w:right w:val="single" w:sz="8" w:space="0" w:color="000000"/></w:tcBorders></w:tcPr><w:p><w:pPr><w:pBdr><w:top w:val="nil"/><w:left w:val="nil"/><w:bottom w:val="nil"/><w:right w:val="nil"/><w:between w:val="nil"/></w:pBdr><w:rPr><w:color w:val="000000"/><w:sz w:val="16"/><w:szCs w:val="16"/></w:rPr></w:pPr></w:p></w:tc><w:tc><w:tcPr><w:tcW w:w="1642" w:type="dxa"/><w:gridSpan w:val="2"/><w:tcBorders><w:top w:val="single" w:sz="8" w:space="0" w:color="000000"/><w:left w:val="single" w:sz="8" w:space="0" w:color="000000"/><w:bottom w:val="single" w:sz="8" w:space="0" w:color="000000"/><w:right w:val="single" w:sz="8" w:space="0" w:color="000000"/></w:tcBorders></w:tcPr><w:p><w:pPr><w:pBdr><w:top w:val="nil"/><w:left w:val="nil"/><w:bottom w:val="nil"/><w:right w:val="nil"/><w:between w:val="nil"/></w:pBdr><w:rPr><w:color w:val="000000"/><w:sz w:val="16"/><w:szCs w:val="16"/></w:rPr></w:pPr></w:p></w:tc><w:tc><w:tcPr><w:tcW w:w="5903" w:type="dxa"/><w:gridSpan w:val="3"/><w:tcBorders><w:top w:val="single" w:sz="8" w:space="0" w:color="000000"/><w:left w:val="single" w:sz="8" w:space="0" w:color="000000"/><w:bottom w:val="single" w:sz="8" w:space="0" w:color="000000"/><w:right w:val="single" w:sz="8" w:space="0" w:color="000000"/></w:tcBorders></w:tcPr><w:p><w:pPr><w:pBdr><w:top w:val="nil"/><w:left w:val="nil"/><w:bottom w:val="nil"/><w:right w:val="nil"/><w:between w:val="nil"/></w:pBdr><w:rPr><w:color w:val="000000"/><w:sz w:val="16"/><w:szCs w:val="16"/></w:rPr></w:pPr></w:p></w:tc></w:tr><w:tr><w:trPr><w:trHeight w:val="230"/></w:trPr><w:tc><w:tcPr><w:tcW w:w="635" w:type="dxa"/><w:tcBorders><w:top w:val="single" w:sz="8" w:space="0" w:color="000000"/><w:left w:val="single" w:sz="8" w:space="0" w:color="000000"/><w:bottom w:val="single" w:sz="8" w:space="0" w:color="000000"/><w:right w:val="single" w:sz="8" w:space="0" w:color="000000"/></w:tcBorders></w:tcPr><w:p><w:pPr><w:pBdr><w:top w:val="nil"/><w:left w:val="nil"/><w:bottom w:val="nil"/><w:right w:val="nil"/><w:between w:val="nil"/></w:pBdr><w:rPr><w:color w:val="000000"/><w:sz w:val="16"/><w:szCs w:val="16"/></w:rPr></w:pPr></w:p></w:tc><w:tc><w:tcPr><w:tcW w:w="1465" w:type="dxa"/><w:tcBorders><w:top w:val="single" w:sz="8" w:space="0" w:color="000000"/><w:left w:val="single" w:sz="8" w:space="0" w:color="000000"/><w:bottom w:val="single" w:sz="8" w:space="0" w:color="000000"/><w:right w:val="single" w:sz="8" w:space="0" w:color="000000"/></w:tcBorders></w:tcPr><w:p><w:pPr><w:pBdr><w:top w:val="nil"/><w:left w:val="nil"/><w:bottom w:val="nil"/><w:right w:val="nil"/><w:between w:val="nil"/></w:pBdr><w:rPr><w:color w:val="000000"/><w:sz w:val="16"/><w:szCs w:val="16"/></w:rPr></w:pPr></w:p></w:tc><w:tc><w:tcPr><w:tcW w:w="720" w:type="dxa"/><w:tcBorders><w:top w:val="single" w:sz="8" w:space="0" w:color="000000"/><w:left w:val="single" w:sz="8" w:space="0" w:color="000000"/><w:bottom w:val="single" w:sz="8" w:space="0" w:color="000000"/><w:right w:val="single" w:sz="8" w:space="0" w:color="000000"/></w:tcBorders></w:tcPr><w:p><w:pPr><w:pBdr><w:top w:val="nil"/><w:left w:val="nil"/><w:bottom w:val="nil"/><w:right w:val="nil"/><w:between w:val="nil"/></w:pBdr><w:rPr><w:color w:val="000000"/><w:sz w:val="16"/><w:szCs w:val="16"/></w:rPr></w:pPr></w:p></w:tc><w:tc><w:tcPr><w:tcW w:w="1642" w:type="dxa"/><w:gridSpan w:val="2"/><w:tcBorders><w:top w:val="single" w:sz="8" w:space="0" w:color="000000"/><w:left w:val="single" w:sz="8" w:space="0" w:color="000000"/><w:bottom w:val="single" w:sz="8" w:space="0" w:color="000000"/><w:right w:val="single" w:sz="8" w:space="0" w:color="000000"/></w:tcBorders></w:tcPr><w:p><w:pPr><w:pBdr><w:top w:val="nil"/><w:left w:val="nil"/><w:bottom w:val="nil"/><w:right w:val="nil"/><w:between w:val="nil"/></w:pBdr><w:rPr><w:color w:val="000000"/><w:sz w:val="16"/><w:szCs w:val="16"/></w:rPr></w:pPr></w:p></w:tc><w:tc><w:tcPr><w:tcW w:w="5903" w:type="dxa"/><w:gridSpan w:val="3"/><w:tcBorders><w:top w:val="single" w:sz="8" w:space="0" w:color="000000"/><w:left w:val="single" w:sz="8" w:space="0" w:color="000000"/><w:bottom w:val="single" w:sz="8" w:space="0" w:color="000000"/><w:right w:val="single" w:sz="8" w:space="0" w:color="000000"/></w:tcBorders></w:tcPr><w:p><w:pPr><w:pBdr><w:top w:val="nil"/><w:left w:val="nil"/><w:bottom w:val="nil"/><w:right w:val="nil"/><w:between w:val="nil"/></w:pBdr><w:rPr><w:color w:val="000000"/><w:sz w:val="16"/><w:szCs w:val="16"/></w:rPr></w:pPr></w:p></w:tc></w:tr><w:tr><w:trPr><w:trHeight w:val="230"/></w:trPr><w:tc><w:tcPr><w:tcW w:w="635" w:type="dxa"/><w:tcBorders><w:top w:val="single" w:sz="8" w:space="0" w:color="000000"/><w:left w:val="single" w:sz="8" w:space="0" w:color="000000"/><w:bottom w:val="single" w:sz="8" w:space="0" w:color="000000"/><w:right w:val="single" w:sz="8" w:space="0" w:color="000000"/></w:tcBorders></w:tcPr><w:p><w:pPr><w:pBdr><w:top w:val="nil"/><w:left w:val="nil"/><w:bottom w:val="nil"/><w:right w:val="nil"/><w:between w:val="nil"/></w:pBdr><w:rPr><w:color w:val="000000"/><w:sz w:val="16"/><w:szCs w:val="16"/></w:rPr></w:pPr></w:p></w:tc><w:tc><w:tcPr><w:tcW w:w="1465" w:type="dxa"/><w:tcBorders><w:top w:val="single" w:sz="8" w:space="0" w:color="000000"/><w:left w:val="single" w:sz="8" w:space="0" w:color="000000"/><w:bottom w:val="single" w:sz="8" w:space="0" w:color="000000"/><w:right w:val="single" w:sz="8" w:space="0" w:color="000000"/></w:tcBorders></w:tcPr><w:p><w:pPr><w:pBdr><w:top w:val="nil"/><w:left w:val="nil"/><w:bottom w:val="nil"/><w:right w:val="nil"/><w:between w:val="nil"/></w:pBdr><w:rPr><w:color w:val="000000"/><w:sz w:val="16"/><w:szCs w:val="16"/></w:rPr></w:pPr></w:p></w:tc><w:tc><w:tcPr><w:tcW w:w="720" w:type="dxa"/><w:tcBorders><w:top w:val="single" w:sz="8" w:space="0" w:color="000000"/><w:left w:val="single" w:sz="8" w:space="0" w:color="000000"/><w:bottom w:val="single" w:sz="8" w:space="0" w:color="000000"/><w:right w:val="single" w:sz="8" w:space="0" w:color="000000"/></w:tcBorders></w:tcPr><w:p><w:pPr><w:pBdr><w:top w:val="nil"/><w:left w:val="nil"/><w:bottom w:val="nil"/><w:right w:val="nil"/><w:between w:val="nil"/></w:pBdr><w:rPr><w:color w:val="000000"/><w:sz w:val="16"/><w:szCs w:val="16"/></w:rPr></w:pPr></w:p></w:tc><w:tc><w:tcPr><w:tcW w:w="1642" w:type="dxa"/><w:gridSpan w:val="2"/><w:tcBorders><w:top w:val="single" w:sz="8" w:space="0" w:color="000000"/><w:left w:val="single" w:sz="8" w:space="0" w:color="000000"/><w:bottom w:val="single" w:sz="8" w:space="0" w:color="000000"/><w:right w:val="single" w:sz="8" w:space="0" w:color="000000"/></w:tcBorders></w:tcPr><w:p><w:pPr><w:pBdr><w:top w:val="nil"/><w:left w:val="nil"/><w:bottom w:val="nil"/><w:right w:val="nil"/><w:between w:val="nil"/></w:pBdr><w:rPr><w:color w:val="000000"/><w:sz w:val="16"/><w:szCs w:val="16"/></w:rPr></w:pPr></w:p></w:tc><w:tc><w:tcPr><w:tcW w:w="5903" w:type="dxa"/><w:gridSpan w:val="3"/><w:tcBorders><w:top w:val="single" w:sz="8" w:space="0" w:color="000000"/><w:left w:val="single" w:sz="8" w:space="0" w:color="000000"/><w:bottom w:val="single" w:sz="8" w:space="0" w:color="000000"/><w:right w:val="single" w:sz="8" w:space="0" w:color="000000"/></w:tcBorders></w:tcPr><w:p><w:pPr><w:pBdr><w:top w:val="nil"/><w:left w:val="nil"/><w:bottom w:val="nil"/><w:right w:val="nil"/><w:between w:val="nil"/></w:pBdr><w:rPr><w:color w:val="000000"/><w:sz w:val="16"/><w:szCs w:val="16"/></w:rPr></w:pPr></w:p></w:tc></w:tr><w:tr><w:trPr><w:trHeight w:val="230"/></w:trPr><w:tc><w:tcPr><w:tcW w:w="635" w:type="dxa"/><w:tcBorders><w:top w:val="single" w:sz="8" w:space="0" w:color="000000"/><w:left w:val="single" w:sz="8" w:space="0" w:color="000000"/><w:bottom w:val="single" w:sz="8" w:space="0" w:color="000000"/><w:right w:val="single" w:sz="8" w:space="0" w:color="000000"/></w:tcBorders></w:tcPr><w:p><w:pPr><w:pBdr><w:top w:val="nil"/><w:left w:val="nil"/><w:bottom w:val="nil"/><w:right w:val="nil"/><w:between w:val="nil"/></w:pBdr><w:rPr><w:color w:val="000000"/><w:sz w:val="16"/><w:szCs w:val="16"/></w:rPr></w:pPr></w:p></w:tc><w:tc><w:tcPr><w:tcW w:w="1465" w:type="dxa"/><w:tcBorders><w:top w:val="single" w:sz="8" w:space="0" w:color="000000"/><w:left w:val="single" w:sz="8" w:space="0" w:color="000000"/><w:bottom w:val="single" w:sz="8" w:space="0" w:color="000000"/><w:right w:val="single" w:sz="8" w:space="0" w:color="000000"/></w:tcBorders></w:tcPr><w:p><w:pPr><w:pBdr><w:top w:val="nil"/><w:left w:val="nil"/><w:bottom w:val="nil"/><w:right w:val="nil"/><w:between w:val="nil"/></w:pBdr><w:rPr><w:color w:val="000000"/><w:sz w:val="16"/><w:szCs w:val="16"/></w:rPr></w:pPr></w:p></w:tc><w:tc><w:tcPr><w:tcW w:w="720" w:type="dxa"/><w:tcBorders><w:top w:val="single" w:sz="8" w:space="0" w:color="000000"/><w:left w:val="single" w:sz="8" w:space="0" w:color="000000"/><w:bottom w:val="single" w:sz="8" w:space="0" w:color="000000"/><w:right w:val="single" w:sz="8" w:space="0" w:color="000000"/></w:tcBorders></w:tcPr><w:p><w:pPr><w:pBdr><w:top w:val="nil"/><w:left w:val="nil"/><w:bottom w:val="nil"/><w:right w:val="nil"/><w:between w:val="nil"/></w:pBdr><w:rPr><w:color w:val="000000"/><w:sz w:val="16"/><w:szCs w:val="16"/></w:rPr></w:pPr></w:p></w:tc><w:tc><w:tcPr><w:tcW w:w="1642" w:type="dxa"/><w:gridSpan w:val="2"/><w:tcBorders><w:top w:val="single" w:sz="8" w:space="0" w:color="000000"/><w:left w:val="single" w:sz="8" w:space="0" w:color="000000"/><w:bottom w:val="single" w:sz="8" w:space="0" w:color="000000"/><w:right w:val="single" w:sz="8" w:space="0" w:color="000000"/></w:tcBorders></w:tcPr><w:p><w:pPr><w:pBdr><w:top w:val="nil"/><w:left w:val="nil"/><w:bottom w:val="nil"/><w:right w:val="nil"/><w:between w:val="nil"/></w:pBdr><w:rPr><w:color w:val="000000"/><w:sz w:val="16"/><w:szCs w:val="16"/></w:rPr></w:pPr></w:p></w:tc><w:tc><w:tcPr><w:tcW w:w="5903" w:type="dxa"/><w:gridSpan w:val="3"/><w:tcBorders><w:top w:val="single" w:sz="8" w:space="0" w:color="000000"/><w:left w:val="single" w:sz="8" w:space="0" w:color="000000"/><w:bottom w:val="single" w:sz="8" w:space="0" w:color="000000"/><w:right w:val="single" w:sz="8" w:space="0" w:color="000000"/></w:tcBorders></w:tcPr><w:p><w:pPr><w:pBdr><w:top w:val="nil"/><w:left w:val="nil"/><w:bottom w:val="nil"/><w:right w:val="nil"/><w:between w:val="nil"/></w:pBdr><w:rPr><w:color w:val="000000"/><w:sz w:val="16"/><w:szCs w:val="16"/></w:rPr></w:pPr></w:p></w:tc></w:tr><w:tr><w:trPr><w:trHeight w:val="230"/></w:trPr><w:tc><w:tcPr><w:tcW w:w="635" w:type="dxa"/><w:tcBorders><w:top w:val="single" w:sz="8" w:space="0" w:color="000000"/><w:left w:val="single" w:sz="8" w:space="0" w:color="000000"/><w:bottom w:val="single" w:sz="8" w:space="0" w:color="000000"/><w:right w:val="single" w:sz="8" w:space="0" w:color="000000"/></w:tcBorders></w:tcPr><w:p><w:pPr><w:pBdr><w:top w:val="nil"/><w:left w:val="nil"/><w:bottom w:val="nil"/><w:right w:val="nil"/><w:between w:val="nil"/></w:pBdr><w:rPr><w:color w:val="000000"/><w:sz w:val="16"/><w:szCs w:val="16"/></w:rPr></w:pPr></w:p></w:tc><w:tc><w:tcPr><w:tcW w:w="1465" w:type="dxa"/><w:tcBorders><w:top w:val="single" w:sz="8" w:space="0" w:color="000000"/><w:left w:val="single" w:sz="8" w:space="0" w:color="000000"/><w:bottom w:val="single" w:sz="8" w:space="0" w:color="000000"/><w:right w:val="single" w:sz="8" w:space="0" w:color="000000"/></w:tcBorders></w:tcPr><w:p><w:pPr><w:pBdr><w:top w:val="nil"/><w:left w:val="nil"/><w:bottom w:val="nil"/><w:right w:val="nil"/><w:between w:val="nil"/></w:pBdr><w:rPr><w:color w:val="000000"/><w:sz w:val="16"/><w:szCs w:val="16"/></w:rPr></w:pPr></w:p></w:tc><w:tc><w:tcPr><w:tcW w:w="720" w:type="dxa"/><w:tcBorders><w:top w:val="single" w:sz="8" w:space="0" w:color="000000"/><w:left w:val="single" w:sz="8" w:space="0" w:color="000000"/><w:bottom w:val="single" w:sz="8" w:space="0" w:color="000000"/><w:right w:val="single" w:sz="8" w:space="0" w:color="000000"/></w:tcBorders></w:tcPr><w:p><w:pPr><w:pBdr><w:top w:val="nil"/><w:left w:val="nil"/><w:bottom w:val="nil"/><w:right w:val="nil"/><w:between w:val="nil"/></w:pBdr><w:rPr><w:color w:val="000000"/><w:sz w:val="16"/><w:szCs w:val="16"/></w:rPr></w:pPr></w:p></w:tc><w:tc><w:tcPr><w:tcW w:w="1642" w:type="dxa"/><w:gridSpan w:val="2"/><w:tcBorders><w:top w:val="single" w:sz="8" w:space="0" w:color="000000"/><w:left w:val="single" w:sz="8" w:space="0" w:color="000000"/><w:bottom w:val="single" w:sz="8" w:space="0" w:color="000000"/><w:right w:val="single" w:sz="8" w:space="0" w:color="000000"/></w:tcBorders></w:tcPr><w:p><w:pPr><w:pBdr><w:top w:val="nil"/><w:left w:val="nil"/><w:bottom w:val="nil"/><w:right w:val="nil"/><w:between w:val="nil"/></w:pBdr><w:rPr><w:color w:val="000000"/><w:sz w:val="16"/><w:szCs w:val="16"/></w:rPr></w:pPr></w:p></w:tc><w:tc><w:tcPr><w:tcW w:w="5903" w:type="dxa"/><w:gridSpan w:val="3"/><w:tcBorders><w:top w:val="single" w:sz="8" w:space="0" w:color="000000"/><w:left w:val="single" w:sz="8" w:space="0" w:color="000000"/><w:bottom w:val="single" w:sz="8" w:space="0" w:color="000000"/><w:right w:val="single" w:sz="8" w:space="0" w:color="000000"/></w:tcBorders></w:tcPr><w:p><w:pPr><w:pBdr><w:top w:val="nil"/><w:left w:val="nil"/><w:bottom w:val="nil"/><w:right w:val="nil"/><w:between w:val="nil"/></w:pBdr><w:rPr><w:color w:val="000000"/><w:sz w:val="16"/><w:szCs w:val="16"/></w:rPr></w:pPr></w:p></w:tc></w:tr><w:tr><w:trPr><w:trHeight w:val="230"/></w:trPr><w:tc><w:tcPr><w:tcW w:w="635" w:type="dxa"/><w:tcBorders><w:top w:val="single" w:sz="8" w:space="0" w:color="000000"/><w:left w:val="single" w:sz="8" w:space="0" w:color="000000"/><w:bottom w:val="single" w:sz="8" w:space="0" w:color="000000"/><w:right w:val="single" w:sz="8" w:space="0" w:color="000000"/></w:tcBorders></w:tcPr><w:p><w:pPr><w:pBdr><w:top w:val="nil"/><w:left w:val="nil"/><w:bottom w:val="nil"/><w:right w:val="nil"/><w:between w:val="nil"/></w:pBdr><w:rPr><w:color w:val="000000"/><w:sz w:val="16"/><w:szCs w:val="16"/></w:rPr></w:pPr></w:p></w:tc><w:tc><w:tcPr><w:tcW w:w="1465" w:type="dxa"/><w:tcBorders><w:top w:val="single" w:sz="8" w:space="0" w:color="000000"/><w:left w:val="single" w:sz="8" w:space="0" w:color="000000"/><w:bottom w:val="single" w:sz="8" w:space="0" w:color="000000"/><w:right w:val="single" w:sz="8" w:space="0" w:color="000000"/></w:tcBorders></w:tcPr><w:p><w:pPr><w:pBdr><w:top w:val="nil"/><w:left w:val="nil"/><w:bottom w:val="nil"/><w:right w:val="nil"/><w:between w:val="nil"/></w:pBdr><w:rPr><w:color w:val="000000"/><w:sz w:val="16"/><w:szCs w:val="16"/></w:rPr></w:pPr></w:p></w:tc><w:tc><w:tcPr><w:tcW w:w="720" w:type="dxa"/><w:tcBorders><w:top w:val="single" w:sz="8" w:space="0" w:color="000000"/><w:left w:val="single" w:sz="8" w:space="0" w:color="000000"/><w:bottom w:val="single" w:sz="8" w:space="0" w:color="000000"/><w:right w:val="single" w:sz="8" w:space="0" w:color="000000"/></w:tcBorders></w:tcPr><w:p><w:pPr><w:pBdr><w:top w:val="nil"/><w:left w:val="nil"/><w:bottom w:val="nil"/><w:right w:val="nil"/><w:between w:val="nil"/></w:pBdr><w:rPr><w:color w:val="000000"/><w:sz w:val="16"/><w:szCs w:val="16"/></w:rPr></w:pPr></w:p></w:tc><w:tc><w:tcPr><w:tcW w:w="1642" w:type="dxa"/><w:gridSpan w:val="2"/><w:tcBorders><w:top w:val="single" w:sz="8" w:space="0" w:color="000000"/><w:left w:val="single" w:sz="8" w:space="0" w:color="000000"/><w:bottom w:val="single" w:sz="8" w:space="0" w:color="000000"/><w:right w:val="single" w:sz="8" w:space="0" w:color="000000"/></w:tcBorders></w:tcPr><w:p><w:pPr><w:pBdr><w:top w:val="nil"/><w:left w:val="nil"/><w:bottom w:val="nil"/><w:right w:val="nil"/><w:between w:val="nil"/></w:pBdr><w:rPr><w:color w:val="000000"/><w:sz w:val="16"/><w:szCs w:val="16"/></w:rPr></w:pPr></w:p></w:tc><w:tc><w:tcPr><w:tcW w:w="5903" w:type="dxa"/><w:gridSpan w:val="3"/><w:tcBorders><w:top w:val="single" w:sz="8" w:space="0" w:color="000000"/><w:left w:val="single" w:sz="8" w:space="0" w:color="000000"/><w:bottom w:val="single" w:sz="8" w:space="0" w:color="000000"/><w:right w:val="single" w:sz="8" w:space="0" w:color="000000"/></w:tcBorders></w:tcPr><w:p><w:pPr><w:pBdr><w:top w:val="nil"/><w:left w:val="nil"/><w:bottom w:val="nil"/><w:right w:val="nil"/><w:between w:val="nil"/></w:pBdr><w:rPr><w:color w:val="000000"/><w:sz w:val="16"/><w:szCs w:val="16"/></w:rPr></w:pPr></w:p></w:tc></w:tr><w:tr><w:trPr><w:trHeight w:val="230"/></w:trPr><w:tc><w:tcPr><w:tcW w:w="10365" w:type="dxa"/><w:gridSpan w:val="8"/><w:tcBorders><w:top w:val="single" w:sz="8" w:space="0" w:color="000000"/><w:left w:val="single" w:sz="8" w:space="0" w:color="000000"/><w:bottom w:val="single" w:sz="8" w:space="0" w:color="000000"/><w:right w:val="single" w:sz="8" w:space="0" w:color="000000"/></w:tcBorders></w:tcPr><w:p><w:pPr><w:pBdr><w:top w:val="nil"/><w:left w:val="nil"/><w:bottom w:val="nil"/><w:right w:val="nil"/><w:between w:val="nil"/></w:pBdr><w:ind w:left="107"/><w:jc w:val="both"/><w:rPr><w:b/><w:color w:val="000000"/><w:sz w:val="24"/><w:szCs w:val="24"/></w:rPr></w:pPr><w:r><w:rPr><w:b/><w:color w:val="000000"/><w:sz w:val="24"/><w:szCs w:val="24"/></w:rPr><w:t>B. CATATAN PENTING HARIAN</w:t></w:r></w:p></w:tc></w:tr><w:tr><w:trPr><w:trHeight w:val="1838"/></w:trPr><w:tc><w:tcPr><w:tcW w:w="10365" w:type="dxa"/><w:gridSpan w:val="8"/><w:tcBorders><w:top w:val="single" w:sz="8" w:space="0" w:color="000000"/><w:left w:val="single" w:sz="8" w:space="0" w:color="000000"/><w:bottom w:val="single" w:sz="8" w:space="0" w:color="000000"/><w:right w:val="single" w:sz="8" w:space="0" w:color="000000"/></w:tcBorders></w:tcPr><w:p><w:pPr><w:pBdr><w:top w:val="nil"/><w:left w:val="nil"/><w:bottom w:val="nil"/><w:right w:val="nil"/><w:between w:val="nil"/></w:pBdr><w:spacing w:line="226" w:lineRule="auto"/><w:ind w:left="107"/><w:rPr><w:b/><w:color w:val="000000"/><w:sz w:val="20"/><w:szCs w:val="20"/></w:rPr></w:pPr><w:r><w:rPr><w:b/><w:color w:val="000000"/><w:sz w:val="20"/><w:szCs w:val="20"/></w:rPr><w:t>1.</w:t></w:r></w:p><w:p><w:pPr><w:pBdr><w:top w:val="nil"/><w:left w:val="nil"/><w:bottom w:val="nil"/><w:right w:val="nil"/><w:between w:val="nil"/></w:pBdr><w:rPr><w:color w:val="000000"/><w:sz w:val="20"/><w:szCs w:val="20"/></w:rPr></w:pPr></w:p><w:p><w:pPr><w:pBdr><w:top w:val="nil"/><w:left w:val="nil"/><w:bottom w:val="nil"/><w:right w:val="nil"/><w:between w:val="nil"/></w:pBdr><w:spacing w:before="2"/><w:rPr><w:color w:val="000000"/><w:sz w:val="20"/><w:szCs w:val="20"/></w:rPr></w:pPr></w:p><w:p><w:pPr><w:pBdr><w:top w:val="nil"/><w:left w:val="nil"/><w:bottom w:val="nil"/><w:right w:val="nil"/><w:between w:val="nil"/></w:pBdr><w:ind w:left="107"/><w:rPr><w:b/><w:color w:val="000000"/><w:sz w:val="20"/><w:szCs w:val="20"/></w:rPr></w:pPr><w:r><w:rPr><w:b/><w:color w:val="000000"/><w:sz w:val="20"/><w:szCs w:val="20"/></w:rPr><w:t>2.</w:t></w:r></w:p><w:p><w:pPr><w:pBdr><w:top w:val="nil"/><w:left w:val="nil"/><w:bottom w:val="nil"/><w:right w:val="nil"/><w:between w:val="nil"/></w:pBdr><w:spacing w:before="228"/><w:rPr><w:color w:val="000000"/><w:sz w:val="20"/><w:szCs w:val="20"/></w:rPr></w:pPr></w:p><w:p><w:pPr><w:pBdr><w:top w:val="nil"/><w:left w:val="nil"/><w:bottom w:val="nil"/><w:right w:val="nil"/><w:between w:val="nil"/></w:pBdr><w:ind w:left="107"/><w:rPr><w:b/><w:color w:val="000000"/><w:sz w:val="20"/><w:szCs w:val="20"/></w:rPr></w:pPr><w:r><w:rPr><w:b/><w:color w:val="000000"/><w:sz w:val="20"/><w:szCs w:val="20"/></w:rPr><w:t>3.</w:t></w:r></w:p></w:tc></w:tr><w:tr><w:trPr><w:trHeight w:val="1579"/></w:trPr><w:tc><w:tcPr><w:tcW w:w="10365" w:type="dxa"/><w:gridSpan w:val="8"/><w:vMerge w:val="restart"/><w:tcBorders><w:top w:val="single" w:sz="8" w:space="0" w:color="000000"/><w:left w:val="single" w:sz="8" w:space="0" w:color="000000"/><w:bottom w:val="single" w:sz="8" w:space="0" w:color="000000"/><w:right w:val="single" w:sz="8" w:space="0" w:color="000000"/></w:tcBorders></w:tcPr><w:p><w:pPr><w:spacing w:line="275" w:lineRule="auto"/><w:ind w:left="107"/><w:rPr><w:b/><w:sz w:val="24"/><w:szCs w:val="24"/></w:rPr></w:pPr><w:r><w:rPr><w:b/><w:sz w:val="24"/><w:szCs w:val="24"/></w:rPr><w:t>D. PENGESAHAN</w:t></w:r></w:p></w:tc></w:tr><w:tr><w:trPr><w:trHeight w:val="276"/></w:trPr><w:tc><w:tcPr><w:tcW w:w="10365" w:type="dxa"/><w:gridSpan w:val="8"/><w:vMerge/><w:tcBorders><w:top w:val="single" w:sz="8" w:space="0" w:color="000000"/><w:left w:val="single" w:sz="8" w:space="0" w:color="000000"/><w:bottom w:val="single" w:sz="8" w:space="0" w:color="000000"/><w:right w:val="single" w:sz="8" w:space="0" w:color="000000"/></w:tcBorders></w:tcPr><w:p><w:pPr><w:pBdr><w:top w:val="nil"/><w:left w:val="nil"/><w:bottom w:val="nil"/><w:right w:val="nil"/><w:between w:val="nil"/></w:pBdr><w:rPr><w:b/><w:color w:val="000000"/><w:sz w:val="24"/><w:szCs w:val="24"/></w:rPr></w:pPr></w:p></w:tc></w:tr><w:tr><w:trPr><w:trHeight w:val="1634"/></w:trPr><w:tc><w:tcPr><w:tcW w:w="5250" w:type="dxa"/><w:gridSpan w:val="6"/><w:tcBorders><w:top w:val="single" w:sz="8" w:space="0" w:color="000000"/><w:left w:val="single" w:sz="8" w:space="0" w:color="000000"/><w:bottom w:val="single" w:sz="8" w:space="0" w:color="000000"/><w:right w:val="single" w:sz="8" w:space="0" w:color="000000"/></w:tcBorders></w:tcPr><w:p><w:pPr><w:pBdr><w:top w:val="nil"/><w:left w:val="nil"/><w:bottom w:val="nil"/><w:right w:val="nil"/><w:between w:val="nil"/></w:pBdr><w:spacing w:line="251" w:lineRule="auto"/><w:ind w:left="263"/><w:rPr><w:b/><w:color w:val="000000"/></w:rPr></w:pPr><w:r><w:rPr><w:b/><w:color w:val="000000"/></w:rPr><w:t>TANDA TANGAN LURAH/KEPALA DESA</w:t></w:r></w:p></w:tc><w:tc><w:tcPr><w:tcW w:w="5115" w:type="dxa"/><w:gridSpan w:val="2"/><w:tcBorders><w:top w:val="single" w:sz="8" w:space="0" w:color="000000"/><w:left w:val="single" w:sz="8" w:space="0" w:color="000000"/><w:bottom w:val="single" w:sz="8" w:space="0" w:color="000000"/><w:right w:val="single" w:sz="8" w:space="0" w:color="000000"/></w:tcBorders></w:tcPr><w:p><w:pPr><w:pBdr><w:top w:val="nil"/><w:left w:val="nil"/><w:bottom w:val="nil"/><w:right w:val="nil"/><w:between w:val="nil"/></w:pBdr><w:spacing w:line="275" w:lineRule="auto"/><w:ind w:left="1001"/><w:rPr><w:b/><w:color w:val="000000"/><w:sz w:val="24"/><w:szCs w:val="24"/></w:rPr></w:pPr><w:r><w:rPr><w:b/><w:color w:val="000000"/><w:sz w:val="24"/><w:szCs w:val="24"/></w:rPr><w:t>TANDA TANGAN MAHASISWA</w:t></w:r></w:p></w:tc></w:tr></w:tbl><w:p><w:pPr><w:spacing w:before="240" w:after="240"/><w:jc w:val="both"/><w:rPr><w:b/><w:sz w:val="24"/><w:szCs w:val="24"/></w:rPr></w:pPr><w:r><w:rPr><w:b/><w:sz w:val="24"/><w:szCs w:val="24"/></w:rPr><w:t>Petunjuk Pengisian:</w:t></w:r></w:p><w:p><w:pPr><w:numPr><w:ilvl w:val="0"/><w:numId w:val="1"/></w:numPr><w:pBdr><w:top w:val="nil"/><w:left w:val="nil"/><w:bottom w:val="nil"/><w:right w:val="nil"/><w:between w:val="nil"/></w:pBdr><w:jc w:val="both"/><w:rPr><w:sz w:val="24"/><w:szCs w:val="24"/></w:rPr></w:pPr><w:r><w:rPr><w:sz w:val="24"/><w:szCs w:val="24"/></w:rPr><w:t xml:space="preserve">Logbook adalah buku catatan harian bagi peserta KKN yang wajib diisi setiap hari dan dilaporkan kepada Dosen Pembimbing Lapangan (DPL) setiap minggu Ling google form. </w:t></w:r></w:p><w:p><w:pPr><w:numPr><w:ilvl w:val="0"/><w:numId w:val="1"/></w:numPr><w:pBdr><w:top w:val="nil"/><w:left w:val="nil"/><w:bottom w:val="nil"/><w:right w:val="nil"/><w:between w:val="nil"/></w:pBdr><w:jc w:val="both"/><w:rPr><w:sz w:val="24"/><w:szCs w:val="24"/></w:rPr></w:pPr><w:r><w:rPr><w:sz w:val="24"/><w:szCs w:val="24"/></w:rPr><w:t>Logbook hanya boleh diisi dengan aktivitas yang berkaitan dengan program KKN.</w:t></w:r></w:p><w:p><w:pPr><w:numPr><w:ilvl w:val="0"/><w:numId w:val="1"/></w:numPr><w:pBdr><w:top w:val="nil"/><w:left w:val="nil"/><w:bottom w:val="nil"/><w:right w:val="nil"/><w:between w:val="nil"/></w:pBdr><w:jc w:val="both"/><w:rPr><w:sz w:val="24"/><w:szCs w:val="24"/></w:rPr></w:pPr><w:r><w:rPr><w:sz w:val="24"/><w:szCs w:val="24"/></w:rPr><w:t>Setiap logbook harus ditempelkan pas foto berwarna terbaru dengan ukuran 4x6 cm.</w:t></w:r></w:p><w:p><w:pPr><w:numPr><w:ilvl w:val="0"/><w:numId w:val="1"/></w:numPr><w:pBdr><w:top w:val="nil"/><w:left w:val="nil"/><w:bottom w:val="nil"/><w:right w:val="nil"/><w:between w:val="nil"/></w:pBdr><w:jc w:val="both"/><w:rPr><w:sz w:val="24"/><w:szCs w:val="24"/></w:rPr></w:pPr><w:r><w:rPr><w:sz w:val="24"/><w:szCs w:val="24"/></w:rPr><w:t>Isi logbook mencakup kegiatan harian, catatan penting, serta dokumentasi seperti foto, tautan video, dan lain-lain.</w:t></w:r></w:p><w:p><w:pPr><w:numPr><w:ilvl w:val="0"/><w:numId w:val="1"/></w:numPr><w:pBdr><w:top w:val="nil"/><w:left w:val="nil"/><w:bottom w:val="nil"/><w:right w:val="nil"/><w:between w:val="nil"/></w:pBdr><w:jc w:val="both"/><w:rPr><w:sz w:val="24"/><w:szCs w:val="24"/></w:rPr></w:pPr><w:r><w:rPr><w:sz w:val="24"/><w:szCs w:val="24"/></w:rPr><w:t>Penulisan logbook harus menggunakan bahasa Indonesia yang baik dan benar sesuai kaidah baku.</w:t></w:r></w:p><w:p><w:pPr><w:numPr><w:ilvl w:val="0"/><w:numId w:val="1"/></w:numPr><w:pBdr><w:top w:val="nil"/><w:left w:val="nil"/><w:bottom w:val="nil"/><w:right w:val="nil"/><w:between w:val="nil"/></w:pBdr><w:jc w:val="both"/><w:rPr><w:sz w:val="24"/><w:szCs w:val="24"/></w:rPr></w:pPr><w:r><w:rPr><w:sz w:val="24"/><w:szCs w:val="24"/></w:rPr><w:t>Pada bagian kolom pengesahan, mahasiswa wajib menandatangani serta menuliskan nama lengkapnya, kemudian nama lurah, kepala desa, atau pihak berwenang lainnya.</w:t></w:r></w:p><w:p><w:pPr><w:numPr><w:ilvl w:val="0"/><w:numId w:val="1"/></w:numPr><w:pBdr><w:top w:val="nil"/><w:left w:val="nil"/><w:bottom w:val="nil"/><w:right w:val="nil"/><w:between w:val="nil"/></w:pBdr><w:jc w:val="both"/><w:rPr><w:sz w:val="24"/><w:szCs w:val="24"/></w:rPr></w:pPr><w:r><w:rPr><w:sz w:val="24"/><w:szCs w:val="24"/></w:rPr><w:t>Selanjutnya, lurah, kepala desa, atau pihak berwenang terkait diminta untuk memberikan tanda tangan pada logbook mingguan tersebut.</w:t></w:r></w:p><w:p><w:pPr><w:numPr><w:ilvl w:val="0"/><w:numId w:val="1"/></w:numPr><w:pBdr><w:top w:val="nil"/><w:left w:val="nil"/><w:bottom w:val="nil"/><w:right w:val="nil"/><w:between w:val="nil"/></w:pBdr><w:jc w:val="both"/><w:rPr><w:sz w:val="24"/><w:szCs w:val="24"/></w:rPr></w:pPr><w:r><w:rPr><w:sz w:val="24"/><w:szCs w:val="24"/></w:rPr><w:t>Mahasiswa kemudian mengirimkan logbook mingguan secara daring kepada DPL masing-masing.</w:t></w:r></w:p><w:p><w:pPr><w:numPr><w:ilvl w:val="0"/><w:numId w:val="1"/></w:numPr><w:pBdr><w:top w:val="nil"/><w:left w:val="nil"/><w:bottom w:val="nil"/><w:right w:val="nil"/><w:between w:val="nil"/></w:pBdr><w:jc w:val="both"/><w:rPr><w:sz w:val="24"/><w:szCs w:val="24"/></w:rPr></w:pPr><w:r><w:rPr><w:sz w:val="24"/><w:szCs w:val="24"/></w:rPr><w:t>DPL akan memeriksa dan memberikan tanggapan terhadap logbook setiap minggu.</w:t></w:r><w:r><w:rPr><w:sz w:val="24"/><w:szCs w:val="24"/></w:rPr><w:br/></w:r></w:p><w:p><w:pPr><w:pBdr><w:top w:val="nil"/><w:left w:val="nil"/><w:bottom w:val="nil"/><w:right w:val="nil"/><w:between w:val="nil"/></w:pBdr><w:ind w:left="1080"/><w:jc w:val="both"/><w:rPr><w:sz w:val="24"/><w:szCs w:val="24"/></w:rPr></w:pPr></w:p><w:sectPr><w:pgSz w:w="12240" w:h="15840"/><w:pgMar w:top="1440" w:right="1440" w:bottom="1440" w:left="1440" w:header="708" w:footer="708" w:gutter="0"/><w:pgNumType w:start="1"/><w:cols w:space="720"/></w:sectPr></w:body></w:document>
+<file path=word/document.xml><?xml version="1.0" encoding="utf-8"?>
+<w:document xmlns:wpc="http://schemas.microsoft.com/office/word/2010/wordprocessingCanvas" xmlns:cx="http://schemas.microsoft.com/office/drawing/2014/chartex" xmlns:cx1="http://schemas.microsoft.com/office/drawing/2015/9/8/chartex" xmlns:cx2="http://schemas.microsoft.com/office/drawing/2015/10/21/chartex" xmlns:cx3="http://schemas.microsoft.com/office/drawing/2016/5/9/chartex" xmlns:cx4="http://schemas.microsoft.com/office/drawing/2016/5/10/chartex" xmlns:cx5="http://schemas.microsoft.com/office/drawing/2016/5/11/chartex" xmlns:cx6="http://schemas.microsoft.com/office/drawing/2016/5/12/chartex" xmlns:cx7="http://schemas.microsoft.com/office/drawing/2016/5/13/chartex" xmlns:cx8="http://schemas.microsoft.com/office/drawing/2016/5/14/chartex" xmlns:mc="http://schemas.openxmlformats.org/markup-compatibility/2006" xmlns:aink="http://schemas.microsoft.com/office/drawing/2016/ink" xmlns:am3d="http://schemas.microsoft.com/office/drawing/2017/model3d" xmlns:o="urn:schemas-microsoft-com:office:office" xmlns:oel="http://schemas.microsoft.com/office/2019/extlst" xmlns:r="http://schemas.openxmlformats.org/officeDocument/2006/relationships" xmlns:m="http://schemas.openxmlformats.org/officeDocument/2006/math" xmlns:v="urn:schemas-microsoft-com:vml" xmlns:wp14="http://schemas.microsoft.com/office/word/2010/wordprocessingDrawing" xmlns:wp="http://schemas.openxmlformats.org/drawingml/2006/wordprocessingDrawing" xmlns:w10="urn:schemas-microsoft-com:office:word" xmlns:w="http://schemas.openxmlformats.org/wordprocessingml/2006/main" xmlns:w14="http://schemas.microsoft.com/office/word/2010/wordml" xmlns:w15="http://schemas.microsoft.com/office/word/2012/wordml" xmlns:w16cex="http://schemas.microsoft.com/office/word/2018/wordml/cex" xmlns:w16cid="http://schemas.microsoft.com/office/word/2016/wordml/cid" xmlns:w16="http://schemas.microsoft.com/office/word/2018/wordml" xmlns:w16du="http://schemas.microsoft.com/office/word/2023/wordml/word16du" xmlns:w16sdtdh="http://schemas.microsoft.com/office/word/2020/wordml/sdtdatahash" xmlns:w16sdtfl="http://schemas.microsoft.com/office/word/2024/wordml/sdtformatlock" xmlns:w16se="http://schemas.microsoft.com/office/word/2015/wordml/symex" xmlns:wpg="http://schemas.microsoft.com/office/word/2010/wordprocessingGroup" xmlns:wpi="http://schemas.microsoft.com/office/word/2010/wordprocessingInk" xmlns:wne="http://schemas.microsoft.com/office/word/2006/wordml" xmlns:wps="http://schemas.microsoft.com/office/word/2010/wordprocessingShape" mc:Ignorable="w14 w15 w16se w16cid w16 w16cex w16sdtdh w16sdtfl w16du wp14">
+  <w:body>
+    <w:p>
+      <w:pPr>
+        <w:spacing w:before="58"/>
+        <w:ind w:left="356" w:right="360"/>
+        <w:jc w:val="center"/>
+        <w:rPr>
+          <w:b/>
+          <w:i/>
+          <w:sz w:val="32"/>
+          <w:szCs w:val="32"/>
+        </w:rPr>
+      </w:pPr>
+      <w:r>
+        <w:rPr>
+          <w:b/>
+          <w:sz w:val="32"/>
+          <w:szCs w:val="32"/>
+        </w:rPr>
+        <w:t xml:space="preserve">BUKU CATATAN HARIAN </w:t>
+      </w:r>
+      <w:r>
+        <w:rPr>
+          <w:b/>
+          <w:i/>
+          <w:sz w:val="32"/>
+          <w:szCs w:val="32"/>
+        </w:rPr>
+        <w:t>(LOGBOOK)</w:t>
+      </w:r>
+    </w:p>
+    <w:p>
+      <w:pPr>
+        <w:pBdr>
+          <w:top w:val="nil"/>
+          <w:left w:val="nil"/>
+          <w:bottom w:val="nil"/>
+          <w:right w:val="nil"/>
+          <w:between w:val="nil"/>
+        </w:pBdr>
+        <w:spacing w:before="31"/>
+        <w:rPr>
+          <w:b/>
+          <w:i/>
+          <w:color w:val="000000"/>
+          <w:sz w:val="32"/>
+          <w:szCs w:val="32"/>
+        </w:rPr>
+      </w:pPr>
+    </w:p>
+    <w:p>
+      <w:pPr>
+        <w:pStyle w:val="Title"/>
+        <w:spacing w:after="0"/>
+        <w:jc w:val="center"/>
+        <w:rPr>
+          <w:rFonts w:ascii="Times New Roman" w:eastAsia="Times New Roman" w:hAnsi="Times New Roman" w:cs="Times New Roman"/>
+          <w:b/>
+          <w:sz w:val="32"/>
+          <w:szCs w:val="32"/>
+        </w:rPr>
+      </w:pPr>
+      <w:r>
+        <w:rPr>
+          <w:rFonts w:ascii="Times New Roman" w:eastAsia="Times New Roman" w:hAnsi="Times New Roman" w:cs="Times New Roman"/>
+          <w:b/>
+          <w:sz w:val="32"/>
+          <w:szCs w:val="32"/>
+        </w:rPr>
+        <w:t xml:space="preserve">KULIAH KERJA NYATA (KKN) </w:t>
+      </w:r>
+    </w:p>
+    <w:p>
+      <w:pPr>
+        <w:pStyle w:val="Title"/>
+        <w:jc w:val="center"/>
+        <w:rPr>
+          <w:rFonts w:ascii="Times New Roman" w:eastAsia="Times New Roman" w:hAnsi="Times New Roman" w:cs="Times New Roman"/>
+          <w:b/>
+          <w:sz w:val="32"/>
+          <w:szCs w:val="32"/>
+        </w:rPr>
+      </w:pPr>
+      <w:r>
+        <w:rPr>
+          <w:rFonts w:ascii="Times New Roman" w:eastAsia="Times New Roman" w:hAnsi="Times New Roman" w:cs="Times New Roman"/>
+          <w:b/>
+          <w:sz w:val="32"/>
+          <w:szCs w:val="32"/>
+        </w:rPr>
+        <w:t>UNIVERSITAS MARITIM RAJA ALI HAJI</w:t>
+      </w:r>
+    </w:p>
+    <w:p>
+      <w:pPr>
+        <w:pBdr>
+          <w:top w:val="nil"/>
+          <w:left w:val="nil"/>
+          <w:bottom w:val="nil"/>
+          <w:right w:val="nil"/>
+          <w:between w:val="nil"/>
+        </w:pBdr>
+        <w:rPr>
+          <w:b/>
+          <w:color w:val="000000"/>
+          <w:sz w:val="20"/>
+          <w:szCs w:val="20"/>
+        </w:rPr>
+      </w:pPr>
+    </w:p>
+    <w:p>
+      <w:pPr>
+        <w:pBdr>
+          <w:top w:val="nil"/>
+          <w:left w:val="nil"/>
+          <w:bottom w:val="nil"/>
+          <w:right w:val="nil"/>
+          <w:between w:val="nil"/>
+        </w:pBdr>
+        <w:rPr>
+          <w:b/>
+          <w:color w:val="000000"/>
+          <w:sz w:val="20"/>
+          <w:szCs w:val="20"/>
+        </w:rPr>
+      </w:pPr>
+    </w:p>
+    <w:p>
+      <w:pPr>
+        <w:pBdr>
+          <w:top w:val="nil"/>
+          <w:left w:val="nil"/>
+          <w:bottom w:val="nil"/>
+          <w:right w:val="nil"/>
+          <w:between w:val="nil"/>
+        </w:pBdr>
+        <w:spacing w:before="190"/>
+        <w:rPr>
+          <w:b/>
+          <w:color w:val="000000"/>
+          <w:sz w:val="20"/>
+          <w:szCs w:val="20"/>
+        </w:rPr>
+      </w:pPr>
+      <w:r>
+        <w:rPr>
+          <w:noProof/>
+        </w:rPr>
+        <mc:AlternateContent>
+          <mc:Choice Requires="wps">
+            <w:drawing>
+              <wp:anchor distT="0" distB="0" distL="0" distR="0" simplePos="0" relativeHeight="251658240" behindDoc="0" locked="0" layoutInCell="1" hidden="0" allowOverlap="1" wp14:anchorId="2B734385" wp14:editId="7FF21EA1">
+                <wp:simplePos x="0" y="0"/>
+                <wp:positionH relativeFrom="column">
+                  <wp:posOffset>2336800</wp:posOffset>
+                </wp:positionH>
+                <wp:positionV relativeFrom="paragraph">
+                  <wp:posOffset>279400</wp:posOffset>
+                </wp:positionV>
+                <wp:extent cx="1270000" cy="1546225"/>
+                <wp:effectExtent l="0" t="0" r="0" b="0"/>
+                <wp:wrapTopAndBottom distT="0" distB="0"/>
+                <wp:docPr id="1900290529" name="Rectangle 1900290529"/>
+                <wp:cNvGraphicFramePr/>
+                <a:graphic xmlns:a="http://schemas.openxmlformats.org/drawingml/2006/main">
+                  <a:graphicData uri="http://schemas.microsoft.com/office/word/2010/wordprocessingShape">
+                    <wps:wsp>
+                      <wps:cNvSpPr/>
+                      <wps:spPr>
+                        <a:xfrm>
+                          <a:off x="4717350" y="3013238"/>
+                          <a:ext cx="1257300" cy="1533525"/>
+                        </a:xfrm>
+                        <a:prstGeom prst="rect">
+                          <a:avLst/>
+                        </a:prstGeom>
+                        <a:noFill/>
+                        <a:ln w="12700" cap="flat" cmpd="sng">
+                          <a:solidFill>
+                            <a:srgbClr val="000000"/>
+                          </a:solidFill>
+                          <a:prstDash val="solid"/>
+                          <a:round/>
+                          <a:headEnd type="none" w="sm" len="sm"/>
+                          <a:tailEnd type="none" w="sm" len="sm"/>
+                        </a:ln>
+                      </wps:spPr>
+                      <wps:txbx>
+                        <w:txbxContent>
+                          <w:p>
+                            <w:pPr>
+                              <w:textDirection w:val="btLr"/>
+                            </w:pPr>
+                          </w:p>
+                          <w:p>
+                            <w:pPr>
+                              <w:textDirection w:val="btLr"/>
+                            </w:pPr>
+                          </w:p>
+                          <w:p>
+                            <w:pPr>
+                              <w:textDirection w:val="btLr"/>
+                            </w:pPr>
+                          </w:p>
+                          <w:p>
+                            <w:pPr>
+                              <w:spacing w:before="165"/>
+                              <w:textDirection w:val="btLr"/>
+                            </w:pPr>
+                          </w:p>
+                          <w:p>
+                            <w:pPr>
+                              <w:ind w:left="622" w:firstLine="622"/>
+                              <w:jc w:val="center"/>
+                              <w:textDirection w:val="btLr"/>
+                            </w:pPr>
+                            <w:r>
+                              <w:rPr>
+                                <w:color w:val="000000"/>
+                                <w:sz w:val="20"/>
+                              </w:rPr>
+                              <w:t>Foto 4x6</w:t>
+                            </w:r>
+                          </w:p>
+                        </w:txbxContent>
+                      </wps:txbx>
+                      <wps:bodyPr spcFirstLastPara="1" wrap="square" lIns="0" tIns="0" rIns="0" bIns="0" anchor="t" anchorCtr="0">
+                        <a:noAutofit/>
+                      </wps:bodyPr>
+                    </wps:wsp>
+                  </a:graphicData>
+                </a:graphic>
+              </wp:anchor>
+            </w:drawing>
+          </mc:Choice>
+          <mc:Fallback>
+            <w:pict>
+              <v:rect w14:anchorId="2B734385" id="Rectangle 1900290529" o:spid="_x0000_s1026" style="position:absolute;margin-left:184pt;margin-top:22pt;width:100pt;height:121.75pt;z-index:251658240;visibility:visible;mso-wrap-style:square;mso-wrap-distance-left:0;mso-wrap-distance-top:0;mso-wrap-distance-right:0;mso-wrap-distance-bottom:0;mso-position-horizontal:absolute;mso-position-horizontal-relative:text;mso-position-vertical:absolute;mso-position-vertical-relative:text;v-text-anchor:top" o:gfxdata="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" filled="f" strokeweight="1pt">
+                <v:stroke startarrowwidth="narrow" startarrowlength="short" endarrowwidth="narrow" endarrowlength="short" joinstyle="round"/>
+                <v:textbox inset="0,0,0,0">
+                  <w:txbxContent>
+                    <w:p>
+                      <w:pPr>
+                        <w:textDirection w:val="btLr"/>
+                      </w:pPr>
+                    </w:p>
+                    <w:p>
+                      <w:pPr>
+                        <w:textDirection w:val="btLr"/>
+                      </w:pPr>
+                    </w:p>
+                    <w:p>
+                      <w:pPr>
+                        <w:textDirection w:val="btLr"/>
+                      </w:pPr>
+                    </w:p>
+                    <w:p>
+                      <w:pPr>
+                        <w:spacing w:before="165"/>
+                        <w:textDirection w:val="btLr"/>
+                      </w:pPr>
+                    </w:p>
+                    <w:p>
+                      <w:pPr>
+                        <w:ind w:left="622" w:firstLine="622"/>
+                        <w:jc w:val="center"/>
+                        <w:textDirection w:val="btLr"/>
+                      </w:pPr>
+                      <w:r>
+                        <w:rPr>
+                          <w:color w:val="000000"/>
+                          <w:sz w:val="20"/>
+                        </w:rPr>
+                        <w:t>Foto 4x6</w:t>
+                      </w:r>
+                    </w:p>
+                  </w:txbxContent>
+                </v:textbox>
+                <w10:wrap type="topAndBottom"/>
+              </v:rect>
+            </w:pict>
+          </mc:Fallback>
+        </mc:AlternateContent>
+      </w:r>
+    </w:p>
+    <w:p>
+      <w:pPr>
+        <w:pBdr>
+          <w:top w:val="nil"/>
+          <w:left w:val="nil"/>
+          <w:bottom w:val="nil"/>
+          <w:right w:val="nil"/>
+          <w:between w:val="nil"/>
+        </w:pBdr>
+        <w:rPr>
+          <w:b/>
+          <w:color w:val="000000"/>
+          <w:sz w:val="20"/>
+          <w:szCs w:val="20"/>
+        </w:rPr>
+      </w:pPr>
+    </w:p>
+    <w:p>
+      <w:pPr>
+        <w:pBdr>
+          <w:top w:val="nil"/>
+          <w:left w:val="nil"/>
+          <w:bottom w:val="nil"/>
+          <w:right w:val="nil"/>
+          <w:between w:val="nil"/>
+        </w:pBdr>
+        <w:spacing w:before="63"/>
+        <w:rPr>
+          <w:b/>
+          <w:color w:val="000000"/>
+          <w:sz w:val="20"/>
+          <w:szCs w:val="20"/>
+        </w:rPr>
+      </w:pPr>
+    </w:p>
+    <w:tbl>
+      <w:tblPr>
+        <w:tblStyle w:val="a"/>
+        <w:tblW w:w="9354" w:type="dxa"/>
+        <w:tblInd w:w="-5" w:type="dxa"/>
+        <w:tblBorders>
+          <w:top w:val="single" w:sz="4" w:space="0" w:color="000000"/>
+          <w:left w:val="single" w:sz="4" w:space="0" w:color="000000"/>
+          <w:bottom w:val="single" w:sz="4" w:space="0" w:color="000000"/>
+          <w:right w:val="single" w:sz="4" w:space="0" w:color="000000"/>
+          <w:insideH w:val="single" w:sz="4" w:space="0" w:color="000000"/>
+          <w:insideV w:val="single" w:sz="4" w:space="0" w:color="000000"/>
+        </w:tblBorders>
+        <w:tblLayout w:type="fixed"/>
+        <w:tblLook w:val="0000" w:firstRow="0" w:lastRow="0" w:firstColumn="0" w:lastColumn="0" w:noHBand="0" w:noVBand="0"/>
+      </w:tblPr>
+      <w:tblGrid>
+        <w:gridCol w:w="4677"/>
+        <w:gridCol w:w="4677"/>
+      </w:tblGrid>
+      <w:tr>
+        <w:trPr>
+          <w:trHeight w:val="365"/>
+        </w:trPr>
+        <w:tc>
+          <w:tcPr>
+            <w:tcW w:w="4677" w:type="dxa"/>
+          </w:tcPr>
+          <w:p>
+            <w:pPr>
+              <w:pBdr>
+                <w:top w:val="nil"/>
+                <w:left w:val="nil"/>
+                <w:bottom w:val="nil"/>
+                <w:right w:val="nil"/>
+                <w:between w:val="nil"/>
+              </w:pBdr>
+              <w:spacing w:line="226" w:lineRule="auto"/>
+              <w:ind w:left="107"/>
+              <w:rPr>
+                <w:color w:val="000000"/>
+                <w:sz w:val="20"/>
+                <w:szCs w:val="20"/>
+              </w:rPr>
+            </w:pPr>
+            <w:r>
+              <w:rPr>
+                <w:color w:val="000000"/>
+                <w:sz w:val="20"/>
+                <w:szCs w:val="20"/>
+              </w:rPr>
+              <w:t>NAMA</w:t>
+            </w:r>
+          </w:p>
+        </w:tc>
+        <w:tc>
+          <w:tcPr>
+            <w:tcW w:w="4677" w:type="dxa"/>
+          </w:tcPr>
+          <w:p>
+            <w:r>
+              <w:rPr>
+                <w:rFonts w:ascii="Times New Roman" w:hAnsi="Times New Roman"/>
+                <w:sz w:val="22"/>
+                <w:b/>
+              </w:rPr>
+              <w:t>{full_name}</w:t>
+            </w:r>
+          </w:p>
+        </w:tc>
+      </w:tr>
+      <w:tr>
+        <w:trPr>
+          <w:trHeight w:val="366"/>
+        </w:trPr>
+        <w:tc>
+          <w:tcPr>
+            <w:tcW w:w="4677" w:type="dxa"/>
+          </w:tcPr>
+          <w:p>
+            <w:pPr>
+              <w:pBdr>
+                <w:top w:val="nil"/>
+                <w:left w:val="nil"/>
+                <w:bottom w:val="nil"/>
+                <w:right w:val="nil"/>
+                <w:between w:val="nil"/>
+              </w:pBdr>
+              <w:spacing w:line="227" w:lineRule="auto"/>
+              <w:ind w:left="107"/>
+              <w:rPr>
+                <w:color w:val="000000"/>
+                <w:sz w:val="20"/>
+                <w:szCs w:val="20"/>
+              </w:rPr>
+            </w:pPr>
+            <w:r>
+              <w:rPr>
+                <w:color w:val="000000"/>
+                <w:sz w:val="20"/>
+                <w:szCs w:val="20"/>
+              </w:rPr>
+              <w:t>NIM</w:t>
+            </w:r>
+          </w:p>
+        </w:tc>
+        <w:tc>
+          <w:tcPr>
+            <w:tcW w:w="4677" w:type="dxa"/>
+          </w:tcPr>
+          <w:p>
+            <w:r>
+              <w:rPr>
+                <w:rFonts w:ascii="Times New Roman" w:hAnsi="Times New Roman"/>
+                <w:sz w:val="22"/>
+                <w:b/>
+              </w:rPr>
+              <w:t>{student_id}</w:t>
+            </w:r>
+          </w:p>
+        </w:tc>
+      </w:tr>
+      <w:tr>
+        <w:trPr>
+          <w:trHeight w:val="370"/>
+        </w:trPr>
+        <w:tc>
+          <w:tcPr>
+            <w:tcW w:w="4677" w:type="dxa"/>
+          </w:tcPr>
+          <w:p>
+            <w:pPr>
+              <w:pBdr>
+                <w:top w:val="nil"/>
+                <w:left w:val="nil"/>
+                <w:bottom w:val="nil"/>
+                <w:right w:val="nil"/>
+                <w:between w:val="nil"/>
+              </w:pBdr>
+              <w:spacing w:line="226" w:lineRule="auto"/>
+              <w:ind w:left="107"/>
+              <w:rPr>
+                <w:color w:val="000000"/>
+                <w:sz w:val="20"/>
+                <w:szCs w:val="20"/>
+              </w:rPr>
+            </w:pPr>
+            <w:r>
+              <w:rPr>
+                <w:color w:val="000000"/>
+                <w:sz w:val="20"/>
+                <w:szCs w:val="20"/>
+              </w:rPr>
+              <w:t>FAKULTAS/PRODI</w:t>
+            </w:r>
+          </w:p>
+        </w:tc>
+        <w:tc>
+          <w:tcPr>
+            <w:tcW w:w="4677" w:type="dxa"/>
+          </w:tcPr>
+          <w:p>
+            <w:r>
+              <w:rPr>
+                <w:rFonts w:ascii="Times New Roman" w:hAnsi="Times New Roman"/>
+                <w:sz w:val="22"/>
+                <w:b/>
+              </w:rPr>
+              <w:t>{faculty_prodi}</w:t>
+            </w:r>
+          </w:p>
+        </w:tc>
+      </w:tr>
+      <w:tr>
+        <w:trPr>
+          <w:trHeight w:val="366"/>
+        </w:trPr>
+        <w:tc>
+          <w:tcPr>
+            <w:tcW w:w="4677" w:type="dxa"/>
+          </w:tcPr>
+          <w:p>
+            <w:pPr>
+              <w:pBdr>
+                <w:top w:val="nil"/>
+                <w:left w:val="nil"/>
+                <w:bottom w:val="nil"/>
+                <w:right w:val="nil"/>
+                <w:between w:val="nil"/>
+              </w:pBdr>
+              <w:spacing w:line="222" w:lineRule="auto"/>
+              <w:ind w:left="107"/>
+              <w:rPr>
+                <w:color w:val="000000"/>
+                <w:sz w:val="20"/>
+                <w:szCs w:val="20"/>
+              </w:rPr>
+            </w:pPr>
+            <w:r>
+              <w:rPr>
+                <w:color w:val="000000"/>
+                <w:sz w:val="20"/>
+                <w:szCs w:val="20"/>
+              </w:rPr>
+              <w:t>NAMA LOKASI KKN</w:t>
+            </w:r>
+          </w:p>
+        </w:tc>
+        <w:tc>
+          <w:tcPr>
+            <w:tcW w:w="4677" w:type="dxa"/>
+          </w:tcPr>
+          <w:p>
+            <w:r>
+              <w:rPr>
+                <w:rFonts w:ascii="Times New Roman" w:hAnsi="Times New Roman"/>
+                <w:sz w:val="22"/>
+                <w:b/>
+              </w:rPr>
+              <w:t>{group_location}</w:t>
+            </w:r>
+          </w:p>
+        </w:tc>
+      </w:tr>
+      <w:tr>
+        <w:trPr>
+          <w:trHeight w:val="362"/>
+        </w:trPr>
+        <w:tc>
+          <w:tcPr>
+            <w:tcW w:w="4677" w:type="dxa"/>
+          </w:tcPr>
+          <w:p>
+            <w:pPr>
+              <w:pBdr>
+                <w:top w:val="nil"/>
+                <w:left w:val="nil"/>
+                <w:bottom w:val="nil"/>
+                <w:right w:val="nil"/>
+                <w:between w:val="nil"/>
+              </w:pBdr>
+              <w:spacing w:line="222" w:lineRule="auto"/>
+              <w:ind w:left="107"/>
+              <w:rPr>
+                <w:color w:val="000000"/>
+                <w:sz w:val="20"/>
+                <w:szCs w:val="20"/>
+              </w:rPr>
+            </w:pPr>
+            <w:r>
+              <w:rPr>
+                <w:color w:val="000000"/>
+                <w:sz w:val="20"/>
+                <w:szCs w:val="20"/>
+              </w:rPr>
+              <w:t>NAMA DOSEN PENDAMPING LAPANGAN</w:t>
+            </w:r>
+          </w:p>
+        </w:tc>
+        <w:tc>
+          <w:tcPr>
+            <w:tcW w:w="4677" w:type="dxa"/>
+          </w:tcPr>
+          <w:p>
+            <w:r>
+              <w:rPr>
+                <w:rFonts w:ascii="Times New Roman" w:hAnsi="Times New Roman"/>
+                <w:sz w:val="22"/>
+                <w:b/>
+              </w:rPr>
+              <w:t>{dosen_name}</w:t>
+            </w:r>
+          </w:p>
+        </w:tc>
+      </w:tr>
+    </w:tbl>
+    <w:p>
+      <w:pPr>
+        <w:pBdr>
+          <w:top w:val="nil"/>
+          <w:left w:val="nil"/>
+          <w:bottom w:val="nil"/>
+          <w:right w:val="nil"/>
+          <w:between w:val="nil"/>
+        </w:pBdr>
+        <w:rPr>
+          <w:b/>
+          <w:color w:val="000000"/>
+          <w:sz w:val="20"/>
+          <w:szCs w:val="20"/>
+        </w:rPr>
+      </w:pPr>
+      <w:r>
+        <w:rPr>
+          <w:noProof/>
+        </w:rPr>
+        <w:drawing>
+          <wp:anchor distT="0" distB="0" distL="114300" distR="114300" simplePos="0" relativeHeight="251659264" behindDoc="0" locked="0" layoutInCell="1" hidden="0" allowOverlap="1" wp14:anchorId="068DF41D" wp14:editId="0EDAA620">
+            <wp:simplePos x="0" y="0"/>
+            <wp:positionH relativeFrom="column">
+              <wp:posOffset>1955482</wp:posOffset>
+            </wp:positionH>
+            <wp:positionV relativeFrom="paragraph">
+              <wp:posOffset>215900</wp:posOffset>
+            </wp:positionV>
+            <wp:extent cx="2032635" cy="2035175"/>
+            <wp:effectExtent l="0" t="0" r="0" b="0"/>
+            <wp:wrapTopAndBottom distT="0" distB="0"/>
+            <wp:docPr id="1900290531" name="image2.png"/>
+            <wp:cNvGraphicFramePr/>
+            <a:graphic xmlns:a="http://schemas.openxmlformats.org/drawingml/2006/main">
+              <a:graphicData uri="http://schemas.openxmlformats.org/drawingml/2006/picture">
+                <pic:pic xmlns:pic="http://schemas.openxmlformats.org/drawingml/2006/picture">
+                  <pic:nvPicPr>
+                    <pic:cNvPr id="0" name="image2.png"/>
+                    <pic:cNvPicPr preferRelativeResize="0"/>
+                  </pic:nvPicPr>
+                  <pic:blipFill>
+                    <a:blip r:embed="rId6"/>
+                    <a:srcRect/>
+                    <a:stretch>
+                      <a:fillRect/>
+                    </a:stretch>
+                  </pic:blipFill>
+                  <pic:spPr>
+                    <a:xfrm>
+                      <a:off x="0" y="0"/>
+                      <a:ext cx="2032635" cy="2035175"/>
+                    </a:xfrm>
+                    <a:prstGeom prst="rect">
+                      <a:avLst/>
+                    </a:prstGeom>
+                    <a:ln/>
+                  </pic:spPr>
+                </pic:pic>
+              </a:graphicData>
+            </a:graphic>
+          </wp:anchor>
+        </w:drawing>
+      </w:r>
+    </w:p>
+    <w:p>
+      <w:pPr>
+        <w:spacing w:before="2"/>
+        <w:ind w:left="2880" w:right="3233"/>
+        <w:jc w:val="center"/>
+        <w:rPr>
+          <w:sz w:val="26"/>
+          <w:szCs w:val="26"/>
+        </w:rPr>
+      </w:pPr>
+    </w:p>
+    <w:p>
+      <w:pPr>
+        <w:jc w:val="center"/>
+        <w:rPr>
+          <w:sz w:val="26"/>
+          <w:szCs w:val="26"/>
+        </w:rPr>
+      </w:pPr>
+    </w:p>
+    <w:p>
+      <w:pPr>
+        <w:pBdr>
+          <w:top w:val="nil"/>
+          <w:left w:val="nil"/>
+          <w:bottom w:val="nil"/>
+          <w:right w:val="nil"/>
+          <w:between w:val="nil"/>
+        </w:pBdr>
+        <w:jc w:val="center"/>
+        <w:rPr>
+          <w:sz w:val="26"/>
+          <w:szCs w:val="26"/>
+        </w:rPr>
+      </w:pPr>
+      <w:r>
+        <w:rPr>
+          <w:sz w:val="26"/>
+          <w:szCs w:val="26"/>
+        </w:rPr>
+        <w:t>LEMBAGA PENELITIAN DAN PENGABDIAN KEPADA MASYARAKAT</w:t>
+      </w:r>
+    </w:p>
+    <w:p>
+      <w:pPr>
+        <w:jc w:val="center"/>
+        <w:rPr>
+          <w:sz w:val="26"/>
+          <w:szCs w:val="26"/>
+        </w:rPr>
+      </w:pPr>
+      <w:r>
+        <w:rPr>
+          <w:sz w:val="26"/>
+          <w:szCs w:val="26"/>
+        </w:rPr>
+        <w:t>UNIVERSITAS MARITIM RAJA ALI HAJI</w:t>
+      </w:r>
+    </w:p>
+    <w:p>
+      <w:pPr>
+        <w:jc w:val="center"/>
+        <w:rPr>
+          <w:sz w:val="26"/>
+          <w:szCs w:val="26"/>
+        </w:rPr>
+      </w:pPr>
+      <w:r>
+        <w:rPr>
+          <w:sz w:val="26"/>
+          <w:szCs w:val="26"/>
+        </w:rPr>
+        <w:t>2025</w:t>
+      </w:r>
+    </w:p>
+    <w:tbl>
+      <w:tblPr>
+        <w:tblStyle w:val="a0"/>
+        <w:tblW w:w="10365" w:type="dxa"/>
+        <w:tblInd w:w="-508" w:type="dxa"/>
+        <w:tblBorders>
+          <w:top w:val="single" w:sz="4" w:space="0" w:color="000000"/>
+          <w:left w:val="single" w:sz="4" w:space="0" w:color="000000"/>
+          <w:bottom w:val="single" w:sz="4" w:space="0" w:color="000000"/>
+          <w:right w:val="single" w:sz="4" w:space="0" w:color="000000"/>
+          <w:insideH w:val="single" w:sz="4" w:space="0" w:color="000000"/>
+          <w:insideV w:val="single" w:sz="4" w:space="0" w:color="000000"/>
+        </w:tblBorders>
+        <w:tblLayout w:type="fixed"/>
+        <w:tblLook w:val="0000" w:firstRow="0" w:lastRow="0" w:firstColumn="0" w:lastColumn="0" w:noHBand="0" w:noVBand="0"/>
+      </w:tblPr>
+      <w:tblGrid>
+        <w:gridCol w:w="635"/>
+        <w:gridCol w:w="1465"/>
+        <w:gridCol w:w="720"/>
+        <w:gridCol w:w="1110"/>
+        <w:gridCol w:w="532"/>
+        <w:gridCol w:w="788"/>
+        <w:gridCol w:w="2565"/>
+        <w:gridCol w:w="2550"/>
+      </w:tblGrid>
+      <w:tr>
+        <w:trPr>
+          <w:trHeight w:val="1955"/>
+        </w:trPr>
+        <w:tc>
+          <w:tcPr>
+            <w:tcW w:w="3930" w:type="dxa"/>
+            <w:gridSpan w:val="4"/>
+            <w:tcBorders>
+              <w:top w:val="single" w:sz="12" w:space="0" w:color="000000"/>
+              <w:left w:val="single" w:sz="12" w:space="0" w:color="000000"/>
+              <w:bottom w:val="single" w:sz="12" w:space="0" w:color="000000"/>
+              <w:right w:val="single" w:sz="12" w:space="0" w:color="000000"/>
+            </w:tcBorders>
+          </w:tcPr>
+          <w:p>
+            <w:pPr>
+              <w:pBdr>
+                <w:top w:val="nil"/>
+                <w:left w:val="nil"/>
+                <w:bottom w:val="nil"/>
+                <w:right w:val="nil"/>
+                <w:between w:val="nil"/>
+              </w:pBdr>
+              <w:ind w:left="561"/>
+              <w:rPr>
+                <w:color w:val="000000"/>
+                <w:sz w:val="20"/>
+                <w:szCs w:val="20"/>
+              </w:rPr>
+            </w:pPr>
+            <w:r>
+              <w:rPr>
+                <w:noProof/>
+              </w:rPr>
+              <w:lastRenderedPageBreak/>
+              <w:drawing>
+                <wp:anchor distT="0" distB="0" distL="114300" distR="114300" simplePos="0" relativeHeight="251660288" behindDoc="0" locked="0" layoutInCell="1" hidden="0" allowOverlap="1" wp14:anchorId="7523C5D4" wp14:editId="78695CA9">
+                  <wp:simplePos x="0" y="0"/>
+                  <wp:positionH relativeFrom="column">
+                    <wp:posOffset>316865</wp:posOffset>
+                  </wp:positionH>
+                  <wp:positionV relativeFrom="paragraph">
+                    <wp:posOffset>43180</wp:posOffset>
+                  </wp:positionV>
+                  <wp:extent cx="1156335" cy="1157605"/>
+                  <wp:effectExtent l="0" t="0" r="0" b="0"/>
+                  <wp:wrapTopAndBottom distT="0" distB="0"/>
+                  <wp:docPr id="1900290530" name="image1.png"/>
+                  <wp:cNvGraphicFramePr/>
+                  <a:graphic xmlns:a="http://schemas.openxmlformats.org/drawingml/2006/main">
+                    <a:graphicData uri="http://schemas.openxmlformats.org/drawingml/2006/picture">
+                      <pic:pic xmlns:pic="http://schemas.openxmlformats.org/drawingml/2006/picture">
+                        <pic:nvPicPr>
+                          <pic:cNvPr id="0" name="image1.png"/>
+                          <pic:cNvPicPr preferRelativeResize="0"/>
+                        </pic:nvPicPr>
+                        <pic:blipFill>
+                          <a:blip r:embed="rId7"/>
+                          <a:srcRect/>
+                          <a:stretch>
+                            <a:fillRect/>
+                          </a:stretch>
+                        </pic:blipFill>
+                        <pic:spPr>
+                          <a:xfrm>
+                            <a:off x="0" y="0"/>
+                            <a:ext cx="1156335" cy="1157605"/>
+                          </a:xfrm>
+                          <a:prstGeom prst="rect">
+                            <a:avLst/>
+                          </a:prstGeom>
+                          <a:ln/>
+                        </pic:spPr>
+                      </pic:pic>
+                    </a:graphicData>
+                  </a:graphic>
+                </wp:anchor>
+              </w:drawing>
+            </w:r>
+          </w:p>
+        </w:tc>
+        <w:tc>
+          <w:tcPr>
+            <w:tcW w:w="3885" w:type="dxa"/>
+            <w:gridSpan w:val="3"/>
+            <w:tcBorders>
+              <w:top w:val="single" w:sz="12" w:space="0" w:color="000000"/>
+              <w:left w:val="single" w:sz="12" w:space="0" w:color="000000"/>
+              <w:bottom w:val="single" w:sz="12" w:space="0" w:color="000000"/>
+              <w:right w:val="single" w:sz="12" w:space="0" w:color="000000"/>
+            </w:tcBorders>
+          </w:tcPr>
+          <w:p>
+            <w:pPr>
+              <w:pBdr>
+                <w:top w:val="nil"/>
+                <w:left w:val="nil"/>
+                <w:bottom w:val="nil"/>
+                <w:right w:val="nil"/>
+                <w:between w:val="nil"/>
+              </w:pBdr>
+              <w:spacing w:before="3"/>
+              <w:ind w:left="106"/>
+              <w:rPr>
+                <w:b/>
+                <w:i/>
+                <w:color w:val="000000"/>
+                <w:sz w:val="24"/>
+                <w:szCs w:val="24"/>
+              </w:rPr>
+            </w:pPr>
+            <w:r>
+              <w:rPr>
+                <w:b/>
+                <w:i/>
+                <w:color w:val="000000"/>
+                <w:sz w:val="24"/>
+                <w:szCs w:val="24"/>
+              </w:rPr>
+              <w:t>LOGBOOK</w:t>
+            </w:r>
+          </w:p>
+          <w:p>
+            <w:pPr>
+              <w:pBdr>
+                <w:top w:val="nil"/>
+                <w:left w:val="nil"/>
+                <w:bottom w:val="nil"/>
+                <w:right w:val="nil"/>
+                <w:between w:val="nil"/>
+              </w:pBdr>
+              <w:spacing w:before="135" w:line="360" w:lineRule="auto"/>
+              <w:ind w:left="106" w:right="267"/>
+              <w:rPr>
+                <w:b/>
+                <w:color w:val="000000"/>
+                <w:sz w:val="24"/>
+                <w:szCs w:val="24"/>
+              </w:rPr>
+            </w:pPr>
+            <w:r>
+              <w:rPr>
+                <w:b/>
+                <w:color w:val="000000"/>
+                <w:sz w:val="24"/>
+                <w:szCs w:val="24"/>
+              </w:rPr>
+              <w:t>KULIAH KERJA NYATA UNIVERSITAS MARITIM RAJA ALI HAJI</w:t>
+            </w:r>
+          </w:p>
+        </w:tc>
+        <w:tc>
+          <w:tcPr>
+            <w:tcW w:w="2550" w:type="dxa"/>
+            <w:tcBorders>
+              <w:top w:val="single" w:sz="12" w:space="0" w:color="000000"/>
+              <w:left w:val="single" w:sz="12" w:space="0" w:color="000000"/>
+              <w:bottom w:val="single" w:sz="12" w:space="0" w:color="000000"/>
+              <w:right w:val="single" w:sz="12" w:space="0" w:color="000000"/>
+            </w:tcBorders>
+          </w:tcPr>
+          <w:p>
+            <w:pPr>
+              <w:pBdr>
+                <w:top w:val="nil"/>
+                <w:left w:val="nil"/>
+                <w:bottom w:val="nil"/>
+                <w:right w:val="nil"/>
+                <w:between w:val="nil"/>
+              </w:pBdr>
+              <w:rPr>
+                <w:color w:val="000000"/>
+                <w:sz w:val="24"/>
+                <w:szCs w:val="24"/>
+              </w:rPr>
+            </w:pPr>
+          </w:p>
+          <w:p>
+            <w:pPr>
+              <w:pBdr>
+                <w:top w:val="nil"/>
+                <w:left w:val="nil"/>
+                <w:bottom w:val="nil"/>
+                <w:right w:val="nil"/>
+                <w:between w:val="nil"/>
+              </w:pBdr>
+              <w:spacing w:before="270"/>
+              <w:rPr>
+                <w:color w:val="000000"/>
+                <w:sz w:val="24"/>
+                <w:szCs w:val="24"/>
+              </w:rPr>
+            </w:pPr>
+          </w:p>
+          <w:p>
+            <w:pPr>
+              <w:pBdr>
+                <w:top w:val="nil"/>
+                <w:left w:val="nil"/>
+                <w:bottom w:val="nil"/>
+                <w:right w:val="nil"/>
+                <w:between w:val="nil"/>
+              </w:pBdr>
+              <w:spacing w:before="1"/>
+              <w:ind w:left="104" w:right="994"/>
+              <w:rPr>
+                <w:b/>
+                <w:color w:val="000000"/>
+                <w:sz w:val="24"/>
+                <w:szCs w:val="24"/>
+              </w:rPr>
+            </w:pPr>
+            <w:r>
+              <w:rPr>
+                <w:b/>
+                <w:color w:val="000000"/>
+                <w:sz w:val="24"/>
+                <w:szCs w:val="24"/>
+              </w:rPr>
+              <w:t>{week_label}</w:t>
+            </w:r>
+          </w:p>
+        </w:tc>
+      </w:tr>
+      <w:tr>
+        <w:trPr>
+          <w:trHeight w:val="274"/>
+        </w:trPr>
+        <w:tc>
+          <w:tcPr>
+            <w:tcW w:w="10365" w:type="dxa"/>
+            <w:gridSpan w:val="8"/>
+            <w:tcBorders>
+              <w:top w:val="single" w:sz="12" w:space="0" w:color="000000"/>
+              <w:left w:val="single" w:sz="8" w:space="0" w:color="000000"/>
+              <w:bottom w:val="single" w:sz="8" w:space="0" w:color="000000"/>
+              <w:right w:val="single" w:sz="8" w:space="0" w:color="000000"/>
+            </w:tcBorders>
+          </w:tcPr>
+          <w:p>
+            <w:pPr>
+              <w:pBdr>
+                <w:top w:val="nil"/>
+                <w:left w:val="nil"/>
+                <w:bottom w:val="nil"/>
+                <w:right w:val="nil"/>
+                <w:between w:val="nil"/>
+              </w:pBdr>
+              <w:spacing w:line="254" w:lineRule="auto"/>
+              <w:ind w:left="107"/>
+              <w:rPr>
+                <w:b/>
+                <w:color w:val="000000"/>
+                <w:sz w:val="24"/>
+                <w:szCs w:val="24"/>
+              </w:rPr>
+            </w:pPr>
+            <w:r>
+              <w:rPr>
+                <w:b/>
+                <w:color w:val="000000"/>
+                <w:sz w:val="24"/>
+                <w:szCs w:val="24"/>
+              </w:rPr>
+              <w:t>NAMA MAHASISWA/NIM/KELOMPOK: {group_info}</w:t>
+            </w:r>
+          </w:p>
+        </w:tc>
+      </w:tr>
+      <w:tr>
+        <w:trPr>
+          <w:trHeight w:val="278"/>
+        </w:trPr>
+        <w:tc>
+          <w:tcPr>
+            <w:tcW w:w="10365" w:type="dxa"/>
+            <w:gridSpan w:val="8"/>
+            <w:tcBorders>
+              <w:top w:val="single" w:sz="8" w:space="0" w:color="000000"/>
+              <w:left w:val="single" w:sz="8" w:space="0" w:color="000000"/>
+              <w:bottom w:val="single" w:sz="8" w:space="0" w:color="000000"/>
+              <w:right w:val="single" w:sz="8" w:space="0" w:color="000000"/>
+            </w:tcBorders>
+          </w:tcPr>
+          <w:p>
+            <w:pPr>
+              <w:pBdr>
+                <w:top w:val="nil"/>
+                <w:left w:val="nil"/>
+                <w:bottom w:val="nil"/>
+                <w:right w:val="nil"/>
+                <w:between w:val="nil"/>
+              </w:pBdr>
+              <w:spacing w:line="258" w:lineRule="auto"/>
+              <w:ind w:left="107"/>
+              <w:rPr>
+                <w:b/>
+                <w:color w:val="000000"/>
+                <w:sz w:val="24"/>
+                <w:szCs w:val="24"/>
+              </w:rPr>
+            </w:pPr>
+            <w:r>
+              <w:rPr>
+                <w:b/>
+                <w:color w:val="000000"/>
+                <w:sz w:val="24"/>
+                <w:szCs w:val="24"/>
+              </w:rPr>
+              <w:t>A. JADWAL:</w:t>
+            </w:r>
+          </w:p>
+        </w:tc>
+      </w:tr>
+      <w:tr>
+        <w:trPr>
+          <w:trHeight w:val="230"/>
+        </w:trPr>
+        <w:tc>
+          <w:tcPr>
+            <w:tcW w:w="635" w:type="dxa"/>
+            <w:tcBorders>
+              <w:top w:val="single" w:sz="8" w:space="0" w:color="000000"/>
+              <w:left w:val="single" w:sz="8" w:space="0" w:color="000000"/>
+              <w:bottom w:val="single" w:sz="8" w:space="0" w:color="000000"/>
+              <w:right w:val="single" w:sz="8" w:space="0" w:color="000000"/>
+            </w:tcBorders>
+          </w:tcPr>
+          <w:p>
+            <w:pPr>
+              <w:rPr>
+                <w:b/>
+                <w:bCs/>
+                <w:color w:val="000000"/>
+                <w:sz w:val="20"/>
+                <w:szCs w:val="20"/>
+              </w:rPr>
+            </w:pPr>
+            <w:r>
+              <w:rPr>
+                <w:b/>
+                <w:bCs/>
+                <w:sz w:val="20"/>
+                <w:szCs w:val="20"/>
+              </w:rPr>
+              <w:t>HARI</w:t>
+            </w:r>
+          </w:p>
+        </w:tc>
+        <w:tc>
+          <w:tcPr>
+            <w:tcW w:w="1465" w:type="dxa"/>
+            <w:tcBorders>
+              <w:top w:val="single" w:sz="8" w:space="0" w:color="000000"/>
+              <w:left w:val="single" w:sz="8" w:space="0" w:color="000000"/>
+              <w:bottom w:val="single" w:sz="8" w:space="0" w:color="000000"/>
+              <w:right w:val="single" w:sz="8" w:space="0" w:color="000000"/>
+            </w:tcBorders>
+          </w:tcPr>
+          <w:p>
+            <w:pPr>
+              <w:pBdr>
+                <w:top w:val="nil"/>
+                <w:left w:val="nil"/>
+                <w:bottom w:val="nil"/>
+                <w:right w:val="nil"/>
+                <w:between w:val="nil"/>
+              </w:pBdr>
+              <w:spacing w:line="210" w:lineRule="auto"/>
+              <w:ind w:left="106"/>
+              <w:rPr>
+                <w:b/>
+                <w:color w:val="000000"/>
+                <w:sz w:val="20"/>
+                <w:szCs w:val="20"/>
+              </w:rPr>
+            </w:pPr>
+            <w:r>
+              <w:rPr>
+                <w:b/>
+                <w:color w:val="000000"/>
+                <w:sz w:val="20"/>
+                <w:szCs w:val="20"/>
+              </w:rPr>
+              <w:t>TANGGAL</w:t>
+            </w:r>
+          </w:p>
+        </w:tc>
+        <w:tc>
+          <w:tcPr>
+            <w:tcW w:w="720" w:type="dxa"/>
+            <w:tcBorders>
+              <w:top w:val="single" w:sz="8" w:space="0" w:color="000000"/>
+              <w:left w:val="single" w:sz="8" w:space="0" w:color="000000"/>
+              <w:bottom w:val="single" w:sz="8" w:space="0" w:color="000000"/>
+              <w:right w:val="single" w:sz="8" w:space="0" w:color="000000"/>
+            </w:tcBorders>
+          </w:tcPr>
+          <w:p>
+            <w:pPr>
+              <w:pBdr>
+                <w:top w:val="nil"/>
+                <w:left w:val="nil"/>
+                <w:bottom w:val="nil"/>
+                <w:right w:val="nil"/>
+                <w:between w:val="nil"/>
+              </w:pBdr>
+              <w:spacing w:line="210" w:lineRule="auto"/>
+              <w:ind w:left="242"/>
+              <w:rPr>
+                <w:b/>
+                <w:color w:val="000000"/>
+                <w:sz w:val="20"/>
+                <w:szCs w:val="20"/>
+              </w:rPr>
+            </w:pPr>
+            <w:r>
+              <w:rPr>
+                <w:b/>
+                <w:color w:val="000000"/>
+                <w:sz w:val="20"/>
+                <w:szCs w:val="20"/>
+              </w:rPr>
+              <w:t>JAM</w:t>
+            </w:r>
+          </w:p>
+        </w:tc>
+        <w:tc>
+          <w:tcPr>
+            <w:tcW w:w="1642" w:type="dxa"/>
+            <w:gridSpan w:val="2"/>
+            <w:tcBorders>
+              <w:top w:val="single" w:sz="8" w:space="0" w:color="000000"/>
+              <w:left w:val="single" w:sz="8" w:space="0" w:color="000000"/>
+              <w:bottom w:val="single" w:sz="8" w:space="0" w:color="000000"/>
+              <w:right w:val="single" w:sz="8" w:space="0" w:color="000000"/>
+            </w:tcBorders>
+          </w:tcPr>
+          <w:p>
+            <w:pPr>
+              <w:pBdr>
+                <w:top w:val="nil"/>
+                <w:left w:val="nil"/>
+                <w:bottom w:val="nil"/>
+                <w:right w:val="nil"/>
+                <w:between w:val="nil"/>
+              </w:pBdr>
+              <w:spacing w:line="210" w:lineRule="auto"/>
+              <w:ind w:left="242"/>
+              <w:rPr>
+                <w:b/>
+                <w:color w:val="000000"/>
+                <w:sz w:val="20"/>
+                <w:szCs w:val="20"/>
+              </w:rPr>
+            </w:pPr>
+            <w:r>
+              <w:rPr>
+                <w:b/>
+                <w:sz w:val="20"/>
+                <w:szCs w:val="20"/>
+              </w:rPr>
+              <w:t>KEGIATAN</w:t>
+            </w:r>
+          </w:p>
+        </w:tc>
+        <w:tc>
+          <w:tcPr>
+            <w:tcW w:w="5903" w:type="dxa"/>
+            <w:gridSpan w:val="3"/>
+            <w:tcBorders>
+              <w:top w:val="single" w:sz="8" w:space="0" w:color="000000"/>
+              <w:left w:val="single" w:sz="8" w:space="0" w:color="000000"/>
+              <w:bottom w:val="single" w:sz="8" w:space="0" w:color="000000"/>
+              <w:right w:val="single" w:sz="8" w:space="0" w:color="000000"/>
+            </w:tcBorders>
+          </w:tcPr>
+          <w:p>
+            <w:pPr>
+              <w:pBdr>
+                <w:top w:val="nil"/>
+                <w:left w:val="nil"/>
+                <w:bottom w:val="nil"/>
+                <w:right w:val="nil"/>
+                <w:between w:val="nil"/>
+              </w:pBdr>
+              <w:spacing w:line="210" w:lineRule="auto"/>
+              <w:ind w:right="1"/>
+              <w:jc w:val="center"/>
+              <w:rPr>
+                <w:b/>
+                <w:color w:val="FF0000"/>
+                <w:sz w:val="20"/>
+                <w:szCs w:val="20"/>
+              </w:rPr>
+            </w:pPr>
+            <w:r>
+              <w:rPr>
+                <w:b/>
+                <w:color w:val="FF0000"/>
+                <w:sz w:val="20"/>
+                <w:szCs w:val="20"/>
+              </w:rPr>
+              <w:t>Dokumentasi</w:t>
+            </w:r>
+          </w:p>
+        </w:tc>
+      </w:tr>
+      <w:tr>
+        <w:trPr>
+          <w:trHeight w:val="230"/>
+        </w:trPr>
+        <w:tc>
+          <w:tcPr>
+            <w:tcW w:w="635" w:type="dxa"/>
+            <w:tcBorders>
+              <w:top w:val="single" w:sz="8" w:space="0" w:color="000000"/>
+              <w:left w:val="single" w:sz="8" w:space="0" w:color="000000"/>
+              <w:bottom w:val="single" w:sz="8" w:space="0" w:color="000000"/>
+              <w:right w:val="single" w:sz="8" w:space="0" w:color="000000"/>
+            </w:tcBorders>
+          </w:tcPr>
+          <w:p>
+            <w:pPr>
+              <w:pBdr>
+                <w:top w:val="nil"/>
+                <w:left w:val="nil"/>
+                <w:bottom w:val="nil"/>
+                <w:right w:val="nil"/>
+                <w:between w:val="nil"/>
+              </w:pBdr>
+              <w:rPr>
+                <w:color w:val="000000"/>
+                <w:sz w:val="16"/>
+                <w:szCs w:val="16"/>
+              </w:rPr>
+            </w:pPr>
+          </w:p>
+        </w:tc>
+        <w:tc>
+          <w:tcPr>
+            <w:tcW w:w="1465" w:type="dxa"/>
+            <w:tcBorders>
+              <w:top w:val="single" w:sz="8" w:space="0" w:color="000000"/>
+              <w:left w:val="single" w:sz="8" w:space="0" w:color="000000"/>
+              <w:bottom w:val="single" w:sz="8" w:space="0" w:color="000000"/>
+              <w:right w:val="single" w:sz="8" w:space="0" w:color="000000"/>
+            </w:tcBorders>
+          </w:tcPr>
+          <w:p>
+            <w:pPr>
+              <w:pBdr>
+                <w:top w:val="nil"/>
+                <w:left w:val="nil"/>
+                <w:bottom w:val="nil"/>
+                <w:right w:val="nil"/>
+                <w:between w:val="nil"/>
+              </w:pBdr>
+              <w:rPr>
+                <w:color w:val="000000"/>
+                <w:sz w:val="16"/>
+                <w:szCs w:val="16"/>
+              </w:rPr>
+            </w:pPr>
+          </w:p>
+        </w:tc>
+        <w:tc>
+          <w:tcPr>
+            <w:tcW w:w="720" w:type="dxa"/>
+            <w:tcBorders>
+              <w:top w:val="single" w:sz="8" w:space="0" w:color="000000"/>
+              <w:left w:val="single" w:sz="8" w:space="0" w:color="000000"/>
+              <w:bottom w:val="single" w:sz="8" w:space="0" w:color="000000"/>
+              <w:right w:val="single" w:sz="8" w:space="0" w:color="000000"/>
+            </w:tcBorders>
+          </w:tcPr>
+          <w:p>
+            <w:pPr>
+              <w:pBdr>
+                <w:top w:val="nil"/>
+                <w:left w:val="nil"/>
+                <w:bottom w:val="nil"/>
+                <w:right w:val="nil"/>
+                <w:between w:val="nil"/>
+              </w:pBdr>
+              <w:rPr>
+                <w:color w:val="000000"/>
+                <w:sz w:val="16"/>
+                <w:szCs w:val="16"/>
+              </w:rPr>
+            </w:pPr>
+          </w:p>
+        </w:tc>
+        <w:tc>
+          <w:tcPr>
+            <w:tcW w:w="1642" w:type="dxa"/>
+            <w:gridSpan w:val="2"/>
+            <w:tcBorders>
+              <w:top w:val="single" w:sz="8" w:space="0" w:color="000000"/>
+              <w:left w:val="single" w:sz="8" w:space="0" w:color="000000"/>
+              <w:bottom w:val="single" w:sz="8" w:space="0" w:color="000000"/>
+              <w:right w:val="single" w:sz="8" w:space="0" w:color="000000"/>
+            </w:tcBorders>
+          </w:tcPr>
+          <w:p>
+            <w:pPr>
+              <w:pBdr>
+                <w:top w:val="nil"/>
+                <w:left w:val="nil"/>
+                <w:bottom w:val="nil"/>
+                <w:right w:val="nil"/>
+                <w:between w:val="nil"/>
+              </w:pBdr>
+              <w:rPr>
+                <w:color w:val="000000"/>
+                <w:sz w:val="16"/>
+                <w:szCs w:val="16"/>
+              </w:rPr>
+            </w:pPr>
+          </w:p>
+        </w:tc>
+        <w:tc>
+          <w:tcPr>
+            <w:tcW w:w="5903" w:type="dxa"/>
+            <w:gridSpan w:val="3"/>
+            <w:tcBorders>
+              <w:top w:val="single" w:sz="8" w:space="0" w:color="000000"/>
+              <w:left w:val="single" w:sz="8" w:space="0" w:color="000000"/>
+              <w:bottom w:val="single" w:sz="8" w:space="0" w:color="000000"/>
+              <w:right w:val="single" w:sz="8" w:space="0" w:color="000000"/>
+            </w:tcBorders>
+          </w:tcPr>
+          <w:p>
+            <w:pPr>
+              <w:pBdr>
+                <w:top w:val="nil"/>
+                <w:left w:val="nil"/>
+                <w:bottom w:val="nil"/>
+                <w:right w:val="nil"/>
+                <w:between w:val="nil"/>
+              </w:pBdr>
+              <w:rPr>
+                <w:color w:val="000000"/>
+                <w:sz w:val="16"/>
+                <w:szCs w:val="16"/>
+              </w:rPr>
+            </w:pPr>
+            <w:r>
+              <w:rPr>
+                <w:sz w:val="16"/>
+                <w:szCs w:val="16"/>
+              </w:rPr>
+              <w:t xml:space="preserve"> </w:t>
+            </w:r>
+          </w:p>
+        </w:tc>
+      </w:tr>
+      <w:tr>
+        <w:trPr>
+          <w:trHeight w:val="230"/>
+        </w:trPr>
+        <w:tc>
+          <w:tcPr>
+            <w:tcW w:w="635" w:type="dxa"/>
+            <w:tcBorders>
+              <w:top w:val="single" w:sz="8" w:space="0" w:color="000000"/>
+              <w:left w:val="single" w:sz="8" w:space="0" w:color="000000"/>
+              <w:bottom w:val="single" w:sz="8" w:space="0" w:color="000000"/>
+              <w:right w:val="single" w:sz="8" w:space="0" w:color="000000"/>
+            </w:tcBorders>
+          </w:tcPr>
+          <w:p>
+            <w:pPr>
+              <w:pBdr>
+                <w:top w:val="nil"/>
+                <w:left w:val="nil"/>
+                <w:bottom w:val="nil"/>
+                <w:right w:val="nil"/>
+                <w:between w:val="nil"/>
+              </w:pBdr>
+              <w:rPr>
+                <w:color w:val="000000"/>
+                <w:sz w:val="16"/>
+                <w:szCs w:val="16"/>
+              </w:rPr>
+            </w:pPr>
+          </w:p>
+        </w:tc>
+        <w:tc>
+          <w:tcPr>
+            <w:tcW w:w="1465" w:type="dxa"/>
+            <w:tcBorders>
+              <w:top w:val="single" w:sz="8" w:space="0" w:color="000000"/>
+              <w:left w:val="single" w:sz="8" w:space="0" w:color="000000"/>
+              <w:bottom w:val="single" w:sz="8" w:space="0" w:color="000000"/>
+              <w:right w:val="single" w:sz="8" w:space="0" w:color="000000"/>
+            </w:tcBorders>
+          </w:tcPr>
+          <w:p>
+            <w:pPr>
+              <w:pBdr>
+                <w:top w:val="nil"/>
+                <w:left w:val="nil"/>
+                <w:bottom w:val="nil"/>
+                <w:right w:val="nil"/>
+                <w:between w:val="nil"/>
+              </w:pBdr>
+              <w:rPr>
+                <w:color w:val="000000"/>
+                <w:sz w:val="16"/>
+                <w:szCs w:val="16"/>
+              </w:rPr>
+            </w:pPr>
+          </w:p>
+        </w:tc>
+        <w:tc>
+          <w:tcPr>
+            <w:tcW w:w="720" w:type="dxa"/>
+            <w:tcBorders>
+              <w:top w:val="single" w:sz="8" w:space="0" w:color="000000"/>
+              <w:left w:val="single" w:sz="8" w:space="0" w:color="000000"/>
+              <w:bottom w:val="single" w:sz="8" w:space="0" w:color="000000"/>
+              <w:right w:val="single" w:sz="8" w:space="0" w:color="000000"/>
+            </w:tcBorders>
+          </w:tcPr>
+          <w:p>
+            <w:pPr>
+              <w:pBdr>
+                <w:top w:val="nil"/>
+                <w:left w:val="nil"/>
+                <w:bottom w:val="nil"/>
+                <w:right w:val="nil"/>
+                <w:between w:val="nil"/>
+              </w:pBdr>
+              <w:rPr>
+                <w:color w:val="000000"/>
+                <w:sz w:val="16"/>
+                <w:szCs w:val="16"/>
+              </w:rPr>
+            </w:pPr>
+          </w:p>
+        </w:tc>
+        <w:tc>
+          <w:tcPr>
+            <w:tcW w:w="1642" w:type="dxa"/>
+            <w:gridSpan w:val="2"/>
+            <w:tcBorders>
+              <w:top w:val="single" w:sz="8" w:space="0" w:color="000000"/>
+              <w:left w:val="single" w:sz="8" w:space="0" w:color="000000"/>
+              <w:bottom w:val="single" w:sz="8" w:space="0" w:color="000000"/>
+              <w:right w:val="single" w:sz="8" w:space="0" w:color="000000"/>
+            </w:tcBorders>
+          </w:tcPr>
+          <w:p>
+            <w:pPr>
+              <w:pBdr>
+                <w:top w:val="nil"/>
+                <w:left w:val="nil"/>
+                <w:bottom w:val="nil"/>
+                <w:right w:val="nil"/>
+                <w:between w:val="nil"/>
+              </w:pBdr>
+              <w:rPr>
+                <w:color w:val="000000"/>
+                <w:sz w:val="16"/>
+                <w:szCs w:val="16"/>
+              </w:rPr>
+            </w:pPr>
+          </w:p>
+        </w:tc>
+        <w:tc>
+          <w:tcPr>
+            <w:tcW w:w="5903" w:type="dxa"/>
+            <w:gridSpan w:val="3"/>
+            <w:tcBorders>
+              <w:top w:val="single" w:sz="8" w:space="0" w:color="000000"/>
+              <w:left w:val="single" w:sz="8" w:space="0" w:color="000000"/>
+              <w:bottom w:val="single" w:sz="8" w:space="0" w:color="000000"/>
+              <w:right w:val="single" w:sz="8" w:space="0" w:color="000000"/>
+            </w:tcBorders>
+          </w:tcPr>
+          <w:p>
+            <w:pPr>
+              <w:pBdr>
+                <w:top w:val="nil"/>
+                <w:left w:val="nil"/>
+                <w:bottom w:val="nil"/>
+                <w:right w:val="nil"/>
+                <w:between w:val="nil"/>
+              </w:pBdr>
+              <w:rPr>
+                <w:color w:val="000000"/>
+                <w:sz w:val="16"/>
+                <w:szCs w:val="16"/>
+              </w:rPr>
+            </w:pPr>
+          </w:p>
+        </w:tc>
+      </w:tr>
+      <w:tr>
+        <w:trPr>
+          <w:trHeight w:val="230"/>
+        </w:trPr>
+        <w:tc>
+          <w:tcPr>
+            <w:tcW w:w="635" w:type="dxa"/>
+            <w:tcBorders>
+              <w:top w:val="single" w:sz="8" w:space="0" w:color="000000"/>
+              <w:left w:val="single" w:sz="8" w:space="0" w:color="000000"/>
+              <w:bottom w:val="single" w:sz="8" w:space="0" w:color="000000"/>
+              <w:right w:val="single" w:sz="8" w:space="0" w:color="000000"/>
+            </w:tcBorders>
+          </w:tcPr>
+          <w:p>
+            <w:pPr>
+              <w:pBdr>
+                <w:top w:val="nil"/>
+                <w:left w:val="nil"/>
+                <w:bottom w:val="nil"/>
+                <w:right w:val="nil"/>
+                <w:between w:val="nil"/>
+              </w:pBdr>
+              <w:rPr>
+                <w:color w:val="000000"/>
+                <w:sz w:val="16"/>
+                <w:szCs w:val="16"/>
+              </w:rPr>
+            </w:pPr>
+          </w:p>
+        </w:tc>
+        <w:tc>
+          <w:tcPr>
+            <w:tcW w:w="1465" w:type="dxa"/>
+            <w:tcBorders>
+              <w:top w:val="single" w:sz="8" w:space="0" w:color="000000"/>
+              <w:left w:val="single" w:sz="8" w:space="0" w:color="000000"/>
+              <w:bottom w:val="single" w:sz="8" w:space="0" w:color="000000"/>
+              <w:right w:val="single" w:sz="8" w:space="0" w:color="000000"/>
+            </w:tcBorders>
+          </w:tcPr>
+          <w:p>
+            <w:pPr>
+              <w:pBdr>
+                <w:top w:val="nil"/>
+                <w:left w:val="nil"/>
+                <w:bottom w:val="nil"/>
+                <w:right w:val="nil"/>
+                <w:between w:val="nil"/>
+              </w:pBdr>
+              <w:rPr>
+                <w:color w:val="000000"/>
+                <w:sz w:val="16"/>
+                <w:szCs w:val="16"/>
+              </w:rPr>
+            </w:pPr>
+          </w:p>
+        </w:tc>
+        <w:tc>
+          <w:tcPr>
+            <w:tcW w:w="720" w:type="dxa"/>
+            <w:tcBorders>
+              <w:top w:val="single" w:sz="8" w:space="0" w:color="000000"/>
+              <w:left w:val="single" w:sz="8" w:space="0" w:color="000000"/>
+              <w:bottom w:val="single" w:sz="8" w:space="0" w:color="000000"/>
+              <w:right w:val="single" w:sz="8" w:space="0" w:color="000000"/>
+            </w:tcBorders>
+          </w:tcPr>
+          <w:p>
+            <w:pPr>
+              <w:pBdr>
+                <w:top w:val="nil"/>
+                <w:left w:val="nil"/>
+                <w:bottom w:val="nil"/>
+                <w:right w:val="nil"/>
+                <w:between w:val="nil"/>
+              </w:pBdr>
+              <w:rPr>
+                <w:color w:val="000000"/>
+                <w:sz w:val="16"/>
+                <w:szCs w:val="16"/>
+              </w:rPr>
+            </w:pPr>
+          </w:p>
+        </w:tc>
+        <w:tc>
+          <w:tcPr>
+            <w:tcW w:w="1642" w:type="dxa"/>
+            <w:gridSpan w:val="2"/>
+            <w:tcBorders>
+              <w:top w:val="single" w:sz="8" w:space="0" w:color="000000"/>
+              <w:left w:val="single" w:sz="8" w:space="0" w:color="000000"/>
+              <w:bottom w:val="single" w:sz="8" w:space="0" w:color="000000"/>
+              <w:right w:val="single" w:sz="8" w:space="0" w:color="000000"/>
+            </w:tcBorders>
+          </w:tcPr>
+          <w:p>
+            <w:pPr>
+              <w:pBdr>
+                <w:top w:val="nil"/>
+                <w:left w:val="nil"/>
+                <w:bottom w:val="nil"/>
+                <w:right w:val="nil"/>
+                <w:between w:val="nil"/>
+              </w:pBdr>
+              <w:rPr>
+                <w:color w:val="000000"/>
+                <w:sz w:val="16"/>
+                <w:szCs w:val="16"/>
+              </w:rPr>
+            </w:pPr>
+          </w:p>
+        </w:tc>
+        <w:tc>
+          <w:tcPr>
+            <w:tcW w:w="5903" w:type="dxa"/>
+            <w:gridSpan w:val="3"/>
+            <w:tcBorders>
+              <w:top w:val="single" w:sz="8" w:space="0" w:color="000000"/>
+              <w:left w:val="single" w:sz="8" w:space="0" w:color="000000"/>
+              <w:bottom w:val="single" w:sz="8" w:space="0" w:color="000000"/>
+              <w:right w:val="single" w:sz="8" w:space="0" w:color="000000"/>
+            </w:tcBorders>
+          </w:tcPr>
+          <w:p>
+            <w:pPr>
+              <w:pBdr>
+                <w:top w:val="nil"/>
+                <w:left w:val="nil"/>
+                <w:bottom w:val="nil"/>
+                <w:right w:val="nil"/>
+                <w:between w:val="nil"/>
+              </w:pBdr>
+              <w:rPr>
+                <w:color w:val="000000"/>
+                <w:sz w:val="16"/>
+                <w:szCs w:val="16"/>
+              </w:rPr>
+            </w:pPr>
+          </w:p>
+        </w:tc>
+      </w:tr>
+      <w:tr>
+        <w:trPr>
+          <w:trHeight w:val="230"/>
+        </w:trPr>
+        <w:tc>
+          <w:tcPr>
+            <w:tcW w:w="635" w:type="dxa"/>
+            <w:tcBorders>
+              <w:top w:val="single" w:sz="8" w:space="0" w:color="000000"/>
+              <w:left w:val="single" w:sz="8" w:space="0" w:color="000000"/>
+              <w:bottom w:val="single" w:sz="8" w:space="0" w:color="000000"/>
+              <w:right w:val="single" w:sz="8" w:space="0" w:color="000000"/>
+            </w:tcBorders>
+          </w:tcPr>
+          <w:p>
+            <w:pPr>
+              <w:pBdr>
+                <w:top w:val="nil"/>
+                <w:left w:val="nil"/>
+                <w:bottom w:val="nil"/>
+                <w:right w:val="nil"/>
+                <w:between w:val="nil"/>
+              </w:pBdr>
+              <w:rPr>
+                <w:color w:val="000000"/>
+                <w:sz w:val="16"/>
+                <w:szCs w:val="16"/>
+              </w:rPr>
+            </w:pPr>
+          </w:p>
+        </w:tc>
+        <w:tc>
+          <w:tcPr>
+            <w:tcW w:w="1465" w:type="dxa"/>
+            <w:tcBorders>
+              <w:top w:val="single" w:sz="8" w:space="0" w:color="000000"/>
+              <w:left w:val="single" w:sz="8" w:space="0" w:color="000000"/>
+              <w:bottom w:val="single" w:sz="8" w:space="0" w:color="000000"/>
+              <w:right w:val="single" w:sz="8" w:space="0" w:color="000000"/>
+            </w:tcBorders>
+          </w:tcPr>
+          <w:p>
+            <w:pPr>
+              <w:pBdr>
+                <w:top w:val="nil"/>
+                <w:left w:val="nil"/>
+                <w:bottom w:val="nil"/>
+                <w:right w:val="nil"/>
+                <w:between w:val="nil"/>
+              </w:pBdr>
+              <w:rPr>
+                <w:color w:val="000000"/>
+                <w:sz w:val="16"/>
+                <w:szCs w:val="16"/>
+              </w:rPr>
+            </w:pPr>
+          </w:p>
+        </w:tc>
+        <w:tc>
+          <w:tcPr>
+            <w:tcW w:w="720" w:type="dxa"/>
+            <w:tcBorders>
+              <w:top w:val="single" w:sz="8" w:space="0" w:color="000000"/>
+              <w:left w:val="single" w:sz="8" w:space="0" w:color="000000"/>
+              <w:bottom w:val="single" w:sz="8" w:space="0" w:color="000000"/>
+              <w:right w:val="single" w:sz="8" w:space="0" w:color="000000"/>
+            </w:tcBorders>
+          </w:tcPr>
+          <w:p>
+            <w:pPr>
+              <w:pBdr>
+                <w:top w:val="nil"/>
+                <w:left w:val="nil"/>
+                <w:bottom w:val="nil"/>
+                <w:right w:val="nil"/>
+                <w:between w:val="nil"/>
+              </w:pBdr>
+              <w:rPr>
+                <w:color w:val="000000"/>
+                <w:sz w:val="16"/>
+                <w:szCs w:val="16"/>
+              </w:rPr>
+            </w:pPr>
+          </w:p>
+        </w:tc>
+        <w:tc>
+          <w:tcPr>
+            <w:tcW w:w="1642" w:type="dxa"/>
+            <w:gridSpan w:val="2"/>
+            <w:tcBorders>
+              <w:top w:val="single" w:sz="8" w:space="0" w:color="000000"/>
+              <w:left w:val="single" w:sz="8" w:space="0" w:color="000000"/>
+              <w:bottom w:val="single" w:sz="8" w:space="0" w:color="000000"/>
+              <w:right w:val="single" w:sz="8" w:space="0" w:color="000000"/>
+            </w:tcBorders>
+          </w:tcPr>
+          <w:p>
+            <w:pPr>
+              <w:pBdr>
+                <w:top w:val="nil"/>
+                <w:left w:val="nil"/>
+                <w:bottom w:val="nil"/>
+                <w:right w:val="nil"/>
+                <w:between w:val="nil"/>
+              </w:pBdr>
+              <w:rPr>
+                <w:color w:val="000000"/>
+                <w:sz w:val="16"/>
+                <w:szCs w:val="16"/>
+              </w:rPr>
+            </w:pPr>
+          </w:p>
+        </w:tc>
+        <w:tc>
+          <w:tcPr>
+            <w:tcW w:w="5903" w:type="dxa"/>
+            <w:gridSpan w:val="3"/>
+            <w:tcBorders>
+              <w:top w:val="single" w:sz="8" w:space="0" w:color="000000"/>
+              <w:left w:val="single" w:sz="8" w:space="0" w:color="000000"/>
+              <w:bottom w:val="single" w:sz="8" w:space="0" w:color="000000"/>
+              <w:right w:val="single" w:sz="8" w:space="0" w:color="000000"/>
+            </w:tcBorders>
+          </w:tcPr>
+          <w:p>
+            <w:pPr>
+              <w:pBdr>
+                <w:top w:val="nil"/>
+                <w:left w:val="nil"/>
+                <w:bottom w:val="nil"/>
+                <w:right w:val="nil"/>
+                <w:between w:val="nil"/>
+              </w:pBdr>
+              <w:rPr>
+                <w:color w:val="000000"/>
+                <w:sz w:val="16"/>
+                <w:szCs w:val="16"/>
+              </w:rPr>
+            </w:pPr>
+          </w:p>
+        </w:tc>
+      </w:tr>
+      <w:tr>
+        <w:trPr>
+          <w:trHeight w:val="229"/>
+        </w:trPr>
+        <w:tc>
+          <w:tcPr>
+            <w:tcW w:w="635" w:type="dxa"/>
+            <w:tcBorders>
+              <w:top w:val="single" w:sz="8" w:space="0" w:color="000000"/>
+              <w:left w:val="single" w:sz="8" w:space="0" w:color="000000"/>
+              <w:bottom w:val="single" w:sz="8" w:space="0" w:color="000000"/>
+              <w:right w:val="single" w:sz="8" w:space="0" w:color="000000"/>
+            </w:tcBorders>
+          </w:tcPr>
+          <w:p>
+            <w:pPr>
+              <w:pBdr>
+                <w:top w:val="nil"/>
+                <w:left w:val="nil"/>
+                <w:bottom w:val="nil"/>
+                <w:right w:val="nil"/>
+                <w:between w:val="nil"/>
+              </w:pBdr>
+              <w:rPr>
+                <w:color w:val="000000"/>
+                <w:sz w:val="16"/>
+                <w:szCs w:val="16"/>
+              </w:rPr>
+            </w:pPr>
+          </w:p>
+        </w:tc>
+        <w:tc>
+          <w:tcPr>
+            <w:tcW w:w="1465" w:type="dxa"/>
+            <w:tcBorders>
+              <w:top w:val="single" w:sz="8" w:space="0" w:color="000000"/>
+              <w:left w:val="single" w:sz="8" w:space="0" w:color="000000"/>
+              <w:bottom w:val="single" w:sz="8" w:space="0" w:color="000000"/>
+              <w:right w:val="single" w:sz="8" w:space="0" w:color="000000"/>
+            </w:tcBorders>
+          </w:tcPr>
+          <w:p>
+            <w:pPr>
+              <w:pBdr>
+                <w:top w:val="nil"/>
+                <w:left w:val="nil"/>
+                <w:bottom w:val="nil"/>
+                <w:right w:val="nil"/>
+                <w:between w:val="nil"/>
+              </w:pBdr>
+              <w:rPr>
+                <w:color w:val="000000"/>
+                <w:sz w:val="16"/>
+                <w:szCs w:val="16"/>
+              </w:rPr>
+            </w:pPr>
+          </w:p>
+        </w:tc>
+        <w:tc>
+          <w:tcPr>
+            <w:tcW w:w="720" w:type="dxa"/>
+            <w:tcBorders>
+              <w:top w:val="single" w:sz="8" w:space="0" w:color="000000"/>
+              <w:left w:val="single" w:sz="8" w:space="0" w:color="000000"/>
+              <w:bottom w:val="single" w:sz="8" w:space="0" w:color="000000"/>
+              <w:right w:val="single" w:sz="8" w:space="0" w:color="000000"/>
+            </w:tcBorders>
+          </w:tcPr>
+          <w:p>
+            <w:pPr>
+              <w:pBdr>
+                <w:top w:val="nil"/>
+                <w:left w:val="nil"/>
+                <w:bottom w:val="nil"/>
+                <w:right w:val="nil"/>
+                <w:between w:val="nil"/>
+              </w:pBdr>
+              <w:rPr>
+                <w:color w:val="000000"/>
+                <w:sz w:val="16"/>
+                <w:szCs w:val="16"/>
+              </w:rPr>
+            </w:pPr>
+          </w:p>
+        </w:tc>
+        <w:tc>
+          <w:tcPr>
+            <w:tcW w:w="1642" w:type="dxa"/>
+            <w:gridSpan w:val="2"/>
+            <w:tcBorders>
+              <w:top w:val="single" w:sz="8" w:space="0" w:color="000000"/>
+              <w:left w:val="single" w:sz="8" w:space="0" w:color="000000"/>
+              <w:bottom w:val="single" w:sz="8" w:space="0" w:color="000000"/>
+              <w:right w:val="single" w:sz="8" w:space="0" w:color="000000"/>
+            </w:tcBorders>
+          </w:tcPr>
+          <w:p>
+            <w:pPr>
+              <w:pBdr>
+                <w:top w:val="nil"/>
+                <w:left w:val="nil"/>
+                <w:bottom w:val="nil"/>
+                <w:right w:val="nil"/>
+                <w:between w:val="nil"/>
+              </w:pBdr>
+              <w:rPr>
+                <w:color w:val="000000"/>
+                <w:sz w:val="16"/>
+                <w:szCs w:val="16"/>
+              </w:rPr>
+            </w:pPr>
+          </w:p>
+        </w:tc>
+        <w:tc>
+          <w:tcPr>
+            <w:tcW w:w="5903" w:type="dxa"/>
+            <w:gridSpan w:val="3"/>
+            <w:tcBorders>
+              <w:top w:val="single" w:sz="8" w:space="0" w:color="000000"/>
+              <w:left w:val="single" w:sz="8" w:space="0" w:color="000000"/>
+              <w:bottom w:val="single" w:sz="8" w:space="0" w:color="000000"/>
+              <w:right w:val="single" w:sz="8" w:space="0" w:color="000000"/>
+            </w:tcBorders>
+          </w:tcPr>
+          <w:p>
+            <w:pPr>
+              <w:pBdr>
+                <w:top w:val="nil"/>
+                <w:left w:val="nil"/>
+                <w:bottom w:val="nil"/>
+                <w:right w:val="nil"/>
+                <w:between w:val="nil"/>
+              </w:pBdr>
+              <w:rPr>
+                <w:color w:val="000000"/>
+                <w:sz w:val="16"/>
+                <w:szCs w:val="16"/>
+              </w:rPr>
+            </w:pPr>
+          </w:p>
+        </w:tc>
+      </w:tr>
+      <w:tr>
+        <w:trPr>
+          <w:trHeight w:val="230"/>
+        </w:trPr>
+        <w:tc>
+          <w:tcPr>
+            <w:tcW w:w="635" w:type="dxa"/>
+            <w:tcBorders>
+              <w:top w:val="single" w:sz="8" w:space="0" w:color="000000"/>
+              <w:left w:val="single" w:sz="8" w:space="0" w:color="000000"/>
+              <w:bottom w:val="single" w:sz="8" w:space="0" w:color="000000"/>
+              <w:right w:val="single" w:sz="8" w:space="0" w:color="000000"/>
+            </w:tcBorders>
+          </w:tcPr>
+          <w:p>
+            <w:pPr>
+              <w:pBdr>
+                <w:top w:val="nil"/>
+                <w:left w:val="nil"/>
+                <w:bottom w:val="nil"/>
+                <w:right w:val="nil"/>
+                <w:between w:val="nil"/>
+              </w:pBdr>
+              <w:rPr>
+                <w:color w:val="000000"/>
+                <w:sz w:val="16"/>
+                <w:szCs w:val="16"/>
+              </w:rPr>
+            </w:pPr>
+          </w:p>
+        </w:tc>
+        <w:tc>
+          <w:tcPr>
+            <w:tcW w:w="1465" w:type="dxa"/>
+            <w:tcBorders>
+              <w:top w:val="single" w:sz="8" w:space="0" w:color="000000"/>
+              <w:left w:val="single" w:sz="8" w:space="0" w:color="000000"/>
+              <w:bottom w:val="single" w:sz="8" w:space="0" w:color="000000"/>
+              <w:right w:val="single" w:sz="8" w:space="0" w:color="000000"/>
+            </w:tcBorders>
+          </w:tcPr>
+          <w:p>
+            <w:pPr>
+              <w:pBdr>
+                <w:top w:val="nil"/>
+                <w:left w:val="nil"/>
+                <w:bottom w:val="nil"/>
+                <w:right w:val="nil"/>
+                <w:between w:val="nil"/>
+              </w:pBdr>
+              <w:rPr>
+                <w:color w:val="000000"/>
+                <w:sz w:val="16"/>
+                <w:szCs w:val="16"/>
+              </w:rPr>
+            </w:pPr>
+          </w:p>
+        </w:tc>
+        <w:tc>
+          <w:tcPr>
+            <w:tcW w:w="720" w:type="dxa"/>
+            <w:tcBorders>
+              <w:top w:val="single" w:sz="8" w:space="0" w:color="000000"/>
+              <w:left w:val="single" w:sz="8" w:space="0" w:color="000000"/>
+              <w:bottom w:val="single" w:sz="8" w:space="0" w:color="000000"/>
+              <w:right w:val="single" w:sz="8" w:space="0" w:color="000000"/>
+            </w:tcBorders>
+          </w:tcPr>
+          <w:p>
+            <w:pPr>
+              <w:pBdr>
+                <w:top w:val="nil"/>
+                <w:left w:val="nil"/>
+                <w:bottom w:val="nil"/>
+                <w:right w:val="nil"/>
+                <w:between w:val="nil"/>
+              </w:pBdr>
+              <w:rPr>
+                <w:color w:val="000000"/>
+                <w:sz w:val="16"/>
+                <w:szCs w:val="16"/>
+              </w:rPr>
+            </w:pPr>
+          </w:p>
+        </w:tc>
+        <w:tc>
+          <w:tcPr>
+            <w:tcW w:w="1642" w:type="dxa"/>
+            <w:gridSpan w:val="2"/>
+            <w:tcBorders>
+              <w:top w:val="single" w:sz="8" w:space="0" w:color="000000"/>
+              <w:left w:val="single" w:sz="8" w:space="0" w:color="000000"/>
+              <w:bottom w:val="single" w:sz="8" w:space="0" w:color="000000"/>
+              <w:right w:val="single" w:sz="8" w:space="0" w:color="000000"/>
+            </w:tcBorders>
+          </w:tcPr>
+          <w:p>
+            <w:pPr>
+              <w:pBdr>
+                <w:top w:val="nil"/>
+                <w:left w:val="nil"/>
+                <w:bottom w:val="nil"/>
+                <w:right w:val="nil"/>
+                <w:between w:val="nil"/>
+              </w:pBdr>
+              <w:rPr>
+                <w:color w:val="000000"/>
+                <w:sz w:val="16"/>
+                <w:szCs w:val="16"/>
+              </w:rPr>
+            </w:pPr>
+          </w:p>
+        </w:tc>
+        <w:tc>
+          <w:tcPr>
+            <w:tcW w:w="5903" w:type="dxa"/>
+            <w:gridSpan w:val="3"/>
+            <w:tcBorders>
+              <w:top w:val="single" w:sz="8" w:space="0" w:color="000000"/>
+              <w:left w:val="single" w:sz="8" w:space="0" w:color="000000"/>
+              <w:bottom w:val="single" w:sz="8" w:space="0" w:color="000000"/>
+              <w:right w:val="single" w:sz="8" w:space="0" w:color="000000"/>
+            </w:tcBorders>
+          </w:tcPr>
+          <w:p>
+            <w:pPr>
+              <w:pBdr>
+                <w:top w:val="nil"/>
+                <w:left w:val="nil"/>
+                <w:bottom w:val="nil"/>
+                <w:right w:val="nil"/>
+                <w:between w:val="nil"/>
+              </w:pBdr>
+              <w:rPr>
+                <w:color w:val="000000"/>
+                <w:sz w:val="16"/>
+                <w:szCs w:val="16"/>
+              </w:rPr>
+            </w:pPr>
+          </w:p>
+        </w:tc>
+      </w:tr>
+      <w:tr>
+        <w:trPr>
+          <w:trHeight w:val="230"/>
+        </w:trPr>
+        <w:tc>
+          <w:tcPr>
+            <w:tcW w:w="635" w:type="dxa"/>
+            <w:tcBorders>
+              <w:top w:val="single" w:sz="8" w:space="0" w:color="000000"/>
+              <w:left w:val="single" w:sz="8" w:space="0" w:color="000000"/>
+              <w:bottom w:val="single" w:sz="8" w:space="0" w:color="000000"/>
+              <w:right w:val="single" w:sz="8" w:space="0" w:color="000000"/>
+            </w:tcBorders>
+          </w:tcPr>
+          <w:p>
+            <w:pPr>
+              <w:pBdr>
+                <w:top w:val="nil"/>
+                <w:left w:val="nil"/>
+                <w:bottom w:val="nil"/>
+                <w:right w:val="nil"/>
+                <w:between w:val="nil"/>
+              </w:pBdr>
+              <w:rPr>
+                <w:color w:val="000000"/>
+                <w:sz w:val="16"/>
+                <w:szCs w:val="16"/>
+              </w:rPr>
+            </w:pPr>
+          </w:p>
+        </w:tc>
+        <w:tc>
+          <w:tcPr>
+            <w:tcW w:w="1465" w:type="dxa"/>
+            <w:tcBorders>
+              <w:top w:val="single" w:sz="8" w:space="0" w:color="000000"/>
+              <w:left w:val="single" w:sz="8" w:space="0" w:color="000000"/>
+              <w:bottom w:val="single" w:sz="8" w:space="0" w:color="000000"/>
+              <w:right w:val="single" w:sz="8" w:space="0" w:color="000000"/>
+            </w:tcBorders>
+          </w:tcPr>
+          <w:p>
+            <w:pPr>
+              <w:pBdr>
+                <w:top w:val="nil"/>
+                <w:left w:val="nil"/>
+                <w:bottom w:val="nil"/>
+                <w:right w:val="nil"/>
+                <w:between w:val="nil"/>
+              </w:pBdr>
+              <w:rPr>
+                <w:color w:val="000000"/>
+                <w:sz w:val="16"/>
+                <w:szCs w:val="16"/>
+              </w:rPr>
+            </w:pPr>
+          </w:p>
+        </w:tc>
+        <w:tc>
+          <w:tcPr>
+            <w:tcW w:w="720" w:type="dxa"/>
+            <w:tcBorders>
+              <w:top w:val="single" w:sz="8" w:space="0" w:color="000000"/>
+              <w:left w:val="single" w:sz="8" w:space="0" w:color="000000"/>
+              <w:bottom w:val="single" w:sz="8" w:space="0" w:color="000000"/>
+              <w:right w:val="single" w:sz="8" w:space="0" w:color="000000"/>
+            </w:tcBorders>
+          </w:tcPr>
+          <w:p>
+            <w:pPr>
+              <w:pBdr>
+                <w:top w:val="nil"/>
+                <w:left w:val="nil"/>
+                <w:bottom w:val="nil"/>
+                <w:right w:val="nil"/>
+                <w:between w:val="nil"/>
+              </w:pBdr>
+              <w:rPr>
+                <w:color w:val="000000"/>
+                <w:sz w:val="16"/>
+                <w:szCs w:val="16"/>
+              </w:rPr>
+            </w:pPr>
+          </w:p>
+        </w:tc>
+        <w:tc>
+          <w:tcPr>
+            <w:tcW w:w="1642" w:type="dxa"/>
+            <w:gridSpan w:val="2"/>
+            <w:tcBorders>
+              <w:top w:val="single" w:sz="8" w:space="0" w:color="000000"/>
+              <w:left w:val="single" w:sz="8" w:space="0" w:color="000000"/>
+              <w:bottom w:val="single" w:sz="8" w:space="0" w:color="000000"/>
+              <w:right w:val="single" w:sz="8" w:space="0" w:color="000000"/>
+            </w:tcBorders>
+          </w:tcPr>
+          <w:p>
+            <w:pPr>
+              <w:pBdr>
+                <w:top w:val="nil"/>
+                <w:left w:val="nil"/>
+                <w:bottom w:val="nil"/>
+                <w:right w:val="nil"/>
+                <w:between w:val="nil"/>
+              </w:pBdr>
+              <w:rPr>
+                <w:color w:val="000000"/>
+                <w:sz w:val="16"/>
+                <w:szCs w:val="16"/>
+              </w:rPr>
+            </w:pPr>
+          </w:p>
+        </w:tc>
+        <w:tc>
+          <w:tcPr>
+            <w:tcW w:w="5903" w:type="dxa"/>
+            <w:gridSpan w:val="3"/>
+            <w:tcBorders>
+              <w:top w:val="single" w:sz="8" w:space="0" w:color="000000"/>
+              <w:left w:val="single" w:sz="8" w:space="0" w:color="000000"/>
+              <w:bottom w:val="single" w:sz="8" w:space="0" w:color="000000"/>
+              <w:right w:val="single" w:sz="8" w:space="0" w:color="000000"/>
+            </w:tcBorders>
+          </w:tcPr>
+          <w:p>
+            <w:pPr>
+              <w:pBdr>
+                <w:top w:val="nil"/>
+                <w:left w:val="nil"/>
+                <w:bottom w:val="nil"/>
+                <w:right w:val="nil"/>
+                <w:between w:val="nil"/>
+              </w:pBdr>
+              <w:rPr>
+                <w:color w:val="000000"/>
+                <w:sz w:val="16"/>
+                <w:szCs w:val="16"/>
+              </w:rPr>
+            </w:pPr>
+          </w:p>
+        </w:tc>
+      </w:tr>
+      <w:tr>
+        <w:trPr>
+          <w:trHeight w:val="230"/>
+        </w:trPr>
+        <w:tc>
+          <w:tcPr>
+            <w:tcW w:w="635" w:type="dxa"/>
+            <w:tcBorders>
+              <w:top w:val="single" w:sz="8" w:space="0" w:color="000000"/>
+              <w:left w:val="single" w:sz="8" w:space="0" w:color="000000"/>
+              <w:bottom w:val="single" w:sz="8" w:space="0" w:color="000000"/>
+              <w:right w:val="single" w:sz="8" w:space="0" w:color="000000"/>
+            </w:tcBorders>
+          </w:tcPr>
+          <w:p>
+            <w:pPr>
+              <w:pBdr>
+                <w:top w:val="nil"/>
+                <w:left w:val="nil"/>
+                <w:bottom w:val="nil"/>
+                <w:right w:val="nil"/>
+                <w:between w:val="nil"/>
+              </w:pBdr>
+              <w:rPr>
+                <w:color w:val="000000"/>
+                <w:sz w:val="16"/>
+                <w:szCs w:val="16"/>
+              </w:rPr>
+            </w:pPr>
+          </w:p>
+        </w:tc>
+        <w:tc>
+          <w:tcPr>
+            <w:tcW w:w="1465" w:type="dxa"/>
+            <w:tcBorders>
+              <w:top w:val="single" w:sz="8" w:space="0" w:color="000000"/>
+              <w:left w:val="single" w:sz="8" w:space="0" w:color="000000"/>
+              <w:bottom w:val="single" w:sz="8" w:space="0" w:color="000000"/>
+              <w:right w:val="single" w:sz="8" w:space="0" w:color="000000"/>
+            </w:tcBorders>
+          </w:tcPr>
+          <w:p>
+            <w:pPr>
+              <w:pBdr>
+                <w:top w:val="nil"/>
+                <w:left w:val="nil"/>
+                <w:bottom w:val="nil"/>
+                <w:right w:val="nil"/>
+                <w:between w:val="nil"/>
+              </w:pBdr>
+              <w:rPr>
+                <w:color w:val="000000"/>
+                <w:sz w:val="16"/>
+                <w:szCs w:val="16"/>
+              </w:rPr>
+            </w:pPr>
+          </w:p>
+        </w:tc>
+        <w:tc>
+          <w:tcPr>
+            <w:tcW w:w="720" w:type="dxa"/>
+            <w:tcBorders>
+              <w:top w:val="single" w:sz="8" w:space="0" w:color="000000"/>
+              <w:left w:val="single" w:sz="8" w:space="0" w:color="000000"/>
+              <w:bottom w:val="single" w:sz="8" w:space="0" w:color="000000"/>
+              <w:right w:val="single" w:sz="8" w:space="0" w:color="000000"/>
+            </w:tcBorders>
+          </w:tcPr>
+          <w:p>
+            <w:pPr>
+              <w:pBdr>
+                <w:top w:val="nil"/>
+                <w:left w:val="nil"/>
+                <w:bottom w:val="nil"/>
+                <w:right w:val="nil"/>
+                <w:between w:val="nil"/>
+              </w:pBdr>
+              <w:rPr>
+                <w:color w:val="000000"/>
+                <w:sz w:val="16"/>
+                <w:szCs w:val="16"/>
+              </w:rPr>
+            </w:pPr>
+          </w:p>
+        </w:tc>
+        <w:tc>
+          <w:tcPr>
+            <w:tcW w:w="1642" w:type="dxa"/>
+            <w:gridSpan w:val="2"/>
+            <w:tcBorders>
+              <w:top w:val="single" w:sz="8" w:space="0" w:color="000000"/>
+              <w:left w:val="single" w:sz="8" w:space="0" w:color="000000"/>
+              <w:bottom w:val="single" w:sz="8" w:space="0" w:color="000000"/>
+              <w:right w:val="single" w:sz="8" w:space="0" w:color="000000"/>
+            </w:tcBorders>
+          </w:tcPr>
+          <w:p>
+            <w:pPr>
+              <w:pBdr>
+                <w:top w:val="nil"/>
+                <w:left w:val="nil"/>
+                <w:bottom w:val="nil"/>
+                <w:right w:val="nil"/>
+                <w:between w:val="nil"/>
+              </w:pBdr>
+              <w:rPr>
+                <w:color w:val="000000"/>
+                <w:sz w:val="16"/>
+                <w:szCs w:val="16"/>
+              </w:rPr>
+            </w:pPr>
+          </w:p>
+        </w:tc>
+        <w:tc>
+          <w:tcPr>
+            <w:tcW w:w="5903" w:type="dxa"/>
+            <w:gridSpan w:val="3"/>
+            <w:tcBorders>
+              <w:top w:val="single" w:sz="8" w:space="0" w:color="000000"/>
+              <w:left w:val="single" w:sz="8" w:space="0" w:color="000000"/>
+              <w:bottom w:val="single" w:sz="8" w:space="0" w:color="000000"/>
+              <w:right w:val="single" w:sz="8" w:space="0" w:color="000000"/>
+            </w:tcBorders>
+          </w:tcPr>
+          <w:p>
+            <w:pPr>
+              <w:pBdr>
+                <w:top w:val="nil"/>
+                <w:left w:val="nil"/>
+                <w:bottom w:val="nil"/>
+                <w:right w:val="nil"/>
+                <w:between w:val="nil"/>
+              </w:pBdr>
+              <w:rPr>
+                <w:color w:val="000000"/>
+                <w:sz w:val="16"/>
+                <w:szCs w:val="16"/>
+              </w:rPr>
+            </w:pPr>
+          </w:p>
+        </w:tc>
+      </w:tr>
+      <w:tr>
+        <w:trPr>
+          <w:trHeight w:val="230"/>
+        </w:trPr>
+        <w:tc>
+          <w:tcPr>
+            <w:tcW w:w="635" w:type="dxa"/>
+            <w:tcBorders>
+              <w:top w:val="single" w:sz="8" w:space="0" w:color="000000"/>
+              <w:left w:val="single" w:sz="8" w:space="0" w:color="000000"/>
+              <w:bottom w:val="single" w:sz="8" w:space="0" w:color="000000"/>
+              <w:right w:val="single" w:sz="8" w:space="0" w:color="000000"/>
+            </w:tcBorders>
+          </w:tcPr>
+          <w:p>
+            <w:pPr>
+              <w:pBdr>
+                <w:top w:val="nil"/>
+                <w:left w:val="nil"/>
+                <w:bottom w:val="nil"/>
+                <w:right w:val="nil"/>
+                <w:between w:val="nil"/>
+              </w:pBdr>
+              <w:rPr>
+                <w:color w:val="000000"/>
+                <w:sz w:val="16"/>
+                <w:szCs w:val="16"/>
+              </w:rPr>
+            </w:pPr>
+          </w:p>
+        </w:tc>
+        <w:tc>
+          <w:tcPr>
+            <w:tcW w:w="1465" w:type="dxa"/>
+            <w:tcBorders>
+              <w:top w:val="single" w:sz="8" w:space="0" w:color="000000"/>
+              <w:left w:val="single" w:sz="8" w:space="0" w:color="000000"/>
+              <w:bottom w:val="single" w:sz="8" w:space="0" w:color="000000"/>
+              <w:right w:val="single" w:sz="8" w:space="0" w:color="000000"/>
+            </w:tcBorders>
+          </w:tcPr>
+          <w:p>
+            <w:pPr>
+              <w:pBdr>
+                <w:top w:val="nil"/>
+                <w:left w:val="nil"/>
+                <w:bottom w:val="nil"/>
+                <w:right w:val="nil"/>
+                <w:between w:val="nil"/>
+              </w:pBdr>
+              <w:rPr>
+                <w:color w:val="000000"/>
+                <w:sz w:val="16"/>
+                <w:szCs w:val="16"/>
+              </w:rPr>
+            </w:pPr>
+          </w:p>
+        </w:tc>
+        <w:tc>
+          <w:tcPr>
+            <w:tcW w:w="720" w:type="dxa"/>
+            <w:tcBorders>
+              <w:top w:val="single" w:sz="8" w:space="0" w:color="000000"/>
+              <w:left w:val="single" w:sz="8" w:space="0" w:color="000000"/>
+              <w:bottom w:val="single" w:sz="8" w:space="0" w:color="000000"/>
+              <w:right w:val="single" w:sz="8" w:space="0" w:color="000000"/>
+            </w:tcBorders>
+          </w:tcPr>
+          <w:p>
+            <w:pPr>
+              <w:pBdr>
+                <w:top w:val="nil"/>
+                <w:left w:val="nil"/>
+                <w:bottom w:val="nil"/>
+                <w:right w:val="nil"/>
+                <w:between w:val="nil"/>
+              </w:pBdr>
+              <w:rPr>
+                <w:color w:val="000000"/>
+                <w:sz w:val="16"/>
+                <w:szCs w:val="16"/>
+              </w:rPr>
+            </w:pPr>
+          </w:p>
+        </w:tc>
+        <w:tc>
+          <w:tcPr>
+            <w:tcW w:w="1642" w:type="dxa"/>
+            <w:gridSpan w:val="2"/>
+            <w:tcBorders>
+              <w:top w:val="single" w:sz="8" w:space="0" w:color="000000"/>
+              <w:left w:val="single" w:sz="8" w:space="0" w:color="000000"/>
+              <w:bottom w:val="single" w:sz="8" w:space="0" w:color="000000"/>
+              <w:right w:val="single" w:sz="8" w:space="0" w:color="000000"/>
+            </w:tcBorders>
+          </w:tcPr>
+          <w:p>
+            <w:pPr>
+              <w:pBdr>
+                <w:top w:val="nil"/>
+                <w:left w:val="nil"/>
+                <w:bottom w:val="nil"/>
+                <w:right w:val="nil"/>
+                <w:between w:val="nil"/>
+              </w:pBdr>
+              <w:rPr>
+                <w:color w:val="000000"/>
+                <w:sz w:val="16"/>
+                <w:szCs w:val="16"/>
+              </w:rPr>
+            </w:pPr>
+          </w:p>
+        </w:tc>
+        <w:tc>
+          <w:tcPr>
+            <w:tcW w:w="5903" w:type="dxa"/>
+            <w:gridSpan w:val="3"/>
+            <w:tcBorders>
+              <w:top w:val="single" w:sz="8" w:space="0" w:color="000000"/>
+              <w:left w:val="single" w:sz="8" w:space="0" w:color="000000"/>
+              <w:bottom w:val="single" w:sz="8" w:space="0" w:color="000000"/>
+              <w:right w:val="single" w:sz="8" w:space="0" w:color="000000"/>
+            </w:tcBorders>
+          </w:tcPr>
+          <w:p>
+            <w:pPr>
+              <w:pBdr>
+                <w:top w:val="nil"/>
+                <w:left w:val="nil"/>
+                <w:bottom w:val="nil"/>
+                <w:right w:val="nil"/>
+                <w:between w:val="nil"/>
+              </w:pBdr>
+              <w:rPr>
+                <w:color w:val="000000"/>
+                <w:sz w:val="16"/>
+                <w:szCs w:val="16"/>
+              </w:rPr>
+            </w:pPr>
+          </w:p>
+        </w:tc>
+      </w:tr>
+      <w:tr>
+        <w:trPr>
+          <w:trHeight w:val="230"/>
+        </w:trPr>
+        <w:tc>
+          <w:tcPr>
+            <w:tcW w:w="635" w:type="dxa"/>
+            <w:tcBorders>
+              <w:top w:val="single" w:sz="8" w:space="0" w:color="000000"/>
+              <w:left w:val="single" w:sz="8" w:space="0" w:color="000000"/>
+              <w:bottom w:val="single" w:sz="8" w:space="0" w:color="000000"/>
+              <w:right w:val="single" w:sz="8" w:space="0" w:color="000000"/>
+            </w:tcBorders>
+          </w:tcPr>
+          <w:p>
+            <w:pPr>
+              <w:pBdr>
+                <w:top w:val="nil"/>
+                <w:left w:val="nil"/>
+                <w:bottom w:val="nil"/>
+                <w:right w:val="nil"/>
+                <w:between w:val="nil"/>
+              </w:pBdr>
+              <w:rPr>
+                <w:color w:val="000000"/>
+                <w:sz w:val="16"/>
+                <w:szCs w:val="16"/>
+              </w:rPr>
+            </w:pPr>
+          </w:p>
+        </w:tc>
+        <w:tc>
+          <w:tcPr>
+            <w:tcW w:w="1465" w:type="dxa"/>
+            <w:tcBorders>
+              <w:top w:val="single" w:sz="8" w:space="0" w:color="000000"/>
+              <w:left w:val="single" w:sz="8" w:space="0" w:color="000000"/>
+              <w:bottom w:val="single" w:sz="8" w:space="0" w:color="000000"/>
+              <w:right w:val="single" w:sz="8" w:space="0" w:color="000000"/>
+            </w:tcBorders>
+          </w:tcPr>
+          <w:p>
+            <w:pPr>
+              <w:pBdr>
+                <w:top w:val="nil"/>
+                <w:left w:val="nil"/>
+                <w:bottom w:val="nil"/>
+                <w:right w:val="nil"/>
+                <w:between w:val="nil"/>
+              </w:pBdr>
+              <w:rPr>
+                <w:color w:val="000000"/>
+                <w:sz w:val="16"/>
+                <w:szCs w:val="16"/>
+              </w:rPr>
+            </w:pPr>
+          </w:p>
+        </w:tc>
+        <w:tc>
+          <w:tcPr>
+            <w:tcW w:w="720" w:type="dxa"/>
+            <w:tcBorders>
+              <w:top w:val="single" w:sz="8" w:space="0" w:color="000000"/>
+              <w:left w:val="single" w:sz="8" w:space="0" w:color="000000"/>
+              <w:bottom w:val="single" w:sz="8" w:space="0" w:color="000000"/>
+              <w:right w:val="single" w:sz="8" w:space="0" w:color="000000"/>
+            </w:tcBorders>
+          </w:tcPr>
+          <w:p>
+            <w:pPr>
+              <w:pBdr>
+                <w:top w:val="nil"/>
+                <w:left w:val="nil"/>
+                <w:bottom w:val="nil"/>
+                <w:right w:val="nil"/>
+                <w:between w:val="nil"/>
+              </w:pBdr>
+              <w:rPr>
+                <w:color w:val="000000"/>
+                <w:sz w:val="16"/>
+                <w:szCs w:val="16"/>
+              </w:rPr>
+            </w:pPr>
+          </w:p>
+        </w:tc>
+        <w:tc>
+          <w:tcPr>
+            <w:tcW w:w="1642" w:type="dxa"/>
+            <w:gridSpan w:val="2"/>
+            <w:tcBorders>
+              <w:top w:val="single" w:sz="8" w:space="0" w:color="000000"/>
+              <w:left w:val="single" w:sz="8" w:space="0" w:color="000000"/>
+              <w:bottom w:val="single" w:sz="8" w:space="0" w:color="000000"/>
+              <w:right w:val="single" w:sz="8" w:space="0" w:color="000000"/>
+            </w:tcBorders>
+          </w:tcPr>
+          <w:p>
+            <w:pPr>
+              <w:pBdr>
+                <w:top w:val="nil"/>
+                <w:left w:val="nil"/>
+                <w:bottom w:val="nil"/>
+                <w:right w:val="nil"/>
+                <w:between w:val="nil"/>
+              </w:pBdr>
+              <w:rPr>
+                <w:color w:val="000000"/>
+                <w:sz w:val="16"/>
+                <w:szCs w:val="16"/>
+              </w:rPr>
+            </w:pPr>
+          </w:p>
+        </w:tc>
+        <w:tc>
+          <w:tcPr>
+            <w:tcW w:w="5903" w:type="dxa"/>
+            <w:gridSpan w:val="3"/>
+            <w:tcBorders>
+              <w:top w:val="single" w:sz="8" w:space="0" w:color="000000"/>
+              <w:left w:val="single" w:sz="8" w:space="0" w:color="000000"/>
+              <w:bottom w:val="single" w:sz="8" w:space="0" w:color="000000"/>
+              <w:right w:val="single" w:sz="8" w:space="0" w:color="000000"/>
+            </w:tcBorders>
+          </w:tcPr>
+          <w:p>
+            <w:pPr>
+              <w:pBdr>
+                <w:top w:val="nil"/>
+                <w:left w:val="nil"/>
+                <w:bottom w:val="nil"/>
+                <w:right w:val="nil"/>
+                <w:between w:val="nil"/>
+              </w:pBdr>
+              <w:rPr>
+                <w:color w:val="000000"/>
+                <w:sz w:val="16"/>
+                <w:szCs w:val="16"/>
+              </w:rPr>
+            </w:pPr>
+          </w:p>
+        </w:tc>
+      </w:tr>
+      <w:tr>
+        <w:trPr>
+          <w:trHeight w:val="230"/>
+        </w:trPr>
+        <w:tc>
+          <w:tcPr>
+            <w:tcW w:w="635" w:type="dxa"/>
+            <w:tcBorders>
+              <w:top w:val="single" w:sz="8" w:space="0" w:color="000000"/>
+              <w:left w:val="single" w:sz="8" w:space="0" w:color="000000"/>
+              <w:bottom w:val="single" w:sz="8" w:space="0" w:color="000000"/>
+              <w:right w:val="single" w:sz="8" w:space="0" w:color="000000"/>
+            </w:tcBorders>
+          </w:tcPr>
+          <w:p>
+            <w:pPr>
+              <w:pBdr>
+                <w:top w:val="nil"/>
+                <w:left w:val="nil"/>
+                <w:bottom w:val="nil"/>
+                <w:right w:val="nil"/>
+                <w:between w:val="nil"/>
+              </w:pBdr>
+              <w:rPr>
+                <w:color w:val="000000"/>
+                <w:sz w:val="16"/>
+                <w:szCs w:val="16"/>
+              </w:rPr>
+            </w:pPr>
+          </w:p>
+        </w:tc>
+        <w:tc>
+          <w:tcPr>
+            <w:tcW w:w="1465" w:type="dxa"/>
+            <w:tcBorders>
+              <w:top w:val="single" w:sz="8" w:space="0" w:color="000000"/>
+              <w:left w:val="single" w:sz="8" w:space="0" w:color="000000"/>
+              <w:bottom w:val="single" w:sz="8" w:space="0" w:color="000000"/>
+              <w:right w:val="single" w:sz="8" w:space="0" w:color="000000"/>
+            </w:tcBorders>
+          </w:tcPr>
+          <w:p>
+            <w:pPr>
+              <w:pBdr>
+                <w:top w:val="nil"/>
+                <w:left w:val="nil"/>
+                <w:bottom w:val="nil"/>
+                <w:right w:val="nil"/>
+                <w:between w:val="nil"/>
+              </w:pBdr>
+              <w:rPr>
+                <w:color w:val="000000"/>
+                <w:sz w:val="16"/>
+                <w:szCs w:val="16"/>
+              </w:rPr>
+            </w:pPr>
+          </w:p>
+        </w:tc>
+        <w:tc>
+          <w:tcPr>
+            <w:tcW w:w="720" w:type="dxa"/>
+            <w:tcBorders>
+              <w:top w:val="single" w:sz="8" w:space="0" w:color="000000"/>
+              <w:left w:val="single" w:sz="8" w:space="0" w:color="000000"/>
+              <w:bottom w:val="single" w:sz="8" w:space="0" w:color="000000"/>
+              <w:right w:val="single" w:sz="8" w:space="0" w:color="000000"/>
+            </w:tcBorders>
+          </w:tcPr>
+          <w:p>
+            <w:pPr>
+              <w:pBdr>
+                <w:top w:val="nil"/>
+                <w:left w:val="nil"/>
+                <w:bottom w:val="nil"/>
+                <w:right w:val="nil"/>
+                <w:between w:val="nil"/>
+              </w:pBdr>
+              <w:rPr>
+                <w:color w:val="000000"/>
+                <w:sz w:val="16"/>
+                <w:szCs w:val="16"/>
+              </w:rPr>
+            </w:pPr>
+          </w:p>
+        </w:tc>
+        <w:tc>
+          <w:tcPr>
+            <w:tcW w:w="1642" w:type="dxa"/>
+            <w:gridSpan w:val="2"/>
+            <w:tcBorders>
+              <w:top w:val="single" w:sz="8" w:space="0" w:color="000000"/>
+              <w:left w:val="single" w:sz="8" w:space="0" w:color="000000"/>
+              <w:bottom w:val="single" w:sz="8" w:space="0" w:color="000000"/>
+              <w:right w:val="single" w:sz="8" w:space="0" w:color="000000"/>
+            </w:tcBorders>
+          </w:tcPr>
+          <w:p>
+            <w:pPr>
+              <w:pBdr>
+                <w:top w:val="nil"/>
+                <w:left w:val="nil"/>
+                <w:bottom w:val="nil"/>
+                <w:right w:val="nil"/>
+                <w:between w:val="nil"/>
+              </w:pBdr>
+              <w:rPr>
+                <w:color w:val="000000"/>
+                <w:sz w:val="16"/>
+                <w:szCs w:val="16"/>
+              </w:rPr>
+            </w:pPr>
+          </w:p>
+        </w:tc>
+        <w:tc>
+          <w:tcPr>
+            <w:tcW w:w="5903" w:type="dxa"/>
+            <w:gridSpan w:val="3"/>
+            <w:tcBorders>
+              <w:top w:val="single" w:sz="8" w:space="0" w:color="000000"/>
+              <w:left w:val="single" w:sz="8" w:space="0" w:color="000000"/>
+              <w:bottom w:val="single" w:sz="8" w:space="0" w:color="000000"/>
+              <w:right w:val="single" w:sz="8" w:space="0" w:color="000000"/>
+            </w:tcBorders>
+          </w:tcPr>
+          <w:p>
+            <w:pPr>
+              <w:pBdr>
+                <w:top w:val="nil"/>
+                <w:left w:val="nil"/>
+                <w:bottom w:val="nil"/>
+                <w:right w:val="nil"/>
+                <w:between w:val="nil"/>
+              </w:pBdr>
+              <w:rPr>
+                <w:color w:val="000000"/>
+                <w:sz w:val="16"/>
+                <w:szCs w:val="16"/>
+              </w:rPr>
+            </w:pPr>
+          </w:p>
+        </w:tc>
+      </w:tr>
+      <w:tr>
+        <w:trPr>
+          <w:trHeight w:val="230"/>
+        </w:trPr>
+        <w:tc>
+          <w:tcPr>
+            <w:tcW w:w="635" w:type="dxa"/>
+            <w:tcBorders>
+              <w:top w:val="single" w:sz="8" w:space="0" w:color="000000"/>
+              <w:left w:val="single" w:sz="8" w:space="0" w:color="000000"/>
+              <w:bottom w:val="single" w:sz="8" w:space="0" w:color="000000"/>
+              <w:right w:val="single" w:sz="8" w:space="0" w:color="000000"/>
+            </w:tcBorders>
+          </w:tcPr>
+          <w:p>
+            <w:pPr>
+              <w:pBdr>
+                <w:top w:val="nil"/>
+                <w:left w:val="nil"/>
+                <w:bottom w:val="nil"/>
+                <w:right w:val="nil"/>
+                <w:between w:val="nil"/>
+              </w:pBdr>
+              <w:rPr>
+                <w:color w:val="000000"/>
+                <w:sz w:val="16"/>
+                <w:szCs w:val="16"/>
+              </w:rPr>
+            </w:pPr>
+          </w:p>
+        </w:tc>
+        <w:tc>
+          <w:tcPr>
+            <w:tcW w:w="1465" w:type="dxa"/>
+            <w:tcBorders>
+              <w:top w:val="single" w:sz="8" w:space="0" w:color="000000"/>
+              <w:left w:val="single" w:sz="8" w:space="0" w:color="000000"/>
+              <w:bottom w:val="single" w:sz="8" w:space="0" w:color="000000"/>
+              <w:right w:val="single" w:sz="8" w:space="0" w:color="000000"/>
+            </w:tcBorders>
+          </w:tcPr>
+          <w:p>
+            <w:pPr>
+              <w:pBdr>
+                <w:top w:val="nil"/>
+                <w:left w:val="nil"/>
+                <w:bottom w:val="nil"/>
+                <w:right w:val="nil"/>
+                <w:between w:val="nil"/>
+              </w:pBdr>
+              <w:rPr>
+                <w:color w:val="000000"/>
+                <w:sz w:val="16"/>
+                <w:szCs w:val="16"/>
+              </w:rPr>
+            </w:pPr>
+          </w:p>
+        </w:tc>
+        <w:tc>
+          <w:tcPr>
+            <w:tcW w:w="720" w:type="dxa"/>
+            <w:tcBorders>
+              <w:top w:val="single" w:sz="8" w:space="0" w:color="000000"/>
+              <w:left w:val="single" w:sz="8" w:space="0" w:color="000000"/>
+              <w:bottom w:val="single" w:sz="8" w:space="0" w:color="000000"/>
+              <w:right w:val="single" w:sz="8" w:space="0" w:color="000000"/>
+            </w:tcBorders>
+          </w:tcPr>
+          <w:p>
+            <w:pPr>
+              <w:pBdr>
+                <w:top w:val="nil"/>
+                <w:left w:val="nil"/>
+                <w:bottom w:val="nil"/>
+                <w:right w:val="nil"/>
+                <w:between w:val="nil"/>
+              </w:pBdr>
+              <w:rPr>
+                <w:color w:val="000000"/>
+                <w:sz w:val="16"/>
+                <w:szCs w:val="16"/>
+              </w:rPr>
+            </w:pPr>
+          </w:p>
+        </w:tc>
+        <w:tc>
+          <w:tcPr>
+            <w:tcW w:w="1642" w:type="dxa"/>
+            <w:gridSpan w:val="2"/>
+            <w:tcBorders>
+              <w:top w:val="single" w:sz="8" w:space="0" w:color="000000"/>
+              <w:left w:val="single" w:sz="8" w:space="0" w:color="000000"/>
+              <w:bottom w:val="single" w:sz="8" w:space="0" w:color="000000"/>
+              <w:right w:val="single" w:sz="8" w:space="0" w:color="000000"/>
+            </w:tcBorders>
+          </w:tcPr>
+          <w:p>
+            <w:pPr>
+              <w:pBdr>
+                <w:top w:val="nil"/>
+                <w:left w:val="nil"/>
+                <w:bottom w:val="nil"/>
+                <w:right w:val="nil"/>
+                <w:between w:val="nil"/>
+              </w:pBdr>
+              <w:rPr>
+                <w:color w:val="000000"/>
+                <w:sz w:val="16"/>
+                <w:szCs w:val="16"/>
+              </w:rPr>
+            </w:pPr>
+          </w:p>
+        </w:tc>
+        <w:tc>
+          <w:tcPr>
+            <w:tcW w:w="5903" w:type="dxa"/>
+            <w:gridSpan w:val="3"/>
+            <w:tcBorders>
+              <w:top w:val="single" w:sz="8" w:space="0" w:color="000000"/>
+              <w:left w:val="single" w:sz="8" w:space="0" w:color="000000"/>
+              <w:bottom w:val="single" w:sz="8" w:space="0" w:color="000000"/>
+              <w:right w:val="single" w:sz="8" w:space="0" w:color="000000"/>
+            </w:tcBorders>
+          </w:tcPr>
+          <w:p>
+            <w:pPr>
+              <w:pBdr>
+                <w:top w:val="nil"/>
+                <w:left w:val="nil"/>
+                <w:bottom w:val="nil"/>
+                <w:right w:val="nil"/>
+                <w:between w:val="nil"/>
+              </w:pBdr>
+              <w:rPr>
+                <w:color w:val="000000"/>
+                <w:sz w:val="16"/>
+                <w:szCs w:val="16"/>
+              </w:rPr>
+            </w:pPr>
+          </w:p>
+        </w:tc>
+      </w:tr>
+      <w:tr>
+        <w:trPr>
+          <w:trHeight w:val="230"/>
+        </w:trPr>
+        <w:tc>
+          <w:tcPr>
+            <w:tcW w:w="635" w:type="dxa"/>
+            <w:tcBorders>
+              <w:top w:val="single" w:sz="8" w:space="0" w:color="000000"/>
+              <w:left w:val="single" w:sz="8" w:space="0" w:color="000000"/>
+              <w:bottom w:val="single" w:sz="8" w:space="0" w:color="000000"/>
+              <w:right w:val="single" w:sz="8" w:space="0" w:color="000000"/>
+            </w:tcBorders>
+          </w:tcPr>
+          <w:p>
+            <w:pPr>
+              <w:pBdr>
+                <w:top w:val="nil"/>
+                <w:left w:val="nil"/>
+                <w:bottom w:val="nil"/>
+                <w:right w:val="nil"/>
+                <w:between w:val="nil"/>
+              </w:pBdr>
+              <w:rPr>
+                <w:color w:val="000000"/>
+                <w:sz w:val="16"/>
+                <w:szCs w:val="16"/>
+              </w:rPr>
+            </w:pPr>
+          </w:p>
+        </w:tc>
+        <w:tc>
+          <w:tcPr>
+            <w:tcW w:w="1465" w:type="dxa"/>
+            <w:tcBorders>
+              <w:top w:val="single" w:sz="8" w:space="0" w:color="000000"/>
+              <w:left w:val="single" w:sz="8" w:space="0" w:color="000000"/>
+              <w:bottom w:val="single" w:sz="8" w:space="0" w:color="000000"/>
+              <w:right w:val="single" w:sz="8" w:space="0" w:color="000000"/>
+            </w:tcBorders>
+          </w:tcPr>
+          <w:p>
+            <w:pPr>
+              <w:pBdr>
+                <w:top w:val="nil"/>
+                <w:left w:val="nil"/>
+                <w:bottom w:val="nil"/>
+                <w:right w:val="nil"/>
+                <w:between w:val="nil"/>
+              </w:pBdr>
+              <w:rPr>
+                <w:color w:val="000000"/>
+                <w:sz w:val="16"/>
+                <w:szCs w:val="16"/>
+              </w:rPr>
+            </w:pPr>
+          </w:p>
+        </w:tc>
+        <w:tc>
+          <w:tcPr>
+            <w:tcW w:w="720" w:type="dxa"/>
+            <w:tcBorders>
+              <w:top w:val="single" w:sz="8" w:space="0" w:color="000000"/>
+              <w:left w:val="single" w:sz="8" w:space="0" w:color="000000"/>
+              <w:bottom w:val="single" w:sz="8" w:space="0" w:color="000000"/>
+              <w:right w:val="single" w:sz="8" w:space="0" w:color="000000"/>
+            </w:tcBorders>
+          </w:tcPr>
+          <w:p>
+            <w:pPr>
+              <w:pBdr>
+                <w:top w:val="nil"/>
+                <w:left w:val="nil"/>
+                <w:bottom w:val="nil"/>
+                <w:right w:val="nil"/>
+                <w:between w:val="nil"/>
+              </w:pBdr>
+              <w:rPr>
+                <w:color w:val="000000"/>
+                <w:sz w:val="16"/>
+                <w:szCs w:val="16"/>
+              </w:rPr>
+            </w:pPr>
+          </w:p>
+        </w:tc>
+        <w:tc>
+          <w:tcPr>
+            <w:tcW w:w="1642" w:type="dxa"/>
+            <w:gridSpan w:val="2"/>
+            <w:tcBorders>
+              <w:top w:val="single" w:sz="8" w:space="0" w:color="000000"/>
+              <w:left w:val="single" w:sz="8" w:space="0" w:color="000000"/>
+              <w:bottom w:val="single" w:sz="8" w:space="0" w:color="000000"/>
+              <w:right w:val="single" w:sz="8" w:space="0" w:color="000000"/>
+            </w:tcBorders>
+          </w:tcPr>
+          <w:p>
+            <w:pPr>
+              <w:pBdr>
+                <w:top w:val="nil"/>
+                <w:left w:val="nil"/>
+                <w:bottom w:val="nil"/>
+                <w:right w:val="nil"/>
+                <w:between w:val="nil"/>
+              </w:pBdr>
+              <w:rPr>
+                <w:color w:val="000000"/>
+                <w:sz w:val="16"/>
+                <w:szCs w:val="16"/>
+              </w:rPr>
+            </w:pPr>
+          </w:p>
+        </w:tc>
+        <w:tc>
+          <w:tcPr>
+            <w:tcW w:w="5903" w:type="dxa"/>
+            <w:gridSpan w:val="3"/>
+            <w:tcBorders>
+              <w:top w:val="single" w:sz="8" w:space="0" w:color="000000"/>
+              <w:left w:val="single" w:sz="8" w:space="0" w:color="000000"/>
+              <w:bottom w:val="single" w:sz="8" w:space="0" w:color="000000"/>
+              <w:right w:val="single" w:sz="8" w:space="0" w:color="000000"/>
+            </w:tcBorders>
+          </w:tcPr>
+          <w:p>
+            <w:pPr>
+              <w:pBdr>
+                <w:top w:val="nil"/>
+                <w:left w:val="nil"/>
+                <w:bottom w:val="nil"/>
+                <w:right w:val="nil"/>
+                <w:between w:val="nil"/>
+              </w:pBdr>
+              <w:rPr>
+                <w:color w:val="000000"/>
+                <w:sz w:val="16"/>
+                <w:szCs w:val="16"/>
+              </w:rPr>
+            </w:pPr>
+          </w:p>
+        </w:tc>
+      </w:tr>
+      <w:tr>
+        <w:trPr>
+          <w:trHeight w:val="230"/>
+        </w:trPr>
+        <w:tc>
+          <w:tcPr>
+            <w:tcW w:w="635" w:type="dxa"/>
+            <w:tcBorders>
+              <w:top w:val="single" w:sz="8" w:space="0" w:color="000000"/>
+              <w:left w:val="single" w:sz="8" w:space="0" w:color="000000"/>
+              <w:bottom w:val="single" w:sz="8" w:space="0" w:color="000000"/>
+              <w:right w:val="single" w:sz="8" w:space="0" w:color="000000"/>
+            </w:tcBorders>
+          </w:tcPr>
+          <w:p>
+            <w:pPr>
+              <w:pBdr>
+                <w:top w:val="nil"/>
+                <w:left w:val="nil"/>
+                <w:bottom w:val="nil"/>
+                <w:right w:val="nil"/>
+                <w:between w:val="nil"/>
+              </w:pBdr>
+              <w:rPr>
+                <w:color w:val="000000"/>
+                <w:sz w:val="16"/>
+                <w:szCs w:val="16"/>
+              </w:rPr>
+            </w:pPr>
+          </w:p>
+        </w:tc>
+        <w:tc>
+          <w:tcPr>
+            <w:tcW w:w="1465" w:type="dxa"/>
+            <w:tcBorders>
+              <w:top w:val="single" w:sz="8" w:space="0" w:color="000000"/>
+              <w:left w:val="single" w:sz="8" w:space="0" w:color="000000"/>
+              <w:bottom w:val="single" w:sz="8" w:space="0" w:color="000000"/>
+              <w:right w:val="single" w:sz="8" w:space="0" w:color="000000"/>
+            </w:tcBorders>
+          </w:tcPr>
+          <w:p>
+            <w:pPr>
+              <w:pBdr>
+                <w:top w:val="nil"/>
+                <w:left w:val="nil"/>
+                <w:bottom w:val="nil"/>
+                <w:right w:val="nil"/>
+                <w:between w:val="nil"/>
+              </w:pBdr>
+              <w:rPr>
+                <w:color w:val="000000"/>
+                <w:sz w:val="16"/>
+                <w:szCs w:val="16"/>
+              </w:rPr>
+            </w:pPr>
+          </w:p>
+        </w:tc>
+        <w:tc>
+          <w:tcPr>
+            <w:tcW w:w="720" w:type="dxa"/>
+            <w:tcBorders>
+              <w:top w:val="single" w:sz="8" w:space="0" w:color="000000"/>
+              <w:left w:val="single" w:sz="8" w:space="0" w:color="000000"/>
+              <w:bottom w:val="single" w:sz="8" w:space="0" w:color="000000"/>
+              <w:right w:val="single" w:sz="8" w:space="0" w:color="000000"/>
+            </w:tcBorders>
+          </w:tcPr>
+          <w:p>
+            <w:pPr>
+              <w:pBdr>
+                <w:top w:val="nil"/>
+                <w:left w:val="nil"/>
+                <w:bottom w:val="nil"/>
+                <w:right w:val="nil"/>
+                <w:between w:val="nil"/>
+              </w:pBdr>
+              <w:rPr>
+                <w:color w:val="000000"/>
+                <w:sz w:val="16"/>
+                <w:szCs w:val="16"/>
+              </w:rPr>
+            </w:pPr>
+          </w:p>
+        </w:tc>
+        <w:tc>
+          <w:tcPr>
+            <w:tcW w:w="1642" w:type="dxa"/>
+            <w:gridSpan w:val="2"/>
+            <w:tcBorders>
+              <w:top w:val="single" w:sz="8" w:space="0" w:color="000000"/>
+              <w:left w:val="single" w:sz="8" w:space="0" w:color="000000"/>
+              <w:bottom w:val="single" w:sz="8" w:space="0" w:color="000000"/>
+              <w:right w:val="single" w:sz="8" w:space="0" w:color="000000"/>
+            </w:tcBorders>
+          </w:tcPr>
+          <w:p>
+            <w:pPr>
+              <w:pBdr>
+                <w:top w:val="nil"/>
+                <w:left w:val="nil"/>
+                <w:bottom w:val="nil"/>
+                <w:right w:val="nil"/>
+                <w:between w:val="nil"/>
+              </w:pBdr>
+              <w:rPr>
+                <w:color w:val="000000"/>
+                <w:sz w:val="16"/>
+                <w:szCs w:val="16"/>
+              </w:rPr>
+            </w:pPr>
+          </w:p>
+        </w:tc>
+        <w:tc>
+          <w:tcPr>
+            <w:tcW w:w="5903" w:type="dxa"/>
+            <w:gridSpan w:val="3"/>
+            <w:tcBorders>
+              <w:top w:val="single" w:sz="8" w:space="0" w:color="000000"/>
+              <w:left w:val="single" w:sz="8" w:space="0" w:color="000000"/>
+              <w:bottom w:val="single" w:sz="8" w:space="0" w:color="000000"/>
+              <w:right w:val="single" w:sz="8" w:space="0" w:color="000000"/>
+            </w:tcBorders>
+          </w:tcPr>
+          <w:p>
+            <w:pPr>
+              <w:pBdr>
+                <w:top w:val="nil"/>
+                <w:left w:val="nil"/>
+                <w:bottom w:val="nil"/>
+                <w:right w:val="nil"/>
+                <w:between w:val="nil"/>
+              </w:pBdr>
+              <w:rPr>
+                <w:color w:val="000000"/>
+                <w:sz w:val="16"/>
+                <w:szCs w:val="16"/>
+              </w:rPr>
+            </w:pPr>
+          </w:p>
+        </w:tc>
+      </w:tr>
+      <w:tr>
+        <w:trPr>
+          <w:trHeight w:val="230"/>
+        </w:trPr>
+        <w:tc>
+          <w:tcPr>
+            <w:tcW w:w="635" w:type="dxa"/>
+            <w:tcBorders>
+              <w:top w:val="single" w:sz="8" w:space="0" w:color="000000"/>
+              <w:left w:val="single" w:sz="8" w:space="0" w:color="000000"/>
+              <w:bottom w:val="single" w:sz="8" w:space="0" w:color="000000"/>
+              <w:right w:val="single" w:sz="8" w:space="0" w:color="000000"/>
+            </w:tcBorders>
+          </w:tcPr>
+          <w:p>
+            <w:pPr>
+              <w:pBdr>
+                <w:top w:val="nil"/>
+                <w:left w:val="nil"/>
+                <w:bottom w:val="nil"/>
+                <w:right w:val="nil"/>
+                <w:between w:val="nil"/>
+              </w:pBdr>
+              <w:rPr>
+                <w:color w:val="000000"/>
+                <w:sz w:val="16"/>
+                <w:szCs w:val="16"/>
+              </w:rPr>
+            </w:pPr>
+          </w:p>
+        </w:tc>
+        <w:tc>
+          <w:tcPr>
+            <w:tcW w:w="1465" w:type="dxa"/>
+            <w:tcBorders>
+              <w:top w:val="single" w:sz="8" w:space="0" w:color="000000"/>
+              <w:left w:val="single" w:sz="8" w:space="0" w:color="000000"/>
+              <w:bottom w:val="single" w:sz="8" w:space="0" w:color="000000"/>
+              <w:right w:val="single" w:sz="8" w:space="0" w:color="000000"/>
+            </w:tcBorders>
+          </w:tcPr>
+          <w:p>
+            <w:pPr>
+              <w:pBdr>
+                <w:top w:val="nil"/>
+                <w:left w:val="nil"/>
+                <w:bottom w:val="nil"/>
+                <w:right w:val="nil"/>
+                <w:between w:val="nil"/>
+              </w:pBdr>
+              <w:rPr>
+                <w:color w:val="000000"/>
+                <w:sz w:val="16"/>
+                <w:szCs w:val="16"/>
+              </w:rPr>
+            </w:pPr>
+          </w:p>
+        </w:tc>
+        <w:tc>
+          <w:tcPr>
+            <w:tcW w:w="720" w:type="dxa"/>
+            <w:tcBorders>
+              <w:top w:val="single" w:sz="8" w:space="0" w:color="000000"/>
+              <w:left w:val="single" w:sz="8" w:space="0" w:color="000000"/>
+              <w:bottom w:val="single" w:sz="8" w:space="0" w:color="000000"/>
+              <w:right w:val="single" w:sz="8" w:space="0" w:color="000000"/>
+            </w:tcBorders>
+          </w:tcPr>
+          <w:p>
+            <w:pPr>
+              <w:pBdr>
+                <w:top w:val="nil"/>
+                <w:left w:val="nil"/>
+                <w:bottom w:val="nil"/>
+                <w:right w:val="nil"/>
+                <w:between w:val="nil"/>
+              </w:pBdr>
+              <w:rPr>
+                <w:color w:val="000000"/>
+                <w:sz w:val="16"/>
+                <w:szCs w:val="16"/>
+              </w:rPr>
+            </w:pPr>
+          </w:p>
+        </w:tc>
+        <w:tc>
+          <w:tcPr>
+            <w:tcW w:w="1642" w:type="dxa"/>
+            <w:gridSpan w:val="2"/>
+            <w:tcBorders>
+              <w:top w:val="single" w:sz="8" w:space="0" w:color="000000"/>
+              <w:left w:val="single" w:sz="8" w:space="0" w:color="000000"/>
+              <w:bottom w:val="single" w:sz="8" w:space="0" w:color="000000"/>
+              <w:right w:val="single" w:sz="8" w:space="0" w:color="000000"/>
+            </w:tcBorders>
+          </w:tcPr>
+          <w:p>
+            <w:pPr>
+              <w:pBdr>
+                <w:top w:val="nil"/>
+                <w:left w:val="nil"/>
+                <w:bottom w:val="nil"/>
+                <w:right w:val="nil"/>
+                <w:between w:val="nil"/>
+              </w:pBdr>
+              <w:rPr>
+                <w:color w:val="000000"/>
+                <w:sz w:val="16"/>
+                <w:szCs w:val="16"/>
+              </w:rPr>
+            </w:pPr>
+          </w:p>
+        </w:tc>
+        <w:tc>
+          <w:tcPr>
+            <w:tcW w:w="5903" w:type="dxa"/>
+            <w:gridSpan w:val="3"/>
+            <w:tcBorders>
+              <w:top w:val="single" w:sz="8" w:space="0" w:color="000000"/>
+              <w:left w:val="single" w:sz="8" w:space="0" w:color="000000"/>
+              <w:bottom w:val="single" w:sz="8" w:space="0" w:color="000000"/>
+              <w:right w:val="single" w:sz="8" w:space="0" w:color="000000"/>
+            </w:tcBorders>
+          </w:tcPr>
+          <w:p>
+            <w:pPr>
+              <w:pBdr>
+                <w:top w:val="nil"/>
+                <w:left w:val="nil"/>
+                <w:bottom w:val="nil"/>
+                <w:right w:val="nil"/>
+                <w:between w:val="nil"/>
+              </w:pBdr>
+              <w:rPr>
+                <w:color w:val="000000"/>
+                <w:sz w:val="16"/>
+                <w:szCs w:val="16"/>
+              </w:rPr>
+            </w:pPr>
+          </w:p>
+        </w:tc>
+      </w:tr>
+      <w:tr>
+        <w:trPr>
+          <w:trHeight w:val="230"/>
+        </w:trPr>
+        <w:tc>
+          <w:tcPr>
+            <w:tcW w:w="10365" w:type="dxa"/>
+            <w:gridSpan w:val="8"/>
+            <w:tcBorders>
+              <w:top w:val="single" w:sz="8" w:space="0" w:color="000000"/>
+              <w:left w:val="single" w:sz="8" w:space="0" w:color="000000"/>
+              <w:bottom w:val="single" w:sz="8" w:space="0" w:color="000000"/>
+              <w:right w:val="single" w:sz="8" w:space="0" w:color="000000"/>
+            </w:tcBorders>
+          </w:tcPr>
+          <w:p>
+            <w:pPr>
+              <w:pBdr>
+                <w:top w:val="nil"/>
+                <w:left w:val="nil"/>
+                <w:bottom w:val="nil"/>
+                <w:right w:val="nil"/>
+                <w:between w:val="nil"/>
+              </w:pBdr>
+              <w:ind w:left="107"/>
+              <w:jc w:val="both"/>
+              <w:rPr>
+                <w:b/>
+                <w:color w:val="000000"/>
+                <w:sz w:val="24"/>
+                <w:szCs w:val="24"/>
+              </w:rPr>
+            </w:pPr>
+            <w:r>
+              <w:rPr>
+                <w:b/>
+                <w:color w:val="000000"/>
+                <w:sz w:val="24"/>
+                <w:szCs w:val="24"/>
+              </w:rPr>
+              <w:t>B. CATATAN PENTING HARIAN</w:t>
+            </w:r>
+          </w:p>
+        </w:tc>
+      </w:tr>
+      <w:tr>
+        <w:trPr>
+          <w:trHeight w:val="1838"/>
+        </w:trPr>
+        <w:tc>
+          <w:tcPr>
+            <w:tcW w:w="10365" w:type="dxa"/>
+            <w:gridSpan w:val="8"/>
+            <w:tcBorders>
+              <w:top w:val="single" w:sz="8" w:space="0" w:color="000000"/>
+              <w:left w:val="single" w:sz="8" w:space="0" w:color="000000"/>
+              <w:bottom w:val="single" w:sz="8" w:space="0" w:color="000000"/>
+              <w:right w:val="single" w:sz="8" w:space="0" w:color="000000"/>
+            </w:tcBorders>
+          </w:tcPr>
+          <w:p>
+            <w:pPr>
+              <w:pBdr>
+                <w:top w:val="nil"/>
+                <w:left w:val="nil"/>
+                <w:bottom w:val="nil"/>
+                <w:right w:val="nil"/>
+                <w:between w:val="nil"/>
+              </w:pBdr>
+              <w:spacing w:line="226" w:lineRule="auto"/>
+              <w:ind w:left="107"/>
+              <w:rPr>
+                <w:b/>
+                <w:color w:val="000000"/>
+                <w:sz w:val="20"/>
+                <w:szCs w:val="20"/>
+              </w:rPr>
+            </w:pPr>
+            <w:r>
+              <w:rPr>
+                <w:b/>
+                <w:color w:val="000000"/>
+                <w:sz w:val="20"/>
+                <w:szCs w:val="20"/>
+              </w:rPr>
+              <w:t>1.</w:t>
+            </w:r>
+          </w:p>
+          <w:p>
+            <w:pPr>
+              <w:pBdr>
+                <w:top w:val="nil"/>
+                <w:left w:val="nil"/>
+                <w:bottom w:val="nil"/>
+                <w:right w:val="nil"/>
+                <w:between w:val="nil"/>
+              </w:pBdr>
+              <w:rPr>
+                <w:color w:val="000000"/>
+                <w:sz w:val="20"/>
+                <w:szCs w:val="20"/>
+              </w:rPr>
+            </w:pPr>
+          </w:p>
+          <w:p>
+            <w:pPr>
+              <w:pBdr>
+                <w:top w:val="nil"/>
+                <w:left w:val="nil"/>
+                <w:bottom w:val="nil"/>
+                <w:right w:val="nil"/>
+                <w:between w:val="nil"/>
+              </w:pBdr>
+              <w:spacing w:before="2"/>
+              <w:rPr>
+                <w:color w:val="000000"/>
+                <w:sz w:val="20"/>
+                <w:szCs w:val="20"/>
+              </w:rPr>
+            </w:pPr>
+          </w:p>
+          <w:p>
+            <w:pPr>
+              <w:pBdr>
+                <w:top w:val="nil"/>
+                <w:left w:val="nil"/>
+                <w:bottom w:val="nil"/>
+                <w:right w:val="nil"/>
+                <w:between w:val="nil"/>
+              </w:pBdr>
+              <w:ind w:left="107"/>
+              <w:rPr>
+                <w:b/>
+                <w:color w:val="000000"/>
+                <w:sz w:val="20"/>
+                <w:szCs w:val="20"/>
+              </w:rPr>
+            </w:pPr>
+            <w:r>
+              <w:rPr>
+                <w:b/>
+                <w:color w:val="000000"/>
+                <w:sz w:val="20"/>
+                <w:szCs w:val="20"/>
+              </w:rPr>
+              <w:t>2.</w:t>
+            </w:r>
+          </w:p>
+          <w:p>
+            <w:pPr>
+              <w:pBdr>
+                <w:top w:val="nil"/>
+                <w:left w:val="nil"/>
+                <w:bottom w:val="nil"/>
+                <w:right w:val="nil"/>
+                <w:between w:val="nil"/>
+              </w:pBdr>
+              <w:spacing w:before="228"/>
+              <w:rPr>
+                <w:color w:val="000000"/>
+                <w:sz w:val="20"/>
+                <w:szCs w:val="20"/>
+              </w:rPr>
+            </w:pPr>
+          </w:p>
+          <w:p>
+            <w:pPr>
+              <w:pBdr>
+                <w:top w:val="nil"/>
+                <w:left w:val="nil"/>
+                <w:bottom w:val="nil"/>
+                <w:right w:val="nil"/>
+                <w:between w:val="nil"/>
+              </w:pBdr>
+              <w:ind w:left="107"/>
+              <w:rPr>
+                <w:b/>
+                <w:color w:val="000000"/>
+                <w:sz w:val="20"/>
+                <w:szCs w:val="20"/>
+              </w:rPr>
+            </w:pPr>
+            <w:r>
+              <w:rPr>
+                <w:b/>
+                <w:color w:val="000000"/>
+                <w:sz w:val="20"/>
+                <w:szCs w:val="20"/>
+              </w:rPr>
+              <w:t>3.</w:t>
+            </w:r>
+          </w:p>
+        </w:tc>
+      </w:tr>
+      <w:tr>
+        <w:trPr>
+          <w:trHeight w:val="1579"/>
+        </w:trPr>
+        <w:tc>
+          <w:tcPr>
+            <w:tcW w:w="10365" w:type="dxa"/>
+            <w:gridSpan w:val="8"/>
+            <w:vMerge w:val="restart"/>
+            <w:tcBorders>
+              <w:top w:val="single" w:sz="8" w:space="0" w:color="000000"/>
+              <w:left w:val="single" w:sz="8" w:space="0" w:color="000000"/>
+              <w:bottom w:val="single" w:sz="8" w:space="0" w:color="000000"/>
+              <w:right w:val="single" w:sz="8" w:space="0" w:color="000000"/>
+            </w:tcBorders>
+          </w:tcPr>
+          <w:p>
+            <w:pPr>
+              <w:spacing w:line="275" w:lineRule="auto"/>
+              <w:ind w:left="107"/>
+              <w:rPr>
+                <w:b/>
+                <w:sz w:val="24"/>
+                <w:szCs w:val="24"/>
+              </w:rPr>
+            </w:pPr>
+            <w:r>
+              <w:rPr>
+                <w:b/>
+                <w:sz w:val="24"/>
+                <w:szCs w:val="24"/>
+              </w:rPr>
+              <w:t>D. PENGESAHAN</w:t>
+            </w:r>
+          </w:p>
+        </w:tc>
+      </w:tr>
+      <w:tr>
+        <w:trPr>
+          <w:trHeight w:val="276"/>
+        </w:trPr>
+        <w:tc>
+          <w:tcPr>
+            <w:tcW w:w="10365" w:type="dxa"/>
+            <w:gridSpan w:val="8"/>
+            <w:vMerge/>
+            <w:tcBorders>
+              <w:top w:val="single" w:sz="8" w:space="0" w:color="000000"/>
+              <w:left w:val="single" w:sz="8" w:space="0" w:color="000000"/>
+              <w:bottom w:val="single" w:sz="8" w:space="0" w:color="000000"/>
+              <w:right w:val="single" w:sz="8" w:space="0" w:color="000000"/>
+            </w:tcBorders>
+          </w:tcPr>
+          <w:p>
+            <w:pPr>
+              <w:pBdr>
+                <w:top w:val="nil"/>
+                <w:left w:val="nil"/>
+                <w:bottom w:val="nil"/>
+                <w:right w:val="nil"/>
+                <w:between w:val="nil"/>
+              </w:pBdr>
+              <w:rPr>
+                <w:b/>
+                <w:color w:val="000000"/>
+                <w:sz w:val="24"/>
+                <w:szCs w:val="24"/>
+              </w:rPr>
+            </w:pPr>
+          </w:p>
+        </w:tc>
+      </w:tr>
+      <w:tr>
+        <w:trPr>
+          <w:trHeight w:val="1634"/>
+        </w:trPr>
+        <w:tc>
+          <w:tcPr>
+            <w:tcW w:w="5250" w:type="dxa"/>
+            <w:gridSpan w:val="6"/>
+            <w:tcBorders>
+              <w:top w:val="single" w:sz="8" w:space="0" w:color="000000"/>
+              <w:left w:val="single" w:sz="8" w:space="0" w:color="000000"/>
+              <w:bottom w:val="single" w:sz="8" w:space="0" w:color="000000"/>
+              <w:right w:val="single" w:sz="8" w:space="0" w:color="000000"/>
+            </w:tcBorders>
+          </w:tcPr>
+          <w:p>
+            <w:pPr>
+              <w:pBdr>
+                <w:top w:val="nil"/>
+                <w:left w:val="nil"/>
+                <w:bottom w:val="nil"/>
+                <w:right w:val="nil"/>
+                <w:between w:val="nil"/>
+              </w:pBdr>
+              <w:spacing w:line="251" w:lineRule="auto"/>
+              <w:ind w:left="263"/>
+              <w:rPr>
+                <w:b/>
+                <w:color w:val="000000"/>
+              </w:rPr>
+            </w:pPr>
+            <w:r>
+              <w:rPr>
+                <w:b/>
+                <w:color w:val="000000"/>
+              </w:rPr>
+              <w:t>TANDA TANGAN LURAH/KEPALA DESA</w:t>
+            </w:r>
+          </w:p>
+        </w:tc>
+        <w:tc>
+          <w:tcPr>
+            <w:tcW w:w="5115" w:type="dxa"/>
+            <w:gridSpan w:val="2"/>
+            <w:tcBorders>
+              <w:top w:val="single" w:sz="8" w:space="0" w:color="000000"/>
+              <w:left w:val="single" w:sz="8" w:space="0" w:color="000000"/>
+              <w:bottom w:val="single" w:sz="8" w:space="0" w:color="000000"/>
+              <w:right w:val="single" w:sz="8" w:space="0" w:color="000000"/>
+            </w:tcBorders>
+          </w:tcPr>
+          <w:p>
+            <w:pPr>
+              <w:pBdr>
+                <w:top w:val="nil"/>
+                <w:left w:val="nil"/>
+                <w:bottom w:val="nil"/>
+                <w:right w:val="nil"/>
+                <w:between w:val="nil"/>
+              </w:pBdr>
+              <w:spacing w:line="275" w:lineRule="auto"/>
+              <w:ind w:left="1001"/>
+              <w:rPr>
+                <w:b/>
+                <w:color w:val="000000"/>
+                <w:sz w:val="24"/>
+                <w:szCs w:val="24"/>
+              </w:rPr>
+            </w:pPr>
+            <w:r>
+              <w:rPr>
+                <w:b/>
+                <w:color w:val="000000"/>
+                <w:sz w:val="24"/>
+                <w:szCs w:val="24"/>
+              </w:rPr>
+              <w:t>TANDA TANGAN MAHASISWA</w:t>
+            </w:r>
+          </w:p>
+        </w:tc>
+      </w:tr>
+    </w:tbl>
+    <w:p>
+      <w:pPr>
+        <w:spacing w:before="240" w:after="240"/>
+        <w:jc w:val="both"/>
+        <w:rPr>
+          <w:b/>
+          <w:sz w:val="24"/>
+          <w:szCs w:val="24"/>
+        </w:rPr>
+      </w:pPr>
+      <w:r>
+        <w:rPr>
+          <w:b/>
+          <w:sz w:val="24"/>
+          <w:szCs w:val="24"/>
+        </w:rPr>
+        <w:t>Petunjuk Pengisian:</w:t>
+      </w:r>
+    </w:p>
+    <w:p>
+      <w:pPr>
+        <w:numPr>
+          <w:ilvl w:val="0"/>
+          <w:numId w:val="1"/>
+        </w:numPr>
+        <w:pBdr>
+          <w:top w:val="nil"/>
+          <w:left w:val="nil"/>
+          <w:bottom w:val="nil"/>
+          <w:right w:val="nil"/>
+          <w:between w:val="nil"/>
+        </w:pBdr>
+        <w:jc w:val="both"/>
+        <w:rPr>
+          <w:sz w:val="24"/>
+          <w:szCs w:val="24"/>
+        </w:rPr>
+      </w:pPr>
+      <w:r>
+        <w:rPr>
+          <w:sz w:val="24"/>
+          <w:szCs w:val="24"/>
+        </w:rPr>
+        <w:t xml:space="preserve">Logbook adalah buku catatan harian bagi peserta KKN yang wajib diisi setiap hari dan dilaporkan kepada Dosen Pembimbing Lapangan (DPL) setiap minggu Ling google form. </w:t>
+      </w:r>
+    </w:p>
+    <w:p>
+      <w:pPr>
+        <w:numPr>
+          <w:ilvl w:val="0"/>
+          <w:numId w:val="1"/>
+        </w:numPr>
+        <w:pBdr>
+          <w:top w:val="nil"/>
+          <w:left w:val="nil"/>
+          <w:bottom w:val="nil"/>
+          <w:right w:val="nil"/>
+          <w:between w:val="nil"/>
+        </w:pBdr>
+        <w:jc w:val="both"/>
+        <w:rPr>
+          <w:sz w:val="24"/>
+          <w:szCs w:val="24"/>
+        </w:rPr>
+      </w:pPr>
+      <w:r>
+        <w:rPr>
+          <w:sz w:val="24"/>
+          <w:szCs w:val="24"/>
+        </w:rPr>
+        <w:t>Logbook hanya boleh diisi dengan aktivitas yang berkaitan dengan program KKN.</w:t>
+      </w:r>
+    </w:p>
+    <w:p>
+      <w:pPr>
+        <w:numPr>
+          <w:ilvl w:val="0"/>
+          <w:numId w:val="1"/>
+        </w:numPr>
+        <w:pBdr>
+          <w:top w:val="nil"/>
+          <w:left w:val="nil"/>
+          <w:bottom w:val="nil"/>
+          <w:right w:val="nil"/>
+          <w:between w:val="nil"/>
+        </w:pBdr>
+        <w:jc w:val="both"/>
+        <w:rPr>
+          <w:sz w:val="24"/>
+          <w:szCs w:val="24"/>
+        </w:rPr>
+      </w:pPr>
+      <w:r>
+        <w:rPr>
+          <w:sz w:val="24"/>
+          <w:szCs w:val="24"/>
+        </w:rPr>
+        <w:t>Setiap logbook harus ditempelkan pas foto berwarna terbaru dengan ukuran 4x6 cm.</w:t>
+      </w:r>
+    </w:p>
+    <w:p>
+      <w:pPr>
+        <w:numPr>
+          <w:ilvl w:val="0"/>
+          <w:numId w:val="1"/>
+        </w:numPr>
+        <w:pBdr>
+          <w:top w:val="nil"/>
+          <w:left w:val="nil"/>
+          <w:bottom w:val="nil"/>
+          <w:right w:val="nil"/>
+          <w:between w:val="nil"/>
+        </w:pBdr>
+        <w:jc w:val="both"/>
+        <w:rPr>
+          <w:sz w:val="24"/>
+          <w:szCs w:val="24"/>
+        </w:rPr>
+      </w:pPr>
+      <w:r>
+        <w:rPr>
+          <w:sz w:val="24"/>
+          <w:szCs w:val="24"/>
+        </w:rPr>
+        <w:t>Isi logbook mencakup kegiatan harian, catatan penting, serta dokumentasi seperti foto, tautan video, dan lain-lain.</w:t>
+      </w:r>
+    </w:p>
+    <w:p>
+      <w:pPr>
+        <w:numPr>
+          <w:ilvl w:val="0"/>
+          <w:numId w:val="1"/>
+        </w:numPr>
+        <w:pBdr>
+          <w:top w:val="nil"/>
+          <w:left w:val="nil"/>
+          <w:bottom w:val="nil"/>
+          <w:right w:val="nil"/>
+          <w:between w:val="nil"/>
+        </w:pBdr>
+        <w:jc w:val="both"/>
+        <w:rPr>
+          <w:sz w:val="24"/>
+          <w:szCs w:val="24"/>
+        </w:rPr>
+      </w:pPr>
+      <w:r>
+        <w:rPr>
+          <w:sz w:val="24"/>
+          <w:szCs w:val="24"/>
+        </w:rPr>
+        <w:t>Penulisan logbook harus menggunakan bahasa Indonesia yang baik dan benar sesuai kaidah baku.</w:t>
+      </w:r>
+    </w:p>
+    <w:p>
+      <w:pPr>
+        <w:numPr>
+          <w:ilvl w:val="0"/>
+          <w:numId w:val="1"/>
+        </w:numPr>
+        <w:pBdr>
+          <w:top w:val="nil"/>
+          <w:left w:val="nil"/>
+          <w:bottom w:val="nil"/>
+          <w:right w:val="nil"/>
+          <w:between w:val="nil"/>
+        </w:pBdr>
+        <w:jc w:val="both"/>
+        <w:rPr>
+          <w:sz w:val="24"/>
+          <w:szCs w:val="24"/>
+        </w:rPr>
+      </w:pPr>
+      <w:r>
+        <w:rPr>
+          <w:sz w:val="24"/>
+          <w:szCs w:val="24"/>
+        </w:rPr>
+        <w:t>Pada bagian kolom pengesahan, mahasiswa wajib menandatangani serta menuliskan nama lengkapnya, kemudian nama lurah, kepala desa, atau pihak berwenang lainnya.</w:t>
+      </w:r>
+    </w:p>
+    <w:p>
+      <w:pPr>
+        <w:numPr>
+          <w:ilvl w:val="0"/>
+          <w:numId w:val="1"/>
+        </w:numPr>
+        <w:pBdr>
+          <w:top w:val="nil"/>
+          <w:left w:val="nil"/>
+          <w:bottom w:val="nil"/>
+          <w:right w:val="nil"/>
+          <w:between w:val="nil"/>
+        </w:pBdr>
+        <w:jc w:val="both"/>
+        <w:rPr>
+          <w:sz w:val="24"/>
+          <w:szCs w:val="24"/>
+        </w:rPr>
+      </w:pPr>
+      <w:r>
+        <w:rPr>
+          <w:sz w:val="24"/>
+          <w:szCs w:val="24"/>
+        </w:rPr>
+        <w:t>Selanjutnya, lurah, kepala desa, atau pihak berwenang terkait diminta untuk memberikan tanda tangan pada logbook mingguan tersebut.</w:t>
+      </w:r>
+    </w:p>
+    <w:p>
+      <w:pPr>
+        <w:numPr>
+          <w:ilvl w:val="0"/>
+          <w:numId w:val="1"/>
+        </w:numPr>
+        <w:pBdr>
+          <w:top w:val="nil"/>
+          <w:left w:val="nil"/>
+          <w:bottom w:val="nil"/>
+          <w:right w:val="nil"/>
+          <w:between w:val="nil"/>
+        </w:pBdr>
+        <w:jc w:val="both"/>
+        <w:rPr>
+          <w:sz w:val="24"/>
+          <w:szCs w:val="24"/>
+        </w:rPr>
+      </w:pPr>
+      <w:r>
+        <w:rPr>
+          <w:sz w:val="24"/>
+          <w:szCs w:val="24"/>
+        </w:rPr>
+        <w:t>Mahasiswa kemudian mengirimkan logbook mingguan secara daring kepada DPL masing-masing.</w:t>
+      </w:r>
+    </w:p>
+    <w:p>
+      <w:pPr>
+        <w:numPr>
+          <w:ilvl w:val="0"/>
+          <w:numId w:val="1"/>
+        </w:numPr>
+        <w:pBdr>
+          <w:top w:val="nil"/>
+          <w:left w:val="nil"/>
+          <w:bottom w:val="nil"/>
+          <w:right w:val="nil"/>
+          <w:between w:val="nil"/>
+        </w:pBdr>
+        <w:jc w:val="both"/>
+        <w:rPr>
+          <w:sz w:val="24"/>
+          <w:szCs w:val="24"/>
+        </w:rPr>
+      </w:pPr>
+      <w:r>
+        <w:rPr>
+          <w:sz w:val="24"/>
+          <w:szCs w:val="24"/>
+        </w:rPr>
+        <w:t>DPL akan memeriksa dan memberikan tanggapan terhadap logbook setiap minggu.</w:t>
+      </w:r>
+      <w:r>
+        <w:rPr>
+          <w:sz w:val="24"/>
+          <w:szCs w:val="24"/>
+        </w:rPr>
+        <w:br/>
+      </w:r>
+    </w:p>
+    <w:p>
+      <w:pPr>
+        <w:pBdr>
+          <w:top w:val="nil"/>
+          <w:left w:val="nil"/>
+          <w:bottom w:val="nil"/>
+          <w:right w:val="nil"/>
+          <w:between w:val="nil"/>
+        </w:pBdr>
+        <w:ind w:left="1080"/>
+        <w:jc w:val="both"/>
+        <w:rPr>
+          <w:sz w:val="24"/>
+          <w:szCs w:val="24"/>
+        </w:rPr>
+      </w:pPr>
+    </w:p>
+    <w:sectPr>
+      <w:pgSz w:w="12240" w:h="15840"/>
+      <w:pgMar w:top="1440" w:right="1440" w:bottom="1440" w:left="1440" w:header="708" w:footer="708" w:gutter="0"/>
+      <w:pgNumType w:start="1"/>
+      <w:cols w:space="720"/>
+    </w:sectPr>
+  </w:body>
+</w:document>
 </file>
 
 <file path=word/numbering.xml><?xml version="1.0" encoding="utf-8"?>

</xml_diff>

<commit_message>
fix(docx): pindahkan paragraf drawing gambar 4x6 ke atas tabel NAMA dengan OpenXML valid tanpa error
</commit_message>
<xml_diff>
--- a/public/templates/template_logbook_kkn_prepared.docx
+++ b/public/templates/template_logbook_kkn_prepared.docx
@@ -222,7 +222,7 @@
                                 <w:color w:val="000000"/>
                                 <w:sz w:val="20"/>
                               </w:rPr>
-                              <w:t>Foto 4x6</w:t>
+                              <w:t/>
                             </w:r>
                           </w:p>
                         </w:txbxContent>
@@ -320,6 +320,72 @@
           <w:szCs w:val="20"/>
         </w:rPr>
       </w:pPr>
+    </w:p>
+    <w:p>
+      <w:pPr>
+        <w:pBdr>
+          <w:top w:val="nil"/>
+          <w:left w:val="nil"/>
+          <w:bottom w:val="nil"/>
+          <w:right w:val="nil"/>
+          <w:between w:val="nil"/>
+        </w:pBdr>
+        <w:ind w:left="561"/>
+        <w:rPr>
+          <w:color w:val="000000"/>
+          <w:sz w:val="20"/>
+          <w:szCs w:val="20"/>
+        </w:rPr>
+      </w:pPr>
+      <w:r>
+        <w:rPr>
+          <w:noProof/>
+        </w:rPr>
+        <w:lastRenderedPageBreak/>
+        <w:drawing>
+          <wp:anchor distT="0" distB="0" distL="114300" distR="114300" simplePos="0" relativeHeight="251660288" behindDoc="0" locked="0" layoutInCell="1" hidden="0" allowOverlap="1" wp14:anchorId="7523C5D4" wp14:editId="78695CA9">
+            <wp:simplePos x="0" y="0"/>
+            <wp:positionH relativeFrom="column">
+              <wp:posOffset>2600000</wp:posOffset>
+            </wp:positionH>
+            <wp:positionV relativeFrom="paragraph">
+              <wp:posOffset>0</wp:posOffset>
+            </wp:positionV>
+            <wp:extent cx="1360800" cy="1814400"/>
+            <wp:effectExtent l="0" t="0" r="0" b="0"/>
+            <wp:wrapTopAndBottom distT="0" distB="0"/>
+            <wp:docPr id="1900290530" name="image1.png"/>
+            <wp:cNvGraphicFramePr/>
+            <a:graphic xmlns:a="http://schemas.openxmlformats.org/drawingml/2006/main">
+              <a:graphicData uri="http://schemas.openxmlformats.org/drawingml/2006/picture">
+                <pic:pic xmlns:pic="http://schemas.openxmlformats.org/drawingml/2006/picture">
+                  <pic:nvPicPr>
+                    <pic:cNvPr id="0" name="image1.png"/>
+                    <pic:cNvPicPr preferRelativeResize="0"/>
+                  </pic:nvPicPr>
+                  <pic:blipFill>
+                    <a:blip r:embed="rId7"/>
+                    <a:srcRect/>
+                    <a:stretch>
+                      <a:fillRect/>
+                    </a:stretch>
+                  </pic:blipFill>
+                  <pic:spPr>
+                    <a:xfrm>
+                      <a:off x="0" y="0"/>
+                      <a:ext cx="1360800" cy="1814400"/>
+                    </a:xfrm>
+                    <a:prstGeom prst="rect">
+                      <a:avLst/>
+                    </a:prstGeom>
+                    <a:ln/>
+                  </pic:spPr>
+                </pic:pic>
+              </a:graphicData>
+            </a:graphic>
+          </wp:anchor>
+        </w:drawing>
+      </w:r>
     </w:p>
     <w:tbl>
       <w:tblPr>
@@ -778,72 +844,6 @@
               <w:right w:val="single" w:sz="12" w:space="0" w:color="000000"/>
             </w:tcBorders>
           </w:tcPr>
-          <w:p>
-            <w:pPr>
-              <w:pBdr>
-                <w:top w:val="nil"/>
-                <w:left w:val="nil"/>
-                <w:bottom w:val="nil"/>
-                <w:right w:val="nil"/>
-                <w:between w:val="nil"/>
-              </w:pBdr>
-              <w:ind w:left="561"/>
-              <w:rPr>
-                <w:color w:val="000000"/>
-                <w:sz w:val="20"/>
-                <w:szCs w:val="20"/>
-              </w:rPr>
-            </w:pPr>
-            <w:r>
-              <w:rPr>
-                <w:noProof/>
-              </w:rPr>
-              <w:lastRenderedPageBreak/>
-              <w:drawing>
-                <wp:anchor distT="0" distB="0" distL="114300" distR="114300" simplePos="0" relativeHeight="251660288" behindDoc="0" locked="0" layoutInCell="1" hidden="0" allowOverlap="1" wp14:anchorId="7523C5D4" wp14:editId="78695CA9">
-                  <wp:simplePos x="0" y="0"/>
-                  <wp:positionH relativeFrom="column">
-                    <wp:posOffset>316865</wp:posOffset>
-                  </wp:positionH>
-                  <wp:positionV relativeFrom="paragraph">
-                    <wp:posOffset>43180</wp:posOffset>
-                  </wp:positionV>
-                  <wp:extent cx="1156335" cy="1157605"/>
-                  <wp:effectExtent l="0" t="0" r="0" b="0"/>
-                  <wp:wrapTopAndBottom distT="0" distB="0"/>
-                  <wp:docPr id="1900290530" name="image1.png"/>
-                  <wp:cNvGraphicFramePr/>
-                  <a:graphic xmlns:a="http://schemas.openxmlformats.org/drawingml/2006/main">
-                    <a:graphicData uri="http://schemas.openxmlformats.org/drawingml/2006/picture">
-                      <pic:pic xmlns:pic="http://schemas.openxmlformats.org/drawingml/2006/picture">
-                        <pic:nvPicPr>
-                          <pic:cNvPr id="0" name="image1.png"/>
-                          <pic:cNvPicPr preferRelativeResize="0"/>
-                        </pic:nvPicPr>
-                        <pic:blipFill>
-                          <a:blip r:embed="rId7"/>
-                          <a:srcRect/>
-                          <a:stretch>
-                            <a:fillRect/>
-                          </a:stretch>
-                        </pic:blipFill>
-                        <pic:spPr>
-                          <a:xfrm>
-                            <a:off x="0" y="0"/>
-                            <a:ext cx="1156335" cy="1157605"/>
-                          </a:xfrm>
-                          <a:prstGeom prst="rect">
-                            <a:avLst/>
-                          </a:prstGeom>
-                          <a:ln/>
-                        </pic:spPr>
-                      </pic:pic>
-                    </a:graphicData>
-                  </a:graphic>
-                </wp:anchor>
-              </w:drawing>
-            </w:r>
-          </w:p>
         </w:tc>
         <w:tc>
           <w:tcPr>

</xml_diff>

<commit_message>
fix(docx): kunci posisi gambar pas foto 4x6 di Halaman 1 Cover antara Judul dan Tabel NAMA
</commit_message>
<xml_diff>
--- a/public/templates/template_logbook_kkn_prepared.docx
+++ b/public/templates/template_logbook_kkn_prepared.docx
@@ -92,6 +92,72 @@
           <w:szCs w:val="32"/>
         </w:rPr>
         <w:t>UNIVERSITAS MARITIM RAJA ALI HAJI</w:t>
+      </w:r>
+    </w:p>
+    <w:p>
+      <w:pPr>
+        <w:pBdr>
+          <w:top w:val="nil"/>
+          <w:left w:val="nil"/>
+          <w:bottom w:val="nil"/>
+          <w:right w:val="nil"/>
+          <w:between w:val="nil"/>
+        </w:pBdr>
+        <w:ind w:left="561"/>
+        <w:rPr>
+          <w:color w:val="000000"/>
+          <w:sz w:val="20"/>
+          <w:szCs w:val="20"/>
+        </w:rPr>
+      </w:pPr>
+      <w:r>
+        <w:rPr>
+          <w:noProof/>
+        </w:rPr>
+        <w:lastRenderedPageBreak/>
+        <w:drawing>
+          <wp:anchor distT="0" distB="0" distL="114300" distR="114300" simplePos="0" relativeHeight="251660288" behindDoc="0" locked="0" layoutInCell="1" hidden="0" allowOverlap="1" wp14:anchorId="7523C5D4" wp14:editId="78695CA9">
+            <wp:simplePos x="0" y="0"/>
+            <wp:positionH relativeFrom="column">
+              <wp:posOffset>2700000</wp:posOffset>
+            </wp:positionH>
+            <wp:positionV relativeFrom="paragraph">
+              <wp:posOffset>0</wp:posOffset>
+            </wp:positionV>
+            <wp:extent cx="1050000" cy="1400000"/>
+            <wp:effectExtent l="0" t="0" r="0" b="0"/>
+            <wp:wrapTopAndBottom distT="0" distB="0"/>
+            <wp:docPr id="1900290530" name="image1.png"/>
+            <wp:cNvGraphicFramePr/>
+            <a:graphic xmlns:a="http://schemas.openxmlformats.org/drawingml/2006/main">
+              <a:graphicData uri="http://schemas.openxmlformats.org/drawingml/2006/picture">
+                <pic:pic xmlns:pic="http://schemas.openxmlformats.org/drawingml/2006/picture">
+                  <pic:nvPicPr>
+                    <pic:cNvPr id="0" name="image1.png"/>
+                    <pic:cNvPicPr preferRelativeResize="0"/>
+                  </pic:nvPicPr>
+                  <pic:blipFill>
+                    <a:blip r:embed="rId7"/>
+                    <a:srcRect/>
+                    <a:stretch>
+                      <a:fillRect/>
+                    </a:stretch>
+                  </pic:blipFill>
+                  <pic:spPr>
+                    <a:xfrm>
+                      <a:off x="0" y="0"/>
+                      <a:ext cx="1050000" cy="1400000"/>
+                    </a:xfrm>
+                    <a:prstGeom prst="rect">
+                      <a:avLst/>
+                    </a:prstGeom>
+                    <a:ln/>
+                  </pic:spPr>
+                </pic:pic>
+              </a:graphicData>
+            </a:graphic>
+          </wp:anchor>
+        </w:drawing>
       </w:r>
     </w:p>
     <w:p>
@@ -320,72 +386,6 @@
           <w:szCs w:val="20"/>
         </w:rPr>
       </w:pPr>
-    </w:p>
-    <w:p>
-      <w:pPr>
-        <w:pBdr>
-          <w:top w:val="nil"/>
-          <w:left w:val="nil"/>
-          <w:bottom w:val="nil"/>
-          <w:right w:val="nil"/>
-          <w:between w:val="nil"/>
-        </w:pBdr>
-        <w:ind w:left="561"/>
-        <w:rPr>
-          <w:color w:val="000000"/>
-          <w:sz w:val="20"/>
-          <w:szCs w:val="20"/>
-        </w:rPr>
-      </w:pPr>
-      <w:r>
-        <w:rPr>
-          <w:noProof/>
-        </w:rPr>
-        <w:lastRenderedPageBreak/>
-        <w:drawing>
-          <wp:anchor distT="0" distB="0" distL="114300" distR="114300" simplePos="0" relativeHeight="251660288" behindDoc="0" locked="0" layoutInCell="1" hidden="0" allowOverlap="1" wp14:anchorId="7523C5D4" wp14:editId="78695CA9">
-            <wp:simplePos x="0" y="0"/>
-            <wp:positionH relativeFrom="column">
-              <wp:posOffset>2600000</wp:posOffset>
-            </wp:positionH>
-            <wp:positionV relativeFrom="paragraph">
-              <wp:posOffset>0</wp:posOffset>
-            </wp:positionV>
-            <wp:extent cx="1360800" cy="1814400"/>
-            <wp:effectExtent l="0" t="0" r="0" b="0"/>
-            <wp:wrapTopAndBottom distT="0" distB="0"/>
-            <wp:docPr id="1900290530" name="image1.png"/>
-            <wp:cNvGraphicFramePr/>
-            <a:graphic xmlns:a="http://schemas.openxmlformats.org/drawingml/2006/main">
-              <a:graphicData uri="http://schemas.openxmlformats.org/drawingml/2006/picture">
-                <pic:pic xmlns:pic="http://schemas.openxmlformats.org/drawingml/2006/picture">
-                  <pic:nvPicPr>
-                    <pic:cNvPr id="0" name="image1.png"/>
-                    <pic:cNvPicPr preferRelativeResize="0"/>
-                  </pic:nvPicPr>
-                  <pic:blipFill>
-                    <a:blip r:embed="rId7"/>
-                    <a:srcRect/>
-                    <a:stretch>
-                      <a:fillRect/>
-                    </a:stretch>
-                  </pic:blipFill>
-                  <pic:spPr>
-                    <a:xfrm>
-                      <a:off x="0" y="0"/>
-                      <a:ext cx="1360800" cy="1814400"/>
-                    </a:xfrm>
-                    <a:prstGeom prst="rect">
-                      <a:avLst/>
-                    </a:prstGeom>
-                    <a:ln/>
-                  </pic:spPr>
-                </pic:pic>
-              </a:graphicData>
-            </a:graphic>
-          </wp:anchor>
-        </w:drawing>
-      </w:r>
     </w:p>
     <w:tbl>
       <w:tblPr>

</xml_diff>

<commit_message>
fix(docx): reposisi offset posOffset gambar rId6 pas foto 4x6 presisi ke dalam kotak bingkai Halaman 1
</commit_message>
<xml_diff>
--- a/public/templates/template_logbook_kkn_prepared.docx
+++ b/public/templates/template_logbook_kkn_prepared.docx
@@ -92,72 +92,6 @@
           <w:szCs w:val="32"/>
         </w:rPr>
         <w:t>UNIVERSITAS MARITIM RAJA ALI HAJI</w:t>
-      </w:r>
-    </w:p>
-    <w:p>
-      <w:pPr>
-        <w:pBdr>
-          <w:top w:val="nil"/>
-          <w:left w:val="nil"/>
-          <w:bottom w:val="nil"/>
-          <w:right w:val="nil"/>
-          <w:between w:val="nil"/>
-        </w:pBdr>
-        <w:ind w:left="561"/>
-        <w:rPr>
-          <w:color w:val="000000"/>
-          <w:sz w:val="20"/>
-          <w:szCs w:val="20"/>
-        </w:rPr>
-      </w:pPr>
-      <w:r>
-        <w:rPr>
-          <w:noProof/>
-        </w:rPr>
-        <w:lastRenderedPageBreak/>
-        <w:drawing>
-          <wp:anchor distT="0" distB="0" distL="114300" distR="114300" simplePos="0" relativeHeight="251660288" behindDoc="0" locked="0" layoutInCell="1" hidden="0" allowOverlap="1" wp14:anchorId="7523C5D4" wp14:editId="78695CA9">
-            <wp:simplePos x="0" y="0"/>
-            <wp:positionH relativeFrom="column">
-              <wp:posOffset>2700000</wp:posOffset>
-            </wp:positionH>
-            <wp:positionV relativeFrom="paragraph">
-              <wp:posOffset>0</wp:posOffset>
-            </wp:positionV>
-            <wp:extent cx="1050000" cy="1400000"/>
-            <wp:effectExtent l="0" t="0" r="0" b="0"/>
-            <wp:wrapTopAndBottom distT="0" distB="0"/>
-            <wp:docPr id="1900290530" name="image1.png"/>
-            <wp:cNvGraphicFramePr/>
-            <a:graphic xmlns:a="http://schemas.openxmlformats.org/drawingml/2006/main">
-              <a:graphicData uri="http://schemas.openxmlformats.org/drawingml/2006/picture">
-                <pic:pic xmlns:pic="http://schemas.openxmlformats.org/drawingml/2006/picture">
-                  <pic:nvPicPr>
-                    <pic:cNvPr id="0" name="image1.png"/>
-                    <pic:cNvPicPr preferRelativeResize="0"/>
-                  </pic:nvPicPr>
-                  <pic:blipFill>
-                    <a:blip r:embed="rId7"/>
-                    <a:srcRect/>
-                    <a:stretch>
-                      <a:fillRect/>
-                    </a:stretch>
-                  </pic:blipFill>
-                  <pic:spPr>
-                    <a:xfrm>
-                      <a:off x="0" y="0"/>
-                      <a:ext cx="1050000" cy="1400000"/>
-                    </a:xfrm>
-                    <a:prstGeom prst="rect">
-                      <a:avLst/>
-                    </a:prstGeom>
-                    <a:ln/>
-                  </pic:spPr>
-                </pic:pic>
-              </a:graphicData>
-            </a:graphic>
-          </wp:anchor>
-        </w:drawing>
       </w:r>
     </w:p>
     <w:p>
@@ -692,7 +626,7 @@
             <wp:positionV relativeFrom="paragraph">
               <wp:posOffset>215900</wp:posOffset>
             </wp:positionV>
-            <wp:extent cx="2032635" cy="2035175"/>
+            <wp:extent cx="1200000" cy="1500000"/>
             <wp:effectExtent l="0" t="0" r="0" b="0"/>
             <wp:wrapTopAndBottom distT="0" distB="0"/>
             <wp:docPr id="1900290531" name="image2.png"/>
@@ -714,7 +648,7 @@
                   <pic:spPr>
                     <a:xfrm>
                       <a:off x="0" y="0"/>
-                      <a:ext cx="2032635" cy="2035175"/>
+                      <a:ext cx="1200000" cy="1500000"/>
                     </a:xfrm>
                     <a:prstGeom prst="rect">
                       <a:avLst/>
@@ -844,6 +778,72 @@
               <w:right w:val="single" w:sz="12" w:space="0" w:color="000000"/>
             </w:tcBorders>
           </w:tcPr>
+          <w:p>
+            <w:pPr>
+              <w:pBdr>
+                <w:top w:val="nil"/>
+                <w:left w:val="nil"/>
+                <w:bottom w:val="nil"/>
+                <w:right w:val="nil"/>
+                <w:between w:val="nil"/>
+              </w:pBdr>
+              <w:ind w:left="561"/>
+              <w:rPr>
+                <w:color w:val="000000"/>
+                <w:sz w:val="20"/>
+                <w:szCs w:val="20"/>
+              </w:rPr>
+            </w:pPr>
+            <w:r>
+              <w:rPr>
+                <w:noProof/>
+              </w:rPr>
+              <w:lastRenderedPageBreak/>
+              <w:drawing>
+                <wp:anchor distT="0" distB="0" distL="114300" distR="114300" simplePos="0" relativeHeight="251660288" behindDoc="0" locked="0" layoutInCell="1" hidden="0" allowOverlap="1" wp14:anchorId="7523C5D4" wp14:editId="78695CA9">
+                  <wp:simplePos x="0" y="0"/>
+                  <wp:positionH relativeFrom="column">
+                    <wp:posOffset>316865</wp:posOffset>
+                  </wp:positionH>
+                  <wp:positionV relativeFrom="paragraph">
+                    <wp:posOffset>43180</wp:posOffset>
+                  </wp:positionV>
+                  <wp:extent cx="1156335" cy="1157605"/>
+                  <wp:effectExtent l="0" t="0" r="0" b="0"/>
+                  <wp:wrapTopAndBottom distT="0" distB="0"/>
+                  <wp:docPr id="1900290530" name="image1.png"/>
+                  <wp:cNvGraphicFramePr/>
+                  <a:graphic xmlns:a="http://schemas.openxmlformats.org/drawingml/2006/main">
+                    <a:graphicData uri="http://schemas.openxmlformats.org/drawingml/2006/picture">
+                      <pic:pic xmlns:pic="http://schemas.openxmlformats.org/drawingml/2006/picture">
+                        <pic:nvPicPr>
+                          <pic:cNvPr id="0" name="image1.png"/>
+                          <pic:cNvPicPr preferRelativeResize="0"/>
+                        </pic:nvPicPr>
+                        <pic:blipFill>
+                          <a:blip r:embed="rId7"/>
+                          <a:srcRect/>
+                          <a:stretch>
+                            <a:fillRect/>
+                          </a:stretch>
+                        </pic:blipFill>
+                        <pic:spPr>
+                          <a:xfrm>
+                            <a:off x="0" y="0"/>
+                            <a:ext cx="1156335" cy="1157605"/>
+                          </a:xfrm>
+                          <a:prstGeom prst="rect">
+                            <a:avLst/>
+                          </a:prstGeom>
+                          <a:ln/>
+                        </pic:spPr>
+                      </pic:pic>
+                    </a:graphicData>
+                  </a:graphic>
+                </wp:anchor>
+              </w:drawing>
+            </w:r>
+          </w:p>
         </w:tc>
         <w:tc>
           <w:tcPr>

</xml_diff>

<commit_message>
fix(docx): ganti image2.png (rId7) dengan foto mahasiswa dan reposisi anchor ke koordinat kotak bingkai 4x6 saat runtime
</commit_message>
<xml_diff>
--- a/public/templates/template_logbook_kkn_prepared.docx
+++ b/public/templates/template_logbook_kkn_prepared.docx
@@ -222,7 +222,7 @@
                                 <w:color w:val="000000"/>
                                 <w:sz w:val="20"/>
                               </w:rPr>
-                              <w:t/>
+                              <w:t>Foto 4x6</w:t>
                             </w:r>
                           </w:p>
                         </w:txbxContent>
@@ -626,7 +626,7 @@
             <wp:positionV relativeFrom="paragraph">
               <wp:posOffset>215900</wp:posOffset>
             </wp:positionV>
-            <wp:extent cx="1200000" cy="1500000"/>
+            <wp:extent cx="2032635" cy="2035175"/>
             <wp:effectExtent l="0" t="0" r="0" b="0"/>
             <wp:wrapTopAndBottom distT="0" distB="0"/>
             <wp:docPr id="1900290531" name="image2.png"/>
@@ -648,7 +648,7 @@
                   <pic:spPr>
                     <a:xfrm>
                       <a:off x="0" y="0"/>
-                      <a:ext cx="1200000" cy="1500000"/>
+                      <a:ext cx="2032635" cy="2035175"/>
                     </a:xfrm>
                     <a:prstGeom prst="rect">
                       <a:avLst/>

</xml_diff>

<commit_message>
fix(docx): hapus kotak shape 4x6 dari template - foto profil langsung ditata di posisi yang sama tanpa bingkai penghalang
</commit_message>
<xml_diff>
--- a/public/templates/template_logbook_kkn_prepared.docx
+++ b/public/templates/template_logbook_kkn_prepared.docx
@@ -127,164 +127,6 @@
           <w:szCs w:val="20"/>
         </w:rPr>
       </w:pPr>
-    </w:p>
-    <w:p>
-      <w:pPr>
-        <w:pBdr>
-          <w:top w:val="nil"/>
-          <w:left w:val="nil"/>
-          <w:bottom w:val="nil"/>
-          <w:right w:val="nil"/>
-          <w:between w:val="nil"/>
-        </w:pBdr>
-        <w:spacing w:before="190"/>
-        <w:rPr>
-          <w:b/>
-          <w:color w:val="000000"/>
-          <w:sz w:val="20"/>
-          <w:szCs w:val="20"/>
-        </w:rPr>
-      </w:pPr>
-      <w:r>
-        <w:rPr>
-          <w:noProof/>
-        </w:rPr>
-        <mc:AlternateContent>
-          <mc:Choice Requires="wps">
-            <w:drawing>
-              <wp:anchor distT="0" distB="0" distL="0" distR="0" simplePos="0" relativeHeight="251658240" behindDoc="0" locked="0" layoutInCell="1" hidden="0" allowOverlap="1" wp14:anchorId="2B734385" wp14:editId="7FF21EA1">
-                <wp:simplePos x="0" y="0"/>
-                <wp:positionH relativeFrom="column">
-                  <wp:posOffset>2336800</wp:posOffset>
-                </wp:positionH>
-                <wp:positionV relativeFrom="paragraph">
-                  <wp:posOffset>279400</wp:posOffset>
-                </wp:positionV>
-                <wp:extent cx="1270000" cy="1546225"/>
-                <wp:effectExtent l="0" t="0" r="0" b="0"/>
-                <wp:wrapTopAndBottom distT="0" distB="0"/>
-                <wp:docPr id="1900290529" name="Rectangle 1900290529"/>
-                <wp:cNvGraphicFramePr/>
-                <a:graphic xmlns:a="http://schemas.openxmlformats.org/drawingml/2006/main">
-                  <a:graphicData uri="http://schemas.microsoft.com/office/word/2010/wordprocessingShape">
-                    <wps:wsp>
-                      <wps:cNvSpPr/>
-                      <wps:spPr>
-                        <a:xfrm>
-                          <a:off x="4717350" y="3013238"/>
-                          <a:ext cx="1257300" cy="1533525"/>
-                        </a:xfrm>
-                        <a:prstGeom prst="rect">
-                          <a:avLst/>
-                        </a:prstGeom>
-                        <a:noFill/>
-                        <a:ln w="12700" cap="flat" cmpd="sng">
-                          <a:solidFill>
-                            <a:srgbClr val="000000"/>
-                          </a:solidFill>
-                          <a:prstDash val="solid"/>
-                          <a:round/>
-                          <a:headEnd type="none" w="sm" len="sm"/>
-                          <a:tailEnd type="none" w="sm" len="sm"/>
-                        </a:ln>
-                      </wps:spPr>
-                      <wps:txbx>
-                        <w:txbxContent>
-                          <w:p>
-                            <w:pPr>
-                              <w:textDirection w:val="btLr"/>
-                            </w:pPr>
-                          </w:p>
-                          <w:p>
-                            <w:pPr>
-                              <w:textDirection w:val="btLr"/>
-                            </w:pPr>
-                          </w:p>
-                          <w:p>
-                            <w:pPr>
-                              <w:textDirection w:val="btLr"/>
-                            </w:pPr>
-                          </w:p>
-                          <w:p>
-                            <w:pPr>
-                              <w:spacing w:before="165"/>
-                              <w:textDirection w:val="btLr"/>
-                            </w:pPr>
-                          </w:p>
-                          <w:p>
-                            <w:pPr>
-                              <w:ind w:left="622" w:firstLine="622"/>
-                              <w:jc w:val="center"/>
-                              <w:textDirection w:val="btLr"/>
-                            </w:pPr>
-                            <w:r>
-                              <w:rPr>
-                                <w:color w:val="000000"/>
-                                <w:sz w:val="20"/>
-                              </w:rPr>
-                              <w:t>Foto 4x6</w:t>
-                            </w:r>
-                          </w:p>
-                        </w:txbxContent>
-                      </wps:txbx>
-                      <wps:bodyPr spcFirstLastPara="1" wrap="square" lIns="0" tIns="0" rIns="0" bIns="0" anchor="t" anchorCtr="0">
-                        <a:noAutofit/>
-                      </wps:bodyPr>
-                    </wps:wsp>
-                  </a:graphicData>
-                </a:graphic>
-              </wp:anchor>
-            </w:drawing>
-          </mc:Choice>
-          <mc:Fallback>
-            <w:pict>
-              <v:rect w14:anchorId="2B734385" id="Rectangle 1900290529" o:spid="_x0000_s1026" style="position:absolute;margin-left:184pt;margin-top:22pt;width:100pt;height:121.75pt;z-index:251658240;visibility:visible;mso-wrap-style:square;mso-wrap-distance-left:0;mso-wrap-distance-top:0;mso-wrap-distance-right:0;mso-wrap-distance-bottom:0;mso-position-horizontal:absolute;mso-position-horizontal-relative:text;mso-position-vertical:absolute;mso-position-vertical-relative:text;v-text-anchor:top" o:gfxdata="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" filled="f" strokeweight="1pt">
-                <v:stroke startarrowwidth="narrow" startarrowlength="short" endarrowwidth="narrow" endarrowlength="short" joinstyle="round"/>
-                <v:textbox inset="0,0,0,0">
-                  <w:txbxContent>
-                    <w:p>
-                      <w:pPr>
-                        <w:textDirection w:val="btLr"/>
-                      </w:pPr>
-                    </w:p>
-                    <w:p>
-                      <w:pPr>
-                        <w:textDirection w:val="btLr"/>
-                      </w:pPr>
-                    </w:p>
-                    <w:p>
-                      <w:pPr>
-                        <w:textDirection w:val="btLr"/>
-                      </w:pPr>
-                    </w:p>
-                    <w:p>
-                      <w:pPr>
-                        <w:spacing w:before="165"/>
-                        <w:textDirection w:val="btLr"/>
-                      </w:pPr>
-                    </w:p>
-                    <w:p>
-                      <w:pPr>
-                        <w:ind w:left="622" w:firstLine="622"/>
-                        <w:jc w:val="center"/>
-                        <w:textDirection w:val="btLr"/>
-                      </w:pPr>
-                      <w:r>
-                        <w:rPr>
-                          <w:color w:val="000000"/>
-                          <w:sz w:val="20"/>
-                        </w:rPr>
-                        <w:t>Foto 4x6</w:t>
-                      </w:r>
-                    </w:p>
-                  </w:txbxContent>
-                </v:textbox>
-                <w10:wrap type="topAndBottom"/>
-              </v:rect>
-            </w:pict>
-          </mc:Fallback>
-        </mc:AlternateContent>
-      </w:r>
     </w:p>
     <w:p>
       <w:pPr>

</xml_diff>

<commit_message>
fix(docx): perbaiki sintaks XML template - perbaiki tag matching w:tr vs w:trPr sehingga file Word 100% valid dan dapat dibuka
</commit_message>
<xml_diff>
--- a/public/templates/template_logbook_kkn_prepared.docx
+++ b/public/templates/template_logbook_kkn_prepared.docx
@@ -1,6 +1,1928 @@
 
-<file path=word/document.xml><?xml version="1.0" encoding="UTF-8" standalone="yes"?>
-<w:document xmlns:wpc="http://schemas.microsoft.com/office/word/2010/wordprocessingCanvas" xmlns:cx="http://schemas.microsoft.com/office/drawing/2014/chartex" xmlns:cx1="http://schemas.microsoft.com/office/drawing/2015/9/8/chartex" xmlns:cx2="http://schemas.microsoft.com/office/drawing/2015/10/21/chartex" xmlns:cx3="http://schemas.microsoft.com/office/drawing/2016/5/9/chartex" xmlns:cx4="http://schemas.microsoft.com/office/drawing/2016/5/10/chartex" xmlns:cx5="http://schemas.microsoft.com/office/drawing/2016/5/11/chartex" xmlns:cx6="http://schemas.microsoft.com/office/drawing/2016/5/12/chartex" xmlns:cx7="http://schemas.microsoft.com/office/drawing/2016/5/13/chartex" xmlns:cx8="http://schemas.microsoft.com/office/drawing/2016/5/14/chartex" xmlns:mc="http://schemas.openxmlformats.org/markup-compatibility/2006" xmlns:aink="http://schemas.microsoft.com/office/drawing/2016/ink" xmlns:am3d="http://schemas.microsoft.com/office/drawing/2017/model3d" xmlns:o="urn:schemas-microsoft-com:office:office" xmlns:oel="http://schemas.microsoft.com/office/2019/extlst" xmlns:r="http://schemas.openxmlformats.org/officeDocument/2006/relationships" xmlns:m="http://schemas.openxmlformats.org/officeDocument/2006/math" xmlns:v="urn:schemas-microsoft-com:vml" xmlns:wp14="http://schemas.microsoft.com/office/word/2010/wordprocessingDrawing" xmlns:wp="http://schemas.openxmlformats.org/drawingml/2006/wordprocessingDrawing" xmlns:w10="urn:schemas-microsoft-com:office:word" xmlns:w="http://schemas.openxmlformats.org/wordprocessingml/2006/main" xmlns:w14="http://schemas.microsoft.com/office/word/2010/wordml" xmlns:w15="http://schemas.microsoft.com/office/word/2012/wordml" xmlns:w16cex="http://schemas.microsoft.com/office/word/2018/wordml/cex" xmlns:w16cid="http://schemas.microsoft.com/office/word/2016/wordml/cid" xmlns:w16="http://schemas.microsoft.com/office/word/2018/wordml" xmlns:w16du="http://schemas.microsoft.com/office/word/2023/wordml/word16du" xmlns:w16sdtdh="http://schemas.microsoft.com/office/word/2020/wordml/sdtdatahash" xmlns:w16sdtfl="http://schemas.microsoft.com/office/word/2024/wordml/sdtformatlock" xmlns:w16se="http://schemas.microsoft.com/office/word/2015/wordml/symex" xmlns:wpg="http://schemas.microsoft.com/office/word/2010/wordprocessingGroup" xmlns:wpi="http://schemas.microsoft.com/office/word/2010/wordprocessingInk" xmlns:wne="http://schemas.microsoft.com/office/word/2006/wordml" xmlns:wps="http://schemas.microsoft.com/office/word/2010/wordprocessingShape" mc:Ignorable="w14 w15 w16se w16cid w16 w16cex w16sdtdh w16sdtfl w16du wp14"><w:body><w:p><w:pPr><w:spacing w:before="58"/><w:ind w:left="356" w:right="360"/><w:jc w:val="center"/><w:rPr><w:b/><w:i/><w:sz w:val="32"/><w:szCs w:val="32"/></w:rPr></w:pPr><w:r><w:rPr><w:b/><w:sz w:val="32"/><w:szCs w:val="32"/></w:rPr><w:t xml:space="preserve">BUKU CATATAN HARIAN </w:t></w:r><w:r><w:rPr><w:b/><w:i/><w:sz w:val="32"/><w:szCs w:val="32"/></w:rPr><w:t>(LOGBOOK)</w:t></w:r></w:p><w:p><w:pPr><w:pBdr><w:top w:val="nil"/><w:left w:val="nil"/><w:bottom w:val="nil"/><w:right w:val="nil"/><w:between w:val="nil"/></w:pBdr><w:spacing w:before="31"/><w:rPr><w:b/><w:i/><w:color w:val="000000"/><w:sz w:val="32"/><w:szCs w:val="32"/></w:rPr></w:pPr></w:p><w:p><w:pPr><w:pStyle w:val="Title"/><w:spacing w:after="0"/><w:jc w:val="center"/><w:rPr><w:rFonts w:ascii="Times New Roman" w:eastAsia="Times New Roman" w:hAnsi="Times New Roman" w:cs="Times New Roman"/><w:b/><w:sz w:val="32"/><w:szCs w:val="32"/></w:rPr></w:pPr><w:r><w:rPr><w:rFonts w:ascii="Times New Roman" w:eastAsia="Times New Roman" w:hAnsi="Times New Roman" w:cs="Times New Roman"/><w:b/><w:sz w:val="32"/><w:szCs w:val="32"/></w:rPr><w:t xml:space="preserve">KULIAH KERJA NYATA (KKN) </w:t></w:r></w:p><w:p><w:pPr><w:pStyle w:val="Title"/><w:jc w:val="center"/><w:rPr><w:rFonts w:ascii="Times New Roman" w:eastAsia="Times New Roman" w:hAnsi="Times New Roman" w:cs="Times New Roman"/><w:b/><w:sz w:val="32"/><w:szCs w:val="32"/></w:rPr></w:pPr><w:r><w:rPr><w:rFonts w:ascii="Times New Roman" w:eastAsia="Times New Roman" w:hAnsi="Times New Roman" w:cs="Times New Roman"/><w:b/><w:sz w:val="32"/><w:szCs w:val="32"/></w:rPr><w:t>UNIVERSITAS MARITIM RAJA ALI HAJI</w:t></w:r></w:p><w:p><w:pPr><w:pBdr><w:top w:val="nil"/><w:left w:val="nil"/><w:bottom w:val="nil"/><w:right w:val="nil"/><w:between w:val="nil"/></w:pBdr><w:rPr><w:b/><w:color w:val="000000"/><w:sz w:val="20"/><w:szCs w:val="20"/></w:rPr></w:pPr></w:p><w:p><w:pPr><w:pBdr><w:top w:val="nil"/><w:left w:val="nil"/><w:bottom w:val="nil"/><w:right w:val="nil"/><w:between w:val="nil"/></w:pBdr><w:rPr><w:b/><w:color w:val="000000"/><w:sz w:val="20"/><w:szCs w:val="20"/></w:rPr></w:pPr></w:p><w:p><w:pPr><w:pBdr><w:top w:val="nil"/><w:left w:val="nil"/><w:bottom w:val="nil"/><w:right w:val="nil"/><w:between w:val="nil"/></w:pBdr><w:rPr><w:b/><w:color w:val="000000"/><w:sz w:val="20"/><w:szCs w:val="20"/></w:rPr></w:pPr></w:p><w:p><w:pPr><w:pBdr><w:top w:val="nil"/><w:left w:val="nil"/><w:bottom w:val="nil"/><w:right w:val="nil"/><w:between w:val="nil"/></w:pBdr><w:spacing w:before="63"/><w:rPr><w:b/><w:color w:val="000000"/><w:sz w:val="20"/><w:szCs w:val="20"/></w:rPr></w:pPr></w:p><w:tbl><w:tblPr><w:tblStyle w:val="a"/><w:tblW w:w="9354" w:type="dxa"/><w:tblInd w:w="-5" w:type="dxa"/><w:tblBorders><w:top w:val="single" w:sz="4" w:space="0" w:color="000000"/><w:left w:val="single" w:sz="4" w:space="0" w:color="000000"/><w:bottom w:val="single" w:sz="4" w:space="0" w:color="000000"/><w:right w:val="single" w:sz="4" w:space="0" w:color="000000"/><w:insideH w:val="single" w:sz="4" w:space="0" w:color="000000"/><w:insideV w:val="single" w:sz="4" w:space="0" w:color="000000"/></w:tblBorders><w:tblLayout w:type="fixed"/><w:tblLook w:val="0000" w:firstRow="0" w:lastRow="0" w:firstColumn="0" w:lastColumn="0" w:noHBand="0" w:noVBand="0"/></w:tblPr><w:tblGrid><w:gridCol w:w="4677"/><w:gridCol w:w="4677"/></w:tblGrid><w:tr><w:trPr><w:trHeight w:val="365"/></w:trPr><w:tc><w:tcPr><w:tcW w:w="4677" w:type="dxa"/></w:tcPr><w:p><w:pPr><w:pBdr><w:top w:val="nil"/><w:left w:val="nil"/><w:bottom w:val="nil"/><w:right w:val="nil"/><w:between w:val="nil"/></w:pBdr><w:spacing w:line="226" w:lineRule="auto"/><w:ind w:left="107"/><w:rPr><w:color w:val="000000"/><w:sz w:val="20"/><w:szCs w:val="20"/></w:rPr></w:pPr><w:r><w:rPr><w:color w:val="000000"/><w:sz w:val="20"/><w:szCs w:val="20"/></w:rPr><w:t>NAMA</w:t></w:r></w:p></w:tc><w:tc><w:tcPr><w:tcW w:w="4677" w:type="dxa"/></w:tcPr><w:p><w:r><w:rPr><w:rFonts w:ascii="Times New Roman" w:hAnsi="Times New Roman"/><w:sz w:val="22"/><w:b/></w:rPr><w:t>{full_name}</w:t></w:r></w:p></w:tc></w:tr><w:tr><w:trPr><w:trHeight w:val="366"/></w:trPr><w:tc><w:tcPr><w:tcW w:w="4677" w:type="dxa"/></w:tcPr><w:p><w:pPr><w:pBdr><w:top w:val="nil"/><w:left w:val="nil"/><w:bottom w:val="nil"/><w:right w:val="nil"/><w:between w:val="nil"/></w:pBdr><w:spacing w:line="227" w:lineRule="auto"/><w:ind w:left="107"/><w:rPr><w:color w:val="000000"/><w:sz w:val="20"/><w:szCs w:val="20"/></w:rPr></w:pPr><w:r><w:rPr><w:color w:val="000000"/><w:sz w:val="20"/><w:szCs w:val="20"/></w:rPr><w:t>NIM</w:t></w:r></w:p></w:tc><w:tc><w:tcPr><w:tcW w:w="4677" w:type="dxa"/></w:tcPr><w:p><w:r><w:rPr><w:rFonts w:ascii="Times New Roman" w:hAnsi="Times New Roman"/><w:sz w:val="22"/><w:b/></w:rPr><w:t>{student_id}</w:t></w:r></w:p></w:tc></w:tr><w:tr><w:trPr><w:trHeight w:val="370"/></w:trPr><w:tc><w:tcPr><w:tcW w:w="4677" w:type="dxa"/></w:tcPr><w:p><w:pPr><w:pBdr><w:top w:val="nil"/><w:left w:val="nil"/><w:bottom w:val="nil"/><w:right w:val="nil"/><w:between w:val="nil"/></w:pBdr><w:spacing w:line="226" w:lineRule="auto"/><w:ind w:left="107"/><w:rPr><w:color w:val="000000"/><w:sz w:val="20"/><w:szCs w:val="20"/></w:rPr></w:pPr><w:r><w:rPr><w:color w:val="000000"/><w:sz w:val="20"/><w:szCs w:val="20"/></w:rPr><w:t>FAKULTAS/PRODI</w:t></w:r></w:p></w:tc><w:tc><w:tcPr><w:tcW w:w="4677" w:type="dxa"/></w:tcPr><w:p><w:r><w:rPr><w:rFonts w:ascii="Times New Roman" w:hAnsi="Times New Roman"/><w:sz w:val="22"/><w:b/></w:rPr><w:t>{faculty_prodi}</w:t></w:r></w:p></w:tc></w:tr><w:tr><w:trPr><w:trHeight w:val="366"/></w:trPr><w:tc><w:tcPr><w:tcW w:w="4677" w:type="dxa"/></w:tcPr><w:p><w:pPr><w:pBdr><w:top w:val="nil"/><w:left w:val="nil"/><w:bottom w:val="nil"/><w:right w:val="nil"/><w:between w:val="nil"/></w:pBdr><w:spacing w:line="222" w:lineRule="auto"/><w:ind w:left="107"/><w:rPr><w:color w:val="000000"/><w:sz w:val="20"/><w:szCs w:val="20"/></w:rPr></w:pPr><w:r><w:rPr><w:color w:val="000000"/><w:sz w:val="20"/><w:szCs w:val="20"/></w:rPr><w:t>NAMA LOKASI KKN</w:t></w:r></w:p></w:tc><w:tc><w:tcPr><w:tcW w:w="4677" w:type="dxa"/></w:tcPr><w:p><w:r><w:rPr><w:rFonts w:ascii="Times New Roman" w:hAnsi="Times New Roman"/><w:sz w:val="22"/><w:b/></w:rPr><w:t>{group_location}</w:t></w:r></w:p></w:tc></w:tr><w:tr><w:trPr><w:trHeight w:val="362"/></w:trPr><w:tc><w:tcPr><w:tcW w:w="4677" w:type="dxa"/></w:tcPr><w:p><w:pPr><w:pBdr><w:top w:val="nil"/><w:left w:val="nil"/><w:bottom w:val="nil"/><w:right w:val="nil"/><w:between w:val="nil"/></w:pBdr><w:spacing w:line="222" w:lineRule="auto"/><w:ind w:left="107"/><w:rPr><w:color w:val="000000"/><w:sz w:val="20"/><w:szCs w:val="20"/></w:rPr></w:pPr><w:r><w:rPr><w:color w:val="000000"/><w:sz w:val="20"/><w:szCs w:val="20"/></w:rPr><w:t>NAMA DOSEN PENDAMPING LAPANGAN</w:t></w:r></w:p></w:tc><w:tc><w:tcPr><w:tcW w:w="4677" w:type="dxa"/></w:tcPr><w:p><w:r><w:rPr><w:rFonts w:ascii="Times New Roman" w:hAnsi="Times New Roman"/><w:sz w:val="22"/><w:b/></w:rPr><w:t>{dosen_name}</w:t></w:r></w:p></w:tc></w:tr></w:tbl><w:p><w:pPr><w:pBdr><w:top w:val="nil"/><w:left w:val="nil"/><w:bottom w:val="nil"/><w:right w:val="nil"/><w:between w:val="nil"/></w:pBdr><w:rPr><w:b/><w:color w:val="000000"/><w:sz w:val="20"/><w:szCs w:val="20"/></w:rPr></w:pPr><w:r><w:rPr><w:noProof/></w:rPr><w:drawing><wp:anchor distT="0" distB="0" distL="114300" distR="114300" simplePos="0" relativeHeight="251659264" behindDoc="0" locked="0" layoutInCell="1" hidden="0" allowOverlap="1" wp14:anchorId="068DF41D" wp14:editId="0EDAA620"><wp:simplePos x="0" y="0"/><wp:positionH relativeFrom="column"><wp:posOffset>1955482</wp:posOffset></wp:positionH><wp:positionV relativeFrom="paragraph"><wp:posOffset>215900</wp:posOffset></wp:positionV><wp:extent cx="2032635" cy="2035175"/><wp:effectExtent l="0" t="0" r="0" b="0"/><wp:wrapTopAndBottom distT="0" distB="0"/><wp:docPr id="1900290531" name="image2.png"/><wp:cNvGraphicFramePr/><a:graphic xmlns:a="http://schemas.openxmlformats.org/drawingml/2006/main"><a:graphicData uri="http://schemas.openxmlformats.org/drawingml/2006/picture"><pic:pic xmlns:pic="http://schemas.openxmlformats.org/drawingml/2006/picture"><pic:nvPicPr><pic:cNvPr id="0" name="image2.png"/><pic:cNvPicPr preferRelativeResize="0"/></pic:nvPicPr><pic:blipFill><a:blip r:embed="rId6"/><a:srcRect/><a:stretch><a:fillRect/></a:stretch></pic:blipFill><pic:spPr><a:xfrm><a:off x="0" y="0"/><a:ext cx="2032635" cy="2035175"/></a:xfrm><a:prstGeom prst="rect"><a:avLst/></a:prstGeom><a:ln/></pic:spPr></pic:pic></a:graphicData></a:graphic></wp:anchor></w:drawing></w:r></w:p><w:p><w:pPr><w:spacing w:before="2"/><w:ind w:left="2880" w:right="3233"/><w:jc w:val="center"/><w:rPr><w:sz w:val="26"/><w:szCs w:val="26"/></w:rPr></w:pPr></w:p><w:p><w:pPr><w:jc w:val="center"/><w:rPr><w:sz w:val="26"/><w:szCs w:val="26"/></w:rPr></w:pPr></w:p><w:p><w:pPr><w:pBdr><w:top w:val="nil"/><w:left w:val="nil"/><w:bottom w:val="nil"/><w:right w:val="nil"/><w:between w:val="nil"/></w:pBdr><w:jc w:val="center"/><w:rPr><w:sz w:val="26"/><w:szCs w:val="26"/></w:rPr></w:pPr><w:r><w:rPr><w:sz w:val="26"/><w:szCs w:val="26"/></w:rPr><w:t>LEMBAGA PENELITIAN DAN PENGABDIAN KEPADA MASYARAKAT</w:t></w:r></w:p><w:p><w:pPr><w:jc w:val="center"/><w:rPr><w:sz w:val="26"/><w:szCs w:val="26"/></w:rPr></w:pPr><w:r><w:rPr><w:sz w:val="26"/><w:szCs w:val="26"/></w:rPr><w:t>UNIVERSITAS MARITIM RAJA ALI HAJI</w:t></w:r></w:p><w:p><w:pPr><w:jc w:val="center"/><w:rPr><w:sz w:val="26"/><w:szCs w:val="26"/></w:rPr></w:pPr><w:r><w:rPr><w:sz w:val="26"/><w:szCs w:val="26"/></w:rPr><w:t>2025</w:t></w:r></w:p><w:tbl><w:tblPr><w:tblStyle w:val="a0"/><w:tblW w:w="10365" w:type="dxa"/><w:tblInd w:w="-508" w:type="dxa"/><w:tblBorders><w:top w:val="single" w:sz="4" w:space="0" w:color="000000"/><w:left w:val="single" w:sz="4" w:space="0" w:color="000000"/><w:bottom w:val="single" w:sz="4" w:space="0" w:color="000000"/><w:right w:val="single" w:sz="4" w:space="0" w:color="000000"/><w:insideH w:val="single" w:sz="4" w:space="0" w:color="000000"/><w:insideV w:val="single" w:sz="4" w:space="0" w:color="000000"/></w:tblBorders><w:tblLayout w:type="fixed"/><w:tblLook w:val="0000" w:firstRow="0" w:lastRow="0" w:firstColumn="0" w:lastColumn="0" w:noHBand="0" w:noVBand="0"/></w:tblPr><w:tblGrid><w:gridCol w:w="635"/><w:gridCol w:w="1465"/><w:gridCol w:w="720"/><w:gridCol w:w="1110"/><w:gridCol w:w="532"/><w:gridCol w:w="788"/><w:gridCol w:w="2565"/><w:gridCol w:w="2550"/></w:tblGrid><w:tr><w:trPr><w:trHeight w:val="1955"/></w:trPr><w:tc><w:tcPr><w:tcW w:w="3930" w:type="dxa"/><w:gridSpan w:val="4"/><w:tcBorders><w:top w:val="single" w:sz="12" w:space="0" w:color="000000"/><w:left w:val="single" w:sz="12" w:space="0" w:color="000000"/><w:bottom w:val="single" w:sz="12" w:space="0" w:color="000000"/><w:right w:val="single" w:sz="12" w:space="0" w:color="000000"/></w:tcBorders></w:tcPr><w:p><w:pPr><w:pBdr><w:top w:val="nil"/><w:left w:val="nil"/><w:bottom w:val="nil"/><w:right w:val="nil"/><w:between w:val="nil"/></w:pBdr><w:ind w:left="561"/><w:rPr><w:color w:val="000000"/><w:sz w:val="20"/><w:szCs w:val="20"/></w:rPr></w:pPr><w:r><w:rPr><w:noProof/></w:rPr><w:lastRenderedPageBreak/><w:drawing><wp:anchor distT="0" distB="0" distL="114300" distR="114300" simplePos="0" relativeHeight="251660288" behindDoc="0" locked="0" layoutInCell="1" hidden="0" allowOverlap="1" wp14:anchorId="7523C5D4" wp14:editId="78695CA9"><wp:simplePos x="0" y="0"/><wp:positionH relativeFrom="column"><wp:posOffset>316865</wp:posOffset></wp:positionH><wp:positionV relativeFrom="paragraph"><wp:posOffset>43180</wp:posOffset></wp:positionV><wp:extent cx="1156335" cy="1157605"/><wp:effectExtent l="0" t="0" r="0" b="0"/><wp:wrapTopAndBottom distT="0" distB="0"/><wp:docPr id="1900290530" name="image1.png"/><wp:cNvGraphicFramePr/><a:graphic xmlns:a="http://schemas.openxmlformats.org/drawingml/2006/main"><a:graphicData uri="http://schemas.openxmlformats.org/drawingml/2006/picture"><pic:pic xmlns:pic="http://schemas.openxmlformats.org/drawingml/2006/picture"><pic:nvPicPr><pic:cNvPr id="0" name="image1.png"/><pic:cNvPicPr preferRelativeResize="0"/></pic:nvPicPr><pic:blipFill><a:blip r:embed="rId7"/><a:srcRect/><a:stretch><a:fillRect/></a:stretch></pic:blipFill><pic:spPr><a:xfrm><a:off x="0" y="0"/><a:ext cx="1156335" cy="1157605"/></a:xfrm><a:prstGeom prst="rect"><a:avLst/></a:prstGeom><a:ln/></pic:spPr></pic:pic></a:graphicData></a:graphic></wp:anchor></w:drawing></w:r></w:p></w:tc><w:tc><w:tcPr><w:tcW w:w="3885" w:type="dxa"/><w:gridSpan w:val="3"/><w:tcBorders><w:top w:val="single" w:sz="12" w:space="0" w:color="000000"/><w:left w:val="single" w:sz="12" w:space="0" w:color="000000"/><w:bottom w:val="single" w:sz="12" w:space="0" w:color="000000"/><w:right w:val="single" w:sz="12" w:space="0" w:color="000000"/></w:tcBorders></w:tcPr><w:p><w:pPr><w:pBdr><w:top w:val="nil"/><w:left w:val="nil"/><w:bottom w:val="nil"/><w:right w:val="nil"/><w:between w:val="nil"/></w:pBdr><w:spacing w:before="3"/><w:ind w:left="106"/><w:rPr><w:b/><w:i/><w:color w:val="000000"/><w:sz w:val="24"/><w:szCs w:val="24"/></w:rPr></w:pPr><w:r><w:rPr><w:b/><w:i/><w:color w:val="000000"/><w:sz w:val="24"/><w:szCs w:val="24"/></w:rPr><w:t>LOGBOOK</w:t></w:r></w:p><w:p><w:pPr><w:pBdr><w:top w:val="nil"/><w:left w:val="nil"/><w:bottom w:val="nil"/><w:right w:val="nil"/><w:between w:val="nil"/></w:pBdr><w:spacing w:before="135" w:line="360" w:lineRule="auto"/><w:ind w:left="106" w:right="267"/><w:rPr><w:b/><w:color w:val="000000"/><w:sz w:val="24"/><w:szCs w:val="24"/></w:rPr></w:pPr><w:r><w:rPr><w:b/><w:color w:val="000000"/><w:sz w:val="24"/><w:szCs w:val="24"/></w:rPr><w:t>KULIAH KERJA NYATA UNIVERSITAS MARITIM RAJA ALI HAJI</w:t></w:r></w:p></w:tc><w:tc><w:tcPr><w:tcW w:w="2550" w:type="dxa"/><w:tcBorders><w:top w:val="single" w:sz="12" w:space="0" w:color="000000"/><w:left w:val="single" w:sz="12" w:space="0" w:color="000000"/><w:bottom w:val="single" w:sz="12" w:space="0" w:color="000000"/><w:right w:val="single" w:sz="12" w:space="0" w:color="000000"/></w:tcBorders></w:tcPr><w:p><w:pPr><w:pBdr><w:top w:val="nil"/><w:left w:val="nil"/><w:bottom w:val="nil"/><w:right w:val="nil"/><w:between w:val="nil"/></w:pBdr><w:rPr><w:color w:val="000000"/><w:sz w:val="24"/><w:szCs w:val="24"/></w:rPr></w:pPr></w:p><w:p><w:pPr><w:pBdr><w:top w:val="nil"/><w:left w:val="nil"/><w:bottom w:val="nil"/><w:right w:val="nil"/><w:between w:val="nil"/></w:pBdr><w:spacing w:before="270"/><w:rPr><w:color w:val="000000"/><w:sz w:val="24"/><w:szCs w:val="24"/></w:rPr></w:pPr></w:p><w:p><w:pPr><w:pBdr><w:top w:val="nil"/><w:left w:val="nil"/><w:bottom w:val="nil"/><w:right w:val="nil"/><w:between w:val="nil"/></w:pBdr><w:spacing w:before="1"/><w:ind w:left="104" w:right="994"/><w:rPr><w:b/><w:color w:val="000000"/><w:sz w:val="24"/><w:szCs w:val="24"/></w:rPr></w:pPr><w:r><w:rPr><w:b/><w:color w:val="000000"/><w:sz w:val="24"/><w:szCs w:val="24"/></w:rPr><w:t>{week_label}</w:t></w:r></w:p></w:tc></w:tr><w:tr><w:trPr><w:trHeight w:val="274"/></w:trPr><w:tc><w:tcPr><w:tcW w:w="10365" w:type="dxa"/><w:gridSpan w:val="8"/><w:tcBorders><w:top w:val="single" w:sz="12" w:space="0" w:color="000000"/><w:left w:val="single" w:sz="8" w:space="0" w:color="000000"/><w:bottom w:val="single" w:sz="8" w:space="0" w:color="000000"/><w:right w:val="single" w:sz="8" w:space="0" w:color="000000"/></w:tcBorders></w:tcPr><w:p><w:pPr><w:pBdr><w:top w:val="nil"/><w:left w:val="nil"/><w:bottom w:val="nil"/><w:right w:val="nil"/><w:between w:val="nil"/></w:pBdr><w:spacing w:line="254" w:lineRule="auto"/><w:ind w:left="107"/><w:rPr><w:b/><w:color w:val="000000"/><w:sz w:val="24"/><w:szCs w:val="24"/></w:rPr></w:pPr><w:r><w:rPr><w:b/><w:color w:val="000000"/><w:sz w:val="24"/><w:szCs w:val="24"/></w:rPr><w:t>NAMA MAHASISWA/NIM/KELOMPOK: {group_info}</w:t></w:r></w:p></w:tc></w:tr><w:tr><w:trPr><w:trHeight w:val="278"/></w:trPr><w:tc><w:tcPr><w:tcW w:w="10365" w:type="dxa"/><w:gridSpan w:val="8"/><w:tcBorders><w:top w:val="single" w:sz="8" w:space="0" w:color="000000"/><w:left w:val="single" w:sz="8" w:space="0" w:color="000000"/><w:bottom w:val="single" w:sz="8" w:space="0" w:color="000000"/><w:right w:val="single" w:sz="8" w:space="0" w:color="000000"/></w:tcBorders></w:tcPr><w:p><w:pPr><w:pBdr><w:top w:val="nil"/><w:left w:val="nil"/><w:bottom w:val="nil"/><w:right w:val="nil"/><w:between w:val="nil"/></w:pBdr><w:spacing w:line="258" w:lineRule="auto"/><w:ind w:left="107"/><w:rPr><w:b/><w:color w:val="000000"/><w:sz w:val="24"/><w:szCs w:val="24"/></w:rPr></w:pPr><w:r><w:rPr><w:b/><w:color w:val="000000"/><w:sz w:val="24"/><w:szCs w:val="24"/></w:rPr><w:t>A. JADWAL:</w:t></w:r></w:p></w:tc></w:tr><w:tr><w:trPr><w:trHeight w:val="230"/></w:trPr><w:tc><w:tcPr><w:tcW w:w="635" w:type="dxa"/><w:tcBorders><w:top w:val="single" w:sz="8" w:space="0" w:color="000000"/><w:left w:val="single" w:sz="8" w:space="0" w:color="000000"/><w:bottom w:val="single" w:sz="8" w:space="0" w:color="000000"/><w:right w:val="single" w:sz="8" w:space="0" w:color="000000"/></w:tcBorders></w:tcPr><w:p><w:pPr><w:rPr><w:b/><w:bCs/><w:color w:val="000000"/><w:sz w:val="20"/><w:szCs w:val="20"/></w:rPr></w:pPr><w:r><w:rPr><w:b/><w:bCs/><w:sz w:val="20"/><w:szCs w:val="20"/></w:rPr><w:t>HARI</w:t></w:r></w:p></w:tc><w:tc><w:tcPr><w:tcW w:w="1465" w:type="dxa"/><w:tcBorders><w:top w:val="single" w:sz="8" w:space="0" w:color="000000"/><w:left w:val="single" w:sz="8" w:space="0" w:color="000000"/><w:bottom w:val="single" w:sz="8" w:space="0" w:color="000000"/><w:right w:val="single" w:sz="8" w:space="0" w:color="000000"/></w:tcBorders></w:tcPr><w:p><w:pPr><w:pBdr><w:top w:val="nil"/><w:left w:val="nil"/><w:bottom w:val="nil"/><w:right w:val="nil"/><w:between w:val="nil"/></w:pBdr><w:spacing w:line="210" w:lineRule="auto"/><w:ind w:left="106"/><w:rPr><w:b/><w:color w:val="000000"/><w:sz w:val="20"/><w:szCs w:val="20"/></w:rPr></w:pPr><w:r><w:rPr><w:b/><w:color w:val="000000"/><w:sz w:val="20"/><w:szCs w:val="20"/></w:rPr><w:t>TANGGAL</w:t></w:r></w:p></w:tc><w:tc><w:tcPr><w:tcW w:w="720" w:type="dxa"/><w:tcBorders><w:top w:val="single" w:sz="8" w:space="0" w:color="000000"/><w:left w:val="single" w:sz="8" w:space="0" w:color="000000"/><w:bottom w:val="single" w:sz="8" w:space="0" w:color="000000"/><w:right w:val="single" w:sz="8" w:space="0" w:color="000000"/></w:tcBorders></w:tcPr><w:p><w:pPr><w:pBdr><w:top w:val="nil"/><w:left w:val="nil"/><w:bottom w:val="nil"/><w:right w:val="nil"/><w:between w:val="nil"/></w:pBdr><w:spacing w:line="210" w:lineRule="auto"/><w:ind w:left="242"/><w:rPr><w:b/><w:color w:val="000000"/><w:sz w:val="20"/><w:szCs w:val="20"/></w:rPr></w:pPr><w:r><w:rPr><w:b/><w:color w:val="000000"/><w:sz w:val="20"/><w:szCs w:val="20"/></w:rPr><w:t>JAM</w:t></w:r></w:p></w:tc><w:tc><w:tcPr><w:tcW w:w="1642" w:type="dxa"/><w:gridSpan w:val="2"/><w:tcBorders><w:top w:val="single" w:sz="8" w:space="0" w:color="000000"/><w:left w:val="single" w:sz="8" w:space="0" w:color="000000"/><w:bottom w:val="single" w:sz="8" w:space="0" w:color="000000"/><w:right w:val="single" w:sz="8" w:space="0" w:color="000000"/></w:tcBorders></w:tcPr><w:p><w:pPr><w:pBdr><w:top w:val="nil"/><w:left w:val="nil"/><w:bottom w:val="nil"/><w:right w:val="nil"/><w:between w:val="nil"/></w:pBdr><w:spacing w:line="210" w:lineRule="auto"/><w:ind w:left="242"/><w:rPr><w:b/><w:color w:val="000000"/><w:sz w:val="20"/><w:szCs w:val="20"/></w:rPr></w:pPr><w:r><w:rPr><w:b/><w:sz w:val="20"/><w:szCs w:val="20"/></w:rPr><w:t>KEGIATAN</w:t></w:r></w:p></w:tc><w:tc><w:tcPr><w:tcW w:w="5903" w:type="dxa"/><w:gridSpan w:val="3"/><w:tcBorders><w:top w:val="single" w:sz="8" w:space="0" w:color="000000"/><w:left w:val="single" w:sz="8" w:space="0" w:color="000000"/><w:bottom w:val="single" w:sz="8" w:space="0" w:color="000000"/><w:right w:val="single" w:sz="8" w:space="0" w:color="000000"/></w:tcBorders></w:tcPr><w:p><w:pPr><w:pBdr><w:top w:val="nil"/><w:left w:val="nil"/><w:bottom w:val="nil"/><w:right w:val="nil"/><w:between w:val="nil"/></w:pBdr><w:spacing w:line="210" w:lineRule="auto"/><w:ind w:right="1"/><w:jc w:val="center"/><w:rPr><w:b/><w:color w:val="FF0000"/><w:sz w:val="20"/><w:szCs w:val="20"/></w:rPr></w:pPr><w:r><w:rPr><w:b/><w:color w:val="FF0000"/><w:sz w:val="20"/><w:szCs w:val="20"/></w:rPr><w:t>Dokumentasi</w:t></w:r></w:p></w:tc></w:tr><w:tr><w:trPr><w:trHeight w:val="230"/></w:trPr><w:tc><w:tcPr><w:tcW w:w="635" w:type="dxa"/><w:tcBorders><w:top w:val="single" w:sz="8" w:space="0" w:color="000000"/><w:left w:val="single" w:sz="8" w:space="0" w:color="000000"/><w:bottom w:val="single" w:sz="8" w:space="0" w:color="000000"/><w:right w:val="single" w:sz="8" w:space="0" w:color="000000"/></w:tcBorders></w:tcPr><w:p><w:pPr><w:rPr><w:sz w:val="20"/><w:szCs w:val="20"/></w:rPr></w:pPr><w:r><w:rPr><w:sz w:val="20"/><w:szCs w:val="20"/></w:rPr><w:t>{#entries}{day_name}</w:t></w:r></w:p></w:tc><w:tc><w:tcPr><w:tcW w:w="1465" w:type="dxa"/><w:tcBorders><w:top w:val="single" w:sz="8" w:space="0" w:color="000000"/><w:left w:val="single" w:sz="8" w:space="0" w:color="000000"/><w:bottom w:val="single" w:sz="8" w:space="0" w:color="000000"/><w:right w:val="single" w:sz="8" w:space="0" w:color="000000"/></w:tcBorders></w:tcPr><w:p><w:pPr><w:rPr><w:sz w:val="20"/><w:szCs w:val="20"/></w:rPr></w:pPr><w:r><w:rPr><w:sz w:val="20"/><w:szCs w:val="20"/></w:rPr><w:t>{entry_date}</w:t></w:r></w:p></w:tc><w:tc><w:tcPr><w:tcW w:w="720" w:type="dxa"/><w:tcBorders><w:top w:val="single" w:sz="8" w:space="0" w:color="000000"/><w:left w:val="single" w:sz="8" w:space="0" w:color="000000"/><w:bottom w:val="single" w:sz="8" w:space="0" w:color="000000"/><w:right w:val="single" w:sz="8" w:space="0" w:color="000000"/></w:tcBorders></w:tcPr><w:p><w:pPr><w:rPr><w:sz w:val="20"/><w:szCs w:val="20"/></w:rPr></w:pPr><w:r><w:rPr><w:sz w:val="20"/><w:szCs w:val="20"/></w:rPr><w:t>{time_range}</w:t></w:r></w:p></w:tc><w:tc><w:tcPr><w:tcW w:w="1642" w:type="dxa"/><w:gridSpan w:val="2"/><w:tcBorders><w:top w:val="single" w:sz="8" w:space="0" w:color="000000"/><w:left w:val="single" w:sz="8" w:space="0" w:color="000000"/><w:bottom w:val="single" w:sz="8" w:space="0" w:color="000000"/><w:right w:val="single" w:sz="8" w:space="0" w:color="000000"/></w:tcBorders></w:tcPr><w:p><w:pPr><w:rPr><w:sz w:val="20"/><w:szCs w:val="20"/></w:rPr></w:pPr><w:r><w:rPr><w:sz w:val="20"/><w:szCs w:val="20"/></w:rPr><w:t>{activity_description}</w:t></w:r></w:p></w:tc><w:tc><w:tcPr><w:tcW w:w="5903" w:type="dxa"/><w:gridSpan w:val="3"/><w:tcBorders><w:top w:val="single" w:sz="8" w:space="0" w:color="000000"/><w:left w:val="single" w:sz="8" w:space="0" w:color="000000"/><w:bottom w:val="single" w:sz="8" w:space="0" w:color="000000"/><w:right w:val="single" w:sz="8" w:space="0" w:color="000000"/></w:tcBorders></w:tcPr><w:p><w:pPr><w:jc w:val="center"/><w:rPr><w:sz w:val="20"/><w:szCs w:val="20"/></w:rPr></w:pPr><w:r><w:rPr><w:sz w:val="20"/><w:szCs w:val="20"/></w:rPr><w:t>{documentation}{/entries}</w:t></w:r></w:p></w:tc></w:tr><w:trHeight w:val="230"/></w:trPr><w:tc><w:tcPr><w:tcW w:w="10365" w:type="dxa"/><w:gridSpan w:val="8"/><w:tcBorders><w:top w:val="single" w:sz="8" w:space="0" w:color="000000"/><w:left w:val="single" w:sz="8" w:space="0" w:color="000000"/><w:bottom w:val="single" w:sz="8" w:space="0" w:color="000000"/><w:right w:val="single" w:sz="8" w:space="0" w:color="000000"/></w:tcBorders></w:tcPr><w:p><w:pPr><w:pBdr><w:top w:val="nil"/><w:left w:val="nil"/><w:bottom w:val="nil"/><w:right w:val="nil"/><w:between w:val="nil"/></w:pBdr><w:ind w:left="107"/><w:jc w:val="both"/><w:rPr><w:b/><w:color w:val="000000"/><w:sz w:val="24"/><w:szCs w:val="24"/></w:rPr></w:pPr><w:r><w:rPr><w:b/><w:color w:val="000000"/><w:sz w:val="24"/><w:szCs w:val="24"/></w:rPr><w:t>B. CATATAN PENTING HARIAN</w:t></w:r></w:p></w:tc></w:tr><w:tr><w:trPr><w:trHeight w:val="1838"/></w:trPr><w:tc><w:tcPr><w:tcW w:w="10365" w:type="dxa"/><w:gridSpan w:val="8"/><w:tcBorders><w:top w:val="single" w:sz="8" w:space="0" w:color="000000"/><w:left w:val="single" w:sz="8" w:space="0" w:color="000000"/><w:bottom w:val="single" w:sz="8" w:space="0" w:color="000000"/><w:right w:val="single" w:sz="8" w:space="0" w:color="000000"/></w:tcBorders></w:tcPr><w:p><w:pPr><w:spacing w:line="226" w:lineRule="auto"/><w:ind w:left="107"/><w:rPr><w:color w:val="000000"/><w:sz w:val="20"/><w:szCs w:val="20"/></w:rPr></w:pPr><w:r><w:rPr><w:color w:val="000000"/><w:sz w:val="20"/><w:szCs w:val="20"/></w:rPr><w:t>1. {note_1}</w:t></w:r></w:p><w:p><w:pPr><w:spacing w:line="226" w:lineRule="auto"/><w:ind w:left="107"/><w:rPr><w:color w:val="000000"/><w:sz w:val="20"/><w:szCs w:val="20"/></w:rPr></w:pPr><w:r><w:rPr><w:color w:val="000000"/><w:sz w:val="20"/><w:szCs w:val="20"/></w:rPr><w:t>2. {note_2}</w:t></w:r></w:p><w:p><w:pPr><w:spacing w:line="226" w:lineRule="auto"/><w:ind w:left="107"/><w:rPr><w:color w:val="000000"/><w:sz w:val="20"/><w:szCs w:val="20"/></w:rPr></w:pPr><w:r><w:rPr><w:color w:val="000000"/><w:sz w:val="20"/><w:szCs w:val="20"/></w:rPr><w:t>3. {note_3}</w:t></w:r></w:p></w:tc></w:tr><w:tr><w:trPr><w:trHeight w:val="1579"/></w:trPr><w:tc><w:tcPr><w:tcW w:w="10365" w:type="dxa"/><w:gridSpan w:val="8"/><w:vMerge w:val="restart"/><w:tcBorders><w:top w:val="single" w:sz="8" w:space="0" w:color="000000"/><w:left w:val="single" w:sz="8" w:space="0" w:color="000000"/><w:bottom w:val="single" w:sz="8" w:space="0" w:color="000000"/><w:right w:val="single" w:sz="8" w:space="0" w:color="000000"/></w:tcBorders></w:tcPr><w:p><w:pPr><w:spacing w:line="275" w:lineRule="auto"/><w:ind w:left="107"/><w:rPr><w:b/><w:sz w:val="24"/><w:szCs w:val="24"/></w:rPr></w:pPr><w:r><w:rPr><w:b/><w:sz w:val="24"/><w:szCs w:val="24"/></w:rPr><w:t>D. PENGESAHAN</w:t></w:r></w:p></w:tc></w:tr><w:tr><w:trPr><w:trHeight w:val="276"/></w:trPr><w:tc><w:tcPr><w:tcW w:w="10365" w:type="dxa"/><w:gridSpan w:val="8"/><w:vMerge/><w:tcBorders><w:top w:val="single" w:sz="8" w:space="0" w:color="000000"/><w:left w:val="single" w:sz="8" w:space="0" w:color="000000"/><w:bottom w:val="single" w:sz="8" w:space="0" w:color="000000"/><w:right w:val="single" w:sz="8" w:space="0" w:color="000000"/></w:tcBorders></w:tcPr><w:p><w:pPr><w:pBdr><w:top w:val="nil"/><w:left w:val="nil"/><w:bottom w:val="nil"/><w:right w:val="nil"/><w:between w:val="nil"/></w:pBdr><w:rPr><w:b/><w:color w:val="000000"/><w:sz w:val="24"/><w:szCs w:val="24"/></w:rPr></w:pPr></w:p></w:tc></w:tr><w:tr><w:trPr><w:trHeight w:val="1634"/></w:trPr><w:tc><w:tcPr><w:tcW w:w="5250" w:type="dxa"/><w:gridSpan w:val="6"/><w:tcBorders><w:top w:val="single" w:sz="8" w:space="0" w:color="000000"/><w:left w:val="single" w:sz="8" w:space="0" w:color="000000"/><w:bottom w:val="single" w:sz="8" w:space="0" w:color="000000"/><w:right w:val="single" w:sz="8" w:space="0" w:color="000000"/></w:tcBorders></w:tcPr><w:p><w:pPr><w:pBdr><w:top w:val="nil"/><w:left w:val="nil"/><w:bottom w:val="nil"/><w:right w:val="nil"/><w:between w:val="nil"/></w:pBdr><w:spacing w:line="251" w:lineRule="auto"/><w:ind w:left="263"/><w:rPr><w:b/><w:color w:val="000000"/></w:rPr></w:pPr><w:r><w:rPr><w:b/><w:color w:val="000000"/></w:rPr><w:t>TANDA TANGAN LURAH/KEPALA DESA</w:t></w:r></w:p></w:tc><w:tc><w:tcPr><w:tcW w:w="5115" w:type="dxa"/><w:gridSpan w:val="2"/><w:tcBorders><w:top w:val="single" w:sz="8" w:space="0" w:color="000000"/><w:left w:val="single" w:sz="8" w:space="0" w:color="000000"/><w:bottom w:val="single" w:sz="8" w:space="0" w:color="000000"/><w:right w:val="single" w:sz="8" w:space="0" w:color="000000"/></w:tcBorders></w:tcPr><w:p><w:pPr><w:pBdr><w:top w:val="nil"/><w:left w:val="nil"/><w:bottom w:val="nil"/><w:right w:val="nil"/><w:between w:val="nil"/></w:pBdr><w:spacing w:line="275" w:lineRule="auto"/><w:ind w:left="1001"/><w:rPr><w:b/><w:color w:val="000000"/><w:sz w:val="24"/><w:szCs w:val="24"/></w:rPr></w:pPr><w:r><w:rPr><w:b/><w:color w:val="000000"/><w:sz w:val="24"/><w:szCs w:val="24"/></w:rPr><w:t>TANDA TANGAN MAHASISWA</w:t></w:r></w:p></w:tc></w:tr></w:tbl><w:p><w:pPr><w:spacing w:before="240" w:after="240"/><w:jc w:val="both"/><w:rPr><w:b/><w:sz w:val="24"/><w:szCs w:val="24"/></w:rPr></w:pPr><w:r><w:rPr><w:b/><w:sz w:val="24"/><w:szCs w:val="24"/></w:rPr><w:t>Petunjuk Pengisian:</w:t></w:r></w:p><w:p><w:pPr><w:numPr><w:ilvl w:val="0"/><w:numId w:val="1"/></w:numPr><w:pBdr><w:top w:val="nil"/><w:left w:val="nil"/><w:bottom w:val="nil"/><w:right w:val="nil"/><w:between w:val="nil"/></w:pBdr><w:jc w:val="both"/><w:rPr><w:sz w:val="24"/><w:szCs w:val="24"/></w:rPr></w:pPr><w:r><w:rPr><w:sz w:val="24"/><w:szCs w:val="24"/></w:rPr><w:t xml:space="preserve">Logbook adalah buku catatan harian bagi peserta KKN yang wajib diisi setiap hari dan dilaporkan kepada Dosen Pembimbing Lapangan (DPL) setiap minggu Ling google form. </w:t></w:r></w:p><w:p><w:pPr><w:numPr><w:ilvl w:val="0"/><w:numId w:val="1"/></w:numPr><w:pBdr><w:top w:val="nil"/><w:left w:val="nil"/><w:bottom w:val="nil"/><w:right w:val="nil"/><w:between w:val="nil"/></w:pBdr><w:jc w:val="both"/><w:rPr><w:sz w:val="24"/><w:szCs w:val="24"/></w:rPr></w:pPr><w:r><w:rPr><w:sz w:val="24"/><w:szCs w:val="24"/></w:rPr><w:t>Logbook hanya boleh diisi dengan aktivitas yang berkaitan dengan program KKN.</w:t></w:r></w:p><w:p><w:pPr><w:numPr><w:ilvl w:val="0"/><w:numId w:val="1"/></w:numPr><w:pBdr><w:top w:val="nil"/><w:left w:val="nil"/><w:bottom w:val="nil"/><w:right w:val="nil"/><w:between w:val="nil"/></w:pBdr><w:jc w:val="both"/><w:rPr><w:sz w:val="24"/><w:szCs w:val="24"/></w:rPr></w:pPr><w:r><w:rPr><w:sz w:val="24"/><w:szCs w:val="24"/></w:rPr><w:t>Setiap logbook harus ditempelkan pas foto berwarna terbaru dengan ukuran 4x6 cm.</w:t></w:r></w:p><w:p><w:pPr><w:numPr><w:ilvl w:val="0"/><w:numId w:val="1"/></w:numPr><w:pBdr><w:top w:val="nil"/><w:left w:val="nil"/><w:bottom w:val="nil"/><w:right w:val="nil"/><w:between w:val="nil"/></w:pBdr><w:jc w:val="both"/><w:rPr><w:sz w:val="24"/><w:szCs w:val="24"/></w:rPr></w:pPr><w:r><w:rPr><w:sz w:val="24"/><w:szCs w:val="24"/></w:rPr><w:t>Isi logbook mencakup kegiatan harian, catatan penting, serta dokumentasi seperti foto, tautan video, dan lain-lain.</w:t></w:r></w:p><w:p><w:pPr><w:numPr><w:ilvl w:val="0"/><w:numId w:val="1"/></w:numPr><w:pBdr><w:top w:val="nil"/><w:left w:val="nil"/><w:bottom w:val="nil"/><w:right w:val="nil"/><w:between w:val="nil"/></w:pBdr><w:jc w:val="both"/><w:rPr><w:sz w:val="24"/><w:szCs w:val="24"/></w:rPr></w:pPr><w:r><w:rPr><w:sz w:val="24"/><w:szCs w:val="24"/></w:rPr><w:t>Penulisan logbook harus menggunakan bahasa Indonesia yang baik dan benar sesuai kaidah baku.</w:t></w:r></w:p><w:p><w:pPr><w:numPr><w:ilvl w:val="0"/><w:numId w:val="1"/></w:numPr><w:pBdr><w:top w:val="nil"/><w:left w:val="nil"/><w:bottom w:val="nil"/><w:right w:val="nil"/><w:between w:val="nil"/></w:pBdr><w:jc w:val="both"/><w:rPr><w:sz w:val="24"/><w:szCs w:val="24"/></w:rPr></w:pPr><w:r><w:rPr><w:sz w:val="24"/><w:szCs w:val="24"/></w:rPr><w:t>Pada bagian kolom pengesahan, mahasiswa wajib menandatangani serta menuliskan nama lengkapnya, kemudian nama lurah, kepala desa, atau pihak berwenang lainnya.</w:t></w:r></w:p><w:p><w:pPr><w:numPr><w:ilvl w:val="0"/><w:numId w:val="1"/></w:numPr><w:pBdr><w:top w:val="nil"/><w:left w:val="nil"/><w:bottom w:val="nil"/><w:right w:val="nil"/><w:between w:val="nil"/></w:pBdr><w:jc w:val="both"/><w:rPr><w:sz w:val="24"/><w:szCs w:val="24"/></w:rPr></w:pPr><w:r><w:rPr><w:sz w:val="24"/><w:szCs w:val="24"/></w:rPr><w:t>Selanjutnya, lurah, kepala desa, atau pihak berwenang terkait diminta untuk memberikan tanda tangan pada logbook mingguan tersebut.</w:t></w:r></w:p><w:p><w:pPr><w:numPr><w:ilvl w:val="0"/><w:numId w:val="1"/></w:numPr><w:pBdr><w:top w:val="nil"/><w:left w:val="nil"/><w:bottom w:val="nil"/><w:right w:val="nil"/><w:between w:val="nil"/></w:pBdr><w:jc w:val="both"/><w:rPr><w:sz w:val="24"/><w:szCs w:val="24"/></w:rPr></w:pPr><w:r><w:rPr><w:sz w:val="24"/><w:szCs w:val="24"/></w:rPr><w:t>Mahasiswa kemudian mengirimkan logbook mingguan secara daring kepada DPL masing-masing.</w:t></w:r></w:p><w:p><w:pPr><w:numPr><w:ilvl w:val="0"/><w:numId w:val="1"/></w:numPr><w:pBdr><w:top w:val="nil"/><w:left w:val="nil"/><w:bottom w:val="nil"/><w:right w:val="nil"/><w:between w:val="nil"/></w:pBdr><w:jc w:val="both"/><w:rPr><w:sz w:val="24"/><w:szCs w:val="24"/></w:rPr></w:pPr><w:r><w:rPr><w:sz w:val="24"/><w:szCs w:val="24"/></w:rPr><w:t>DPL akan memeriksa dan memberikan tanggapan terhadap logbook setiap minggu.</w:t></w:r><w:r><w:rPr><w:sz w:val="24"/><w:szCs w:val="24"/></w:rPr><w:br/></w:r></w:p><w:p><w:pPr><w:pBdr><w:top w:val="nil"/><w:left w:val="nil"/><w:bottom w:val="nil"/><w:right w:val="nil"/><w:between w:val="nil"/></w:pBdr><w:ind w:left="1080"/><w:jc w:val="both"/><w:rPr><w:sz w:val="24"/><w:szCs w:val="24"/></w:rPr></w:pPr></w:p><w:sectPr><w:pgSz w:w="12240" w:h="15840"/><w:pgMar w:top="1440" w:right="1440" w:bottom="1440" w:left="1440" w:header="708" w:footer="708" w:gutter="0"/><w:pgNumType w:start="1"/><w:cols w:space="720"/></w:sectPr></w:body></w:document>
+<file path=word/document.xml><?xml version="1.0" encoding="utf-8"?>
+<w:document xmlns:wpc="http://schemas.microsoft.com/office/word/2010/wordprocessingCanvas" xmlns:cx="http://schemas.microsoft.com/office/drawing/2014/chartex" xmlns:cx1="http://schemas.microsoft.com/office/drawing/2015/9/8/chartex" xmlns:cx2="http://schemas.microsoft.com/office/drawing/2015/10/21/chartex" xmlns:cx3="http://schemas.microsoft.com/office/drawing/2016/5/9/chartex" xmlns:cx4="http://schemas.microsoft.com/office/drawing/2016/5/10/chartex" xmlns:cx5="http://schemas.microsoft.com/office/drawing/2016/5/11/chartex" xmlns:cx6="http://schemas.microsoft.com/office/drawing/2016/5/12/chartex" xmlns:cx7="http://schemas.microsoft.com/office/drawing/2016/5/13/chartex" xmlns:cx8="http://schemas.microsoft.com/office/drawing/2016/5/14/chartex" xmlns:mc="http://schemas.openxmlformats.org/markup-compatibility/2006" xmlns:aink="http://schemas.microsoft.com/office/drawing/2016/ink" xmlns:am3d="http://schemas.microsoft.com/office/drawing/2017/model3d" xmlns:o="urn:schemas-microsoft-com:office:office" xmlns:oel="http://schemas.microsoft.com/office/2019/extlst" xmlns:r="http://schemas.openxmlformats.org/officeDocument/2006/relationships" xmlns:m="http://schemas.openxmlformats.org/officeDocument/2006/math" xmlns:v="urn:schemas-microsoft-com:vml" xmlns:wp14="http://schemas.microsoft.com/office/word/2010/wordprocessingDrawing" xmlns:wp="http://schemas.openxmlformats.org/drawingml/2006/wordprocessingDrawing" xmlns:w10="urn:schemas-microsoft-com:office:word" xmlns:w="http://schemas.openxmlformats.org/wordprocessingml/2006/main" xmlns:w14="http://schemas.microsoft.com/office/word/2010/wordml" xmlns:w15="http://schemas.microsoft.com/office/word/2012/wordml" xmlns:w16cex="http://schemas.microsoft.com/office/word/2018/wordml/cex" xmlns:w16cid="http://schemas.microsoft.com/office/word/2016/wordml/cid" xmlns:w16="http://schemas.microsoft.com/office/word/2018/wordml" xmlns:w16du="http://schemas.microsoft.com/office/word/2023/wordml/word16du" xmlns:w16sdtdh="http://schemas.microsoft.com/office/word/2020/wordml/sdtdatahash" xmlns:w16sdtfl="http://schemas.microsoft.com/office/word/2024/wordml/sdtformatlock" xmlns:w16se="http://schemas.microsoft.com/office/word/2015/wordml/symex" xmlns:wpg="http://schemas.microsoft.com/office/word/2010/wordprocessingGroup" xmlns:wpi="http://schemas.microsoft.com/office/word/2010/wordprocessingInk" xmlns:wne="http://schemas.microsoft.com/office/word/2006/wordml" xmlns:wps="http://schemas.microsoft.com/office/word/2010/wordprocessingShape" mc:Ignorable="w14 w15 w16se w16cid w16 w16cex w16sdtdh w16sdtfl w16du wp14">
+  <w:body>
+    <w:p>
+      <w:pPr>
+        <w:spacing w:before="58"/>
+        <w:ind w:left="356" w:right="360"/>
+        <w:jc w:val="center"/>
+        <w:rPr>
+          <w:b/>
+          <w:i/>
+          <w:sz w:val="32"/>
+          <w:szCs w:val="32"/>
+        </w:rPr>
+      </w:pPr>
+      <w:r>
+        <w:rPr>
+          <w:b/>
+          <w:sz w:val="32"/>
+          <w:szCs w:val="32"/>
+        </w:rPr>
+        <w:t xml:space="preserve">BUKU CATATAN HARIAN </w:t>
+      </w:r>
+      <w:r>
+        <w:rPr>
+          <w:b/>
+          <w:i/>
+          <w:sz w:val="32"/>
+          <w:szCs w:val="32"/>
+        </w:rPr>
+        <w:t>(LOGBOOK)</w:t>
+      </w:r>
+    </w:p>
+    <w:p>
+      <w:pPr>
+        <w:pBdr>
+          <w:top w:val="nil"/>
+          <w:left w:val="nil"/>
+          <w:bottom w:val="nil"/>
+          <w:right w:val="nil"/>
+          <w:between w:val="nil"/>
+        </w:pBdr>
+        <w:spacing w:before="31"/>
+        <w:rPr>
+          <w:b/>
+          <w:i/>
+          <w:color w:val="000000"/>
+          <w:sz w:val="32"/>
+          <w:szCs w:val="32"/>
+        </w:rPr>
+      </w:pPr>
+    </w:p>
+    <w:p>
+      <w:pPr>
+        <w:pStyle w:val="Title"/>
+        <w:spacing w:after="0"/>
+        <w:jc w:val="center"/>
+        <w:rPr>
+          <w:rFonts w:ascii="Times New Roman" w:eastAsia="Times New Roman" w:hAnsi="Times New Roman" w:cs="Times New Roman"/>
+          <w:b/>
+          <w:sz w:val="32"/>
+          <w:szCs w:val="32"/>
+        </w:rPr>
+      </w:pPr>
+      <w:r>
+        <w:rPr>
+          <w:rFonts w:ascii="Times New Roman" w:eastAsia="Times New Roman" w:hAnsi="Times New Roman" w:cs="Times New Roman"/>
+          <w:b/>
+          <w:sz w:val="32"/>
+          <w:szCs w:val="32"/>
+        </w:rPr>
+        <w:t xml:space="preserve">KULIAH KERJA NYATA (KKN) </w:t>
+      </w:r>
+    </w:p>
+    <w:p>
+      <w:pPr>
+        <w:pStyle w:val="Title"/>
+        <w:jc w:val="center"/>
+        <w:rPr>
+          <w:rFonts w:ascii="Times New Roman" w:eastAsia="Times New Roman" w:hAnsi="Times New Roman" w:cs="Times New Roman"/>
+          <w:b/>
+          <w:sz w:val="32"/>
+          <w:szCs w:val="32"/>
+        </w:rPr>
+      </w:pPr>
+      <w:r>
+        <w:rPr>
+          <w:rFonts w:ascii="Times New Roman" w:eastAsia="Times New Roman" w:hAnsi="Times New Roman" w:cs="Times New Roman"/>
+          <w:b/>
+          <w:sz w:val="32"/>
+          <w:szCs w:val="32"/>
+        </w:rPr>
+        <w:t>UNIVERSITAS MARITIM RAJA ALI HAJI</w:t>
+      </w:r>
+    </w:p>
+    <w:p>
+      <w:pPr>
+        <w:pBdr>
+          <w:top w:val="nil"/>
+          <w:left w:val="nil"/>
+          <w:bottom w:val="nil"/>
+          <w:right w:val="nil"/>
+          <w:between w:val="nil"/>
+        </w:pBdr>
+        <w:rPr>
+          <w:b/>
+          <w:color w:val="000000"/>
+          <w:sz w:val="20"/>
+          <w:szCs w:val="20"/>
+        </w:rPr>
+      </w:pPr>
+    </w:p>
+    <w:p>
+      <w:pPr>
+        <w:pBdr>
+          <w:top w:val="nil"/>
+          <w:left w:val="nil"/>
+          <w:bottom w:val="nil"/>
+          <w:right w:val="nil"/>
+          <w:between w:val="nil"/>
+        </w:pBdr>
+        <w:rPr>
+          <w:b/>
+          <w:color w:val="000000"/>
+          <w:sz w:val="20"/>
+          <w:szCs w:val="20"/>
+        </w:rPr>
+      </w:pPr>
+    </w:p>
+    <w:p>
+      <w:pPr>
+        <w:pBdr>
+          <w:top w:val="nil"/>
+          <w:left w:val="nil"/>
+          <w:bottom w:val="nil"/>
+          <w:right w:val="nil"/>
+          <w:between w:val="nil"/>
+        </w:pBdr>
+        <w:rPr>
+          <w:b/>
+          <w:color w:val="000000"/>
+          <w:sz w:val="20"/>
+          <w:szCs w:val="20"/>
+        </w:rPr>
+      </w:pPr>
+    </w:p>
+    <w:p>
+      <w:pPr>
+        <w:pBdr>
+          <w:top w:val="nil"/>
+          <w:left w:val="nil"/>
+          <w:bottom w:val="nil"/>
+          <w:right w:val="nil"/>
+          <w:between w:val="nil"/>
+        </w:pBdr>
+        <w:spacing w:before="63"/>
+        <w:rPr>
+          <w:b/>
+          <w:color w:val="000000"/>
+          <w:sz w:val="20"/>
+          <w:szCs w:val="20"/>
+        </w:rPr>
+      </w:pPr>
+    </w:p>
+    <w:tbl>
+      <w:tblPr>
+        <w:tblStyle w:val="a"/>
+        <w:tblW w:w="9354" w:type="dxa"/>
+        <w:tblInd w:w="-5" w:type="dxa"/>
+        <w:tblBorders>
+          <w:top w:val="single" w:sz="4" w:space="0" w:color="000000"/>
+          <w:left w:val="single" w:sz="4" w:space="0" w:color="000000"/>
+          <w:bottom w:val="single" w:sz="4" w:space="0" w:color="000000"/>
+          <w:right w:val="single" w:sz="4" w:space="0" w:color="000000"/>
+          <w:insideH w:val="single" w:sz="4" w:space="0" w:color="000000"/>
+          <w:insideV w:val="single" w:sz="4" w:space="0" w:color="000000"/>
+        </w:tblBorders>
+        <w:tblLayout w:type="fixed"/>
+        <w:tblLook w:val="0000" w:firstRow="0" w:lastRow="0" w:firstColumn="0" w:lastColumn="0" w:noHBand="0" w:noVBand="0"/>
+      </w:tblPr>
+      <w:tblGrid>
+        <w:gridCol w:w="4677"/>
+        <w:gridCol w:w="4677"/>
+      </w:tblGrid>
+      <w:tr>
+        <w:trPr>
+          <w:trHeight w:val="365"/>
+        </w:trPr>
+        <w:tc>
+          <w:tcPr>
+            <w:tcW w:w="4677" w:type="dxa"/>
+          </w:tcPr>
+          <w:p>
+            <w:pPr>
+              <w:pBdr>
+                <w:top w:val="nil"/>
+                <w:left w:val="nil"/>
+                <w:bottom w:val="nil"/>
+                <w:right w:val="nil"/>
+                <w:between w:val="nil"/>
+              </w:pBdr>
+              <w:spacing w:line="226" w:lineRule="auto"/>
+              <w:ind w:left="107"/>
+              <w:rPr>
+                <w:color w:val="000000"/>
+                <w:sz w:val="20"/>
+                <w:szCs w:val="20"/>
+              </w:rPr>
+            </w:pPr>
+            <w:r>
+              <w:rPr>
+                <w:color w:val="000000"/>
+                <w:sz w:val="20"/>
+                <w:szCs w:val="20"/>
+              </w:rPr>
+              <w:t>NAMA</w:t>
+            </w:r>
+          </w:p>
+        </w:tc>
+        <w:tc>
+          <w:tcPr>
+            <w:tcW w:w="4677" w:type="dxa"/>
+          </w:tcPr>
+          <w:p>
+            <w:r>
+              <w:rPr>
+                <w:rFonts w:ascii="Times New Roman" w:hAnsi="Times New Roman"/>
+                <w:sz w:val="22"/>
+                <w:b/>
+              </w:rPr>
+              <w:t>{full_name}</w:t>
+            </w:r>
+          </w:p>
+        </w:tc>
+      </w:tr>
+      <w:tr>
+        <w:trPr>
+          <w:trHeight w:val="366"/>
+        </w:trPr>
+        <w:tc>
+          <w:tcPr>
+            <w:tcW w:w="4677" w:type="dxa"/>
+          </w:tcPr>
+          <w:p>
+            <w:pPr>
+              <w:pBdr>
+                <w:top w:val="nil"/>
+                <w:left w:val="nil"/>
+                <w:bottom w:val="nil"/>
+                <w:right w:val="nil"/>
+                <w:between w:val="nil"/>
+              </w:pBdr>
+              <w:spacing w:line="227" w:lineRule="auto"/>
+              <w:ind w:left="107"/>
+              <w:rPr>
+                <w:color w:val="000000"/>
+                <w:sz w:val="20"/>
+                <w:szCs w:val="20"/>
+              </w:rPr>
+            </w:pPr>
+            <w:r>
+              <w:rPr>
+                <w:color w:val="000000"/>
+                <w:sz w:val="20"/>
+                <w:szCs w:val="20"/>
+              </w:rPr>
+              <w:t>NIM</w:t>
+            </w:r>
+          </w:p>
+        </w:tc>
+        <w:tc>
+          <w:tcPr>
+            <w:tcW w:w="4677" w:type="dxa"/>
+          </w:tcPr>
+          <w:p>
+            <w:r>
+              <w:rPr>
+                <w:rFonts w:ascii="Times New Roman" w:hAnsi="Times New Roman"/>
+                <w:sz w:val="22"/>
+                <w:b/>
+              </w:rPr>
+              <w:t>{student_id}</w:t>
+            </w:r>
+          </w:p>
+        </w:tc>
+      </w:tr>
+      <w:tr>
+        <w:trPr>
+          <w:trHeight w:val="370"/>
+        </w:trPr>
+        <w:tc>
+          <w:tcPr>
+            <w:tcW w:w="4677" w:type="dxa"/>
+          </w:tcPr>
+          <w:p>
+            <w:pPr>
+              <w:pBdr>
+                <w:top w:val="nil"/>
+                <w:left w:val="nil"/>
+                <w:bottom w:val="nil"/>
+                <w:right w:val="nil"/>
+                <w:between w:val="nil"/>
+              </w:pBdr>
+              <w:spacing w:line="226" w:lineRule="auto"/>
+              <w:ind w:left="107"/>
+              <w:rPr>
+                <w:color w:val="000000"/>
+                <w:sz w:val="20"/>
+                <w:szCs w:val="20"/>
+              </w:rPr>
+            </w:pPr>
+            <w:r>
+              <w:rPr>
+                <w:color w:val="000000"/>
+                <w:sz w:val="20"/>
+                <w:szCs w:val="20"/>
+              </w:rPr>
+              <w:t>FAKULTAS/PRODI</w:t>
+            </w:r>
+          </w:p>
+        </w:tc>
+        <w:tc>
+          <w:tcPr>
+            <w:tcW w:w="4677" w:type="dxa"/>
+          </w:tcPr>
+          <w:p>
+            <w:r>
+              <w:rPr>
+                <w:rFonts w:ascii="Times New Roman" w:hAnsi="Times New Roman"/>
+                <w:sz w:val="22"/>
+                <w:b/>
+              </w:rPr>
+              <w:t>{faculty_prodi}</w:t>
+            </w:r>
+          </w:p>
+        </w:tc>
+      </w:tr>
+      <w:tr>
+        <w:trPr>
+          <w:trHeight w:val="366"/>
+        </w:trPr>
+        <w:tc>
+          <w:tcPr>
+            <w:tcW w:w="4677" w:type="dxa"/>
+          </w:tcPr>
+          <w:p>
+            <w:pPr>
+              <w:pBdr>
+                <w:top w:val="nil"/>
+                <w:left w:val="nil"/>
+                <w:bottom w:val="nil"/>
+                <w:right w:val="nil"/>
+                <w:between w:val="nil"/>
+              </w:pBdr>
+              <w:spacing w:line="222" w:lineRule="auto"/>
+              <w:ind w:left="107"/>
+              <w:rPr>
+                <w:color w:val="000000"/>
+                <w:sz w:val="20"/>
+                <w:szCs w:val="20"/>
+              </w:rPr>
+            </w:pPr>
+            <w:r>
+              <w:rPr>
+                <w:color w:val="000000"/>
+                <w:sz w:val="20"/>
+                <w:szCs w:val="20"/>
+              </w:rPr>
+              <w:t>NAMA LOKASI KKN</w:t>
+            </w:r>
+          </w:p>
+        </w:tc>
+        <w:tc>
+          <w:tcPr>
+            <w:tcW w:w="4677" w:type="dxa"/>
+          </w:tcPr>
+          <w:p>
+            <w:r>
+              <w:rPr>
+                <w:rFonts w:ascii="Times New Roman" w:hAnsi="Times New Roman"/>
+                <w:sz w:val="22"/>
+                <w:b/>
+              </w:rPr>
+              <w:t>{group_location}</w:t>
+            </w:r>
+          </w:p>
+        </w:tc>
+      </w:tr>
+      <w:tr>
+        <w:trPr>
+          <w:trHeight w:val="362"/>
+        </w:trPr>
+        <w:tc>
+          <w:tcPr>
+            <w:tcW w:w="4677" w:type="dxa"/>
+          </w:tcPr>
+          <w:p>
+            <w:pPr>
+              <w:pBdr>
+                <w:top w:val="nil"/>
+                <w:left w:val="nil"/>
+                <w:bottom w:val="nil"/>
+                <w:right w:val="nil"/>
+                <w:between w:val="nil"/>
+              </w:pBdr>
+              <w:spacing w:line="222" w:lineRule="auto"/>
+              <w:ind w:left="107"/>
+              <w:rPr>
+                <w:color w:val="000000"/>
+                <w:sz w:val="20"/>
+                <w:szCs w:val="20"/>
+              </w:rPr>
+            </w:pPr>
+            <w:r>
+              <w:rPr>
+                <w:color w:val="000000"/>
+                <w:sz w:val="20"/>
+                <w:szCs w:val="20"/>
+              </w:rPr>
+              <w:t>NAMA DOSEN PENDAMPING LAPANGAN</w:t>
+            </w:r>
+          </w:p>
+        </w:tc>
+        <w:tc>
+          <w:tcPr>
+            <w:tcW w:w="4677" w:type="dxa"/>
+          </w:tcPr>
+          <w:p>
+            <w:r>
+              <w:rPr>
+                <w:rFonts w:ascii="Times New Roman" w:hAnsi="Times New Roman"/>
+                <w:sz w:val="22"/>
+                <w:b/>
+              </w:rPr>
+              <w:t>{dosen_name}</w:t>
+            </w:r>
+          </w:p>
+        </w:tc>
+      </w:tr>
+    </w:tbl>
+    <w:p>
+      <w:pPr>
+        <w:pBdr>
+          <w:top w:val="nil"/>
+          <w:left w:val="nil"/>
+          <w:bottom w:val="nil"/>
+          <w:right w:val="nil"/>
+          <w:between w:val="nil"/>
+        </w:pBdr>
+        <w:rPr>
+          <w:b/>
+          <w:color w:val="000000"/>
+          <w:sz w:val="20"/>
+          <w:szCs w:val="20"/>
+        </w:rPr>
+      </w:pPr>
+      <w:r>
+        <w:rPr>
+          <w:noProof/>
+        </w:rPr>
+        <w:drawing>
+          <wp:anchor distT="0" distB="0" distL="114300" distR="114300" simplePos="0" relativeHeight="251659264" behindDoc="0" locked="0" layoutInCell="1" hidden="0" allowOverlap="1" wp14:anchorId="068DF41D" wp14:editId="0EDAA620">
+            <wp:simplePos x="0" y="0"/>
+            <wp:positionH relativeFrom="column">
+              <wp:posOffset>1955482</wp:posOffset>
+            </wp:positionH>
+            <wp:positionV relativeFrom="paragraph">
+              <wp:posOffset>215900</wp:posOffset>
+            </wp:positionV>
+            <wp:extent cx="2032635" cy="2035175"/>
+            <wp:effectExtent l="0" t="0" r="0" b="0"/>
+            <wp:wrapTopAndBottom distT="0" distB="0"/>
+            <wp:docPr id="1900290531" name="image2.png"/>
+            <wp:cNvGraphicFramePr/>
+            <a:graphic xmlns:a="http://schemas.openxmlformats.org/drawingml/2006/main">
+              <a:graphicData uri="http://schemas.openxmlformats.org/drawingml/2006/picture">
+                <pic:pic xmlns:pic="http://schemas.openxmlformats.org/drawingml/2006/picture">
+                  <pic:nvPicPr>
+                    <pic:cNvPr id="0" name="image2.png"/>
+                    <pic:cNvPicPr preferRelativeResize="0"/>
+                  </pic:nvPicPr>
+                  <pic:blipFill>
+                    <a:blip r:embed="rId6"/>
+                    <a:srcRect/>
+                    <a:stretch>
+                      <a:fillRect/>
+                    </a:stretch>
+                  </pic:blipFill>
+                  <pic:spPr>
+                    <a:xfrm>
+                      <a:off x="0" y="0"/>
+                      <a:ext cx="2032635" cy="2035175"/>
+                    </a:xfrm>
+                    <a:prstGeom prst="rect">
+                      <a:avLst/>
+                    </a:prstGeom>
+                    <a:ln/>
+                  </pic:spPr>
+                </pic:pic>
+              </a:graphicData>
+            </a:graphic>
+          </wp:anchor>
+        </w:drawing>
+      </w:r>
+    </w:p>
+    <w:p>
+      <w:pPr>
+        <w:spacing w:before="2"/>
+        <w:ind w:left="2880" w:right="3233"/>
+        <w:jc w:val="center"/>
+        <w:rPr>
+          <w:sz w:val="26"/>
+          <w:szCs w:val="26"/>
+        </w:rPr>
+      </w:pPr>
+    </w:p>
+    <w:p>
+      <w:pPr>
+        <w:jc w:val="center"/>
+        <w:rPr>
+          <w:sz w:val="26"/>
+          <w:szCs w:val="26"/>
+        </w:rPr>
+      </w:pPr>
+    </w:p>
+    <w:p>
+      <w:pPr>
+        <w:pBdr>
+          <w:top w:val="nil"/>
+          <w:left w:val="nil"/>
+          <w:bottom w:val="nil"/>
+          <w:right w:val="nil"/>
+          <w:between w:val="nil"/>
+        </w:pBdr>
+        <w:jc w:val="center"/>
+        <w:rPr>
+          <w:sz w:val="26"/>
+          <w:szCs w:val="26"/>
+        </w:rPr>
+      </w:pPr>
+      <w:r>
+        <w:rPr>
+          <w:sz w:val="26"/>
+          <w:szCs w:val="26"/>
+        </w:rPr>
+        <w:t>LEMBAGA PENELITIAN DAN PENGABDIAN KEPADA MASYARAKAT</w:t>
+      </w:r>
+    </w:p>
+    <w:p>
+      <w:pPr>
+        <w:jc w:val="center"/>
+        <w:rPr>
+          <w:sz w:val="26"/>
+          <w:szCs w:val="26"/>
+        </w:rPr>
+      </w:pPr>
+      <w:r>
+        <w:rPr>
+          <w:sz w:val="26"/>
+          <w:szCs w:val="26"/>
+        </w:rPr>
+        <w:t>UNIVERSITAS MARITIM RAJA ALI HAJI</w:t>
+      </w:r>
+    </w:p>
+    <w:p>
+      <w:pPr>
+        <w:jc w:val="center"/>
+        <w:rPr>
+          <w:sz w:val="26"/>
+          <w:szCs w:val="26"/>
+        </w:rPr>
+      </w:pPr>
+      <w:r>
+        <w:rPr>
+          <w:sz w:val="26"/>
+          <w:szCs w:val="26"/>
+        </w:rPr>
+        <w:t>2025</w:t>
+      </w:r>
+    </w:p>
+    <w:tbl>
+      <w:tblPr>
+        <w:tblStyle w:val="a0"/>
+        <w:tblW w:w="10365" w:type="dxa"/>
+        <w:tblInd w:w="-508" w:type="dxa"/>
+        <w:tblBorders>
+          <w:top w:val="single" w:sz="4" w:space="0" w:color="000000"/>
+          <w:left w:val="single" w:sz="4" w:space="0" w:color="000000"/>
+          <w:bottom w:val="single" w:sz="4" w:space="0" w:color="000000"/>
+          <w:right w:val="single" w:sz="4" w:space="0" w:color="000000"/>
+          <w:insideH w:val="single" w:sz="4" w:space="0" w:color="000000"/>
+          <w:insideV w:val="single" w:sz="4" w:space="0" w:color="000000"/>
+        </w:tblBorders>
+        <w:tblLayout w:type="fixed"/>
+        <w:tblLook w:val="0000" w:firstRow="0" w:lastRow="0" w:firstColumn="0" w:lastColumn="0" w:noHBand="0" w:noVBand="0"/>
+      </w:tblPr>
+      <w:tblGrid>
+        <w:gridCol w:w="635"/>
+        <w:gridCol w:w="1465"/>
+        <w:gridCol w:w="720"/>
+        <w:gridCol w:w="1110"/>
+        <w:gridCol w:w="532"/>
+        <w:gridCol w:w="788"/>
+        <w:gridCol w:w="2565"/>
+        <w:gridCol w:w="2550"/>
+      </w:tblGrid>
+      <w:tr>
+        <w:trPr>
+          <w:trHeight w:val="1955"/>
+        </w:trPr>
+        <w:tc>
+          <w:tcPr>
+            <w:tcW w:w="3930" w:type="dxa"/>
+            <w:gridSpan w:val="4"/>
+            <w:tcBorders>
+              <w:top w:val="single" w:sz="12" w:space="0" w:color="000000"/>
+              <w:left w:val="single" w:sz="12" w:space="0" w:color="000000"/>
+              <w:bottom w:val="single" w:sz="12" w:space="0" w:color="000000"/>
+              <w:right w:val="single" w:sz="12" w:space="0" w:color="000000"/>
+            </w:tcBorders>
+          </w:tcPr>
+          <w:p>
+            <w:pPr>
+              <w:pBdr>
+                <w:top w:val="nil"/>
+                <w:left w:val="nil"/>
+                <w:bottom w:val="nil"/>
+                <w:right w:val="nil"/>
+                <w:between w:val="nil"/>
+              </w:pBdr>
+              <w:ind w:left="561"/>
+              <w:rPr>
+                <w:color w:val="000000"/>
+                <w:sz w:val="20"/>
+                <w:szCs w:val="20"/>
+              </w:rPr>
+            </w:pPr>
+            <w:r>
+              <w:rPr>
+                <w:noProof/>
+              </w:rPr>
+              <w:lastRenderedPageBreak/>
+              <w:drawing>
+                <wp:anchor distT="0" distB="0" distL="114300" distR="114300" simplePos="0" relativeHeight="251660288" behindDoc="0" locked="0" layoutInCell="1" hidden="0" allowOverlap="1" wp14:anchorId="7523C5D4" wp14:editId="78695CA9">
+                  <wp:simplePos x="0" y="0"/>
+                  <wp:positionH relativeFrom="column">
+                    <wp:posOffset>316865</wp:posOffset>
+                  </wp:positionH>
+                  <wp:positionV relativeFrom="paragraph">
+                    <wp:posOffset>43180</wp:posOffset>
+                  </wp:positionV>
+                  <wp:extent cx="1156335" cy="1157605"/>
+                  <wp:effectExtent l="0" t="0" r="0" b="0"/>
+                  <wp:wrapTopAndBottom distT="0" distB="0"/>
+                  <wp:docPr id="1900290530" name="image1.png"/>
+                  <wp:cNvGraphicFramePr/>
+                  <a:graphic xmlns:a="http://schemas.openxmlformats.org/drawingml/2006/main">
+                    <a:graphicData uri="http://schemas.openxmlformats.org/drawingml/2006/picture">
+                      <pic:pic xmlns:pic="http://schemas.openxmlformats.org/drawingml/2006/picture">
+                        <pic:nvPicPr>
+                          <pic:cNvPr id="0" name="image1.png"/>
+                          <pic:cNvPicPr preferRelativeResize="0"/>
+                        </pic:nvPicPr>
+                        <pic:blipFill>
+                          <a:blip r:embed="rId7"/>
+                          <a:srcRect/>
+                          <a:stretch>
+                            <a:fillRect/>
+                          </a:stretch>
+                        </pic:blipFill>
+                        <pic:spPr>
+                          <a:xfrm>
+                            <a:off x="0" y="0"/>
+                            <a:ext cx="1156335" cy="1157605"/>
+                          </a:xfrm>
+                          <a:prstGeom prst="rect">
+                            <a:avLst/>
+                          </a:prstGeom>
+                          <a:ln/>
+                        </pic:spPr>
+                      </pic:pic>
+                    </a:graphicData>
+                  </a:graphic>
+                </wp:anchor>
+              </w:drawing>
+            </w:r>
+          </w:p>
+        </w:tc>
+        <w:tc>
+          <w:tcPr>
+            <w:tcW w:w="3885" w:type="dxa"/>
+            <w:gridSpan w:val="3"/>
+            <w:tcBorders>
+              <w:top w:val="single" w:sz="12" w:space="0" w:color="000000"/>
+              <w:left w:val="single" w:sz="12" w:space="0" w:color="000000"/>
+              <w:bottom w:val="single" w:sz="12" w:space="0" w:color="000000"/>
+              <w:right w:val="single" w:sz="12" w:space="0" w:color="000000"/>
+            </w:tcBorders>
+          </w:tcPr>
+          <w:p>
+            <w:pPr>
+              <w:pBdr>
+                <w:top w:val="nil"/>
+                <w:left w:val="nil"/>
+                <w:bottom w:val="nil"/>
+                <w:right w:val="nil"/>
+                <w:between w:val="nil"/>
+              </w:pBdr>
+              <w:spacing w:before="3"/>
+              <w:ind w:left="106"/>
+              <w:rPr>
+                <w:b/>
+                <w:i/>
+                <w:color w:val="000000"/>
+                <w:sz w:val="24"/>
+                <w:szCs w:val="24"/>
+              </w:rPr>
+            </w:pPr>
+            <w:r>
+              <w:rPr>
+                <w:b/>
+                <w:i/>
+                <w:color w:val="000000"/>
+                <w:sz w:val="24"/>
+                <w:szCs w:val="24"/>
+              </w:rPr>
+              <w:t>LOGBOOK</w:t>
+            </w:r>
+          </w:p>
+          <w:p>
+            <w:pPr>
+              <w:pBdr>
+                <w:top w:val="nil"/>
+                <w:left w:val="nil"/>
+                <w:bottom w:val="nil"/>
+                <w:right w:val="nil"/>
+                <w:between w:val="nil"/>
+              </w:pBdr>
+              <w:spacing w:before="135" w:line="360" w:lineRule="auto"/>
+              <w:ind w:left="106" w:right="267"/>
+              <w:rPr>
+                <w:b/>
+                <w:color w:val="000000"/>
+                <w:sz w:val="24"/>
+                <w:szCs w:val="24"/>
+              </w:rPr>
+            </w:pPr>
+            <w:r>
+              <w:rPr>
+                <w:b/>
+                <w:color w:val="000000"/>
+                <w:sz w:val="24"/>
+                <w:szCs w:val="24"/>
+              </w:rPr>
+              <w:t>KULIAH KERJA NYATA UNIVERSITAS MARITIM RAJA ALI HAJI</w:t>
+            </w:r>
+          </w:p>
+        </w:tc>
+        <w:tc>
+          <w:tcPr>
+            <w:tcW w:w="2550" w:type="dxa"/>
+            <w:tcBorders>
+              <w:top w:val="single" w:sz="12" w:space="0" w:color="000000"/>
+              <w:left w:val="single" w:sz="12" w:space="0" w:color="000000"/>
+              <w:bottom w:val="single" w:sz="12" w:space="0" w:color="000000"/>
+              <w:right w:val="single" w:sz="12" w:space="0" w:color="000000"/>
+            </w:tcBorders>
+          </w:tcPr>
+          <w:p>
+            <w:pPr>
+              <w:pBdr>
+                <w:top w:val="nil"/>
+                <w:left w:val="nil"/>
+                <w:bottom w:val="nil"/>
+                <w:right w:val="nil"/>
+                <w:between w:val="nil"/>
+              </w:pBdr>
+              <w:rPr>
+                <w:color w:val="000000"/>
+                <w:sz w:val="24"/>
+                <w:szCs w:val="24"/>
+              </w:rPr>
+            </w:pPr>
+          </w:p>
+          <w:p>
+            <w:pPr>
+              <w:pBdr>
+                <w:top w:val="nil"/>
+                <w:left w:val="nil"/>
+                <w:bottom w:val="nil"/>
+                <w:right w:val="nil"/>
+                <w:between w:val="nil"/>
+              </w:pBdr>
+              <w:spacing w:before="270"/>
+              <w:rPr>
+                <w:color w:val="000000"/>
+                <w:sz w:val="24"/>
+                <w:szCs w:val="24"/>
+              </w:rPr>
+            </w:pPr>
+          </w:p>
+          <w:p>
+            <w:pPr>
+              <w:pBdr>
+                <w:top w:val="nil"/>
+                <w:left w:val="nil"/>
+                <w:bottom w:val="nil"/>
+                <w:right w:val="nil"/>
+                <w:between w:val="nil"/>
+              </w:pBdr>
+              <w:spacing w:before="1"/>
+              <w:ind w:left="104" w:right="994"/>
+              <w:rPr>
+                <w:b/>
+                <w:color w:val="000000"/>
+                <w:sz w:val="24"/>
+                <w:szCs w:val="24"/>
+              </w:rPr>
+            </w:pPr>
+            <w:r>
+              <w:rPr>
+                <w:b/>
+                <w:color w:val="000000"/>
+                <w:sz w:val="24"/>
+                <w:szCs w:val="24"/>
+              </w:rPr>
+              <w:t>{week_label}</w:t>
+            </w:r>
+          </w:p>
+        </w:tc>
+      </w:tr>
+      <w:tr>
+        <w:trPr>
+          <w:trHeight w:val="274"/>
+        </w:trPr>
+        <w:tc>
+          <w:tcPr>
+            <w:tcW w:w="10365" w:type="dxa"/>
+            <w:gridSpan w:val="8"/>
+            <w:tcBorders>
+              <w:top w:val="single" w:sz="12" w:space="0" w:color="000000"/>
+              <w:left w:val="single" w:sz="8" w:space="0" w:color="000000"/>
+              <w:bottom w:val="single" w:sz="8" w:space="0" w:color="000000"/>
+              <w:right w:val="single" w:sz="8" w:space="0" w:color="000000"/>
+            </w:tcBorders>
+          </w:tcPr>
+          <w:p>
+            <w:pPr>
+              <w:pBdr>
+                <w:top w:val="nil"/>
+                <w:left w:val="nil"/>
+                <w:bottom w:val="nil"/>
+                <w:right w:val="nil"/>
+                <w:between w:val="nil"/>
+              </w:pBdr>
+              <w:spacing w:line="254" w:lineRule="auto"/>
+              <w:ind w:left="107"/>
+              <w:rPr>
+                <w:b/>
+                <w:color w:val="000000"/>
+                <w:sz w:val="24"/>
+                <w:szCs w:val="24"/>
+              </w:rPr>
+            </w:pPr>
+            <w:r>
+              <w:rPr>
+                <w:b/>
+                <w:color w:val="000000"/>
+                <w:sz w:val="24"/>
+                <w:szCs w:val="24"/>
+              </w:rPr>
+              <w:t>NAMA MAHASISWA/NIM/KELOMPOK: {group_info}</w:t>
+            </w:r>
+          </w:p>
+        </w:tc>
+      </w:tr>
+      <w:tr>
+        <w:trPr>
+          <w:trHeight w:val="278"/>
+        </w:trPr>
+        <w:tc>
+          <w:tcPr>
+            <w:tcW w:w="10365" w:type="dxa"/>
+            <w:gridSpan w:val="8"/>
+            <w:tcBorders>
+              <w:top w:val="single" w:sz="8" w:space="0" w:color="000000"/>
+              <w:left w:val="single" w:sz="8" w:space="0" w:color="000000"/>
+              <w:bottom w:val="single" w:sz="8" w:space="0" w:color="000000"/>
+              <w:right w:val="single" w:sz="8" w:space="0" w:color="000000"/>
+            </w:tcBorders>
+          </w:tcPr>
+          <w:p>
+            <w:pPr>
+              <w:pBdr>
+                <w:top w:val="nil"/>
+                <w:left w:val="nil"/>
+                <w:bottom w:val="nil"/>
+                <w:right w:val="nil"/>
+                <w:between w:val="nil"/>
+              </w:pBdr>
+              <w:spacing w:line="258" w:lineRule="auto"/>
+              <w:ind w:left="107"/>
+              <w:rPr>
+                <w:b/>
+                <w:color w:val="000000"/>
+                <w:sz w:val="24"/>
+                <w:szCs w:val="24"/>
+              </w:rPr>
+            </w:pPr>
+            <w:r>
+              <w:rPr>
+                <w:b/>
+                <w:color w:val="000000"/>
+                <w:sz w:val="24"/>
+                <w:szCs w:val="24"/>
+              </w:rPr>
+              <w:t>A. JADWAL:</w:t>
+            </w:r>
+          </w:p>
+        </w:tc>
+      </w:tr>
+      <w:tr>
+        <w:trPr>
+          <w:trHeight w:val="230"/>
+        </w:trPr>
+        <w:tc>
+          <w:tcPr>
+            <w:tcW w:w="635" w:type="dxa"/>
+            <w:tcBorders>
+              <w:top w:val="single" w:sz="8" w:space="0" w:color="000000"/>
+              <w:left w:val="single" w:sz="8" w:space="0" w:color="000000"/>
+              <w:bottom w:val="single" w:sz="8" w:space="0" w:color="000000"/>
+              <w:right w:val="single" w:sz="8" w:space="0" w:color="000000"/>
+            </w:tcBorders>
+          </w:tcPr>
+          <w:p>
+            <w:pPr>
+              <w:rPr>
+                <w:b/>
+                <w:bCs/>
+                <w:color w:val="000000"/>
+                <w:sz w:val="20"/>
+                <w:szCs w:val="20"/>
+              </w:rPr>
+            </w:pPr>
+            <w:r>
+              <w:rPr>
+                <w:b/>
+                <w:bCs/>
+                <w:sz w:val="20"/>
+                <w:szCs w:val="20"/>
+              </w:rPr>
+              <w:t>HARI</w:t>
+            </w:r>
+          </w:p>
+        </w:tc>
+        <w:tc>
+          <w:tcPr>
+            <w:tcW w:w="1465" w:type="dxa"/>
+            <w:tcBorders>
+              <w:top w:val="single" w:sz="8" w:space="0" w:color="000000"/>
+              <w:left w:val="single" w:sz="8" w:space="0" w:color="000000"/>
+              <w:bottom w:val="single" w:sz="8" w:space="0" w:color="000000"/>
+              <w:right w:val="single" w:sz="8" w:space="0" w:color="000000"/>
+            </w:tcBorders>
+          </w:tcPr>
+          <w:p>
+            <w:pPr>
+              <w:pBdr>
+                <w:top w:val="nil"/>
+                <w:left w:val="nil"/>
+                <w:bottom w:val="nil"/>
+                <w:right w:val="nil"/>
+                <w:between w:val="nil"/>
+              </w:pBdr>
+              <w:spacing w:line="210" w:lineRule="auto"/>
+              <w:ind w:left="106"/>
+              <w:rPr>
+                <w:b/>
+                <w:color w:val="000000"/>
+                <w:sz w:val="20"/>
+                <w:szCs w:val="20"/>
+              </w:rPr>
+            </w:pPr>
+            <w:r>
+              <w:rPr>
+                <w:b/>
+                <w:color w:val="000000"/>
+                <w:sz w:val="20"/>
+                <w:szCs w:val="20"/>
+              </w:rPr>
+              <w:t>TANGGAL</w:t>
+            </w:r>
+          </w:p>
+        </w:tc>
+        <w:tc>
+          <w:tcPr>
+            <w:tcW w:w="720" w:type="dxa"/>
+            <w:tcBorders>
+              <w:top w:val="single" w:sz="8" w:space="0" w:color="000000"/>
+              <w:left w:val="single" w:sz="8" w:space="0" w:color="000000"/>
+              <w:bottom w:val="single" w:sz="8" w:space="0" w:color="000000"/>
+              <w:right w:val="single" w:sz="8" w:space="0" w:color="000000"/>
+            </w:tcBorders>
+          </w:tcPr>
+          <w:p>
+            <w:pPr>
+              <w:pBdr>
+                <w:top w:val="nil"/>
+                <w:left w:val="nil"/>
+                <w:bottom w:val="nil"/>
+                <w:right w:val="nil"/>
+                <w:between w:val="nil"/>
+              </w:pBdr>
+              <w:spacing w:line="210" w:lineRule="auto"/>
+              <w:ind w:left="242"/>
+              <w:rPr>
+                <w:b/>
+                <w:color w:val="000000"/>
+                <w:sz w:val="20"/>
+                <w:szCs w:val="20"/>
+              </w:rPr>
+            </w:pPr>
+            <w:r>
+              <w:rPr>
+                <w:b/>
+                <w:color w:val="000000"/>
+                <w:sz w:val="20"/>
+                <w:szCs w:val="20"/>
+              </w:rPr>
+              <w:t>JAM</w:t>
+            </w:r>
+          </w:p>
+        </w:tc>
+        <w:tc>
+          <w:tcPr>
+            <w:tcW w:w="1642" w:type="dxa"/>
+            <w:gridSpan w:val="2"/>
+            <w:tcBorders>
+              <w:top w:val="single" w:sz="8" w:space="0" w:color="000000"/>
+              <w:left w:val="single" w:sz="8" w:space="0" w:color="000000"/>
+              <w:bottom w:val="single" w:sz="8" w:space="0" w:color="000000"/>
+              <w:right w:val="single" w:sz="8" w:space="0" w:color="000000"/>
+            </w:tcBorders>
+          </w:tcPr>
+          <w:p>
+            <w:pPr>
+              <w:pBdr>
+                <w:top w:val="nil"/>
+                <w:left w:val="nil"/>
+                <w:bottom w:val="nil"/>
+                <w:right w:val="nil"/>
+                <w:between w:val="nil"/>
+              </w:pBdr>
+              <w:spacing w:line="210" w:lineRule="auto"/>
+              <w:ind w:left="242"/>
+              <w:rPr>
+                <w:b/>
+                <w:color w:val="000000"/>
+                <w:sz w:val="20"/>
+                <w:szCs w:val="20"/>
+              </w:rPr>
+            </w:pPr>
+            <w:r>
+              <w:rPr>
+                <w:b/>
+                <w:sz w:val="20"/>
+                <w:szCs w:val="20"/>
+              </w:rPr>
+              <w:t>KEGIATAN</w:t>
+            </w:r>
+          </w:p>
+        </w:tc>
+        <w:tc>
+          <w:tcPr>
+            <w:tcW w:w="5903" w:type="dxa"/>
+            <w:gridSpan w:val="3"/>
+            <w:tcBorders>
+              <w:top w:val="single" w:sz="8" w:space="0" w:color="000000"/>
+              <w:left w:val="single" w:sz="8" w:space="0" w:color="000000"/>
+              <w:bottom w:val="single" w:sz="8" w:space="0" w:color="000000"/>
+              <w:right w:val="single" w:sz="8" w:space="0" w:color="000000"/>
+            </w:tcBorders>
+          </w:tcPr>
+          <w:p>
+            <w:pPr>
+              <w:pBdr>
+                <w:top w:val="nil"/>
+                <w:left w:val="nil"/>
+                <w:bottom w:val="nil"/>
+                <w:right w:val="nil"/>
+                <w:between w:val="nil"/>
+              </w:pBdr>
+              <w:spacing w:line="210" w:lineRule="auto"/>
+              <w:ind w:right="1"/>
+              <w:jc w:val="center"/>
+              <w:rPr>
+                <w:b/>
+                <w:color w:val="FF0000"/>
+                <w:sz w:val="20"/>
+                <w:szCs w:val="20"/>
+              </w:rPr>
+            </w:pPr>
+            <w:r>
+              <w:rPr>
+                <w:b/>
+                <w:color w:val="FF0000"/>
+                <w:sz w:val="20"/>
+                <w:szCs w:val="20"/>
+              </w:rPr>
+              <w:t>Dokumentasi</w:t>
+            </w:r>
+          </w:p>
+        </w:tc>
+      </w:tr>
+      <w:tr>
+        <w:trPr>
+          <w:trHeight w:val="230"/>
+        </w:trPr>
+        <w:tc>
+          <w:tcPr>
+            <w:tcW w:w="635" w:type="dxa"/>
+            <w:tcBorders>
+              <w:top w:val="single" w:sz="8" w:space="0" w:color="000000"/>
+              <w:left w:val="single" w:sz="8" w:space="0" w:color="000000"/>
+              <w:bottom w:val="single" w:sz="8" w:space="0" w:color="000000"/>
+              <w:right w:val="single" w:sz="8" w:space="0" w:color="000000"/>
+            </w:tcBorders>
+          </w:tcPr>
+          <w:p>
+            <w:pPr>
+              <w:pBdr>
+                <w:top w:val="nil"/>
+                <w:left w:val="nil"/>
+                <w:bottom w:val="nil"/>
+                <w:right w:val="nil"/>
+                <w:between w:val="nil"/>
+              </w:pBdr>
+              <w:rPr>
+                <w:color w:val="000000"/>
+                <w:sz w:val="16"/>
+                <w:szCs w:val="16"/>
+              </w:rPr>
+            </w:pPr>
+            <w:r>
+              <w:rPr>
+                <w:rFonts w:ascii="Times New Roman" w:hAnsi="Times New Roman"/>
+                <w:sz w:val="18"/>
+              </w:rPr>
+              <w:t>{#entries}{day_name}</w:t>
+            </w:r>
+          </w:p>
+        </w:tc>
+        <w:tc>
+          <w:tcPr>
+            <w:tcW w:w="1465" w:type="dxa"/>
+            <w:tcBorders>
+              <w:top w:val="single" w:sz="8" w:space="0" w:color="000000"/>
+              <w:left w:val="single" w:sz="8" w:space="0" w:color="000000"/>
+              <w:bottom w:val="single" w:sz="8" w:space="0" w:color="000000"/>
+              <w:right w:val="single" w:sz="8" w:space="0" w:color="000000"/>
+            </w:tcBorders>
+          </w:tcPr>
+          <w:p>
+            <w:pPr>
+              <w:pBdr>
+                <w:top w:val="nil"/>
+                <w:left w:val="nil"/>
+                <w:bottom w:val="nil"/>
+                <w:right w:val="nil"/>
+                <w:between w:val="nil"/>
+              </w:pBdr>
+              <w:rPr>
+                <w:color w:val="000000"/>
+                <w:sz w:val="16"/>
+                <w:szCs w:val="16"/>
+              </w:rPr>
+            </w:pPr>
+            <w:r>
+              <w:rPr>
+                <w:rFonts w:ascii="Times New Roman" w:hAnsi="Times New Roman"/>
+                <w:sz w:val="18"/>
+              </w:rPr>
+              <w:t>{entry_date}</w:t>
+            </w:r>
+          </w:p>
+        </w:tc>
+        <w:tc>
+          <w:tcPr>
+            <w:tcW w:w="720" w:type="dxa"/>
+            <w:tcBorders>
+              <w:top w:val="single" w:sz="8" w:space="0" w:color="000000"/>
+              <w:left w:val="single" w:sz="8" w:space="0" w:color="000000"/>
+              <w:bottom w:val="single" w:sz="8" w:space="0" w:color="000000"/>
+              <w:right w:val="single" w:sz="8" w:space="0" w:color="000000"/>
+            </w:tcBorders>
+          </w:tcPr>
+          <w:p>
+            <w:pPr>
+              <w:pBdr>
+                <w:top w:val="nil"/>
+                <w:left w:val="nil"/>
+                <w:bottom w:val="nil"/>
+                <w:right w:val="nil"/>
+                <w:between w:val="nil"/>
+              </w:pBdr>
+              <w:rPr>
+                <w:color w:val="000000"/>
+                <w:sz w:val="16"/>
+                <w:szCs w:val="16"/>
+              </w:rPr>
+            </w:pPr>
+            <w:r>
+              <w:rPr>
+                <w:rFonts w:ascii="Times New Roman" w:hAnsi="Times New Roman"/>
+                <w:sz w:val="18"/>
+              </w:rPr>
+              <w:t>{time_range}</w:t>
+            </w:r>
+          </w:p>
+        </w:tc>
+        <w:tc>
+          <w:tcPr>
+            <w:tcW w:w="1642" w:type="dxa"/>
+            <w:gridSpan w:val="2"/>
+            <w:tcBorders>
+              <w:top w:val="single" w:sz="8" w:space="0" w:color="000000"/>
+              <w:left w:val="single" w:sz="8" w:space="0" w:color="000000"/>
+              <w:bottom w:val="single" w:sz="8" w:space="0" w:color="000000"/>
+              <w:right w:val="single" w:sz="8" w:space="0" w:color="000000"/>
+            </w:tcBorders>
+          </w:tcPr>
+          <w:p>
+            <w:pPr>
+              <w:pBdr>
+                <w:top w:val="nil"/>
+                <w:left w:val="nil"/>
+                <w:bottom w:val="nil"/>
+                <w:right w:val="nil"/>
+                <w:between w:val="nil"/>
+              </w:pBdr>
+              <w:rPr>
+                <w:color w:val="000000"/>
+                <w:sz w:val="16"/>
+                <w:szCs w:val="16"/>
+              </w:rPr>
+            </w:pPr>
+            <w:r>
+              <w:rPr>
+                <w:rFonts w:ascii="Times New Roman" w:hAnsi="Times New Roman"/>
+                <w:sz w:val="18"/>
+              </w:rPr>
+              <w:t>{activity_description}</w:t>
+            </w:r>
+          </w:p>
+        </w:tc>
+        <w:tc>
+          <w:tcPr>
+            <w:tcW w:w="5903" w:type="dxa"/>
+            <w:gridSpan w:val="3"/>
+            <w:tcBorders>
+              <w:top w:val="single" w:sz="8" w:space="0" w:color="000000"/>
+              <w:left w:val="single" w:sz="8" w:space="0" w:color="000000"/>
+              <w:bottom w:val="single" w:sz="8" w:space="0" w:color="000000"/>
+              <w:right w:val="single" w:sz="8" w:space="0" w:color="000000"/>
+            </w:tcBorders>
+          </w:tcPr>
+          <w:p>
+            <w:pPr>
+              <w:pBdr>
+                <w:top w:val="nil"/>
+                <w:left w:val="nil"/>
+                <w:bottom w:val="nil"/>
+                <w:right w:val="nil"/>
+                <w:between w:val="nil"/>
+              </w:pBdr>
+              <w:rPr>
+                <w:color w:val="000000"/>
+                <w:sz w:val="16"/>
+                <w:szCs w:val="16"/>
+              </w:rPr>
+            </w:pPr>
+            <w:r>
+              <w:rPr>
+                <w:rFonts w:ascii="Times New Roman" w:hAnsi="Times New Roman"/>
+                <w:sz w:val="18"/>
+              </w:rPr>
+              <w:t>{documentation}{/entries}</w:t>
+            </w:r>
+          </w:p>
+        </w:tc>
+      </w:tr>
+      <w:tr>
+        <w:trPr>
+          <w:trHeight w:val="230"/>
+        </w:trPr>
+        <w:tc>
+          <w:tcPr>
+            <w:tcW w:w="10365" w:type="dxa"/>
+            <w:gridSpan w:val="8"/>
+            <w:tcBorders>
+              <w:top w:val="single" w:sz="8" w:space="0" w:color="000000"/>
+              <w:left w:val="single" w:sz="8" w:space="0" w:color="000000"/>
+              <w:bottom w:val="single" w:sz="8" w:space="0" w:color="000000"/>
+              <w:right w:val="single" w:sz="8" w:space="0" w:color="000000"/>
+            </w:tcBorders>
+          </w:tcPr>
+          <w:p>
+            <w:pPr>
+              <w:pBdr>
+                <w:top w:val="nil"/>
+                <w:left w:val="nil"/>
+                <w:bottom w:val="nil"/>
+                <w:right w:val="nil"/>
+                <w:between w:val="nil"/>
+              </w:pBdr>
+              <w:ind w:left="107"/>
+              <w:jc w:val="both"/>
+              <w:rPr>
+                <w:b/>
+                <w:color w:val="000000"/>
+                <w:sz w:val="24"/>
+                <w:szCs w:val="24"/>
+              </w:rPr>
+            </w:pPr>
+            <w:r>
+              <w:rPr>
+                <w:b/>
+                <w:color w:val="000000"/>
+                <w:sz w:val="24"/>
+                <w:szCs w:val="24"/>
+              </w:rPr>
+              <w:t>B. CATATAN PENTING HARIAN</w:t>
+            </w:r>
+          </w:p>
+        </w:tc>
+      </w:tr>
+      <w:tr>
+        <w:trPr>
+          <w:trHeight w:val="1838"/>
+        </w:trPr>
+        <w:tc>
+          <w:tcPr>
+            <w:tcW w:w="10365" w:type="dxa"/>
+            <w:gridSpan w:val="8"/>
+            <w:tcBorders>
+              <w:top w:val="single" w:sz="8" w:space="0" w:color="000000"/>
+              <w:left w:val="single" w:sz="8" w:space="0" w:color="000000"/>
+              <w:bottom w:val="single" w:sz="8" w:space="0" w:color="000000"/>
+              <w:right w:val="single" w:sz="8" w:space="0" w:color="000000"/>
+            </w:tcBorders>
+          </w:tcPr>
+          <w:p>
+            <w:pPr>
+              <w:spacing w:line="220" w:lineRule="auto"/>
+              <w:ind w:left="100"/>
+              <w:rPr>
+                <w:rFonts w:ascii="Times New Roman" w:hAnsi="Times New Roman"/>
+                <w:sz w:val="20"/>
+              </w:rPr>
+            </w:pPr>
+            <w:r>
+              <w:rPr>
+                <w:rFonts w:ascii="Times New Roman" w:hAnsi="Times New Roman"/>
+                <w:sz w:val="20"/>
+              </w:rPr>
+              <w:t>1. {note_1}</w:t>
+            </w:r>
+          </w:p>
+          <w:p>
+            <w:pPr>
+              <w:spacing w:line="220" w:lineRule="auto"/>
+              <w:ind w:left="100"/>
+              <w:rPr>
+                <w:rFonts w:ascii="Times New Roman" w:hAnsi="Times New Roman"/>
+                <w:sz w:val="20"/>
+              </w:rPr>
+            </w:pPr>
+            <w:r>
+              <w:rPr>
+                <w:rFonts w:ascii="Times New Roman" w:hAnsi="Times New Roman"/>
+                <w:sz w:val="20"/>
+              </w:rPr>
+              <w:t>2. {note_2}</w:t>
+            </w:r>
+          </w:p>
+          <w:p>
+            <w:pPr>
+              <w:spacing w:line="220" w:lineRule="auto"/>
+              <w:ind w:left="100"/>
+              <w:rPr>
+                <w:rFonts w:ascii="Times New Roman" w:hAnsi="Times New Roman"/>
+                <w:sz w:val="20"/>
+              </w:rPr>
+            </w:pPr>
+            <w:r>
+              <w:rPr>
+                <w:rFonts w:ascii="Times New Roman" w:hAnsi="Times New Roman"/>
+                <w:sz w:val="20"/>
+              </w:rPr>
+              <w:t>3. {note_3}</w:t>
+            </w:r>
+          </w:p>
+          <w:p>
+            <w:pPr>
+              <w:pBdr>
+                <w:top w:val="nil"/>
+                <w:left w:val="nil"/>
+                <w:bottom w:val="nil"/>
+                <w:right w:val="nil"/>
+                <w:between w:val="nil"/>
+              </w:pBdr>
+              <w:ind w:left="107"/>
+              <w:rPr>
+                <w:b/>
+                <w:color w:val="000000"/>
+                <w:sz w:val="20"/>
+                <w:szCs w:val="20"/>
+              </w:rPr>
+            </w:pPr>
+            <w:r>
+              <w:rPr>
+                <w:b/>
+                <w:color w:val="000000"/>
+                <w:sz w:val="20"/>
+                <w:szCs w:val="20"/>
+              </w:rPr>
+              <w:t>2.</w:t>
+            </w:r>
+          </w:p>
+          <w:p>
+            <w:pPr>
+              <w:pBdr>
+                <w:top w:val="nil"/>
+                <w:left w:val="nil"/>
+                <w:bottom w:val="nil"/>
+                <w:right w:val="nil"/>
+                <w:between w:val="nil"/>
+              </w:pBdr>
+              <w:spacing w:before="228"/>
+              <w:rPr>
+                <w:color w:val="000000"/>
+                <w:sz w:val="20"/>
+                <w:szCs w:val="20"/>
+              </w:rPr>
+            </w:pPr>
+          </w:p>
+          <w:p>
+            <w:pPr>
+              <w:pBdr>
+                <w:top w:val="nil"/>
+                <w:left w:val="nil"/>
+                <w:bottom w:val="nil"/>
+                <w:right w:val="nil"/>
+                <w:between w:val="nil"/>
+              </w:pBdr>
+              <w:ind w:left="107"/>
+              <w:rPr>
+                <w:b/>
+                <w:color w:val="000000"/>
+                <w:sz w:val="20"/>
+                <w:szCs w:val="20"/>
+              </w:rPr>
+            </w:pPr>
+            <w:r>
+              <w:rPr>
+                <w:b/>
+                <w:color w:val="000000"/>
+                <w:sz w:val="20"/>
+                <w:szCs w:val="20"/>
+              </w:rPr>
+              <w:t>3.</w:t>
+            </w:r>
+          </w:p>
+        </w:tc>
+      </w:tr>
+      <w:tr>
+        <w:trPr>
+          <w:trHeight w:val="1579"/>
+        </w:trPr>
+        <w:tc>
+          <w:tcPr>
+            <w:tcW w:w="10365" w:type="dxa"/>
+            <w:gridSpan w:val="8"/>
+            <w:vMerge w:val="restart"/>
+            <w:tcBorders>
+              <w:top w:val="single" w:sz="8" w:space="0" w:color="000000"/>
+              <w:left w:val="single" w:sz="8" w:space="0" w:color="000000"/>
+              <w:bottom w:val="single" w:sz="8" w:space="0" w:color="000000"/>
+              <w:right w:val="single" w:sz="8" w:space="0" w:color="000000"/>
+            </w:tcBorders>
+          </w:tcPr>
+          <w:p>
+            <w:pPr>
+              <w:spacing w:line="275" w:lineRule="auto"/>
+              <w:ind w:left="107"/>
+              <w:rPr>
+                <w:b/>
+                <w:sz w:val="24"/>
+                <w:szCs w:val="24"/>
+              </w:rPr>
+            </w:pPr>
+            <w:r>
+              <w:rPr>
+                <w:b/>
+                <w:sz w:val="24"/>
+                <w:szCs w:val="24"/>
+              </w:rPr>
+              <w:t>D. PENGESAHAN</w:t>
+            </w:r>
+          </w:p>
+        </w:tc>
+      </w:tr>
+      <w:tr>
+        <w:trPr>
+          <w:trHeight w:val="276"/>
+        </w:trPr>
+        <w:tc>
+          <w:tcPr>
+            <w:tcW w:w="10365" w:type="dxa"/>
+            <w:gridSpan w:val="8"/>
+            <w:vMerge/>
+            <w:tcBorders>
+              <w:top w:val="single" w:sz="8" w:space="0" w:color="000000"/>
+              <w:left w:val="single" w:sz="8" w:space="0" w:color="000000"/>
+              <w:bottom w:val="single" w:sz="8" w:space="0" w:color="000000"/>
+              <w:right w:val="single" w:sz="8" w:space="0" w:color="000000"/>
+            </w:tcBorders>
+          </w:tcPr>
+          <w:p>
+            <w:pPr>
+              <w:pBdr>
+                <w:top w:val="nil"/>
+                <w:left w:val="nil"/>
+                <w:bottom w:val="nil"/>
+                <w:right w:val="nil"/>
+                <w:between w:val="nil"/>
+              </w:pBdr>
+              <w:rPr>
+                <w:b/>
+                <w:color w:val="000000"/>
+                <w:sz w:val="24"/>
+                <w:szCs w:val="24"/>
+              </w:rPr>
+            </w:pPr>
+          </w:p>
+        </w:tc>
+      </w:tr>
+      <w:tr>
+        <w:trPr>
+          <w:trHeight w:val="1634"/>
+        </w:trPr>
+        <w:tc>
+          <w:tcPr>
+            <w:tcW w:w="5250" w:type="dxa"/>
+            <w:gridSpan w:val="6"/>
+            <w:tcBorders>
+              <w:top w:val="single" w:sz="8" w:space="0" w:color="000000"/>
+              <w:left w:val="single" w:sz="8" w:space="0" w:color="000000"/>
+              <w:bottom w:val="single" w:sz="8" w:space="0" w:color="000000"/>
+              <w:right w:val="single" w:sz="8" w:space="0" w:color="000000"/>
+            </w:tcBorders>
+          </w:tcPr>
+          <w:p>
+            <w:pPr>
+              <w:pBdr>
+                <w:top w:val="nil"/>
+                <w:left w:val="nil"/>
+                <w:bottom w:val="nil"/>
+                <w:right w:val="nil"/>
+                <w:between w:val="nil"/>
+              </w:pBdr>
+              <w:spacing w:line="251" w:lineRule="auto"/>
+              <w:ind w:left="263"/>
+              <w:rPr>
+                <w:b/>
+                <w:color w:val="000000"/>
+              </w:rPr>
+            </w:pPr>
+            <w:r>
+              <w:rPr>
+                <w:b/>
+                <w:color w:val="000000"/>
+              </w:rPr>
+              <w:t>TANDA TANGAN LURAH/KEPALA DESA</w:t>
+            </w:r>
+          </w:p>
+        </w:tc>
+        <w:tc>
+          <w:tcPr>
+            <w:tcW w:w="5115" w:type="dxa"/>
+            <w:gridSpan w:val="2"/>
+            <w:tcBorders>
+              <w:top w:val="single" w:sz="8" w:space="0" w:color="000000"/>
+              <w:left w:val="single" w:sz="8" w:space="0" w:color="000000"/>
+              <w:bottom w:val="single" w:sz="8" w:space="0" w:color="000000"/>
+              <w:right w:val="single" w:sz="8" w:space="0" w:color="000000"/>
+            </w:tcBorders>
+          </w:tcPr>
+          <w:p>
+            <w:pPr>
+              <w:pBdr>
+                <w:top w:val="nil"/>
+                <w:left w:val="nil"/>
+                <w:bottom w:val="nil"/>
+                <w:right w:val="nil"/>
+                <w:between w:val="nil"/>
+              </w:pBdr>
+              <w:spacing w:line="275" w:lineRule="auto"/>
+              <w:ind w:left="1001"/>
+              <w:rPr>
+                <w:b/>
+                <w:color w:val="000000"/>
+                <w:sz w:val="24"/>
+                <w:szCs w:val="24"/>
+              </w:rPr>
+            </w:pPr>
+            <w:r>
+              <w:rPr>
+                <w:b/>
+                <w:color w:val="000000"/>
+                <w:sz w:val="24"/>
+                <w:szCs w:val="24"/>
+              </w:rPr>
+              <w:t>TANDA TANGAN MAHASISWA</w:t>
+            </w:r>
+          </w:p>
+        </w:tc>
+      </w:tr>
+    </w:tbl>
+    <w:p>
+      <w:pPr>
+        <w:spacing w:before="240" w:after="240"/>
+        <w:jc w:val="both"/>
+        <w:rPr>
+          <w:b/>
+          <w:sz w:val="24"/>
+          <w:szCs w:val="24"/>
+        </w:rPr>
+      </w:pPr>
+      <w:r>
+        <w:rPr>
+          <w:b/>
+          <w:sz w:val="24"/>
+          <w:szCs w:val="24"/>
+        </w:rPr>
+        <w:t>Petunjuk Pengisian:</w:t>
+      </w:r>
+    </w:p>
+    <w:p>
+      <w:pPr>
+        <w:numPr>
+          <w:ilvl w:val="0"/>
+          <w:numId w:val="1"/>
+        </w:numPr>
+        <w:pBdr>
+          <w:top w:val="nil"/>
+          <w:left w:val="nil"/>
+          <w:bottom w:val="nil"/>
+          <w:right w:val="nil"/>
+          <w:between w:val="nil"/>
+        </w:pBdr>
+        <w:jc w:val="both"/>
+        <w:rPr>
+          <w:sz w:val="24"/>
+          <w:szCs w:val="24"/>
+        </w:rPr>
+      </w:pPr>
+      <w:r>
+        <w:rPr>
+          <w:sz w:val="24"/>
+          <w:szCs w:val="24"/>
+        </w:rPr>
+        <w:t xml:space="preserve">Logbook adalah buku catatan harian bagi peserta KKN yang wajib diisi setiap hari dan dilaporkan kepada Dosen Pembimbing Lapangan (DPL) setiap minggu Ling google form. </w:t>
+      </w:r>
+    </w:p>
+    <w:p>
+      <w:pPr>
+        <w:numPr>
+          <w:ilvl w:val="0"/>
+          <w:numId w:val="1"/>
+        </w:numPr>
+        <w:pBdr>
+          <w:top w:val="nil"/>
+          <w:left w:val="nil"/>
+          <w:bottom w:val="nil"/>
+          <w:right w:val="nil"/>
+          <w:between w:val="nil"/>
+        </w:pBdr>
+        <w:jc w:val="both"/>
+        <w:rPr>
+          <w:sz w:val="24"/>
+          <w:szCs w:val="24"/>
+        </w:rPr>
+      </w:pPr>
+      <w:r>
+        <w:rPr>
+          <w:sz w:val="24"/>
+          <w:szCs w:val="24"/>
+        </w:rPr>
+        <w:t>Logbook hanya boleh diisi dengan aktivitas yang berkaitan dengan program KKN.</w:t>
+      </w:r>
+    </w:p>
+    <w:p>
+      <w:pPr>
+        <w:numPr>
+          <w:ilvl w:val="0"/>
+          <w:numId w:val="1"/>
+        </w:numPr>
+        <w:pBdr>
+          <w:top w:val="nil"/>
+          <w:left w:val="nil"/>
+          <w:bottom w:val="nil"/>
+          <w:right w:val="nil"/>
+          <w:between w:val="nil"/>
+        </w:pBdr>
+        <w:jc w:val="both"/>
+        <w:rPr>
+          <w:sz w:val="24"/>
+          <w:szCs w:val="24"/>
+        </w:rPr>
+      </w:pPr>
+      <w:r>
+        <w:rPr>
+          <w:sz w:val="24"/>
+          <w:szCs w:val="24"/>
+        </w:rPr>
+        <w:t>Setiap logbook harus ditempelkan pas foto berwarna terbaru dengan ukuran 4x6 cm.</w:t>
+      </w:r>
+    </w:p>
+    <w:p>
+      <w:pPr>
+        <w:numPr>
+          <w:ilvl w:val="0"/>
+          <w:numId w:val="1"/>
+        </w:numPr>
+        <w:pBdr>
+          <w:top w:val="nil"/>
+          <w:left w:val="nil"/>
+          <w:bottom w:val="nil"/>
+          <w:right w:val="nil"/>
+          <w:between w:val="nil"/>
+        </w:pBdr>
+        <w:jc w:val="both"/>
+        <w:rPr>
+          <w:sz w:val="24"/>
+          <w:szCs w:val="24"/>
+        </w:rPr>
+      </w:pPr>
+      <w:r>
+        <w:rPr>
+          <w:sz w:val="24"/>
+          <w:szCs w:val="24"/>
+        </w:rPr>
+        <w:t>Isi logbook mencakup kegiatan harian, catatan penting, serta dokumentasi seperti foto, tautan video, dan lain-lain.</w:t>
+      </w:r>
+    </w:p>
+    <w:p>
+      <w:pPr>
+        <w:numPr>
+          <w:ilvl w:val="0"/>
+          <w:numId w:val="1"/>
+        </w:numPr>
+        <w:pBdr>
+          <w:top w:val="nil"/>
+          <w:left w:val="nil"/>
+          <w:bottom w:val="nil"/>
+          <w:right w:val="nil"/>
+          <w:between w:val="nil"/>
+        </w:pBdr>
+        <w:jc w:val="both"/>
+        <w:rPr>
+          <w:sz w:val="24"/>
+          <w:szCs w:val="24"/>
+        </w:rPr>
+      </w:pPr>
+      <w:r>
+        <w:rPr>
+          <w:sz w:val="24"/>
+          <w:szCs w:val="24"/>
+        </w:rPr>
+        <w:t>Penulisan logbook harus menggunakan bahasa Indonesia yang baik dan benar sesuai kaidah baku.</w:t>
+      </w:r>
+    </w:p>
+    <w:p>
+      <w:pPr>
+        <w:numPr>
+          <w:ilvl w:val="0"/>
+          <w:numId w:val="1"/>
+        </w:numPr>
+        <w:pBdr>
+          <w:top w:val="nil"/>
+          <w:left w:val="nil"/>
+          <w:bottom w:val="nil"/>
+          <w:right w:val="nil"/>
+          <w:between w:val="nil"/>
+        </w:pBdr>
+        <w:jc w:val="both"/>
+        <w:rPr>
+          <w:sz w:val="24"/>
+          <w:szCs w:val="24"/>
+        </w:rPr>
+      </w:pPr>
+      <w:r>
+        <w:rPr>
+          <w:sz w:val="24"/>
+          <w:szCs w:val="24"/>
+        </w:rPr>
+        <w:t>Pada bagian kolom pengesahan, mahasiswa wajib menandatangani serta menuliskan nama lengkapnya, kemudian nama lurah, kepala desa, atau pihak berwenang lainnya.</w:t>
+      </w:r>
+    </w:p>
+    <w:p>
+      <w:pPr>
+        <w:numPr>
+          <w:ilvl w:val="0"/>
+          <w:numId w:val="1"/>
+        </w:numPr>
+        <w:pBdr>
+          <w:top w:val="nil"/>
+          <w:left w:val="nil"/>
+          <w:bottom w:val="nil"/>
+          <w:right w:val="nil"/>
+          <w:between w:val="nil"/>
+        </w:pBdr>
+        <w:jc w:val="both"/>
+        <w:rPr>
+          <w:sz w:val="24"/>
+          <w:szCs w:val="24"/>
+        </w:rPr>
+      </w:pPr>
+      <w:r>
+        <w:rPr>
+          <w:sz w:val="24"/>
+          <w:szCs w:val="24"/>
+        </w:rPr>
+        <w:t>Selanjutnya, lurah, kepala desa, atau pihak berwenang terkait diminta untuk memberikan tanda tangan pada logbook mingguan tersebut.</w:t>
+      </w:r>
+    </w:p>
+    <w:p>
+      <w:pPr>
+        <w:numPr>
+          <w:ilvl w:val="0"/>
+          <w:numId w:val="1"/>
+        </w:numPr>
+        <w:pBdr>
+          <w:top w:val="nil"/>
+          <w:left w:val="nil"/>
+          <w:bottom w:val="nil"/>
+          <w:right w:val="nil"/>
+          <w:between w:val="nil"/>
+        </w:pBdr>
+        <w:jc w:val="both"/>
+        <w:rPr>
+          <w:sz w:val="24"/>
+          <w:szCs w:val="24"/>
+        </w:rPr>
+      </w:pPr>
+      <w:r>
+        <w:rPr>
+          <w:sz w:val="24"/>
+          <w:szCs w:val="24"/>
+        </w:rPr>
+        <w:t>Mahasiswa kemudian mengirimkan logbook mingguan secara daring kepada DPL masing-masing.</w:t>
+      </w:r>
+    </w:p>
+    <w:p>
+      <w:pPr>
+        <w:numPr>
+          <w:ilvl w:val="0"/>
+          <w:numId w:val="1"/>
+        </w:numPr>
+        <w:pBdr>
+          <w:top w:val="nil"/>
+          <w:left w:val="nil"/>
+          <w:bottom w:val="nil"/>
+          <w:right w:val="nil"/>
+          <w:between w:val="nil"/>
+        </w:pBdr>
+        <w:jc w:val="both"/>
+        <w:rPr>
+          <w:sz w:val="24"/>
+          <w:szCs w:val="24"/>
+        </w:rPr>
+      </w:pPr>
+      <w:r>
+        <w:rPr>
+          <w:sz w:val="24"/>
+          <w:szCs w:val="24"/>
+        </w:rPr>
+        <w:t>DPL akan memeriksa dan memberikan tanggapan terhadap logbook setiap minggu.</w:t>
+      </w:r>
+      <w:r>
+        <w:rPr>
+          <w:sz w:val="24"/>
+          <w:szCs w:val="24"/>
+        </w:rPr>
+        <w:br/>
+      </w:r>
+    </w:p>
+    <w:p>
+      <w:pPr>
+        <w:pBdr>
+          <w:top w:val="nil"/>
+          <w:left w:val="nil"/>
+          <w:bottom w:val="nil"/>
+          <w:right w:val="nil"/>
+          <w:between w:val="nil"/>
+        </w:pBdr>
+        <w:ind w:left="1080"/>
+        <w:jc w:val="both"/>
+        <w:rPr>
+          <w:sz w:val="24"/>
+          <w:szCs w:val="24"/>
+        </w:rPr>
+      </w:pPr>
+    </w:p>
+    <w:sectPr>
+      <w:pgSz w:w="12240" w:h="15840"/>
+      <w:pgMar w:top="1440" w:right="1440" w:bottom="1440" w:left="1440" w:header="708" w:footer="708" w:gutter="0"/>
+      <w:pgNumType w:start="1"/>
+      <w:cols w:space="720"/>
+    </w:sectPr>
+  </w:body>
+</w:document>
 </file>
 
 <file path=word/numbering.xml><?xml version="1.0" encoding="utf-8"?>

</xml_diff>

<commit_message>
fix(docx): perbaiki penggabungan XML multi-minggu tanpa merusak skema OpenXML Word - 100% dapat dibuka di MS Word
</commit_message>
<xml_diff>
--- a/public/templates/template_logbook_kkn_prepared.docx
+++ b/public/templates/template_logbook_kkn_prepared.docx
@@ -1,6 +1,1928 @@
 
-<file path=word/document.xml><w:p><w:r><w:br w:type="page"/><w:t>{#weeks}</w:t></w:r></w:p><?xml version="1.0" encoding="UTF-8" standalone="yes"?>
-<w:document xmlns:wpc="http://schemas.microsoft.com/office/word/2010/wordprocessingCanvas" xmlns:cx="http://schemas.microsoft.com/office/drawing/2014/chartex" xmlns:cx1="http://schemas.microsoft.com/office/drawing/2015/9/8/chartex" xmlns:cx2="http://schemas.microsoft.com/office/drawing/2015/10/21/chartex" xmlns:cx3="http://schemas.microsoft.com/office/drawing/2016/5/9/chartex" xmlns:cx4="http://schemas.microsoft.com/office/drawing/2016/5/10/chartex" xmlns:cx5="http://schemas.microsoft.com/office/drawing/2016/5/11/chartex" xmlns:cx6="http://schemas.microsoft.com/office/drawing/2016/5/12/chartex" xmlns:cx7="http://schemas.microsoft.com/office/drawing/2016/5/13/chartex" xmlns:cx8="http://schemas.microsoft.com/office/drawing/2016/5/14/chartex" xmlns:mc="http://schemas.openxmlformats.org/markup-compatibility/2006" xmlns:aink="http://schemas.microsoft.com/office/drawing/2016/ink" xmlns:am3d="http://schemas.microsoft.com/office/drawing/2017/model3d" xmlns:o="urn:schemas-microsoft-com:office:office" xmlns:oel="http://schemas.microsoft.com/office/2019/extlst" xmlns:r="http://schemas.openxmlformats.org/officeDocument/2006/relationships" xmlns:m="http://schemas.openxmlformats.org/officeDocument/2006/math" xmlns:v="urn:schemas-microsoft-com:vml" xmlns:wp14="http://schemas.microsoft.com/office/word/2010/wordprocessingDrawing" xmlns:wp="http://schemas.openxmlformats.org/drawingml/2006/wordprocessingDrawing" xmlns:w10="urn:schemas-microsoft-com:office:word" xmlns:w="http://schemas.openxmlformats.org/wordprocessingml/2006/main" xmlns:w14="http://schemas.microsoft.com/office/word/2010/wordml" xmlns:w15="http://schemas.microsoft.com/office/word/2012/wordml" xmlns:w16cex="http://schemas.microsoft.com/office/word/2018/wordml/cex" xmlns:w16cid="http://schemas.microsoft.com/office/word/2016/wordml/cid" xmlns:w16="http://schemas.microsoft.com/office/word/2018/wordml" xmlns:w16du="http://schemas.microsoft.com/office/word/2023/wordml/word16du" xmlns:w16sdtdh="http://schemas.microsoft.com/office/word/2020/wordml/sdtdatahash" xmlns:w16sdtfl="http://schemas.microsoft.com/office/word/2024/wordml/sdtformatlock" xmlns:w16se="http://schemas.microsoft.com/office/word/2015/wordml/symex" xmlns:wpg="http://schemas.microsoft.com/office/word/2010/wordprocessingGroup" xmlns:wpi="http://schemas.microsoft.com/office/word/2010/wordprocessingInk" xmlns:wne="http://schemas.microsoft.com/office/word/2006/wordml" xmlns:wps="http://schemas.microsoft.com/office/word/2010/wordprocessingShape" mc:Ignorable="w14 w15 w16se w16cid w16 w16cex w16sdtdh w16sdtfl w16du wp14"><w:body><w:p><w:pPr><w:spacing w:before="58"/><w:ind w:left="356" w:right="360"/><w:jc w:val="center"/><w:rPr><w:b/><w:i/><w:sz w:val="32"/><w:szCs w:val="32"/></w:rPr></w:pPr><w:r><w:rPr><w:b/><w:sz w:val="32"/><w:szCs w:val="32"/></w:rPr><w:t xml:space="preserve">BUKU CATATAN HARIAN </w:t></w:r><w:r><w:rPr><w:b/><w:i/><w:sz w:val="32"/><w:szCs w:val="32"/></w:rPr><w:t>(LOGBOOK)</w:t></w:r></w:p><w:p><w:pPr><w:pBdr><w:top w:val="nil"/><w:left w:val="nil"/><w:bottom w:val="nil"/><w:right w:val="nil"/><w:between w:val="nil"/></w:pBdr><w:spacing w:before="31"/><w:rPr><w:b/><w:i/><w:color w:val="000000"/><w:sz w:val="32"/><w:szCs w:val="32"/></w:rPr></w:pPr></w:p><w:p><w:pPr><w:pStyle w:val="Title"/><w:spacing w:after="0"/><w:jc w:val="center"/><w:rPr><w:rFonts w:ascii="Times New Roman" w:eastAsia="Times New Roman" w:hAnsi="Times New Roman" w:cs="Times New Roman"/><w:b/><w:sz w:val="32"/><w:szCs w:val="32"/></w:rPr></w:pPr><w:r><w:rPr><w:rFonts w:ascii="Times New Roman" w:eastAsia="Times New Roman" w:hAnsi="Times New Roman" w:cs="Times New Roman"/><w:b/><w:sz w:val="32"/><w:szCs w:val="32"/></w:rPr><w:t xml:space="preserve">KULIAH KERJA NYATA (KKN) </w:t></w:r></w:p><w:p><w:pPr><w:pStyle w:val="Title"/><w:jc w:val="center"/><w:rPr><w:rFonts w:ascii="Times New Roman" w:eastAsia="Times New Roman" w:hAnsi="Times New Roman" w:cs="Times New Roman"/><w:b/><w:sz w:val="32"/><w:szCs w:val="32"/></w:rPr></w:pPr><w:r><w:rPr><w:rFonts w:ascii="Times New Roman" w:eastAsia="Times New Roman" w:hAnsi="Times New Roman" w:cs="Times New Roman"/><w:b/><w:sz w:val="32"/><w:szCs w:val="32"/></w:rPr><w:t>UNIVERSITAS MARITIM RAJA ALI HAJI</w:t></w:r></w:p><w:p><w:pPr><w:pBdr><w:top w:val="nil"/><w:left w:val="nil"/><w:bottom w:val="nil"/><w:right w:val="nil"/><w:between w:val="nil"/></w:pBdr><w:rPr><w:b/><w:color w:val="000000"/><w:sz w:val="20"/><w:szCs w:val="20"/></w:rPr></w:pPr></w:p><w:p><w:pPr><w:pBdr><w:top w:val="nil"/><w:left w:val="nil"/><w:bottom w:val="nil"/><w:right w:val="nil"/><w:between w:val="nil"/></w:pBdr><w:rPr><w:b/><w:color w:val="000000"/><w:sz w:val="20"/><w:szCs w:val="20"/></w:rPr></w:pPr></w:p><w:p><w:pPr><w:pBdr><w:top w:val="nil"/><w:left w:val="nil"/><w:bottom w:val="nil"/><w:right w:val="nil"/><w:between w:val="nil"/></w:pBdr><w:rPr><w:b/><w:color w:val="000000"/><w:sz w:val="20"/><w:szCs w:val="20"/></w:rPr></w:pPr></w:p><w:p><w:pPr><w:pBdr><w:top w:val="nil"/><w:left w:val="nil"/><w:bottom w:val="nil"/><w:right w:val="nil"/><w:between w:val="nil"/></w:pBdr><w:spacing w:before="63"/><w:rPr><w:b/><w:color w:val="000000"/><w:sz w:val="20"/><w:szCs w:val="20"/></w:rPr></w:pPr></w:p><w:tbl><w:tblPr><w:tblStyle w:val="a"/><w:tblW w:w="9354" w:type="dxa"/><w:tblInd w:w="-5" w:type="dxa"/><w:tblBorders><w:top w:val="single" w:sz="4" w:space="0" w:color="000000"/><w:left w:val="single" w:sz="4" w:space="0" w:color="000000"/><w:bottom w:val="single" w:sz="4" w:space="0" w:color="000000"/><w:right w:val="single" w:sz="4" w:space="0" w:color="000000"/><w:insideH w:val="single" w:sz="4" w:space="0" w:color="000000"/><w:insideV w:val="single" w:sz="4" w:space="0" w:color="000000"/></w:tblBorders><w:tblLayout w:type="fixed"/><w:tblLook w:val="0000" w:firstRow="0" w:lastRow="0" w:firstColumn="0" w:lastColumn="0" w:noHBand="0" w:noVBand="0"/></w:tblPr><w:tblGrid><w:gridCol w:w="4677"/><w:gridCol w:w="4677"/></w:tblGrid><w:tr><w:trPr><w:trHeight w:val="365"/></w:trPr><w:tc><w:tcPr><w:tcW w:w="4677" w:type="dxa"/></w:tcPr><w:p><w:pPr><w:pBdr><w:top w:val="nil"/><w:left w:val="nil"/><w:bottom w:val="nil"/><w:right w:val="nil"/><w:between w:val="nil"/></w:pBdr><w:spacing w:line="226" w:lineRule="auto"/><w:ind w:left="107"/><w:rPr><w:color w:val="000000"/><w:sz w:val="20"/><w:szCs w:val="20"/></w:rPr></w:pPr><w:r><w:rPr><w:color w:val="000000"/><w:sz w:val="20"/><w:szCs w:val="20"/></w:rPr><w:t>NAMA</w:t></w:r></w:p></w:tc><w:tc><w:tcPr><w:tcW w:w="4677" w:type="dxa"/></w:tcPr><w:p><w:r><w:rPr><w:rFonts w:ascii="Times New Roman" w:hAnsi="Times New Roman"/><w:sz w:val="22"/><w:b/></w:rPr><w:t>{full_name}</w:t></w:r></w:p></w:tc></w:tr><w:tr><w:trPr><w:trHeight w:val="366"/></w:trPr><w:tc><w:tcPr><w:tcW w:w="4677" w:type="dxa"/></w:tcPr><w:p><w:pPr><w:pBdr><w:top w:val="nil"/><w:left w:val="nil"/><w:bottom w:val="nil"/><w:right w:val="nil"/><w:between w:val="nil"/></w:pBdr><w:spacing w:line="227" w:lineRule="auto"/><w:ind w:left="107"/><w:rPr><w:color w:val="000000"/><w:sz w:val="20"/><w:szCs w:val="20"/></w:rPr></w:pPr><w:r><w:rPr><w:color w:val="000000"/><w:sz w:val="20"/><w:szCs w:val="20"/></w:rPr><w:t>NIM</w:t></w:r></w:p></w:tc><w:tc><w:tcPr><w:tcW w:w="4677" w:type="dxa"/></w:tcPr><w:p><w:r><w:rPr><w:rFonts w:ascii="Times New Roman" w:hAnsi="Times New Roman"/><w:sz w:val="22"/><w:b/></w:rPr><w:t>{student_id}</w:t></w:r></w:p></w:tc></w:tr><w:tr><w:trPr><w:trHeight w:val="370"/></w:trPr><w:tc><w:tcPr><w:tcW w:w="4677" w:type="dxa"/></w:tcPr><w:p><w:pPr><w:pBdr><w:top w:val="nil"/><w:left w:val="nil"/><w:bottom w:val="nil"/><w:right w:val="nil"/><w:between w:val="nil"/></w:pBdr><w:spacing w:line="226" w:lineRule="auto"/><w:ind w:left="107"/><w:rPr><w:color w:val="000000"/><w:sz w:val="20"/><w:szCs w:val="20"/></w:rPr></w:pPr><w:r><w:rPr><w:color w:val="000000"/><w:sz w:val="20"/><w:szCs w:val="20"/></w:rPr><w:t>FAKULTAS/PRODI</w:t></w:r></w:p></w:tc><w:tc><w:tcPr><w:tcW w:w="4677" w:type="dxa"/></w:tcPr><w:p><w:r><w:rPr><w:rFonts w:ascii="Times New Roman" w:hAnsi="Times New Roman"/><w:sz w:val="22"/><w:b/></w:rPr><w:t>{faculty_prodi}</w:t></w:r></w:p></w:tc></w:tr><w:tr><w:trPr><w:trHeight w:val="366"/></w:trPr><w:tc><w:tcPr><w:tcW w:w="4677" w:type="dxa"/></w:tcPr><w:p><w:pPr><w:pBdr><w:top w:val="nil"/><w:left w:val="nil"/><w:bottom w:val="nil"/><w:right w:val="nil"/><w:between w:val="nil"/></w:pBdr><w:spacing w:line="222" w:lineRule="auto"/><w:ind w:left="107"/><w:rPr><w:color w:val="000000"/><w:sz w:val="20"/><w:szCs w:val="20"/></w:rPr></w:pPr><w:r><w:rPr><w:color w:val="000000"/><w:sz w:val="20"/><w:szCs w:val="20"/></w:rPr><w:t>NAMA LOKASI KKN</w:t></w:r></w:p></w:tc><w:tc><w:tcPr><w:tcW w:w="4677" w:type="dxa"/></w:tcPr><w:p><w:r><w:rPr><w:rFonts w:ascii="Times New Roman" w:hAnsi="Times New Roman"/><w:sz w:val="22"/><w:b/></w:rPr><w:t>{group_location}</w:t></w:r></w:p></w:tc></w:tr><w:tr><w:trPr><w:trHeight w:val="362"/></w:trPr><w:tc><w:tcPr><w:tcW w:w="4677" w:type="dxa"/></w:tcPr><w:p><w:pPr><w:pBdr><w:top w:val="nil"/><w:left w:val="nil"/><w:bottom w:val="nil"/><w:right w:val="nil"/><w:between w:val="nil"/></w:pBdr><w:spacing w:line="222" w:lineRule="auto"/><w:ind w:left="107"/><w:rPr><w:color w:val="000000"/><w:sz w:val="20"/><w:szCs w:val="20"/></w:rPr></w:pPr><w:r><w:rPr><w:color w:val="000000"/><w:sz w:val="20"/><w:szCs w:val="20"/></w:rPr><w:t>NAMA DOSEN PENDAMPING LAPANGAN</w:t></w:r></w:p></w:tc><w:tc><w:tcPr><w:tcW w:w="4677" w:type="dxa"/></w:tcPr><w:p><w:r><w:rPr><w:rFonts w:ascii="Times New Roman" w:hAnsi="Times New Roman"/><w:sz w:val="22"/><w:b/></w:rPr><w:t>{dosen_name}</w:t></w:r></w:p></w:tc></w:tr></w:tbl><w:p><w:pPr><w:pBdr><w:top w:val="nil"/><w:left w:val="nil"/><w:bottom w:val="nil"/><w:right w:val="nil"/><w:between w:val="nil"/></w:pBdr><w:rPr><w:b/><w:color w:val="000000"/><w:sz w:val="20"/><w:szCs w:val="20"/></w:rPr></w:pPr><w:r><w:rPr><w:noProof/></w:rPr><w:drawing><wp:anchor distT="0" distB="0" distL="114300" distR="114300" simplePos="0" relativeHeight="251659264" behindDoc="0" locked="0" layoutInCell="1" hidden="0" allowOverlap="1" wp14:anchorId="068DF41D" wp14:editId="0EDAA620"><wp:simplePos x="0" y="0"/><wp:positionH relativeFrom="column"><wp:posOffset>1955482</wp:posOffset></wp:positionH><wp:positionV relativeFrom="paragraph"><wp:posOffset>215900</wp:posOffset></wp:positionV><wp:extent cx="2032635" cy="2035175"/><wp:effectExtent l="0" t="0" r="0" b="0"/><wp:wrapTopAndBottom distT="0" distB="0"/><wp:docPr id="1900290531" name="image2.png"/><wp:cNvGraphicFramePr/><a:graphic xmlns:a="http://schemas.openxmlformats.org/drawingml/2006/main"><a:graphicData uri="http://schemas.openxmlformats.org/drawingml/2006/picture"><pic:pic xmlns:pic="http://schemas.openxmlformats.org/drawingml/2006/picture"><pic:nvPicPr><pic:cNvPr id="0" name="image2.png"/><pic:cNvPicPr preferRelativeResize="0"/></pic:nvPicPr><pic:blipFill><a:blip r:embed="rId6"/><a:srcRect/><a:stretch><a:fillRect/></a:stretch></pic:blipFill><pic:spPr><a:xfrm><a:off x="0" y="0"/><a:ext cx="2032635" cy="2035175"/></a:xfrm><a:prstGeom prst="rect"><a:avLst/></a:prstGeom><a:ln/></pic:spPr></pic:pic></a:graphicData></a:graphic></wp:anchor></w:drawing></w:r></w:p><w:p><w:pPr><w:spacing w:before="2"/><w:ind w:left="2880" w:right="3233"/><w:jc w:val="center"/><w:rPr><w:sz w:val="26"/><w:szCs w:val="26"/></w:rPr></w:pPr></w:p><w:p><w:pPr><w:jc w:val="center"/><w:rPr><w:sz w:val="26"/><w:szCs w:val="26"/></w:rPr></w:pPr></w:p><w:p><w:pPr><w:pBdr><w:top w:val="nil"/><w:left w:val="nil"/><w:bottom w:val="nil"/><w:right w:val="nil"/><w:between w:val="nil"/></w:pBdr><w:jc w:val="center"/><w:rPr><w:sz w:val="26"/><w:szCs w:val="26"/></w:rPr></w:pPr><w:r><w:rPr><w:sz w:val="26"/><w:szCs w:val="26"/></w:rPr><w:t>LEMBAGA PENELITIAN DAN PENGABDIAN KEPADA MASYARAKAT</w:t></w:r></w:p><w:p><w:pPr><w:jc w:val="center"/><w:rPr><w:sz w:val="26"/><w:szCs w:val="26"/></w:rPr></w:pPr><w:r><w:rPr><w:sz w:val="26"/><w:szCs w:val="26"/></w:rPr><w:t>UNIVERSITAS MARITIM RAJA ALI HAJI</w:t></w:r></w:p><w:p><w:pPr><w:jc w:val="center"/><w:rPr><w:sz w:val="26"/><w:szCs w:val="26"/></w:rPr></w:pPr><w:r><w:rPr><w:sz w:val="26"/><w:szCs w:val="26"/></w:rPr><w:t>2025</w:t></w:r></w:p><w:tbl><w:tblPr><w:tblStyle w:val="a0"/><w:tblW w:w="10365" w:type="dxa"/><w:tblInd w:w="-508" w:type="dxa"/><w:tblBorders><w:top w:val="single" w:sz="4" w:space="0" w:color="000000"/><w:left w:val="single" w:sz="4" w:space="0" w:color="000000"/><w:bottom w:val="single" w:sz="4" w:space="0" w:color="000000"/><w:right w:val="single" w:sz="4" w:space="0" w:color="000000"/><w:insideH w:val="single" w:sz="4" w:space="0" w:color="000000"/><w:insideV w:val="single" w:sz="4" w:space="0" w:color="000000"/></w:tblBorders><w:tblLayout w:type="fixed"/><w:tblLook w:val="0000" w:firstRow="0" w:lastRow="0" w:firstColumn="0" w:lastColumn="0" w:noHBand="0" w:noVBand="0"/></w:tblPr><w:tblGrid><w:gridCol w:w="635"/><w:gridCol w:w="1465"/><w:gridCol w:w="720"/><w:gridCol w:w="1110"/><w:gridCol w:w="532"/><w:gridCol w:w="788"/><w:gridCol w:w="2565"/><w:gridCol w:w="2550"/></w:tblGrid><w:tr><w:trPr><w:trHeight w:val="1955"/></w:trPr><w:tc><w:tcPr><w:tcW w:w="3930" w:type="dxa"/><w:gridSpan w:val="4"/><w:tcBorders><w:top w:val="single" w:sz="12" w:space="0" w:color="000000"/><w:left w:val="single" w:sz="12" w:space="0" w:color="000000"/><w:bottom w:val="single" w:sz="12" w:space="0" w:color="000000"/><w:right w:val="single" w:sz="12" w:space="0" w:color="000000"/></w:tcBorders></w:tcPr><w:p><w:pPr><w:pBdr><w:top w:val="nil"/><w:left w:val="nil"/><w:bottom w:val="nil"/><w:right w:val="nil"/><w:between w:val="nil"/></w:pBdr><w:ind w:left="561"/><w:rPr><w:color w:val="000000"/><w:sz w:val="20"/><w:szCs w:val="20"/></w:rPr></w:pPr><w:r><w:rPr><w:noProof/></w:rPr><w:lastRenderedPageBreak/><w:drawing><wp:anchor distT="0" distB="0" distL="114300" distR="114300" simplePos="0" relativeHeight="251660288" behindDoc="0" locked="0" layoutInCell="1" hidden="0" allowOverlap="1" wp14:anchorId="7523C5D4" wp14:editId="78695CA9"><wp:simplePos x="0" y="0"/><wp:positionH relativeFrom="column"><wp:posOffset>316865</wp:posOffset></wp:positionH><wp:positionV relativeFrom="paragraph"><wp:posOffset>43180</wp:posOffset></wp:positionV><wp:extent cx="1156335" cy="1157605"/><wp:effectExtent l="0" t="0" r="0" b="0"/><wp:wrapTopAndBottom distT="0" distB="0"/><wp:docPr id="1900290530" name="image1.png"/><wp:cNvGraphicFramePr/><a:graphic xmlns:a="http://schemas.openxmlformats.org/drawingml/2006/main"><a:graphicData uri="http://schemas.openxmlformats.org/drawingml/2006/picture"><pic:pic xmlns:pic="http://schemas.openxmlformats.org/drawingml/2006/picture"><pic:nvPicPr><pic:cNvPr id="0" name="image1.png"/><pic:cNvPicPr preferRelativeResize="0"/></pic:nvPicPr><pic:blipFill><a:blip r:embed="rId7"/><a:srcRect/><a:stretch><a:fillRect/></a:stretch></pic:blipFill><pic:spPr><a:xfrm><a:off x="0" y="0"/><a:ext cx="1156335" cy="1157605"/></a:xfrm><a:prstGeom prst="rect"><a:avLst/></a:prstGeom><a:ln/></pic:spPr></pic:pic></a:graphicData></a:graphic></wp:anchor></w:drawing></w:r></w:p></w:tc><w:tc><w:tcPr><w:tcW w:w="3885" w:type="dxa"/><w:gridSpan w:val="3"/><w:tcBorders><w:top w:val="single" w:sz="12" w:space="0" w:color="000000"/><w:left w:val="single" w:sz="12" w:space="0" w:color="000000"/><w:bottom w:val="single" w:sz="12" w:space="0" w:color="000000"/><w:right w:val="single" w:sz="12" w:space="0" w:color="000000"/></w:tcBorders></w:tcPr><w:p><w:pPr><w:pBdr><w:top w:val="nil"/><w:left w:val="nil"/><w:bottom w:val="nil"/><w:right w:val="nil"/><w:between w:val="nil"/></w:pBdr><w:spacing w:before="3"/><w:ind w:left="106"/><w:rPr><w:b/><w:i/><w:color w:val="000000"/><w:sz w:val="24"/><w:szCs w:val="24"/></w:rPr></w:pPr><w:r><w:rPr><w:b/><w:i/><w:color w:val="000000"/><w:sz w:val="24"/><w:szCs w:val="24"/></w:rPr><w:t>LOGBOOK</w:t></w:r></w:p><w:p><w:pPr><w:pBdr><w:top w:val="nil"/><w:left w:val="nil"/><w:bottom w:val="nil"/><w:right w:val="nil"/><w:between w:val="nil"/></w:pBdr><w:spacing w:before="135" w:line="360" w:lineRule="auto"/><w:ind w:left="106" w:right="267"/><w:rPr><w:b/><w:color w:val="000000"/><w:sz w:val="24"/><w:szCs w:val="24"/></w:rPr></w:pPr><w:r><w:rPr><w:b/><w:color w:val="000000"/><w:sz w:val="24"/><w:szCs w:val="24"/></w:rPr><w:t>KULIAH KERJA NYATA UNIVERSITAS MARITIM RAJA ALI HAJI</w:t></w:r></w:p></w:tc><w:tc><w:tcPr><w:tcW w:w="2550" w:type="dxa"/><w:tcBorders><w:top w:val="single" w:sz="12" w:space="0" w:color="000000"/><w:left w:val="single" w:sz="12" w:space="0" w:color="000000"/><w:bottom w:val="single" w:sz="12" w:space="0" w:color="000000"/><w:right w:val="single" w:sz="12" w:space="0" w:color="000000"/></w:tcBorders></w:tcPr><w:p><w:pPr><w:pBdr><w:top w:val="nil"/><w:left w:val="nil"/><w:bottom w:val="nil"/><w:right w:val="nil"/><w:between w:val="nil"/></w:pBdr><w:rPr><w:color w:val="000000"/><w:sz w:val="24"/><w:szCs w:val="24"/></w:rPr></w:pPr></w:p><w:p><w:pPr><w:pBdr><w:top w:val="nil"/><w:left w:val="nil"/><w:bottom w:val="nil"/><w:right w:val="nil"/><w:between w:val="nil"/></w:pBdr><w:spacing w:before="270"/><w:rPr><w:color w:val="000000"/><w:sz w:val="24"/><w:szCs w:val="24"/></w:rPr></w:pPr></w:p><w:p><w:pPr><w:pBdr><w:top w:val="nil"/><w:left w:val="nil"/><w:bottom w:val="nil"/><w:right w:val="nil"/><w:between w:val="nil"/></w:pBdr><w:spacing w:before="1"/><w:ind w:left="104" w:right="994"/><w:rPr><w:b/><w:color w:val="000000"/><w:sz w:val="24"/><w:szCs w:val="24"/></w:rPr></w:pPr><w:r><w:rPr><w:b/><w:color w:val="000000"/><w:sz w:val="24"/><w:szCs w:val="24"/></w:rPr><w:t>{week_label}</w:t></w:r></w:p></w:tc></w:tr><w:tr><w:trPr><w:trHeight w:val="274"/></w:trPr><w:tc><w:tcPr><w:tcW w:w="10365" w:type="dxa"/><w:gridSpan w:val="8"/><w:tcBorders><w:top w:val="single" w:sz="12" w:space="0" w:color="000000"/><w:left w:val="single" w:sz="8" w:space="0" w:color="000000"/><w:bottom w:val="single" w:sz="8" w:space="0" w:color="000000"/><w:right w:val="single" w:sz="8" w:space="0" w:color="000000"/></w:tcBorders></w:tcPr><w:p><w:pPr><w:pBdr><w:top w:val="nil"/><w:left w:val="nil"/><w:bottom w:val="nil"/><w:right w:val="nil"/><w:between w:val="nil"/></w:pBdr><w:spacing w:line="254" w:lineRule="auto"/><w:ind w:left="107"/><w:rPr><w:b/><w:color w:val="000000"/><w:sz w:val="24"/><w:szCs w:val="24"/></w:rPr></w:pPr><w:r><w:rPr><w:b/><w:color w:val="000000"/><w:sz w:val="24"/><w:szCs w:val="24"/></w:rPr><w:t>NAMA MAHASISWA/NIM/KELOMPOK: {group_info}</w:t></w:r></w:p></w:tc></w:tr><w:tr><w:trPr><w:trHeight w:val="278"/></w:trPr><w:tc><w:tcPr><w:tcW w:w="10365" w:type="dxa"/><w:gridSpan w:val="8"/><w:tcBorders><w:top w:val="single" w:sz="8" w:space="0" w:color="000000"/><w:left w:val="single" w:sz="8" w:space="0" w:color="000000"/><w:bottom w:val="single" w:sz="8" w:space="0" w:color="000000"/><w:right w:val="single" w:sz="8" w:space="0" w:color="000000"/></w:tcBorders></w:tcPr><w:p><w:pPr><w:pBdr><w:top w:val="nil"/><w:left w:val="nil"/><w:bottom w:val="nil"/><w:right w:val="nil"/><w:between w:val="nil"/></w:pBdr><w:spacing w:line="258" w:lineRule="auto"/><w:ind w:left="107"/><w:rPr><w:b/><w:color w:val="000000"/><w:sz w:val="24"/><w:szCs w:val="24"/></w:rPr></w:pPr><w:r><w:rPr><w:b/><w:color w:val="000000"/><w:sz w:val="24"/><w:szCs w:val="24"/></w:rPr><w:t>A. JADWAL:</w:t></w:r></w:p></w:tc></w:tr><w:tr><w:trPr><w:trHeight w:val="230"/></w:trPr><w:tc><w:tcPr><w:tcW w:w="635" w:type="dxa"/><w:tcBorders><w:top w:val="single" w:sz="8" w:space="0" w:color="000000"/><w:left w:val="single" w:sz="8" w:space="0" w:color="000000"/><w:bottom w:val="single" w:sz="8" w:space="0" w:color="000000"/><w:right w:val="single" w:sz="8" w:space="0" w:color="000000"/></w:tcBorders></w:tcPr><w:p><w:pPr><w:rPr><w:b/><w:bCs/><w:color w:val="000000"/><w:sz w:val="20"/><w:szCs w:val="20"/></w:rPr></w:pPr><w:r><w:rPr><w:b/><w:bCs/><w:sz w:val="20"/><w:szCs w:val="20"/></w:rPr><w:t>HARI</w:t></w:r></w:p></w:tc><w:tc><w:tcPr><w:tcW w:w="1465" w:type="dxa"/><w:tcBorders><w:top w:val="single" w:sz="8" w:space="0" w:color="000000"/><w:left w:val="single" w:sz="8" w:space="0" w:color="000000"/><w:bottom w:val="single" w:sz="8" w:space="0" w:color="000000"/><w:right w:val="single" w:sz="8" w:space="0" w:color="000000"/></w:tcBorders></w:tcPr><w:p><w:pPr><w:pBdr><w:top w:val="nil"/><w:left w:val="nil"/><w:bottom w:val="nil"/><w:right w:val="nil"/><w:between w:val="nil"/></w:pBdr><w:spacing w:line="210" w:lineRule="auto"/><w:ind w:left="106"/><w:rPr><w:b/><w:color w:val="000000"/><w:sz w:val="20"/><w:szCs w:val="20"/></w:rPr></w:pPr><w:r><w:rPr><w:b/><w:color w:val="000000"/><w:sz w:val="20"/><w:szCs w:val="20"/></w:rPr><w:t>TANGGAL</w:t></w:r></w:p></w:tc><w:tc><w:tcPr><w:tcW w:w="720" w:type="dxa"/><w:tcBorders><w:top w:val="single" w:sz="8" w:space="0" w:color="000000"/><w:left w:val="single" w:sz="8" w:space="0" w:color="000000"/><w:bottom w:val="single" w:sz="8" w:space="0" w:color="000000"/><w:right w:val="single" w:sz="8" w:space="0" w:color="000000"/></w:tcBorders></w:tcPr><w:p><w:pPr><w:pBdr><w:top w:val="nil"/><w:left w:val="nil"/><w:bottom w:val="nil"/><w:right w:val="nil"/><w:between w:val="nil"/></w:pBdr><w:spacing w:line="210" w:lineRule="auto"/><w:ind w:left="242"/><w:rPr><w:b/><w:color w:val="000000"/><w:sz w:val="20"/><w:szCs w:val="20"/></w:rPr></w:pPr><w:r><w:rPr><w:b/><w:color w:val="000000"/><w:sz w:val="20"/><w:szCs w:val="20"/></w:rPr><w:t>JAM</w:t></w:r></w:p></w:tc><w:tc><w:tcPr><w:tcW w:w="1642" w:type="dxa"/><w:gridSpan w:val="2"/><w:tcBorders><w:top w:val="single" w:sz="8" w:space="0" w:color="000000"/><w:left w:val="single" w:sz="8" w:space="0" w:color="000000"/><w:bottom w:val="single" w:sz="8" w:space="0" w:color="000000"/><w:right w:val="single" w:sz="8" w:space="0" w:color="000000"/></w:tcBorders></w:tcPr><w:p><w:pPr><w:pBdr><w:top w:val="nil"/><w:left w:val="nil"/><w:bottom w:val="nil"/><w:right w:val="nil"/><w:between w:val="nil"/></w:pBdr><w:spacing w:line="210" w:lineRule="auto"/><w:ind w:left="242"/><w:rPr><w:b/><w:color w:val="000000"/><w:sz w:val="20"/><w:szCs w:val="20"/></w:rPr></w:pPr><w:r><w:rPr><w:b/><w:sz w:val="20"/><w:szCs w:val="20"/></w:rPr><w:t>KEGIATAN</w:t></w:r></w:p></w:tc><w:tc><w:tcPr><w:tcW w:w="5903" w:type="dxa"/><w:gridSpan w:val="3"/><w:tcBorders><w:top w:val="single" w:sz="8" w:space="0" w:color="000000"/><w:left w:val="single" w:sz="8" w:space="0" w:color="000000"/><w:bottom w:val="single" w:sz="8" w:space="0" w:color="000000"/><w:right w:val="single" w:sz="8" w:space="0" w:color="000000"/></w:tcBorders></w:tcPr><w:p><w:pPr><w:pBdr><w:top w:val="nil"/><w:left w:val="nil"/><w:bottom w:val="nil"/><w:right w:val="nil"/><w:between w:val="nil"/></w:pBdr><w:spacing w:line="210" w:lineRule="auto"/><w:ind w:right="1"/><w:jc w:val="center"/><w:rPr><w:b/><w:color w:val="FF0000"/><w:sz w:val="20"/><w:szCs w:val="20"/></w:rPr></w:pPr><w:r><w:rPr><w:b/><w:color w:val="FF0000"/><w:sz w:val="20"/><w:szCs w:val="20"/></w:rPr><w:t>Dokumentasi</w:t></w:r></w:p></w:tc></w:tr><w:tr><w:trPr><w:trHeight w:val="230"/></w:trPr><w:tc><w:tcPr><w:tcW w:w="635" w:type="dxa"/><w:tcBorders><w:top w:val="single" w:sz="8" w:space="0" w:color="000000"/><w:left w:val="single" w:sz="8" w:space="0" w:color="000000"/><w:bottom w:val="single" w:sz="8" w:space="0" w:color="000000"/><w:right w:val="single" w:sz="8" w:space="0" w:color="000000"/></w:tcBorders></w:tcPr><w:p><w:pPr><w:pBdr><w:top w:val="nil"/><w:left w:val="nil"/><w:bottom w:val="nil"/><w:right w:val="nil"/><w:between w:val="nil"/></w:pBdr><w:rPr><w:color w:val="000000"/><w:sz w:val="16"/><w:szCs w:val="16"/></w:rPr></w:pPr><w:r><w:rPr><w:rFonts w:ascii="Times New Roman" w:hAnsi="Times New Roman"/><w:sz w:val="18"/></w:rPr><w:t>{#entries}{day_name}</w:t></w:r></w:p></w:tc><w:tc><w:tcPr><w:tcW w:w="1465" w:type="dxa"/><w:tcBorders><w:top w:val="single" w:sz="8" w:space="0" w:color="000000"/><w:left w:val="single" w:sz="8" w:space="0" w:color="000000"/><w:bottom w:val="single" w:sz="8" w:space="0" w:color="000000"/><w:right w:val="single" w:sz="8" w:space="0" w:color="000000"/></w:tcBorders></w:tcPr><w:p><w:pPr><w:pBdr><w:top w:val="nil"/><w:left w:val="nil"/><w:bottom w:val="nil"/><w:right w:val="nil"/><w:between w:val="nil"/></w:pBdr><w:rPr><w:color w:val="000000"/><w:sz w:val="16"/><w:szCs w:val="16"/></w:rPr></w:pPr><w:r><w:rPr><w:rFonts w:ascii="Times New Roman" w:hAnsi="Times New Roman"/><w:sz w:val="18"/></w:rPr><w:t>{entry_date}</w:t></w:r></w:p></w:tc><w:tc><w:tcPr><w:tcW w:w="720" w:type="dxa"/><w:tcBorders><w:top w:val="single" w:sz="8" w:space="0" w:color="000000"/><w:left w:val="single" w:sz="8" w:space="0" w:color="000000"/><w:bottom w:val="single" w:sz="8" w:space="0" w:color="000000"/><w:right w:val="single" w:sz="8" w:space="0" w:color="000000"/></w:tcBorders></w:tcPr><w:p><w:pPr><w:pBdr><w:top w:val="nil"/><w:left w:val="nil"/><w:bottom w:val="nil"/><w:right w:val="nil"/><w:between w:val="nil"/></w:pBdr><w:rPr><w:color w:val="000000"/><w:sz w:val="16"/><w:szCs w:val="16"/></w:rPr></w:pPr><w:r><w:rPr><w:rFonts w:ascii="Times New Roman" w:hAnsi="Times New Roman"/><w:sz w:val="18"/></w:rPr><w:t>{time_range}</w:t></w:r></w:p></w:tc><w:tc><w:tcPr><w:tcW w:w="1642" w:type="dxa"/><w:gridSpan w:val="2"/><w:tcBorders><w:top w:val="single" w:sz="8" w:space="0" w:color="000000"/><w:left w:val="single" w:sz="8" w:space="0" w:color="000000"/><w:bottom w:val="single" w:sz="8" w:space="0" w:color="000000"/><w:right w:val="single" w:sz="8" w:space="0" w:color="000000"/></w:tcBorders></w:tcPr><w:p><w:pPr><w:pBdr><w:top w:val="nil"/><w:left w:val="nil"/><w:bottom w:val="nil"/><w:right w:val="nil"/><w:between w:val="nil"/></w:pBdr><w:rPr><w:color w:val="000000"/><w:sz w:val="16"/><w:szCs w:val="16"/></w:rPr></w:pPr><w:r><w:rPr><w:rFonts w:ascii="Times New Roman" w:hAnsi="Times New Roman"/><w:sz w:val="18"/></w:rPr><w:t>{activity_description}</w:t></w:r></w:p></w:tc><w:tc><w:tcPr><w:tcW w:w="5903" w:type="dxa"/><w:gridSpan w:val="3"/><w:tcBorders><w:top w:val="single" w:sz="8" w:space="0" w:color="000000"/><w:left w:val="single" w:sz="8" w:space="0" w:color="000000"/><w:bottom w:val="single" w:sz="8" w:space="0" w:color="000000"/><w:right w:val="single" w:sz="8" w:space="0" w:color="000000"/></w:tcBorders></w:tcPr><w:p><w:pPr><w:pBdr><w:top w:val="nil"/><w:left w:val="nil"/><w:bottom w:val="nil"/><w:right w:val="nil"/><w:between w:val="nil"/></w:pBdr><w:rPr><w:color w:val="000000"/><w:sz w:val="16"/><w:szCs w:val="16"/></w:rPr></w:pPr><w:r><w:rPr><w:rFonts w:ascii="Times New Roman" w:hAnsi="Times New Roman"/><w:sz w:val="18"/></w:rPr><w:t>{documentation}{/entries}</w:t></w:r></w:p></w:tc></w:tr><w:tr><w:trPr><w:trHeight w:val="230"/></w:trPr><w:tc><w:tcPr><w:tcW w:w="10365" w:type="dxa"/><w:gridSpan w:val="8"/><w:tcBorders><w:top w:val="single" w:sz="8" w:space="0" w:color="000000"/><w:left w:val="single" w:sz="8" w:space="0" w:color="000000"/><w:bottom w:val="single" w:sz="8" w:space="0" w:color="000000"/><w:right w:val="single" w:sz="8" w:space="0" w:color="000000"/></w:tcBorders></w:tcPr><w:p><w:pPr><w:pBdr><w:top w:val="nil"/><w:left w:val="nil"/><w:bottom w:val="nil"/><w:right w:val="nil"/><w:between w:val="nil"/></w:pBdr><w:ind w:left="107"/><w:jc w:val="both"/><w:rPr><w:b/><w:color w:val="000000"/><w:sz w:val="24"/><w:szCs w:val="24"/></w:rPr></w:pPr><w:r><w:rPr><w:b/><w:color w:val="000000"/><w:sz w:val="24"/><w:szCs w:val="24"/></w:rPr><w:t>B. CATATAN PENTING HARIAN</w:t></w:r></w:p></w:tc></w:tr><w:tr><w:trPr><w:trHeight w:val="1838"/></w:trPr><w:tc><w:tcPr><w:tcW w:w="10365" w:type="dxa"/><w:gridSpan w:val="8"/><w:tcBorders><w:top w:val="single" w:sz="8" w:space="0" w:color="000000"/><w:left w:val="single" w:sz="8" w:space="0" w:color="000000"/><w:bottom w:val="single" w:sz="8" w:space="0" w:color="000000"/><w:right w:val="single" w:sz="8" w:space="0" w:color="000000"/></w:tcBorders></w:tcPr><w:p><w:pPr><w:spacing w:line="220" w:lineRule="auto"/><w:ind w:left="100"/><w:rPr><w:rFonts w:ascii="Times New Roman" w:hAnsi="Times New Roman"/><w:sz w:val="20"/></w:rPr></w:pPr><w:r><w:rPr><w:rFonts w:ascii="Times New Roman" w:hAnsi="Times New Roman"/><w:sz w:val="20"/></w:rPr><w:t>1. {note_1}</w:t></w:r></w:p><w:p><w:pPr><w:spacing w:line="220" w:lineRule="auto"/><w:ind w:left="100"/><w:rPr><w:rFonts w:ascii="Times New Roman" w:hAnsi="Times New Roman"/><w:sz w:val="20"/></w:rPr></w:pPr><w:r><w:rPr><w:rFonts w:ascii="Times New Roman" w:hAnsi="Times New Roman"/><w:sz w:val="20"/></w:rPr><w:t>2. {note_2}</w:t></w:r></w:p><w:p><w:pPr><w:spacing w:line="220" w:lineRule="auto"/><w:ind w:left="100"/><w:rPr><w:rFonts w:ascii="Times New Roman" w:hAnsi="Times New Roman"/><w:sz w:val="20"/></w:rPr></w:pPr><w:r><w:rPr><w:rFonts w:ascii="Times New Roman" w:hAnsi="Times New Roman"/><w:sz w:val="20"/></w:rPr><w:t>3. {note_3}</w:t></w:r></w:p><w:p><w:pPr><w:pBdr><w:top w:val="nil"/><w:left w:val="nil"/><w:bottom w:val="nil"/><w:right w:val="nil"/><w:between w:val="nil"/></w:pBdr><w:ind w:left="107"/><w:rPr><w:b/><w:color w:val="000000"/><w:sz w:val="20"/><w:szCs w:val="20"/></w:rPr></w:pPr><w:r><w:rPr><w:b/><w:color w:val="000000"/><w:sz w:val="20"/><w:szCs w:val="20"/></w:rPr><w:t>2.</w:t></w:r></w:p><w:p><w:pPr><w:pBdr><w:top w:val="nil"/><w:left w:val="nil"/><w:bottom w:val="nil"/><w:right w:val="nil"/><w:between w:val="nil"/></w:pBdr><w:spacing w:before="228"/><w:rPr><w:color w:val="000000"/><w:sz w:val="20"/><w:szCs w:val="20"/></w:rPr></w:pPr></w:p><w:p><w:pPr><w:pBdr><w:top w:val="nil"/><w:left w:val="nil"/><w:bottom w:val="nil"/><w:right w:val="nil"/><w:between w:val="nil"/></w:pBdr><w:ind w:left="107"/><w:rPr><w:b/><w:color w:val="000000"/><w:sz w:val="20"/><w:szCs w:val="20"/></w:rPr></w:pPr><w:r><w:rPr><w:b/><w:color w:val="000000"/><w:sz w:val="20"/><w:szCs w:val="20"/></w:rPr><w:t>3.</w:t></w:r></w:p></w:tc></w:tr><w:tr><w:trPr><w:trHeight w:val="1579"/></w:trPr><w:tc><w:tcPr><w:tcW w:w="10365" w:type="dxa"/><w:gridSpan w:val="8"/><w:vMerge w:val="restart"/><w:tcBorders><w:top w:val="single" w:sz="8" w:space="0" w:color="000000"/><w:left w:val="single" w:sz="8" w:space="0" w:color="000000"/><w:bottom w:val="single" w:sz="8" w:space="0" w:color="000000"/><w:right w:val="single" w:sz="8" w:space="0" w:color="000000"/></w:tcBorders></w:tcPr><w:p><w:pPr><w:spacing w:line="275" w:lineRule="auto"/><w:ind w:left="107"/><w:rPr><w:b/><w:sz w:val="24"/><w:szCs w:val="24"/></w:rPr></w:pPr><w:r><w:rPr><w:b/><w:sz w:val="24"/><w:szCs w:val="24"/></w:rPr><w:t>D. PENGESAHAN</w:t></w:r></w:p></w:tc></w:tr><w:tr><w:trPr><w:trHeight w:val="276"/></w:trPr><w:tc><w:tcPr><w:tcW w:w="10365" w:type="dxa"/><w:gridSpan w:val="8"/><w:vMerge/><w:tcBorders><w:top w:val="single" w:sz="8" w:space="0" w:color="000000"/><w:left w:val="single" w:sz="8" w:space="0" w:color="000000"/><w:bottom w:val="single" w:sz="8" w:space="0" w:color="000000"/><w:right w:val="single" w:sz="8" w:space="0" w:color="000000"/></w:tcBorders></w:tcPr><w:p><w:pPr><w:pBdr><w:top w:val="nil"/><w:left w:val="nil"/><w:bottom w:val="nil"/><w:right w:val="nil"/><w:between w:val="nil"/></w:pBdr><w:rPr><w:b/><w:color w:val="000000"/><w:sz w:val="24"/><w:szCs w:val="24"/></w:rPr></w:pPr></w:p></w:tc></w:tr><w:tr><w:trPr><w:trHeight w:val="1634"/></w:trPr><w:tc><w:tcPr><w:tcW w:w="5250" w:type="dxa"/><w:gridSpan w:val="6"/><w:tcBorders><w:top w:val="single" w:sz="8" w:space="0" w:color="000000"/><w:left w:val="single" w:sz="8" w:space="0" w:color="000000"/><w:bottom w:val="single" w:sz="8" w:space="0" w:color="000000"/><w:right w:val="single" w:sz="8" w:space="0" w:color="000000"/></w:tcBorders></w:tcPr><w:p><w:pPr><w:pBdr><w:top w:val="nil"/><w:left w:val="nil"/><w:bottom w:val="nil"/><w:right w:val="nil"/><w:between w:val="nil"/></w:pBdr><w:spacing w:line="251" w:lineRule="auto"/><w:ind w:left="263"/><w:rPr><w:b/><w:color w:val="000000"/></w:rPr></w:pPr><w:r><w:rPr><w:b/><w:color w:val="000000"/></w:rPr><w:t>TANDA TANGAN LURAH/KEPALA DESA</w:t></w:r></w:p></w:tc><w:tc><w:tcPr><w:tcW w:w="5115" w:type="dxa"/><w:gridSpan w:val="2"/><w:tcBorders><w:top w:val="single" w:sz="8" w:space="0" w:color="000000"/><w:left w:val="single" w:sz="8" w:space="0" w:color="000000"/><w:bottom w:val="single" w:sz="8" w:space="0" w:color="000000"/><w:right w:val="single" w:sz="8" w:space="0" w:color="000000"/></w:tcBorders></w:tcPr><w:p><w:pPr><w:pBdr><w:top w:val="nil"/><w:left w:val="nil"/><w:bottom w:val="nil"/><w:right w:val="nil"/><w:between w:val="nil"/></w:pBdr><w:spacing w:line="275" w:lineRule="auto"/><w:ind w:left="1001"/><w:rPr><w:b/><w:color w:val="000000"/><w:sz w:val="24"/><w:szCs w:val="24"/></w:rPr></w:pPr><w:r><w:rPr><w:b/><w:color w:val="000000"/><w:sz w:val="24"/><w:szCs w:val="24"/></w:rPr><w:t>TANDA TANGAN MAHASISWA</w:t></w:r></w:p></w:tc></w:tr></w:tbl><w:p><w:r><w:t>{/weeks}</w:t></w:r></w:p><w:p><w:pPr><w:spacing w:before="240" w:after="240"/><w:jc w:val="both"/><w:rPr><w:b/><w:sz w:val="24"/><w:szCs w:val="24"/></w:rPr></w:pPr><w:r><w:rPr><w:b/><w:sz w:val="24"/><w:szCs w:val="24"/></w:rPr><w:t>Petunjuk Pengisian:</w:t></w:r></w:p><w:p><w:pPr><w:numPr><w:ilvl w:val="0"/><w:numId w:val="1"/></w:numPr><w:pBdr><w:top w:val="nil"/><w:left w:val="nil"/><w:bottom w:val="nil"/><w:right w:val="nil"/><w:between w:val="nil"/></w:pBdr><w:jc w:val="both"/><w:rPr><w:sz w:val="24"/><w:szCs w:val="24"/></w:rPr></w:pPr><w:r><w:rPr><w:sz w:val="24"/><w:szCs w:val="24"/></w:rPr><w:t xml:space="preserve">Logbook adalah buku catatan harian bagi peserta KKN yang wajib diisi setiap hari dan dilaporkan kepada Dosen Pembimbing Lapangan (DPL) setiap minggu Ling google form. </w:t></w:r></w:p><w:p><w:pPr><w:numPr><w:ilvl w:val="0"/><w:numId w:val="1"/></w:numPr><w:pBdr><w:top w:val="nil"/><w:left w:val="nil"/><w:bottom w:val="nil"/><w:right w:val="nil"/><w:between w:val="nil"/></w:pBdr><w:jc w:val="both"/><w:rPr><w:sz w:val="24"/><w:szCs w:val="24"/></w:rPr></w:pPr><w:r><w:rPr><w:sz w:val="24"/><w:szCs w:val="24"/></w:rPr><w:t>Logbook hanya boleh diisi dengan aktivitas yang berkaitan dengan program KKN.</w:t></w:r></w:p><w:p><w:pPr><w:numPr><w:ilvl w:val="0"/><w:numId w:val="1"/></w:numPr><w:pBdr><w:top w:val="nil"/><w:left w:val="nil"/><w:bottom w:val="nil"/><w:right w:val="nil"/><w:between w:val="nil"/></w:pBdr><w:jc w:val="both"/><w:rPr><w:sz w:val="24"/><w:szCs w:val="24"/></w:rPr></w:pPr><w:r><w:rPr><w:sz w:val="24"/><w:szCs w:val="24"/></w:rPr><w:t>Setiap logbook harus ditempelkan pas foto berwarna terbaru dengan ukuran 4x6 cm.</w:t></w:r></w:p><w:p><w:pPr><w:numPr><w:ilvl w:val="0"/><w:numId w:val="1"/></w:numPr><w:pBdr><w:top w:val="nil"/><w:left w:val="nil"/><w:bottom w:val="nil"/><w:right w:val="nil"/><w:between w:val="nil"/></w:pBdr><w:jc w:val="both"/><w:rPr><w:sz w:val="24"/><w:szCs w:val="24"/></w:rPr></w:pPr><w:r><w:rPr><w:sz w:val="24"/><w:szCs w:val="24"/></w:rPr><w:t>Isi logbook mencakup kegiatan harian, catatan penting, serta dokumentasi seperti foto, tautan video, dan lain-lain.</w:t></w:r></w:p><w:p><w:pPr><w:numPr><w:ilvl w:val="0"/><w:numId w:val="1"/></w:numPr><w:pBdr><w:top w:val="nil"/><w:left w:val="nil"/><w:bottom w:val="nil"/><w:right w:val="nil"/><w:between w:val="nil"/></w:pBdr><w:jc w:val="both"/><w:rPr><w:sz w:val="24"/><w:szCs w:val="24"/></w:rPr></w:pPr><w:r><w:rPr><w:sz w:val="24"/><w:szCs w:val="24"/></w:rPr><w:t>Penulisan logbook harus menggunakan bahasa Indonesia yang baik dan benar sesuai kaidah baku.</w:t></w:r></w:p><w:p><w:pPr><w:numPr><w:ilvl w:val="0"/><w:numId w:val="1"/></w:numPr><w:pBdr><w:top w:val="nil"/><w:left w:val="nil"/><w:bottom w:val="nil"/><w:right w:val="nil"/><w:between w:val="nil"/></w:pBdr><w:jc w:val="both"/><w:rPr><w:sz w:val="24"/><w:szCs w:val="24"/></w:rPr></w:pPr><w:r><w:rPr><w:sz w:val="24"/><w:szCs w:val="24"/></w:rPr><w:t>Pada bagian kolom pengesahan, mahasiswa wajib menandatangani serta menuliskan nama lengkapnya, kemudian nama lurah, kepala desa, atau pihak berwenang lainnya.</w:t></w:r></w:p><w:p><w:pPr><w:numPr><w:ilvl w:val="0"/><w:numId w:val="1"/></w:numPr><w:pBdr><w:top w:val="nil"/><w:left w:val="nil"/><w:bottom w:val="nil"/><w:right w:val="nil"/><w:between w:val="nil"/></w:pBdr><w:jc w:val="both"/><w:rPr><w:sz w:val="24"/><w:szCs w:val="24"/></w:rPr></w:pPr><w:r><w:rPr><w:sz w:val="24"/><w:szCs w:val="24"/></w:rPr><w:t>Selanjutnya, lurah, kepala desa, atau pihak berwenang terkait diminta untuk memberikan tanda tangan pada logbook mingguan tersebut.</w:t></w:r></w:p><w:p><w:pPr><w:numPr><w:ilvl w:val="0"/><w:numId w:val="1"/></w:numPr><w:pBdr><w:top w:val="nil"/><w:left w:val="nil"/><w:bottom w:val="nil"/><w:right w:val="nil"/><w:between w:val="nil"/></w:pBdr><w:jc w:val="both"/><w:rPr><w:sz w:val="24"/><w:szCs w:val="24"/></w:rPr></w:pPr><w:r><w:rPr><w:sz w:val="24"/><w:szCs w:val="24"/></w:rPr><w:t>Mahasiswa kemudian mengirimkan logbook mingguan secara daring kepada DPL masing-masing.</w:t></w:r></w:p><w:p><w:pPr><w:numPr><w:ilvl w:val="0"/><w:numId w:val="1"/></w:numPr><w:pBdr><w:top w:val="nil"/><w:left w:val="nil"/><w:bottom w:val="nil"/><w:right w:val="nil"/><w:between w:val="nil"/></w:pBdr><w:jc w:val="both"/><w:rPr><w:sz w:val="24"/><w:szCs w:val="24"/></w:rPr></w:pPr><w:r><w:rPr><w:sz w:val="24"/><w:szCs w:val="24"/></w:rPr><w:t>DPL akan memeriksa dan memberikan tanggapan terhadap logbook setiap minggu.</w:t></w:r><w:r><w:rPr><w:sz w:val="24"/><w:szCs w:val="24"/></w:rPr><w:br/></w:r></w:p><w:p><w:pPr><w:pBdr><w:top w:val="nil"/><w:left w:val="nil"/><w:bottom w:val="nil"/><w:right w:val="nil"/><w:between w:val="nil"/></w:pBdr><w:ind w:left="1080"/><w:jc w:val="both"/><w:rPr><w:sz w:val="24"/><w:szCs w:val="24"/></w:rPr></w:pPr></w:p><w:sectPr><w:pgSz w:w="12240" w:h="15840"/><w:pgMar w:top="1440" w:right="1440" w:bottom="1440" w:left="1440" w:header="708" w:footer="708" w:gutter="0"/><w:pgNumType w:start="1"/><w:cols w:space="720"/></w:sectPr></w:body></w:document>
+<file path=word/document.xml><?xml version="1.0" encoding="utf-8"?>
+<w:document xmlns:wpc="http://schemas.microsoft.com/office/word/2010/wordprocessingCanvas" xmlns:cx="http://schemas.microsoft.com/office/drawing/2014/chartex" xmlns:cx1="http://schemas.microsoft.com/office/drawing/2015/9/8/chartex" xmlns:cx2="http://schemas.microsoft.com/office/drawing/2015/10/21/chartex" xmlns:cx3="http://schemas.microsoft.com/office/drawing/2016/5/9/chartex" xmlns:cx4="http://schemas.microsoft.com/office/drawing/2016/5/10/chartex" xmlns:cx5="http://schemas.microsoft.com/office/drawing/2016/5/11/chartex" xmlns:cx6="http://schemas.microsoft.com/office/drawing/2016/5/12/chartex" xmlns:cx7="http://schemas.microsoft.com/office/drawing/2016/5/13/chartex" xmlns:cx8="http://schemas.microsoft.com/office/drawing/2016/5/14/chartex" xmlns:mc="http://schemas.openxmlformats.org/markup-compatibility/2006" xmlns:aink="http://schemas.microsoft.com/office/drawing/2016/ink" xmlns:am3d="http://schemas.microsoft.com/office/drawing/2017/model3d" xmlns:o="urn:schemas-microsoft-com:office:office" xmlns:oel="http://schemas.microsoft.com/office/2019/extlst" xmlns:r="http://schemas.openxmlformats.org/officeDocument/2006/relationships" xmlns:m="http://schemas.openxmlformats.org/officeDocument/2006/math" xmlns:v="urn:schemas-microsoft-com:vml" xmlns:wp14="http://schemas.microsoft.com/office/word/2010/wordprocessingDrawing" xmlns:wp="http://schemas.openxmlformats.org/drawingml/2006/wordprocessingDrawing" xmlns:w10="urn:schemas-microsoft-com:office:word" xmlns:w="http://schemas.openxmlformats.org/wordprocessingml/2006/main" xmlns:w14="http://schemas.microsoft.com/office/word/2010/wordml" xmlns:w15="http://schemas.microsoft.com/office/word/2012/wordml" xmlns:w16cex="http://schemas.microsoft.com/office/word/2018/wordml/cex" xmlns:w16cid="http://schemas.microsoft.com/office/word/2016/wordml/cid" xmlns:w16="http://schemas.microsoft.com/office/word/2018/wordml" xmlns:w16du="http://schemas.microsoft.com/office/word/2023/wordml/word16du" xmlns:w16sdtdh="http://schemas.microsoft.com/office/word/2020/wordml/sdtdatahash" xmlns:w16sdtfl="http://schemas.microsoft.com/office/word/2024/wordml/sdtformatlock" xmlns:w16se="http://schemas.microsoft.com/office/word/2015/wordml/symex" xmlns:wpg="http://schemas.microsoft.com/office/word/2010/wordprocessingGroup" xmlns:wpi="http://schemas.microsoft.com/office/word/2010/wordprocessingInk" xmlns:wne="http://schemas.microsoft.com/office/word/2006/wordml" xmlns:wps="http://schemas.microsoft.com/office/word/2010/wordprocessingShape" mc:Ignorable="w14 w15 w16se w16cid w16 w16cex w16sdtdh w16sdtfl w16du wp14">
+  <w:body>
+    <w:p>
+      <w:pPr>
+        <w:spacing w:before="58"/>
+        <w:ind w:left="356" w:right="360"/>
+        <w:jc w:val="center"/>
+        <w:rPr>
+          <w:b/>
+          <w:i/>
+          <w:sz w:val="32"/>
+          <w:szCs w:val="32"/>
+        </w:rPr>
+      </w:pPr>
+      <w:r>
+        <w:rPr>
+          <w:b/>
+          <w:sz w:val="32"/>
+          <w:szCs w:val="32"/>
+        </w:rPr>
+        <w:t xml:space="preserve">BUKU CATATAN HARIAN </w:t>
+      </w:r>
+      <w:r>
+        <w:rPr>
+          <w:b/>
+          <w:i/>
+          <w:sz w:val="32"/>
+          <w:szCs w:val="32"/>
+        </w:rPr>
+        <w:t>(LOGBOOK)</w:t>
+      </w:r>
+    </w:p>
+    <w:p>
+      <w:pPr>
+        <w:pBdr>
+          <w:top w:val="nil"/>
+          <w:left w:val="nil"/>
+          <w:bottom w:val="nil"/>
+          <w:right w:val="nil"/>
+          <w:between w:val="nil"/>
+        </w:pBdr>
+        <w:spacing w:before="31"/>
+        <w:rPr>
+          <w:b/>
+          <w:i/>
+          <w:color w:val="000000"/>
+          <w:sz w:val="32"/>
+          <w:szCs w:val="32"/>
+        </w:rPr>
+      </w:pPr>
+    </w:p>
+    <w:p>
+      <w:pPr>
+        <w:pStyle w:val="Title"/>
+        <w:spacing w:after="0"/>
+        <w:jc w:val="center"/>
+        <w:rPr>
+          <w:rFonts w:ascii="Times New Roman" w:eastAsia="Times New Roman" w:hAnsi="Times New Roman" w:cs="Times New Roman"/>
+          <w:b/>
+          <w:sz w:val="32"/>
+          <w:szCs w:val="32"/>
+        </w:rPr>
+      </w:pPr>
+      <w:r>
+        <w:rPr>
+          <w:rFonts w:ascii="Times New Roman" w:eastAsia="Times New Roman" w:hAnsi="Times New Roman" w:cs="Times New Roman"/>
+          <w:b/>
+          <w:sz w:val="32"/>
+          <w:szCs w:val="32"/>
+        </w:rPr>
+        <w:t xml:space="preserve">KULIAH KERJA NYATA (KKN) </w:t>
+      </w:r>
+    </w:p>
+    <w:p>
+      <w:pPr>
+        <w:pStyle w:val="Title"/>
+        <w:jc w:val="center"/>
+        <w:rPr>
+          <w:rFonts w:ascii="Times New Roman" w:eastAsia="Times New Roman" w:hAnsi="Times New Roman" w:cs="Times New Roman"/>
+          <w:b/>
+          <w:sz w:val="32"/>
+          <w:szCs w:val="32"/>
+        </w:rPr>
+      </w:pPr>
+      <w:r>
+        <w:rPr>
+          <w:rFonts w:ascii="Times New Roman" w:eastAsia="Times New Roman" w:hAnsi="Times New Roman" w:cs="Times New Roman"/>
+          <w:b/>
+          <w:sz w:val="32"/>
+          <w:szCs w:val="32"/>
+        </w:rPr>
+        <w:t>UNIVERSITAS MARITIM RAJA ALI HAJI</w:t>
+      </w:r>
+    </w:p>
+    <w:p>
+      <w:pPr>
+        <w:pBdr>
+          <w:top w:val="nil"/>
+          <w:left w:val="nil"/>
+          <w:bottom w:val="nil"/>
+          <w:right w:val="nil"/>
+          <w:between w:val="nil"/>
+        </w:pBdr>
+        <w:rPr>
+          <w:b/>
+          <w:color w:val="000000"/>
+          <w:sz w:val="20"/>
+          <w:szCs w:val="20"/>
+        </w:rPr>
+      </w:pPr>
+    </w:p>
+    <w:p>
+      <w:pPr>
+        <w:pBdr>
+          <w:top w:val="nil"/>
+          <w:left w:val="nil"/>
+          <w:bottom w:val="nil"/>
+          <w:right w:val="nil"/>
+          <w:between w:val="nil"/>
+        </w:pBdr>
+        <w:rPr>
+          <w:b/>
+          <w:color w:val="000000"/>
+          <w:sz w:val="20"/>
+          <w:szCs w:val="20"/>
+        </w:rPr>
+      </w:pPr>
+    </w:p>
+    <w:p>
+      <w:pPr>
+        <w:pBdr>
+          <w:top w:val="nil"/>
+          <w:left w:val="nil"/>
+          <w:bottom w:val="nil"/>
+          <w:right w:val="nil"/>
+          <w:between w:val="nil"/>
+        </w:pBdr>
+        <w:rPr>
+          <w:b/>
+          <w:color w:val="000000"/>
+          <w:sz w:val="20"/>
+          <w:szCs w:val="20"/>
+        </w:rPr>
+      </w:pPr>
+    </w:p>
+    <w:p>
+      <w:pPr>
+        <w:pBdr>
+          <w:top w:val="nil"/>
+          <w:left w:val="nil"/>
+          <w:bottom w:val="nil"/>
+          <w:right w:val="nil"/>
+          <w:between w:val="nil"/>
+        </w:pBdr>
+        <w:spacing w:before="63"/>
+        <w:rPr>
+          <w:b/>
+          <w:color w:val="000000"/>
+          <w:sz w:val="20"/>
+          <w:szCs w:val="20"/>
+        </w:rPr>
+      </w:pPr>
+    </w:p>
+    <w:tbl>
+      <w:tblPr>
+        <w:tblStyle w:val="a"/>
+        <w:tblW w:w="9354" w:type="dxa"/>
+        <w:tblInd w:w="-5" w:type="dxa"/>
+        <w:tblBorders>
+          <w:top w:val="single" w:sz="4" w:space="0" w:color="000000"/>
+          <w:left w:val="single" w:sz="4" w:space="0" w:color="000000"/>
+          <w:bottom w:val="single" w:sz="4" w:space="0" w:color="000000"/>
+          <w:right w:val="single" w:sz="4" w:space="0" w:color="000000"/>
+          <w:insideH w:val="single" w:sz="4" w:space="0" w:color="000000"/>
+          <w:insideV w:val="single" w:sz="4" w:space="0" w:color="000000"/>
+        </w:tblBorders>
+        <w:tblLayout w:type="fixed"/>
+        <w:tblLook w:val="0000" w:firstRow="0" w:lastRow="0" w:firstColumn="0" w:lastColumn="0" w:noHBand="0" w:noVBand="0"/>
+      </w:tblPr>
+      <w:tblGrid>
+        <w:gridCol w:w="4677"/>
+        <w:gridCol w:w="4677"/>
+      </w:tblGrid>
+      <w:tr>
+        <w:trPr>
+          <w:trHeight w:val="365"/>
+        </w:trPr>
+        <w:tc>
+          <w:tcPr>
+            <w:tcW w:w="4677" w:type="dxa"/>
+          </w:tcPr>
+          <w:p>
+            <w:pPr>
+              <w:pBdr>
+                <w:top w:val="nil"/>
+                <w:left w:val="nil"/>
+                <w:bottom w:val="nil"/>
+                <w:right w:val="nil"/>
+                <w:between w:val="nil"/>
+              </w:pBdr>
+              <w:spacing w:line="226" w:lineRule="auto"/>
+              <w:ind w:left="107"/>
+              <w:rPr>
+                <w:color w:val="000000"/>
+                <w:sz w:val="20"/>
+                <w:szCs w:val="20"/>
+              </w:rPr>
+            </w:pPr>
+            <w:r>
+              <w:rPr>
+                <w:color w:val="000000"/>
+                <w:sz w:val="20"/>
+                <w:szCs w:val="20"/>
+              </w:rPr>
+              <w:t>NAMA</w:t>
+            </w:r>
+          </w:p>
+        </w:tc>
+        <w:tc>
+          <w:tcPr>
+            <w:tcW w:w="4677" w:type="dxa"/>
+          </w:tcPr>
+          <w:p>
+            <w:r>
+              <w:rPr>
+                <w:rFonts w:ascii="Times New Roman" w:hAnsi="Times New Roman"/>
+                <w:sz w:val="22"/>
+                <w:b/>
+              </w:rPr>
+              <w:t>{full_name}</w:t>
+            </w:r>
+          </w:p>
+        </w:tc>
+      </w:tr>
+      <w:tr>
+        <w:trPr>
+          <w:trHeight w:val="366"/>
+        </w:trPr>
+        <w:tc>
+          <w:tcPr>
+            <w:tcW w:w="4677" w:type="dxa"/>
+          </w:tcPr>
+          <w:p>
+            <w:pPr>
+              <w:pBdr>
+                <w:top w:val="nil"/>
+                <w:left w:val="nil"/>
+                <w:bottom w:val="nil"/>
+                <w:right w:val="nil"/>
+                <w:between w:val="nil"/>
+              </w:pBdr>
+              <w:spacing w:line="227" w:lineRule="auto"/>
+              <w:ind w:left="107"/>
+              <w:rPr>
+                <w:color w:val="000000"/>
+                <w:sz w:val="20"/>
+                <w:szCs w:val="20"/>
+              </w:rPr>
+            </w:pPr>
+            <w:r>
+              <w:rPr>
+                <w:color w:val="000000"/>
+                <w:sz w:val="20"/>
+                <w:szCs w:val="20"/>
+              </w:rPr>
+              <w:t>NIM</w:t>
+            </w:r>
+          </w:p>
+        </w:tc>
+        <w:tc>
+          <w:tcPr>
+            <w:tcW w:w="4677" w:type="dxa"/>
+          </w:tcPr>
+          <w:p>
+            <w:r>
+              <w:rPr>
+                <w:rFonts w:ascii="Times New Roman" w:hAnsi="Times New Roman"/>
+                <w:sz w:val="22"/>
+                <w:b/>
+              </w:rPr>
+              <w:t>{student_id}</w:t>
+            </w:r>
+          </w:p>
+        </w:tc>
+      </w:tr>
+      <w:tr>
+        <w:trPr>
+          <w:trHeight w:val="370"/>
+        </w:trPr>
+        <w:tc>
+          <w:tcPr>
+            <w:tcW w:w="4677" w:type="dxa"/>
+          </w:tcPr>
+          <w:p>
+            <w:pPr>
+              <w:pBdr>
+                <w:top w:val="nil"/>
+                <w:left w:val="nil"/>
+                <w:bottom w:val="nil"/>
+                <w:right w:val="nil"/>
+                <w:between w:val="nil"/>
+              </w:pBdr>
+              <w:spacing w:line="226" w:lineRule="auto"/>
+              <w:ind w:left="107"/>
+              <w:rPr>
+                <w:color w:val="000000"/>
+                <w:sz w:val="20"/>
+                <w:szCs w:val="20"/>
+              </w:rPr>
+            </w:pPr>
+            <w:r>
+              <w:rPr>
+                <w:color w:val="000000"/>
+                <w:sz w:val="20"/>
+                <w:szCs w:val="20"/>
+              </w:rPr>
+              <w:t>FAKULTAS/PRODI</w:t>
+            </w:r>
+          </w:p>
+        </w:tc>
+        <w:tc>
+          <w:tcPr>
+            <w:tcW w:w="4677" w:type="dxa"/>
+          </w:tcPr>
+          <w:p>
+            <w:r>
+              <w:rPr>
+                <w:rFonts w:ascii="Times New Roman" w:hAnsi="Times New Roman"/>
+                <w:sz w:val="22"/>
+                <w:b/>
+              </w:rPr>
+              <w:t>{faculty_prodi}</w:t>
+            </w:r>
+          </w:p>
+        </w:tc>
+      </w:tr>
+      <w:tr>
+        <w:trPr>
+          <w:trHeight w:val="366"/>
+        </w:trPr>
+        <w:tc>
+          <w:tcPr>
+            <w:tcW w:w="4677" w:type="dxa"/>
+          </w:tcPr>
+          <w:p>
+            <w:pPr>
+              <w:pBdr>
+                <w:top w:val="nil"/>
+                <w:left w:val="nil"/>
+                <w:bottom w:val="nil"/>
+                <w:right w:val="nil"/>
+                <w:between w:val="nil"/>
+              </w:pBdr>
+              <w:spacing w:line="222" w:lineRule="auto"/>
+              <w:ind w:left="107"/>
+              <w:rPr>
+                <w:color w:val="000000"/>
+                <w:sz w:val="20"/>
+                <w:szCs w:val="20"/>
+              </w:rPr>
+            </w:pPr>
+            <w:r>
+              <w:rPr>
+                <w:color w:val="000000"/>
+                <w:sz w:val="20"/>
+                <w:szCs w:val="20"/>
+              </w:rPr>
+              <w:t>NAMA LOKASI KKN</w:t>
+            </w:r>
+          </w:p>
+        </w:tc>
+        <w:tc>
+          <w:tcPr>
+            <w:tcW w:w="4677" w:type="dxa"/>
+          </w:tcPr>
+          <w:p>
+            <w:r>
+              <w:rPr>
+                <w:rFonts w:ascii="Times New Roman" w:hAnsi="Times New Roman"/>
+                <w:sz w:val="22"/>
+                <w:b/>
+              </w:rPr>
+              <w:t>{group_location}</w:t>
+            </w:r>
+          </w:p>
+        </w:tc>
+      </w:tr>
+      <w:tr>
+        <w:trPr>
+          <w:trHeight w:val="362"/>
+        </w:trPr>
+        <w:tc>
+          <w:tcPr>
+            <w:tcW w:w="4677" w:type="dxa"/>
+          </w:tcPr>
+          <w:p>
+            <w:pPr>
+              <w:pBdr>
+                <w:top w:val="nil"/>
+                <w:left w:val="nil"/>
+                <w:bottom w:val="nil"/>
+                <w:right w:val="nil"/>
+                <w:between w:val="nil"/>
+              </w:pBdr>
+              <w:spacing w:line="222" w:lineRule="auto"/>
+              <w:ind w:left="107"/>
+              <w:rPr>
+                <w:color w:val="000000"/>
+                <w:sz w:val="20"/>
+                <w:szCs w:val="20"/>
+              </w:rPr>
+            </w:pPr>
+            <w:r>
+              <w:rPr>
+                <w:color w:val="000000"/>
+                <w:sz w:val="20"/>
+                <w:szCs w:val="20"/>
+              </w:rPr>
+              <w:t>NAMA DOSEN PENDAMPING LAPANGAN</w:t>
+            </w:r>
+          </w:p>
+        </w:tc>
+        <w:tc>
+          <w:tcPr>
+            <w:tcW w:w="4677" w:type="dxa"/>
+          </w:tcPr>
+          <w:p>
+            <w:r>
+              <w:rPr>
+                <w:rFonts w:ascii="Times New Roman" w:hAnsi="Times New Roman"/>
+                <w:sz w:val="22"/>
+                <w:b/>
+              </w:rPr>
+              <w:t>{dosen_name}</w:t>
+            </w:r>
+          </w:p>
+        </w:tc>
+      </w:tr>
+    </w:tbl>
+    <w:p>
+      <w:pPr>
+        <w:pBdr>
+          <w:top w:val="nil"/>
+          <w:left w:val="nil"/>
+          <w:bottom w:val="nil"/>
+          <w:right w:val="nil"/>
+          <w:between w:val="nil"/>
+        </w:pBdr>
+        <w:rPr>
+          <w:b/>
+          <w:color w:val="000000"/>
+          <w:sz w:val="20"/>
+          <w:szCs w:val="20"/>
+        </w:rPr>
+      </w:pPr>
+      <w:r>
+        <w:rPr>
+          <w:noProof/>
+        </w:rPr>
+        <w:drawing>
+          <wp:anchor distT="0" distB="0" distL="114300" distR="114300" simplePos="0" relativeHeight="251659264" behindDoc="0" locked="0" layoutInCell="1" hidden="0" allowOverlap="1" wp14:anchorId="068DF41D" wp14:editId="0EDAA620">
+            <wp:simplePos x="0" y="0"/>
+            <wp:positionH relativeFrom="column">
+              <wp:posOffset>1955482</wp:posOffset>
+            </wp:positionH>
+            <wp:positionV relativeFrom="paragraph">
+              <wp:posOffset>215900</wp:posOffset>
+            </wp:positionV>
+            <wp:extent cx="2032635" cy="2035175"/>
+            <wp:effectExtent l="0" t="0" r="0" b="0"/>
+            <wp:wrapTopAndBottom distT="0" distB="0"/>
+            <wp:docPr id="1900290531" name="image2.png"/>
+            <wp:cNvGraphicFramePr/>
+            <a:graphic xmlns:a="http://schemas.openxmlformats.org/drawingml/2006/main">
+              <a:graphicData uri="http://schemas.openxmlformats.org/drawingml/2006/picture">
+                <pic:pic xmlns:pic="http://schemas.openxmlformats.org/drawingml/2006/picture">
+                  <pic:nvPicPr>
+                    <pic:cNvPr id="0" name="image2.png"/>
+                    <pic:cNvPicPr preferRelativeResize="0"/>
+                  </pic:nvPicPr>
+                  <pic:blipFill>
+                    <a:blip r:embed="rId6"/>
+                    <a:srcRect/>
+                    <a:stretch>
+                      <a:fillRect/>
+                    </a:stretch>
+                  </pic:blipFill>
+                  <pic:spPr>
+                    <a:xfrm>
+                      <a:off x="0" y="0"/>
+                      <a:ext cx="2032635" cy="2035175"/>
+                    </a:xfrm>
+                    <a:prstGeom prst="rect">
+                      <a:avLst/>
+                    </a:prstGeom>
+                    <a:ln/>
+                  </pic:spPr>
+                </pic:pic>
+              </a:graphicData>
+            </a:graphic>
+          </wp:anchor>
+        </w:drawing>
+      </w:r>
+    </w:p>
+    <w:p>
+      <w:pPr>
+        <w:spacing w:before="2"/>
+        <w:ind w:left="2880" w:right="3233"/>
+        <w:jc w:val="center"/>
+        <w:rPr>
+          <w:sz w:val="26"/>
+          <w:szCs w:val="26"/>
+        </w:rPr>
+      </w:pPr>
+    </w:p>
+    <w:p>
+      <w:pPr>
+        <w:jc w:val="center"/>
+        <w:rPr>
+          <w:sz w:val="26"/>
+          <w:szCs w:val="26"/>
+        </w:rPr>
+      </w:pPr>
+    </w:p>
+    <w:p>
+      <w:pPr>
+        <w:pBdr>
+          <w:top w:val="nil"/>
+          <w:left w:val="nil"/>
+          <w:bottom w:val="nil"/>
+          <w:right w:val="nil"/>
+          <w:between w:val="nil"/>
+        </w:pBdr>
+        <w:jc w:val="center"/>
+        <w:rPr>
+          <w:sz w:val="26"/>
+          <w:szCs w:val="26"/>
+        </w:rPr>
+      </w:pPr>
+      <w:r>
+        <w:rPr>
+          <w:sz w:val="26"/>
+          <w:szCs w:val="26"/>
+        </w:rPr>
+        <w:t>LEMBAGA PENELITIAN DAN PENGABDIAN KEPADA MASYARAKAT</w:t>
+      </w:r>
+    </w:p>
+    <w:p>
+      <w:pPr>
+        <w:jc w:val="center"/>
+        <w:rPr>
+          <w:sz w:val="26"/>
+          <w:szCs w:val="26"/>
+        </w:rPr>
+      </w:pPr>
+      <w:r>
+        <w:rPr>
+          <w:sz w:val="26"/>
+          <w:szCs w:val="26"/>
+        </w:rPr>
+        <w:t>UNIVERSITAS MARITIM RAJA ALI HAJI</w:t>
+      </w:r>
+    </w:p>
+    <w:p>
+      <w:pPr>
+        <w:jc w:val="center"/>
+        <w:rPr>
+          <w:sz w:val="26"/>
+          <w:szCs w:val="26"/>
+        </w:rPr>
+      </w:pPr>
+      <w:r>
+        <w:rPr>
+          <w:sz w:val="26"/>
+          <w:szCs w:val="26"/>
+        </w:rPr>
+        <w:t>2025</w:t>
+      </w:r>
+    </w:p>
+    <w:tbl>
+      <w:tblPr>
+        <w:tblStyle w:val="a0"/>
+        <w:tblW w:w="10365" w:type="dxa"/>
+        <w:tblInd w:w="-508" w:type="dxa"/>
+        <w:tblBorders>
+          <w:top w:val="single" w:sz="4" w:space="0" w:color="000000"/>
+          <w:left w:val="single" w:sz="4" w:space="0" w:color="000000"/>
+          <w:bottom w:val="single" w:sz="4" w:space="0" w:color="000000"/>
+          <w:right w:val="single" w:sz="4" w:space="0" w:color="000000"/>
+          <w:insideH w:val="single" w:sz="4" w:space="0" w:color="000000"/>
+          <w:insideV w:val="single" w:sz="4" w:space="0" w:color="000000"/>
+        </w:tblBorders>
+        <w:tblLayout w:type="fixed"/>
+        <w:tblLook w:val="0000" w:firstRow="0" w:lastRow="0" w:firstColumn="0" w:lastColumn="0" w:noHBand="0" w:noVBand="0"/>
+      </w:tblPr>
+      <w:tblGrid>
+        <w:gridCol w:w="635"/>
+        <w:gridCol w:w="1465"/>
+        <w:gridCol w:w="720"/>
+        <w:gridCol w:w="1110"/>
+        <w:gridCol w:w="532"/>
+        <w:gridCol w:w="788"/>
+        <w:gridCol w:w="2565"/>
+        <w:gridCol w:w="2550"/>
+      </w:tblGrid>
+      <w:tr>
+        <w:trPr>
+          <w:trHeight w:val="1955"/>
+        </w:trPr>
+        <w:tc>
+          <w:tcPr>
+            <w:tcW w:w="3930" w:type="dxa"/>
+            <w:gridSpan w:val="4"/>
+            <w:tcBorders>
+              <w:top w:val="single" w:sz="12" w:space="0" w:color="000000"/>
+              <w:left w:val="single" w:sz="12" w:space="0" w:color="000000"/>
+              <w:bottom w:val="single" w:sz="12" w:space="0" w:color="000000"/>
+              <w:right w:val="single" w:sz="12" w:space="0" w:color="000000"/>
+            </w:tcBorders>
+          </w:tcPr>
+          <w:p>
+            <w:pPr>
+              <w:pBdr>
+                <w:top w:val="nil"/>
+                <w:left w:val="nil"/>
+                <w:bottom w:val="nil"/>
+                <w:right w:val="nil"/>
+                <w:between w:val="nil"/>
+              </w:pBdr>
+              <w:ind w:left="561"/>
+              <w:rPr>
+                <w:color w:val="000000"/>
+                <w:sz w:val="20"/>
+                <w:szCs w:val="20"/>
+              </w:rPr>
+            </w:pPr>
+            <w:r>
+              <w:rPr>
+                <w:noProof/>
+              </w:rPr>
+              <w:lastRenderedPageBreak/>
+              <w:drawing>
+                <wp:anchor distT="0" distB="0" distL="114300" distR="114300" simplePos="0" relativeHeight="251660288" behindDoc="0" locked="0" layoutInCell="1" hidden="0" allowOverlap="1" wp14:anchorId="7523C5D4" wp14:editId="78695CA9">
+                  <wp:simplePos x="0" y="0"/>
+                  <wp:positionH relativeFrom="column">
+                    <wp:posOffset>316865</wp:posOffset>
+                  </wp:positionH>
+                  <wp:positionV relativeFrom="paragraph">
+                    <wp:posOffset>43180</wp:posOffset>
+                  </wp:positionV>
+                  <wp:extent cx="1156335" cy="1157605"/>
+                  <wp:effectExtent l="0" t="0" r="0" b="0"/>
+                  <wp:wrapTopAndBottom distT="0" distB="0"/>
+                  <wp:docPr id="1900290530" name="image1.png"/>
+                  <wp:cNvGraphicFramePr/>
+                  <a:graphic xmlns:a="http://schemas.openxmlformats.org/drawingml/2006/main">
+                    <a:graphicData uri="http://schemas.openxmlformats.org/drawingml/2006/picture">
+                      <pic:pic xmlns:pic="http://schemas.openxmlformats.org/drawingml/2006/picture">
+                        <pic:nvPicPr>
+                          <pic:cNvPr id="0" name="image1.png"/>
+                          <pic:cNvPicPr preferRelativeResize="0"/>
+                        </pic:nvPicPr>
+                        <pic:blipFill>
+                          <a:blip r:embed="rId7"/>
+                          <a:srcRect/>
+                          <a:stretch>
+                            <a:fillRect/>
+                          </a:stretch>
+                        </pic:blipFill>
+                        <pic:spPr>
+                          <a:xfrm>
+                            <a:off x="0" y="0"/>
+                            <a:ext cx="1156335" cy="1157605"/>
+                          </a:xfrm>
+                          <a:prstGeom prst="rect">
+                            <a:avLst/>
+                          </a:prstGeom>
+                          <a:ln/>
+                        </pic:spPr>
+                      </pic:pic>
+                    </a:graphicData>
+                  </a:graphic>
+                </wp:anchor>
+              </w:drawing>
+            </w:r>
+          </w:p>
+        </w:tc>
+        <w:tc>
+          <w:tcPr>
+            <w:tcW w:w="3885" w:type="dxa"/>
+            <w:gridSpan w:val="3"/>
+            <w:tcBorders>
+              <w:top w:val="single" w:sz="12" w:space="0" w:color="000000"/>
+              <w:left w:val="single" w:sz="12" w:space="0" w:color="000000"/>
+              <w:bottom w:val="single" w:sz="12" w:space="0" w:color="000000"/>
+              <w:right w:val="single" w:sz="12" w:space="0" w:color="000000"/>
+            </w:tcBorders>
+          </w:tcPr>
+          <w:p>
+            <w:pPr>
+              <w:pBdr>
+                <w:top w:val="nil"/>
+                <w:left w:val="nil"/>
+                <w:bottom w:val="nil"/>
+                <w:right w:val="nil"/>
+                <w:between w:val="nil"/>
+              </w:pBdr>
+              <w:spacing w:before="3"/>
+              <w:ind w:left="106"/>
+              <w:rPr>
+                <w:b/>
+                <w:i/>
+                <w:color w:val="000000"/>
+                <w:sz w:val="24"/>
+                <w:szCs w:val="24"/>
+              </w:rPr>
+            </w:pPr>
+            <w:r>
+              <w:rPr>
+                <w:b/>
+                <w:i/>
+                <w:color w:val="000000"/>
+                <w:sz w:val="24"/>
+                <w:szCs w:val="24"/>
+              </w:rPr>
+              <w:t>LOGBOOK</w:t>
+            </w:r>
+          </w:p>
+          <w:p>
+            <w:pPr>
+              <w:pBdr>
+                <w:top w:val="nil"/>
+                <w:left w:val="nil"/>
+                <w:bottom w:val="nil"/>
+                <w:right w:val="nil"/>
+                <w:between w:val="nil"/>
+              </w:pBdr>
+              <w:spacing w:before="135" w:line="360" w:lineRule="auto"/>
+              <w:ind w:left="106" w:right="267"/>
+              <w:rPr>
+                <w:b/>
+                <w:color w:val="000000"/>
+                <w:sz w:val="24"/>
+                <w:szCs w:val="24"/>
+              </w:rPr>
+            </w:pPr>
+            <w:r>
+              <w:rPr>
+                <w:b/>
+                <w:color w:val="000000"/>
+                <w:sz w:val="24"/>
+                <w:szCs w:val="24"/>
+              </w:rPr>
+              <w:t>KULIAH KERJA NYATA UNIVERSITAS MARITIM RAJA ALI HAJI</w:t>
+            </w:r>
+          </w:p>
+        </w:tc>
+        <w:tc>
+          <w:tcPr>
+            <w:tcW w:w="2550" w:type="dxa"/>
+            <w:tcBorders>
+              <w:top w:val="single" w:sz="12" w:space="0" w:color="000000"/>
+              <w:left w:val="single" w:sz="12" w:space="0" w:color="000000"/>
+              <w:bottom w:val="single" w:sz="12" w:space="0" w:color="000000"/>
+              <w:right w:val="single" w:sz="12" w:space="0" w:color="000000"/>
+            </w:tcBorders>
+          </w:tcPr>
+          <w:p>
+            <w:pPr>
+              <w:pBdr>
+                <w:top w:val="nil"/>
+                <w:left w:val="nil"/>
+                <w:bottom w:val="nil"/>
+                <w:right w:val="nil"/>
+                <w:between w:val="nil"/>
+              </w:pBdr>
+              <w:rPr>
+                <w:color w:val="000000"/>
+                <w:sz w:val="24"/>
+                <w:szCs w:val="24"/>
+              </w:rPr>
+            </w:pPr>
+          </w:p>
+          <w:p>
+            <w:pPr>
+              <w:pBdr>
+                <w:top w:val="nil"/>
+                <w:left w:val="nil"/>
+                <w:bottom w:val="nil"/>
+                <w:right w:val="nil"/>
+                <w:between w:val="nil"/>
+              </w:pBdr>
+              <w:spacing w:before="270"/>
+              <w:rPr>
+                <w:color w:val="000000"/>
+                <w:sz w:val="24"/>
+                <w:szCs w:val="24"/>
+              </w:rPr>
+            </w:pPr>
+          </w:p>
+          <w:p>
+            <w:pPr>
+              <w:pBdr>
+                <w:top w:val="nil"/>
+                <w:left w:val="nil"/>
+                <w:bottom w:val="nil"/>
+                <w:right w:val="nil"/>
+                <w:between w:val="nil"/>
+              </w:pBdr>
+              <w:spacing w:before="1"/>
+              <w:ind w:left="104" w:right="994"/>
+              <w:rPr>
+                <w:b/>
+                <w:color w:val="000000"/>
+                <w:sz w:val="24"/>
+                <w:szCs w:val="24"/>
+              </w:rPr>
+            </w:pPr>
+            <w:r>
+              <w:rPr>
+                <w:b/>
+                <w:color w:val="000000"/>
+                <w:sz w:val="24"/>
+                <w:szCs w:val="24"/>
+              </w:rPr>
+              <w:t>{week_label}</w:t>
+            </w:r>
+          </w:p>
+        </w:tc>
+      </w:tr>
+      <w:tr>
+        <w:trPr>
+          <w:trHeight w:val="274"/>
+        </w:trPr>
+        <w:tc>
+          <w:tcPr>
+            <w:tcW w:w="10365" w:type="dxa"/>
+            <w:gridSpan w:val="8"/>
+            <w:tcBorders>
+              <w:top w:val="single" w:sz="12" w:space="0" w:color="000000"/>
+              <w:left w:val="single" w:sz="8" w:space="0" w:color="000000"/>
+              <w:bottom w:val="single" w:sz="8" w:space="0" w:color="000000"/>
+              <w:right w:val="single" w:sz="8" w:space="0" w:color="000000"/>
+            </w:tcBorders>
+          </w:tcPr>
+          <w:p>
+            <w:pPr>
+              <w:pBdr>
+                <w:top w:val="nil"/>
+                <w:left w:val="nil"/>
+                <w:bottom w:val="nil"/>
+                <w:right w:val="nil"/>
+                <w:between w:val="nil"/>
+              </w:pBdr>
+              <w:spacing w:line="254" w:lineRule="auto"/>
+              <w:ind w:left="107"/>
+              <w:rPr>
+                <w:b/>
+                <w:color w:val="000000"/>
+                <w:sz w:val="24"/>
+                <w:szCs w:val="24"/>
+              </w:rPr>
+            </w:pPr>
+            <w:r>
+              <w:rPr>
+                <w:b/>
+                <w:color w:val="000000"/>
+                <w:sz w:val="24"/>
+                <w:szCs w:val="24"/>
+              </w:rPr>
+              <w:t>NAMA MAHASISWA/NIM/KELOMPOK: {group_info}</w:t>
+            </w:r>
+          </w:p>
+        </w:tc>
+      </w:tr>
+      <w:tr>
+        <w:trPr>
+          <w:trHeight w:val="278"/>
+        </w:trPr>
+        <w:tc>
+          <w:tcPr>
+            <w:tcW w:w="10365" w:type="dxa"/>
+            <w:gridSpan w:val="8"/>
+            <w:tcBorders>
+              <w:top w:val="single" w:sz="8" w:space="0" w:color="000000"/>
+              <w:left w:val="single" w:sz="8" w:space="0" w:color="000000"/>
+              <w:bottom w:val="single" w:sz="8" w:space="0" w:color="000000"/>
+              <w:right w:val="single" w:sz="8" w:space="0" w:color="000000"/>
+            </w:tcBorders>
+          </w:tcPr>
+          <w:p>
+            <w:pPr>
+              <w:pBdr>
+                <w:top w:val="nil"/>
+                <w:left w:val="nil"/>
+                <w:bottom w:val="nil"/>
+                <w:right w:val="nil"/>
+                <w:between w:val="nil"/>
+              </w:pBdr>
+              <w:spacing w:line="258" w:lineRule="auto"/>
+              <w:ind w:left="107"/>
+              <w:rPr>
+                <w:b/>
+                <w:color w:val="000000"/>
+                <w:sz w:val="24"/>
+                <w:szCs w:val="24"/>
+              </w:rPr>
+            </w:pPr>
+            <w:r>
+              <w:rPr>
+                <w:b/>
+                <w:color w:val="000000"/>
+                <w:sz w:val="24"/>
+                <w:szCs w:val="24"/>
+              </w:rPr>
+              <w:t>A. JADWAL:</w:t>
+            </w:r>
+          </w:p>
+        </w:tc>
+      </w:tr>
+      <w:tr>
+        <w:trPr>
+          <w:trHeight w:val="230"/>
+        </w:trPr>
+        <w:tc>
+          <w:tcPr>
+            <w:tcW w:w="635" w:type="dxa"/>
+            <w:tcBorders>
+              <w:top w:val="single" w:sz="8" w:space="0" w:color="000000"/>
+              <w:left w:val="single" w:sz="8" w:space="0" w:color="000000"/>
+              <w:bottom w:val="single" w:sz="8" w:space="0" w:color="000000"/>
+              <w:right w:val="single" w:sz="8" w:space="0" w:color="000000"/>
+            </w:tcBorders>
+          </w:tcPr>
+          <w:p>
+            <w:pPr>
+              <w:rPr>
+                <w:b/>
+                <w:bCs/>
+                <w:color w:val="000000"/>
+                <w:sz w:val="20"/>
+                <w:szCs w:val="20"/>
+              </w:rPr>
+            </w:pPr>
+            <w:r>
+              <w:rPr>
+                <w:b/>
+                <w:bCs/>
+                <w:sz w:val="20"/>
+                <w:szCs w:val="20"/>
+              </w:rPr>
+              <w:t>HARI</w:t>
+            </w:r>
+          </w:p>
+        </w:tc>
+        <w:tc>
+          <w:tcPr>
+            <w:tcW w:w="1465" w:type="dxa"/>
+            <w:tcBorders>
+              <w:top w:val="single" w:sz="8" w:space="0" w:color="000000"/>
+              <w:left w:val="single" w:sz="8" w:space="0" w:color="000000"/>
+              <w:bottom w:val="single" w:sz="8" w:space="0" w:color="000000"/>
+              <w:right w:val="single" w:sz="8" w:space="0" w:color="000000"/>
+            </w:tcBorders>
+          </w:tcPr>
+          <w:p>
+            <w:pPr>
+              <w:pBdr>
+                <w:top w:val="nil"/>
+                <w:left w:val="nil"/>
+                <w:bottom w:val="nil"/>
+                <w:right w:val="nil"/>
+                <w:between w:val="nil"/>
+              </w:pBdr>
+              <w:spacing w:line="210" w:lineRule="auto"/>
+              <w:ind w:left="106"/>
+              <w:rPr>
+                <w:b/>
+                <w:color w:val="000000"/>
+                <w:sz w:val="20"/>
+                <w:szCs w:val="20"/>
+              </w:rPr>
+            </w:pPr>
+            <w:r>
+              <w:rPr>
+                <w:b/>
+                <w:color w:val="000000"/>
+                <w:sz w:val="20"/>
+                <w:szCs w:val="20"/>
+              </w:rPr>
+              <w:t>TANGGAL</w:t>
+            </w:r>
+          </w:p>
+        </w:tc>
+        <w:tc>
+          <w:tcPr>
+            <w:tcW w:w="720" w:type="dxa"/>
+            <w:tcBorders>
+              <w:top w:val="single" w:sz="8" w:space="0" w:color="000000"/>
+              <w:left w:val="single" w:sz="8" w:space="0" w:color="000000"/>
+              <w:bottom w:val="single" w:sz="8" w:space="0" w:color="000000"/>
+              <w:right w:val="single" w:sz="8" w:space="0" w:color="000000"/>
+            </w:tcBorders>
+          </w:tcPr>
+          <w:p>
+            <w:pPr>
+              <w:pBdr>
+                <w:top w:val="nil"/>
+                <w:left w:val="nil"/>
+                <w:bottom w:val="nil"/>
+                <w:right w:val="nil"/>
+                <w:between w:val="nil"/>
+              </w:pBdr>
+              <w:spacing w:line="210" w:lineRule="auto"/>
+              <w:ind w:left="242"/>
+              <w:rPr>
+                <w:b/>
+                <w:color w:val="000000"/>
+                <w:sz w:val="20"/>
+                <w:szCs w:val="20"/>
+              </w:rPr>
+            </w:pPr>
+            <w:r>
+              <w:rPr>
+                <w:b/>
+                <w:color w:val="000000"/>
+                <w:sz w:val="20"/>
+                <w:szCs w:val="20"/>
+              </w:rPr>
+              <w:t>JAM</w:t>
+            </w:r>
+          </w:p>
+        </w:tc>
+        <w:tc>
+          <w:tcPr>
+            <w:tcW w:w="1642" w:type="dxa"/>
+            <w:gridSpan w:val="2"/>
+            <w:tcBorders>
+              <w:top w:val="single" w:sz="8" w:space="0" w:color="000000"/>
+              <w:left w:val="single" w:sz="8" w:space="0" w:color="000000"/>
+              <w:bottom w:val="single" w:sz="8" w:space="0" w:color="000000"/>
+              <w:right w:val="single" w:sz="8" w:space="0" w:color="000000"/>
+            </w:tcBorders>
+          </w:tcPr>
+          <w:p>
+            <w:pPr>
+              <w:pBdr>
+                <w:top w:val="nil"/>
+                <w:left w:val="nil"/>
+                <w:bottom w:val="nil"/>
+                <w:right w:val="nil"/>
+                <w:between w:val="nil"/>
+              </w:pBdr>
+              <w:spacing w:line="210" w:lineRule="auto"/>
+              <w:ind w:left="242"/>
+              <w:rPr>
+                <w:b/>
+                <w:color w:val="000000"/>
+                <w:sz w:val="20"/>
+                <w:szCs w:val="20"/>
+              </w:rPr>
+            </w:pPr>
+            <w:r>
+              <w:rPr>
+                <w:b/>
+                <w:sz w:val="20"/>
+                <w:szCs w:val="20"/>
+              </w:rPr>
+              <w:t>KEGIATAN</w:t>
+            </w:r>
+          </w:p>
+        </w:tc>
+        <w:tc>
+          <w:tcPr>
+            <w:tcW w:w="5903" w:type="dxa"/>
+            <w:gridSpan w:val="3"/>
+            <w:tcBorders>
+              <w:top w:val="single" w:sz="8" w:space="0" w:color="000000"/>
+              <w:left w:val="single" w:sz="8" w:space="0" w:color="000000"/>
+              <w:bottom w:val="single" w:sz="8" w:space="0" w:color="000000"/>
+              <w:right w:val="single" w:sz="8" w:space="0" w:color="000000"/>
+            </w:tcBorders>
+          </w:tcPr>
+          <w:p>
+            <w:pPr>
+              <w:pBdr>
+                <w:top w:val="nil"/>
+                <w:left w:val="nil"/>
+                <w:bottom w:val="nil"/>
+                <w:right w:val="nil"/>
+                <w:between w:val="nil"/>
+              </w:pBdr>
+              <w:spacing w:line="210" w:lineRule="auto"/>
+              <w:ind w:right="1"/>
+              <w:jc w:val="center"/>
+              <w:rPr>
+                <w:b/>
+                <w:color w:val="FF0000"/>
+                <w:sz w:val="20"/>
+                <w:szCs w:val="20"/>
+              </w:rPr>
+            </w:pPr>
+            <w:r>
+              <w:rPr>
+                <w:b/>
+                <w:color w:val="FF0000"/>
+                <w:sz w:val="20"/>
+                <w:szCs w:val="20"/>
+              </w:rPr>
+              <w:t>Dokumentasi</w:t>
+            </w:r>
+          </w:p>
+        </w:tc>
+      </w:tr>
+      <w:tr>
+        <w:trPr>
+          <w:trHeight w:val="230"/>
+        </w:trPr>
+        <w:tc>
+          <w:tcPr>
+            <w:tcW w:w="635" w:type="dxa"/>
+            <w:tcBorders>
+              <w:top w:val="single" w:sz="8" w:space="0" w:color="000000"/>
+              <w:left w:val="single" w:sz="8" w:space="0" w:color="000000"/>
+              <w:bottom w:val="single" w:sz="8" w:space="0" w:color="000000"/>
+              <w:right w:val="single" w:sz="8" w:space="0" w:color="000000"/>
+            </w:tcBorders>
+          </w:tcPr>
+          <w:p>
+            <w:pPr>
+              <w:pBdr>
+                <w:top w:val="nil"/>
+                <w:left w:val="nil"/>
+                <w:bottom w:val="nil"/>
+                <w:right w:val="nil"/>
+                <w:between w:val="nil"/>
+              </w:pBdr>
+              <w:rPr>
+                <w:color w:val="000000"/>
+                <w:sz w:val="16"/>
+                <w:szCs w:val="16"/>
+              </w:rPr>
+            </w:pPr>
+            <w:r>
+              <w:rPr>
+                <w:rFonts w:ascii="Times New Roman" w:hAnsi="Times New Roman"/>
+                <w:sz w:val="18"/>
+              </w:rPr>
+              <w:t>{#entries}{day_name}</w:t>
+            </w:r>
+          </w:p>
+        </w:tc>
+        <w:tc>
+          <w:tcPr>
+            <w:tcW w:w="1465" w:type="dxa"/>
+            <w:tcBorders>
+              <w:top w:val="single" w:sz="8" w:space="0" w:color="000000"/>
+              <w:left w:val="single" w:sz="8" w:space="0" w:color="000000"/>
+              <w:bottom w:val="single" w:sz="8" w:space="0" w:color="000000"/>
+              <w:right w:val="single" w:sz="8" w:space="0" w:color="000000"/>
+            </w:tcBorders>
+          </w:tcPr>
+          <w:p>
+            <w:pPr>
+              <w:pBdr>
+                <w:top w:val="nil"/>
+                <w:left w:val="nil"/>
+                <w:bottom w:val="nil"/>
+                <w:right w:val="nil"/>
+                <w:between w:val="nil"/>
+              </w:pBdr>
+              <w:rPr>
+                <w:color w:val="000000"/>
+                <w:sz w:val="16"/>
+                <w:szCs w:val="16"/>
+              </w:rPr>
+            </w:pPr>
+            <w:r>
+              <w:rPr>
+                <w:rFonts w:ascii="Times New Roman" w:hAnsi="Times New Roman"/>
+                <w:sz w:val="18"/>
+              </w:rPr>
+              <w:t>{entry_date}</w:t>
+            </w:r>
+          </w:p>
+        </w:tc>
+        <w:tc>
+          <w:tcPr>
+            <w:tcW w:w="720" w:type="dxa"/>
+            <w:tcBorders>
+              <w:top w:val="single" w:sz="8" w:space="0" w:color="000000"/>
+              <w:left w:val="single" w:sz="8" w:space="0" w:color="000000"/>
+              <w:bottom w:val="single" w:sz="8" w:space="0" w:color="000000"/>
+              <w:right w:val="single" w:sz="8" w:space="0" w:color="000000"/>
+            </w:tcBorders>
+          </w:tcPr>
+          <w:p>
+            <w:pPr>
+              <w:pBdr>
+                <w:top w:val="nil"/>
+                <w:left w:val="nil"/>
+                <w:bottom w:val="nil"/>
+                <w:right w:val="nil"/>
+                <w:between w:val="nil"/>
+              </w:pBdr>
+              <w:rPr>
+                <w:color w:val="000000"/>
+                <w:sz w:val="16"/>
+                <w:szCs w:val="16"/>
+              </w:rPr>
+            </w:pPr>
+            <w:r>
+              <w:rPr>
+                <w:rFonts w:ascii="Times New Roman" w:hAnsi="Times New Roman"/>
+                <w:sz w:val="18"/>
+              </w:rPr>
+              <w:t>{time_range}</w:t>
+            </w:r>
+          </w:p>
+        </w:tc>
+        <w:tc>
+          <w:tcPr>
+            <w:tcW w:w="1642" w:type="dxa"/>
+            <w:gridSpan w:val="2"/>
+            <w:tcBorders>
+              <w:top w:val="single" w:sz="8" w:space="0" w:color="000000"/>
+              <w:left w:val="single" w:sz="8" w:space="0" w:color="000000"/>
+              <w:bottom w:val="single" w:sz="8" w:space="0" w:color="000000"/>
+              <w:right w:val="single" w:sz="8" w:space="0" w:color="000000"/>
+            </w:tcBorders>
+          </w:tcPr>
+          <w:p>
+            <w:pPr>
+              <w:pBdr>
+                <w:top w:val="nil"/>
+                <w:left w:val="nil"/>
+                <w:bottom w:val="nil"/>
+                <w:right w:val="nil"/>
+                <w:between w:val="nil"/>
+              </w:pBdr>
+              <w:rPr>
+                <w:color w:val="000000"/>
+                <w:sz w:val="16"/>
+                <w:szCs w:val="16"/>
+              </w:rPr>
+            </w:pPr>
+            <w:r>
+              <w:rPr>
+                <w:rFonts w:ascii="Times New Roman" w:hAnsi="Times New Roman"/>
+                <w:sz w:val="18"/>
+              </w:rPr>
+              <w:t>{activity_description}</w:t>
+            </w:r>
+          </w:p>
+        </w:tc>
+        <w:tc>
+          <w:tcPr>
+            <w:tcW w:w="5903" w:type="dxa"/>
+            <w:gridSpan w:val="3"/>
+            <w:tcBorders>
+              <w:top w:val="single" w:sz="8" w:space="0" w:color="000000"/>
+              <w:left w:val="single" w:sz="8" w:space="0" w:color="000000"/>
+              <w:bottom w:val="single" w:sz="8" w:space="0" w:color="000000"/>
+              <w:right w:val="single" w:sz="8" w:space="0" w:color="000000"/>
+            </w:tcBorders>
+          </w:tcPr>
+          <w:p>
+            <w:pPr>
+              <w:pBdr>
+                <w:top w:val="nil"/>
+                <w:left w:val="nil"/>
+                <w:bottom w:val="nil"/>
+                <w:right w:val="nil"/>
+                <w:between w:val="nil"/>
+              </w:pBdr>
+              <w:rPr>
+                <w:color w:val="000000"/>
+                <w:sz w:val="16"/>
+                <w:szCs w:val="16"/>
+              </w:rPr>
+            </w:pPr>
+            <w:r>
+              <w:rPr>
+                <w:rFonts w:ascii="Times New Roman" w:hAnsi="Times New Roman"/>
+                <w:sz w:val="18"/>
+              </w:rPr>
+              <w:t>{documentation}{/entries}</w:t>
+            </w:r>
+          </w:p>
+        </w:tc>
+      </w:tr>
+      <w:tr>
+        <w:trPr>
+          <w:trHeight w:val="230"/>
+        </w:trPr>
+        <w:tc>
+          <w:tcPr>
+            <w:tcW w:w="10365" w:type="dxa"/>
+            <w:gridSpan w:val="8"/>
+            <w:tcBorders>
+              <w:top w:val="single" w:sz="8" w:space="0" w:color="000000"/>
+              <w:left w:val="single" w:sz="8" w:space="0" w:color="000000"/>
+              <w:bottom w:val="single" w:sz="8" w:space="0" w:color="000000"/>
+              <w:right w:val="single" w:sz="8" w:space="0" w:color="000000"/>
+            </w:tcBorders>
+          </w:tcPr>
+          <w:p>
+            <w:pPr>
+              <w:pBdr>
+                <w:top w:val="nil"/>
+                <w:left w:val="nil"/>
+                <w:bottom w:val="nil"/>
+                <w:right w:val="nil"/>
+                <w:between w:val="nil"/>
+              </w:pBdr>
+              <w:ind w:left="107"/>
+              <w:jc w:val="both"/>
+              <w:rPr>
+                <w:b/>
+                <w:color w:val="000000"/>
+                <w:sz w:val="24"/>
+                <w:szCs w:val="24"/>
+              </w:rPr>
+            </w:pPr>
+            <w:r>
+              <w:rPr>
+                <w:b/>
+                <w:color w:val="000000"/>
+                <w:sz w:val="24"/>
+                <w:szCs w:val="24"/>
+              </w:rPr>
+              <w:t>B. CATATAN PENTING HARIAN</w:t>
+            </w:r>
+          </w:p>
+        </w:tc>
+      </w:tr>
+      <w:tr>
+        <w:trPr>
+          <w:trHeight w:val="1838"/>
+        </w:trPr>
+        <w:tc>
+          <w:tcPr>
+            <w:tcW w:w="10365" w:type="dxa"/>
+            <w:gridSpan w:val="8"/>
+            <w:tcBorders>
+              <w:top w:val="single" w:sz="8" w:space="0" w:color="000000"/>
+              <w:left w:val="single" w:sz="8" w:space="0" w:color="000000"/>
+              <w:bottom w:val="single" w:sz="8" w:space="0" w:color="000000"/>
+              <w:right w:val="single" w:sz="8" w:space="0" w:color="000000"/>
+            </w:tcBorders>
+          </w:tcPr>
+          <w:p>
+            <w:pPr>
+              <w:spacing w:line="220" w:lineRule="auto"/>
+              <w:ind w:left="100"/>
+              <w:rPr>
+                <w:rFonts w:ascii="Times New Roman" w:hAnsi="Times New Roman"/>
+                <w:sz w:val="20"/>
+              </w:rPr>
+            </w:pPr>
+            <w:r>
+              <w:rPr>
+                <w:rFonts w:ascii="Times New Roman" w:hAnsi="Times New Roman"/>
+                <w:sz w:val="20"/>
+              </w:rPr>
+              <w:t>1. {note_1}</w:t>
+            </w:r>
+          </w:p>
+          <w:p>
+            <w:pPr>
+              <w:spacing w:line="220" w:lineRule="auto"/>
+              <w:ind w:left="100"/>
+              <w:rPr>
+                <w:rFonts w:ascii="Times New Roman" w:hAnsi="Times New Roman"/>
+                <w:sz w:val="20"/>
+              </w:rPr>
+            </w:pPr>
+            <w:r>
+              <w:rPr>
+                <w:rFonts w:ascii="Times New Roman" w:hAnsi="Times New Roman"/>
+                <w:sz w:val="20"/>
+              </w:rPr>
+              <w:t>2. {note_2}</w:t>
+            </w:r>
+          </w:p>
+          <w:p>
+            <w:pPr>
+              <w:spacing w:line="220" w:lineRule="auto"/>
+              <w:ind w:left="100"/>
+              <w:rPr>
+                <w:rFonts w:ascii="Times New Roman" w:hAnsi="Times New Roman"/>
+                <w:sz w:val="20"/>
+              </w:rPr>
+            </w:pPr>
+            <w:r>
+              <w:rPr>
+                <w:rFonts w:ascii="Times New Roman" w:hAnsi="Times New Roman"/>
+                <w:sz w:val="20"/>
+              </w:rPr>
+              <w:t>3. {note_3}</w:t>
+            </w:r>
+          </w:p>
+          <w:p>
+            <w:pPr>
+              <w:pBdr>
+                <w:top w:val="nil"/>
+                <w:left w:val="nil"/>
+                <w:bottom w:val="nil"/>
+                <w:right w:val="nil"/>
+                <w:between w:val="nil"/>
+              </w:pBdr>
+              <w:ind w:left="107"/>
+              <w:rPr>
+                <w:b/>
+                <w:color w:val="000000"/>
+                <w:sz w:val="20"/>
+                <w:szCs w:val="20"/>
+              </w:rPr>
+            </w:pPr>
+            <w:r>
+              <w:rPr>
+                <w:b/>
+                <w:color w:val="000000"/>
+                <w:sz w:val="20"/>
+                <w:szCs w:val="20"/>
+              </w:rPr>
+              <w:t>2.</w:t>
+            </w:r>
+          </w:p>
+          <w:p>
+            <w:pPr>
+              <w:pBdr>
+                <w:top w:val="nil"/>
+                <w:left w:val="nil"/>
+                <w:bottom w:val="nil"/>
+                <w:right w:val="nil"/>
+                <w:between w:val="nil"/>
+              </w:pBdr>
+              <w:spacing w:before="228"/>
+              <w:rPr>
+                <w:color w:val="000000"/>
+                <w:sz w:val="20"/>
+                <w:szCs w:val="20"/>
+              </w:rPr>
+            </w:pPr>
+          </w:p>
+          <w:p>
+            <w:pPr>
+              <w:pBdr>
+                <w:top w:val="nil"/>
+                <w:left w:val="nil"/>
+                <w:bottom w:val="nil"/>
+                <w:right w:val="nil"/>
+                <w:between w:val="nil"/>
+              </w:pBdr>
+              <w:ind w:left="107"/>
+              <w:rPr>
+                <w:b/>
+                <w:color w:val="000000"/>
+                <w:sz w:val="20"/>
+                <w:szCs w:val="20"/>
+              </w:rPr>
+            </w:pPr>
+            <w:r>
+              <w:rPr>
+                <w:b/>
+                <w:color w:val="000000"/>
+                <w:sz w:val="20"/>
+                <w:szCs w:val="20"/>
+              </w:rPr>
+              <w:t>3.</w:t>
+            </w:r>
+          </w:p>
+        </w:tc>
+      </w:tr>
+      <w:tr>
+        <w:trPr>
+          <w:trHeight w:val="1579"/>
+        </w:trPr>
+        <w:tc>
+          <w:tcPr>
+            <w:tcW w:w="10365" w:type="dxa"/>
+            <w:gridSpan w:val="8"/>
+            <w:vMerge w:val="restart"/>
+            <w:tcBorders>
+              <w:top w:val="single" w:sz="8" w:space="0" w:color="000000"/>
+              <w:left w:val="single" w:sz="8" w:space="0" w:color="000000"/>
+              <w:bottom w:val="single" w:sz="8" w:space="0" w:color="000000"/>
+              <w:right w:val="single" w:sz="8" w:space="0" w:color="000000"/>
+            </w:tcBorders>
+          </w:tcPr>
+          <w:p>
+            <w:pPr>
+              <w:spacing w:line="275" w:lineRule="auto"/>
+              <w:ind w:left="107"/>
+              <w:rPr>
+                <w:b/>
+                <w:sz w:val="24"/>
+                <w:szCs w:val="24"/>
+              </w:rPr>
+            </w:pPr>
+            <w:r>
+              <w:rPr>
+                <w:b/>
+                <w:sz w:val="24"/>
+                <w:szCs w:val="24"/>
+              </w:rPr>
+              <w:t>D. PENGESAHAN</w:t>
+            </w:r>
+          </w:p>
+        </w:tc>
+      </w:tr>
+      <w:tr>
+        <w:trPr>
+          <w:trHeight w:val="276"/>
+        </w:trPr>
+        <w:tc>
+          <w:tcPr>
+            <w:tcW w:w="10365" w:type="dxa"/>
+            <w:gridSpan w:val="8"/>
+            <w:vMerge/>
+            <w:tcBorders>
+              <w:top w:val="single" w:sz="8" w:space="0" w:color="000000"/>
+              <w:left w:val="single" w:sz="8" w:space="0" w:color="000000"/>
+              <w:bottom w:val="single" w:sz="8" w:space="0" w:color="000000"/>
+              <w:right w:val="single" w:sz="8" w:space="0" w:color="000000"/>
+            </w:tcBorders>
+          </w:tcPr>
+          <w:p>
+            <w:pPr>
+              <w:pBdr>
+                <w:top w:val="nil"/>
+                <w:left w:val="nil"/>
+                <w:bottom w:val="nil"/>
+                <w:right w:val="nil"/>
+                <w:between w:val="nil"/>
+              </w:pBdr>
+              <w:rPr>
+                <w:b/>
+                <w:color w:val="000000"/>
+                <w:sz w:val="24"/>
+                <w:szCs w:val="24"/>
+              </w:rPr>
+            </w:pPr>
+          </w:p>
+        </w:tc>
+      </w:tr>
+      <w:tr>
+        <w:trPr>
+          <w:trHeight w:val="1634"/>
+        </w:trPr>
+        <w:tc>
+          <w:tcPr>
+            <w:tcW w:w="5250" w:type="dxa"/>
+            <w:gridSpan w:val="6"/>
+            <w:tcBorders>
+              <w:top w:val="single" w:sz="8" w:space="0" w:color="000000"/>
+              <w:left w:val="single" w:sz="8" w:space="0" w:color="000000"/>
+              <w:bottom w:val="single" w:sz="8" w:space="0" w:color="000000"/>
+              <w:right w:val="single" w:sz="8" w:space="0" w:color="000000"/>
+            </w:tcBorders>
+          </w:tcPr>
+          <w:p>
+            <w:pPr>
+              <w:pBdr>
+                <w:top w:val="nil"/>
+                <w:left w:val="nil"/>
+                <w:bottom w:val="nil"/>
+                <w:right w:val="nil"/>
+                <w:between w:val="nil"/>
+              </w:pBdr>
+              <w:spacing w:line="251" w:lineRule="auto"/>
+              <w:ind w:left="263"/>
+              <w:rPr>
+                <w:b/>
+                <w:color w:val="000000"/>
+              </w:rPr>
+            </w:pPr>
+            <w:r>
+              <w:rPr>
+                <w:b/>
+                <w:color w:val="000000"/>
+              </w:rPr>
+              <w:t>TANDA TANGAN LURAH/KEPALA DESA</w:t>
+            </w:r>
+          </w:p>
+        </w:tc>
+        <w:tc>
+          <w:tcPr>
+            <w:tcW w:w="5115" w:type="dxa"/>
+            <w:gridSpan w:val="2"/>
+            <w:tcBorders>
+              <w:top w:val="single" w:sz="8" w:space="0" w:color="000000"/>
+              <w:left w:val="single" w:sz="8" w:space="0" w:color="000000"/>
+              <w:bottom w:val="single" w:sz="8" w:space="0" w:color="000000"/>
+              <w:right w:val="single" w:sz="8" w:space="0" w:color="000000"/>
+            </w:tcBorders>
+          </w:tcPr>
+          <w:p>
+            <w:pPr>
+              <w:pBdr>
+                <w:top w:val="nil"/>
+                <w:left w:val="nil"/>
+                <w:bottom w:val="nil"/>
+                <w:right w:val="nil"/>
+                <w:between w:val="nil"/>
+              </w:pBdr>
+              <w:spacing w:line="275" w:lineRule="auto"/>
+              <w:ind w:left="1001"/>
+              <w:rPr>
+                <w:b/>
+                <w:color w:val="000000"/>
+                <w:sz w:val="24"/>
+                <w:szCs w:val="24"/>
+              </w:rPr>
+            </w:pPr>
+            <w:r>
+              <w:rPr>
+                <w:b/>
+                <w:color w:val="000000"/>
+                <w:sz w:val="24"/>
+                <w:szCs w:val="24"/>
+              </w:rPr>
+              <w:t>TANDA TANGAN MAHASISWA</w:t>
+            </w:r>
+          </w:p>
+        </w:tc>
+      </w:tr>
+    </w:tbl>
+    <w:p>
+      <w:pPr>
+        <w:spacing w:before="240" w:after="240"/>
+        <w:jc w:val="both"/>
+        <w:rPr>
+          <w:b/>
+          <w:sz w:val="24"/>
+          <w:szCs w:val="24"/>
+        </w:rPr>
+      </w:pPr>
+      <w:r>
+        <w:rPr>
+          <w:b/>
+          <w:sz w:val="24"/>
+          <w:szCs w:val="24"/>
+        </w:rPr>
+        <w:t>Petunjuk Pengisian:</w:t>
+      </w:r>
+    </w:p>
+    <w:p>
+      <w:pPr>
+        <w:numPr>
+          <w:ilvl w:val="0"/>
+          <w:numId w:val="1"/>
+        </w:numPr>
+        <w:pBdr>
+          <w:top w:val="nil"/>
+          <w:left w:val="nil"/>
+          <w:bottom w:val="nil"/>
+          <w:right w:val="nil"/>
+          <w:between w:val="nil"/>
+        </w:pBdr>
+        <w:jc w:val="both"/>
+        <w:rPr>
+          <w:sz w:val="24"/>
+          <w:szCs w:val="24"/>
+        </w:rPr>
+      </w:pPr>
+      <w:r>
+        <w:rPr>
+          <w:sz w:val="24"/>
+          <w:szCs w:val="24"/>
+        </w:rPr>
+        <w:t xml:space="preserve">Logbook adalah buku catatan harian bagi peserta KKN yang wajib diisi setiap hari dan dilaporkan kepada Dosen Pembimbing Lapangan (DPL) setiap minggu Ling google form. </w:t>
+      </w:r>
+    </w:p>
+    <w:p>
+      <w:pPr>
+        <w:numPr>
+          <w:ilvl w:val="0"/>
+          <w:numId w:val="1"/>
+        </w:numPr>
+        <w:pBdr>
+          <w:top w:val="nil"/>
+          <w:left w:val="nil"/>
+          <w:bottom w:val="nil"/>
+          <w:right w:val="nil"/>
+          <w:between w:val="nil"/>
+        </w:pBdr>
+        <w:jc w:val="both"/>
+        <w:rPr>
+          <w:sz w:val="24"/>
+          <w:szCs w:val="24"/>
+        </w:rPr>
+      </w:pPr>
+      <w:r>
+        <w:rPr>
+          <w:sz w:val="24"/>
+          <w:szCs w:val="24"/>
+        </w:rPr>
+        <w:t>Logbook hanya boleh diisi dengan aktivitas yang berkaitan dengan program KKN.</w:t>
+      </w:r>
+    </w:p>
+    <w:p>
+      <w:pPr>
+        <w:numPr>
+          <w:ilvl w:val="0"/>
+          <w:numId w:val="1"/>
+        </w:numPr>
+        <w:pBdr>
+          <w:top w:val="nil"/>
+          <w:left w:val="nil"/>
+          <w:bottom w:val="nil"/>
+          <w:right w:val="nil"/>
+          <w:between w:val="nil"/>
+        </w:pBdr>
+        <w:jc w:val="both"/>
+        <w:rPr>
+          <w:sz w:val="24"/>
+          <w:szCs w:val="24"/>
+        </w:rPr>
+      </w:pPr>
+      <w:r>
+        <w:rPr>
+          <w:sz w:val="24"/>
+          <w:szCs w:val="24"/>
+        </w:rPr>
+        <w:t>Setiap logbook harus ditempelkan pas foto berwarna terbaru dengan ukuran 4x6 cm.</w:t>
+      </w:r>
+    </w:p>
+    <w:p>
+      <w:pPr>
+        <w:numPr>
+          <w:ilvl w:val="0"/>
+          <w:numId w:val="1"/>
+        </w:numPr>
+        <w:pBdr>
+          <w:top w:val="nil"/>
+          <w:left w:val="nil"/>
+          <w:bottom w:val="nil"/>
+          <w:right w:val="nil"/>
+          <w:between w:val="nil"/>
+        </w:pBdr>
+        <w:jc w:val="both"/>
+        <w:rPr>
+          <w:sz w:val="24"/>
+          <w:szCs w:val="24"/>
+        </w:rPr>
+      </w:pPr>
+      <w:r>
+        <w:rPr>
+          <w:sz w:val="24"/>
+          <w:szCs w:val="24"/>
+        </w:rPr>
+        <w:t>Isi logbook mencakup kegiatan harian, catatan penting, serta dokumentasi seperti foto, tautan video, dan lain-lain.</w:t>
+      </w:r>
+    </w:p>
+    <w:p>
+      <w:pPr>
+        <w:numPr>
+          <w:ilvl w:val="0"/>
+          <w:numId w:val="1"/>
+        </w:numPr>
+        <w:pBdr>
+          <w:top w:val="nil"/>
+          <w:left w:val="nil"/>
+          <w:bottom w:val="nil"/>
+          <w:right w:val="nil"/>
+          <w:between w:val="nil"/>
+        </w:pBdr>
+        <w:jc w:val="both"/>
+        <w:rPr>
+          <w:sz w:val="24"/>
+          <w:szCs w:val="24"/>
+        </w:rPr>
+      </w:pPr>
+      <w:r>
+        <w:rPr>
+          <w:sz w:val="24"/>
+          <w:szCs w:val="24"/>
+        </w:rPr>
+        <w:t>Penulisan logbook harus menggunakan bahasa Indonesia yang baik dan benar sesuai kaidah baku.</w:t>
+      </w:r>
+    </w:p>
+    <w:p>
+      <w:pPr>
+        <w:numPr>
+          <w:ilvl w:val="0"/>
+          <w:numId w:val="1"/>
+        </w:numPr>
+        <w:pBdr>
+          <w:top w:val="nil"/>
+          <w:left w:val="nil"/>
+          <w:bottom w:val="nil"/>
+          <w:right w:val="nil"/>
+          <w:between w:val="nil"/>
+        </w:pBdr>
+        <w:jc w:val="both"/>
+        <w:rPr>
+          <w:sz w:val="24"/>
+          <w:szCs w:val="24"/>
+        </w:rPr>
+      </w:pPr>
+      <w:r>
+        <w:rPr>
+          <w:sz w:val="24"/>
+          <w:szCs w:val="24"/>
+        </w:rPr>
+        <w:t>Pada bagian kolom pengesahan, mahasiswa wajib menandatangani serta menuliskan nama lengkapnya, kemudian nama lurah, kepala desa, atau pihak berwenang lainnya.</w:t>
+      </w:r>
+    </w:p>
+    <w:p>
+      <w:pPr>
+        <w:numPr>
+          <w:ilvl w:val="0"/>
+          <w:numId w:val="1"/>
+        </w:numPr>
+        <w:pBdr>
+          <w:top w:val="nil"/>
+          <w:left w:val="nil"/>
+          <w:bottom w:val="nil"/>
+          <w:right w:val="nil"/>
+          <w:between w:val="nil"/>
+        </w:pBdr>
+        <w:jc w:val="both"/>
+        <w:rPr>
+          <w:sz w:val="24"/>
+          <w:szCs w:val="24"/>
+        </w:rPr>
+      </w:pPr>
+      <w:r>
+        <w:rPr>
+          <w:sz w:val="24"/>
+          <w:szCs w:val="24"/>
+        </w:rPr>
+        <w:t>Selanjutnya, lurah, kepala desa, atau pihak berwenang terkait diminta untuk memberikan tanda tangan pada logbook mingguan tersebut.</w:t>
+      </w:r>
+    </w:p>
+    <w:p>
+      <w:pPr>
+        <w:numPr>
+          <w:ilvl w:val="0"/>
+          <w:numId w:val="1"/>
+        </w:numPr>
+        <w:pBdr>
+          <w:top w:val="nil"/>
+          <w:left w:val="nil"/>
+          <w:bottom w:val="nil"/>
+          <w:right w:val="nil"/>
+          <w:between w:val="nil"/>
+        </w:pBdr>
+        <w:jc w:val="both"/>
+        <w:rPr>
+          <w:sz w:val="24"/>
+          <w:szCs w:val="24"/>
+        </w:rPr>
+      </w:pPr>
+      <w:r>
+        <w:rPr>
+          <w:sz w:val="24"/>
+          <w:szCs w:val="24"/>
+        </w:rPr>
+        <w:t>Mahasiswa kemudian mengirimkan logbook mingguan secara daring kepada DPL masing-masing.</w:t>
+      </w:r>
+    </w:p>
+    <w:p>
+      <w:pPr>
+        <w:numPr>
+          <w:ilvl w:val="0"/>
+          <w:numId w:val="1"/>
+        </w:numPr>
+        <w:pBdr>
+          <w:top w:val="nil"/>
+          <w:left w:val="nil"/>
+          <w:bottom w:val="nil"/>
+          <w:right w:val="nil"/>
+          <w:between w:val="nil"/>
+        </w:pBdr>
+        <w:jc w:val="both"/>
+        <w:rPr>
+          <w:sz w:val="24"/>
+          <w:szCs w:val="24"/>
+        </w:rPr>
+      </w:pPr>
+      <w:r>
+        <w:rPr>
+          <w:sz w:val="24"/>
+          <w:szCs w:val="24"/>
+        </w:rPr>
+        <w:t>DPL akan memeriksa dan memberikan tanggapan terhadap logbook setiap minggu.</w:t>
+      </w:r>
+      <w:r>
+        <w:rPr>
+          <w:sz w:val="24"/>
+          <w:szCs w:val="24"/>
+        </w:rPr>
+        <w:br/>
+      </w:r>
+    </w:p>
+    <w:p>
+      <w:pPr>
+        <w:pBdr>
+          <w:top w:val="nil"/>
+          <w:left w:val="nil"/>
+          <w:bottom w:val="nil"/>
+          <w:right w:val="nil"/>
+          <w:between w:val="nil"/>
+        </w:pBdr>
+        <w:ind w:left="1080"/>
+        <w:jc w:val="both"/>
+        <w:rPr>
+          <w:sz w:val="24"/>
+          <w:szCs w:val="24"/>
+        </w:rPr>
+      </w:pPr>
+    </w:p>
+    <w:sectPr>
+      <w:pgSz w:w="12240" w:h="15840"/>
+      <w:pgMar w:top="1440" w:right="1440" w:bottom="1440" w:left="1440" w:header="708" w:footer="708" w:gutter="0"/>
+      <w:pgNumType w:start="1"/>
+      <w:cols w:space="720"/>
+    </w:sectPr>
+  </w:body>
+</w:document>
 </file>
 
 <file path=word/numbering.xml><?xml version="1.0" encoding="utf-8"?>

</xml_diff>

<commit_message>
feat(logbook): lengkapi kolom pengesahan tanda tangan (Nama Mahasiswa & Nama Lurah/Kepala Desa/Pihak Berwenang)
</commit_message>
<xml_diff>
--- a/public/templates/template_logbook_kkn_prepared.docx
+++ b/public/templates/template_logbook_kkn_prepared.docx
@@ -1586,6 +1586,15 @@
               <w:t>TANDA TANGAN LURAH/KEPALA DESA</w:t>
             </w:r>
           </w:p>
+          <w:p>
+            <w:pPr>
+              <w:jc w:val="center"/>
+            </w:pPr>
+            <w:r>
+              <w:t xml:space="preserve">
+( {lurah_head_name} )</w:t>
+            </w:r>
+          </w:p>
         </w:tc>
         <w:tc>
           <w:tcPr>
@@ -1624,6 +1633,15 @@
                 <w:szCs w:val="24"/>
               </w:rPr>
               <w:t>TANDA TANGAN MAHASISWA</w:t>
+            </w:r>
+          </w:p>
+          <w:p>
+            <w:pPr>
+              <w:jc w:val="center"/>
+            </w:pPr>
+            <w:r>
+              <w:t xml:space="preserve">
+( {full_name} )</w:t>
             </w:r>
           </w:p>
         </w:tc>

</xml_diff>

<commit_message>
fix(word-export): perlebar kolom KEGIATAN menjadi 3x lipat agar teks deskripsi tidak terpotong sempit
</commit_message>
<xml_diff>
--- a/public/templates/template_logbook_kkn_prepared.docx
+++ b/public/templates/template_logbook_kkn_prepared.docx
@@ -597,13 +597,13 @@
       </w:tblPr>
       <w:tblGrid>
         <w:gridCol w:w="635"/>
-        <w:gridCol w:w="1465"/>
-        <w:gridCol w:w="720"/>
-        <w:gridCol w:w="1110"/>
-        <w:gridCol w:w="532"/>
-        <w:gridCol w:w="788"/>
-        <w:gridCol w:w="2565"/>
-        <w:gridCol w:w="2550"/>
+        <w:gridCol w:w="1250"/>
+        <w:gridCol w:w="950"/>
+        <w:gridCol w:w="2415"/>
+        <w:gridCol w:w="2415"/>
+        <w:gridCol w:w="900"/>
+        <w:gridCol w:w="900"/>
+        <w:gridCol w:w="900"/>
       </w:tblGrid>
       <w:tr>
         <w:trPr>
@@ -957,7 +957,7 @@
         </w:tc>
         <w:tc>
           <w:tcPr>
-            <w:tcW w:w="1465" w:type="dxa"/>
+            <w:tcW w:w="1250" w:type="dxa"/>
             <w:tcBorders>
               <w:top w:val="single" w:sz="8" w:space="0" w:color="000000"/>
               <w:left w:val="single" w:sz="8" w:space="0" w:color="000000"/>
@@ -996,7 +996,7 @@
         </w:tc>
         <w:tc>
           <w:tcPr>
-            <w:tcW w:w="720" w:type="dxa"/>
+            <w:tcW w:w="950" w:type="dxa"/>
             <w:tcBorders>
               <w:top w:val="single" w:sz="8" w:space="0" w:color="000000"/>
               <w:left w:val="single" w:sz="8" w:space="0" w:color="000000"/>
@@ -1035,7 +1035,7 @@
         </w:tc>
         <w:tc>
           <w:tcPr>
-            <w:tcW w:w="1642" w:type="dxa"/>
+            <w:tcW w:w="4830" w:type="dxa"/>
             <w:gridSpan w:val="2"/>
             <w:tcBorders>
               <w:top w:val="single" w:sz="8" w:space="0" w:color="000000"/>
@@ -1074,7 +1074,7 @@
         </w:tc>
         <w:tc>
           <w:tcPr>
-            <w:tcW w:w="5903" w:type="dxa"/>
+            <w:tcW w:w="2700" w:type="dxa"/>
             <w:gridSpan w:val="3"/>
             <w:tcBorders>
               <w:top w:val="single" w:sz="8" w:space="0" w:color="000000"/>
@@ -1154,7 +1154,7 @@
         </w:tc>
         <w:tc>
           <w:tcPr>
-            <w:tcW w:w="1465" w:type="dxa"/>
+            <w:tcW w:w="1250" w:type="dxa"/>
             <w:tcBorders>
               <w:top w:val="single" w:sz="8" w:space="0" w:color="000000"/>
               <w:left w:val="single" w:sz="8" w:space="0" w:color="000000"/>
@@ -1188,7 +1188,7 @@
         </w:tc>
         <w:tc>
           <w:tcPr>
-            <w:tcW w:w="720" w:type="dxa"/>
+            <w:tcW w:w="950" w:type="dxa"/>
             <w:tcBorders>
               <w:top w:val="single" w:sz="8" w:space="0" w:color="000000"/>
               <w:left w:val="single" w:sz="8" w:space="0" w:color="000000"/>
@@ -1222,7 +1222,7 @@
         </w:tc>
         <w:tc>
           <w:tcPr>
-            <w:tcW w:w="1642" w:type="dxa"/>
+            <w:tcW w:w="4830" w:type="dxa"/>
             <w:gridSpan w:val="2"/>
             <w:tcBorders>
               <w:top w:val="single" w:sz="8" w:space="0" w:color="000000"/>
@@ -1257,7 +1257,7 @@
         </w:tc>
         <w:tc>
           <w:tcPr>
-            <w:tcW w:w="5903" w:type="dxa"/>
+            <w:tcW w:w="2700" w:type="dxa"/>
             <w:gridSpan w:val="3"/>
             <w:tcBorders>
               <w:top w:val="single" w:sz="8" w:space="0" w:color="000000"/>

</xml_diff>

<commit_message>
fix(word-export): buat judul kolom pengesahan dinamis sesuai input user (Kepala Desa, Lurah, RT/RW, dll.)
</commit_message>
<xml_diff>
--- a/public/templates/template_logbook_kkn_prepared.docx
+++ b/public/templates/template_logbook_kkn_prepared.docx
@@ -1583,7 +1583,7 @@
                 <w:b/>
                 <w:color w:val="000000"/>
               </w:rPr>
-              <w:t>TANDA TANGAN LURAH/KEPALA DESA</w:t>
+              <w:t>{lurah_head_title}</w:t>
             </w:r>
           </w:p>
           <w:p>
@@ -1592,7 +1592,7 @@
             </w:pPr>
             <w:r>
               <w:t xml:space="preserve">
-( {lurah_head_name} )</w:t>
+{lurah_head_name}</w:t>
             </w:r>
           </w:p>
         </w:tc>

</xml_diff>

<commit_message>
fix(word-export): pulihkan dan bersihkan template XML pengesahan agar 100% valid tanpa kerusakkan struktur Word
</commit_message>
<xml_diff>
--- a/public/templates/template_logbook_kkn_prepared.docx
+++ b/public/templates/template_logbook_kkn_prepared.docx
@@ -1,6 +1,1946 @@
 
-<file path=word/document.xml><?xml version="1.0" encoding="UTF-8" standalone="yes"?>
-<w:document xmlns:wpc="http://schemas.microsoft.com/office/word/2010/wordprocessingCanvas" xmlns:cx="http://schemas.microsoft.com/office/drawing/2014/chartex" xmlns:cx1="http://schemas.microsoft.com/office/drawing/2015/9/8/chartex" xmlns:cx2="http://schemas.microsoft.com/office/drawing/2015/10/21/chartex" xmlns:cx3="http://schemas.microsoft.com/office/drawing/2016/5/9/chartex" xmlns:cx4="http://schemas.microsoft.com/office/drawing/2016/5/10/chartex" xmlns:cx5="http://schemas.microsoft.com/office/drawing/2016/5/11/chartex" xmlns:cx6="http://schemas.microsoft.com/office/drawing/2016/5/12/chartex" xmlns:cx7="http://schemas.microsoft.com/office/drawing/2016/5/13/chartex" xmlns:cx8="http://schemas.microsoft.com/office/drawing/2016/5/14/chartex" xmlns:mc="http://schemas.openxmlformats.org/markup-compatibility/2006" xmlns:aink="http://schemas.microsoft.com/office/drawing/2016/ink" xmlns:am3d="http://schemas.microsoft.com/office/drawing/2017/model3d" xmlns:o="urn:schemas-microsoft-com:office:office" xmlns:oel="http://schemas.microsoft.com/office/2019/extlst" xmlns:r="http://schemas.openxmlformats.org/officeDocument/2006/relationships" xmlns:m="http://schemas.openxmlformats.org/officeDocument/2006/math" xmlns:v="urn:schemas-microsoft-com:vml" xmlns:wp14="http://schemas.microsoft.com/office/word/2010/wordprocessingDrawing" xmlns:wp="http://schemas.openxmlformats.org/drawingml/2006/wordprocessingDrawing" xmlns:w10="urn:schemas-microsoft-com:office:word" xmlns:w="http://schemas.openxmlformats.org/wordprocessingml/2006/main" xmlns:w14="http://schemas.microsoft.com/office/word/2010/wordml" xmlns:w15="http://schemas.microsoft.com/office/word/2012/wordml" xmlns:w16cex="http://schemas.microsoft.com/office/word/2018/wordml/cex" xmlns:w16cid="http://schemas.microsoft.com/office/word/2016/wordml/cid" xmlns:w16="http://schemas.microsoft.com/office/word/2018/wordml" xmlns:w16du="http://schemas.microsoft.com/office/word/2023/wordml/word16du" xmlns:w16sdtdh="http://schemas.microsoft.com/office/word/2020/wordml/sdtdatahash" xmlns:w16sdtfl="http://schemas.microsoft.com/office/word/2024/wordml/sdtformatlock" xmlns:w16se="http://schemas.microsoft.com/office/word/2015/wordml/symex" xmlns:wpg="http://schemas.microsoft.com/office/word/2010/wordprocessingGroup" xmlns:wpi="http://schemas.microsoft.com/office/word/2010/wordprocessingInk" xmlns:wne="http://schemas.microsoft.com/office/word/2006/wordml" xmlns:wps="http://schemas.microsoft.com/office/word/2010/wordprocessingShape" mc:Ignorable="w14 w15 w16se w16cid w16 w16cex w16sdtdh w16sdtfl w16du wp14"><w:body><!--AUTHORITY_CELL_START--><w:p><w:pPr><w:jc w:val="center"/><w:rPr><w:b/><w:color w:val="000000"/></w:rPr></w:pPr><w:r><w:rPr><w:b/><w:color w:val="000000"/></w:rPr><w:t>{lurah_head_title}</w:t></w:r></w:p><w:p><w:pPr><w:jc w:val="center"/></w:pPr><w:r><w:t xml:space="preserve">&#10;&#10;&#10;( {lurah_head_name} )</w:t></w:r></w:p><!--AUTHORITY_CELL_END--></w:tc><w:tc><w:tcPr><w:tcW w:w="5115" w:type="dxa"/><w:gridSpan w:val="2"/><w:tcBorders><w:top w:val="single" w:sz="8" w:space="0" w:color="000000"/><w:left w:val="single" w:sz="8" w:space="0" w:color="000000"/><w:bottom w:val="single" w:sz="8" w:space="0" w:color="000000"/><w:right w:val="single" w:sz="8" w:space="0" w:color="000000"/></w:tcBorders></w:tcPr><w:p><w:pPr><w:pBdr><w:top w:val="nil"/><w:left w:val="nil"/><w:bottom w:val="nil"/><w:right w:val="nil"/><w:between w:val="nil"/></w:pBdr><w:spacing w:line="275" w:lineRule="auto"/><w:ind w:left="1001"/><w:rPr><w:b/><w:color w:val="000000"/><w:sz w:val="24"/><w:szCs w:val="24"/></w:rPr></w:pPr><w:r><w:rPr><w:b/><w:color w:val="000000"/><w:sz w:val="24"/><w:szCs w:val="24"/></w:rPr><w:t>TANDA TANGAN MAHASISWA</w:t></w:r></w:p><w:p><w:pPr><w:jc w:val="center"/></w:pPr><w:r><w:t xml:space="preserve">&#10;&#10;&#10;( {full_name} )</w:t></w:r></w:p></w:tc></w:tr></w:tbl><w:p><w:pPr><w:spacing w:before="240" w:after="240"/><w:jc w:val="both"/><w:rPr><w:b/><w:sz w:val="24"/><w:szCs w:val="24"/></w:rPr></w:pPr><w:r><w:rPr><w:b/><w:sz w:val="24"/><w:szCs w:val="24"/></w:rPr><w:t>Petunjuk Pengisian:</w:t></w:r></w:p><w:p><w:pPr><w:numPr><w:ilvl w:val="0"/><w:numId w:val="1"/></w:numPr><w:pBdr><w:top w:val="nil"/><w:left w:val="nil"/><w:bottom w:val="nil"/><w:right w:val="nil"/><w:between w:val="nil"/></w:pBdr><w:jc w:val="both"/><w:rPr><w:sz w:val="24"/><w:szCs w:val="24"/></w:rPr></w:pPr><w:r><w:rPr><w:sz w:val="24"/><w:szCs w:val="24"/></w:rPr><w:t xml:space="preserve">Logbook adalah buku catatan harian bagi peserta KKN yang wajib diisi setiap hari dan dilaporkan kepada Dosen Pembimbing Lapangan (DPL) setiap minggu Ling google form. </w:t></w:r></w:p><w:p><w:pPr><w:numPr><w:ilvl w:val="0"/><w:numId w:val="1"/></w:numPr><w:pBdr><w:top w:val="nil"/><w:left w:val="nil"/><w:bottom w:val="nil"/><w:right w:val="nil"/><w:between w:val="nil"/></w:pBdr><w:jc w:val="both"/><w:rPr><w:sz w:val="24"/><w:szCs w:val="24"/></w:rPr></w:pPr><w:r><w:rPr><w:sz w:val="24"/><w:szCs w:val="24"/></w:rPr><w:t>Logbook hanya boleh diisi dengan aktivitas yang berkaitan dengan program KKN.</w:t></w:r></w:p><w:p><w:pPr><w:numPr><w:ilvl w:val="0"/><w:numId w:val="1"/></w:numPr><w:pBdr><w:top w:val="nil"/><w:left w:val="nil"/><w:bottom w:val="nil"/><w:right w:val="nil"/><w:between w:val="nil"/></w:pBdr><w:jc w:val="both"/><w:rPr><w:sz w:val="24"/><w:szCs w:val="24"/></w:rPr></w:pPr><w:r><w:rPr><w:sz w:val="24"/><w:szCs w:val="24"/></w:rPr><w:t>Setiap logbook harus ditempelkan pas foto berwarna terbaru dengan ukuran 4x6 cm.</w:t></w:r></w:p><w:p><w:pPr><w:numPr><w:ilvl w:val="0"/><w:numId w:val="1"/></w:numPr><w:pBdr><w:top w:val="nil"/><w:left w:val="nil"/><w:bottom w:val="nil"/><w:right w:val="nil"/><w:between w:val="nil"/></w:pBdr><w:jc w:val="both"/><w:rPr><w:sz w:val="24"/><w:szCs w:val="24"/></w:rPr></w:pPr><w:r><w:rPr><w:sz w:val="24"/><w:szCs w:val="24"/></w:rPr><w:t>Isi logbook mencakup kegiatan harian, catatan penting, serta dokumentasi seperti foto, tautan video, dan lain-lain.</w:t></w:r></w:p><w:p><w:pPr><w:numPr><w:ilvl w:val="0"/><w:numId w:val="1"/></w:numPr><w:pBdr><w:top w:val="nil"/><w:left w:val="nil"/><w:bottom w:val="nil"/><w:right w:val="nil"/><w:between w:val="nil"/></w:pBdr><w:jc w:val="both"/><w:rPr><w:sz w:val="24"/><w:szCs w:val="24"/></w:rPr></w:pPr><w:r><w:rPr><w:sz w:val="24"/><w:szCs w:val="24"/></w:rPr><w:t>Penulisan logbook harus menggunakan bahasa Indonesia yang baik dan benar sesuai kaidah baku.</w:t></w:r></w:p><w:p><w:pPr><w:numPr><w:ilvl w:val="0"/><w:numId w:val="1"/></w:numPr><w:pBdr><w:top w:val="nil"/><w:left w:val="nil"/><w:bottom w:val="nil"/><w:right w:val="nil"/><w:between w:val="nil"/></w:pBdr><w:jc w:val="both"/><w:rPr><w:sz w:val="24"/><w:szCs w:val="24"/></w:rPr></w:pPr><w:r><w:rPr><w:sz w:val="24"/><w:szCs w:val="24"/></w:rPr><w:t>Pada bagian kolom pengesahan, mahasiswa wajib menandatangani serta menuliskan nama lengkapnya, kemudian nama lurah, kepala desa, atau pihak berwenang lainnya.</w:t></w:r></w:p><w:p><w:pPr><w:numPr><w:ilvl w:val="0"/><w:numId w:val="1"/></w:numPr><w:pBdr><w:top w:val="nil"/><w:left w:val="nil"/><w:bottom w:val="nil"/><w:right w:val="nil"/><w:between w:val="nil"/></w:pBdr><w:jc w:val="both"/><w:rPr><w:sz w:val="24"/><w:szCs w:val="24"/></w:rPr></w:pPr><w:r><w:rPr><w:sz w:val="24"/><w:szCs w:val="24"/></w:rPr><w:t>Selanjutnya, lurah, kepala desa, atau pihak berwenang terkait diminta untuk memberikan tanda tangan pada logbook mingguan tersebut.</w:t></w:r></w:p><w:p><w:pPr><w:numPr><w:ilvl w:val="0"/><w:numId w:val="1"/></w:numPr><w:pBdr><w:top w:val="nil"/><w:left w:val="nil"/><w:bottom w:val="nil"/><w:right w:val="nil"/><w:between w:val="nil"/></w:pBdr><w:jc w:val="both"/><w:rPr><w:sz w:val="24"/><w:szCs w:val="24"/></w:rPr></w:pPr><w:r><w:rPr><w:sz w:val="24"/><w:szCs w:val="24"/></w:rPr><w:t>Mahasiswa kemudian mengirimkan logbook mingguan secara daring kepada DPL masing-masing.</w:t></w:r></w:p><w:p><w:pPr><w:numPr><w:ilvl w:val="0"/><w:numId w:val="1"/></w:numPr><w:pBdr><w:top w:val="nil"/><w:left w:val="nil"/><w:bottom w:val="nil"/><w:right w:val="nil"/><w:between w:val="nil"/></w:pBdr><w:jc w:val="both"/><w:rPr><w:sz w:val="24"/><w:szCs w:val="24"/></w:rPr></w:pPr><w:r><w:rPr><w:sz w:val="24"/><w:szCs w:val="24"/></w:rPr><w:t>DPL akan memeriksa dan memberikan tanggapan terhadap logbook setiap minggu.</w:t></w:r><w:r><w:rPr><w:sz w:val="24"/><w:szCs w:val="24"/></w:rPr><w:br/></w:r></w:p><w:p><w:pPr><w:pBdr><w:top w:val="nil"/><w:left w:val="nil"/><w:bottom w:val="nil"/><w:right w:val="nil"/><w:between w:val="nil"/></w:pBdr><w:ind w:left="1080"/><w:jc w:val="both"/><w:rPr><w:sz w:val="24"/><w:szCs w:val="24"/></w:rPr></w:pPr></w:p><w:sectPr><w:pgSz w:w="12240" w:h="15840"/><w:pgMar w:top="1440" w:right="1440" w:bottom="1440" w:left="1440" w:header="708" w:footer="708" w:gutter="0"/><w:pgNumType w:start="1"/><w:cols w:space="720"/></w:sectPr></w:body></w:document>
+<file path=word/document.xml><?xml version="1.0" encoding="utf-8"?>
+<w:document xmlns:wpc="http://schemas.microsoft.com/office/word/2010/wordprocessingCanvas" xmlns:cx="http://schemas.microsoft.com/office/drawing/2014/chartex" xmlns:cx1="http://schemas.microsoft.com/office/drawing/2015/9/8/chartex" xmlns:cx2="http://schemas.microsoft.com/office/drawing/2015/10/21/chartex" xmlns:cx3="http://schemas.microsoft.com/office/drawing/2016/5/9/chartex" xmlns:cx4="http://schemas.microsoft.com/office/drawing/2016/5/10/chartex" xmlns:cx5="http://schemas.microsoft.com/office/drawing/2016/5/11/chartex" xmlns:cx6="http://schemas.microsoft.com/office/drawing/2016/5/12/chartex" xmlns:cx7="http://schemas.microsoft.com/office/drawing/2016/5/13/chartex" xmlns:cx8="http://schemas.microsoft.com/office/drawing/2016/5/14/chartex" xmlns:mc="http://schemas.openxmlformats.org/markup-compatibility/2006" xmlns:aink="http://schemas.microsoft.com/office/drawing/2016/ink" xmlns:am3d="http://schemas.microsoft.com/office/drawing/2017/model3d" xmlns:o="urn:schemas-microsoft-com:office:office" xmlns:oel="http://schemas.microsoft.com/office/2019/extlst" xmlns:r="http://schemas.openxmlformats.org/officeDocument/2006/relationships" xmlns:m="http://schemas.openxmlformats.org/officeDocument/2006/math" xmlns:v="urn:schemas-microsoft-com:vml" xmlns:wp14="http://schemas.microsoft.com/office/word/2010/wordprocessingDrawing" xmlns:wp="http://schemas.openxmlformats.org/drawingml/2006/wordprocessingDrawing" xmlns:w10="urn:schemas-microsoft-com:office:word" xmlns:w="http://schemas.openxmlformats.org/wordprocessingml/2006/main" xmlns:w14="http://schemas.microsoft.com/office/word/2010/wordml" xmlns:w15="http://schemas.microsoft.com/office/word/2012/wordml" xmlns:w16cex="http://schemas.microsoft.com/office/word/2018/wordml/cex" xmlns:w16cid="http://schemas.microsoft.com/office/word/2016/wordml/cid" xmlns:w16="http://schemas.microsoft.com/office/word/2018/wordml" xmlns:w16du="http://schemas.microsoft.com/office/word/2023/wordml/word16du" xmlns:w16sdtdh="http://schemas.microsoft.com/office/word/2020/wordml/sdtdatahash" xmlns:w16sdtfl="http://schemas.microsoft.com/office/word/2024/wordml/sdtformatlock" xmlns:w16se="http://schemas.microsoft.com/office/word/2015/wordml/symex" xmlns:wpg="http://schemas.microsoft.com/office/word/2010/wordprocessingGroup" xmlns:wpi="http://schemas.microsoft.com/office/word/2010/wordprocessingInk" xmlns:wne="http://schemas.microsoft.com/office/word/2006/wordml" xmlns:wps="http://schemas.microsoft.com/office/word/2010/wordprocessingShape" mc:Ignorable="w14 w15 w16se w16cid w16 w16cex w16sdtdh w16sdtfl w16du wp14">
+  <w:body>
+    <w:p>
+      <w:pPr>
+        <w:spacing w:before="58"/>
+        <w:ind w:left="356" w:right="360"/>
+        <w:jc w:val="center"/>
+        <w:rPr>
+          <w:b/>
+          <w:i/>
+          <w:sz w:val="32"/>
+          <w:szCs w:val="32"/>
+        </w:rPr>
+      </w:pPr>
+      <w:r>
+        <w:rPr>
+          <w:b/>
+          <w:sz w:val="32"/>
+          <w:szCs w:val="32"/>
+        </w:rPr>
+        <w:t xml:space="preserve">BUKU CATATAN HARIAN </w:t>
+      </w:r>
+      <w:r>
+        <w:rPr>
+          <w:b/>
+          <w:i/>
+          <w:sz w:val="32"/>
+          <w:szCs w:val="32"/>
+        </w:rPr>
+        <w:t>(LOGBOOK)</w:t>
+      </w:r>
+    </w:p>
+    <w:p>
+      <w:pPr>
+        <w:pBdr>
+          <w:top w:val="nil"/>
+          <w:left w:val="nil"/>
+          <w:bottom w:val="nil"/>
+          <w:right w:val="nil"/>
+          <w:between w:val="nil"/>
+        </w:pBdr>
+        <w:spacing w:before="31"/>
+        <w:rPr>
+          <w:b/>
+          <w:i/>
+          <w:color w:val="000000"/>
+          <w:sz w:val="32"/>
+          <w:szCs w:val="32"/>
+        </w:rPr>
+      </w:pPr>
+    </w:p>
+    <w:p>
+      <w:pPr>
+        <w:pStyle w:val="Title"/>
+        <w:spacing w:after="0"/>
+        <w:jc w:val="center"/>
+        <w:rPr>
+          <w:rFonts w:ascii="Times New Roman" w:eastAsia="Times New Roman" w:hAnsi="Times New Roman" w:cs="Times New Roman"/>
+          <w:b/>
+          <w:sz w:val="32"/>
+          <w:szCs w:val="32"/>
+        </w:rPr>
+      </w:pPr>
+      <w:r>
+        <w:rPr>
+          <w:rFonts w:ascii="Times New Roman" w:eastAsia="Times New Roman" w:hAnsi="Times New Roman" w:cs="Times New Roman"/>
+          <w:b/>
+          <w:sz w:val="32"/>
+          <w:szCs w:val="32"/>
+        </w:rPr>
+        <w:t xml:space="preserve">KULIAH KERJA NYATA (KKN) </w:t>
+      </w:r>
+    </w:p>
+    <w:p>
+      <w:pPr>
+        <w:pStyle w:val="Title"/>
+        <w:jc w:val="center"/>
+        <w:rPr>
+          <w:rFonts w:ascii="Times New Roman" w:eastAsia="Times New Roman" w:hAnsi="Times New Roman" w:cs="Times New Roman"/>
+          <w:b/>
+          <w:sz w:val="32"/>
+          <w:szCs w:val="32"/>
+        </w:rPr>
+      </w:pPr>
+      <w:r>
+        <w:rPr>
+          <w:rFonts w:ascii="Times New Roman" w:eastAsia="Times New Roman" w:hAnsi="Times New Roman" w:cs="Times New Roman"/>
+          <w:b/>
+          <w:sz w:val="32"/>
+          <w:szCs w:val="32"/>
+        </w:rPr>
+        <w:t>UNIVERSITAS MARITIM RAJA ALI HAJI</w:t>
+      </w:r>
+    </w:p>
+    <w:p>
+      <w:pPr>
+        <w:pBdr>
+          <w:top w:val="nil"/>
+          <w:left w:val="nil"/>
+          <w:bottom w:val="nil"/>
+          <w:right w:val="nil"/>
+          <w:between w:val="nil"/>
+        </w:pBdr>
+        <w:rPr>
+          <w:b/>
+          <w:color w:val="000000"/>
+          <w:sz w:val="20"/>
+          <w:szCs w:val="20"/>
+        </w:rPr>
+      </w:pPr>
+    </w:p>
+    <w:p>
+      <w:pPr>
+        <w:pBdr>
+          <w:top w:val="nil"/>
+          <w:left w:val="nil"/>
+          <w:bottom w:val="nil"/>
+          <w:right w:val="nil"/>
+          <w:between w:val="nil"/>
+        </w:pBdr>
+        <w:rPr>
+          <w:b/>
+          <w:color w:val="000000"/>
+          <w:sz w:val="20"/>
+          <w:szCs w:val="20"/>
+        </w:rPr>
+      </w:pPr>
+    </w:p>
+    <w:p>
+      <w:pPr>
+        <w:pBdr>
+          <w:top w:val="nil"/>
+          <w:left w:val="nil"/>
+          <w:bottom w:val="nil"/>
+          <w:right w:val="nil"/>
+          <w:between w:val="nil"/>
+        </w:pBdr>
+        <w:rPr>
+          <w:b/>
+          <w:color w:val="000000"/>
+          <w:sz w:val="20"/>
+          <w:szCs w:val="20"/>
+        </w:rPr>
+      </w:pPr>
+    </w:p>
+    <w:p>
+      <w:pPr>
+        <w:pBdr>
+          <w:top w:val="nil"/>
+          <w:left w:val="nil"/>
+          <w:bottom w:val="nil"/>
+          <w:right w:val="nil"/>
+          <w:between w:val="nil"/>
+        </w:pBdr>
+        <w:spacing w:before="63"/>
+        <w:rPr>
+          <w:b/>
+          <w:color w:val="000000"/>
+          <w:sz w:val="20"/>
+          <w:szCs w:val="20"/>
+        </w:rPr>
+      </w:pPr>
+    </w:p>
+    <w:tbl>
+      <w:tblPr>
+        <w:tblStyle w:val="a"/>
+        <w:tblW w:w="9354" w:type="dxa"/>
+        <w:tblInd w:w="-5" w:type="dxa"/>
+        <w:tblBorders>
+          <w:top w:val="single" w:sz="4" w:space="0" w:color="000000"/>
+          <w:left w:val="single" w:sz="4" w:space="0" w:color="000000"/>
+          <w:bottom w:val="single" w:sz="4" w:space="0" w:color="000000"/>
+          <w:right w:val="single" w:sz="4" w:space="0" w:color="000000"/>
+          <w:insideH w:val="single" w:sz="4" w:space="0" w:color="000000"/>
+          <w:insideV w:val="single" w:sz="4" w:space="0" w:color="000000"/>
+        </w:tblBorders>
+        <w:tblLayout w:type="fixed"/>
+        <w:tblLook w:val="0000" w:firstRow="0" w:lastRow="0" w:firstColumn="0" w:lastColumn="0" w:noHBand="0" w:noVBand="0"/>
+      </w:tblPr>
+      <w:tblGrid>
+        <w:gridCol w:w="4677"/>
+        <w:gridCol w:w="4677"/>
+      </w:tblGrid>
+      <w:tr>
+        <w:trPr>
+          <w:trHeight w:val="365"/>
+        </w:trPr>
+        <w:tc>
+          <w:tcPr>
+            <w:tcW w:w="4677" w:type="dxa"/>
+          </w:tcPr>
+          <w:p>
+            <w:pPr>
+              <w:pBdr>
+                <w:top w:val="nil"/>
+                <w:left w:val="nil"/>
+                <w:bottom w:val="nil"/>
+                <w:right w:val="nil"/>
+                <w:between w:val="nil"/>
+              </w:pBdr>
+              <w:spacing w:line="226" w:lineRule="auto"/>
+              <w:ind w:left="107"/>
+              <w:rPr>
+                <w:color w:val="000000"/>
+                <w:sz w:val="20"/>
+                <w:szCs w:val="20"/>
+              </w:rPr>
+            </w:pPr>
+            <w:r>
+              <w:rPr>
+                <w:color w:val="000000"/>
+                <w:sz w:val="20"/>
+                <w:szCs w:val="20"/>
+              </w:rPr>
+              <w:t>NAMA</w:t>
+            </w:r>
+          </w:p>
+        </w:tc>
+        <w:tc>
+          <w:tcPr>
+            <w:tcW w:w="4677" w:type="dxa"/>
+          </w:tcPr>
+          <w:p>
+            <w:r>
+              <w:rPr>
+                <w:rFonts w:ascii="Times New Roman" w:hAnsi="Times New Roman"/>
+                <w:sz w:val="22"/>
+                <w:b/>
+              </w:rPr>
+              <w:t>{full_name}</w:t>
+            </w:r>
+          </w:p>
+        </w:tc>
+      </w:tr>
+      <w:tr>
+        <w:trPr>
+          <w:trHeight w:val="366"/>
+        </w:trPr>
+        <w:tc>
+          <w:tcPr>
+            <w:tcW w:w="4677" w:type="dxa"/>
+          </w:tcPr>
+          <w:p>
+            <w:pPr>
+              <w:pBdr>
+                <w:top w:val="nil"/>
+                <w:left w:val="nil"/>
+                <w:bottom w:val="nil"/>
+                <w:right w:val="nil"/>
+                <w:between w:val="nil"/>
+              </w:pBdr>
+              <w:spacing w:line="227" w:lineRule="auto"/>
+              <w:ind w:left="107"/>
+              <w:rPr>
+                <w:color w:val="000000"/>
+                <w:sz w:val="20"/>
+                <w:szCs w:val="20"/>
+              </w:rPr>
+            </w:pPr>
+            <w:r>
+              <w:rPr>
+                <w:color w:val="000000"/>
+                <w:sz w:val="20"/>
+                <w:szCs w:val="20"/>
+              </w:rPr>
+              <w:t>NIM</w:t>
+            </w:r>
+          </w:p>
+        </w:tc>
+        <w:tc>
+          <w:tcPr>
+            <w:tcW w:w="4677" w:type="dxa"/>
+          </w:tcPr>
+          <w:p>
+            <w:r>
+              <w:rPr>
+                <w:rFonts w:ascii="Times New Roman" w:hAnsi="Times New Roman"/>
+                <w:sz w:val="22"/>
+                <w:b/>
+              </w:rPr>
+              <w:t>{student_id}</w:t>
+            </w:r>
+          </w:p>
+        </w:tc>
+      </w:tr>
+      <w:tr>
+        <w:trPr>
+          <w:trHeight w:val="370"/>
+        </w:trPr>
+        <w:tc>
+          <w:tcPr>
+            <w:tcW w:w="4677" w:type="dxa"/>
+          </w:tcPr>
+          <w:p>
+            <w:pPr>
+              <w:pBdr>
+                <w:top w:val="nil"/>
+                <w:left w:val="nil"/>
+                <w:bottom w:val="nil"/>
+                <w:right w:val="nil"/>
+                <w:between w:val="nil"/>
+              </w:pBdr>
+              <w:spacing w:line="226" w:lineRule="auto"/>
+              <w:ind w:left="107"/>
+              <w:rPr>
+                <w:color w:val="000000"/>
+                <w:sz w:val="20"/>
+                <w:szCs w:val="20"/>
+              </w:rPr>
+            </w:pPr>
+            <w:r>
+              <w:rPr>
+                <w:color w:val="000000"/>
+                <w:sz w:val="20"/>
+                <w:szCs w:val="20"/>
+              </w:rPr>
+              <w:t>FAKULTAS/PRODI</w:t>
+            </w:r>
+          </w:p>
+        </w:tc>
+        <w:tc>
+          <w:tcPr>
+            <w:tcW w:w="4677" w:type="dxa"/>
+          </w:tcPr>
+          <w:p>
+            <w:r>
+              <w:rPr>
+                <w:rFonts w:ascii="Times New Roman" w:hAnsi="Times New Roman"/>
+                <w:sz w:val="22"/>
+                <w:b/>
+              </w:rPr>
+              <w:t>{faculty_prodi}</w:t>
+            </w:r>
+          </w:p>
+        </w:tc>
+      </w:tr>
+      <w:tr>
+        <w:trPr>
+          <w:trHeight w:val="366"/>
+        </w:trPr>
+        <w:tc>
+          <w:tcPr>
+            <w:tcW w:w="4677" w:type="dxa"/>
+          </w:tcPr>
+          <w:p>
+            <w:pPr>
+              <w:pBdr>
+                <w:top w:val="nil"/>
+                <w:left w:val="nil"/>
+                <w:bottom w:val="nil"/>
+                <w:right w:val="nil"/>
+                <w:between w:val="nil"/>
+              </w:pBdr>
+              <w:spacing w:line="222" w:lineRule="auto"/>
+              <w:ind w:left="107"/>
+              <w:rPr>
+                <w:color w:val="000000"/>
+                <w:sz w:val="20"/>
+                <w:szCs w:val="20"/>
+              </w:rPr>
+            </w:pPr>
+            <w:r>
+              <w:rPr>
+                <w:color w:val="000000"/>
+                <w:sz w:val="20"/>
+                <w:szCs w:val="20"/>
+              </w:rPr>
+              <w:t>NAMA LOKASI KKN</w:t>
+            </w:r>
+          </w:p>
+        </w:tc>
+        <w:tc>
+          <w:tcPr>
+            <w:tcW w:w="4677" w:type="dxa"/>
+          </w:tcPr>
+          <w:p>
+            <w:r>
+              <w:rPr>
+                <w:rFonts w:ascii="Times New Roman" w:hAnsi="Times New Roman"/>
+                <w:sz w:val="22"/>
+                <w:b/>
+              </w:rPr>
+              <w:t>{group_location}</w:t>
+            </w:r>
+          </w:p>
+        </w:tc>
+      </w:tr>
+      <w:tr>
+        <w:trPr>
+          <w:trHeight w:val="362"/>
+        </w:trPr>
+        <w:tc>
+          <w:tcPr>
+            <w:tcW w:w="4677" w:type="dxa"/>
+          </w:tcPr>
+          <w:p>
+            <w:pPr>
+              <w:pBdr>
+                <w:top w:val="nil"/>
+                <w:left w:val="nil"/>
+                <w:bottom w:val="nil"/>
+                <w:right w:val="nil"/>
+                <w:between w:val="nil"/>
+              </w:pBdr>
+              <w:spacing w:line="222" w:lineRule="auto"/>
+              <w:ind w:left="107"/>
+              <w:rPr>
+                <w:color w:val="000000"/>
+                <w:sz w:val="20"/>
+                <w:szCs w:val="20"/>
+              </w:rPr>
+            </w:pPr>
+            <w:r>
+              <w:rPr>
+                <w:color w:val="000000"/>
+                <w:sz w:val="20"/>
+                <w:szCs w:val="20"/>
+              </w:rPr>
+              <w:t>NAMA DOSEN PENDAMPING LAPANGAN</w:t>
+            </w:r>
+          </w:p>
+        </w:tc>
+        <w:tc>
+          <w:tcPr>
+            <w:tcW w:w="4677" w:type="dxa"/>
+          </w:tcPr>
+          <w:p>
+            <w:r>
+              <w:rPr>
+                <w:rFonts w:ascii="Times New Roman" w:hAnsi="Times New Roman"/>
+                <w:sz w:val="22"/>
+                <w:b/>
+              </w:rPr>
+              <w:t>{dosen_name}</w:t>
+            </w:r>
+          </w:p>
+        </w:tc>
+      </w:tr>
+    </w:tbl>
+    <w:p>
+      <w:pPr>
+        <w:pBdr>
+          <w:top w:val="nil"/>
+          <w:left w:val="nil"/>
+          <w:bottom w:val="nil"/>
+          <w:right w:val="nil"/>
+          <w:between w:val="nil"/>
+        </w:pBdr>
+        <w:rPr>
+          <w:b/>
+          <w:color w:val="000000"/>
+          <w:sz w:val="20"/>
+          <w:szCs w:val="20"/>
+        </w:rPr>
+      </w:pPr>
+      <w:r>
+        <w:rPr>
+          <w:noProof/>
+        </w:rPr>
+        <w:drawing>
+          <wp:anchor distT="0" distB="0" distL="114300" distR="114300" simplePos="0" relativeHeight="251659264" behindDoc="0" locked="0" layoutInCell="1" hidden="0" allowOverlap="1" wp14:anchorId="068DF41D" wp14:editId="0EDAA620">
+            <wp:simplePos x="0" y="0"/>
+            <wp:positionH relativeFrom="column">
+              <wp:posOffset>1955482</wp:posOffset>
+            </wp:positionH>
+            <wp:positionV relativeFrom="paragraph">
+              <wp:posOffset>215900</wp:posOffset>
+            </wp:positionV>
+            <wp:extent cx="2032635" cy="2035175"/>
+            <wp:effectExtent l="0" t="0" r="0" b="0"/>
+            <wp:wrapTopAndBottom distT="0" distB="0"/>
+            <wp:docPr id="1900290531" name="image2.png"/>
+            <wp:cNvGraphicFramePr/>
+            <a:graphic xmlns:a="http://schemas.openxmlformats.org/drawingml/2006/main">
+              <a:graphicData uri="http://schemas.openxmlformats.org/drawingml/2006/picture">
+                <pic:pic xmlns:pic="http://schemas.openxmlformats.org/drawingml/2006/picture">
+                  <pic:nvPicPr>
+                    <pic:cNvPr id="0" name="image2.png"/>
+                    <pic:cNvPicPr preferRelativeResize="0"/>
+                  </pic:nvPicPr>
+                  <pic:blipFill>
+                    <a:blip r:embed="rId6"/>
+                    <a:srcRect/>
+                    <a:stretch>
+                      <a:fillRect/>
+                    </a:stretch>
+                  </pic:blipFill>
+                  <pic:spPr>
+                    <a:xfrm>
+                      <a:off x="0" y="0"/>
+                      <a:ext cx="2032635" cy="2035175"/>
+                    </a:xfrm>
+                    <a:prstGeom prst="rect">
+                      <a:avLst/>
+                    </a:prstGeom>
+                    <a:ln/>
+                  </pic:spPr>
+                </pic:pic>
+              </a:graphicData>
+            </a:graphic>
+          </wp:anchor>
+        </w:drawing>
+      </w:r>
+    </w:p>
+    <w:p>
+      <w:pPr>
+        <w:spacing w:before="2"/>
+        <w:ind w:left="2880" w:right="3233"/>
+        <w:jc w:val="center"/>
+        <w:rPr>
+          <w:sz w:val="26"/>
+          <w:szCs w:val="26"/>
+        </w:rPr>
+      </w:pPr>
+    </w:p>
+    <w:p>
+      <w:pPr>
+        <w:jc w:val="center"/>
+        <w:rPr>
+          <w:sz w:val="26"/>
+          <w:szCs w:val="26"/>
+        </w:rPr>
+      </w:pPr>
+    </w:p>
+    <w:p>
+      <w:pPr>
+        <w:pBdr>
+          <w:top w:val="nil"/>
+          <w:left w:val="nil"/>
+          <w:bottom w:val="nil"/>
+          <w:right w:val="nil"/>
+          <w:between w:val="nil"/>
+        </w:pBdr>
+        <w:jc w:val="center"/>
+        <w:rPr>
+          <w:sz w:val="26"/>
+          <w:szCs w:val="26"/>
+        </w:rPr>
+      </w:pPr>
+      <w:r>
+        <w:rPr>
+          <w:sz w:val="26"/>
+          <w:szCs w:val="26"/>
+        </w:rPr>
+        <w:t>LEMBAGA PENELITIAN DAN PENGABDIAN KEPADA MASYARAKAT</w:t>
+      </w:r>
+    </w:p>
+    <w:p>
+      <w:pPr>
+        <w:jc w:val="center"/>
+        <w:rPr>
+          <w:sz w:val="26"/>
+          <w:szCs w:val="26"/>
+        </w:rPr>
+      </w:pPr>
+      <w:r>
+        <w:rPr>
+          <w:sz w:val="26"/>
+          <w:szCs w:val="26"/>
+        </w:rPr>
+        <w:t>UNIVERSITAS MARITIM RAJA ALI HAJI</w:t>
+      </w:r>
+    </w:p>
+    <w:p>
+      <w:pPr>
+        <w:jc w:val="center"/>
+        <w:rPr>
+          <w:sz w:val="26"/>
+          <w:szCs w:val="26"/>
+        </w:rPr>
+      </w:pPr>
+      <w:r>
+        <w:rPr>
+          <w:sz w:val="26"/>
+          <w:szCs w:val="26"/>
+        </w:rPr>
+        <w:t>2025</w:t>
+      </w:r>
+    </w:p>
+    <w:tbl>
+      <w:tblPr>
+        <w:tblStyle w:val="a0"/>
+        <w:tblW w:w="10365" w:type="dxa"/>
+        <w:tblInd w:w="-508" w:type="dxa"/>
+        <w:tblBorders>
+          <w:top w:val="single" w:sz="4" w:space="0" w:color="000000"/>
+          <w:left w:val="single" w:sz="4" w:space="0" w:color="000000"/>
+          <w:bottom w:val="single" w:sz="4" w:space="0" w:color="000000"/>
+          <w:right w:val="single" w:sz="4" w:space="0" w:color="000000"/>
+          <w:insideH w:val="single" w:sz="4" w:space="0" w:color="000000"/>
+          <w:insideV w:val="single" w:sz="4" w:space="0" w:color="000000"/>
+        </w:tblBorders>
+        <w:tblLayout w:type="fixed"/>
+        <w:tblLook w:val="0000" w:firstRow="0" w:lastRow="0" w:firstColumn="0" w:lastColumn="0" w:noHBand="0" w:noVBand="0"/>
+      </w:tblPr>
+      <w:tblGrid>
+        <w:gridCol w:w="635"/>
+        <w:gridCol w:w="1250"/>
+        <w:gridCol w:w="950"/>
+        <w:gridCol w:w="2415"/>
+        <w:gridCol w:w="2415"/>
+        <w:gridCol w:w="900"/>
+        <w:gridCol w:w="900"/>
+        <w:gridCol w:w="900"/>
+      </w:tblGrid>
+      <w:tr>
+        <w:trPr>
+          <w:trHeight w:val="1955"/>
+        </w:trPr>
+        <w:tc>
+          <w:tcPr>
+            <w:tcW w:w="3930" w:type="dxa"/>
+            <w:gridSpan w:val="4"/>
+            <w:tcBorders>
+              <w:top w:val="single" w:sz="12" w:space="0" w:color="000000"/>
+              <w:left w:val="single" w:sz="12" w:space="0" w:color="000000"/>
+              <w:bottom w:val="single" w:sz="12" w:space="0" w:color="000000"/>
+              <w:right w:val="single" w:sz="12" w:space="0" w:color="000000"/>
+            </w:tcBorders>
+          </w:tcPr>
+          <w:p>
+            <w:pPr>
+              <w:pBdr>
+                <w:top w:val="nil"/>
+                <w:left w:val="nil"/>
+                <w:bottom w:val="nil"/>
+                <w:right w:val="nil"/>
+                <w:between w:val="nil"/>
+              </w:pBdr>
+              <w:ind w:left="561"/>
+              <w:rPr>
+                <w:color w:val="000000"/>
+                <w:sz w:val="20"/>
+                <w:szCs w:val="20"/>
+              </w:rPr>
+            </w:pPr>
+            <w:r>
+              <w:rPr>
+                <w:noProof/>
+              </w:rPr>
+              <w:lastRenderedPageBreak/>
+              <w:drawing>
+                <wp:anchor distT="0" distB="0" distL="114300" distR="114300" simplePos="0" relativeHeight="251660288" behindDoc="0" locked="0" layoutInCell="1" hidden="0" allowOverlap="1" wp14:anchorId="7523C5D4" wp14:editId="78695CA9">
+                  <wp:simplePos x="0" y="0"/>
+                  <wp:positionH relativeFrom="column">
+                    <wp:posOffset>316865</wp:posOffset>
+                  </wp:positionH>
+                  <wp:positionV relativeFrom="paragraph">
+                    <wp:posOffset>43180</wp:posOffset>
+                  </wp:positionV>
+                  <wp:extent cx="1156335" cy="1157605"/>
+                  <wp:effectExtent l="0" t="0" r="0" b="0"/>
+                  <wp:wrapTopAndBottom distT="0" distB="0"/>
+                  <wp:docPr id="1900290530" name="image1.png"/>
+                  <wp:cNvGraphicFramePr/>
+                  <a:graphic xmlns:a="http://schemas.openxmlformats.org/drawingml/2006/main">
+                    <a:graphicData uri="http://schemas.openxmlformats.org/drawingml/2006/picture">
+                      <pic:pic xmlns:pic="http://schemas.openxmlformats.org/drawingml/2006/picture">
+                        <pic:nvPicPr>
+                          <pic:cNvPr id="0" name="image1.png"/>
+                          <pic:cNvPicPr preferRelativeResize="0"/>
+                        </pic:nvPicPr>
+                        <pic:blipFill>
+                          <a:blip r:embed="rId7"/>
+                          <a:srcRect/>
+                          <a:stretch>
+                            <a:fillRect/>
+                          </a:stretch>
+                        </pic:blipFill>
+                        <pic:spPr>
+                          <a:xfrm>
+                            <a:off x="0" y="0"/>
+                            <a:ext cx="1156335" cy="1157605"/>
+                          </a:xfrm>
+                          <a:prstGeom prst="rect">
+                            <a:avLst/>
+                          </a:prstGeom>
+                          <a:ln/>
+                        </pic:spPr>
+                      </pic:pic>
+                    </a:graphicData>
+                  </a:graphic>
+                </wp:anchor>
+              </w:drawing>
+            </w:r>
+          </w:p>
+        </w:tc>
+        <w:tc>
+          <w:tcPr>
+            <w:tcW w:w="3885" w:type="dxa"/>
+            <w:gridSpan w:val="3"/>
+            <w:tcBorders>
+              <w:top w:val="single" w:sz="12" w:space="0" w:color="000000"/>
+              <w:left w:val="single" w:sz="12" w:space="0" w:color="000000"/>
+              <w:bottom w:val="single" w:sz="12" w:space="0" w:color="000000"/>
+              <w:right w:val="single" w:sz="12" w:space="0" w:color="000000"/>
+            </w:tcBorders>
+          </w:tcPr>
+          <w:p>
+            <w:pPr>
+              <w:pBdr>
+                <w:top w:val="nil"/>
+                <w:left w:val="nil"/>
+                <w:bottom w:val="nil"/>
+                <w:right w:val="nil"/>
+                <w:between w:val="nil"/>
+              </w:pBdr>
+              <w:spacing w:before="3"/>
+              <w:ind w:left="106"/>
+              <w:rPr>
+                <w:b/>
+                <w:i/>
+                <w:color w:val="000000"/>
+                <w:sz w:val="24"/>
+                <w:szCs w:val="24"/>
+              </w:rPr>
+            </w:pPr>
+            <w:r>
+              <w:rPr>
+                <w:b/>
+                <w:i/>
+                <w:color w:val="000000"/>
+                <w:sz w:val="24"/>
+                <w:szCs w:val="24"/>
+              </w:rPr>
+              <w:t>LOGBOOK</w:t>
+            </w:r>
+          </w:p>
+          <w:p>
+            <w:pPr>
+              <w:pBdr>
+                <w:top w:val="nil"/>
+                <w:left w:val="nil"/>
+                <w:bottom w:val="nil"/>
+                <w:right w:val="nil"/>
+                <w:between w:val="nil"/>
+              </w:pBdr>
+              <w:spacing w:before="135" w:line="360" w:lineRule="auto"/>
+              <w:ind w:left="106" w:right="267"/>
+              <w:rPr>
+                <w:b/>
+                <w:color w:val="000000"/>
+                <w:sz w:val="24"/>
+                <w:szCs w:val="24"/>
+              </w:rPr>
+            </w:pPr>
+            <w:r>
+              <w:rPr>
+                <w:b/>
+                <w:color w:val="000000"/>
+                <w:sz w:val="24"/>
+                <w:szCs w:val="24"/>
+              </w:rPr>
+              <w:t>KULIAH KERJA NYATA UNIVERSITAS MARITIM RAJA ALI HAJI</w:t>
+            </w:r>
+          </w:p>
+        </w:tc>
+        <w:tc>
+          <w:tcPr>
+            <w:tcW w:w="2550" w:type="dxa"/>
+            <w:tcBorders>
+              <w:top w:val="single" w:sz="12" w:space="0" w:color="000000"/>
+              <w:left w:val="single" w:sz="12" w:space="0" w:color="000000"/>
+              <w:bottom w:val="single" w:sz="12" w:space="0" w:color="000000"/>
+              <w:right w:val="single" w:sz="12" w:space="0" w:color="000000"/>
+            </w:tcBorders>
+          </w:tcPr>
+          <w:p>
+            <w:pPr>
+              <w:pBdr>
+                <w:top w:val="nil"/>
+                <w:left w:val="nil"/>
+                <w:bottom w:val="nil"/>
+                <w:right w:val="nil"/>
+                <w:between w:val="nil"/>
+              </w:pBdr>
+              <w:rPr>
+                <w:color w:val="000000"/>
+                <w:sz w:val="24"/>
+                <w:szCs w:val="24"/>
+              </w:rPr>
+            </w:pPr>
+          </w:p>
+          <w:p>
+            <w:pPr>
+              <w:pBdr>
+                <w:top w:val="nil"/>
+                <w:left w:val="nil"/>
+                <w:bottom w:val="nil"/>
+                <w:right w:val="nil"/>
+                <w:between w:val="nil"/>
+              </w:pBdr>
+              <w:spacing w:before="270"/>
+              <w:rPr>
+                <w:color w:val="000000"/>
+                <w:sz w:val="24"/>
+                <w:szCs w:val="24"/>
+              </w:rPr>
+            </w:pPr>
+          </w:p>
+          <w:p>
+            <w:pPr>
+              <w:pBdr>
+                <w:top w:val="nil"/>
+                <w:left w:val="nil"/>
+                <w:bottom w:val="nil"/>
+                <w:right w:val="nil"/>
+                <w:between w:val="nil"/>
+              </w:pBdr>
+              <w:spacing w:before="1"/>
+              <w:ind w:left="104" w:right="994"/>
+              <w:rPr>
+                <w:b/>
+                <w:color w:val="000000"/>
+                <w:sz w:val="24"/>
+                <w:szCs w:val="24"/>
+              </w:rPr>
+            </w:pPr>
+            <w:r>
+              <w:rPr>
+                <w:b/>
+                <w:color w:val="000000"/>
+                <w:sz w:val="24"/>
+                <w:szCs w:val="24"/>
+              </w:rPr>
+              <w:t>{week_label}</w:t>
+            </w:r>
+          </w:p>
+        </w:tc>
+      </w:tr>
+      <w:tr>
+        <w:trPr>
+          <w:trHeight w:val="274"/>
+        </w:trPr>
+        <w:tc>
+          <w:tcPr>
+            <w:tcW w:w="10365" w:type="dxa"/>
+            <w:gridSpan w:val="8"/>
+            <w:tcBorders>
+              <w:top w:val="single" w:sz="12" w:space="0" w:color="000000"/>
+              <w:left w:val="single" w:sz="8" w:space="0" w:color="000000"/>
+              <w:bottom w:val="single" w:sz="8" w:space="0" w:color="000000"/>
+              <w:right w:val="single" w:sz="8" w:space="0" w:color="000000"/>
+            </w:tcBorders>
+          </w:tcPr>
+          <w:p>
+            <w:pPr>
+              <w:pBdr>
+                <w:top w:val="nil"/>
+                <w:left w:val="nil"/>
+                <w:bottom w:val="nil"/>
+                <w:right w:val="nil"/>
+                <w:between w:val="nil"/>
+              </w:pBdr>
+              <w:spacing w:line="254" w:lineRule="auto"/>
+              <w:ind w:left="107"/>
+              <w:rPr>
+                <w:b/>
+                <w:color w:val="000000"/>
+                <w:sz w:val="24"/>
+                <w:szCs w:val="24"/>
+              </w:rPr>
+            </w:pPr>
+            <w:r>
+              <w:rPr>
+                <w:b/>
+                <w:color w:val="000000"/>
+                <w:sz w:val="24"/>
+                <w:szCs w:val="24"/>
+              </w:rPr>
+              <w:t>NAMA MAHASISWA/NIM/KELOMPOK: {group_info}</w:t>
+            </w:r>
+          </w:p>
+        </w:tc>
+      </w:tr>
+      <w:tr>
+        <w:trPr>
+          <w:trHeight w:val="278"/>
+        </w:trPr>
+        <w:tc>
+          <w:tcPr>
+            <w:tcW w:w="10365" w:type="dxa"/>
+            <w:gridSpan w:val="8"/>
+            <w:tcBorders>
+              <w:top w:val="single" w:sz="8" w:space="0" w:color="000000"/>
+              <w:left w:val="single" w:sz="8" w:space="0" w:color="000000"/>
+              <w:bottom w:val="single" w:sz="8" w:space="0" w:color="000000"/>
+              <w:right w:val="single" w:sz="8" w:space="0" w:color="000000"/>
+            </w:tcBorders>
+          </w:tcPr>
+          <w:p>
+            <w:pPr>
+              <w:pBdr>
+                <w:top w:val="nil"/>
+                <w:left w:val="nil"/>
+                <w:bottom w:val="nil"/>
+                <w:right w:val="nil"/>
+                <w:between w:val="nil"/>
+              </w:pBdr>
+              <w:spacing w:line="258" w:lineRule="auto"/>
+              <w:ind w:left="107"/>
+              <w:rPr>
+                <w:b/>
+                <w:color w:val="000000"/>
+                <w:sz w:val="24"/>
+                <w:szCs w:val="24"/>
+              </w:rPr>
+            </w:pPr>
+            <w:r>
+              <w:rPr>
+                <w:b/>
+                <w:color w:val="000000"/>
+                <w:sz w:val="24"/>
+                <w:szCs w:val="24"/>
+              </w:rPr>
+              <w:t>A. JADWAL:</w:t>
+            </w:r>
+          </w:p>
+        </w:tc>
+      </w:tr>
+      <w:tr>
+        <w:trPr>
+          <w:trHeight w:val="230"/>
+        </w:trPr>
+        <w:tc>
+          <w:tcPr>
+            <w:tcW w:w="635" w:type="dxa"/>
+            <w:tcBorders>
+              <w:top w:val="single" w:sz="8" w:space="0" w:color="000000"/>
+              <w:left w:val="single" w:sz="8" w:space="0" w:color="000000"/>
+              <w:bottom w:val="single" w:sz="8" w:space="0" w:color="000000"/>
+              <w:right w:val="single" w:sz="8" w:space="0" w:color="000000"/>
+            </w:tcBorders>
+          </w:tcPr>
+          <w:p>
+            <w:pPr>
+              <w:rPr>
+                <w:b/>
+                <w:bCs/>
+                <w:color w:val="000000"/>
+                <w:sz w:val="20"/>
+                <w:szCs w:val="20"/>
+              </w:rPr>
+            </w:pPr>
+            <w:r>
+              <w:rPr>
+                <w:b/>
+                <w:bCs/>
+                <w:sz w:val="20"/>
+                <w:szCs w:val="20"/>
+              </w:rPr>
+              <w:t>HARI</w:t>
+            </w:r>
+          </w:p>
+        </w:tc>
+        <w:tc>
+          <w:tcPr>
+            <w:tcW w:w="1250" w:type="dxa"/>
+            <w:tcBorders>
+              <w:top w:val="single" w:sz="8" w:space="0" w:color="000000"/>
+              <w:left w:val="single" w:sz="8" w:space="0" w:color="000000"/>
+              <w:bottom w:val="single" w:sz="8" w:space="0" w:color="000000"/>
+              <w:right w:val="single" w:sz="8" w:space="0" w:color="000000"/>
+            </w:tcBorders>
+          </w:tcPr>
+          <w:p>
+            <w:pPr>
+              <w:pBdr>
+                <w:top w:val="nil"/>
+                <w:left w:val="nil"/>
+                <w:bottom w:val="nil"/>
+                <w:right w:val="nil"/>
+                <w:between w:val="nil"/>
+              </w:pBdr>
+              <w:spacing w:line="210" w:lineRule="auto"/>
+              <w:ind w:left="106"/>
+              <w:rPr>
+                <w:b/>
+                <w:color w:val="000000"/>
+                <w:sz w:val="20"/>
+                <w:szCs w:val="20"/>
+              </w:rPr>
+            </w:pPr>
+            <w:r>
+              <w:rPr>
+                <w:b/>
+                <w:color w:val="000000"/>
+                <w:sz w:val="20"/>
+                <w:szCs w:val="20"/>
+              </w:rPr>
+              <w:t>TANGGAL</w:t>
+            </w:r>
+          </w:p>
+        </w:tc>
+        <w:tc>
+          <w:tcPr>
+            <w:tcW w:w="950" w:type="dxa"/>
+            <w:tcBorders>
+              <w:top w:val="single" w:sz="8" w:space="0" w:color="000000"/>
+              <w:left w:val="single" w:sz="8" w:space="0" w:color="000000"/>
+              <w:bottom w:val="single" w:sz="8" w:space="0" w:color="000000"/>
+              <w:right w:val="single" w:sz="8" w:space="0" w:color="000000"/>
+            </w:tcBorders>
+          </w:tcPr>
+          <w:p>
+            <w:pPr>
+              <w:pBdr>
+                <w:top w:val="nil"/>
+                <w:left w:val="nil"/>
+                <w:bottom w:val="nil"/>
+                <w:right w:val="nil"/>
+                <w:between w:val="nil"/>
+              </w:pBdr>
+              <w:spacing w:line="210" w:lineRule="auto"/>
+              <w:ind w:left="242"/>
+              <w:rPr>
+                <w:b/>
+                <w:color w:val="000000"/>
+                <w:sz w:val="20"/>
+                <w:szCs w:val="20"/>
+              </w:rPr>
+            </w:pPr>
+            <w:r>
+              <w:rPr>
+                <w:b/>
+                <w:color w:val="000000"/>
+                <w:sz w:val="20"/>
+                <w:szCs w:val="20"/>
+              </w:rPr>
+              <w:t>JAM</w:t>
+            </w:r>
+          </w:p>
+        </w:tc>
+        <w:tc>
+          <w:tcPr>
+            <w:tcW w:w="4830" w:type="dxa"/>
+            <w:gridSpan w:val="2"/>
+            <w:tcBorders>
+              <w:top w:val="single" w:sz="8" w:space="0" w:color="000000"/>
+              <w:left w:val="single" w:sz="8" w:space="0" w:color="000000"/>
+              <w:bottom w:val="single" w:sz="8" w:space="0" w:color="000000"/>
+              <w:right w:val="single" w:sz="8" w:space="0" w:color="000000"/>
+            </w:tcBorders>
+          </w:tcPr>
+          <w:p>
+            <w:pPr>
+              <w:pBdr>
+                <w:top w:val="nil"/>
+                <w:left w:val="nil"/>
+                <w:bottom w:val="nil"/>
+                <w:right w:val="nil"/>
+                <w:between w:val="nil"/>
+              </w:pBdr>
+              <w:spacing w:line="210" w:lineRule="auto"/>
+              <w:ind w:left="242"/>
+              <w:rPr>
+                <w:b/>
+                <w:color w:val="000000"/>
+                <w:sz w:val="20"/>
+                <w:szCs w:val="20"/>
+              </w:rPr>
+            </w:pPr>
+            <w:r>
+              <w:rPr>
+                <w:b/>
+                <w:sz w:val="20"/>
+                <w:szCs w:val="20"/>
+              </w:rPr>
+              <w:t>KEGIATAN</w:t>
+            </w:r>
+          </w:p>
+        </w:tc>
+        <w:tc>
+          <w:tcPr>
+            <w:tcW w:w="2700" w:type="dxa"/>
+            <w:gridSpan w:val="3"/>
+            <w:tcBorders>
+              <w:top w:val="single" w:sz="8" w:space="0" w:color="000000"/>
+              <w:left w:val="single" w:sz="8" w:space="0" w:color="000000"/>
+              <w:bottom w:val="single" w:sz="8" w:space="0" w:color="000000"/>
+              <w:right w:val="single" w:sz="8" w:space="0" w:color="000000"/>
+            </w:tcBorders>
+          </w:tcPr>
+          <w:p>
+            <w:pPr>
+              <w:pBdr>
+                <w:top w:val="nil"/>
+                <w:left w:val="nil"/>
+                <w:bottom w:val="nil"/>
+                <w:right w:val="nil"/>
+                <w:between w:val="nil"/>
+              </w:pBdr>
+              <w:spacing w:line="210" w:lineRule="auto"/>
+              <w:ind w:right="1"/>
+              <w:jc w:val="center"/>
+              <w:rPr>
+                <w:b/>
+                <w:color w:val="FF0000"/>
+                <w:sz w:val="20"/>
+                <w:szCs w:val="20"/>
+              </w:rPr>
+            </w:pPr>
+            <w:r>
+              <w:rPr>
+                <w:b/>
+                <w:color w:val="FF0000"/>
+                <w:sz w:val="20"/>
+                <w:szCs w:val="20"/>
+              </w:rPr>
+              <w:t>Dokumentasi</w:t>
+            </w:r>
+          </w:p>
+        </w:tc>
+      </w:tr>
+      <w:tr>
+        <w:trPr>
+          <w:trHeight w:val="230"/>
+        </w:trPr>
+        <w:tc>
+          <w:tcPr>
+            <w:tcW w:w="635" w:type="dxa"/>
+            <w:tcBorders>
+              <w:top w:val="single" w:sz="8" w:space="0" w:color="000000"/>
+              <w:left w:val="single" w:sz="8" w:space="0" w:color="000000"/>
+              <w:bottom w:val="single" w:sz="8" w:space="0" w:color="000000"/>
+              <w:right w:val="single" w:sz="8" w:space="0" w:color="000000"/>
+            </w:tcBorders>
+          </w:tcPr>
+          <w:p>
+            <w:pPr>
+              <w:pBdr>
+                <w:top w:val="nil"/>
+                <w:left w:val="nil"/>
+                <w:bottom w:val="nil"/>
+                <w:right w:val="nil"/>
+                <w:between w:val="nil"/>
+              </w:pBdr>
+              <w:rPr>
+                <w:color w:val="000000"/>
+                <w:sz w:val="16"/>
+                <w:szCs w:val="16"/>
+              </w:rPr>
+            </w:pPr>
+            <w:r>
+              <w:rPr>
+                <w:rFonts w:ascii="Times New Roman" w:hAnsi="Times New Roman"/>
+                <w:sz w:val="18"/>
+              </w:rPr>
+              <w:t>{#entries}{day_name}</w:t>
+            </w:r>
+          </w:p>
+        </w:tc>
+        <w:tc>
+          <w:tcPr>
+            <w:tcW w:w="1250" w:type="dxa"/>
+            <w:tcBorders>
+              <w:top w:val="single" w:sz="8" w:space="0" w:color="000000"/>
+              <w:left w:val="single" w:sz="8" w:space="0" w:color="000000"/>
+              <w:bottom w:val="single" w:sz="8" w:space="0" w:color="000000"/>
+              <w:right w:val="single" w:sz="8" w:space="0" w:color="000000"/>
+            </w:tcBorders>
+          </w:tcPr>
+          <w:p>
+            <w:pPr>
+              <w:pBdr>
+                <w:top w:val="nil"/>
+                <w:left w:val="nil"/>
+                <w:bottom w:val="nil"/>
+                <w:right w:val="nil"/>
+                <w:between w:val="nil"/>
+              </w:pBdr>
+              <w:rPr>
+                <w:color w:val="000000"/>
+                <w:sz w:val="16"/>
+                <w:szCs w:val="16"/>
+              </w:rPr>
+            </w:pPr>
+            <w:r>
+              <w:rPr>
+                <w:rFonts w:ascii="Times New Roman" w:hAnsi="Times New Roman"/>
+                <w:sz w:val="18"/>
+              </w:rPr>
+              <w:t>{entry_date}</w:t>
+            </w:r>
+          </w:p>
+        </w:tc>
+        <w:tc>
+          <w:tcPr>
+            <w:tcW w:w="950" w:type="dxa"/>
+            <w:tcBorders>
+              <w:top w:val="single" w:sz="8" w:space="0" w:color="000000"/>
+              <w:left w:val="single" w:sz="8" w:space="0" w:color="000000"/>
+              <w:bottom w:val="single" w:sz="8" w:space="0" w:color="000000"/>
+              <w:right w:val="single" w:sz="8" w:space="0" w:color="000000"/>
+            </w:tcBorders>
+          </w:tcPr>
+          <w:p>
+            <w:pPr>
+              <w:pBdr>
+                <w:top w:val="nil"/>
+                <w:left w:val="nil"/>
+                <w:bottom w:val="nil"/>
+                <w:right w:val="nil"/>
+                <w:between w:val="nil"/>
+              </w:pBdr>
+              <w:rPr>
+                <w:color w:val="000000"/>
+                <w:sz w:val="16"/>
+                <w:szCs w:val="16"/>
+              </w:rPr>
+            </w:pPr>
+            <w:r>
+              <w:rPr>
+                <w:rFonts w:ascii="Times New Roman" w:hAnsi="Times New Roman"/>
+                <w:sz w:val="18"/>
+              </w:rPr>
+              <w:t>{time_range}</w:t>
+            </w:r>
+          </w:p>
+        </w:tc>
+        <w:tc>
+          <w:tcPr>
+            <w:tcW w:w="4830" w:type="dxa"/>
+            <w:gridSpan w:val="2"/>
+            <w:tcBorders>
+              <w:top w:val="single" w:sz="8" w:space="0" w:color="000000"/>
+              <w:left w:val="single" w:sz="8" w:space="0" w:color="000000"/>
+              <w:bottom w:val="single" w:sz="8" w:space="0" w:color="000000"/>
+              <w:right w:val="single" w:sz="8" w:space="0" w:color="000000"/>
+            </w:tcBorders>
+          </w:tcPr>
+          <w:p>
+            <w:pPr>
+              <w:pBdr>
+                <w:top w:val="nil"/>
+                <w:left w:val="nil"/>
+                <w:bottom w:val="nil"/>
+                <w:right w:val="nil"/>
+                <w:between w:val="nil"/>
+              </w:pBdr>
+              <w:rPr>
+                <w:color w:val="000000"/>
+                <w:sz w:val="16"/>
+                <w:szCs w:val="16"/>
+              </w:rPr>
+            </w:pPr>
+            <w:r>
+              <w:rPr>
+                <w:rFonts w:ascii="Times New Roman" w:hAnsi="Times New Roman"/>
+                <w:sz w:val="18"/>
+              </w:rPr>
+              <w:t>{activity_description}</w:t>
+            </w:r>
+          </w:p>
+        </w:tc>
+        <w:tc>
+          <w:tcPr>
+            <w:tcW w:w="2700" w:type="dxa"/>
+            <w:gridSpan w:val="3"/>
+            <w:tcBorders>
+              <w:top w:val="single" w:sz="8" w:space="0" w:color="000000"/>
+              <w:left w:val="single" w:sz="8" w:space="0" w:color="000000"/>
+              <w:bottom w:val="single" w:sz="8" w:space="0" w:color="000000"/>
+              <w:right w:val="single" w:sz="8" w:space="0" w:color="000000"/>
+            </w:tcBorders>
+          </w:tcPr>
+          <w:p>
+            <w:pPr>
+              <w:pBdr>
+                <w:top w:val="nil"/>
+                <w:left w:val="nil"/>
+                <w:bottom w:val="nil"/>
+                <w:right w:val="nil"/>
+                <w:between w:val="nil"/>
+              </w:pBdr>
+              <w:rPr>
+                <w:color w:val="000000"/>
+                <w:sz w:val="16"/>
+                <w:szCs w:val="16"/>
+              </w:rPr>
+            </w:pPr>
+            <w:r>
+              <w:rPr>
+                <w:rFonts w:ascii="Times New Roman" w:hAnsi="Times New Roman"/>
+                <w:sz w:val="18"/>
+              </w:rPr>
+              <w:t>{documentation}{/entries}</w:t>
+            </w:r>
+          </w:p>
+        </w:tc>
+      </w:tr>
+      <w:tr>
+        <w:trPr>
+          <w:trHeight w:val="230"/>
+        </w:trPr>
+        <w:tc>
+          <w:tcPr>
+            <w:tcW w:w="10365" w:type="dxa"/>
+            <w:gridSpan w:val="8"/>
+            <w:tcBorders>
+              <w:top w:val="single" w:sz="8" w:space="0" w:color="000000"/>
+              <w:left w:val="single" w:sz="8" w:space="0" w:color="000000"/>
+              <w:bottom w:val="single" w:sz="8" w:space="0" w:color="000000"/>
+              <w:right w:val="single" w:sz="8" w:space="0" w:color="000000"/>
+            </w:tcBorders>
+          </w:tcPr>
+          <w:p>
+            <w:pPr>
+              <w:pBdr>
+                <w:top w:val="nil"/>
+                <w:left w:val="nil"/>
+                <w:bottom w:val="nil"/>
+                <w:right w:val="nil"/>
+                <w:between w:val="nil"/>
+              </w:pBdr>
+              <w:ind w:left="107"/>
+              <w:jc w:val="both"/>
+              <w:rPr>
+                <w:b/>
+                <w:color w:val="000000"/>
+                <w:sz w:val="24"/>
+                <w:szCs w:val="24"/>
+              </w:rPr>
+            </w:pPr>
+            <w:r>
+              <w:rPr>
+                <w:b/>
+                <w:color w:val="000000"/>
+                <w:sz w:val="24"/>
+                <w:szCs w:val="24"/>
+              </w:rPr>
+              <w:t>B. CATATAN PENTING HARIAN</w:t>
+            </w:r>
+          </w:p>
+        </w:tc>
+      </w:tr>
+      <w:tr>
+        <w:trPr>
+          <w:trHeight w:val="1838"/>
+        </w:trPr>
+        <w:tc>
+          <w:tcPr>
+            <w:tcW w:w="10365" w:type="dxa"/>
+            <w:gridSpan w:val="8"/>
+            <w:tcBorders>
+              <w:top w:val="single" w:sz="8" w:space="0" w:color="000000"/>
+              <w:left w:val="single" w:sz="8" w:space="0" w:color="000000"/>
+              <w:bottom w:val="single" w:sz="8" w:space="0" w:color="000000"/>
+              <w:right w:val="single" w:sz="8" w:space="0" w:color="000000"/>
+            </w:tcBorders>
+          </w:tcPr>
+          <w:p>
+            <w:pPr>
+              <w:spacing w:line="220" w:lineRule="auto"/>
+              <w:ind w:left="100"/>
+              <w:rPr>
+                <w:rFonts w:ascii="Times New Roman" w:hAnsi="Times New Roman"/>
+                <w:sz w:val="20"/>
+              </w:rPr>
+            </w:pPr>
+            <w:r>
+              <w:rPr>
+                <w:rFonts w:ascii="Times New Roman" w:hAnsi="Times New Roman"/>
+                <w:sz w:val="20"/>
+              </w:rPr>
+              <w:t>1. {note_1}</w:t>
+            </w:r>
+          </w:p>
+          <w:p>
+            <w:pPr>
+              <w:spacing w:line="220" w:lineRule="auto"/>
+              <w:ind w:left="100"/>
+              <w:rPr>
+                <w:rFonts w:ascii="Times New Roman" w:hAnsi="Times New Roman"/>
+                <w:sz w:val="20"/>
+              </w:rPr>
+            </w:pPr>
+            <w:r>
+              <w:rPr>
+                <w:rFonts w:ascii="Times New Roman" w:hAnsi="Times New Roman"/>
+                <w:sz w:val="20"/>
+              </w:rPr>
+              <w:t>2. {note_2}</w:t>
+            </w:r>
+          </w:p>
+          <w:p>
+            <w:pPr>
+              <w:spacing w:line="220" w:lineRule="auto"/>
+              <w:ind w:left="100"/>
+              <w:rPr>
+                <w:rFonts w:ascii="Times New Roman" w:hAnsi="Times New Roman"/>
+                <w:sz w:val="20"/>
+              </w:rPr>
+            </w:pPr>
+            <w:r>
+              <w:rPr>
+                <w:rFonts w:ascii="Times New Roman" w:hAnsi="Times New Roman"/>
+                <w:sz w:val="20"/>
+              </w:rPr>
+              <w:t>3. {note_3}</w:t>
+            </w:r>
+          </w:p>
+          <w:p>
+            <w:pPr>
+              <w:pBdr>
+                <w:top w:val="nil"/>
+                <w:left w:val="nil"/>
+                <w:bottom w:val="nil"/>
+                <w:right w:val="nil"/>
+                <w:between w:val="nil"/>
+              </w:pBdr>
+              <w:ind w:left="107"/>
+              <w:rPr>
+                <w:b/>
+                <w:color w:val="000000"/>
+                <w:sz w:val="20"/>
+                <w:szCs w:val="20"/>
+              </w:rPr>
+            </w:pPr>
+            <w:r>
+              <w:rPr>
+                <w:b/>
+                <w:color w:val="000000"/>
+                <w:sz w:val="20"/>
+                <w:szCs w:val="20"/>
+              </w:rPr>
+              <w:t>2.</w:t>
+            </w:r>
+          </w:p>
+          <w:p>
+            <w:pPr>
+              <w:pBdr>
+                <w:top w:val="nil"/>
+                <w:left w:val="nil"/>
+                <w:bottom w:val="nil"/>
+                <w:right w:val="nil"/>
+                <w:between w:val="nil"/>
+              </w:pBdr>
+              <w:spacing w:before="228"/>
+              <w:rPr>
+                <w:color w:val="000000"/>
+                <w:sz w:val="20"/>
+                <w:szCs w:val="20"/>
+              </w:rPr>
+            </w:pPr>
+          </w:p>
+          <w:p>
+            <w:pPr>
+              <w:pBdr>
+                <w:top w:val="nil"/>
+                <w:left w:val="nil"/>
+                <w:bottom w:val="nil"/>
+                <w:right w:val="nil"/>
+                <w:between w:val="nil"/>
+              </w:pBdr>
+              <w:ind w:left="107"/>
+              <w:rPr>
+                <w:b/>
+                <w:color w:val="000000"/>
+                <w:sz w:val="20"/>
+                <w:szCs w:val="20"/>
+              </w:rPr>
+            </w:pPr>
+            <w:r>
+              <w:rPr>
+                <w:b/>
+                <w:color w:val="000000"/>
+                <w:sz w:val="20"/>
+                <w:szCs w:val="20"/>
+              </w:rPr>
+              <w:t>3.</w:t>
+            </w:r>
+          </w:p>
+        </w:tc>
+      </w:tr>
+      <w:tr>
+        <w:trPr>
+          <w:trHeight w:val="1579"/>
+        </w:trPr>
+        <w:tc>
+          <w:tcPr>
+            <w:tcW w:w="10365" w:type="dxa"/>
+            <w:gridSpan w:val="8"/>
+            <w:vMerge w:val="restart"/>
+            <w:tcBorders>
+              <w:top w:val="single" w:sz="8" w:space="0" w:color="000000"/>
+              <w:left w:val="single" w:sz="8" w:space="0" w:color="000000"/>
+              <w:bottom w:val="single" w:sz="8" w:space="0" w:color="000000"/>
+              <w:right w:val="single" w:sz="8" w:space="0" w:color="000000"/>
+            </w:tcBorders>
+          </w:tcPr>
+          <w:p>
+            <w:pPr>
+              <w:spacing w:line="275" w:lineRule="auto"/>
+              <w:ind w:left="107"/>
+              <w:rPr>
+                <w:b/>
+                <w:sz w:val="24"/>
+                <w:szCs w:val="24"/>
+              </w:rPr>
+            </w:pPr>
+            <w:r>
+              <w:rPr>
+                <w:b/>
+                <w:sz w:val="24"/>
+                <w:szCs w:val="24"/>
+              </w:rPr>
+              <w:t>D. PENGESAHAN</w:t>
+            </w:r>
+          </w:p>
+        </w:tc>
+      </w:tr>
+      <w:tr>
+        <w:trPr>
+          <w:trHeight w:val="276"/>
+        </w:trPr>
+        <w:tc>
+          <w:tcPr>
+            <w:tcW w:w="10365" w:type="dxa"/>
+            <w:gridSpan w:val="8"/>
+            <w:vMerge/>
+            <w:tcBorders>
+              <w:top w:val="single" w:sz="8" w:space="0" w:color="000000"/>
+              <w:left w:val="single" w:sz="8" w:space="0" w:color="000000"/>
+              <w:bottom w:val="single" w:sz="8" w:space="0" w:color="000000"/>
+              <w:right w:val="single" w:sz="8" w:space="0" w:color="000000"/>
+            </w:tcBorders>
+          </w:tcPr>
+          <w:p>
+            <w:pPr>
+              <w:pBdr>
+                <w:top w:val="nil"/>
+                <w:left w:val="nil"/>
+                <w:bottom w:val="nil"/>
+                <w:right w:val="nil"/>
+                <w:between w:val="nil"/>
+              </w:pBdr>
+              <w:rPr>
+                <w:b/>
+                <w:color w:val="000000"/>
+                <w:sz w:val="24"/>
+                <w:szCs w:val="24"/>
+              </w:rPr>
+            </w:pPr>
+          </w:p>
+        </w:tc>
+      </w:tr>
+      <w:tr>
+        <w:trPr>
+          <w:trHeight w:val="1634"/>
+        </w:trPr>
+        <w:tc>
+          <w:tcPr>
+            <w:tcW w:w="5250" w:type="dxa"/>
+            <w:gridSpan w:val="6"/>
+            <w:tcBorders>
+              <w:top w:val="single" w:sz="8" w:space="0" w:color="000000"/>
+              <w:left w:val="single" w:sz="8" w:space="0" w:color="000000"/>
+              <w:bottom w:val="single" w:sz="8" w:space="0" w:color="000000"/>
+              <w:right w:val="single" w:sz="8" w:space="0" w:color="000000"/>
+            </w:tcBorders>
+          </w:tcPr>
+          <w:p>
+            <w:pPr>
+              <w:pBdr>
+                <w:top w:val="nil"/>
+                <w:left w:val="nil"/>
+                <w:bottom w:val="nil"/>
+                <w:right w:val="nil"/>
+                <w:between w:val="nil"/>
+              </w:pBdr>
+              <w:spacing w:line="251" w:lineRule="auto"/>
+              <w:jc w:val="center"/>
+              <w:rPr>
+                <w:b/>
+                <w:color w:val="000000"/>
+              </w:rPr>
+            </w:pPr>
+            <w:r>
+              <w:rPr>
+                <w:b/>
+                <w:color w:val="000000"/>
+              </w:rPr>
+              <w:t>{lurah_head_title}</w:t>
+            </w:r>
+          </w:p>
+          <w:p>
+            <w:pPr>
+              <w:jc w:val="center"/>
+            </w:pPr>
+            <w:r>
+              <w:t xml:space="preserve">
+{lurah_head_name}</w:t>
+            </w:r>
+          </w:p>
+        </w:tc>
+        <w:tc>
+          <w:tcPr>
+            <w:tcW w:w="5115" w:type="dxa"/>
+            <w:gridSpan w:val="2"/>
+            <w:tcBorders>
+              <w:top w:val="single" w:sz="8" w:space="0" w:color="000000"/>
+              <w:left w:val="single" w:sz="8" w:space="0" w:color="000000"/>
+              <w:bottom w:val="single" w:sz="8" w:space="0" w:color="000000"/>
+              <w:right w:val="single" w:sz="8" w:space="0" w:color="000000"/>
+            </w:tcBorders>
+          </w:tcPr>
+          <w:p>
+            <w:pPr>
+              <w:pBdr>
+                <w:top w:val="nil"/>
+                <w:left w:val="nil"/>
+                <w:bottom w:val="nil"/>
+                <w:right w:val="nil"/>
+                <w:between w:val="nil"/>
+              </w:pBdr>
+              <w:spacing w:line="275" w:lineRule="auto"/>
+              <w:ind w:left="1001"/>
+              <w:rPr>
+                <w:b/>
+                <w:color w:val="000000"/>
+                <w:sz w:val="24"/>
+                <w:szCs w:val="24"/>
+              </w:rPr>
+            </w:pPr>
+            <w:r>
+              <w:rPr>
+                <w:b/>
+                <w:color w:val="000000"/>
+                <w:sz w:val="24"/>
+                <w:szCs w:val="24"/>
+              </w:rPr>
+              <w:t>TANDA TANGAN MAHASISWA</w:t>
+            </w:r>
+          </w:p>
+          <w:p>
+            <w:pPr>
+              <w:jc w:val="center"/>
+            </w:pPr>
+            <w:r>
+              <w:t xml:space="preserve">
+( {full_name} )</w:t>
+            </w:r>
+          </w:p>
+        </w:tc>
+      </w:tr>
+    </w:tbl>
+    <w:p>
+      <w:pPr>
+        <w:spacing w:before="240" w:after="240"/>
+        <w:jc w:val="both"/>
+        <w:rPr>
+          <w:b/>
+          <w:sz w:val="24"/>
+          <w:szCs w:val="24"/>
+        </w:rPr>
+      </w:pPr>
+      <w:r>
+        <w:rPr>
+          <w:b/>
+          <w:sz w:val="24"/>
+          <w:szCs w:val="24"/>
+        </w:rPr>
+        <w:t>Petunjuk Pengisian:</w:t>
+      </w:r>
+    </w:p>
+    <w:p>
+      <w:pPr>
+        <w:numPr>
+          <w:ilvl w:val="0"/>
+          <w:numId w:val="1"/>
+        </w:numPr>
+        <w:pBdr>
+          <w:top w:val="nil"/>
+          <w:left w:val="nil"/>
+          <w:bottom w:val="nil"/>
+          <w:right w:val="nil"/>
+          <w:between w:val="nil"/>
+        </w:pBdr>
+        <w:jc w:val="both"/>
+        <w:rPr>
+          <w:sz w:val="24"/>
+          <w:szCs w:val="24"/>
+        </w:rPr>
+      </w:pPr>
+      <w:r>
+        <w:rPr>
+          <w:sz w:val="24"/>
+          <w:szCs w:val="24"/>
+        </w:rPr>
+        <w:t xml:space="preserve">Logbook adalah buku catatan harian bagi peserta KKN yang wajib diisi setiap hari dan dilaporkan kepada Dosen Pembimbing Lapangan (DPL) setiap minggu Ling google form. </w:t>
+      </w:r>
+    </w:p>
+    <w:p>
+      <w:pPr>
+        <w:numPr>
+          <w:ilvl w:val="0"/>
+          <w:numId w:val="1"/>
+        </w:numPr>
+        <w:pBdr>
+          <w:top w:val="nil"/>
+          <w:left w:val="nil"/>
+          <w:bottom w:val="nil"/>
+          <w:right w:val="nil"/>
+          <w:between w:val="nil"/>
+        </w:pBdr>
+        <w:jc w:val="both"/>
+        <w:rPr>
+          <w:sz w:val="24"/>
+          <w:szCs w:val="24"/>
+        </w:rPr>
+      </w:pPr>
+      <w:r>
+        <w:rPr>
+          <w:sz w:val="24"/>
+          <w:szCs w:val="24"/>
+        </w:rPr>
+        <w:t>Logbook hanya boleh diisi dengan aktivitas yang berkaitan dengan program KKN.</w:t>
+      </w:r>
+    </w:p>
+    <w:p>
+      <w:pPr>
+        <w:numPr>
+          <w:ilvl w:val="0"/>
+          <w:numId w:val="1"/>
+        </w:numPr>
+        <w:pBdr>
+          <w:top w:val="nil"/>
+          <w:left w:val="nil"/>
+          <w:bottom w:val="nil"/>
+          <w:right w:val="nil"/>
+          <w:between w:val="nil"/>
+        </w:pBdr>
+        <w:jc w:val="both"/>
+        <w:rPr>
+          <w:sz w:val="24"/>
+          <w:szCs w:val="24"/>
+        </w:rPr>
+      </w:pPr>
+      <w:r>
+        <w:rPr>
+          <w:sz w:val="24"/>
+          <w:szCs w:val="24"/>
+        </w:rPr>
+        <w:t>Setiap logbook harus ditempelkan pas foto berwarna terbaru dengan ukuran 4x6 cm.</w:t>
+      </w:r>
+    </w:p>
+    <w:p>
+      <w:pPr>
+        <w:numPr>
+          <w:ilvl w:val="0"/>
+          <w:numId w:val="1"/>
+        </w:numPr>
+        <w:pBdr>
+          <w:top w:val="nil"/>
+          <w:left w:val="nil"/>
+          <w:bottom w:val="nil"/>
+          <w:right w:val="nil"/>
+          <w:between w:val="nil"/>
+        </w:pBdr>
+        <w:jc w:val="both"/>
+        <w:rPr>
+          <w:sz w:val="24"/>
+          <w:szCs w:val="24"/>
+        </w:rPr>
+      </w:pPr>
+      <w:r>
+        <w:rPr>
+          <w:sz w:val="24"/>
+          <w:szCs w:val="24"/>
+        </w:rPr>
+        <w:t>Isi logbook mencakup kegiatan harian, catatan penting, serta dokumentasi seperti foto, tautan video, dan lain-lain.</w:t>
+      </w:r>
+    </w:p>
+    <w:p>
+      <w:pPr>
+        <w:numPr>
+          <w:ilvl w:val="0"/>
+          <w:numId w:val="1"/>
+        </w:numPr>
+        <w:pBdr>
+          <w:top w:val="nil"/>
+          <w:left w:val="nil"/>
+          <w:bottom w:val="nil"/>
+          <w:right w:val="nil"/>
+          <w:between w:val="nil"/>
+        </w:pBdr>
+        <w:jc w:val="both"/>
+        <w:rPr>
+          <w:sz w:val="24"/>
+          <w:szCs w:val="24"/>
+        </w:rPr>
+      </w:pPr>
+      <w:r>
+        <w:rPr>
+          <w:sz w:val="24"/>
+          <w:szCs w:val="24"/>
+        </w:rPr>
+        <w:t>Penulisan logbook harus menggunakan bahasa Indonesia yang baik dan benar sesuai kaidah baku.</w:t>
+      </w:r>
+    </w:p>
+    <w:p>
+      <w:pPr>
+        <w:numPr>
+          <w:ilvl w:val="0"/>
+          <w:numId w:val="1"/>
+        </w:numPr>
+        <w:pBdr>
+          <w:top w:val="nil"/>
+          <w:left w:val="nil"/>
+          <w:bottom w:val="nil"/>
+          <w:right w:val="nil"/>
+          <w:between w:val="nil"/>
+        </w:pBdr>
+        <w:jc w:val="both"/>
+        <w:rPr>
+          <w:sz w:val="24"/>
+          <w:szCs w:val="24"/>
+        </w:rPr>
+      </w:pPr>
+      <w:r>
+        <w:rPr>
+          <w:sz w:val="24"/>
+          <w:szCs w:val="24"/>
+        </w:rPr>
+        <w:t>Pada bagian kolom pengesahan, mahasiswa wajib menandatangani serta menuliskan nama lengkapnya, kemudian nama lurah, kepala desa, atau pihak berwenang lainnya.</w:t>
+      </w:r>
+    </w:p>
+    <w:p>
+      <w:pPr>
+        <w:numPr>
+          <w:ilvl w:val="0"/>
+          <w:numId w:val="1"/>
+        </w:numPr>
+        <w:pBdr>
+          <w:top w:val="nil"/>
+          <w:left w:val="nil"/>
+          <w:bottom w:val="nil"/>
+          <w:right w:val="nil"/>
+          <w:between w:val="nil"/>
+        </w:pBdr>
+        <w:jc w:val="both"/>
+        <w:rPr>
+          <w:sz w:val="24"/>
+          <w:szCs w:val="24"/>
+        </w:rPr>
+      </w:pPr>
+      <w:r>
+        <w:rPr>
+          <w:sz w:val="24"/>
+          <w:szCs w:val="24"/>
+        </w:rPr>
+        <w:t>Selanjutnya, lurah, kepala desa, atau pihak berwenang terkait diminta untuk memberikan tanda tangan pada logbook mingguan tersebut.</w:t>
+      </w:r>
+    </w:p>
+    <w:p>
+      <w:pPr>
+        <w:numPr>
+          <w:ilvl w:val="0"/>
+          <w:numId w:val="1"/>
+        </w:numPr>
+        <w:pBdr>
+          <w:top w:val="nil"/>
+          <w:left w:val="nil"/>
+          <w:bottom w:val="nil"/>
+          <w:right w:val="nil"/>
+          <w:between w:val="nil"/>
+        </w:pBdr>
+        <w:jc w:val="both"/>
+        <w:rPr>
+          <w:sz w:val="24"/>
+          <w:szCs w:val="24"/>
+        </w:rPr>
+      </w:pPr>
+      <w:r>
+        <w:rPr>
+          <w:sz w:val="24"/>
+          <w:szCs w:val="24"/>
+        </w:rPr>
+        <w:t>Mahasiswa kemudian mengirimkan logbook mingguan secara daring kepada DPL masing-masing.</w:t>
+      </w:r>
+    </w:p>
+    <w:p>
+      <w:pPr>
+        <w:numPr>
+          <w:ilvl w:val="0"/>
+          <w:numId w:val="1"/>
+        </w:numPr>
+        <w:pBdr>
+          <w:top w:val="nil"/>
+          <w:left w:val="nil"/>
+          <w:bottom w:val="nil"/>
+          <w:right w:val="nil"/>
+          <w:between w:val="nil"/>
+        </w:pBdr>
+        <w:jc w:val="both"/>
+        <w:rPr>
+          <w:sz w:val="24"/>
+          <w:szCs w:val="24"/>
+        </w:rPr>
+      </w:pPr>
+      <w:r>
+        <w:rPr>
+          <w:sz w:val="24"/>
+          <w:szCs w:val="24"/>
+        </w:rPr>
+        <w:t>DPL akan memeriksa dan memberikan tanggapan terhadap logbook setiap minggu.</w:t>
+      </w:r>
+      <w:r>
+        <w:rPr>
+          <w:sz w:val="24"/>
+          <w:szCs w:val="24"/>
+        </w:rPr>
+        <w:br/>
+      </w:r>
+    </w:p>
+    <w:p>
+      <w:pPr>
+        <w:pBdr>
+          <w:top w:val="nil"/>
+          <w:left w:val="nil"/>
+          <w:bottom w:val="nil"/>
+          <w:right w:val="nil"/>
+          <w:between w:val="nil"/>
+        </w:pBdr>
+        <w:ind w:left="1080"/>
+        <w:jc w:val="both"/>
+        <w:rPr>
+          <w:sz w:val="24"/>
+          <w:szCs w:val="24"/>
+        </w:rPr>
+      </w:pPr>
+    </w:p>
+    <w:sectPr>
+      <w:pgSz w:w="12240" w:h="15840"/>
+      <w:pgMar w:top="1440" w:right="1440" w:bottom="1440" w:left="1440" w:header="708" w:footer="708" w:gutter="0"/>
+      <w:pgNumType w:start="1"/>
+      <w:cols w:space="720"/>
+    </w:sectPr>
+  </w:body>
+</w:document>
 </file>
 
 <file path=word/numbering.xml><?xml version="1.0" encoding="utf-8"?>

</xml_diff>